<commit_message>
feat(ecus): add deterministic execution clock
</commit_message>
<xml_diff>
--- a/docs/ATEP_Volume_III_ECU_Simulator_Engineering_Workbook.docx
+++ b/docs/ATEP_Volume_III_ECU_Simulator_Engineering_Workbook.docx
@@ -143,7 +143,7 @@
                 <w:color w:val="0B2545"/>
                 <w:sz w:val="19"/>
               </w:rPr>
-              <w:t>0.1.0</w:t>
+              <w:t>0.2.0</w:t>
             </w:r>
           </w:p>
         </w:tc>
@@ -265,7 +265,7 @@
                 <w:color w:val="111827"/>
                 <w:sz w:val="19"/>
               </w:rPr>
-              <w:t>Living document - Increment III-1 implemented</w:t>
+              <w:t>Living document - Increments III-1 and III-2 implemented</w:t>
             </w:r>
           </w:p>
         </w:tc>
@@ -599,6 +599,25 @@
           <w:color w:val="0B2545"/>
           <w:sz w:val="21"/>
         </w:rPr>
+        <w:t>11.1 III-2 Verification</w:t>
+      </w:r>
+    </w:p>
+    <w:p>
+      <w:pPr>
+        <w:pStyle w:val="ListNumber"/>
+        <w:numPr>
+          <w:ilvl w:val="0"/>
+          <w:numId w:val="10"/>
+        </w:numPr>
+        <w:ind w:left="216" w:firstLine="0"/>
+      </w:pPr>
+      <w:r>
+        <w:rPr>
+          <w:rFonts w:ascii="Calibri" w:hAnsi="Calibri"/>
+          <w:b/>
+          <w:color w:val="0B2545"/>
+          <w:sz w:val="21"/>
+        </w:rPr>
         <w:t>12. Implemented Evidence</w:t>
       </w:r>
     </w:p>
@@ -657,25 +676,6 @@
           <w:sz w:val="21"/>
         </w:rPr>
         <w:t>15. Study Exercises</w:t>
-      </w:r>
-    </w:p>
-    <w:p>
-      <w:pPr>
-        <w:pStyle w:val="ListNumber"/>
-        <w:numPr>
-          <w:ilvl w:val="0"/>
-          <w:numId w:val="10"/>
-        </w:numPr>
-        <w:ind w:left="216" w:firstLine="0"/>
-      </w:pPr>
-      <w:r>
-        <w:rPr>
-          <w:rFonts w:ascii="Calibri" w:hAnsi="Calibri"/>
-          <w:b/>
-          <w:color w:val="0B2545"/>
-          <w:sz w:val="21"/>
-        </w:rPr>
-        <w:t>16. Workbook Maintenance Checklist</w:t>
       </w:r>
     </w:p>
     <w:p>
@@ -912,7 +912,7 @@
                 <w:color w:val="111827"/>
                 <w:sz w:val="17"/>
               </w:rPr>
-              <w:t>Increment III-1</w:t>
+              <w:t>Increments III-1 and III-2</w:t>
             </w:r>
           </w:p>
         </w:tc>
@@ -1316,6 +1316,95 @@
           </w:p>
         </w:tc>
       </w:tr>
+      <w:tr>
+        <w:trPr>
+          <w:cantSplit/>
+        </w:trPr>
+        <w:tc>
+          <w:tcPr>
+            <w:tcW w:type="dxa" w:w="1650"/>
+            <w:tcMar>
+              <w:top w:w="80" w:type="dxa"/>
+              <w:start w:w="120" w:type="dxa"/>
+              <w:bottom w:w="80" w:type="dxa"/>
+              <w:end w:w="120" w:type="dxa"/>
+            </w:tcMar>
+            <w:vAlign w:val="center"/>
+            <w:shd w:fill="FFFFFF"/>
+          </w:tcPr>
+          <w:p>
+            <w:pPr>
+              <w:spacing w:before="0" w:after="40" w:line="252" w:lineRule="auto"/>
+              <w:jc w:val="center"/>
+            </w:pPr>
+            <w:r>
+              <w:rPr>
+                <w:rFonts w:ascii="Calibri" w:hAnsi="Calibri"/>
+                <w:b w:val="0"/>
+                <w:color w:val="111827"/>
+                <w:sz w:val="17"/>
+              </w:rPr>
+              <w:t>0.2.0</w:t>
+            </w:r>
+          </w:p>
+        </w:tc>
+        <w:tc>
+          <w:tcPr>
+            <w:tcW w:type="dxa" w:w="4450"/>
+            <w:tcMar>
+              <w:top w:w="80" w:type="dxa"/>
+              <w:start w:w="120" w:type="dxa"/>
+              <w:bottom w:w="80" w:type="dxa"/>
+              <w:end w:w="120" w:type="dxa"/>
+            </w:tcMar>
+            <w:vAlign w:val="center"/>
+            <w:shd w:fill="FFFFFF"/>
+          </w:tcPr>
+          <w:p>
+            <w:pPr>
+              <w:spacing w:before="0" w:after="40" w:line="252" w:lineRule="auto"/>
+              <w:jc w:val="left"/>
+            </w:pPr>
+            <w:r>
+              <w:rPr>
+                <w:rFonts w:ascii="Calibri" w:hAnsi="Calibri"/>
+                <w:b w:val="0"/>
+                <w:color w:val="111827"/>
+                <w:sz w:val="17"/>
+              </w:rPr>
+              <w:t>2026-08-24</w:t>
+            </w:r>
+          </w:p>
+        </w:tc>
+        <w:tc>
+          <w:tcPr>
+            <w:tcW w:type="dxa" w:w="3260"/>
+            <w:tcMar>
+              <w:top w:w="80" w:type="dxa"/>
+              <w:start w:w="120" w:type="dxa"/>
+              <w:bottom w:w="80" w:type="dxa"/>
+              <w:end w:w="120" w:type="dxa"/>
+            </w:tcMar>
+            <w:vAlign w:val="center"/>
+            <w:shd w:fill="FFFFFF"/>
+          </w:tcPr>
+          <w:p>
+            <w:pPr>
+              <w:spacing w:before="0" w:after="40" w:line="252" w:lineRule="auto"/>
+              <w:jc w:val="left"/>
+            </w:pPr>
+            <w:r>
+              <w:rPr>
+                <w:rFonts w:ascii="Calibri" w:hAnsi="Calibri"/>
+                <w:b w:val="0"/>
+                <w:color w:val="111827"/>
+                <w:sz w:val="17"/>
+              </w:rPr>
+              <w:t>Added logical time, cyclic scheduling, reset modes, replay evidence, APIs, and tests.</w:t>
+            </w:r>
+          </w:p>
+        </w:tc>
+      </w:tr>
     </w:tbl>
     <w:p>
       <w:pPr>
@@ -1480,6 +1569,40 @@
     </w:p>
     <w:p>
       <w:pPr>
+        <w:pStyle w:val="ListBullet"/>
+        <w:numPr>
+          <w:ilvl w:val="0"/>
+          <w:numId w:val="11"/>
+        </w:numPr>
+      </w:pPr>
+      <w:r>
+        <w:rPr>
+          <w:rFonts w:ascii="Calibri" w:hAnsi="Calibri"/>
+          <w:color w:val="111827"/>
+          <w:sz w:val="22"/>
+        </w:rPr>
+        <w:t>Per-ECU logical time, cyclic task schedules, and boot counters.</w:t>
+      </w:r>
+    </w:p>
+    <w:p>
+      <w:pPr>
+        <w:pStyle w:val="ListBullet"/>
+        <w:numPr>
+          <w:ilvl w:val="0"/>
+          <w:numId w:val="11"/>
+        </w:numPr>
+      </w:pPr>
+      <w:r>
+        <w:rPr>
+          <w:rFonts w:ascii="Calibri" w:hAnsi="Calibri"/>
+          <w:color w:val="111827"/>
+          <w:sz w:val="22"/>
+        </w:rPr>
+        <w:t>Idempotent advance/reset commands with persisted execution evidence.</w:t>
+      </w:r>
+    </w:p>
+    <w:p>
+      <w:pPr>
         <w:pStyle w:val="Heading2"/>
         <w:keepNext/>
         <w:keepLines/>
@@ -1503,23 +1626,6 @@
           <w:sz w:val="22"/>
         </w:rPr>
         <w:t>Firmware or instruction execution.</w:t>
-      </w:r>
-    </w:p>
-    <w:p>
-      <w:pPr>
-        <w:pStyle w:val="ListBullet"/>
-        <w:numPr>
-          <w:ilvl w:val="0"/>
-          <w:numId w:val="12"/>
-        </w:numPr>
-      </w:pPr>
-      <w:r>
-        <w:rPr>
-          <w:rFonts w:ascii="Calibri" w:hAnsi="Calibri"/>
-          <w:color w:val="111827"/>
-          <w:sz w:val="22"/>
-        </w:rPr>
-        <w:t>Logical execution cycles and task scheduling.</w:t>
       </w:r>
     </w:p>
     <w:p>
@@ -1570,7 +1676,7 @@
           <w:color w:val="111827"/>
           <w:sz w:val="22"/>
         </w:rPr>
-        <w:t>Persistent memory regions and reset semantics.</w:t>
+        <w:t>Persistent memory regions and reset persistence semantics.</w:t>
       </w:r>
     </w:p>
     <w:p>
@@ -1765,7 +1871,7 @@
           <w:color w:val="111827"/>
           <w:sz w:val="22"/>
         </w:rPr>
-        <w:t xml:space="preserve">, </w:t>
+        <w:t xml:space="preserve">, cyclic tasks, logical time, boot count, </w:t>
       </w:r>
       <w:r>
         <w:rPr>
@@ -1792,6 +1898,16 @@
           <w:sz w:val="22"/>
         </w:rPr>
         <w:t>The lifecycle contains offline, booting, running, degraded, fault, and shutdown. A confirmed critical fault cannot coexist with a non-fault lifecycle state. This protects the simulator from representing an obviously contradictory safety state.</w:t>
+      </w:r>
+    </w:p>
+    <w:p>
+      <w:r>
+        <w:rPr>
+          <w:rFonts w:ascii="Calibri" w:hAnsi="Calibri"/>
+          <w:color w:val="111827"/>
+          <w:sz w:val="22"/>
+        </w:rPr>
+        <w:t>Each cyclic task has a unique canonical ID, a period from 1 to 60,000 milliseconds, and an offset smaller than its period. A maximum of 32 tasks keeps configuration and execution evidence bounded.</w:t>
       </w:r>
     </w:p>
     <w:p>
@@ -2412,6 +2528,240 @@
           </w:p>
         </w:tc>
       </w:tr>
+      <w:tr>
+        <w:trPr>
+          <w:cantSplit/>
+        </w:trPr>
+        <w:tc>
+          <w:tcPr>
+            <w:tcW w:type="dxa" w:w="1150"/>
+            <w:tcMar>
+              <w:top w:w="80" w:type="dxa"/>
+              <w:start w:w="120" w:type="dxa"/>
+              <w:bottom w:w="80" w:type="dxa"/>
+              <w:end w:w="120" w:type="dxa"/>
+            </w:tcMar>
+            <w:vAlign w:val="center"/>
+            <w:shd w:fill="FFFFFF"/>
+          </w:tcPr>
+          <w:p>
+            <w:pPr>
+              <w:spacing w:before="0" w:after="40" w:line="252" w:lineRule="auto"/>
+              <w:jc w:val="center"/>
+            </w:pPr>
+            <w:r>
+              <w:rPr>
+                <w:rFonts w:ascii="Calibri" w:hAnsi="Calibri"/>
+                <w:b w:val="0"/>
+                <w:color w:val="111827"/>
+                <w:sz w:val="16"/>
+              </w:rPr>
+              <w:t>POST</w:t>
+            </w:r>
+          </w:p>
+        </w:tc>
+        <w:tc>
+          <w:tcPr>
+            <w:tcW w:type="dxa" w:w="3700"/>
+            <w:tcMar>
+              <w:top w:w="80" w:type="dxa"/>
+              <w:start w:w="120" w:type="dxa"/>
+              <w:bottom w:w="80" w:type="dxa"/>
+              <w:end w:w="120" w:type="dxa"/>
+            </w:tcMar>
+            <w:vAlign w:val="center"/>
+            <w:shd w:fill="FFFFFF"/>
+          </w:tcPr>
+          <w:p>
+            <w:pPr>
+              <w:spacing w:before="0" w:after="40" w:line="252" w:lineRule="auto"/>
+              <w:jc w:val="left"/>
+            </w:pPr>
+            <w:r>
+              <w:rPr>
+                <w:rFonts w:ascii="Calibri" w:hAnsi="Calibri"/>
+                <w:b w:val="0"/>
+                <w:color w:val="111827"/>
+                <w:sz w:val="16"/>
+              </w:rPr>
+              <w:t>/api/v1/vehicles/{vehicle_id}/ecus/{ecu_id}/simulation/advance</w:t>
+            </w:r>
+          </w:p>
+        </w:tc>
+        <w:tc>
+          <w:tcPr>
+            <w:tcW w:type="dxa" w:w="3100"/>
+            <w:tcMar>
+              <w:top w:w="80" w:type="dxa"/>
+              <w:start w:w="120" w:type="dxa"/>
+              <w:bottom w:w="80" w:type="dxa"/>
+              <w:end w:w="120" w:type="dxa"/>
+            </w:tcMar>
+            <w:vAlign w:val="center"/>
+            <w:shd w:fill="FFFFFF"/>
+          </w:tcPr>
+          <w:p>
+            <w:pPr>
+              <w:spacing w:before="0" w:after="40" w:line="252" w:lineRule="auto"/>
+              <w:jc w:val="left"/>
+            </w:pPr>
+            <w:r>
+              <w:rPr>
+                <w:rFonts w:ascii="Calibri" w:hAnsi="Calibri"/>
+                <w:b w:val="0"/>
+                <w:color w:val="111827"/>
+                <w:sz w:val="16"/>
+              </w:rPr>
+              <w:t>ecus:manage</w:t>
+            </w:r>
+          </w:p>
+        </w:tc>
+        <w:tc>
+          <w:tcPr>
+            <w:tcW w:type="dxa" w:w="1410"/>
+            <w:tcMar>
+              <w:top w:w="80" w:type="dxa"/>
+              <w:start w:w="120" w:type="dxa"/>
+              <w:bottom w:w="80" w:type="dxa"/>
+              <w:end w:w="120" w:type="dxa"/>
+            </w:tcMar>
+            <w:vAlign w:val="center"/>
+            <w:shd w:fill="FFFFFF"/>
+          </w:tcPr>
+          <w:p>
+            <w:pPr>
+              <w:spacing w:before="0" w:after="40" w:line="252" w:lineRule="auto"/>
+              <w:jc w:val="left"/>
+            </w:pPr>
+            <w:r>
+              <w:rPr>
+                <w:rFonts w:ascii="Calibri" w:hAnsi="Calibri"/>
+                <w:b w:val="0"/>
+                <w:color w:val="111827"/>
+                <w:sz w:val="16"/>
+              </w:rPr>
+              <w:t>Advance logical time and summarize due tasks.</w:t>
+            </w:r>
+          </w:p>
+        </w:tc>
+      </w:tr>
+      <w:tr>
+        <w:trPr>
+          <w:cantSplit/>
+        </w:trPr>
+        <w:tc>
+          <w:tcPr>
+            <w:tcW w:type="dxa" w:w="1150"/>
+            <w:tcMar>
+              <w:top w:w="80" w:type="dxa"/>
+              <w:start w:w="120" w:type="dxa"/>
+              <w:bottom w:w="80" w:type="dxa"/>
+              <w:end w:w="120" w:type="dxa"/>
+            </w:tcMar>
+            <w:vAlign w:val="center"/>
+            <w:shd w:fill="FFFFFF"/>
+          </w:tcPr>
+          <w:p>
+            <w:pPr>
+              <w:spacing w:before="0" w:after="40" w:line="252" w:lineRule="auto"/>
+              <w:jc w:val="center"/>
+            </w:pPr>
+            <w:r>
+              <w:rPr>
+                <w:rFonts w:ascii="Calibri" w:hAnsi="Calibri"/>
+                <w:b w:val="0"/>
+                <w:color w:val="111827"/>
+                <w:sz w:val="16"/>
+              </w:rPr>
+              <w:t>POST</w:t>
+            </w:r>
+          </w:p>
+        </w:tc>
+        <w:tc>
+          <w:tcPr>
+            <w:tcW w:type="dxa" w:w="3700"/>
+            <w:tcMar>
+              <w:top w:w="80" w:type="dxa"/>
+              <w:start w:w="120" w:type="dxa"/>
+              <w:bottom w:w="80" w:type="dxa"/>
+              <w:end w:w="120" w:type="dxa"/>
+            </w:tcMar>
+            <w:vAlign w:val="center"/>
+            <w:shd w:fill="FFFFFF"/>
+          </w:tcPr>
+          <w:p>
+            <w:pPr>
+              <w:spacing w:before="0" w:after="40" w:line="252" w:lineRule="auto"/>
+              <w:jc w:val="left"/>
+            </w:pPr>
+            <w:r>
+              <w:rPr>
+                <w:rFonts w:ascii="Calibri" w:hAnsi="Calibri"/>
+                <w:b w:val="0"/>
+                <w:color w:val="111827"/>
+                <w:sz w:val="16"/>
+              </w:rPr>
+              <w:t>/api/v1/vehicles/{vehicle_id}/ecus/{ecu_id}/reset</w:t>
+            </w:r>
+          </w:p>
+        </w:tc>
+        <w:tc>
+          <w:tcPr>
+            <w:tcW w:type="dxa" w:w="3100"/>
+            <w:tcMar>
+              <w:top w:w="80" w:type="dxa"/>
+              <w:start w:w="120" w:type="dxa"/>
+              <w:bottom w:w="80" w:type="dxa"/>
+              <w:end w:w="120" w:type="dxa"/>
+            </w:tcMar>
+            <w:vAlign w:val="center"/>
+            <w:shd w:fill="FFFFFF"/>
+          </w:tcPr>
+          <w:p>
+            <w:pPr>
+              <w:spacing w:before="0" w:after="40" w:line="252" w:lineRule="auto"/>
+              <w:jc w:val="left"/>
+            </w:pPr>
+            <w:r>
+              <w:rPr>
+                <w:rFonts w:ascii="Calibri" w:hAnsi="Calibri"/>
+                <w:b w:val="0"/>
+                <w:color w:val="111827"/>
+                <w:sz w:val="16"/>
+              </w:rPr>
+              <w:t>ecus:manage</w:t>
+            </w:r>
+          </w:p>
+        </w:tc>
+        <w:tc>
+          <w:tcPr>
+            <w:tcW w:type="dxa" w:w="1410"/>
+            <w:tcMar>
+              <w:top w:w="80" w:type="dxa"/>
+              <w:start w:w="120" w:type="dxa"/>
+              <w:bottom w:w="80" w:type="dxa"/>
+              <w:end w:w="120" w:type="dxa"/>
+            </w:tcMar>
+            <w:vAlign w:val="center"/>
+            <w:shd w:fill="FFFFFF"/>
+          </w:tcPr>
+          <w:p>
+            <w:pPr>
+              <w:spacing w:before="0" w:after="40" w:line="252" w:lineRule="auto"/>
+              <w:jc w:val="left"/>
+            </w:pPr>
+            <w:r>
+              <w:rPr>
+                <w:rFonts w:ascii="Calibri" w:hAnsi="Calibri"/>
+                <w:b w:val="0"/>
+                <w:color w:val="111827"/>
+                <w:sz w:val="16"/>
+              </w:rPr>
+              <w:t>Execute a deterministic reset mode.</w:t>
+            </w:r>
+          </w:p>
+        </w:tc>
+      </w:tr>
     </w:tbl>
     <w:p>
       <w:pPr>
@@ -2514,6 +2864,52 @@
     </w:p>
     <w:p>
       <w:pPr>
+        <w:pStyle w:val="Heading2"/>
+        <w:keepNext/>
+        <w:keepLines/>
+      </w:pPr>
+      <w:r>
+        <w:t>8.1 Deterministic Scheduling and Reset</w:t>
+      </w:r>
+    </w:p>
+    <w:p>
+      <w:r>
+        <w:rPr>
+          <w:rFonts w:ascii="Calibri" w:hAnsi="Calibri"/>
+          <w:color w:val="111827"/>
+          <w:sz w:val="22"/>
+        </w:rPr>
+        <w:t xml:space="preserve">The scheduler counts due executions over </w:t>
+      </w:r>
+      <w:r>
+        <w:rPr>
+          <w:rFonts w:ascii="Consolas" w:hAnsi="Consolas"/>
+          <w:color w:val="1F4D78"/>
+          <w:sz w:val="19"/>
+        </w:rPr>
+        <w:t>(previous_time, new_time]</w:t>
+      </w:r>
+      <w:r>
+        <w:rPr>
+          <w:rFonts w:ascii="Calibri" w:hAnsi="Calibri"/>
+          <w:color w:val="111827"/>
+          <w:sz w:val="22"/>
+        </w:rPr>
+        <w:t xml:space="preserve"> using arithmetic, not loops over every millisecond, and never real-time sleep. Each result reports count and first and last due times per task. Response size therefore follows configured task count rather than elapsed cycles.</w:t>
+      </w:r>
+    </w:p>
+    <w:p>
+      <w:r>
+        <w:rPr>
+          <w:rFonts w:ascii="Calibri" w:hAnsi="Calibri"/>
+          <w:color w:val="111827"/>
+          <w:sz w:val="22"/>
+        </w:rPr>
+        <w:t>Reset durations are fixed: soft 10 ms, hard 100 ms, and power cycle 500 ms. Reset increments the boot counter, advances logical time, and becomes offline unless a confirmed critical fault requires fault state. Memory and faults remain unchanged pending the III-4 memory-region model.</w:t>
+      </w:r>
+    </w:p>
+    <w:p>
+      <w:pPr>
         <w:pStyle w:val="Heading1"/>
         <w:keepNext/>
         <w:keepLines/>
@@ -2545,7 +2941,7 @@
           <w:color w:val="111827"/>
           <w:sz w:val="22"/>
         </w:rPr>
-        <w:t>. III-1 covers ownership, uniqueness, retrieval, bounded state, consistency invariants, optimistic concurrency, RBAC, events, and audit.</w:t>
+        <w:t>. III-1 covers the aggregate and III-2 covers logical time, cyclic schedules, reset modes, replay, lifecycle guards, events, and audit.</w:t>
       </w:r>
     </w:p>
     <w:p>
@@ -2636,6 +3032,46 @@
           <w:sz w:val="22"/>
         </w:rPr>
         <w:t>One versioned command gives deterministic conflict behavior and atomic evidence. Fine-grained memory and fault commands can be introduced later when their timing semantics are defined.</w:t>
+      </w:r>
+    </w:p>
+    <w:p>
+      <w:pPr>
+        <w:pStyle w:val="Heading2"/>
+        <w:keepNext/>
+        <w:keepLines/>
+      </w:pPr>
+      <w:r>
+        <w:t>ADR-ECU-005 — Use Logical Time and Aggregated Schedule Evidence</w:t>
+      </w:r>
+    </w:p>
+    <w:p>
+      <w:r>
+        <w:rPr>
+          <w:rFonts w:ascii="Calibri" w:hAnsi="Calibri"/>
+          <w:color w:val="111827"/>
+          <w:sz w:val="22"/>
+        </w:rPr>
+        <w:t>Wall-clock scheduling would make tests slow and nondeterministic. Arithmetic task summaries provide due-cycle evidence with bounded storage and no dependency on host performance.</w:t>
+      </w:r>
+    </w:p>
+    <w:p>
+      <w:pPr>
+        <w:pStyle w:val="Heading2"/>
+        <w:keepNext/>
+        <w:keepLines/>
+      </w:pPr>
+      <w:r>
+        <w:t>ADR-ECU-006 — Preserve State Until Memory Regions Exist</w:t>
+      </w:r>
+    </w:p>
+    <w:p>
+      <w:r>
+        <w:rPr>
+          <w:rFonts w:ascii="Calibri" w:hAnsi="Calibri"/>
+          <w:color w:val="111827"/>
+          <w:sz w:val="22"/>
+        </w:rPr>
+        <w:t>Clearing state before defining volatile and non-volatile regions would invent behavior. III-2 records reset mode, duration, boot count, and preservation; III-4 will own persistence semantics.</w:t>
       </w:r>
     </w:p>
     <w:p>
@@ -4497,6 +4933,936 @@
         <w:pStyle w:val="Heading1"/>
         <w:keepNext/>
         <w:keepLines/>
+        <w:pageBreakBefore/>
+      </w:pPr>
+      <w:r>
+        <w:t>11.1 III-2 Verification</w:t>
+      </w:r>
+    </w:p>
+    <w:tbl>
+      <w:tblPr>
+        <w:tblW w:type="dxa" w:w="9360"/>
+        <w:jc w:val="left"/>
+        <w:tblLayout w:type="fixed"/>
+        <w:tblLook w:firstColumn="1" w:firstRow="1" w:lastColumn="0" w:lastRow="0" w:noHBand="0" w:noVBand="1" w:val="04A0"/>
+        <w:tblInd w:w="120" w:type="dxa"/>
+        <w:tblBorders>
+          <w:top w:val="single" w:sz="6" w:color="B8C4D1"/>
+          <w:left w:val="single" w:sz="6" w:color="B8C4D1"/>
+          <w:bottom w:val="single" w:sz="6" w:color="B8C4D1"/>
+          <w:right w:val="single" w:sz="6" w:color="B8C4D1"/>
+          <w:insideH w:val="single" w:sz="6" w:color="B8C4D1"/>
+          <w:insideV w:val="single" w:sz="6" w:color="B8C4D1"/>
+        </w:tblBorders>
+      </w:tblPr>
+      <w:tblGrid>
+        <w:gridCol w:w="1650"/>
+        <w:gridCol w:w="4450"/>
+        <w:gridCol w:w="3260"/>
+      </w:tblGrid>
+      <w:tr>
+        <w:trPr>
+          <w:tblHeader w:val="true"/>
+          <w:cantSplit/>
+        </w:trPr>
+        <w:tc>
+          <w:tcPr>
+            <w:tcW w:type="dxa" w:w="1650"/>
+            <w:tcMar>
+              <w:top w:w="80" w:type="dxa"/>
+              <w:start w:w="120" w:type="dxa"/>
+              <w:bottom w:w="80" w:type="dxa"/>
+              <w:end w:w="120" w:type="dxa"/>
+            </w:tcMar>
+            <w:vAlign w:val="center"/>
+            <w:shd w:fill="E8EEF5"/>
+          </w:tcPr>
+          <w:p>
+            <w:pPr>
+              <w:spacing w:before="0" w:after="40" w:line="252" w:lineRule="auto"/>
+              <w:jc w:val="center"/>
+            </w:pPr>
+            <w:r>
+              <w:rPr>
+                <w:rFonts w:ascii="Calibri" w:hAnsi="Calibri"/>
+                <w:b/>
+                <w:color w:val="0B2545"/>
+                <w:sz w:val="17"/>
+              </w:rPr>
+              <w:t>Test</w:t>
+            </w:r>
+          </w:p>
+        </w:tc>
+        <w:tc>
+          <w:tcPr>
+            <w:tcW w:type="dxa" w:w="4450"/>
+            <w:tcMar>
+              <w:top w:w="80" w:type="dxa"/>
+              <w:start w:w="120" w:type="dxa"/>
+              <w:bottom w:w="80" w:type="dxa"/>
+              <w:end w:w="120" w:type="dxa"/>
+            </w:tcMar>
+            <w:vAlign w:val="center"/>
+            <w:shd w:fill="E8EEF5"/>
+          </w:tcPr>
+          <w:p>
+            <w:pPr>
+              <w:spacing w:before="0" w:after="40" w:line="252" w:lineRule="auto"/>
+              <w:jc w:val="left"/>
+            </w:pPr>
+            <w:r>
+              <w:rPr>
+                <w:rFonts w:ascii="Calibri" w:hAnsi="Calibri"/>
+                <w:b/>
+                <w:color w:val="0B2545"/>
+                <w:sz w:val="17"/>
+              </w:rPr>
+              <w:t>Objective</w:t>
+            </w:r>
+          </w:p>
+        </w:tc>
+        <w:tc>
+          <w:tcPr>
+            <w:tcW w:type="dxa" w:w="3260"/>
+            <w:tcMar>
+              <w:top w:w="80" w:type="dxa"/>
+              <w:start w:w="120" w:type="dxa"/>
+              <w:bottom w:w="80" w:type="dxa"/>
+              <w:end w:w="120" w:type="dxa"/>
+            </w:tcMar>
+            <w:vAlign w:val="center"/>
+            <w:shd w:fill="E8EEF5"/>
+          </w:tcPr>
+          <w:p>
+            <w:pPr>
+              <w:spacing w:before="0" w:after="40" w:line="252" w:lineRule="auto"/>
+              <w:jc w:val="left"/>
+            </w:pPr>
+            <w:r>
+              <w:rPr>
+                <w:rFonts w:ascii="Calibri" w:hAnsi="Calibri"/>
+                <w:b/>
+                <w:color w:val="0B2545"/>
+                <w:sz w:val="17"/>
+              </w:rPr>
+              <w:t>Level</w:t>
+            </w:r>
+          </w:p>
+        </w:tc>
+      </w:tr>
+      <w:tr>
+        <w:trPr>
+          <w:cantSplit/>
+        </w:trPr>
+        <w:tc>
+          <w:tcPr>
+            <w:tcW w:type="dxa" w:w="1650"/>
+            <w:tcMar>
+              <w:top w:w="80" w:type="dxa"/>
+              <w:start w:w="120" w:type="dxa"/>
+              <w:bottom w:w="80" w:type="dxa"/>
+              <w:end w:w="120" w:type="dxa"/>
+            </w:tcMar>
+            <w:vAlign w:val="center"/>
+            <w:shd w:fill="FFFFFF"/>
+          </w:tcPr>
+          <w:p>
+            <w:pPr>
+              <w:spacing w:before="0" w:after="40" w:line="252" w:lineRule="auto"/>
+              <w:jc w:val="center"/>
+            </w:pPr>
+            <w:r>
+              <w:rPr>
+                <w:rFonts w:ascii="Calibri" w:hAnsi="Calibri"/>
+                <w:b w:val="0"/>
+                <w:color w:val="111827"/>
+                <w:sz w:val="17"/>
+              </w:rPr>
+              <w:t>Deterministic schedule</w:t>
+            </w:r>
+          </w:p>
+        </w:tc>
+        <w:tc>
+          <w:tcPr>
+            <w:tcW w:type="dxa" w:w="4450"/>
+            <w:tcMar>
+              <w:top w:w="80" w:type="dxa"/>
+              <w:start w:w="120" w:type="dxa"/>
+              <w:bottom w:w="80" w:type="dxa"/>
+              <w:end w:w="120" w:type="dxa"/>
+            </w:tcMar>
+            <w:vAlign w:val="center"/>
+            <w:shd w:fill="FFFFFF"/>
+          </w:tcPr>
+          <w:p>
+            <w:pPr>
+              <w:spacing w:before="0" w:after="40" w:line="252" w:lineRule="auto"/>
+              <w:jc w:val="left"/>
+            </w:pPr>
+            <w:r>
+              <w:rPr>
+                <w:rFonts w:ascii="Calibri" w:hAnsi="Calibri"/>
+                <w:b w:val="0"/>
+                <w:color w:val="111827"/>
+                <w:sz w:val="17"/>
+              </w:rPr>
+              <w:t>Reproduce task counts and due boundaries from the same inputs.</w:t>
+            </w:r>
+          </w:p>
+        </w:tc>
+        <w:tc>
+          <w:tcPr>
+            <w:tcW w:type="dxa" w:w="3260"/>
+            <w:tcMar>
+              <w:top w:w="80" w:type="dxa"/>
+              <w:start w:w="120" w:type="dxa"/>
+              <w:bottom w:w="80" w:type="dxa"/>
+              <w:end w:w="120" w:type="dxa"/>
+            </w:tcMar>
+            <w:vAlign w:val="center"/>
+            <w:shd w:fill="FFFFFF"/>
+          </w:tcPr>
+          <w:p>
+            <w:pPr>
+              <w:spacing w:before="0" w:after="40" w:line="252" w:lineRule="auto"/>
+              <w:jc w:val="left"/>
+            </w:pPr>
+            <w:r>
+              <w:rPr>
+                <w:rFonts w:ascii="Calibri" w:hAnsi="Calibri"/>
+                <w:b w:val="0"/>
+                <w:color w:val="111827"/>
+                <w:sz w:val="17"/>
+              </w:rPr>
+              <w:t>Service</w:t>
+            </w:r>
+          </w:p>
+        </w:tc>
+      </w:tr>
+      <w:tr>
+        <w:trPr>
+          <w:cantSplit/>
+        </w:trPr>
+        <w:tc>
+          <w:tcPr>
+            <w:tcW w:type="dxa" w:w="1650"/>
+            <w:tcMar>
+              <w:top w:w="80" w:type="dxa"/>
+              <w:start w:w="120" w:type="dxa"/>
+              <w:bottom w:w="80" w:type="dxa"/>
+              <w:end w:w="120" w:type="dxa"/>
+            </w:tcMar>
+            <w:vAlign w:val="center"/>
+            <w:shd w:fill="FFFFFF"/>
+          </w:tcPr>
+          <w:p>
+            <w:pPr>
+              <w:spacing w:before="0" w:after="40" w:line="252" w:lineRule="auto"/>
+              <w:jc w:val="center"/>
+            </w:pPr>
+            <w:r>
+              <w:rPr>
+                <w:rFonts w:ascii="Calibri" w:hAnsi="Calibri"/>
+                <w:b w:val="0"/>
+                <w:color w:val="111827"/>
+                <w:sz w:val="17"/>
+              </w:rPr>
+              <w:t>Large advance bound</w:t>
+            </w:r>
+          </w:p>
+        </w:tc>
+        <w:tc>
+          <w:tcPr>
+            <w:tcW w:type="dxa" w:w="4450"/>
+            <w:tcMar>
+              <w:top w:w="80" w:type="dxa"/>
+              <w:start w:w="120" w:type="dxa"/>
+              <w:bottom w:w="80" w:type="dxa"/>
+              <w:end w:w="120" w:type="dxa"/>
+            </w:tcMar>
+            <w:vAlign w:val="center"/>
+            <w:shd w:fill="FFFFFF"/>
+          </w:tcPr>
+          <w:p>
+            <w:pPr>
+              <w:spacing w:before="0" w:after="40" w:line="252" w:lineRule="auto"/>
+              <w:jc w:val="left"/>
+            </w:pPr>
+            <w:r>
+              <w:rPr>
+                <w:rFonts w:ascii="Calibri" w:hAnsi="Calibri"/>
+                <w:b w:val="0"/>
+                <w:color w:val="111827"/>
+                <w:sz w:val="17"/>
+              </w:rPr>
+              <w:t>Keep output proportional to tasks rather than elapsed cycles.</w:t>
+            </w:r>
+          </w:p>
+        </w:tc>
+        <w:tc>
+          <w:tcPr>
+            <w:tcW w:type="dxa" w:w="3260"/>
+            <w:tcMar>
+              <w:top w:w="80" w:type="dxa"/>
+              <w:start w:w="120" w:type="dxa"/>
+              <w:bottom w:w="80" w:type="dxa"/>
+              <w:end w:w="120" w:type="dxa"/>
+            </w:tcMar>
+            <w:vAlign w:val="center"/>
+            <w:shd w:fill="FFFFFF"/>
+          </w:tcPr>
+          <w:p>
+            <w:pPr>
+              <w:spacing w:before="0" w:after="40" w:line="252" w:lineRule="auto"/>
+              <w:jc w:val="left"/>
+            </w:pPr>
+            <w:r>
+              <w:rPr>
+                <w:rFonts w:ascii="Calibri" w:hAnsi="Calibri"/>
+                <w:b w:val="0"/>
+                <w:color w:val="111827"/>
+                <w:sz w:val="17"/>
+              </w:rPr>
+              <w:t>Service</w:t>
+            </w:r>
+          </w:p>
+        </w:tc>
+      </w:tr>
+      <w:tr>
+        <w:trPr>
+          <w:cantSplit/>
+        </w:trPr>
+        <w:tc>
+          <w:tcPr>
+            <w:tcW w:type="dxa" w:w="1650"/>
+            <w:tcMar>
+              <w:top w:w="80" w:type="dxa"/>
+              <w:start w:w="120" w:type="dxa"/>
+              <w:bottom w:w="80" w:type="dxa"/>
+              <w:end w:w="120" w:type="dxa"/>
+            </w:tcMar>
+            <w:vAlign w:val="center"/>
+            <w:shd w:fill="FFFFFF"/>
+          </w:tcPr>
+          <w:p>
+            <w:pPr>
+              <w:spacing w:before="0" w:after="40" w:line="252" w:lineRule="auto"/>
+              <w:jc w:val="center"/>
+            </w:pPr>
+            <w:r>
+              <w:rPr>
+                <w:rFonts w:ascii="Calibri" w:hAnsi="Calibri"/>
+                <w:b w:val="0"/>
+                <w:color w:val="111827"/>
+                <w:sz w:val="17"/>
+              </w:rPr>
+              <w:t>Offline execution rejection</w:t>
+            </w:r>
+          </w:p>
+        </w:tc>
+        <w:tc>
+          <w:tcPr>
+            <w:tcW w:type="dxa" w:w="4450"/>
+            <w:tcMar>
+              <w:top w:w="80" w:type="dxa"/>
+              <w:start w:w="120" w:type="dxa"/>
+              <w:bottom w:w="80" w:type="dxa"/>
+              <w:end w:w="120" w:type="dxa"/>
+            </w:tcMar>
+            <w:vAlign w:val="center"/>
+            <w:shd w:fill="FFFFFF"/>
+          </w:tcPr>
+          <w:p>
+            <w:pPr>
+              <w:spacing w:before="0" w:after="40" w:line="252" w:lineRule="auto"/>
+              <w:jc w:val="left"/>
+            </w:pPr>
+            <w:r>
+              <w:rPr>
+                <w:rFonts w:ascii="Calibri" w:hAnsi="Calibri"/>
+                <w:b w:val="0"/>
+                <w:color w:val="111827"/>
+                <w:sz w:val="17"/>
+              </w:rPr>
+              <w:t>Prevent cyclic execution outside running/degraded states.</w:t>
+            </w:r>
+          </w:p>
+        </w:tc>
+        <w:tc>
+          <w:tcPr>
+            <w:tcW w:type="dxa" w:w="3260"/>
+            <w:tcMar>
+              <w:top w:w="80" w:type="dxa"/>
+              <w:start w:w="120" w:type="dxa"/>
+              <w:bottom w:w="80" w:type="dxa"/>
+              <w:end w:w="120" w:type="dxa"/>
+            </w:tcMar>
+            <w:vAlign w:val="center"/>
+            <w:shd w:fill="FFFFFF"/>
+          </w:tcPr>
+          <w:p>
+            <w:pPr>
+              <w:spacing w:before="0" w:after="40" w:line="252" w:lineRule="auto"/>
+              <w:jc w:val="left"/>
+            </w:pPr>
+            <w:r>
+              <w:rPr>
+                <w:rFonts w:ascii="Calibri" w:hAnsi="Calibri"/>
+                <w:b w:val="0"/>
+                <w:color w:val="111827"/>
+                <w:sz w:val="17"/>
+              </w:rPr>
+              <w:t>Service/API</w:t>
+            </w:r>
+          </w:p>
+        </w:tc>
+      </w:tr>
+      <w:tr>
+        <w:trPr>
+          <w:cantSplit/>
+        </w:trPr>
+        <w:tc>
+          <w:tcPr>
+            <w:tcW w:type="dxa" w:w="1650"/>
+            <w:tcMar>
+              <w:top w:w="80" w:type="dxa"/>
+              <w:start w:w="120" w:type="dxa"/>
+              <w:bottom w:w="80" w:type="dxa"/>
+              <w:end w:w="120" w:type="dxa"/>
+            </w:tcMar>
+            <w:vAlign w:val="center"/>
+            <w:shd w:fill="FFFFFF"/>
+          </w:tcPr>
+          <w:p>
+            <w:pPr>
+              <w:spacing w:before="0" w:after="40" w:line="252" w:lineRule="auto"/>
+              <w:jc w:val="center"/>
+            </w:pPr>
+            <w:r>
+              <w:rPr>
+                <w:rFonts w:ascii="Calibri" w:hAnsi="Calibri"/>
+                <w:b w:val="0"/>
+                <w:color w:val="111827"/>
+                <w:sz w:val="17"/>
+              </w:rPr>
+              <w:t>Advance exact retry</w:t>
+            </w:r>
+          </w:p>
+        </w:tc>
+        <w:tc>
+          <w:tcPr>
+            <w:tcW w:type="dxa" w:w="4450"/>
+            <w:tcMar>
+              <w:top w:w="80" w:type="dxa"/>
+              <w:start w:w="120" w:type="dxa"/>
+              <w:bottom w:w="80" w:type="dxa"/>
+              <w:end w:w="120" w:type="dxa"/>
+            </w:tcMar>
+            <w:vAlign w:val="center"/>
+            <w:shd w:fill="FFFFFF"/>
+          </w:tcPr>
+          <w:p>
+            <w:pPr>
+              <w:spacing w:before="0" w:after="40" w:line="252" w:lineRule="auto"/>
+              <w:jc w:val="left"/>
+            </w:pPr>
+            <w:r>
+              <w:rPr>
+                <w:rFonts w:ascii="Calibri" w:hAnsi="Calibri"/>
+                <w:b w:val="0"/>
+                <w:color w:val="111827"/>
+                <w:sz w:val="17"/>
+              </w:rPr>
+              <w:t>Prevent logical time and version from advancing twice.</w:t>
+            </w:r>
+          </w:p>
+        </w:tc>
+        <w:tc>
+          <w:tcPr>
+            <w:tcW w:type="dxa" w:w="3260"/>
+            <w:tcMar>
+              <w:top w:w="80" w:type="dxa"/>
+              <w:start w:w="120" w:type="dxa"/>
+              <w:bottom w:w="80" w:type="dxa"/>
+              <w:end w:w="120" w:type="dxa"/>
+            </w:tcMar>
+            <w:vAlign w:val="center"/>
+            <w:shd w:fill="FFFFFF"/>
+          </w:tcPr>
+          <w:p>
+            <w:pPr>
+              <w:spacing w:before="0" w:after="40" w:line="252" w:lineRule="auto"/>
+              <w:jc w:val="left"/>
+            </w:pPr>
+            <w:r>
+              <w:rPr>
+                <w:rFonts w:ascii="Calibri" w:hAnsi="Calibri"/>
+                <w:b w:val="0"/>
+                <w:color w:val="111827"/>
+                <w:sz w:val="17"/>
+              </w:rPr>
+              <w:t>Service</w:t>
+            </w:r>
+          </w:p>
+        </w:tc>
+      </w:tr>
+      <w:tr>
+        <w:trPr>
+          <w:cantSplit/>
+        </w:trPr>
+        <w:tc>
+          <w:tcPr>
+            <w:tcW w:type="dxa" w:w="1650"/>
+            <w:tcMar>
+              <w:top w:w="80" w:type="dxa"/>
+              <w:start w:w="120" w:type="dxa"/>
+              <w:bottom w:w="80" w:type="dxa"/>
+              <w:end w:w="120" w:type="dxa"/>
+            </w:tcMar>
+            <w:vAlign w:val="center"/>
+            <w:shd w:fill="FFFFFF"/>
+          </w:tcPr>
+          <w:p>
+            <w:pPr>
+              <w:spacing w:before="0" w:after="40" w:line="252" w:lineRule="auto"/>
+              <w:jc w:val="center"/>
+            </w:pPr>
+            <w:r>
+              <w:rPr>
+                <w:rFonts w:ascii="Calibri" w:hAnsi="Calibri"/>
+                <w:b w:val="0"/>
+                <w:color w:val="111827"/>
+                <w:sz w:val="17"/>
+              </w:rPr>
+              <w:t>Command-ID conflict</w:t>
+            </w:r>
+          </w:p>
+        </w:tc>
+        <w:tc>
+          <w:tcPr>
+            <w:tcW w:type="dxa" w:w="4450"/>
+            <w:tcMar>
+              <w:top w:w="80" w:type="dxa"/>
+              <w:start w:w="120" w:type="dxa"/>
+              <w:bottom w:w="80" w:type="dxa"/>
+              <w:end w:w="120" w:type="dxa"/>
+            </w:tcMar>
+            <w:vAlign w:val="center"/>
+            <w:shd w:fill="FFFFFF"/>
+          </w:tcPr>
+          <w:p>
+            <w:pPr>
+              <w:spacing w:before="0" w:after="40" w:line="252" w:lineRule="auto"/>
+              <w:jc w:val="left"/>
+            </w:pPr>
+            <w:r>
+              <w:rPr>
+                <w:rFonts w:ascii="Calibri" w:hAnsi="Calibri"/>
+                <w:b w:val="0"/>
+                <w:color w:val="111827"/>
+                <w:sz w:val="17"/>
+              </w:rPr>
+              <w:t>Reject reuse of an ID with a different command.</w:t>
+            </w:r>
+          </w:p>
+        </w:tc>
+        <w:tc>
+          <w:tcPr>
+            <w:tcW w:type="dxa" w:w="3260"/>
+            <w:tcMar>
+              <w:top w:w="80" w:type="dxa"/>
+              <w:start w:w="120" w:type="dxa"/>
+              <w:bottom w:w="80" w:type="dxa"/>
+              <w:end w:w="120" w:type="dxa"/>
+            </w:tcMar>
+            <w:vAlign w:val="center"/>
+            <w:shd w:fill="FFFFFF"/>
+          </w:tcPr>
+          <w:p>
+            <w:pPr>
+              <w:spacing w:before="0" w:after="40" w:line="252" w:lineRule="auto"/>
+              <w:jc w:val="left"/>
+            </w:pPr>
+            <w:r>
+              <w:rPr>
+                <w:rFonts w:ascii="Calibri" w:hAnsi="Calibri"/>
+                <w:b w:val="0"/>
+                <w:color w:val="111827"/>
+                <w:sz w:val="17"/>
+              </w:rPr>
+              <w:t>Service/API</w:t>
+            </w:r>
+          </w:p>
+        </w:tc>
+      </w:tr>
+      <w:tr>
+        <w:trPr>
+          <w:cantSplit/>
+        </w:trPr>
+        <w:tc>
+          <w:tcPr>
+            <w:tcW w:type="dxa" w:w="1650"/>
+            <w:tcMar>
+              <w:top w:w="80" w:type="dxa"/>
+              <w:start w:w="120" w:type="dxa"/>
+              <w:bottom w:w="80" w:type="dxa"/>
+              <w:end w:w="120" w:type="dxa"/>
+            </w:tcMar>
+            <w:vAlign w:val="center"/>
+            <w:shd w:fill="FFFFFF"/>
+          </w:tcPr>
+          <w:p>
+            <w:pPr>
+              <w:spacing w:before="0" w:after="40" w:line="252" w:lineRule="auto"/>
+              <w:jc w:val="center"/>
+            </w:pPr>
+            <w:r>
+              <w:rPr>
+                <w:rFonts w:ascii="Calibri" w:hAnsi="Calibri"/>
+                <w:b w:val="0"/>
+                <w:color w:val="111827"/>
+                <w:sz w:val="17"/>
+              </w:rPr>
+              <w:t>Reset duration matrix</w:t>
+            </w:r>
+          </w:p>
+        </w:tc>
+        <w:tc>
+          <w:tcPr>
+            <w:tcW w:type="dxa" w:w="4450"/>
+            <w:tcMar>
+              <w:top w:w="80" w:type="dxa"/>
+              <w:start w:w="120" w:type="dxa"/>
+              <w:bottom w:w="80" w:type="dxa"/>
+              <w:end w:w="120" w:type="dxa"/>
+            </w:tcMar>
+            <w:vAlign w:val="center"/>
+            <w:shd w:fill="FFFFFF"/>
+          </w:tcPr>
+          <w:p>
+            <w:pPr>
+              <w:spacing w:before="0" w:after="40" w:line="252" w:lineRule="auto"/>
+              <w:jc w:val="left"/>
+            </w:pPr>
+            <w:r>
+              <w:rPr>
+                <w:rFonts w:ascii="Calibri" w:hAnsi="Calibri"/>
+                <w:b w:val="0"/>
+                <w:color w:val="111827"/>
+                <w:sz w:val="17"/>
+              </w:rPr>
+              <w:t>Verify fixed soft, hard, and power-cycle durations.</w:t>
+            </w:r>
+          </w:p>
+        </w:tc>
+        <w:tc>
+          <w:tcPr>
+            <w:tcW w:type="dxa" w:w="3260"/>
+            <w:tcMar>
+              <w:top w:w="80" w:type="dxa"/>
+              <w:start w:w="120" w:type="dxa"/>
+              <w:bottom w:w="80" w:type="dxa"/>
+              <w:end w:w="120" w:type="dxa"/>
+            </w:tcMar>
+            <w:vAlign w:val="center"/>
+            <w:shd w:fill="FFFFFF"/>
+          </w:tcPr>
+          <w:p>
+            <w:pPr>
+              <w:spacing w:before="0" w:after="40" w:line="252" w:lineRule="auto"/>
+              <w:jc w:val="left"/>
+            </w:pPr>
+            <w:r>
+              <w:rPr>
+                <w:rFonts w:ascii="Calibri" w:hAnsi="Calibri"/>
+                <w:b w:val="0"/>
+                <w:color w:val="111827"/>
+                <w:sz w:val="17"/>
+              </w:rPr>
+              <w:t>Unit/service</w:t>
+            </w:r>
+          </w:p>
+        </w:tc>
+      </w:tr>
+      <w:tr>
+        <w:trPr>
+          <w:cantSplit/>
+        </w:trPr>
+        <w:tc>
+          <w:tcPr>
+            <w:tcW w:type="dxa" w:w="1650"/>
+            <w:tcMar>
+              <w:top w:w="80" w:type="dxa"/>
+              <w:start w:w="120" w:type="dxa"/>
+              <w:bottom w:w="80" w:type="dxa"/>
+              <w:end w:w="120" w:type="dxa"/>
+            </w:tcMar>
+            <w:vAlign w:val="center"/>
+            <w:shd w:fill="FFFFFF"/>
+          </w:tcPr>
+          <w:p>
+            <w:pPr>
+              <w:spacing w:before="0" w:after="40" w:line="252" w:lineRule="auto"/>
+              <w:jc w:val="center"/>
+            </w:pPr>
+            <w:r>
+              <w:rPr>
+                <w:rFonts w:ascii="Calibri" w:hAnsi="Calibri"/>
+                <w:b w:val="0"/>
+                <w:color w:val="111827"/>
+                <w:sz w:val="17"/>
+              </w:rPr>
+              <w:t>Reset preservation</w:t>
+            </w:r>
+          </w:p>
+        </w:tc>
+        <w:tc>
+          <w:tcPr>
+            <w:tcW w:type="dxa" w:w="4450"/>
+            <w:tcMar>
+              <w:top w:w="80" w:type="dxa"/>
+              <w:start w:w="120" w:type="dxa"/>
+              <w:bottom w:w="80" w:type="dxa"/>
+              <w:end w:w="120" w:type="dxa"/>
+            </w:tcMar>
+            <w:vAlign w:val="center"/>
+            <w:shd w:fill="FFFFFF"/>
+          </w:tcPr>
+          <w:p>
+            <w:pPr>
+              <w:spacing w:before="0" w:after="40" w:line="252" w:lineRule="auto"/>
+              <w:jc w:val="left"/>
+            </w:pPr>
+            <w:r>
+              <w:rPr>
+                <w:rFonts w:ascii="Calibri" w:hAnsi="Calibri"/>
+                <w:b w:val="0"/>
+                <w:color w:val="111827"/>
+                <w:sz w:val="17"/>
+              </w:rPr>
+              <w:t>Prove memory and faults remain unchanged in III-2.</w:t>
+            </w:r>
+          </w:p>
+        </w:tc>
+        <w:tc>
+          <w:tcPr>
+            <w:tcW w:type="dxa" w:w="3260"/>
+            <w:tcMar>
+              <w:top w:w="80" w:type="dxa"/>
+              <w:start w:w="120" w:type="dxa"/>
+              <w:bottom w:w="80" w:type="dxa"/>
+              <w:end w:w="120" w:type="dxa"/>
+            </w:tcMar>
+            <w:vAlign w:val="center"/>
+            <w:shd w:fill="FFFFFF"/>
+          </w:tcPr>
+          <w:p>
+            <w:pPr>
+              <w:spacing w:before="0" w:after="40" w:line="252" w:lineRule="auto"/>
+              <w:jc w:val="left"/>
+            </w:pPr>
+            <w:r>
+              <w:rPr>
+                <w:rFonts w:ascii="Calibri" w:hAnsi="Calibri"/>
+                <w:b w:val="0"/>
+                <w:color w:val="111827"/>
+                <w:sz w:val="17"/>
+              </w:rPr>
+              <w:t>Service</w:t>
+            </w:r>
+          </w:p>
+        </w:tc>
+      </w:tr>
+      <w:tr>
+        <w:trPr>
+          <w:cantSplit/>
+        </w:trPr>
+        <w:tc>
+          <w:tcPr>
+            <w:tcW w:type="dxa" w:w="1650"/>
+            <w:tcMar>
+              <w:top w:w="80" w:type="dxa"/>
+              <w:start w:w="120" w:type="dxa"/>
+              <w:bottom w:w="80" w:type="dxa"/>
+              <w:end w:w="120" w:type="dxa"/>
+            </w:tcMar>
+            <w:vAlign w:val="center"/>
+            <w:shd w:fill="FFFFFF"/>
+          </w:tcPr>
+          <w:p>
+            <w:pPr>
+              <w:spacing w:before="0" w:after="40" w:line="252" w:lineRule="auto"/>
+              <w:jc w:val="center"/>
+            </w:pPr>
+            <w:r>
+              <w:rPr>
+                <w:rFonts w:ascii="Calibri" w:hAnsi="Calibri"/>
+                <w:b w:val="0"/>
+                <w:color w:val="111827"/>
+                <w:sz w:val="17"/>
+              </w:rPr>
+              <w:t>Reset boot counter</w:t>
+            </w:r>
+          </w:p>
+        </w:tc>
+        <w:tc>
+          <w:tcPr>
+            <w:tcW w:type="dxa" w:w="4450"/>
+            <w:tcMar>
+              <w:top w:w="80" w:type="dxa"/>
+              <w:start w:w="120" w:type="dxa"/>
+              <w:bottom w:w="80" w:type="dxa"/>
+              <w:end w:w="120" w:type="dxa"/>
+            </w:tcMar>
+            <w:vAlign w:val="center"/>
+            <w:shd w:fill="FFFFFF"/>
+          </w:tcPr>
+          <w:p>
+            <w:pPr>
+              <w:spacing w:before="0" w:after="40" w:line="252" w:lineRule="auto"/>
+              <w:jc w:val="left"/>
+            </w:pPr>
+            <w:r>
+              <w:rPr>
+                <w:rFonts w:ascii="Calibri" w:hAnsi="Calibri"/>
+                <w:b w:val="0"/>
+                <w:color w:val="111827"/>
+                <w:sz w:val="17"/>
+              </w:rPr>
+              <w:t>Increment boot count exactly once, including after retry.</w:t>
+            </w:r>
+          </w:p>
+        </w:tc>
+        <w:tc>
+          <w:tcPr>
+            <w:tcW w:type="dxa" w:w="3260"/>
+            <w:tcMar>
+              <w:top w:w="80" w:type="dxa"/>
+              <w:start w:w="120" w:type="dxa"/>
+              <w:bottom w:w="80" w:type="dxa"/>
+              <w:end w:w="120" w:type="dxa"/>
+            </w:tcMar>
+            <w:vAlign w:val="center"/>
+            <w:shd w:fill="FFFFFF"/>
+          </w:tcPr>
+          <w:p>
+            <w:pPr>
+              <w:spacing w:before="0" w:after="40" w:line="252" w:lineRule="auto"/>
+              <w:jc w:val="left"/>
+            </w:pPr>
+            <w:r>
+              <w:rPr>
+                <w:rFonts w:ascii="Calibri" w:hAnsi="Calibri"/>
+                <w:b w:val="0"/>
+                <w:color w:val="111827"/>
+                <w:sz w:val="17"/>
+              </w:rPr>
+              <w:t>Service</w:t>
+            </w:r>
+          </w:p>
+        </w:tc>
+      </w:tr>
+      <w:tr>
+        <w:trPr>
+          <w:cantSplit/>
+        </w:trPr>
+        <w:tc>
+          <w:tcPr>
+            <w:tcW w:type="dxa" w:w="1650"/>
+            <w:tcMar>
+              <w:top w:w="80" w:type="dxa"/>
+              <w:start w:w="120" w:type="dxa"/>
+              <w:bottom w:w="80" w:type="dxa"/>
+              <w:end w:w="120" w:type="dxa"/>
+            </w:tcMar>
+            <w:vAlign w:val="center"/>
+            <w:shd w:fill="FFFFFF"/>
+          </w:tcPr>
+          <w:p>
+            <w:pPr>
+              <w:spacing w:before="0" w:after="40" w:line="252" w:lineRule="auto"/>
+              <w:jc w:val="center"/>
+            </w:pPr>
+            <w:r>
+              <w:rPr>
+                <w:rFonts w:ascii="Calibri" w:hAnsi="Calibri"/>
+                <w:b w:val="0"/>
+                <w:color w:val="111827"/>
+                <w:sz w:val="17"/>
+              </w:rPr>
+              <w:t>Critical reset invariant</w:t>
+            </w:r>
+          </w:p>
+        </w:tc>
+        <w:tc>
+          <w:tcPr>
+            <w:tcW w:type="dxa" w:w="4450"/>
+            <w:tcMar>
+              <w:top w:w="80" w:type="dxa"/>
+              <w:start w:w="120" w:type="dxa"/>
+              <w:bottom w:w="80" w:type="dxa"/>
+              <w:end w:w="120" w:type="dxa"/>
+            </w:tcMar>
+            <w:vAlign w:val="center"/>
+            <w:shd w:fill="FFFFFF"/>
+          </w:tcPr>
+          <w:p>
+            <w:pPr>
+              <w:spacing w:before="0" w:after="40" w:line="252" w:lineRule="auto"/>
+              <w:jc w:val="left"/>
+            </w:pPr>
+            <w:r>
+              <w:rPr>
+                <w:rFonts w:ascii="Calibri" w:hAnsi="Calibri"/>
+                <w:b w:val="0"/>
+                <w:color w:val="111827"/>
+                <w:sz w:val="17"/>
+              </w:rPr>
+              <w:t>Keep fault state while a confirmed critical fault remains.</w:t>
+            </w:r>
+          </w:p>
+        </w:tc>
+        <w:tc>
+          <w:tcPr>
+            <w:tcW w:type="dxa" w:w="3260"/>
+            <w:tcMar>
+              <w:top w:w="80" w:type="dxa"/>
+              <w:start w:w="120" w:type="dxa"/>
+              <w:bottom w:w="80" w:type="dxa"/>
+              <w:end w:w="120" w:type="dxa"/>
+            </w:tcMar>
+            <w:vAlign w:val="center"/>
+            <w:shd w:fill="FFFFFF"/>
+          </w:tcPr>
+          <w:p>
+            <w:pPr>
+              <w:spacing w:before="0" w:after="40" w:line="252" w:lineRule="auto"/>
+              <w:jc w:val="left"/>
+            </w:pPr>
+            <w:r>
+              <w:rPr>
+                <w:rFonts w:ascii="Calibri" w:hAnsi="Calibri"/>
+                <w:b w:val="0"/>
+                <w:color w:val="111827"/>
+                <w:sz w:val="17"/>
+              </w:rPr>
+              <w:t>Service</w:t>
+            </w:r>
+          </w:p>
+        </w:tc>
+      </w:tr>
+    </w:tbl>
+    <w:p>
+      <w:pPr>
+        <w:spacing w:after="60"/>
+      </w:pPr>
+    </w:p>
+    <w:p>
+      <w:pPr>
+        <w:pStyle w:val="Heading1"/>
+        <w:keepNext/>
+        <w:keepLines/>
+        <w:pageBreakBefore/>
       </w:pPr>
       <w:r>
         <w:t>12. Implemented Evidence</w:t>
@@ -4541,7 +5907,7 @@
           <w:color w:val="111827"/>
           <w:sz w:val="22"/>
         </w:rPr>
-        <w:t xml:space="preserve">Migration </w:t>
+        <w:t xml:space="preserve">Migrations </w:t>
       </w:r>
       <w:r>
         <w:rPr>
@@ -4557,7 +5923,23 @@
           <w:color w:val="111827"/>
           <w:sz w:val="22"/>
         </w:rPr>
-        <w:t xml:space="preserve"> owns the database schema.</w:t>
+        <w:t xml:space="preserve"> and </w:t>
+      </w:r>
+      <w:r>
+        <w:rPr>
+          <w:rFonts w:ascii="Consolas" w:hAnsi="Consolas"/>
+          <w:color w:val="1F4D78"/>
+          <w:sz w:val="19"/>
+        </w:rPr>
+        <w:t>0019_ecu_execution_clock</w:t>
+      </w:r>
+      <w:r>
+        <w:rPr>
+          <w:rFonts w:ascii="Calibri" w:hAnsi="Calibri"/>
+          <w:color w:val="111827"/>
+          <w:sz w:val="22"/>
+        </w:rPr>
+        <w:t xml:space="preserve"> own the database schema.</w:t>
       </w:r>
     </w:p>
     <w:p>
@@ -4648,6 +6030,55 @@
           <w:sz w:val="19"/>
         </w:rPr>
         <w:t>atep.ecu.state.updated.v1</w:t>
+      </w:r>
+      <w:r>
+        <w:rPr>
+          <w:rFonts w:ascii="Calibri" w:hAnsi="Calibri"/>
+          <w:color w:val="111827"/>
+          <w:sz w:val="22"/>
+        </w:rPr>
+        <w:t>.</w:t>
+      </w:r>
+    </w:p>
+    <w:p>
+      <w:pPr>
+        <w:pStyle w:val="ListBullet"/>
+        <w:numPr>
+          <w:ilvl w:val="0"/>
+          <w:numId w:val="13"/>
+        </w:numPr>
+      </w:pPr>
+      <w:r>
+        <w:rPr>
+          <w:rFonts w:ascii="Calibri" w:hAnsi="Calibri"/>
+          <w:color w:val="111827"/>
+          <w:sz w:val="22"/>
+        </w:rPr>
+        <w:t xml:space="preserve">Simulation events are </w:t>
+      </w:r>
+      <w:r>
+        <w:rPr>
+          <w:rFonts w:ascii="Consolas" w:hAnsi="Consolas"/>
+          <w:color w:val="1F4D78"/>
+          <w:sz w:val="19"/>
+        </w:rPr>
+        <w:t>atep.ecu.simulation.advanced.v1</w:t>
+      </w:r>
+      <w:r>
+        <w:rPr>
+          <w:rFonts w:ascii="Calibri" w:hAnsi="Calibri"/>
+          <w:color w:val="111827"/>
+          <w:sz w:val="22"/>
+        </w:rPr>
+        <w:t xml:space="preserve"> and </w:t>
+      </w:r>
+      <w:r>
+        <w:rPr>
+          <w:rFonts w:ascii="Consolas" w:hAnsi="Consolas"/>
+          <w:color w:val="1F4D78"/>
+          <w:sz w:val="19"/>
+        </w:rPr>
+        <w:t>atep.ecu.reset.completed.v1</w:t>
       </w:r>
       <w:r>
         <w:rPr>
@@ -4787,7 +6218,7 @@
           <w:color w:val="111827"/>
           <w:sz w:val="22"/>
         </w:rPr>
-        <w:t xml:space="preserve">The next increment adds a deterministic logical clock, cyclic tasks, and reset semantics without wall-clock sleeps. Later increments add ECU profiles, memory regions, fault lifecycle, CAN contracts, and multi-ECU scenarios. See </w:t>
+        <w:t xml:space="preserve">The next increment adds ECU-specific behavior profiles on top of the deterministic task clock. Later increments add memory regions, fault lifecycle, CAN contracts, and multi-ECU scenarios. See </w:t>
       </w:r>
       <w:r>
         <w:rPr>
@@ -4903,20 +6334,10 @@
     </w:p>
     <w:p>
       <w:pPr>
-        <w:pStyle w:val="Heading1"/>
-        <w:keepNext/>
-        <w:keepLines/>
-      </w:pPr>
-      <w:r>
-        <w:t>16. Workbook Maintenance Checklist</w:t>
-      </w:r>
-    </w:p>
-    <w:p>
-      <w:pPr>
-        <w:pStyle w:val="ListBullet"/>
+        <w:pStyle w:val="ListNumber"/>
         <w:numPr>
           <w:ilvl w:val="0"/>
-          <w:numId w:val="16"/>
+          <w:numId w:val="15"/>
         </w:numPr>
       </w:pPr>
       <w:r>
@@ -4925,15 +6346,15 @@
           <w:color w:val="111827"/>
           <w:sz w:val="22"/>
         </w:rPr>
-        <w:t>Update requirement status and evidence with every increment.</w:t>
+        <w:t>Calculate the due times for a 100 ms task with a 20 ms offset over two consecutive advances.</w:t>
       </w:r>
     </w:p>
     <w:p>
       <w:pPr>
-        <w:pStyle w:val="ListBullet"/>
+        <w:pStyle w:val="ListNumber"/>
         <w:numPr>
           <w:ilvl w:val="0"/>
-          <w:numId w:val="16"/>
+          <w:numId w:val="15"/>
         </w:numPr>
       </w:pPr>
       <w:r>
@@ -4942,41 +6363,7 @@
           <w:color w:val="111827"/>
           <w:sz w:val="22"/>
         </w:rPr>
-        <w:t>Add each architecture decision before introducing its implementation dependency.</w:t>
-      </w:r>
-    </w:p>
-    <w:p>
-      <w:pPr>
-        <w:pStyle w:val="ListBullet"/>
-        <w:numPr>
-          <w:ilvl w:val="0"/>
-          <w:numId w:val="16"/>
-        </w:numPr>
-      </w:pPr>
-      <w:r>
-        <w:rPr>
-          <w:rFonts w:ascii="Calibri" w:hAnsi="Calibri"/>
-          <w:color w:val="111827"/>
-          <w:sz w:val="22"/>
-        </w:rPr>
-        <w:t>Record public event names and stable errors.</w:t>
-      </w:r>
-    </w:p>
-    <w:p>
-      <w:pPr>
-        <w:pStyle w:val="ListBullet"/>
-        <w:numPr>
-          <w:ilvl w:val="0"/>
-          <w:numId w:val="16"/>
-        </w:numPr>
-      </w:pPr>
-      <w:r>
-        <w:rPr>
-          <w:rFonts w:ascii="Calibri" w:hAnsi="Calibri"/>
-          <w:color w:val="111827"/>
-          <w:sz w:val="22"/>
-        </w:rPr>
-        <w:t>Keep test objectives aligned with automated test names.</w:t>
+        <w:t>Explain why III-2 reset preserves memory and how III-4 can refine that contract safely.</w:t>
       </w:r>
     </w:p>
     <w:sectPr>
@@ -5008,7 +6395,7 @@
         <w:color w:val="667085"/>
         <w:sz w:val="17"/>
       </w:rPr>
-      <w:t>ATEP Volume III Workbook  |  Version 0.1.0</w:t>
+      <w:t>ATEP Volume III Workbook  |  Version 0.2.0</w:t>
     </w:r>
     <w:r>
       <w:rPr>
@@ -5321,12 +6708,6 @@
   </w:num>
   <w:num w:numId="15">
     <w:abstractNumId w:val="9"/>
-    <w:lvlOverride w:ilvl="0">
-      <w:startOverride w:val="1"/>
-    </w:lvlOverride>
-  </w:num>
-  <w:num w:numId="16">
-    <w:abstractNumId w:val="10"/>
     <w:lvlOverride w:ilvl="0">
       <w:startOverride w:val="1"/>
     </w:lvlOverride>

</xml_diff>

<commit_message>
feat(ecus): add deterministic execution clock (#51)
</commit_message>
<xml_diff>
--- a/docs/ATEP_Volume_III_ECU_Simulator_Engineering_Workbook.docx
+++ b/docs/ATEP_Volume_III_ECU_Simulator_Engineering_Workbook.docx
@@ -143,7 +143,7 @@
                 <w:color w:val="0B2545"/>
                 <w:sz w:val="19"/>
               </w:rPr>
-              <w:t>0.1.0</w:t>
+              <w:t>0.2.0</w:t>
             </w:r>
           </w:p>
         </w:tc>
@@ -265,7 +265,7 @@
                 <w:color w:val="111827"/>
                 <w:sz w:val="19"/>
               </w:rPr>
-              <w:t>Living document - Increment III-1 implemented</w:t>
+              <w:t>Living document - Increments III-1 and III-2 implemented</w:t>
             </w:r>
           </w:p>
         </w:tc>
@@ -599,6 +599,25 @@
           <w:color w:val="0B2545"/>
           <w:sz w:val="21"/>
         </w:rPr>
+        <w:t>11.1 III-2 Verification</w:t>
+      </w:r>
+    </w:p>
+    <w:p>
+      <w:pPr>
+        <w:pStyle w:val="ListNumber"/>
+        <w:numPr>
+          <w:ilvl w:val="0"/>
+          <w:numId w:val="10"/>
+        </w:numPr>
+        <w:ind w:left="216" w:firstLine="0"/>
+      </w:pPr>
+      <w:r>
+        <w:rPr>
+          <w:rFonts w:ascii="Calibri" w:hAnsi="Calibri"/>
+          <w:b/>
+          <w:color w:val="0B2545"/>
+          <w:sz w:val="21"/>
+        </w:rPr>
         <w:t>12. Implemented Evidence</w:t>
       </w:r>
     </w:p>
@@ -657,25 +676,6 @@
           <w:sz w:val="21"/>
         </w:rPr>
         <w:t>15. Study Exercises</w:t>
-      </w:r>
-    </w:p>
-    <w:p>
-      <w:pPr>
-        <w:pStyle w:val="ListNumber"/>
-        <w:numPr>
-          <w:ilvl w:val="0"/>
-          <w:numId w:val="10"/>
-        </w:numPr>
-        <w:ind w:left="216" w:firstLine="0"/>
-      </w:pPr>
-      <w:r>
-        <w:rPr>
-          <w:rFonts w:ascii="Calibri" w:hAnsi="Calibri"/>
-          <w:b/>
-          <w:color w:val="0B2545"/>
-          <w:sz w:val="21"/>
-        </w:rPr>
-        <w:t>16. Workbook Maintenance Checklist</w:t>
       </w:r>
     </w:p>
     <w:p>
@@ -912,7 +912,7 @@
                 <w:color w:val="111827"/>
                 <w:sz w:val="17"/>
               </w:rPr>
-              <w:t>Increment III-1</w:t>
+              <w:t>Increments III-1 and III-2</w:t>
             </w:r>
           </w:p>
         </w:tc>
@@ -1316,6 +1316,95 @@
           </w:p>
         </w:tc>
       </w:tr>
+      <w:tr>
+        <w:trPr>
+          <w:cantSplit/>
+        </w:trPr>
+        <w:tc>
+          <w:tcPr>
+            <w:tcW w:type="dxa" w:w="1650"/>
+            <w:tcMar>
+              <w:top w:w="80" w:type="dxa"/>
+              <w:start w:w="120" w:type="dxa"/>
+              <w:bottom w:w="80" w:type="dxa"/>
+              <w:end w:w="120" w:type="dxa"/>
+            </w:tcMar>
+            <w:vAlign w:val="center"/>
+            <w:shd w:fill="FFFFFF"/>
+          </w:tcPr>
+          <w:p>
+            <w:pPr>
+              <w:spacing w:before="0" w:after="40" w:line="252" w:lineRule="auto"/>
+              <w:jc w:val="center"/>
+            </w:pPr>
+            <w:r>
+              <w:rPr>
+                <w:rFonts w:ascii="Calibri" w:hAnsi="Calibri"/>
+                <w:b w:val="0"/>
+                <w:color w:val="111827"/>
+                <w:sz w:val="17"/>
+              </w:rPr>
+              <w:t>0.2.0</w:t>
+            </w:r>
+          </w:p>
+        </w:tc>
+        <w:tc>
+          <w:tcPr>
+            <w:tcW w:type="dxa" w:w="4450"/>
+            <w:tcMar>
+              <w:top w:w="80" w:type="dxa"/>
+              <w:start w:w="120" w:type="dxa"/>
+              <w:bottom w:w="80" w:type="dxa"/>
+              <w:end w:w="120" w:type="dxa"/>
+            </w:tcMar>
+            <w:vAlign w:val="center"/>
+            <w:shd w:fill="FFFFFF"/>
+          </w:tcPr>
+          <w:p>
+            <w:pPr>
+              <w:spacing w:before="0" w:after="40" w:line="252" w:lineRule="auto"/>
+              <w:jc w:val="left"/>
+            </w:pPr>
+            <w:r>
+              <w:rPr>
+                <w:rFonts w:ascii="Calibri" w:hAnsi="Calibri"/>
+                <w:b w:val="0"/>
+                <w:color w:val="111827"/>
+                <w:sz w:val="17"/>
+              </w:rPr>
+              <w:t>2026-08-24</w:t>
+            </w:r>
+          </w:p>
+        </w:tc>
+        <w:tc>
+          <w:tcPr>
+            <w:tcW w:type="dxa" w:w="3260"/>
+            <w:tcMar>
+              <w:top w:w="80" w:type="dxa"/>
+              <w:start w:w="120" w:type="dxa"/>
+              <w:bottom w:w="80" w:type="dxa"/>
+              <w:end w:w="120" w:type="dxa"/>
+            </w:tcMar>
+            <w:vAlign w:val="center"/>
+            <w:shd w:fill="FFFFFF"/>
+          </w:tcPr>
+          <w:p>
+            <w:pPr>
+              <w:spacing w:before="0" w:after="40" w:line="252" w:lineRule="auto"/>
+              <w:jc w:val="left"/>
+            </w:pPr>
+            <w:r>
+              <w:rPr>
+                <w:rFonts w:ascii="Calibri" w:hAnsi="Calibri"/>
+                <w:b w:val="0"/>
+                <w:color w:val="111827"/>
+                <w:sz w:val="17"/>
+              </w:rPr>
+              <w:t>Added logical time, cyclic scheduling, reset modes, replay evidence, APIs, and tests.</w:t>
+            </w:r>
+          </w:p>
+        </w:tc>
+      </w:tr>
     </w:tbl>
     <w:p>
       <w:pPr>
@@ -1480,6 +1569,40 @@
     </w:p>
     <w:p>
       <w:pPr>
+        <w:pStyle w:val="ListBullet"/>
+        <w:numPr>
+          <w:ilvl w:val="0"/>
+          <w:numId w:val="11"/>
+        </w:numPr>
+      </w:pPr>
+      <w:r>
+        <w:rPr>
+          <w:rFonts w:ascii="Calibri" w:hAnsi="Calibri"/>
+          <w:color w:val="111827"/>
+          <w:sz w:val="22"/>
+        </w:rPr>
+        <w:t>Per-ECU logical time, cyclic task schedules, and boot counters.</w:t>
+      </w:r>
+    </w:p>
+    <w:p>
+      <w:pPr>
+        <w:pStyle w:val="ListBullet"/>
+        <w:numPr>
+          <w:ilvl w:val="0"/>
+          <w:numId w:val="11"/>
+        </w:numPr>
+      </w:pPr>
+      <w:r>
+        <w:rPr>
+          <w:rFonts w:ascii="Calibri" w:hAnsi="Calibri"/>
+          <w:color w:val="111827"/>
+          <w:sz w:val="22"/>
+        </w:rPr>
+        <w:t>Idempotent advance/reset commands with persisted execution evidence.</w:t>
+      </w:r>
+    </w:p>
+    <w:p>
+      <w:pPr>
         <w:pStyle w:val="Heading2"/>
         <w:keepNext/>
         <w:keepLines/>
@@ -1503,23 +1626,6 @@
           <w:sz w:val="22"/>
         </w:rPr>
         <w:t>Firmware or instruction execution.</w:t>
-      </w:r>
-    </w:p>
-    <w:p>
-      <w:pPr>
-        <w:pStyle w:val="ListBullet"/>
-        <w:numPr>
-          <w:ilvl w:val="0"/>
-          <w:numId w:val="12"/>
-        </w:numPr>
-      </w:pPr>
-      <w:r>
-        <w:rPr>
-          <w:rFonts w:ascii="Calibri" w:hAnsi="Calibri"/>
-          <w:color w:val="111827"/>
-          <w:sz w:val="22"/>
-        </w:rPr>
-        <w:t>Logical execution cycles and task scheduling.</w:t>
       </w:r>
     </w:p>
     <w:p>
@@ -1570,7 +1676,7 @@
           <w:color w:val="111827"/>
           <w:sz w:val="22"/>
         </w:rPr>
-        <w:t>Persistent memory regions and reset semantics.</w:t>
+        <w:t>Persistent memory regions and reset persistence semantics.</w:t>
       </w:r>
     </w:p>
     <w:p>
@@ -1765,7 +1871,7 @@
           <w:color w:val="111827"/>
           <w:sz w:val="22"/>
         </w:rPr>
-        <w:t xml:space="preserve">, </w:t>
+        <w:t xml:space="preserve">, cyclic tasks, logical time, boot count, </w:t>
       </w:r>
       <w:r>
         <w:rPr>
@@ -1792,6 +1898,16 @@
           <w:sz w:val="22"/>
         </w:rPr>
         <w:t>The lifecycle contains offline, booting, running, degraded, fault, and shutdown. A confirmed critical fault cannot coexist with a non-fault lifecycle state. This protects the simulator from representing an obviously contradictory safety state.</w:t>
+      </w:r>
+    </w:p>
+    <w:p>
+      <w:r>
+        <w:rPr>
+          <w:rFonts w:ascii="Calibri" w:hAnsi="Calibri"/>
+          <w:color w:val="111827"/>
+          <w:sz w:val="22"/>
+        </w:rPr>
+        <w:t>Each cyclic task has a unique canonical ID, a period from 1 to 60,000 milliseconds, and an offset smaller than its period. A maximum of 32 tasks keeps configuration and execution evidence bounded.</w:t>
       </w:r>
     </w:p>
     <w:p>
@@ -2412,6 +2528,240 @@
           </w:p>
         </w:tc>
       </w:tr>
+      <w:tr>
+        <w:trPr>
+          <w:cantSplit/>
+        </w:trPr>
+        <w:tc>
+          <w:tcPr>
+            <w:tcW w:type="dxa" w:w="1150"/>
+            <w:tcMar>
+              <w:top w:w="80" w:type="dxa"/>
+              <w:start w:w="120" w:type="dxa"/>
+              <w:bottom w:w="80" w:type="dxa"/>
+              <w:end w:w="120" w:type="dxa"/>
+            </w:tcMar>
+            <w:vAlign w:val="center"/>
+            <w:shd w:fill="FFFFFF"/>
+          </w:tcPr>
+          <w:p>
+            <w:pPr>
+              <w:spacing w:before="0" w:after="40" w:line="252" w:lineRule="auto"/>
+              <w:jc w:val="center"/>
+            </w:pPr>
+            <w:r>
+              <w:rPr>
+                <w:rFonts w:ascii="Calibri" w:hAnsi="Calibri"/>
+                <w:b w:val="0"/>
+                <w:color w:val="111827"/>
+                <w:sz w:val="16"/>
+              </w:rPr>
+              <w:t>POST</w:t>
+            </w:r>
+          </w:p>
+        </w:tc>
+        <w:tc>
+          <w:tcPr>
+            <w:tcW w:type="dxa" w:w="3700"/>
+            <w:tcMar>
+              <w:top w:w="80" w:type="dxa"/>
+              <w:start w:w="120" w:type="dxa"/>
+              <w:bottom w:w="80" w:type="dxa"/>
+              <w:end w:w="120" w:type="dxa"/>
+            </w:tcMar>
+            <w:vAlign w:val="center"/>
+            <w:shd w:fill="FFFFFF"/>
+          </w:tcPr>
+          <w:p>
+            <w:pPr>
+              <w:spacing w:before="0" w:after="40" w:line="252" w:lineRule="auto"/>
+              <w:jc w:val="left"/>
+            </w:pPr>
+            <w:r>
+              <w:rPr>
+                <w:rFonts w:ascii="Calibri" w:hAnsi="Calibri"/>
+                <w:b w:val="0"/>
+                <w:color w:val="111827"/>
+                <w:sz w:val="16"/>
+              </w:rPr>
+              <w:t>/api/v1/vehicles/{vehicle_id}/ecus/{ecu_id}/simulation/advance</w:t>
+            </w:r>
+          </w:p>
+        </w:tc>
+        <w:tc>
+          <w:tcPr>
+            <w:tcW w:type="dxa" w:w="3100"/>
+            <w:tcMar>
+              <w:top w:w="80" w:type="dxa"/>
+              <w:start w:w="120" w:type="dxa"/>
+              <w:bottom w:w="80" w:type="dxa"/>
+              <w:end w:w="120" w:type="dxa"/>
+            </w:tcMar>
+            <w:vAlign w:val="center"/>
+            <w:shd w:fill="FFFFFF"/>
+          </w:tcPr>
+          <w:p>
+            <w:pPr>
+              <w:spacing w:before="0" w:after="40" w:line="252" w:lineRule="auto"/>
+              <w:jc w:val="left"/>
+            </w:pPr>
+            <w:r>
+              <w:rPr>
+                <w:rFonts w:ascii="Calibri" w:hAnsi="Calibri"/>
+                <w:b w:val="0"/>
+                <w:color w:val="111827"/>
+                <w:sz w:val="16"/>
+              </w:rPr>
+              <w:t>ecus:manage</w:t>
+            </w:r>
+          </w:p>
+        </w:tc>
+        <w:tc>
+          <w:tcPr>
+            <w:tcW w:type="dxa" w:w="1410"/>
+            <w:tcMar>
+              <w:top w:w="80" w:type="dxa"/>
+              <w:start w:w="120" w:type="dxa"/>
+              <w:bottom w:w="80" w:type="dxa"/>
+              <w:end w:w="120" w:type="dxa"/>
+            </w:tcMar>
+            <w:vAlign w:val="center"/>
+            <w:shd w:fill="FFFFFF"/>
+          </w:tcPr>
+          <w:p>
+            <w:pPr>
+              <w:spacing w:before="0" w:after="40" w:line="252" w:lineRule="auto"/>
+              <w:jc w:val="left"/>
+            </w:pPr>
+            <w:r>
+              <w:rPr>
+                <w:rFonts w:ascii="Calibri" w:hAnsi="Calibri"/>
+                <w:b w:val="0"/>
+                <w:color w:val="111827"/>
+                <w:sz w:val="16"/>
+              </w:rPr>
+              <w:t>Advance logical time and summarize due tasks.</w:t>
+            </w:r>
+          </w:p>
+        </w:tc>
+      </w:tr>
+      <w:tr>
+        <w:trPr>
+          <w:cantSplit/>
+        </w:trPr>
+        <w:tc>
+          <w:tcPr>
+            <w:tcW w:type="dxa" w:w="1150"/>
+            <w:tcMar>
+              <w:top w:w="80" w:type="dxa"/>
+              <w:start w:w="120" w:type="dxa"/>
+              <w:bottom w:w="80" w:type="dxa"/>
+              <w:end w:w="120" w:type="dxa"/>
+            </w:tcMar>
+            <w:vAlign w:val="center"/>
+            <w:shd w:fill="FFFFFF"/>
+          </w:tcPr>
+          <w:p>
+            <w:pPr>
+              <w:spacing w:before="0" w:after="40" w:line="252" w:lineRule="auto"/>
+              <w:jc w:val="center"/>
+            </w:pPr>
+            <w:r>
+              <w:rPr>
+                <w:rFonts w:ascii="Calibri" w:hAnsi="Calibri"/>
+                <w:b w:val="0"/>
+                <w:color w:val="111827"/>
+                <w:sz w:val="16"/>
+              </w:rPr>
+              <w:t>POST</w:t>
+            </w:r>
+          </w:p>
+        </w:tc>
+        <w:tc>
+          <w:tcPr>
+            <w:tcW w:type="dxa" w:w="3700"/>
+            <w:tcMar>
+              <w:top w:w="80" w:type="dxa"/>
+              <w:start w:w="120" w:type="dxa"/>
+              <w:bottom w:w="80" w:type="dxa"/>
+              <w:end w:w="120" w:type="dxa"/>
+            </w:tcMar>
+            <w:vAlign w:val="center"/>
+            <w:shd w:fill="FFFFFF"/>
+          </w:tcPr>
+          <w:p>
+            <w:pPr>
+              <w:spacing w:before="0" w:after="40" w:line="252" w:lineRule="auto"/>
+              <w:jc w:val="left"/>
+            </w:pPr>
+            <w:r>
+              <w:rPr>
+                <w:rFonts w:ascii="Calibri" w:hAnsi="Calibri"/>
+                <w:b w:val="0"/>
+                <w:color w:val="111827"/>
+                <w:sz w:val="16"/>
+              </w:rPr>
+              <w:t>/api/v1/vehicles/{vehicle_id}/ecus/{ecu_id}/reset</w:t>
+            </w:r>
+          </w:p>
+        </w:tc>
+        <w:tc>
+          <w:tcPr>
+            <w:tcW w:type="dxa" w:w="3100"/>
+            <w:tcMar>
+              <w:top w:w="80" w:type="dxa"/>
+              <w:start w:w="120" w:type="dxa"/>
+              <w:bottom w:w="80" w:type="dxa"/>
+              <w:end w:w="120" w:type="dxa"/>
+            </w:tcMar>
+            <w:vAlign w:val="center"/>
+            <w:shd w:fill="FFFFFF"/>
+          </w:tcPr>
+          <w:p>
+            <w:pPr>
+              <w:spacing w:before="0" w:after="40" w:line="252" w:lineRule="auto"/>
+              <w:jc w:val="left"/>
+            </w:pPr>
+            <w:r>
+              <w:rPr>
+                <w:rFonts w:ascii="Calibri" w:hAnsi="Calibri"/>
+                <w:b w:val="0"/>
+                <w:color w:val="111827"/>
+                <w:sz w:val="16"/>
+              </w:rPr>
+              <w:t>ecus:manage</w:t>
+            </w:r>
+          </w:p>
+        </w:tc>
+        <w:tc>
+          <w:tcPr>
+            <w:tcW w:type="dxa" w:w="1410"/>
+            <w:tcMar>
+              <w:top w:w="80" w:type="dxa"/>
+              <w:start w:w="120" w:type="dxa"/>
+              <w:bottom w:w="80" w:type="dxa"/>
+              <w:end w:w="120" w:type="dxa"/>
+            </w:tcMar>
+            <w:vAlign w:val="center"/>
+            <w:shd w:fill="FFFFFF"/>
+          </w:tcPr>
+          <w:p>
+            <w:pPr>
+              <w:spacing w:before="0" w:after="40" w:line="252" w:lineRule="auto"/>
+              <w:jc w:val="left"/>
+            </w:pPr>
+            <w:r>
+              <w:rPr>
+                <w:rFonts w:ascii="Calibri" w:hAnsi="Calibri"/>
+                <w:b w:val="0"/>
+                <w:color w:val="111827"/>
+                <w:sz w:val="16"/>
+              </w:rPr>
+              <w:t>Execute a deterministic reset mode.</w:t>
+            </w:r>
+          </w:p>
+        </w:tc>
+      </w:tr>
     </w:tbl>
     <w:p>
       <w:pPr>
@@ -2514,6 +2864,52 @@
     </w:p>
     <w:p>
       <w:pPr>
+        <w:pStyle w:val="Heading2"/>
+        <w:keepNext/>
+        <w:keepLines/>
+      </w:pPr>
+      <w:r>
+        <w:t>8.1 Deterministic Scheduling and Reset</w:t>
+      </w:r>
+    </w:p>
+    <w:p>
+      <w:r>
+        <w:rPr>
+          <w:rFonts w:ascii="Calibri" w:hAnsi="Calibri"/>
+          <w:color w:val="111827"/>
+          <w:sz w:val="22"/>
+        </w:rPr>
+        <w:t xml:space="preserve">The scheduler counts due executions over </w:t>
+      </w:r>
+      <w:r>
+        <w:rPr>
+          <w:rFonts w:ascii="Consolas" w:hAnsi="Consolas"/>
+          <w:color w:val="1F4D78"/>
+          <w:sz w:val="19"/>
+        </w:rPr>
+        <w:t>(previous_time, new_time]</w:t>
+      </w:r>
+      <w:r>
+        <w:rPr>
+          <w:rFonts w:ascii="Calibri" w:hAnsi="Calibri"/>
+          <w:color w:val="111827"/>
+          <w:sz w:val="22"/>
+        </w:rPr>
+        <w:t xml:space="preserve"> using arithmetic, not loops over every millisecond, and never real-time sleep. Each result reports count and first and last due times per task. Response size therefore follows configured task count rather than elapsed cycles.</w:t>
+      </w:r>
+    </w:p>
+    <w:p>
+      <w:r>
+        <w:rPr>
+          <w:rFonts w:ascii="Calibri" w:hAnsi="Calibri"/>
+          <w:color w:val="111827"/>
+          <w:sz w:val="22"/>
+        </w:rPr>
+        <w:t>Reset durations are fixed: soft 10 ms, hard 100 ms, and power cycle 500 ms. Reset increments the boot counter, advances logical time, and becomes offline unless a confirmed critical fault requires fault state. Memory and faults remain unchanged pending the III-4 memory-region model.</w:t>
+      </w:r>
+    </w:p>
+    <w:p>
+      <w:pPr>
         <w:pStyle w:val="Heading1"/>
         <w:keepNext/>
         <w:keepLines/>
@@ -2545,7 +2941,7 @@
           <w:color w:val="111827"/>
           <w:sz w:val="22"/>
         </w:rPr>
-        <w:t>. III-1 covers ownership, uniqueness, retrieval, bounded state, consistency invariants, optimistic concurrency, RBAC, events, and audit.</w:t>
+        <w:t>. III-1 covers the aggregate and III-2 covers logical time, cyclic schedules, reset modes, replay, lifecycle guards, events, and audit.</w:t>
       </w:r>
     </w:p>
     <w:p>
@@ -2636,6 +3032,46 @@
           <w:sz w:val="22"/>
         </w:rPr>
         <w:t>One versioned command gives deterministic conflict behavior and atomic evidence. Fine-grained memory and fault commands can be introduced later when their timing semantics are defined.</w:t>
+      </w:r>
+    </w:p>
+    <w:p>
+      <w:pPr>
+        <w:pStyle w:val="Heading2"/>
+        <w:keepNext/>
+        <w:keepLines/>
+      </w:pPr>
+      <w:r>
+        <w:t>ADR-ECU-005 — Use Logical Time and Aggregated Schedule Evidence</w:t>
+      </w:r>
+    </w:p>
+    <w:p>
+      <w:r>
+        <w:rPr>
+          <w:rFonts w:ascii="Calibri" w:hAnsi="Calibri"/>
+          <w:color w:val="111827"/>
+          <w:sz w:val="22"/>
+        </w:rPr>
+        <w:t>Wall-clock scheduling would make tests slow and nondeterministic. Arithmetic task summaries provide due-cycle evidence with bounded storage and no dependency on host performance.</w:t>
+      </w:r>
+    </w:p>
+    <w:p>
+      <w:pPr>
+        <w:pStyle w:val="Heading2"/>
+        <w:keepNext/>
+        <w:keepLines/>
+      </w:pPr>
+      <w:r>
+        <w:t>ADR-ECU-006 — Preserve State Until Memory Regions Exist</w:t>
+      </w:r>
+    </w:p>
+    <w:p>
+      <w:r>
+        <w:rPr>
+          <w:rFonts w:ascii="Calibri" w:hAnsi="Calibri"/>
+          <w:color w:val="111827"/>
+          <w:sz w:val="22"/>
+        </w:rPr>
+        <w:t>Clearing state before defining volatile and non-volatile regions would invent behavior. III-2 records reset mode, duration, boot count, and preservation; III-4 will own persistence semantics.</w:t>
       </w:r>
     </w:p>
     <w:p>
@@ -4497,6 +4933,936 @@
         <w:pStyle w:val="Heading1"/>
         <w:keepNext/>
         <w:keepLines/>
+        <w:pageBreakBefore/>
+      </w:pPr>
+      <w:r>
+        <w:t>11.1 III-2 Verification</w:t>
+      </w:r>
+    </w:p>
+    <w:tbl>
+      <w:tblPr>
+        <w:tblW w:type="dxa" w:w="9360"/>
+        <w:jc w:val="left"/>
+        <w:tblLayout w:type="fixed"/>
+        <w:tblLook w:firstColumn="1" w:firstRow="1" w:lastColumn="0" w:lastRow="0" w:noHBand="0" w:noVBand="1" w:val="04A0"/>
+        <w:tblInd w:w="120" w:type="dxa"/>
+        <w:tblBorders>
+          <w:top w:val="single" w:sz="6" w:color="B8C4D1"/>
+          <w:left w:val="single" w:sz="6" w:color="B8C4D1"/>
+          <w:bottom w:val="single" w:sz="6" w:color="B8C4D1"/>
+          <w:right w:val="single" w:sz="6" w:color="B8C4D1"/>
+          <w:insideH w:val="single" w:sz="6" w:color="B8C4D1"/>
+          <w:insideV w:val="single" w:sz="6" w:color="B8C4D1"/>
+        </w:tblBorders>
+      </w:tblPr>
+      <w:tblGrid>
+        <w:gridCol w:w="1650"/>
+        <w:gridCol w:w="4450"/>
+        <w:gridCol w:w="3260"/>
+      </w:tblGrid>
+      <w:tr>
+        <w:trPr>
+          <w:tblHeader w:val="true"/>
+          <w:cantSplit/>
+        </w:trPr>
+        <w:tc>
+          <w:tcPr>
+            <w:tcW w:type="dxa" w:w="1650"/>
+            <w:tcMar>
+              <w:top w:w="80" w:type="dxa"/>
+              <w:start w:w="120" w:type="dxa"/>
+              <w:bottom w:w="80" w:type="dxa"/>
+              <w:end w:w="120" w:type="dxa"/>
+            </w:tcMar>
+            <w:vAlign w:val="center"/>
+            <w:shd w:fill="E8EEF5"/>
+          </w:tcPr>
+          <w:p>
+            <w:pPr>
+              <w:spacing w:before="0" w:after="40" w:line="252" w:lineRule="auto"/>
+              <w:jc w:val="center"/>
+            </w:pPr>
+            <w:r>
+              <w:rPr>
+                <w:rFonts w:ascii="Calibri" w:hAnsi="Calibri"/>
+                <w:b/>
+                <w:color w:val="0B2545"/>
+                <w:sz w:val="17"/>
+              </w:rPr>
+              <w:t>Test</w:t>
+            </w:r>
+          </w:p>
+        </w:tc>
+        <w:tc>
+          <w:tcPr>
+            <w:tcW w:type="dxa" w:w="4450"/>
+            <w:tcMar>
+              <w:top w:w="80" w:type="dxa"/>
+              <w:start w:w="120" w:type="dxa"/>
+              <w:bottom w:w="80" w:type="dxa"/>
+              <w:end w:w="120" w:type="dxa"/>
+            </w:tcMar>
+            <w:vAlign w:val="center"/>
+            <w:shd w:fill="E8EEF5"/>
+          </w:tcPr>
+          <w:p>
+            <w:pPr>
+              <w:spacing w:before="0" w:after="40" w:line="252" w:lineRule="auto"/>
+              <w:jc w:val="left"/>
+            </w:pPr>
+            <w:r>
+              <w:rPr>
+                <w:rFonts w:ascii="Calibri" w:hAnsi="Calibri"/>
+                <w:b/>
+                <w:color w:val="0B2545"/>
+                <w:sz w:val="17"/>
+              </w:rPr>
+              <w:t>Objective</w:t>
+            </w:r>
+          </w:p>
+        </w:tc>
+        <w:tc>
+          <w:tcPr>
+            <w:tcW w:type="dxa" w:w="3260"/>
+            <w:tcMar>
+              <w:top w:w="80" w:type="dxa"/>
+              <w:start w:w="120" w:type="dxa"/>
+              <w:bottom w:w="80" w:type="dxa"/>
+              <w:end w:w="120" w:type="dxa"/>
+            </w:tcMar>
+            <w:vAlign w:val="center"/>
+            <w:shd w:fill="E8EEF5"/>
+          </w:tcPr>
+          <w:p>
+            <w:pPr>
+              <w:spacing w:before="0" w:after="40" w:line="252" w:lineRule="auto"/>
+              <w:jc w:val="left"/>
+            </w:pPr>
+            <w:r>
+              <w:rPr>
+                <w:rFonts w:ascii="Calibri" w:hAnsi="Calibri"/>
+                <w:b/>
+                <w:color w:val="0B2545"/>
+                <w:sz w:val="17"/>
+              </w:rPr>
+              <w:t>Level</w:t>
+            </w:r>
+          </w:p>
+        </w:tc>
+      </w:tr>
+      <w:tr>
+        <w:trPr>
+          <w:cantSplit/>
+        </w:trPr>
+        <w:tc>
+          <w:tcPr>
+            <w:tcW w:type="dxa" w:w="1650"/>
+            <w:tcMar>
+              <w:top w:w="80" w:type="dxa"/>
+              <w:start w:w="120" w:type="dxa"/>
+              <w:bottom w:w="80" w:type="dxa"/>
+              <w:end w:w="120" w:type="dxa"/>
+            </w:tcMar>
+            <w:vAlign w:val="center"/>
+            <w:shd w:fill="FFFFFF"/>
+          </w:tcPr>
+          <w:p>
+            <w:pPr>
+              <w:spacing w:before="0" w:after="40" w:line="252" w:lineRule="auto"/>
+              <w:jc w:val="center"/>
+            </w:pPr>
+            <w:r>
+              <w:rPr>
+                <w:rFonts w:ascii="Calibri" w:hAnsi="Calibri"/>
+                <w:b w:val="0"/>
+                <w:color w:val="111827"/>
+                <w:sz w:val="17"/>
+              </w:rPr>
+              <w:t>Deterministic schedule</w:t>
+            </w:r>
+          </w:p>
+        </w:tc>
+        <w:tc>
+          <w:tcPr>
+            <w:tcW w:type="dxa" w:w="4450"/>
+            <w:tcMar>
+              <w:top w:w="80" w:type="dxa"/>
+              <w:start w:w="120" w:type="dxa"/>
+              <w:bottom w:w="80" w:type="dxa"/>
+              <w:end w:w="120" w:type="dxa"/>
+            </w:tcMar>
+            <w:vAlign w:val="center"/>
+            <w:shd w:fill="FFFFFF"/>
+          </w:tcPr>
+          <w:p>
+            <w:pPr>
+              <w:spacing w:before="0" w:after="40" w:line="252" w:lineRule="auto"/>
+              <w:jc w:val="left"/>
+            </w:pPr>
+            <w:r>
+              <w:rPr>
+                <w:rFonts w:ascii="Calibri" w:hAnsi="Calibri"/>
+                <w:b w:val="0"/>
+                <w:color w:val="111827"/>
+                <w:sz w:val="17"/>
+              </w:rPr>
+              <w:t>Reproduce task counts and due boundaries from the same inputs.</w:t>
+            </w:r>
+          </w:p>
+        </w:tc>
+        <w:tc>
+          <w:tcPr>
+            <w:tcW w:type="dxa" w:w="3260"/>
+            <w:tcMar>
+              <w:top w:w="80" w:type="dxa"/>
+              <w:start w:w="120" w:type="dxa"/>
+              <w:bottom w:w="80" w:type="dxa"/>
+              <w:end w:w="120" w:type="dxa"/>
+            </w:tcMar>
+            <w:vAlign w:val="center"/>
+            <w:shd w:fill="FFFFFF"/>
+          </w:tcPr>
+          <w:p>
+            <w:pPr>
+              <w:spacing w:before="0" w:after="40" w:line="252" w:lineRule="auto"/>
+              <w:jc w:val="left"/>
+            </w:pPr>
+            <w:r>
+              <w:rPr>
+                <w:rFonts w:ascii="Calibri" w:hAnsi="Calibri"/>
+                <w:b w:val="0"/>
+                <w:color w:val="111827"/>
+                <w:sz w:val="17"/>
+              </w:rPr>
+              <w:t>Service</w:t>
+            </w:r>
+          </w:p>
+        </w:tc>
+      </w:tr>
+      <w:tr>
+        <w:trPr>
+          <w:cantSplit/>
+        </w:trPr>
+        <w:tc>
+          <w:tcPr>
+            <w:tcW w:type="dxa" w:w="1650"/>
+            <w:tcMar>
+              <w:top w:w="80" w:type="dxa"/>
+              <w:start w:w="120" w:type="dxa"/>
+              <w:bottom w:w="80" w:type="dxa"/>
+              <w:end w:w="120" w:type="dxa"/>
+            </w:tcMar>
+            <w:vAlign w:val="center"/>
+            <w:shd w:fill="FFFFFF"/>
+          </w:tcPr>
+          <w:p>
+            <w:pPr>
+              <w:spacing w:before="0" w:after="40" w:line="252" w:lineRule="auto"/>
+              <w:jc w:val="center"/>
+            </w:pPr>
+            <w:r>
+              <w:rPr>
+                <w:rFonts w:ascii="Calibri" w:hAnsi="Calibri"/>
+                <w:b w:val="0"/>
+                <w:color w:val="111827"/>
+                <w:sz w:val="17"/>
+              </w:rPr>
+              <w:t>Large advance bound</w:t>
+            </w:r>
+          </w:p>
+        </w:tc>
+        <w:tc>
+          <w:tcPr>
+            <w:tcW w:type="dxa" w:w="4450"/>
+            <w:tcMar>
+              <w:top w:w="80" w:type="dxa"/>
+              <w:start w:w="120" w:type="dxa"/>
+              <w:bottom w:w="80" w:type="dxa"/>
+              <w:end w:w="120" w:type="dxa"/>
+            </w:tcMar>
+            <w:vAlign w:val="center"/>
+            <w:shd w:fill="FFFFFF"/>
+          </w:tcPr>
+          <w:p>
+            <w:pPr>
+              <w:spacing w:before="0" w:after="40" w:line="252" w:lineRule="auto"/>
+              <w:jc w:val="left"/>
+            </w:pPr>
+            <w:r>
+              <w:rPr>
+                <w:rFonts w:ascii="Calibri" w:hAnsi="Calibri"/>
+                <w:b w:val="0"/>
+                <w:color w:val="111827"/>
+                <w:sz w:val="17"/>
+              </w:rPr>
+              <w:t>Keep output proportional to tasks rather than elapsed cycles.</w:t>
+            </w:r>
+          </w:p>
+        </w:tc>
+        <w:tc>
+          <w:tcPr>
+            <w:tcW w:type="dxa" w:w="3260"/>
+            <w:tcMar>
+              <w:top w:w="80" w:type="dxa"/>
+              <w:start w:w="120" w:type="dxa"/>
+              <w:bottom w:w="80" w:type="dxa"/>
+              <w:end w:w="120" w:type="dxa"/>
+            </w:tcMar>
+            <w:vAlign w:val="center"/>
+            <w:shd w:fill="FFFFFF"/>
+          </w:tcPr>
+          <w:p>
+            <w:pPr>
+              <w:spacing w:before="0" w:after="40" w:line="252" w:lineRule="auto"/>
+              <w:jc w:val="left"/>
+            </w:pPr>
+            <w:r>
+              <w:rPr>
+                <w:rFonts w:ascii="Calibri" w:hAnsi="Calibri"/>
+                <w:b w:val="0"/>
+                <w:color w:val="111827"/>
+                <w:sz w:val="17"/>
+              </w:rPr>
+              <w:t>Service</w:t>
+            </w:r>
+          </w:p>
+        </w:tc>
+      </w:tr>
+      <w:tr>
+        <w:trPr>
+          <w:cantSplit/>
+        </w:trPr>
+        <w:tc>
+          <w:tcPr>
+            <w:tcW w:type="dxa" w:w="1650"/>
+            <w:tcMar>
+              <w:top w:w="80" w:type="dxa"/>
+              <w:start w:w="120" w:type="dxa"/>
+              <w:bottom w:w="80" w:type="dxa"/>
+              <w:end w:w="120" w:type="dxa"/>
+            </w:tcMar>
+            <w:vAlign w:val="center"/>
+            <w:shd w:fill="FFFFFF"/>
+          </w:tcPr>
+          <w:p>
+            <w:pPr>
+              <w:spacing w:before="0" w:after="40" w:line="252" w:lineRule="auto"/>
+              <w:jc w:val="center"/>
+            </w:pPr>
+            <w:r>
+              <w:rPr>
+                <w:rFonts w:ascii="Calibri" w:hAnsi="Calibri"/>
+                <w:b w:val="0"/>
+                <w:color w:val="111827"/>
+                <w:sz w:val="17"/>
+              </w:rPr>
+              <w:t>Offline execution rejection</w:t>
+            </w:r>
+          </w:p>
+        </w:tc>
+        <w:tc>
+          <w:tcPr>
+            <w:tcW w:type="dxa" w:w="4450"/>
+            <w:tcMar>
+              <w:top w:w="80" w:type="dxa"/>
+              <w:start w:w="120" w:type="dxa"/>
+              <w:bottom w:w="80" w:type="dxa"/>
+              <w:end w:w="120" w:type="dxa"/>
+            </w:tcMar>
+            <w:vAlign w:val="center"/>
+            <w:shd w:fill="FFFFFF"/>
+          </w:tcPr>
+          <w:p>
+            <w:pPr>
+              <w:spacing w:before="0" w:after="40" w:line="252" w:lineRule="auto"/>
+              <w:jc w:val="left"/>
+            </w:pPr>
+            <w:r>
+              <w:rPr>
+                <w:rFonts w:ascii="Calibri" w:hAnsi="Calibri"/>
+                <w:b w:val="0"/>
+                <w:color w:val="111827"/>
+                <w:sz w:val="17"/>
+              </w:rPr>
+              <w:t>Prevent cyclic execution outside running/degraded states.</w:t>
+            </w:r>
+          </w:p>
+        </w:tc>
+        <w:tc>
+          <w:tcPr>
+            <w:tcW w:type="dxa" w:w="3260"/>
+            <w:tcMar>
+              <w:top w:w="80" w:type="dxa"/>
+              <w:start w:w="120" w:type="dxa"/>
+              <w:bottom w:w="80" w:type="dxa"/>
+              <w:end w:w="120" w:type="dxa"/>
+            </w:tcMar>
+            <w:vAlign w:val="center"/>
+            <w:shd w:fill="FFFFFF"/>
+          </w:tcPr>
+          <w:p>
+            <w:pPr>
+              <w:spacing w:before="0" w:after="40" w:line="252" w:lineRule="auto"/>
+              <w:jc w:val="left"/>
+            </w:pPr>
+            <w:r>
+              <w:rPr>
+                <w:rFonts w:ascii="Calibri" w:hAnsi="Calibri"/>
+                <w:b w:val="0"/>
+                <w:color w:val="111827"/>
+                <w:sz w:val="17"/>
+              </w:rPr>
+              <w:t>Service/API</w:t>
+            </w:r>
+          </w:p>
+        </w:tc>
+      </w:tr>
+      <w:tr>
+        <w:trPr>
+          <w:cantSplit/>
+        </w:trPr>
+        <w:tc>
+          <w:tcPr>
+            <w:tcW w:type="dxa" w:w="1650"/>
+            <w:tcMar>
+              <w:top w:w="80" w:type="dxa"/>
+              <w:start w:w="120" w:type="dxa"/>
+              <w:bottom w:w="80" w:type="dxa"/>
+              <w:end w:w="120" w:type="dxa"/>
+            </w:tcMar>
+            <w:vAlign w:val="center"/>
+            <w:shd w:fill="FFFFFF"/>
+          </w:tcPr>
+          <w:p>
+            <w:pPr>
+              <w:spacing w:before="0" w:after="40" w:line="252" w:lineRule="auto"/>
+              <w:jc w:val="center"/>
+            </w:pPr>
+            <w:r>
+              <w:rPr>
+                <w:rFonts w:ascii="Calibri" w:hAnsi="Calibri"/>
+                <w:b w:val="0"/>
+                <w:color w:val="111827"/>
+                <w:sz w:val="17"/>
+              </w:rPr>
+              <w:t>Advance exact retry</w:t>
+            </w:r>
+          </w:p>
+        </w:tc>
+        <w:tc>
+          <w:tcPr>
+            <w:tcW w:type="dxa" w:w="4450"/>
+            <w:tcMar>
+              <w:top w:w="80" w:type="dxa"/>
+              <w:start w:w="120" w:type="dxa"/>
+              <w:bottom w:w="80" w:type="dxa"/>
+              <w:end w:w="120" w:type="dxa"/>
+            </w:tcMar>
+            <w:vAlign w:val="center"/>
+            <w:shd w:fill="FFFFFF"/>
+          </w:tcPr>
+          <w:p>
+            <w:pPr>
+              <w:spacing w:before="0" w:after="40" w:line="252" w:lineRule="auto"/>
+              <w:jc w:val="left"/>
+            </w:pPr>
+            <w:r>
+              <w:rPr>
+                <w:rFonts w:ascii="Calibri" w:hAnsi="Calibri"/>
+                <w:b w:val="0"/>
+                <w:color w:val="111827"/>
+                <w:sz w:val="17"/>
+              </w:rPr>
+              <w:t>Prevent logical time and version from advancing twice.</w:t>
+            </w:r>
+          </w:p>
+        </w:tc>
+        <w:tc>
+          <w:tcPr>
+            <w:tcW w:type="dxa" w:w="3260"/>
+            <w:tcMar>
+              <w:top w:w="80" w:type="dxa"/>
+              <w:start w:w="120" w:type="dxa"/>
+              <w:bottom w:w="80" w:type="dxa"/>
+              <w:end w:w="120" w:type="dxa"/>
+            </w:tcMar>
+            <w:vAlign w:val="center"/>
+            <w:shd w:fill="FFFFFF"/>
+          </w:tcPr>
+          <w:p>
+            <w:pPr>
+              <w:spacing w:before="0" w:after="40" w:line="252" w:lineRule="auto"/>
+              <w:jc w:val="left"/>
+            </w:pPr>
+            <w:r>
+              <w:rPr>
+                <w:rFonts w:ascii="Calibri" w:hAnsi="Calibri"/>
+                <w:b w:val="0"/>
+                <w:color w:val="111827"/>
+                <w:sz w:val="17"/>
+              </w:rPr>
+              <w:t>Service</w:t>
+            </w:r>
+          </w:p>
+        </w:tc>
+      </w:tr>
+      <w:tr>
+        <w:trPr>
+          <w:cantSplit/>
+        </w:trPr>
+        <w:tc>
+          <w:tcPr>
+            <w:tcW w:type="dxa" w:w="1650"/>
+            <w:tcMar>
+              <w:top w:w="80" w:type="dxa"/>
+              <w:start w:w="120" w:type="dxa"/>
+              <w:bottom w:w="80" w:type="dxa"/>
+              <w:end w:w="120" w:type="dxa"/>
+            </w:tcMar>
+            <w:vAlign w:val="center"/>
+            <w:shd w:fill="FFFFFF"/>
+          </w:tcPr>
+          <w:p>
+            <w:pPr>
+              <w:spacing w:before="0" w:after="40" w:line="252" w:lineRule="auto"/>
+              <w:jc w:val="center"/>
+            </w:pPr>
+            <w:r>
+              <w:rPr>
+                <w:rFonts w:ascii="Calibri" w:hAnsi="Calibri"/>
+                <w:b w:val="0"/>
+                <w:color w:val="111827"/>
+                <w:sz w:val="17"/>
+              </w:rPr>
+              <w:t>Command-ID conflict</w:t>
+            </w:r>
+          </w:p>
+        </w:tc>
+        <w:tc>
+          <w:tcPr>
+            <w:tcW w:type="dxa" w:w="4450"/>
+            <w:tcMar>
+              <w:top w:w="80" w:type="dxa"/>
+              <w:start w:w="120" w:type="dxa"/>
+              <w:bottom w:w="80" w:type="dxa"/>
+              <w:end w:w="120" w:type="dxa"/>
+            </w:tcMar>
+            <w:vAlign w:val="center"/>
+            <w:shd w:fill="FFFFFF"/>
+          </w:tcPr>
+          <w:p>
+            <w:pPr>
+              <w:spacing w:before="0" w:after="40" w:line="252" w:lineRule="auto"/>
+              <w:jc w:val="left"/>
+            </w:pPr>
+            <w:r>
+              <w:rPr>
+                <w:rFonts w:ascii="Calibri" w:hAnsi="Calibri"/>
+                <w:b w:val="0"/>
+                <w:color w:val="111827"/>
+                <w:sz w:val="17"/>
+              </w:rPr>
+              <w:t>Reject reuse of an ID with a different command.</w:t>
+            </w:r>
+          </w:p>
+        </w:tc>
+        <w:tc>
+          <w:tcPr>
+            <w:tcW w:type="dxa" w:w="3260"/>
+            <w:tcMar>
+              <w:top w:w="80" w:type="dxa"/>
+              <w:start w:w="120" w:type="dxa"/>
+              <w:bottom w:w="80" w:type="dxa"/>
+              <w:end w:w="120" w:type="dxa"/>
+            </w:tcMar>
+            <w:vAlign w:val="center"/>
+            <w:shd w:fill="FFFFFF"/>
+          </w:tcPr>
+          <w:p>
+            <w:pPr>
+              <w:spacing w:before="0" w:after="40" w:line="252" w:lineRule="auto"/>
+              <w:jc w:val="left"/>
+            </w:pPr>
+            <w:r>
+              <w:rPr>
+                <w:rFonts w:ascii="Calibri" w:hAnsi="Calibri"/>
+                <w:b w:val="0"/>
+                <w:color w:val="111827"/>
+                <w:sz w:val="17"/>
+              </w:rPr>
+              <w:t>Service/API</w:t>
+            </w:r>
+          </w:p>
+        </w:tc>
+      </w:tr>
+      <w:tr>
+        <w:trPr>
+          <w:cantSplit/>
+        </w:trPr>
+        <w:tc>
+          <w:tcPr>
+            <w:tcW w:type="dxa" w:w="1650"/>
+            <w:tcMar>
+              <w:top w:w="80" w:type="dxa"/>
+              <w:start w:w="120" w:type="dxa"/>
+              <w:bottom w:w="80" w:type="dxa"/>
+              <w:end w:w="120" w:type="dxa"/>
+            </w:tcMar>
+            <w:vAlign w:val="center"/>
+            <w:shd w:fill="FFFFFF"/>
+          </w:tcPr>
+          <w:p>
+            <w:pPr>
+              <w:spacing w:before="0" w:after="40" w:line="252" w:lineRule="auto"/>
+              <w:jc w:val="center"/>
+            </w:pPr>
+            <w:r>
+              <w:rPr>
+                <w:rFonts w:ascii="Calibri" w:hAnsi="Calibri"/>
+                <w:b w:val="0"/>
+                <w:color w:val="111827"/>
+                <w:sz w:val="17"/>
+              </w:rPr>
+              <w:t>Reset duration matrix</w:t>
+            </w:r>
+          </w:p>
+        </w:tc>
+        <w:tc>
+          <w:tcPr>
+            <w:tcW w:type="dxa" w:w="4450"/>
+            <w:tcMar>
+              <w:top w:w="80" w:type="dxa"/>
+              <w:start w:w="120" w:type="dxa"/>
+              <w:bottom w:w="80" w:type="dxa"/>
+              <w:end w:w="120" w:type="dxa"/>
+            </w:tcMar>
+            <w:vAlign w:val="center"/>
+            <w:shd w:fill="FFFFFF"/>
+          </w:tcPr>
+          <w:p>
+            <w:pPr>
+              <w:spacing w:before="0" w:after="40" w:line="252" w:lineRule="auto"/>
+              <w:jc w:val="left"/>
+            </w:pPr>
+            <w:r>
+              <w:rPr>
+                <w:rFonts w:ascii="Calibri" w:hAnsi="Calibri"/>
+                <w:b w:val="0"/>
+                <w:color w:val="111827"/>
+                <w:sz w:val="17"/>
+              </w:rPr>
+              <w:t>Verify fixed soft, hard, and power-cycle durations.</w:t>
+            </w:r>
+          </w:p>
+        </w:tc>
+        <w:tc>
+          <w:tcPr>
+            <w:tcW w:type="dxa" w:w="3260"/>
+            <w:tcMar>
+              <w:top w:w="80" w:type="dxa"/>
+              <w:start w:w="120" w:type="dxa"/>
+              <w:bottom w:w="80" w:type="dxa"/>
+              <w:end w:w="120" w:type="dxa"/>
+            </w:tcMar>
+            <w:vAlign w:val="center"/>
+            <w:shd w:fill="FFFFFF"/>
+          </w:tcPr>
+          <w:p>
+            <w:pPr>
+              <w:spacing w:before="0" w:after="40" w:line="252" w:lineRule="auto"/>
+              <w:jc w:val="left"/>
+            </w:pPr>
+            <w:r>
+              <w:rPr>
+                <w:rFonts w:ascii="Calibri" w:hAnsi="Calibri"/>
+                <w:b w:val="0"/>
+                <w:color w:val="111827"/>
+                <w:sz w:val="17"/>
+              </w:rPr>
+              <w:t>Unit/service</w:t>
+            </w:r>
+          </w:p>
+        </w:tc>
+      </w:tr>
+      <w:tr>
+        <w:trPr>
+          <w:cantSplit/>
+        </w:trPr>
+        <w:tc>
+          <w:tcPr>
+            <w:tcW w:type="dxa" w:w="1650"/>
+            <w:tcMar>
+              <w:top w:w="80" w:type="dxa"/>
+              <w:start w:w="120" w:type="dxa"/>
+              <w:bottom w:w="80" w:type="dxa"/>
+              <w:end w:w="120" w:type="dxa"/>
+            </w:tcMar>
+            <w:vAlign w:val="center"/>
+            <w:shd w:fill="FFFFFF"/>
+          </w:tcPr>
+          <w:p>
+            <w:pPr>
+              <w:spacing w:before="0" w:after="40" w:line="252" w:lineRule="auto"/>
+              <w:jc w:val="center"/>
+            </w:pPr>
+            <w:r>
+              <w:rPr>
+                <w:rFonts w:ascii="Calibri" w:hAnsi="Calibri"/>
+                <w:b w:val="0"/>
+                <w:color w:val="111827"/>
+                <w:sz w:val="17"/>
+              </w:rPr>
+              <w:t>Reset preservation</w:t>
+            </w:r>
+          </w:p>
+        </w:tc>
+        <w:tc>
+          <w:tcPr>
+            <w:tcW w:type="dxa" w:w="4450"/>
+            <w:tcMar>
+              <w:top w:w="80" w:type="dxa"/>
+              <w:start w:w="120" w:type="dxa"/>
+              <w:bottom w:w="80" w:type="dxa"/>
+              <w:end w:w="120" w:type="dxa"/>
+            </w:tcMar>
+            <w:vAlign w:val="center"/>
+            <w:shd w:fill="FFFFFF"/>
+          </w:tcPr>
+          <w:p>
+            <w:pPr>
+              <w:spacing w:before="0" w:after="40" w:line="252" w:lineRule="auto"/>
+              <w:jc w:val="left"/>
+            </w:pPr>
+            <w:r>
+              <w:rPr>
+                <w:rFonts w:ascii="Calibri" w:hAnsi="Calibri"/>
+                <w:b w:val="0"/>
+                <w:color w:val="111827"/>
+                <w:sz w:val="17"/>
+              </w:rPr>
+              <w:t>Prove memory and faults remain unchanged in III-2.</w:t>
+            </w:r>
+          </w:p>
+        </w:tc>
+        <w:tc>
+          <w:tcPr>
+            <w:tcW w:type="dxa" w:w="3260"/>
+            <w:tcMar>
+              <w:top w:w="80" w:type="dxa"/>
+              <w:start w:w="120" w:type="dxa"/>
+              <w:bottom w:w="80" w:type="dxa"/>
+              <w:end w:w="120" w:type="dxa"/>
+            </w:tcMar>
+            <w:vAlign w:val="center"/>
+            <w:shd w:fill="FFFFFF"/>
+          </w:tcPr>
+          <w:p>
+            <w:pPr>
+              <w:spacing w:before="0" w:after="40" w:line="252" w:lineRule="auto"/>
+              <w:jc w:val="left"/>
+            </w:pPr>
+            <w:r>
+              <w:rPr>
+                <w:rFonts w:ascii="Calibri" w:hAnsi="Calibri"/>
+                <w:b w:val="0"/>
+                <w:color w:val="111827"/>
+                <w:sz w:val="17"/>
+              </w:rPr>
+              <w:t>Service</w:t>
+            </w:r>
+          </w:p>
+        </w:tc>
+      </w:tr>
+      <w:tr>
+        <w:trPr>
+          <w:cantSplit/>
+        </w:trPr>
+        <w:tc>
+          <w:tcPr>
+            <w:tcW w:type="dxa" w:w="1650"/>
+            <w:tcMar>
+              <w:top w:w="80" w:type="dxa"/>
+              <w:start w:w="120" w:type="dxa"/>
+              <w:bottom w:w="80" w:type="dxa"/>
+              <w:end w:w="120" w:type="dxa"/>
+            </w:tcMar>
+            <w:vAlign w:val="center"/>
+            <w:shd w:fill="FFFFFF"/>
+          </w:tcPr>
+          <w:p>
+            <w:pPr>
+              <w:spacing w:before="0" w:after="40" w:line="252" w:lineRule="auto"/>
+              <w:jc w:val="center"/>
+            </w:pPr>
+            <w:r>
+              <w:rPr>
+                <w:rFonts w:ascii="Calibri" w:hAnsi="Calibri"/>
+                <w:b w:val="0"/>
+                <w:color w:val="111827"/>
+                <w:sz w:val="17"/>
+              </w:rPr>
+              <w:t>Reset boot counter</w:t>
+            </w:r>
+          </w:p>
+        </w:tc>
+        <w:tc>
+          <w:tcPr>
+            <w:tcW w:type="dxa" w:w="4450"/>
+            <w:tcMar>
+              <w:top w:w="80" w:type="dxa"/>
+              <w:start w:w="120" w:type="dxa"/>
+              <w:bottom w:w="80" w:type="dxa"/>
+              <w:end w:w="120" w:type="dxa"/>
+            </w:tcMar>
+            <w:vAlign w:val="center"/>
+            <w:shd w:fill="FFFFFF"/>
+          </w:tcPr>
+          <w:p>
+            <w:pPr>
+              <w:spacing w:before="0" w:after="40" w:line="252" w:lineRule="auto"/>
+              <w:jc w:val="left"/>
+            </w:pPr>
+            <w:r>
+              <w:rPr>
+                <w:rFonts w:ascii="Calibri" w:hAnsi="Calibri"/>
+                <w:b w:val="0"/>
+                <w:color w:val="111827"/>
+                <w:sz w:val="17"/>
+              </w:rPr>
+              <w:t>Increment boot count exactly once, including after retry.</w:t>
+            </w:r>
+          </w:p>
+        </w:tc>
+        <w:tc>
+          <w:tcPr>
+            <w:tcW w:type="dxa" w:w="3260"/>
+            <w:tcMar>
+              <w:top w:w="80" w:type="dxa"/>
+              <w:start w:w="120" w:type="dxa"/>
+              <w:bottom w:w="80" w:type="dxa"/>
+              <w:end w:w="120" w:type="dxa"/>
+            </w:tcMar>
+            <w:vAlign w:val="center"/>
+            <w:shd w:fill="FFFFFF"/>
+          </w:tcPr>
+          <w:p>
+            <w:pPr>
+              <w:spacing w:before="0" w:after="40" w:line="252" w:lineRule="auto"/>
+              <w:jc w:val="left"/>
+            </w:pPr>
+            <w:r>
+              <w:rPr>
+                <w:rFonts w:ascii="Calibri" w:hAnsi="Calibri"/>
+                <w:b w:val="0"/>
+                <w:color w:val="111827"/>
+                <w:sz w:val="17"/>
+              </w:rPr>
+              <w:t>Service</w:t>
+            </w:r>
+          </w:p>
+        </w:tc>
+      </w:tr>
+      <w:tr>
+        <w:trPr>
+          <w:cantSplit/>
+        </w:trPr>
+        <w:tc>
+          <w:tcPr>
+            <w:tcW w:type="dxa" w:w="1650"/>
+            <w:tcMar>
+              <w:top w:w="80" w:type="dxa"/>
+              <w:start w:w="120" w:type="dxa"/>
+              <w:bottom w:w="80" w:type="dxa"/>
+              <w:end w:w="120" w:type="dxa"/>
+            </w:tcMar>
+            <w:vAlign w:val="center"/>
+            <w:shd w:fill="FFFFFF"/>
+          </w:tcPr>
+          <w:p>
+            <w:pPr>
+              <w:spacing w:before="0" w:after="40" w:line="252" w:lineRule="auto"/>
+              <w:jc w:val="center"/>
+            </w:pPr>
+            <w:r>
+              <w:rPr>
+                <w:rFonts w:ascii="Calibri" w:hAnsi="Calibri"/>
+                <w:b w:val="0"/>
+                <w:color w:val="111827"/>
+                <w:sz w:val="17"/>
+              </w:rPr>
+              <w:t>Critical reset invariant</w:t>
+            </w:r>
+          </w:p>
+        </w:tc>
+        <w:tc>
+          <w:tcPr>
+            <w:tcW w:type="dxa" w:w="4450"/>
+            <w:tcMar>
+              <w:top w:w="80" w:type="dxa"/>
+              <w:start w:w="120" w:type="dxa"/>
+              <w:bottom w:w="80" w:type="dxa"/>
+              <w:end w:w="120" w:type="dxa"/>
+            </w:tcMar>
+            <w:vAlign w:val="center"/>
+            <w:shd w:fill="FFFFFF"/>
+          </w:tcPr>
+          <w:p>
+            <w:pPr>
+              <w:spacing w:before="0" w:after="40" w:line="252" w:lineRule="auto"/>
+              <w:jc w:val="left"/>
+            </w:pPr>
+            <w:r>
+              <w:rPr>
+                <w:rFonts w:ascii="Calibri" w:hAnsi="Calibri"/>
+                <w:b w:val="0"/>
+                <w:color w:val="111827"/>
+                <w:sz w:val="17"/>
+              </w:rPr>
+              <w:t>Keep fault state while a confirmed critical fault remains.</w:t>
+            </w:r>
+          </w:p>
+        </w:tc>
+        <w:tc>
+          <w:tcPr>
+            <w:tcW w:type="dxa" w:w="3260"/>
+            <w:tcMar>
+              <w:top w:w="80" w:type="dxa"/>
+              <w:start w:w="120" w:type="dxa"/>
+              <w:bottom w:w="80" w:type="dxa"/>
+              <w:end w:w="120" w:type="dxa"/>
+            </w:tcMar>
+            <w:vAlign w:val="center"/>
+            <w:shd w:fill="FFFFFF"/>
+          </w:tcPr>
+          <w:p>
+            <w:pPr>
+              <w:spacing w:before="0" w:after="40" w:line="252" w:lineRule="auto"/>
+              <w:jc w:val="left"/>
+            </w:pPr>
+            <w:r>
+              <w:rPr>
+                <w:rFonts w:ascii="Calibri" w:hAnsi="Calibri"/>
+                <w:b w:val="0"/>
+                <w:color w:val="111827"/>
+                <w:sz w:val="17"/>
+              </w:rPr>
+              <w:t>Service</w:t>
+            </w:r>
+          </w:p>
+        </w:tc>
+      </w:tr>
+    </w:tbl>
+    <w:p>
+      <w:pPr>
+        <w:spacing w:after="60"/>
+      </w:pPr>
+    </w:p>
+    <w:p>
+      <w:pPr>
+        <w:pStyle w:val="Heading1"/>
+        <w:keepNext/>
+        <w:keepLines/>
+        <w:pageBreakBefore/>
       </w:pPr>
       <w:r>
         <w:t>12. Implemented Evidence</w:t>
@@ -4541,7 +5907,7 @@
           <w:color w:val="111827"/>
           <w:sz w:val="22"/>
         </w:rPr>
-        <w:t xml:space="preserve">Migration </w:t>
+        <w:t xml:space="preserve">Migrations </w:t>
       </w:r>
       <w:r>
         <w:rPr>
@@ -4557,7 +5923,23 @@
           <w:color w:val="111827"/>
           <w:sz w:val="22"/>
         </w:rPr>
-        <w:t xml:space="preserve"> owns the database schema.</w:t>
+        <w:t xml:space="preserve"> and </w:t>
+      </w:r>
+      <w:r>
+        <w:rPr>
+          <w:rFonts w:ascii="Consolas" w:hAnsi="Consolas"/>
+          <w:color w:val="1F4D78"/>
+          <w:sz w:val="19"/>
+        </w:rPr>
+        <w:t>0019_ecu_execution_clock</w:t>
+      </w:r>
+      <w:r>
+        <w:rPr>
+          <w:rFonts w:ascii="Calibri" w:hAnsi="Calibri"/>
+          <w:color w:val="111827"/>
+          <w:sz w:val="22"/>
+        </w:rPr>
+        <w:t xml:space="preserve"> own the database schema.</w:t>
       </w:r>
     </w:p>
     <w:p>
@@ -4648,6 +6030,55 @@
           <w:sz w:val="19"/>
         </w:rPr>
         <w:t>atep.ecu.state.updated.v1</w:t>
+      </w:r>
+      <w:r>
+        <w:rPr>
+          <w:rFonts w:ascii="Calibri" w:hAnsi="Calibri"/>
+          <w:color w:val="111827"/>
+          <w:sz w:val="22"/>
+        </w:rPr>
+        <w:t>.</w:t>
+      </w:r>
+    </w:p>
+    <w:p>
+      <w:pPr>
+        <w:pStyle w:val="ListBullet"/>
+        <w:numPr>
+          <w:ilvl w:val="0"/>
+          <w:numId w:val="13"/>
+        </w:numPr>
+      </w:pPr>
+      <w:r>
+        <w:rPr>
+          <w:rFonts w:ascii="Calibri" w:hAnsi="Calibri"/>
+          <w:color w:val="111827"/>
+          <w:sz w:val="22"/>
+        </w:rPr>
+        <w:t xml:space="preserve">Simulation events are </w:t>
+      </w:r>
+      <w:r>
+        <w:rPr>
+          <w:rFonts w:ascii="Consolas" w:hAnsi="Consolas"/>
+          <w:color w:val="1F4D78"/>
+          <w:sz w:val="19"/>
+        </w:rPr>
+        <w:t>atep.ecu.simulation.advanced.v1</w:t>
+      </w:r>
+      <w:r>
+        <w:rPr>
+          <w:rFonts w:ascii="Calibri" w:hAnsi="Calibri"/>
+          <w:color w:val="111827"/>
+          <w:sz w:val="22"/>
+        </w:rPr>
+        <w:t xml:space="preserve"> and </w:t>
+      </w:r>
+      <w:r>
+        <w:rPr>
+          <w:rFonts w:ascii="Consolas" w:hAnsi="Consolas"/>
+          <w:color w:val="1F4D78"/>
+          <w:sz w:val="19"/>
+        </w:rPr>
+        <w:t>atep.ecu.reset.completed.v1</w:t>
       </w:r>
       <w:r>
         <w:rPr>
@@ -4787,7 +6218,7 @@
           <w:color w:val="111827"/>
           <w:sz w:val="22"/>
         </w:rPr>
-        <w:t xml:space="preserve">The next increment adds a deterministic logical clock, cyclic tasks, and reset semantics without wall-clock sleeps. Later increments add ECU profiles, memory regions, fault lifecycle, CAN contracts, and multi-ECU scenarios. See </w:t>
+        <w:t xml:space="preserve">The next increment adds ECU-specific behavior profiles on top of the deterministic task clock. Later increments add memory regions, fault lifecycle, CAN contracts, and multi-ECU scenarios. See </w:t>
       </w:r>
       <w:r>
         <w:rPr>
@@ -4903,20 +6334,10 @@
     </w:p>
     <w:p>
       <w:pPr>
-        <w:pStyle w:val="Heading1"/>
-        <w:keepNext/>
-        <w:keepLines/>
-      </w:pPr>
-      <w:r>
-        <w:t>16. Workbook Maintenance Checklist</w:t>
-      </w:r>
-    </w:p>
-    <w:p>
-      <w:pPr>
-        <w:pStyle w:val="ListBullet"/>
+        <w:pStyle w:val="ListNumber"/>
         <w:numPr>
           <w:ilvl w:val="0"/>
-          <w:numId w:val="16"/>
+          <w:numId w:val="15"/>
         </w:numPr>
       </w:pPr>
       <w:r>
@@ -4925,15 +6346,15 @@
           <w:color w:val="111827"/>
           <w:sz w:val="22"/>
         </w:rPr>
-        <w:t>Update requirement status and evidence with every increment.</w:t>
+        <w:t>Calculate the due times for a 100 ms task with a 20 ms offset over two consecutive advances.</w:t>
       </w:r>
     </w:p>
     <w:p>
       <w:pPr>
-        <w:pStyle w:val="ListBullet"/>
+        <w:pStyle w:val="ListNumber"/>
         <w:numPr>
           <w:ilvl w:val="0"/>
-          <w:numId w:val="16"/>
+          <w:numId w:val="15"/>
         </w:numPr>
       </w:pPr>
       <w:r>
@@ -4942,41 +6363,7 @@
           <w:color w:val="111827"/>
           <w:sz w:val="22"/>
         </w:rPr>
-        <w:t>Add each architecture decision before introducing its implementation dependency.</w:t>
-      </w:r>
-    </w:p>
-    <w:p>
-      <w:pPr>
-        <w:pStyle w:val="ListBullet"/>
-        <w:numPr>
-          <w:ilvl w:val="0"/>
-          <w:numId w:val="16"/>
-        </w:numPr>
-      </w:pPr>
-      <w:r>
-        <w:rPr>
-          <w:rFonts w:ascii="Calibri" w:hAnsi="Calibri"/>
-          <w:color w:val="111827"/>
-          <w:sz w:val="22"/>
-        </w:rPr>
-        <w:t>Record public event names and stable errors.</w:t>
-      </w:r>
-    </w:p>
-    <w:p>
-      <w:pPr>
-        <w:pStyle w:val="ListBullet"/>
-        <w:numPr>
-          <w:ilvl w:val="0"/>
-          <w:numId w:val="16"/>
-        </w:numPr>
-      </w:pPr>
-      <w:r>
-        <w:rPr>
-          <w:rFonts w:ascii="Calibri" w:hAnsi="Calibri"/>
-          <w:color w:val="111827"/>
-          <w:sz w:val="22"/>
-        </w:rPr>
-        <w:t>Keep test objectives aligned with automated test names.</w:t>
+        <w:t>Explain why III-2 reset preserves memory and how III-4 can refine that contract safely.</w:t>
       </w:r>
     </w:p>
     <w:sectPr>
@@ -5008,7 +6395,7 @@
         <w:color w:val="667085"/>
         <w:sz w:val="17"/>
       </w:rPr>
-      <w:t>ATEP Volume III Workbook  |  Version 0.1.0</w:t>
+      <w:t>ATEP Volume III Workbook  |  Version 0.2.0</w:t>
     </w:r>
     <w:r>
       <w:rPr>
@@ -5321,12 +6708,6 @@
   </w:num>
   <w:num w:numId="15">
     <w:abstractNumId w:val="9"/>
-    <w:lvlOverride w:ilvl="0">
-      <w:startOverride w:val="1"/>
-    </w:lvlOverride>
-  </w:num>
-  <w:num w:numId="16">
-    <w:abstractNumId w:val="10"/>
     <w:lvlOverride w:ilvl="0">
       <w:startOverride w:val="1"/>
     </w:lvlOverride>

</xml_diff>

<commit_message>
feat(ecus): add behavior profiles
</commit_message>
<xml_diff>
--- a/docs/ATEP_Volume_III_ECU_Simulator_Engineering_Workbook.docx
+++ b/docs/ATEP_Volume_III_ECU_Simulator_Engineering_Workbook.docx
@@ -143,7 +143,7 @@
                 <w:color w:val="0B2545"/>
                 <w:sz w:val="19"/>
               </w:rPr>
-              <w:t>0.2.0</w:t>
+              <w:t>0.3.0</w:t>
             </w:r>
           </w:p>
         </w:tc>
@@ -265,7 +265,7 @@
                 <w:color w:val="111827"/>
                 <w:sz w:val="19"/>
               </w:rPr>
-              <w:t>Living document - Increments III-1 and III-2 implemented</w:t>
+              <w:t>Living document - Increments III-1 through III-3 implemented</w:t>
             </w:r>
           </w:p>
         </w:tc>
@@ -618,6 +618,25 @@
           <w:color w:val="0B2545"/>
           <w:sz w:val="21"/>
         </w:rPr>
+        <w:t>11.2 III-3 Verification</w:t>
+      </w:r>
+    </w:p>
+    <w:p>
+      <w:pPr>
+        <w:pStyle w:val="ListNumber"/>
+        <w:numPr>
+          <w:ilvl w:val="0"/>
+          <w:numId w:val="10"/>
+        </w:numPr>
+        <w:ind w:left="216" w:firstLine="0"/>
+      </w:pPr>
+      <w:r>
+        <w:rPr>
+          <w:rFonts w:ascii="Calibri" w:hAnsi="Calibri"/>
+          <w:b/>
+          <w:color w:val="0B2545"/>
+          <w:sz w:val="21"/>
+        </w:rPr>
         <w:t>12. Implemented Evidence</w:t>
       </w:r>
     </w:p>
@@ -912,7 +931,7 @@
                 <w:color w:val="111827"/>
                 <w:sz w:val="17"/>
               </w:rPr>
-              <w:t>Increments III-1 and III-2</w:t>
+              <w:t>Increments III-1 through III-3</w:t>
             </w:r>
           </w:p>
         </w:tc>
@@ -1405,6 +1424,95 @@
           </w:p>
         </w:tc>
       </w:tr>
+      <w:tr>
+        <w:trPr>
+          <w:cantSplit/>
+        </w:trPr>
+        <w:tc>
+          <w:tcPr>
+            <w:tcW w:type="dxa" w:w="1650"/>
+            <w:tcMar>
+              <w:top w:w="80" w:type="dxa"/>
+              <w:start w:w="120" w:type="dxa"/>
+              <w:bottom w:w="80" w:type="dxa"/>
+              <w:end w:w="120" w:type="dxa"/>
+            </w:tcMar>
+            <w:vAlign w:val="center"/>
+            <w:shd w:fill="FFFFFF"/>
+          </w:tcPr>
+          <w:p>
+            <w:pPr>
+              <w:spacing w:before="0" w:after="40" w:line="252" w:lineRule="auto"/>
+              <w:jc w:val="center"/>
+            </w:pPr>
+            <w:r>
+              <w:rPr>
+                <w:rFonts w:ascii="Calibri" w:hAnsi="Calibri"/>
+                <w:b w:val="0"/>
+                <w:color w:val="111827"/>
+                <w:sz w:val="17"/>
+              </w:rPr>
+              <w:t>0.3.0</w:t>
+            </w:r>
+          </w:p>
+        </w:tc>
+        <w:tc>
+          <w:tcPr>
+            <w:tcW w:type="dxa" w:w="4450"/>
+            <w:tcMar>
+              <w:top w:w="80" w:type="dxa"/>
+              <w:start w:w="120" w:type="dxa"/>
+              <w:bottom w:w="80" w:type="dxa"/>
+              <w:end w:w="120" w:type="dxa"/>
+            </w:tcMar>
+            <w:vAlign w:val="center"/>
+            <w:shd w:fill="FFFFFF"/>
+          </w:tcPr>
+          <w:p>
+            <w:pPr>
+              <w:spacing w:before="0" w:after="40" w:line="252" w:lineRule="auto"/>
+              <w:jc w:val="left"/>
+            </w:pPr>
+            <w:r>
+              <w:rPr>
+                <w:rFonts w:ascii="Calibri" w:hAnsi="Calibri"/>
+                <w:b w:val="0"/>
+                <w:color w:val="111827"/>
+                <w:sz w:val="17"/>
+              </w:rPr>
+              <w:t>2026-08-24</w:t>
+            </w:r>
+          </w:p>
+        </w:tc>
+        <w:tc>
+          <w:tcPr>
+            <w:tcW w:type="dxa" w:w="3260"/>
+            <w:tcMar>
+              <w:top w:w="80" w:type="dxa"/>
+              <w:start w:w="120" w:type="dxa"/>
+              <w:bottom w:w="80" w:type="dxa"/>
+              <w:end w:w="120" w:type="dxa"/>
+            </w:tcMar>
+            <w:vAlign w:val="center"/>
+            <w:shd w:fill="FFFFFF"/>
+          </w:tcPr>
+          <w:p>
+            <w:pPr>
+              <w:spacing w:before="0" w:after="40" w:line="252" w:lineRule="auto"/>
+              <w:jc w:val="left"/>
+            </w:pPr>
+            <w:r>
+              <w:rPr>
+                <w:rFonts w:ascii="Calibri" w:hAnsi="Calibri"/>
+                <w:b w:val="0"/>
+                <w:color w:val="111827"/>
+                <w:sz w:val="17"/>
+              </w:rPr>
+              <w:t>Added versioned behavior profiles, profile APIs, deterministic state transitions, migration, and tests.</w:t>
+            </w:r>
+          </w:p>
+        </w:tc>
+      </w:tr>
     </w:tbl>
     <w:p>
       <w:pPr>
@@ -1599,6 +1707,23 @@
           <w:sz w:val="22"/>
         </w:rPr>
         <w:t>Idempotent advance/reset commands with persisted execution evidence.</w:t>
+      </w:r>
+    </w:p>
+    <w:p>
+      <w:pPr>
+        <w:pStyle w:val="ListBullet"/>
+        <w:numPr>
+          <w:ilvl w:val="0"/>
+          <w:numId w:val="11"/>
+        </w:numPr>
+      </w:pPr>
+      <w:r>
+        <w:rPr>
+          <w:rFonts w:ascii="Calibri" w:hAnsi="Calibri"/>
+          <w:color w:val="111827"/>
+          <w:sz w:val="22"/>
+        </w:rPr>
+        <w:t>Versioned profiles with allowed schedules, bounded initial state, and deterministic transitions.</w:t>
       </w:r>
     </w:p>
     <w:p>
@@ -1871,7 +1996,7 @@
           <w:color w:val="111827"/>
           <w:sz w:val="22"/>
         </w:rPr>
-        <w:t xml:space="preserve">, cyclic tasks, logical time, boot count, </w:t>
+        <w:t xml:space="preserve">, cyclic tasks, profile version, behavior state, logical time, boot count, </w:t>
       </w:r>
       <w:r>
         <w:rPr>
@@ -2762,6 +2887,240 @@
           </w:p>
         </w:tc>
       </w:tr>
+      <w:tr>
+        <w:trPr>
+          <w:cantSplit/>
+        </w:trPr>
+        <w:tc>
+          <w:tcPr>
+            <w:tcW w:type="dxa" w:w="1150"/>
+            <w:tcMar>
+              <w:top w:w="80" w:type="dxa"/>
+              <w:start w:w="120" w:type="dxa"/>
+              <w:bottom w:w="80" w:type="dxa"/>
+              <w:end w:w="120" w:type="dxa"/>
+            </w:tcMar>
+            <w:vAlign w:val="center"/>
+            <w:shd w:fill="FFFFFF"/>
+          </w:tcPr>
+          <w:p>
+            <w:pPr>
+              <w:spacing w:before="0" w:after="40" w:line="252" w:lineRule="auto"/>
+              <w:jc w:val="center"/>
+            </w:pPr>
+            <w:r>
+              <w:rPr>
+                <w:rFonts w:ascii="Calibri" w:hAnsi="Calibri"/>
+                <w:b w:val="0"/>
+                <w:color w:val="111827"/>
+                <w:sz w:val="16"/>
+              </w:rPr>
+              <w:t>GET</w:t>
+            </w:r>
+          </w:p>
+        </w:tc>
+        <w:tc>
+          <w:tcPr>
+            <w:tcW w:type="dxa" w:w="3700"/>
+            <w:tcMar>
+              <w:top w:w="80" w:type="dxa"/>
+              <w:start w:w="120" w:type="dxa"/>
+              <w:bottom w:w="80" w:type="dxa"/>
+              <w:end w:w="120" w:type="dxa"/>
+            </w:tcMar>
+            <w:vAlign w:val="center"/>
+            <w:shd w:fill="FFFFFF"/>
+          </w:tcPr>
+          <w:p>
+            <w:pPr>
+              <w:spacing w:before="0" w:after="40" w:line="252" w:lineRule="auto"/>
+              <w:jc w:val="left"/>
+            </w:pPr>
+            <w:r>
+              <w:rPr>
+                <w:rFonts w:ascii="Calibri" w:hAnsi="Calibri"/>
+                <w:b w:val="0"/>
+                <w:color w:val="111827"/>
+                <w:sz w:val="16"/>
+              </w:rPr>
+              <w:t>/api/v1/ecu-profiles</w:t>
+            </w:r>
+          </w:p>
+        </w:tc>
+        <w:tc>
+          <w:tcPr>
+            <w:tcW w:type="dxa" w:w="3100"/>
+            <w:tcMar>
+              <w:top w:w="80" w:type="dxa"/>
+              <w:start w:w="120" w:type="dxa"/>
+              <w:bottom w:w="80" w:type="dxa"/>
+              <w:end w:w="120" w:type="dxa"/>
+            </w:tcMar>
+            <w:vAlign w:val="center"/>
+            <w:shd w:fill="FFFFFF"/>
+          </w:tcPr>
+          <w:p>
+            <w:pPr>
+              <w:spacing w:before="0" w:after="40" w:line="252" w:lineRule="auto"/>
+              <w:jc w:val="left"/>
+            </w:pPr>
+            <w:r>
+              <w:rPr>
+                <w:rFonts w:ascii="Calibri" w:hAnsi="Calibri"/>
+                <w:b w:val="0"/>
+                <w:color w:val="111827"/>
+                <w:sz w:val="16"/>
+              </w:rPr>
+              <w:t>ecus:read</w:t>
+            </w:r>
+          </w:p>
+        </w:tc>
+        <w:tc>
+          <w:tcPr>
+            <w:tcW w:type="dxa" w:w="1410"/>
+            <w:tcMar>
+              <w:top w:w="80" w:type="dxa"/>
+              <w:start w:w="120" w:type="dxa"/>
+              <w:bottom w:w="80" w:type="dxa"/>
+              <w:end w:w="120" w:type="dxa"/>
+            </w:tcMar>
+            <w:vAlign w:val="center"/>
+            <w:shd w:fill="FFFFFF"/>
+          </w:tcPr>
+          <w:p>
+            <w:pPr>
+              <w:spacing w:before="0" w:after="40" w:line="252" w:lineRule="auto"/>
+              <w:jc w:val="left"/>
+            </w:pPr>
+            <w:r>
+              <w:rPr>
+                <w:rFonts w:ascii="Calibri" w:hAnsi="Calibri"/>
+                <w:b w:val="0"/>
+                <w:color w:val="111827"/>
+                <w:sz w:val="16"/>
+              </w:rPr>
+              <w:t>List versioned behavior profiles.</w:t>
+            </w:r>
+          </w:p>
+        </w:tc>
+      </w:tr>
+      <w:tr>
+        <w:trPr>
+          <w:cantSplit/>
+        </w:trPr>
+        <w:tc>
+          <w:tcPr>
+            <w:tcW w:type="dxa" w:w="1150"/>
+            <w:tcMar>
+              <w:top w:w="80" w:type="dxa"/>
+              <w:start w:w="120" w:type="dxa"/>
+              <w:bottom w:w="80" w:type="dxa"/>
+              <w:end w:w="120" w:type="dxa"/>
+            </w:tcMar>
+            <w:vAlign w:val="center"/>
+            <w:shd w:fill="FFFFFF"/>
+          </w:tcPr>
+          <w:p>
+            <w:pPr>
+              <w:spacing w:before="0" w:after="40" w:line="252" w:lineRule="auto"/>
+              <w:jc w:val="center"/>
+            </w:pPr>
+            <w:r>
+              <w:rPr>
+                <w:rFonts w:ascii="Calibri" w:hAnsi="Calibri"/>
+                <w:b w:val="0"/>
+                <w:color w:val="111827"/>
+                <w:sz w:val="16"/>
+              </w:rPr>
+              <w:t>GET</w:t>
+            </w:r>
+          </w:p>
+        </w:tc>
+        <w:tc>
+          <w:tcPr>
+            <w:tcW w:type="dxa" w:w="3700"/>
+            <w:tcMar>
+              <w:top w:w="80" w:type="dxa"/>
+              <w:start w:w="120" w:type="dxa"/>
+              <w:bottom w:w="80" w:type="dxa"/>
+              <w:end w:w="120" w:type="dxa"/>
+            </w:tcMar>
+            <w:vAlign w:val="center"/>
+            <w:shd w:fill="FFFFFF"/>
+          </w:tcPr>
+          <w:p>
+            <w:pPr>
+              <w:spacing w:before="0" w:after="40" w:line="252" w:lineRule="auto"/>
+              <w:jc w:val="left"/>
+            </w:pPr>
+            <w:r>
+              <w:rPr>
+                <w:rFonts w:ascii="Calibri" w:hAnsi="Calibri"/>
+                <w:b w:val="0"/>
+                <w:color w:val="111827"/>
+                <w:sz w:val="16"/>
+              </w:rPr>
+              <w:t>/api/v1/ecu-profiles/{ecu_type}</w:t>
+            </w:r>
+          </w:p>
+        </w:tc>
+        <w:tc>
+          <w:tcPr>
+            <w:tcW w:type="dxa" w:w="3100"/>
+            <w:tcMar>
+              <w:top w:w="80" w:type="dxa"/>
+              <w:start w:w="120" w:type="dxa"/>
+              <w:bottom w:w="80" w:type="dxa"/>
+              <w:end w:w="120" w:type="dxa"/>
+            </w:tcMar>
+            <w:vAlign w:val="center"/>
+            <w:shd w:fill="FFFFFF"/>
+          </w:tcPr>
+          <w:p>
+            <w:pPr>
+              <w:spacing w:before="0" w:after="40" w:line="252" w:lineRule="auto"/>
+              <w:jc w:val="left"/>
+            </w:pPr>
+            <w:r>
+              <w:rPr>
+                <w:rFonts w:ascii="Calibri" w:hAnsi="Calibri"/>
+                <w:b w:val="0"/>
+                <w:color w:val="111827"/>
+                <w:sz w:val="16"/>
+              </w:rPr>
+              <w:t>ecus:read</w:t>
+            </w:r>
+          </w:p>
+        </w:tc>
+        <w:tc>
+          <w:tcPr>
+            <w:tcW w:type="dxa" w:w="1410"/>
+            <w:tcMar>
+              <w:top w:w="80" w:type="dxa"/>
+              <w:start w:w="120" w:type="dxa"/>
+              <w:bottom w:w="80" w:type="dxa"/>
+              <w:end w:w="120" w:type="dxa"/>
+            </w:tcMar>
+            <w:vAlign w:val="center"/>
+            <w:shd w:fill="FFFFFF"/>
+          </w:tcPr>
+          <w:p>
+            <w:pPr>
+              <w:spacing w:before="0" w:after="40" w:line="252" w:lineRule="auto"/>
+              <w:jc w:val="left"/>
+            </w:pPr>
+            <w:r>
+              <w:rPr>
+                <w:rFonts w:ascii="Calibri" w:hAnsi="Calibri"/>
+                <w:b w:val="0"/>
+                <w:color w:val="111827"/>
+                <w:sz w:val="16"/>
+              </w:rPr>
+              <w:t>Inspect one profile contract.</w:t>
+            </w:r>
+          </w:p>
+        </w:tc>
+      </w:tr>
     </w:tbl>
     <w:p>
       <w:pPr>
@@ -2910,6 +3269,26 @@
     </w:p>
     <w:p>
       <w:pPr>
+        <w:pStyle w:val="Heading2"/>
+        <w:keepNext/>
+        <w:keepLines/>
+      </w:pPr>
+      <w:r>
+        <w:t>8.2 Profile Execution</w:t>
+      </w:r>
+    </w:p>
+    <w:p>
+      <w:r>
+        <w:rPr>
+          <w:rFonts w:ascii="Calibri" w:hAnsi="Calibri"/>
+          <w:color w:val="111827"/>
+          <w:sz w:val="22"/>
+        </w:rPr>
+        <w:t>The immutable registry defines a version, allowed task schedules, initial behavior state, and a state effect for every task. Creation applies defaults when callers omit them. State replacement rejects unknown task IDs, modified schedules, and unknown state keys. During logical-time advance, aggregated execution counts update integer counters once; no wall-clock or protocol adapter is used.</w:t>
+      </w:r>
+    </w:p>
+    <w:p>
+      <w:pPr>
         <w:pStyle w:val="Heading1"/>
         <w:keepNext/>
         <w:keepLines/>
@@ -2941,7 +3320,7 @@
           <w:color w:val="111827"/>
           <w:sz w:val="22"/>
         </w:rPr>
-        <w:t>. III-1 covers the aggregate and III-2 covers logical time, cyclic schedules, reset modes, replay, lifecycle guards, events, and audit.</w:t>
+        <w:t>. III-1 covers the aggregate, III-2 covers deterministic execution and reset, and III-3 covers versioned profiles and state transitions.</w:t>
       </w:r>
     </w:p>
     <w:p>
@@ -3072,6 +3451,26 @@
           <w:sz w:val="22"/>
         </w:rPr>
         <w:t>Clearing state before defining volatile and non-volatile regions would invent behavior. III-2 records reset mode, duration, boot count, and preservation; III-4 will own persistence semantics.</w:t>
+      </w:r>
+    </w:p>
+    <w:p>
+      <w:pPr>
+        <w:pStyle w:val="Heading2"/>
+        <w:keepNext/>
+        <w:keepLines/>
+      </w:pPr>
+      <w:r>
+        <w:t>ADR-ECU-007 — Keep Behavior Profiles Immutable and Protocol-Independent</w:t>
+      </w:r>
+    </w:p>
+    <w:p>
+      <w:r>
+        <w:rPr>
+          <w:rFonts w:ascii="Calibri" w:hAnsi="Calibri"/>
+          <w:color w:val="111827"/>
+          <w:sz w:val="22"/>
+        </w:rPr>
+        <w:t>Profiles are source-controlled contracts rather than mutable database configuration. This makes tests reproducible and reviewable. CAN production, UDS diagnostics, and continuous physical models remain outside the profile registry and will integrate through later explicit boundaries.</w:t>
       </w:r>
     </w:p>
     <w:p>
@@ -4933,7 +5332,6 @@
         <w:pStyle w:val="Heading1"/>
         <w:keepNext/>
         <w:keepLines/>
-        <w:pageBreakBefore/>
       </w:pPr>
       <w:r>
         <w:t>11.1 III-2 Verification</w:t>
@@ -5862,7 +6260,952 @@
         <w:pStyle w:val="Heading1"/>
         <w:keepNext/>
         <w:keepLines/>
-        <w:pageBreakBefore/>
+      </w:pPr>
+      <w:r>
+        <w:t>11.2 III-3 Verification</w:t>
+      </w:r>
+    </w:p>
+    <w:tbl>
+      <w:tblPr>
+        <w:tblW w:type="dxa" w:w="9360"/>
+        <w:jc w:val="left"/>
+        <w:tblLayout w:type="fixed"/>
+        <w:tblLook w:firstColumn="1" w:firstRow="1" w:lastColumn="0" w:lastRow="0" w:noHBand="0" w:noVBand="1" w:val="04A0"/>
+        <w:tblInd w:w="120" w:type="dxa"/>
+        <w:tblBorders>
+          <w:top w:val="single" w:sz="6" w:color="B8C4D1"/>
+          <w:left w:val="single" w:sz="6" w:color="B8C4D1"/>
+          <w:bottom w:val="single" w:sz="6" w:color="B8C4D1"/>
+          <w:right w:val="single" w:sz="6" w:color="B8C4D1"/>
+          <w:insideH w:val="single" w:sz="6" w:color="B8C4D1"/>
+          <w:insideV w:val="single" w:sz="6" w:color="B8C4D1"/>
+        </w:tblBorders>
+      </w:tblPr>
+      <w:tblGrid>
+        <w:gridCol w:w="1650"/>
+        <w:gridCol w:w="4450"/>
+        <w:gridCol w:w="3260"/>
+      </w:tblGrid>
+      <w:tr>
+        <w:trPr>
+          <w:tblHeader w:val="true"/>
+          <w:cantSplit/>
+        </w:trPr>
+        <w:tc>
+          <w:tcPr>
+            <w:tcW w:type="dxa" w:w="1650"/>
+            <w:tcMar>
+              <w:top w:w="80" w:type="dxa"/>
+              <w:start w:w="120" w:type="dxa"/>
+              <w:bottom w:w="80" w:type="dxa"/>
+              <w:end w:w="120" w:type="dxa"/>
+            </w:tcMar>
+            <w:vAlign w:val="center"/>
+            <w:shd w:fill="E8EEF5"/>
+          </w:tcPr>
+          <w:p>
+            <w:pPr>
+              <w:spacing w:before="0" w:after="40" w:line="252" w:lineRule="auto"/>
+              <w:jc w:val="center"/>
+            </w:pPr>
+            <w:r>
+              <w:rPr>
+                <w:rFonts w:ascii="Calibri" w:hAnsi="Calibri"/>
+                <w:b/>
+                <w:color w:val="0B2545"/>
+                <w:sz w:val="17"/>
+              </w:rPr>
+              <w:t>Test</w:t>
+            </w:r>
+          </w:p>
+        </w:tc>
+        <w:tc>
+          <w:tcPr>
+            <w:tcW w:type="dxa" w:w="4450"/>
+            <w:tcMar>
+              <w:top w:w="80" w:type="dxa"/>
+              <w:start w:w="120" w:type="dxa"/>
+              <w:bottom w:w="80" w:type="dxa"/>
+              <w:end w:w="120" w:type="dxa"/>
+            </w:tcMar>
+            <w:vAlign w:val="center"/>
+            <w:shd w:fill="E8EEF5"/>
+          </w:tcPr>
+          <w:p>
+            <w:pPr>
+              <w:spacing w:before="0" w:after="40" w:line="252" w:lineRule="auto"/>
+              <w:jc w:val="left"/>
+            </w:pPr>
+            <w:r>
+              <w:rPr>
+                <w:rFonts w:ascii="Calibri" w:hAnsi="Calibri"/>
+                <w:b/>
+                <w:color w:val="0B2545"/>
+                <w:sz w:val="17"/>
+              </w:rPr>
+              <w:t>Objective</w:t>
+            </w:r>
+          </w:p>
+        </w:tc>
+        <w:tc>
+          <w:tcPr>
+            <w:tcW w:type="dxa" w:w="3260"/>
+            <w:tcMar>
+              <w:top w:w="80" w:type="dxa"/>
+              <w:start w:w="120" w:type="dxa"/>
+              <w:bottom w:w="80" w:type="dxa"/>
+              <w:end w:w="120" w:type="dxa"/>
+            </w:tcMar>
+            <w:vAlign w:val="center"/>
+            <w:shd w:fill="E8EEF5"/>
+          </w:tcPr>
+          <w:p>
+            <w:pPr>
+              <w:spacing w:before="0" w:after="40" w:line="252" w:lineRule="auto"/>
+              <w:jc w:val="left"/>
+            </w:pPr>
+            <w:r>
+              <w:rPr>
+                <w:rFonts w:ascii="Calibri" w:hAnsi="Calibri"/>
+                <w:b/>
+                <w:color w:val="0B2545"/>
+                <w:sz w:val="17"/>
+              </w:rPr>
+              <w:t>Level</w:t>
+            </w:r>
+          </w:p>
+        </w:tc>
+      </w:tr>
+      <w:tr>
+        <w:trPr>
+          <w:cantSplit/>
+        </w:trPr>
+        <w:tc>
+          <w:tcPr>
+            <w:tcW w:type="dxa" w:w="1650"/>
+            <w:tcMar>
+              <w:top w:w="80" w:type="dxa"/>
+              <w:start w:w="120" w:type="dxa"/>
+              <w:bottom w:w="80" w:type="dxa"/>
+              <w:end w:w="120" w:type="dxa"/>
+            </w:tcMar>
+            <w:vAlign w:val="center"/>
+            <w:shd w:fill="FFFFFF"/>
+          </w:tcPr>
+          <w:p>
+            <w:pPr>
+              <w:spacing w:before="0" w:after="40" w:line="252" w:lineRule="auto"/>
+              <w:jc w:val="center"/>
+            </w:pPr>
+            <w:r>
+              <w:rPr>
+                <w:rFonts w:ascii="Calibri" w:hAnsi="Calibri"/>
+                <w:b w:val="0"/>
+                <w:color w:val="111827"/>
+                <w:sz w:val="17"/>
+              </w:rPr>
+              <w:t>Profile coverage</w:t>
+            </w:r>
+          </w:p>
+        </w:tc>
+        <w:tc>
+          <w:tcPr>
+            <w:tcW w:type="dxa" w:w="4450"/>
+            <w:tcMar>
+              <w:top w:w="80" w:type="dxa"/>
+              <w:start w:w="120" w:type="dxa"/>
+              <w:bottom w:w="80" w:type="dxa"/>
+              <w:end w:w="120" w:type="dxa"/>
+            </w:tcMar>
+            <w:vAlign w:val="center"/>
+            <w:shd w:fill="FFFFFF"/>
+          </w:tcPr>
+          <w:p>
+            <w:pPr>
+              <w:spacing w:before="0" w:after="40" w:line="252" w:lineRule="auto"/>
+              <w:jc w:val="left"/>
+            </w:pPr>
+            <w:r>
+              <w:rPr>
+                <w:rFonts w:ascii="Calibri" w:hAnsi="Calibri"/>
+                <w:b w:val="0"/>
+                <w:color w:val="111827"/>
+                <w:sz w:val="17"/>
+              </w:rPr>
+              <w:t>Publish a versioned profile for every supported ECU type.</w:t>
+            </w:r>
+          </w:p>
+        </w:tc>
+        <w:tc>
+          <w:tcPr>
+            <w:tcW w:type="dxa" w:w="3260"/>
+            <w:tcMar>
+              <w:top w:w="80" w:type="dxa"/>
+              <w:start w:w="120" w:type="dxa"/>
+              <w:bottom w:w="80" w:type="dxa"/>
+              <w:end w:w="120" w:type="dxa"/>
+            </w:tcMar>
+            <w:vAlign w:val="center"/>
+            <w:shd w:fill="FFFFFF"/>
+          </w:tcPr>
+          <w:p>
+            <w:pPr>
+              <w:spacing w:before="0" w:after="40" w:line="252" w:lineRule="auto"/>
+              <w:jc w:val="left"/>
+            </w:pPr>
+            <w:r>
+              <w:rPr>
+                <w:rFonts w:ascii="Calibri" w:hAnsi="Calibri"/>
+                <w:b w:val="0"/>
+                <w:color w:val="111827"/>
+                <w:sz w:val="17"/>
+              </w:rPr>
+              <w:t>Unit/contract</w:t>
+            </w:r>
+          </w:p>
+        </w:tc>
+      </w:tr>
+      <w:tr>
+        <w:trPr>
+          <w:cantSplit/>
+        </w:trPr>
+        <w:tc>
+          <w:tcPr>
+            <w:tcW w:type="dxa" w:w="1650"/>
+            <w:tcMar>
+              <w:top w:w="80" w:type="dxa"/>
+              <w:start w:w="120" w:type="dxa"/>
+              <w:bottom w:w="80" w:type="dxa"/>
+              <w:end w:w="120" w:type="dxa"/>
+            </w:tcMar>
+            <w:vAlign w:val="center"/>
+            <w:shd w:fill="FFFFFF"/>
+          </w:tcPr>
+          <w:p>
+            <w:pPr>
+              <w:spacing w:before="0" w:after="40" w:line="252" w:lineRule="auto"/>
+              <w:jc w:val="center"/>
+            </w:pPr>
+            <w:r>
+              <w:rPr>
+                <w:rFonts w:ascii="Calibri" w:hAnsi="Calibri"/>
+                <w:b w:val="0"/>
+                <w:color w:val="111827"/>
+                <w:sz w:val="17"/>
+              </w:rPr>
+              <w:t>Distinct controller profiles</w:t>
+            </w:r>
+          </w:p>
+        </w:tc>
+        <w:tc>
+          <w:tcPr>
+            <w:tcW w:type="dxa" w:w="4450"/>
+            <w:tcMar>
+              <w:top w:w="80" w:type="dxa"/>
+              <w:start w:w="120" w:type="dxa"/>
+              <w:bottom w:w="80" w:type="dxa"/>
+              <w:end w:w="120" w:type="dxa"/>
+            </w:tcMar>
+            <w:vAlign w:val="center"/>
+            <w:shd w:fill="FFFFFF"/>
+          </w:tcPr>
+          <w:p>
+            <w:pPr>
+              <w:spacing w:before="0" w:after="40" w:line="252" w:lineRule="auto"/>
+              <w:jc w:val="left"/>
+            </w:pPr>
+            <w:r>
+              <w:rPr>
+                <w:rFonts w:ascii="Calibri" w:hAnsi="Calibri"/>
+                <w:b w:val="0"/>
+                <w:color w:val="111827"/>
+                <w:sz w:val="17"/>
+              </w:rPr>
+              <w:t>Verify motor, battery, body, gateway, and ABS safety schedules differ.</w:t>
+            </w:r>
+          </w:p>
+        </w:tc>
+        <w:tc>
+          <w:tcPr>
+            <w:tcW w:type="dxa" w:w="3260"/>
+            <w:tcMar>
+              <w:top w:w="80" w:type="dxa"/>
+              <w:start w:w="120" w:type="dxa"/>
+              <w:bottom w:w="80" w:type="dxa"/>
+              <w:end w:w="120" w:type="dxa"/>
+            </w:tcMar>
+            <w:vAlign w:val="center"/>
+            <w:shd w:fill="FFFFFF"/>
+          </w:tcPr>
+          <w:p>
+            <w:pPr>
+              <w:spacing w:before="0" w:after="40" w:line="252" w:lineRule="auto"/>
+              <w:jc w:val="left"/>
+            </w:pPr>
+            <w:r>
+              <w:rPr>
+                <w:rFonts w:ascii="Calibri" w:hAnsi="Calibri"/>
+                <w:b w:val="0"/>
+                <w:color w:val="111827"/>
+                <w:sz w:val="17"/>
+              </w:rPr>
+              <w:t>Unit</w:t>
+            </w:r>
+          </w:p>
+        </w:tc>
+      </w:tr>
+      <w:tr>
+        <w:trPr>
+          <w:cantSplit/>
+        </w:trPr>
+        <w:tc>
+          <w:tcPr>
+            <w:tcW w:type="dxa" w:w="1650"/>
+            <w:tcMar>
+              <w:top w:w="80" w:type="dxa"/>
+              <w:start w:w="120" w:type="dxa"/>
+              <w:bottom w:w="80" w:type="dxa"/>
+              <w:end w:w="120" w:type="dxa"/>
+            </w:tcMar>
+            <w:vAlign w:val="center"/>
+            <w:shd w:fill="FFFFFF"/>
+          </w:tcPr>
+          <w:p>
+            <w:pPr>
+              <w:spacing w:before="0" w:after="40" w:line="252" w:lineRule="auto"/>
+              <w:jc w:val="center"/>
+            </w:pPr>
+            <w:r>
+              <w:rPr>
+                <w:rFonts w:ascii="Calibri" w:hAnsi="Calibri"/>
+                <w:b w:val="0"/>
+                <w:color w:val="111827"/>
+                <w:sz w:val="17"/>
+              </w:rPr>
+              <w:t>Creation defaults</w:t>
+            </w:r>
+          </w:p>
+        </w:tc>
+        <w:tc>
+          <w:tcPr>
+            <w:tcW w:type="dxa" w:w="4450"/>
+            <w:tcMar>
+              <w:top w:w="80" w:type="dxa"/>
+              <w:start w:w="120" w:type="dxa"/>
+              <w:bottom w:w="80" w:type="dxa"/>
+              <w:end w:w="120" w:type="dxa"/>
+            </w:tcMar>
+            <w:vAlign w:val="center"/>
+            <w:shd w:fill="FFFFFF"/>
+          </w:tcPr>
+          <w:p>
+            <w:pPr>
+              <w:spacing w:before="0" w:after="40" w:line="252" w:lineRule="auto"/>
+              <w:jc w:val="left"/>
+            </w:pPr>
+            <w:r>
+              <w:rPr>
+                <w:rFonts w:ascii="Calibri" w:hAnsi="Calibri"/>
+                <w:b w:val="0"/>
+                <w:color w:val="111827"/>
+                <w:sz w:val="17"/>
+              </w:rPr>
+              <w:t>Apply profile tasks and initial state when omitted.</w:t>
+            </w:r>
+          </w:p>
+        </w:tc>
+        <w:tc>
+          <w:tcPr>
+            <w:tcW w:type="dxa" w:w="3260"/>
+            <w:tcMar>
+              <w:top w:w="80" w:type="dxa"/>
+              <w:start w:w="120" w:type="dxa"/>
+              <w:bottom w:w="80" w:type="dxa"/>
+              <w:end w:w="120" w:type="dxa"/>
+            </w:tcMar>
+            <w:vAlign w:val="center"/>
+            <w:shd w:fill="FFFFFF"/>
+          </w:tcPr>
+          <w:p>
+            <w:pPr>
+              <w:spacing w:before="0" w:after="40" w:line="252" w:lineRule="auto"/>
+              <w:jc w:val="left"/>
+            </w:pPr>
+            <w:r>
+              <w:rPr>
+                <w:rFonts w:ascii="Calibri" w:hAnsi="Calibri"/>
+                <w:b w:val="0"/>
+                <w:color w:val="111827"/>
+                <w:sz w:val="17"/>
+              </w:rPr>
+              <w:t>Service</w:t>
+            </w:r>
+          </w:p>
+        </w:tc>
+      </w:tr>
+      <w:tr>
+        <w:trPr>
+          <w:cantSplit/>
+        </w:trPr>
+        <w:tc>
+          <w:tcPr>
+            <w:tcW w:type="dxa" w:w="1650"/>
+            <w:tcMar>
+              <w:top w:w="80" w:type="dxa"/>
+              <w:start w:w="120" w:type="dxa"/>
+              <w:bottom w:w="80" w:type="dxa"/>
+              <w:end w:w="120" w:type="dxa"/>
+            </w:tcMar>
+            <w:vAlign w:val="center"/>
+            <w:shd w:fill="FFFFFF"/>
+          </w:tcPr>
+          <w:p>
+            <w:pPr>
+              <w:spacing w:before="0" w:after="40" w:line="252" w:lineRule="auto"/>
+              <w:jc w:val="center"/>
+            </w:pPr>
+            <w:r>
+              <w:rPr>
+                <w:rFonts w:ascii="Calibri" w:hAnsi="Calibri"/>
+                <w:b w:val="0"/>
+                <w:color w:val="111827"/>
+                <w:sz w:val="17"/>
+              </w:rPr>
+              <w:t>Unsupported task rejection</w:t>
+            </w:r>
+          </w:p>
+        </w:tc>
+        <w:tc>
+          <w:tcPr>
+            <w:tcW w:type="dxa" w:w="4450"/>
+            <w:tcMar>
+              <w:top w:w="80" w:type="dxa"/>
+              <w:start w:w="120" w:type="dxa"/>
+              <w:bottom w:w="80" w:type="dxa"/>
+              <w:end w:w="120" w:type="dxa"/>
+            </w:tcMar>
+            <w:vAlign w:val="center"/>
+            <w:shd w:fill="FFFFFF"/>
+          </w:tcPr>
+          <w:p>
+            <w:pPr>
+              <w:spacing w:before="0" w:after="40" w:line="252" w:lineRule="auto"/>
+              <w:jc w:val="left"/>
+            </w:pPr>
+            <w:r>
+              <w:rPr>
+                <w:rFonts w:ascii="Calibri" w:hAnsi="Calibri"/>
+                <w:b w:val="0"/>
+                <w:color w:val="111827"/>
+                <w:sz w:val="17"/>
+              </w:rPr>
+              <w:t>Reject task IDs outside the ECU type contract.</w:t>
+            </w:r>
+          </w:p>
+        </w:tc>
+        <w:tc>
+          <w:tcPr>
+            <w:tcW w:type="dxa" w:w="3260"/>
+            <w:tcMar>
+              <w:top w:w="80" w:type="dxa"/>
+              <w:start w:w="120" w:type="dxa"/>
+              <w:bottom w:w="80" w:type="dxa"/>
+              <w:end w:w="120" w:type="dxa"/>
+            </w:tcMar>
+            <w:vAlign w:val="center"/>
+            <w:shd w:fill="FFFFFF"/>
+          </w:tcPr>
+          <w:p>
+            <w:pPr>
+              <w:spacing w:before="0" w:after="40" w:line="252" w:lineRule="auto"/>
+              <w:jc w:val="left"/>
+            </w:pPr>
+            <w:r>
+              <w:rPr>
+                <w:rFonts w:ascii="Calibri" w:hAnsi="Calibri"/>
+                <w:b w:val="0"/>
+                <w:color w:val="111827"/>
+                <w:sz w:val="17"/>
+              </w:rPr>
+              <w:t>Service/API</w:t>
+            </w:r>
+          </w:p>
+        </w:tc>
+      </w:tr>
+      <w:tr>
+        <w:trPr>
+          <w:cantSplit/>
+        </w:trPr>
+        <w:tc>
+          <w:tcPr>
+            <w:tcW w:type="dxa" w:w="1650"/>
+            <w:tcMar>
+              <w:top w:w="80" w:type="dxa"/>
+              <w:start w:w="120" w:type="dxa"/>
+              <w:bottom w:w="80" w:type="dxa"/>
+              <w:end w:w="120" w:type="dxa"/>
+            </w:tcMar>
+            <w:vAlign w:val="center"/>
+            <w:shd w:fill="FFFFFF"/>
+          </w:tcPr>
+          <w:p>
+            <w:pPr>
+              <w:spacing w:before="0" w:after="40" w:line="252" w:lineRule="auto"/>
+              <w:jc w:val="center"/>
+            </w:pPr>
+            <w:r>
+              <w:rPr>
+                <w:rFonts w:ascii="Calibri" w:hAnsi="Calibri"/>
+                <w:b w:val="0"/>
+                <w:color w:val="111827"/>
+                <w:sz w:val="17"/>
+              </w:rPr>
+              <w:t>Schedule drift rejection</w:t>
+            </w:r>
+          </w:p>
+        </w:tc>
+        <w:tc>
+          <w:tcPr>
+            <w:tcW w:type="dxa" w:w="4450"/>
+            <w:tcMar>
+              <w:top w:w="80" w:type="dxa"/>
+              <w:start w:w="120" w:type="dxa"/>
+              <w:bottom w:w="80" w:type="dxa"/>
+              <w:end w:w="120" w:type="dxa"/>
+            </w:tcMar>
+            <w:vAlign w:val="center"/>
+            <w:shd w:fill="FFFFFF"/>
+          </w:tcPr>
+          <w:p>
+            <w:pPr>
+              <w:spacing w:before="0" w:after="40" w:line="252" w:lineRule="auto"/>
+              <w:jc w:val="left"/>
+            </w:pPr>
+            <w:r>
+              <w:rPr>
+                <w:rFonts w:ascii="Calibri" w:hAnsi="Calibri"/>
+                <w:b w:val="0"/>
+                <w:color w:val="111827"/>
+                <w:sz w:val="17"/>
+              </w:rPr>
+              <w:t>Reject changed periods or offsets for a known task.</w:t>
+            </w:r>
+          </w:p>
+        </w:tc>
+        <w:tc>
+          <w:tcPr>
+            <w:tcW w:type="dxa" w:w="3260"/>
+            <w:tcMar>
+              <w:top w:w="80" w:type="dxa"/>
+              <w:start w:w="120" w:type="dxa"/>
+              <w:bottom w:w="80" w:type="dxa"/>
+              <w:end w:w="120" w:type="dxa"/>
+            </w:tcMar>
+            <w:vAlign w:val="center"/>
+            <w:shd w:fill="FFFFFF"/>
+          </w:tcPr>
+          <w:p>
+            <w:pPr>
+              <w:spacing w:before="0" w:after="40" w:line="252" w:lineRule="auto"/>
+              <w:jc w:val="left"/>
+            </w:pPr>
+            <w:r>
+              <w:rPr>
+                <w:rFonts w:ascii="Calibri" w:hAnsi="Calibri"/>
+                <w:b w:val="0"/>
+                <w:color w:val="111827"/>
+                <w:sz w:val="17"/>
+              </w:rPr>
+              <w:t>Service/API</w:t>
+            </w:r>
+          </w:p>
+        </w:tc>
+      </w:tr>
+      <w:tr>
+        <w:trPr>
+          <w:cantSplit/>
+        </w:trPr>
+        <w:tc>
+          <w:tcPr>
+            <w:tcW w:type="dxa" w:w="1650"/>
+            <w:tcMar>
+              <w:top w:w="80" w:type="dxa"/>
+              <w:start w:w="120" w:type="dxa"/>
+              <w:bottom w:w="80" w:type="dxa"/>
+              <w:end w:w="120" w:type="dxa"/>
+            </w:tcMar>
+            <w:vAlign w:val="center"/>
+            <w:shd w:fill="FFFFFF"/>
+          </w:tcPr>
+          <w:p>
+            <w:pPr>
+              <w:spacing w:before="0" w:after="40" w:line="252" w:lineRule="auto"/>
+              <w:jc w:val="center"/>
+            </w:pPr>
+            <w:r>
+              <w:rPr>
+                <w:rFonts w:ascii="Calibri" w:hAnsi="Calibri"/>
+                <w:b w:val="0"/>
+                <w:color w:val="111827"/>
+                <w:sz w:val="17"/>
+              </w:rPr>
+              <w:t>State-key rejection</w:t>
+            </w:r>
+          </w:p>
+        </w:tc>
+        <w:tc>
+          <w:tcPr>
+            <w:tcW w:type="dxa" w:w="4450"/>
+            <w:tcMar>
+              <w:top w:w="80" w:type="dxa"/>
+              <w:start w:w="120" w:type="dxa"/>
+              <w:bottom w:w="80" w:type="dxa"/>
+              <w:end w:w="120" w:type="dxa"/>
+            </w:tcMar>
+            <w:vAlign w:val="center"/>
+            <w:shd w:fill="FFFFFF"/>
+          </w:tcPr>
+          <w:p>
+            <w:pPr>
+              <w:spacing w:before="0" w:after="40" w:line="252" w:lineRule="auto"/>
+              <w:jc w:val="left"/>
+            </w:pPr>
+            <w:r>
+              <w:rPr>
+                <w:rFonts w:ascii="Calibri" w:hAnsi="Calibri"/>
+                <w:b w:val="0"/>
+                <w:color w:val="111827"/>
+                <w:sz w:val="17"/>
+              </w:rPr>
+              <w:t>Prevent unbounded or unknown behavior-state fields.</w:t>
+            </w:r>
+          </w:p>
+        </w:tc>
+        <w:tc>
+          <w:tcPr>
+            <w:tcW w:type="dxa" w:w="3260"/>
+            <w:tcMar>
+              <w:top w:w="80" w:type="dxa"/>
+              <w:start w:w="120" w:type="dxa"/>
+              <w:bottom w:w="80" w:type="dxa"/>
+              <w:end w:w="120" w:type="dxa"/>
+            </w:tcMar>
+            <w:vAlign w:val="center"/>
+            <w:shd w:fill="FFFFFF"/>
+          </w:tcPr>
+          <w:p>
+            <w:pPr>
+              <w:spacing w:before="0" w:after="40" w:line="252" w:lineRule="auto"/>
+              <w:jc w:val="left"/>
+            </w:pPr>
+            <w:r>
+              <w:rPr>
+                <w:rFonts w:ascii="Calibri" w:hAnsi="Calibri"/>
+                <w:b w:val="0"/>
+                <w:color w:val="111827"/>
+                <w:sz w:val="17"/>
+              </w:rPr>
+              <w:t>Service/API</w:t>
+            </w:r>
+          </w:p>
+        </w:tc>
+      </w:tr>
+      <w:tr>
+        <w:trPr>
+          <w:cantSplit/>
+        </w:trPr>
+        <w:tc>
+          <w:tcPr>
+            <w:tcW w:type="dxa" w:w="1650"/>
+            <w:tcMar>
+              <w:top w:w="80" w:type="dxa"/>
+              <w:start w:w="120" w:type="dxa"/>
+              <w:bottom w:w="80" w:type="dxa"/>
+              <w:end w:w="120" w:type="dxa"/>
+            </w:tcMar>
+            <w:vAlign w:val="center"/>
+            <w:shd w:fill="FFFFFF"/>
+          </w:tcPr>
+          <w:p>
+            <w:pPr>
+              <w:spacing w:before="0" w:after="40" w:line="252" w:lineRule="auto"/>
+              <w:jc w:val="center"/>
+            </w:pPr>
+            <w:r>
+              <w:rPr>
+                <w:rFonts w:ascii="Calibri" w:hAnsi="Calibri"/>
+                <w:b w:val="0"/>
+                <w:color w:val="111827"/>
+                <w:sz w:val="17"/>
+              </w:rPr>
+              <w:t>Deterministic transition</w:t>
+            </w:r>
+          </w:p>
+        </w:tc>
+        <w:tc>
+          <w:tcPr>
+            <w:tcW w:type="dxa" w:w="4450"/>
+            <w:tcMar>
+              <w:top w:w="80" w:type="dxa"/>
+              <w:start w:w="120" w:type="dxa"/>
+              <w:bottom w:w="80" w:type="dxa"/>
+              <w:end w:w="120" w:type="dxa"/>
+            </w:tcMar>
+            <w:vAlign w:val="center"/>
+            <w:shd w:fill="FFFFFF"/>
+          </w:tcPr>
+          <w:p>
+            <w:pPr>
+              <w:spacing w:before="0" w:after="40" w:line="252" w:lineRule="auto"/>
+              <w:jc w:val="left"/>
+            </w:pPr>
+            <w:r>
+              <w:rPr>
+                <w:rFonts w:ascii="Calibri" w:hAnsi="Calibri"/>
+                <w:b w:val="0"/>
+                <w:color w:val="111827"/>
+                <w:sz w:val="17"/>
+              </w:rPr>
+              <w:t>Derive counter changes from aggregated task-run counts.</w:t>
+            </w:r>
+          </w:p>
+        </w:tc>
+        <w:tc>
+          <w:tcPr>
+            <w:tcW w:type="dxa" w:w="3260"/>
+            <w:tcMar>
+              <w:top w:w="80" w:type="dxa"/>
+              <w:start w:w="120" w:type="dxa"/>
+              <w:bottom w:w="80" w:type="dxa"/>
+              <w:end w:w="120" w:type="dxa"/>
+            </w:tcMar>
+            <w:vAlign w:val="center"/>
+            <w:shd w:fill="FFFFFF"/>
+          </w:tcPr>
+          <w:p>
+            <w:pPr>
+              <w:spacing w:before="0" w:after="40" w:line="252" w:lineRule="auto"/>
+              <w:jc w:val="left"/>
+            </w:pPr>
+            <w:r>
+              <w:rPr>
+                <w:rFonts w:ascii="Calibri" w:hAnsi="Calibri"/>
+                <w:b w:val="0"/>
+                <w:color w:val="111827"/>
+                <w:sz w:val="17"/>
+              </w:rPr>
+              <w:t>Service</w:t>
+            </w:r>
+          </w:p>
+        </w:tc>
+      </w:tr>
+      <w:tr>
+        <w:trPr>
+          <w:cantSplit/>
+        </w:trPr>
+        <w:tc>
+          <w:tcPr>
+            <w:tcW w:type="dxa" w:w="1650"/>
+            <w:tcMar>
+              <w:top w:w="80" w:type="dxa"/>
+              <w:start w:w="120" w:type="dxa"/>
+              <w:bottom w:w="80" w:type="dxa"/>
+              <w:end w:w="120" w:type="dxa"/>
+            </w:tcMar>
+            <w:vAlign w:val="center"/>
+            <w:shd w:fill="FFFFFF"/>
+          </w:tcPr>
+          <w:p>
+            <w:pPr>
+              <w:spacing w:before="0" w:after="40" w:line="252" w:lineRule="auto"/>
+              <w:jc w:val="center"/>
+            </w:pPr>
+            <w:r>
+              <w:rPr>
+                <w:rFonts w:ascii="Calibri" w:hAnsi="Calibri"/>
+                <w:b w:val="0"/>
+                <w:color w:val="111827"/>
+                <w:sz w:val="17"/>
+              </w:rPr>
+              <w:t>Profile RBAC</w:t>
+            </w:r>
+          </w:p>
+        </w:tc>
+        <w:tc>
+          <w:tcPr>
+            <w:tcW w:type="dxa" w:w="4450"/>
+            <w:tcMar>
+              <w:top w:w="80" w:type="dxa"/>
+              <w:start w:w="120" w:type="dxa"/>
+              <w:bottom w:w="80" w:type="dxa"/>
+              <w:end w:w="120" w:type="dxa"/>
+            </w:tcMar>
+            <w:vAlign w:val="center"/>
+            <w:shd w:fill="FFFFFF"/>
+          </w:tcPr>
+          <w:p>
+            <w:pPr>
+              <w:spacing w:before="0" w:after="40" w:line="252" w:lineRule="auto"/>
+              <w:jc w:val="left"/>
+            </w:pPr>
+            <w:r>
+              <w:rPr>
+                <w:rFonts w:ascii="Calibri" w:hAnsi="Calibri"/>
+                <w:b w:val="0"/>
+                <w:color w:val="111827"/>
+                <w:sz w:val="17"/>
+              </w:rPr>
+              <w:t xml:space="preserve">Require </w:t>
+            </w:r>
+            <w:r>
+              <w:rPr>
+                <w:rFonts w:ascii="Calibri" w:hAnsi="Calibri"/>
+                <w:b w:val="0"/>
+                <w:color w:val="111827"/>
+                <w:sz w:val="17"/>
+              </w:rPr>
+              <w:t>ecus:read</w:t>
+            </w:r>
+            <w:r>
+              <w:rPr>
+                <w:rFonts w:ascii="Calibri" w:hAnsi="Calibri"/>
+                <w:b w:val="0"/>
+                <w:color w:val="111827"/>
+                <w:sz w:val="17"/>
+              </w:rPr>
+              <w:t xml:space="preserve"> for catalogue and detail endpoints.</w:t>
+            </w:r>
+          </w:p>
+        </w:tc>
+        <w:tc>
+          <w:tcPr>
+            <w:tcW w:type="dxa" w:w="3260"/>
+            <w:tcMar>
+              <w:top w:w="80" w:type="dxa"/>
+              <w:start w:w="120" w:type="dxa"/>
+              <w:bottom w:w="80" w:type="dxa"/>
+              <w:end w:w="120" w:type="dxa"/>
+            </w:tcMar>
+            <w:vAlign w:val="center"/>
+            <w:shd w:fill="FFFFFF"/>
+          </w:tcPr>
+          <w:p>
+            <w:pPr>
+              <w:spacing w:before="0" w:after="40" w:line="252" w:lineRule="auto"/>
+              <w:jc w:val="left"/>
+            </w:pPr>
+            <w:r>
+              <w:rPr>
+                <w:rFonts w:ascii="Calibri" w:hAnsi="Calibri"/>
+                <w:b w:val="0"/>
+                <w:color w:val="111827"/>
+                <w:sz w:val="17"/>
+              </w:rPr>
+              <w:t>API/integration</w:t>
+            </w:r>
+          </w:p>
+        </w:tc>
+      </w:tr>
+      <w:tr>
+        <w:trPr>
+          <w:cantSplit/>
+        </w:trPr>
+        <w:tc>
+          <w:tcPr>
+            <w:tcW w:type="dxa" w:w="1650"/>
+            <w:tcMar>
+              <w:top w:w="80" w:type="dxa"/>
+              <w:start w:w="120" w:type="dxa"/>
+              <w:bottom w:w="80" w:type="dxa"/>
+              <w:end w:w="120" w:type="dxa"/>
+            </w:tcMar>
+            <w:vAlign w:val="center"/>
+            <w:shd w:fill="FFFFFF"/>
+          </w:tcPr>
+          <w:p>
+            <w:pPr>
+              <w:spacing w:before="0" w:after="40" w:line="252" w:lineRule="auto"/>
+              <w:jc w:val="center"/>
+            </w:pPr>
+            <w:r>
+              <w:rPr>
+                <w:rFonts w:ascii="Calibri" w:hAnsi="Calibri"/>
+                <w:b w:val="0"/>
+                <w:color w:val="111827"/>
+                <w:sz w:val="17"/>
+              </w:rPr>
+              <w:t>OpenAPI publication</w:t>
+            </w:r>
+          </w:p>
+        </w:tc>
+        <w:tc>
+          <w:tcPr>
+            <w:tcW w:type="dxa" w:w="4450"/>
+            <w:tcMar>
+              <w:top w:w="80" w:type="dxa"/>
+              <w:start w:w="120" w:type="dxa"/>
+              <w:bottom w:w="80" w:type="dxa"/>
+              <w:end w:w="120" w:type="dxa"/>
+            </w:tcMar>
+            <w:vAlign w:val="center"/>
+            <w:shd w:fill="FFFFFF"/>
+          </w:tcPr>
+          <w:p>
+            <w:pPr>
+              <w:spacing w:before="0" w:after="40" w:line="252" w:lineRule="auto"/>
+              <w:jc w:val="left"/>
+            </w:pPr>
+            <w:r>
+              <w:rPr>
+                <w:rFonts w:ascii="Calibri" w:hAnsi="Calibri"/>
+                <w:b w:val="0"/>
+                <w:color w:val="111827"/>
+                <w:sz w:val="17"/>
+              </w:rPr>
+              <w:t>Publish profile paths and typed schemas.</w:t>
+            </w:r>
+          </w:p>
+        </w:tc>
+        <w:tc>
+          <w:tcPr>
+            <w:tcW w:type="dxa" w:w="3260"/>
+            <w:tcMar>
+              <w:top w:w="80" w:type="dxa"/>
+              <w:start w:w="120" w:type="dxa"/>
+              <w:bottom w:w="80" w:type="dxa"/>
+              <w:end w:w="120" w:type="dxa"/>
+            </w:tcMar>
+            <w:vAlign w:val="center"/>
+            <w:shd w:fill="FFFFFF"/>
+          </w:tcPr>
+          <w:p>
+            <w:pPr>
+              <w:spacing w:before="0" w:after="40" w:line="252" w:lineRule="auto"/>
+              <w:jc w:val="left"/>
+            </w:pPr>
+            <w:r>
+              <w:rPr>
+                <w:rFonts w:ascii="Calibri" w:hAnsi="Calibri"/>
+                <w:b w:val="0"/>
+                <w:color w:val="111827"/>
+                <w:sz w:val="17"/>
+              </w:rPr>
+              <w:t>Contract</w:t>
+            </w:r>
+          </w:p>
+        </w:tc>
+      </w:tr>
+    </w:tbl>
+    <w:p>
+      <w:pPr>
+        <w:spacing w:after="60"/>
+      </w:pPr>
+    </w:p>
+    <w:p>
+      <w:pPr>
+        <w:pStyle w:val="Heading1"/>
+        <w:keepNext/>
+        <w:keepLines/>
       </w:pPr>
       <w:r>
         <w:t>12. Implemented Evidence</w:t>
@@ -5923,7 +7266,7 @@
           <w:color w:val="111827"/>
           <w:sz w:val="22"/>
         </w:rPr>
-        <w:t xml:space="preserve"> and </w:t>
+        <w:t xml:space="preserve">, </w:t>
       </w:r>
       <w:r>
         <w:rPr>
@@ -5939,6 +7282,24 @@
           <w:color w:val="111827"/>
           <w:sz w:val="22"/>
         </w:rPr>
+        <w:t>, and</w:t>
+      </w:r>
+    </w:p>
+    <w:p>
+      <w:r>
+        <w:rPr>
+          <w:rFonts w:ascii="Consolas" w:hAnsi="Consolas"/>
+          <w:color w:val="1F4D78"/>
+          <w:sz w:val="19"/>
+        </w:rPr>
+        <w:t>0020_ecu_behavior_profiles</w:t>
+      </w:r>
+      <w:r>
+        <w:rPr>
+          <w:rFonts w:ascii="Calibri" w:hAnsi="Calibri"/>
+          <w:color w:val="111827"/>
+          <w:sz w:val="22"/>
+        </w:rPr>
         <w:t xml:space="preserve"> own the database schema.</w:t>
       </w:r>
     </w:p>
@@ -5947,7 +7308,7 @@
         <w:pStyle w:val="ListBullet"/>
         <w:numPr>
           <w:ilvl w:val="0"/>
-          <w:numId w:val="13"/>
+          <w:numId w:val="14"/>
         </w:numPr>
       </w:pPr>
       <w:r>
@@ -5996,7 +7357,7 @@
         <w:pStyle w:val="ListBullet"/>
         <w:numPr>
           <w:ilvl w:val="0"/>
-          <w:numId w:val="13"/>
+          <w:numId w:val="14"/>
         </w:numPr>
       </w:pPr>
       <w:r>
@@ -6045,7 +7406,7 @@
         <w:pStyle w:val="ListBullet"/>
         <w:numPr>
           <w:ilvl w:val="0"/>
-          <w:numId w:val="13"/>
+          <w:numId w:val="14"/>
         </w:numPr>
       </w:pPr>
       <w:r>
@@ -6094,7 +7455,7 @@
         <w:pStyle w:val="ListBullet"/>
         <w:numPr>
           <w:ilvl w:val="0"/>
-          <w:numId w:val="13"/>
+          <w:numId w:val="14"/>
         </w:numPr>
       </w:pPr>
       <w:r>
@@ -6121,7 +7482,7 @@
         <w:pStyle w:val="ListBullet"/>
         <w:numPr>
           <w:ilvl w:val="0"/>
-          <w:numId w:val="14"/>
+          <w:numId w:val="15"/>
         </w:numPr>
       </w:pPr>
       <w:r>
@@ -6138,7 +7499,7 @@
         <w:pStyle w:val="ListBullet"/>
         <w:numPr>
           <w:ilvl w:val="0"/>
-          <w:numId w:val="14"/>
+          <w:numId w:val="15"/>
         </w:numPr>
       </w:pPr>
       <w:r>
@@ -6155,7 +7516,7 @@
         <w:pStyle w:val="ListBullet"/>
         <w:numPr>
           <w:ilvl w:val="0"/>
-          <w:numId w:val="14"/>
+          <w:numId w:val="15"/>
         </w:numPr>
       </w:pPr>
       <w:r>
@@ -6164,7 +7525,17 @@
           <w:color w:val="111827"/>
           <w:sz w:val="22"/>
         </w:rPr>
-        <w:t>ECU type profiles are not yet behaviorally distinct.</w:t>
+        <w:t>Coordination profiles for door, ADAS, climate, and lighting intentionally share a baseline and</w:t>
+      </w:r>
+    </w:p>
+    <w:p>
+      <w:r>
+        <w:rPr>
+          <w:rFonts w:ascii="Calibri" w:hAnsi="Calibri"/>
+          <w:color w:val="111827"/>
+          <w:sz w:val="22"/>
+        </w:rPr>
+        <w:t>need specialization in later scenario-driven work.</w:t>
       </w:r>
     </w:p>
     <w:p>
@@ -6172,7 +7543,7 @@
         <w:pStyle w:val="ListBullet"/>
         <w:numPr>
           <w:ilvl w:val="0"/>
-          <w:numId w:val="14"/>
+          <w:numId w:val="16"/>
         </w:numPr>
       </w:pPr>
       <w:r>
@@ -6189,7 +7560,7 @@
         <w:pStyle w:val="ListBullet"/>
         <w:numPr>
           <w:ilvl w:val="0"/>
-          <w:numId w:val="14"/>
+          <w:numId w:val="16"/>
         </w:numPr>
       </w:pPr>
       <w:r>
@@ -6218,7 +7589,7 @@
           <w:color w:val="111827"/>
           <w:sz w:val="22"/>
         </w:rPr>
-        <w:t xml:space="preserve">The next increment adds ECU-specific behavior profiles on top of the deterministic task clock. Later increments add memory regions, fault lifecycle, CAN contracts, and multi-ECU scenarios. See </w:t>
+        <w:t xml:space="preserve">The next increment adds volatile and non-volatile memory regions, snapshots, reset persistence, and corruption injection. Later increments add fault lifecycle, CAN contracts, and multi-ECU scenarios. See </w:t>
       </w:r>
       <w:r>
         <w:rPr>
@@ -6252,7 +7623,7 @@
         <w:pStyle w:val="ListNumber"/>
         <w:numPr>
           <w:ilvl w:val="0"/>
-          <w:numId w:val="15"/>
+          <w:numId w:val="17"/>
         </w:numPr>
       </w:pPr>
       <w:r>
@@ -6269,7 +7640,7 @@
         <w:pStyle w:val="ListNumber"/>
         <w:numPr>
           <w:ilvl w:val="0"/>
-          <w:numId w:val="15"/>
+          <w:numId w:val="17"/>
         </w:numPr>
       </w:pPr>
       <w:r>
@@ -6286,7 +7657,7 @@
         <w:pStyle w:val="ListNumber"/>
         <w:numPr>
           <w:ilvl w:val="0"/>
-          <w:numId w:val="15"/>
+          <w:numId w:val="17"/>
         </w:numPr>
       </w:pPr>
       <w:r>
@@ -6303,7 +7674,7 @@
         <w:pStyle w:val="ListNumber"/>
         <w:numPr>
           <w:ilvl w:val="0"/>
-          <w:numId w:val="15"/>
+          <w:numId w:val="17"/>
         </w:numPr>
       </w:pPr>
       <w:r>
@@ -6320,7 +7691,7 @@
         <w:pStyle w:val="ListNumber"/>
         <w:numPr>
           <w:ilvl w:val="0"/>
-          <w:numId w:val="15"/>
+          <w:numId w:val="17"/>
         </w:numPr>
       </w:pPr>
       <w:r>
@@ -6337,7 +7708,7 @@
         <w:pStyle w:val="ListNumber"/>
         <w:numPr>
           <w:ilvl w:val="0"/>
-          <w:numId w:val="15"/>
+          <w:numId w:val="17"/>
         </w:numPr>
       </w:pPr>
       <w:r>
@@ -6354,7 +7725,7 @@
         <w:pStyle w:val="ListNumber"/>
         <w:numPr>
           <w:ilvl w:val="0"/>
-          <w:numId w:val="15"/>
+          <w:numId w:val="17"/>
         </w:numPr>
       </w:pPr>
       <w:r>
@@ -6364,6 +7735,57 @@
           <w:sz w:val="22"/>
         </w:rPr>
         <w:t>Explain why III-2 reset preserves memory and how III-4 can refine that contract safely.</w:t>
+      </w:r>
+    </w:p>
+    <w:p>
+      <w:pPr>
+        <w:pStyle w:val="ListNumber"/>
+        <w:numPr>
+          <w:ilvl w:val="0"/>
+          <w:numId w:val="17"/>
+        </w:numPr>
+      </w:pPr>
+      <w:r>
+        <w:rPr>
+          <w:rFonts w:ascii="Calibri" w:hAnsi="Calibri"/>
+          <w:color w:val="111827"/>
+          <w:sz w:val="22"/>
+        </w:rPr>
+        <w:t>Compare the battery and gateway schedules and explain why both remain protocol-independent.</w:t>
+      </w:r>
+    </w:p>
+    <w:p>
+      <w:pPr>
+        <w:pStyle w:val="ListNumber"/>
+        <w:numPr>
+          <w:ilvl w:val="0"/>
+          <w:numId w:val="17"/>
+        </w:numPr>
+      </w:pPr>
+      <w:r>
+        <w:rPr>
+          <w:rFonts w:ascii="Calibri" w:hAnsi="Calibri"/>
+          <w:color w:val="111827"/>
+          <w:sz w:val="22"/>
+        </w:rPr>
+        <w:t>Calculate the behavior-state counters after advancing a new battery ECU by 2,100 ms.</w:t>
+      </w:r>
+    </w:p>
+    <w:p>
+      <w:pPr>
+        <w:pStyle w:val="ListNumber"/>
+        <w:numPr>
+          <w:ilvl w:val="0"/>
+          <w:numId w:val="17"/>
+        </w:numPr>
+      </w:pPr>
+      <w:r>
+        <w:rPr>
+          <w:rFonts w:ascii="Calibri" w:hAnsi="Calibri"/>
+          <w:color w:val="111827"/>
+          <w:sz w:val="22"/>
+        </w:rPr>
+        <w:t>Design a dedicated ADAS profile without adding camera or CAN dependencies to the registry.</w:t>
       </w:r>
     </w:p>
     <w:sectPr>
@@ -6395,7 +7817,7 @@
         <w:color w:val="667085"/>
         <w:sz w:val="17"/>
       </w:rPr>
-      <w:t>ATEP Volume III Workbook  |  Version 0.2.0</w:t>
+      <w:t>ATEP Volume III Workbook  |  Version 0.3.0</w:t>
     </w:r>
     <w:r>
       <w:rPr>
@@ -6707,6 +8129,18 @@
     </w:lvlOverride>
   </w:num>
   <w:num w:numId="15">
+    <w:abstractNumId w:val="10"/>
+    <w:lvlOverride w:ilvl="0">
+      <w:startOverride w:val="1"/>
+    </w:lvlOverride>
+  </w:num>
+  <w:num w:numId="16">
+    <w:abstractNumId w:val="10"/>
+    <w:lvlOverride w:ilvl="0">
+      <w:startOverride w:val="1"/>
+    </w:lvlOverride>
+  </w:num>
+  <w:num w:numId="17">
     <w:abstractNumId w:val="9"/>
     <w:lvlOverride w:ilvl="0">
       <w:startOverride w:val="1"/>

</xml_diff>

<commit_message>
feat(ecus): add behavior profiles (#52)
</commit_message>
<xml_diff>
--- a/docs/ATEP_Volume_III_ECU_Simulator_Engineering_Workbook.docx
+++ b/docs/ATEP_Volume_III_ECU_Simulator_Engineering_Workbook.docx
@@ -143,7 +143,7 @@
                 <w:color w:val="0B2545"/>
                 <w:sz w:val="19"/>
               </w:rPr>
-              <w:t>0.2.0</w:t>
+              <w:t>0.3.0</w:t>
             </w:r>
           </w:p>
         </w:tc>
@@ -265,7 +265,7 @@
                 <w:color w:val="111827"/>
                 <w:sz w:val="19"/>
               </w:rPr>
-              <w:t>Living document - Increments III-1 and III-2 implemented</w:t>
+              <w:t>Living document - Increments III-1 through III-3 implemented</w:t>
             </w:r>
           </w:p>
         </w:tc>
@@ -618,6 +618,25 @@
           <w:color w:val="0B2545"/>
           <w:sz w:val="21"/>
         </w:rPr>
+        <w:t>11.2 III-3 Verification</w:t>
+      </w:r>
+    </w:p>
+    <w:p>
+      <w:pPr>
+        <w:pStyle w:val="ListNumber"/>
+        <w:numPr>
+          <w:ilvl w:val="0"/>
+          <w:numId w:val="10"/>
+        </w:numPr>
+        <w:ind w:left="216" w:firstLine="0"/>
+      </w:pPr>
+      <w:r>
+        <w:rPr>
+          <w:rFonts w:ascii="Calibri" w:hAnsi="Calibri"/>
+          <w:b/>
+          <w:color w:val="0B2545"/>
+          <w:sz w:val="21"/>
+        </w:rPr>
         <w:t>12. Implemented Evidence</w:t>
       </w:r>
     </w:p>
@@ -912,7 +931,7 @@
                 <w:color w:val="111827"/>
                 <w:sz w:val="17"/>
               </w:rPr>
-              <w:t>Increments III-1 and III-2</w:t>
+              <w:t>Increments III-1 through III-3</w:t>
             </w:r>
           </w:p>
         </w:tc>
@@ -1405,6 +1424,95 @@
           </w:p>
         </w:tc>
       </w:tr>
+      <w:tr>
+        <w:trPr>
+          <w:cantSplit/>
+        </w:trPr>
+        <w:tc>
+          <w:tcPr>
+            <w:tcW w:type="dxa" w:w="1650"/>
+            <w:tcMar>
+              <w:top w:w="80" w:type="dxa"/>
+              <w:start w:w="120" w:type="dxa"/>
+              <w:bottom w:w="80" w:type="dxa"/>
+              <w:end w:w="120" w:type="dxa"/>
+            </w:tcMar>
+            <w:vAlign w:val="center"/>
+            <w:shd w:fill="FFFFFF"/>
+          </w:tcPr>
+          <w:p>
+            <w:pPr>
+              <w:spacing w:before="0" w:after="40" w:line="252" w:lineRule="auto"/>
+              <w:jc w:val="center"/>
+            </w:pPr>
+            <w:r>
+              <w:rPr>
+                <w:rFonts w:ascii="Calibri" w:hAnsi="Calibri"/>
+                <w:b w:val="0"/>
+                <w:color w:val="111827"/>
+                <w:sz w:val="17"/>
+              </w:rPr>
+              <w:t>0.3.0</w:t>
+            </w:r>
+          </w:p>
+        </w:tc>
+        <w:tc>
+          <w:tcPr>
+            <w:tcW w:type="dxa" w:w="4450"/>
+            <w:tcMar>
+              <w:top w:w="80" w:type="dxa"/>
+              <w:start w:w="120" w:type="dxa"/>
+              <w:bottom w:w="80" w:type="dxa"/>
+              <w:end w:w="120" w:type="dxa"/>
+            </w:tcMar>
+            <w:vAlign w:val="center"/>
+            <w:shd w:fill="FFFFFF"/>
+          </w:tcPr>
+          <w:p>
+            <w:pPr>
+              <w:spacing w:before="0" w:after="40" w:line="252" w:lineRule="auto"/>
+              <w:jc w:val="left"/>
+            </w:pPr>
+            <w:r>
+              <w:rPr>
+                <w:rFonts w:ascii="Calibri" w:hAnsi="Calibri"/>
+                <w:b w:val="0"/>
+                <w:color w:val="111827"/>
+                <w:sz w:val="17"/>
+              </w:rPr>
+              <w:t>2026-08-24</w:t>
+            </w:r>
+          </w:p>
+        </w:tc>
+        <w:tc>
+          <w:tcPr>
+            <w:tcW w:type="dxa" w:w="3260"/>
+            <w:tcMar>
+              <w:top w:w="80" w:type="dxa"/>
+              <w:start w:w="120" w:type="dxa"/>
+              <w:bottom w:w="80" w:type="dxa"/>
+              <w:end w:w="120" w:type="dxa"/>
+            </w:tcMar>
+            <w:vAlign w:val="center"/>
+            <w:shd w:fill="FFFFFF"/>
+          </w:tcPr>
+          <w:p>
+            <w:pPr>
+              <w:spacing w:before="0" w:after="40" w:line="252" w:lineRule="auto"/>
+              <w:jc w:val="left"/>
+            </w:pPr>
+            <w:r>
+              <w:rPr>
+                <w:rFonts w:ascii="Calibri" w:hAnsi="Calibri"/>
+                <w:b w:val="0"/>
+                <w:color w:val="111827"/>
+                <w:sz w:val="17"/>
+              </w:rPr>
+              <w:t>Added versioned behavior profiles, profile APIs, deterministic state transitions, migration, and tests.</w:t>
+            </w:r>
+          </w:p>
+        </w:tc>
+      </w:tr>
     </w:tbl>
     <w:p>
       <w:pPr>
@@ -1599,6 +1707,23 @@
           <w:sz w:val="22"/>
         </w:rPr>
         <w:t>Idempotent advance/reset commands with persisted execution evidence.</w:t>
+      </w:r>
+    </w:p>
+    <w:p>
+      <w:pPr>
+        <w:pStyle w:val="ListBullet"/>
+        <w:numPr>
+          <w:ilvl w:val="0"/>
+          <w:numId w:val="11"/>
+        </w:numPr>
+      </w:pPr>
+      <w:r>
+        <w:rPr>
+          <w:rFonts w:ascii="Calibri" w:hAnsi="Calibri"/>
+          <w:color w:val="111827"/>
+          <w:sz w:val="22"/>
+        </w:rPr>
+        <w:t>Versioned profiles with allowed schedules, bounded initial state, and deterministic transitions.</w:t>
       </w:r>
     </w:p>
     <w:p>
@@ -1871,7 +1996,7 @@
           <w:color w:val="111827"/>
           <w:sz w:val="22"/>
         </w:rPr>
-        <w:t xml:space="preserve">, cyclic tasks, logical time, boot count, </w:t>
+        <w:t xml:space="preserve">, cyclic tasks, profile version, behavior state, logical time, boot count, </w:t>
       </w:r>
       <w:r>
         <w:rPr>
@@ -2762,6 +2887,240 @@
           </w:p>
         </w:tc>
       </w:tr>
+      <w:tr>
+        <w:trPr>
+          <w:cantSplit/>
+        </w:trPr>
+        <w:tc>
+          <w:tcPr>
+            <w:tcW w:type="dxa" w:w="1150"/>
+            <w:tcMar>
+              <w:top w:w="80" w:type="dxa"/>
+              <w:start w:w="120" w:type="dxa"/>
+              <w:bottom w:w="80" w:type="dxa"/>
+              <w:end w:w="120" w:type="dxa"/>
+            </w:tcMar>
+            <w:vAlign w:val="center"/>
+            <w:shd w:fill="FFFFFF"/>
+          </w:tcPr>
+          <w:p>
+            <w:pPr>
+              <w:spacing w:before="0" w:after="40" w:line="252" w:lineRule="auto"/>
+              <w:jc w:val="center"/>
+            </w:pPr>
+            <w:r>
+              <w:rPr>
+                <w:rFonts w:ascii="Calibri" w:hAnsi="Calibri"/>
+                <w:b w:val="0"/>
+                <w:color w:val="111827"/>
+                <w:sz w:val="16"/>
+              </w:rPr>
+              <w:t>GET</w:t>
+            </w:r>
+          </w:p>
+        </w:tc>
+        <w:tc>
+          <w:tcPr>
+            <w:tcW w:type="dxa" w:w="3700"/>
+            <w:tcMar>
+              <w:top w:w="80" w:type="dxa"/>
+              <w:start w:w="120" w:type="dxa"/>
+              <w:bottom w:w="80" w:type="dxa"/>
+              <w:end w:w="120" w:type="dxa"/>
+            </w:tcMar>
+            <w:vAlign w:val="center"/>
+            <w:shd w:fill="FFFFFF"/>
+          </w:tcPr>
+          <w:p>
+            <w:pPr>
+              <w:spacing w:before="0" w:after="40" w:line="252" w:lineRule="auto"/>
+              <w:jc w:val="left"/>
+            </w:pPr>
+            <w:r>
+              <w:rPr>
+                <w:rFonts w:ascii="Calibri" w:hAnsi="Calibri"/>
+                <w:b w:val="0"/>
+                <w:color w:val="111827"/>
+                <w:sz w:val="16"/>
+              </w:rPr>
+              <w:t>/api/v1/ecu-profiles</w:t>
+            </w:r>
+          </w:p>
+        </w:tc>
+        <w:tc>
+          <w:tcPr>
+            <w:tcW w:type="dxa" w:w="3100"/>
+            <w:tcMar>
+              <w:top w:w="80" w:type="dxa"/>
+              <w:start w:w="120" w:type="dxa"/>
+              <w:bottom w:w="80" w:type="dxa"/>
+              <w:end w:w="120" w:type="dxa"/>
+            </w:tcMar>
+            <w:vAlign w:val="center"/>
+            <w:shd w:fill="FFFFFF"/>
+          </w:tcPr>
+          <w:p>
+            <w:pPr>
+              <w:spacing w:before="0" w:after="40" w:line="252" w:lineRule="auto"/>
+              <w:jc w:val="left"/>
+            </w:pPr>
+            <w:r>
+              <w:rPr>
+                <w:rFonts w:ascii="Calibri" w:hAnsi="Calibri"/>
+                <w:b w:val="0"/>
+                <w:color w:val="111827"/>
+                <w:sz w:val="16"/>
+              </w:rPr>
+              <w:t>ecus:read</w:t>
+            </w:r>
+          </w:p>
+        </w:tc>
+        <w:tc>
+          <w:tcPr>
+            <w:tcW w:type="dxa" w:w="1410"/>
+            <w:tcMar>
+              <w:top w:w="80" w:type="dxa"/>
+              <w:start w:w="120" w:type="dxa"/>
+              <w:bottom w:w="80" w:type="dxa"/>
+              <w:end w:w="120" w:type="dxa"/>
+            </w:tcMar>
+            <w:vAlign w:val="center"/>
+            <w:shd w:fill="FFFFFF"/>
+          </w:tcPr>
+          <w:p>
+            <w:pPr>
+              <w:spacing w:before="0" w:after="40" w:line="252" w:lineRule="auto"/>
+              <w:jc w:val="left"/>
+            </w:pPr>
+            <w:r>
+              <w:rPr>
+                <w:rFonts w:ascii="Calibri" w:hAnsi="Calibri"/>
+                <w:b w:val="0"/>
+                <w:color w:val="111827"/>
+                <w:sz w:val="16"/>
+              </w:rPr>
+              <w:t>List versioned behavior profiles.</w:t>
+            </w:r>
+          </w:p>
+        </w:tc>
+      </w:tr>
+      <w:tr>
+        <w:trPr>
+          <w:cantSplit/>
+        </w:trPr>
+        <w:tc>
+          <w:tcPr>
+            <w:tcW w:type="dxa" w:w="1150"/>
+            <w:tcMar>
+              <w:top w:w="80" w:type="dxa"/>
+              <w:start w:w="120" w:type="dxa"/>
+              <w:bottom w:w="80" w:type="dxa"/>
+              <w:end w:w="120" w:type="dxa"/>
+            </w:tcMar>
+            <w:vAlign w:val="center"/>
+            <w:shd w:fill="FFFFFF"/>
+          </w:tcPr>
+          <w:p>
+            <w:pPr>
+              <w:spacing w:before="0" w:after="40" w:line="252" w:lineRule="auto"/>
+              <w:jc w:val="center"/>
+            </w:pPr>
+            <w:r>
+              <w:rPr>
+                <w:rFonts w:ascii="Calibri" w:hAnsi="Calibri"/>
+                <w:b w:val="0"/>
+                <w:color w:val="111827"/>
+                <w:sz w:val="16"/>
+              </w:rPr>
+              <w:t>GET</w:t>
+            </w:r>
+          </w:p>
+        </w:tc>
+        <w:tc>
+          <w:tcPr>
+            <w:tcW w:type="dxa" w:w="3700"/>
+            <w:tcMar>
+              <w:top w:w="80" w:type="dxa"/>
+              <w:start w:w="120" w:type="dxa"/>
+              <w:bottom w:w="80" w:type="dxa"/>
+              <w:end w:w="120" w:type="dxa"/>
+            </w:tcMar>
+            <w:vAlign w:val="center"/>
+            <w:shd w:fill="FFFFFF"/>
+          </w:tcPr>
+          <w:p>
+            <w:pPr>
+              <w:spacing w:before="0" w:after="40" w:line="252" w:lineRule="auto"/>
+              <w:jc w:val="left"/>
+            </w:pPr>
+            <w:r>
+              <w:rPr>
+                <w:rFonts w:ascii="Calibri" w:hAnsi="Calibri"/>
+                <w:b w:val="0"/>
+                <w:color w:val="111827"/>
+                <w:sz w:val="16"/>
+              </w:rPr>
+              <w:t>/api/v1/ecu-profiles/{ecu_type}</w:t>
+            </w:r>
+          </w:p>
+        </w:tc>
+        <w:tc>
+          <w:tcPr>
+            <w:tcW w:type="dxa" w:w="3100"/>
+            <w:tcMar>
+              <w:top w:w="80" w:type="dxa"/>
+              <w:start w:w="120" w:type="dxa"/>
+              <w:bottom w:w="80" w:type="dxa"/>
+              <w:end w:w="120" w:type="dxa"/>
+            </w:tcMar>
+            <w:vAlign w:val="center"/>
+            <w:shd w:fill="FFFFFF"/>
+          </w:tcPr>
+          <w:p>
+            <w:pPr>
+              <w:spacing w:before="0" w:after="40" w:line="252" w:lineRule="auto"/>
+              <w:jc w:val="left"/>
+            </w:pPr>
+            <w:r>
+              <w:rPr>
+                <w:rFonts w:ascii="Calibri" w:hAnsi="Calibri"/>
+                <w:b w:val="0"/>
+                <w:color w:val="111827"/>
+                <w:sz w:val="16"/>
+              </w:rPr>
+              <w:t>ecus:read</w:t>
+            </w:r>
+          </w:p>
+        </w:tc>
+        <w:tc>
+          <w:tcPr>
+            <w:tcW w:type="dxa" w:w="1410"/>
+            <w:tcMar>
+              <w:top w:w="80" w:type="dxa"/>
+              <w:start w:w="120" w:type="dxa"/>
+              <w:bottom w:w="80" w:type="dxa"/>
+              <w:end w:w="120" w:type="dxa"/>
+            </w:tcMar>
+            <w:vAlign w:val="center"/>
+            <w:shd w:fill="FFFFFF"/>
+          </w:tcPr>
+          <w:p>
+            <w:pPr>
+              <w:spacing w:before="0" w:after="40" w:line="252" w:lineRule="auto"/>
+              <w:jc w:val="left"/>
+            </w:pPr>
+            <w:r>
+              <w:rPr>
+                <w:rFonts w:ascii="Calibri" w:hAnsi="Calibri"/>
+                <w:b w:val="0"/>
+                <w:color w:val="111827"/>
+                <w:sz w:val="16"/>
+              </w:rPr>
+              <w:t>Inspect one profile contract.</w:t>
+            </w:r>
+          </w:p>
+        </w:tc>
+      </w:tr>
     </w:tbl>
     <w:p>
       <w:pPr>
@@ -2910,6 +3269,26 @@
     </w:p>
     <w:p>
       <w:pPr>
+        <w:pStyle w:val="Heading2"/>
+        <w:keepNext/>
+        <w:keepLines/>
+      </w:pPr>
+      <w:r>
+        <w:t>8.2 Profile Execution</w:t>
+      </w:r>
+    </w:p>
+    <w:p>
+      <w:r>
+        <w:rPr>
+          <w:rFonts w:ascii="Calibri" w:hAnsi="Calibri"/>
+          <w:color w:val="111827"/>
+          <w:sz w:val="22"/>
+        </w:rPr>
+        <w:t>The immutable registry defines a version, allowed task schedules, initial behavior state, and a state effect for every task. Creation applies defaults when callers omit them. State replacement rejects unknown task IDs, modified schedules, and unknown state keys. During logical-time advance, aggregated execution counts update integer counters once; no wall-clock or protocol adapter is used.</w:t>
+      </w:r>
+    </w:p>
+    <w:p>
+      <w:pPr>
         <w:pStyle w:val="Heading1"/>
         <w:keepNext/>
         <w:keepLines/>
@@ -2941,7 +3320,7 @@
           <w:color w:val="111827"/>
           <w:sz w:val="22"/>
         </w:rPr>
-        <w:t>. III-1 covers the aggregate and III-2 covers logical time, cyclic schedules, reset modes, replay, lifecycle guards, events, and audit.</w:t>
+        <w:t>. III-1 covers the aggregate, III-2 covers deterministic execution and reset, and III-3 covers versioned profiles and state transitions.</w:t>
       </w:r>
     </w:p>
     <w:p>
@@ -3072,6 +3451,26 @@
           <w:sz w:val="22"/>
         </w:rPr>
         <w:t>Clearing state before defining volatile and non-volatile regions would invent behavior. III-2 records reset mode, duration, boot count, and preservation; III-4 will own persistence semantics.</w:t>
+      </w:r>
+    </w:p>
+    <w:p>
+      <w:pPr>
+        <w:pStyle w:val="Heading2"/>
+        <w:keepNext/>
+        <w:keepLines/>
+      </w:pPr>
+      <w:r>
+        <w:t>ADR-ECU-007 — Keep Behavior Profiles Immutable and Protocol-Independent</w:t>
+      </w:r>
+    </w:p>
+    <w:p>
+      <w:r>
+        <w:rPr>
+          <w:rFonts w:ascii="Calibri" w:hAnsi="Calibri"/>
+          <w:color w:val="111827"/>
+          <w:sz w:val="22"/>
+        </w:rPr>
+        <w:t>Profiles are source-controlled contracts rather than mutable database configuration. This makes tests reproducible and reviewable. CAN production, UDS diagnostics, and continuous physical models remain outside the profile registry and will integrate through later explicit boundaries.</w:t>
       </w:r>
     </w:p>
     <w:p>
@@ -4933,7 +5332,6 @@
         <w:pStyle w:val="Heading1"/>
         <w:keepNext/>
         <w:keepLines/>
-        <w:pageBreakBefore/>
       </w:pPr>
       <w:r>
         <w:t>11.1 III-2 Verification</w:t>
@@ -5862,7 +6260,952 @@
         <w:pStyle w:val="Heading1"/>
         <w:keepNext/>
         <w:keepLines/>
-        <w:pageBreakBefore/>
+      </w:pPr>
+      <w:r>
+        <w:t>11.2 III-3 Verification</w:t>
+      </w:r>
+    </w:p>
+    <w:tbl>
+      <w:tblPr>
+        <w:tblW w:type="dxa" w:w="9360"/>
+        <w:jc w:val="left"/>
+        <w:tblLayout w:type="fixed"/>
+        <w:tblLook w:firstColumn="1" w:firstRow="1" w:lastColumn="0" w:lastRow="0" w:noHBand="0" w:noVBand="1" w:val="04A0"/>
+        <w:tblInd w:w="120" w:type="dxa"/>
+        <w:tblBorders>
+          <w:top w:val="single" w:sz="6" w:color="B8C4D1"/>
+          <w:left w:val="single" w:sz="6" w:color="B8C4D1"/>
+          <w:bottom w:val="single" w:sz="6" w:color="B8C4D1"/>
+          <w:right w:val="single" w:sz="6" w:color="B8C4D1"/>
+          <w:insideH w:val="single" w:sz="6" w:color="B8C4D1"/>
+          <w:insideV w:val="single" w:sz="6" w:color="B8C4D1"/>
+        </w:tblBorders>
+      </w:tblPr>
+      <w:tblGrid>
+        <w:gridCol w:w="1650"/>
+        <w:gridCol w:w="4450"/>
+        <w:gridCol w:w="3260"/>
+      </w:tblGrid>
+      <w:tr>
+        <w:trPr>
+          <w:tblHeader w:val="true"/>
+          <w:cantSplit/>
+        </w:trPr>
+        <w:tc>
+          <w:tcPr>
+            <w:tcW w:type="dxa" w:w="1650"/>
+            <w:tcMar>
+              <w:top w:w="80" w:type="dxa"/>
+              <w:start w:w="120" w:type="dxa"/>
+              <w:bottom w:w="80" w:type="dxa"/>
+              <w:end w:w="120" w:type="dxa"/>
+            </w:tcMar>
+            <w:vAlign w:val="center"/>
+            <w:shd w:fill="E8EEF5"/>
+          </w:tcPr>
+          <w:p>
+            <w:pPr>
+              <w:spacing w:before="0" w:after="40" w:line="252" w:lineRule="auto"/>
+              <w:jc w:val="center"/>
+            </w:pPr>
+            <w:r>
+              <w:rPr>
+                <w:rFonts w:ascii="Calibri" w:hAnsi="Calibri"/>
+                <w:b/>
+                <w:color w:val="0B2545"/>
+                <w:sz w:val="17"/>
+              </w:rPr>
+              <w:t>Test</w:t>
+            </w:r>
+          </w:p>
+        </w:tc>
+        <w:tc>
+          <w:tcPr>
+            <w:tcW w:type="dxa" w:w="4450"/>
+            <w:tcMar>
+              <w:top w:w="80" w:type="dxa"/>
+              <w:start w:w="120" w:type="dxa"/>
+              <w:bottom w:w="80" w:type="dxa"/>
+              <w:end w:w="120" w:type="dxa"/>
+            </w:tcMar>
+            <w:vAlign w:val="center"/>
+            <w:shd w:fill="E8EEF5"/>
+          </w:tcPr>
+          <w:p>
+            <w:pPr>
+              <w:spacing w:before="0" w:after="40" w:line="252" w:lineRule="auto"/>
+              <w:jc w:val="left"/>
+            </w:pPr>
+            <w:r>
+              <w:rPr>
+                <w:rFonts w:ascii="Calibri" w:hAnsi="Calibri"/>
+                <w:b/>
+                <w:color w:val="0B2545"/>
+                <w:sz w:val="17"/>
+              </w:rPr>
+              <w:t>Objective</w:t>
+            </w:r>
+          </w:p>
+        </w:tc>
+        <w:tc>
+          <w:tcPr>
+            <w:tcW w:type="dxa" w:w="3260"/>
+            <w:tcMar>
+              <w:top w:w="80" w:type="dxa"/>
+              <w:start w:w="120" w:type="dxa"/>
+              <w:bottom w:w="80" w:type="dxa"/>
+              <w:end w:w="120" w:type="dxa"/>
+            </w:tcMar>
+            <w:vAlign w:val="center"/>
+            <w:shd w:fill="E8EEF5"/>
+          </w:tcPr>
+          <w:p>
+            <w:pPr>
+              <w:spacing w:before="0" w:after="40" w:line="252" w:lineRule="auto"/>
+              <w:jc w:val="left"/>
+            </w:pPr>
+            <w:r>
+              <w:rPr>
+                <w:rFonts w:ascii="Calibri" w:hAnsi="Calibri"/>
+                <w:b/>
+                <w:color w:val="0B2545"/>
+                <w:sz w:val="17"/>
+              </w:rPr>
+              <w:t>Level</w:t>
+            </w:r>
+          </w:p>
+        </w:tc>
+      </w:tr>
+      <w:tr>
+        <w:trPr>
+          <w:cantSplit/>
+        </w:trPr>
+        <w:tc>
+          <w:tcPr>
+            <w:tcW w:type="dxa" w:w="1650"/>
+            <w:tcMar>
+              <w:top w:w="80" w:type="dxa"/>
+              <w:start w:w="120" w:type="dxa"/>
+              <w:bottom w:w="80" w:type="dxa"/>
+              <w:end w:w="120" w:type="dxa"/>
+            </w:tcMar>
+            <w:vAlign w:val="center"/>
+            <w:shd w:fill="FFFFFF"/>
+          </w:tcPr>
+          <w:p>
+            <w:pPr>
+              <w:spacing w:before="0" w:after="40" w:line="252" w:lineRule="auto"/>
+              <w:jc w:val="center"/>
+            </w:pPr>
+            <w:r>
+              <w:rPr>
+                <w:rFonts w:ascii="Calibri" w:hAnsi="Calibri"/>
+                <w:b w:val="0"/>
+                <w:color w:val="111827"/>
+                <w:sz w:val="17"/>
+              </w:rPr>
+              <w:t>Profile coverage</w:t>
+            </w:r>
+          </w:p>
+        </w:tc>
+        <w:tc>
+          <w:tcPr>
+            <w:tcW w:type="dxa" w:w="4450"/>
+            <w:tcMar>
+              <w:top w:w="80" w:type="dxa"/>
+              <w:start w:w="120" w:type="dxa"/>
+              <w:bottom w:w="80" w:type="dxa"/>
+              <w:end w:w="120" w:type="dxa"/>
+            </w:tcMar>
+            <w:vAlign w:val="center"/>
+            <w:shd w:fill="FFFFFF"/>
+          </w:tcPr>
+          <w:p>
+            <w:pPr>
+              <w:spacing w:before="0" w:after="40" w:line="252" w:lineRule="auto"/>
+              <w:jc w:val="left"/>
+            </w:pPr>
+            <w:r>
+              <w:rPr>
+                <w:rFonts w:ascii="Calibri" w:hAnsi="Calibri"/>
+                <w:b w:val="0"/>
+                <w:color w:val="111827"/>
+                <w:sz w:val="17"/>
+              </w:rPr>
+              <w:t>Publish a versioned profile for every supported ECU type.</w:t>
+            </w:r>
+          </w:p>
+        </w:tc>
+        <w:tc>
+          <w:tcPr>
+            <w:tcW w:type="dxa" w:w="3260"/>
+            <w:tcMar>
+              <w:top w:w="80" w:type="dxa"/>
+              <w:start w:w="120" w:type="dxa"/>
+              <w:bottom w:w="80" w:type="dxa"/>
+              <w:end w:w="120" w:type="dxa"/>
+            </w:tcMar>
+            <w:vAlign w:val="center"/>
+            <w:shd w:fill="FFFFFF"/>
+          </w:tcPr>
+          <w:p>
+            <w:pPr>
+              <w:spacing w:before="0" w:after="40" w:line="252" w:lineRule="auto"/>
+              <w:jc w:val="left"/>
+            </w:pPr>
+            <w:r>
+              <w:rPr>
+                <w:rFonts w:ascii="Calibri" w:hAnsi="Calibri"/>
+                <w:b w:val="0"/>
+                <w:color w:val="111827"/>
+                <w:sz w:val="17"/>
+              </w:rPr>
+              <w:t>Unit/contract</w:t>
+            </w:r>
+          </w:p>
+        </w:tc>
+      </w:tr>
+      <w:tr>
+        <w:trPr>
+          <w:cantSplit/>
+        </w:trPr>
+        <w:tc>
+          <w:tcPr>
+            <w:tcW w:type="dxa" w:w="1650"/>
+            <w:tcMar>
+              <w:top w:w="80" w:type="dxa"/>
+              <w:start w:w="120" w:type="dxa"/>
+              <w:bottom w:w="80" w:type="dxa"/>
+              <w:end w:w="120" w:type="dxa"/>
+            </w:tcMar>
+            <w:vAlign w:val="center"/>
+            <w:shd w:fill="FFFFFF"/>
+          </w:tcPr>
+          <w:p>
+            <w:pPr>
+              <w:spacing w:before="0" w:after="40" w:line="252" w:lineRule="auto"/>
+              <w:jc w:val="center"/>
+            </w:pPr>
+            <w:r>
+              <w:rPr>
+                <w:rFonts w:ascii="Calibri" w:hAnsi="Calibri"/>
+                <w:b w:val="0"/>
+                <w:color w:val="111827"/>
+                <w:sz w:val="17"/>
+              </w:rPr>
+              <w:t>Distinct controller profiles</w:t>
+            </w:r>
+          </w:p>
+        </w:tc>
+        <w:tc>
+          <w:tcPr>
+            <w:tcW w:type="dxa" w:w="4450"/>
+            <w:tcMar>
+              <w:top w:w="80" w:type="dxa"/>
+              <w:start w:w="120" w:type="dxa"/>
+              <w:bottom w:w="80" w:type="dxa"/>
+              <w:end w:w="120" w:type="dxa"/>
+            </w:tcMar>
+            <w:vAlign w:val="center"/>
+            <w:shd w:fill="FFFFFF"/>
+          </w:tcPr>
+          <w:p>
+            <w:pPr>
+              <w:spacing w:before="0" w:after="40" w:line="252" w:lineRule="auto"/>
+              <w:jc w:val="left"/>
+            </w:pPr>
+            <w:r>
+              <w:rPr>
+                <w:rFonts w:ascii="Calibri" w:hAnsi="Calibri"/>
+                <w:b w:val="0"/>
+                <w:color w:val="111827"/>
+                <w:sz w:val="17"/>
+              </w:rPr>
+              <w:t>Verify motor, battery, body, gateway, and ABS safety schedules differ.</w:t>
+            </w:r>
+          </w:p>
+        </w:tc>
+        <w:tc>
+          <w:tcPr>
+            <w:tcW w:type="dxa" w:w="3260"/>
+            <w:tcMar>
+              <w:top w:w="80" w:type="dxa"/>
+              <w:start w:w="120" w:type="dxa"/>
+              <w:bottom w:w="80" w:type="dxa"/>
+              <w:end w:w="120" w:type="dxa"/>
+            </w:tcMar>
+            <w:vAlign w:val="center"/>
+            <w:shd w:fill="FFFFFF"/>
+          </w:tcPr>
+          <w:p>
+            <w:pPr>
+              <w:spacing w:before="0" w:after="40" w:line="252" w:lineRule="auto"/>
+              <w:jc w:val="left"/>
+            </w:pPr>
+            <w:r>
+              <w:rPr>
+                <w:rFonts w:ascii="Calibri" w:hAnsi="Calibri"/>
+                <w:b w:val="0"/>
+                <w:color w:val="111827"/>
+                <w:sz w:val="17"/>
+              </w:rPr>
+              <w:t>Unit</w:t>
+            </w:r>
+          </w:p>
+        </w:tc>
+      </w:tr>
+      <w:tr>
+        <w:trPr>
+          <w:cantSplit/>
+        </w:trPr>
+        <w:tc>
+          <w:tcPr>
+            <w:tcW w:type="dxa" w:w="1650"/>
+            <w:tcMar>
+              <w:top w:w="80" w:type="dxa"/>
+              <w:start w:w="120" w:type="dxa"/>
+              <w:bottom w:w="80" w:type="dxa"/>
+              <w:end w:w="120" w:type="dxa"/>
+            </w:tcMar>
+            <w:vAlign w:val="center"/>
+            <w:shd w:fill="FFFFFF"/>
+          </w:tcPr>
+          <w:p>
+            <w:pPr>
+              <w:spacing w:before="0" w:after="40" w:line="252" w:lineRule="auto"/>
+              <w:jc w:val="center"/>
+            </w:pPr>
+            <w:r>
+              <w:rPr>
+                <w:rFonts w:ascii="Calibri" w:hAnsi="Calibri"/>
+                <w:b w:val="0"/>
+                <w:color w:val="111827"/>
+                <w:sz w:val="17"/>
+              </w:rPr>
+              <w:t>Creation defaults</w:t>
+            </w:r>
+          </w:p>
+        </w:tc>
+        <w:tc>
+          <w:tcPr>
+            <w:tcW w:type="dxa" w:w="4450"/>
+            <w:tcMar>
+              <w:top w:w="80" w:type="dxa"/>
+              <w:start w:w="120" w:type="dxa"/>
+              <w:bottom w:w="80" w:type="dxa"/>
+              <w:end w:w="120" w:type="dxa"/>
+            </w:tcMar>
+            <w:vAlign w:val="center"/>
+            <w:shd w:fill="FFFFFF"/>
+          </w:tcPr>
+          <w:p>
+            <w:pPr>
+              <w:spacing w:before="0" w:after="40" w:line="252" w:lineRule="auto"/>
+              <w:jc w:val="left"/>
+            </w:pPr>
+            <w:r>
+              <w:rPr>
+                <w:rFonts w:ascii="Calibri" w:hAnsi="Calibri"/>
+                <w:b w:val="0"/>
+                <w:color w:val="111827"/>
+                <w:sz w:val="17"/>
+              </w:rPr>
+              <w:t>Apply profile tasks and initial state when omitted.</w:t>
+            </w:r>
+          </w:p>
+        </w:tc>
+        <w:tc>
+          <w:tcPr>
+            <w:tcW w:type="dxa" w:w="3260"/>
+            <w:tcMar>
+              <w:top w:w="80" w:type="dxa"/>
+              <w:start w:w="120" w:type="dxa"/>
+              <w:bottom w:w="80" w:type="dxa"/>
+              <w:end w:w="120" w:type="dxa"/>
+            </w:tcMar>
+            <w:vAlign w:val="center"/>
+            <w:shd w:fill="FFFFFF"/>
+          </w:tcPr>
+          <w:p>
+            <w:pPr>
+              <w:spacing w:before="0" w:after="40" w:line="252" w:lineRule="auto"/>
+              <w:jc w:val="left"/>
+            </w:pPr>
+            <w:r>
+              <w:rPr>
+                <w:rFonts w:ascii="Calibri" w:hAnsi="Calibri"/>
+                <w:b w:val="0"/>
+                <w:color w:val="111827"/>
+                <w:sz w:val="17"/>
+              </w:rPr>
+              <w:t>Service</w:t>
+            </w:r>
+          </w:p>
+        </w:tc>
+      </w:tr>
+      <w:tr>
+        <w:trPr>
+          <w:cantSplit/>
+        </w:trPr>
+        <w:tc>
+          <w:tcPr>
+            <w:tcW w:type="dxa" w:w="1650"/>
+            <w:tcMar>
+              <w:top w:w="80" w:type="dxa"/>
+              <w:start w:w="120" w:type="dxa"/>
+              <w:bottom w:w="80" w:type="dxa"/>
+              <w:end w:w="120" w:type="dxa"/>
+            </w:tcMar>
+            <w:vAlign w:val="center"/>
+            <w:shd w:fill="FFFFFF"/>
+          </w:tcPr>
+          <w:p>
+            <w:pPr>
+              <w:spacing w:before="0" w:after="40" w:line="252" w:lineRule="auto"/>
+              <w:jc w:val="center"/>
+            </w:pPr>
+            <w:r>
+              <w:rPr>
+                <w:rFonts w:ascii="Calibri" w:hAnsi="Calibri"/>
+                <w:b w:val="0"/>
+                <w:color w:val="111827"/>
+                <w:sz w:val="17"/>
+              </w:rPr>
+              <w:t>Unsupported task rejection</w:t>
+            </w:r>
+          </w:p>
+        </w:tc>
+        <w:tc>
+          <w:tcPr>
+            <w:tcW w:type="dxa" w:w="4450"/>
+            <w:tcMar>
+              <w:top w:w="80" w:type="dxa"/>
+              <w:start w:w="120" w:type="dxa"/>
+              <w:bottom w:w="80" w:type="dxa"/>
+              <w:end w:w="120" w:type="dxa"/>
+            </w:tcMar>
+            <w:vAlign w:val="center"/>
+            <w:shd w:fill="FFFFFF"/>
+          </w:tcPr>
+          <w:p>
+            <w:pPr>
+              <w:spacing w:before="0" w:after="40" w:line="252" w:lineRule="auto"/>
+              <w:jc w:val="left"/>
+            </w:pPr>
+            <w:r>
+              <w:rPr>
+                <w:rFonts w:ascii="Calibri" w:hAnsi="Calibri"/>
+                <w:b w:val="0"/>
+                <w:color w:val="111827"/>
+                <w:sz w:val="17"/>
+              </w:rPr>
+              <w:t>Reject task IDs outside the ECU type contract.</w:t>
+            </w:r>
+          </w:p>
+        </w:tc>
+        <w:tc>
+          <w:tcPr>
+            <w:tcW w:type="dxa" w:w="3260"/>
+            <w:tcMar>
+              <w:top w:w="80" w:type="dxa"/>
+              <w:start w:w="120" w:type="dxa"/>
+              <w:bottom w:w="80" w:type="dxa"/>
+              <w:end w:w="120" w:type="dxa"/>
+            </w:tcMar>
+            <w:vAlign w:val="center"/>
+            <w:shd w:fill="FFFFFF"/>
+          </w:tcPr>
+          <w:p>
+            <w:pPr>
+              <w:spacing w:before="0" w:after="40" w:line="252" w:lineRule="auto"/>
+              <w:jc w:val="left"/>
+            </w:pPr>
+            <w:r>
+              <w:rPr>
+                <w:rFonts w:ascii="Calibri" w:hAnsi="Calibri"/>
+                <w:b w:val="0"/>
+                <w:color w:val="111827"/>
+                <w:sz w:val="17"/>
+              </w:rPr>
+              <w:t>Service/API</w:t>
+            </w:r>
+          </w:p>
+        </w:tc>
+      </w:tr>
+      <w:tr>
+        <w:trPr>
+          <w:cantSplit/>
+        </w:trPr>
+        <w:tc>
+          <w:tcPr>
+            <w:tcW w:type="dxa" w:w="1650"/>
+            <w:tcMar>
+              <w:top w:w="80" w:type="dxa"/>
+              <w:start w:w="120" w:type="dxa"/>
+              <w:bottom w:w="80" w:type="dxa"/>
+              <w:end w:w="120" w:type="dxa"/>
+            </w:tcMar>
+            <w:vAlign w:val="center"/>
+            <w:shd w:fill="FFFFFF"/>
+          </w:tcPr>
+          <w:p>
+            <w:pPr>
+              <w:spacing w:before="0" w:after="40" w:line="252" w:lineRule="auto"/>
+              <w:jc w:val="center"/>
+            </w:pPr>
+            <w:r>
+              <w:rPr>
+                <w:rFonts w:ascii="Calibri" w:hAnsi="Calibri"/>
+                <w:b w:val="0"/>
+                <w:color w:val="111827"/>
+                <w:sz w:val="17"/>
+              </w:rPr>
+              <w:t>Schedule drift rejection</w:t>
+            </w:r>
+          </w:p>
+        </w:tc>
+        <w:tc>
+          <w:tcPr>
+            <w:tcW w:type="dxa" w:w="4450"/>
+            <w:tcMar>
+              <w:top w:w="80" w:type="dxa"/>
+              <w:start w:w="120" w:type="dxa"/>
+              <w:bottom w:w="80" w:type="dxa"/>
+              <w:end w:w="120" w:type="dxa"/>
+            </w:tcMar>
+            <w:vAlign w:val="center"/>
+            <w:shd w:fill="FFFFFF"/>
+          </w:tcPr>
+          <w:p>
+            <w:pPr>
+              <w:spacing w:before="0" w:after="40" w:line="252" w:lineRule="auto"/>
+              <w:jc w:val="left"/>
+            </w:pPr>
+            <w:r>
+              <w:rPr>
+                <w:rFonts w:ascii="Calibri" w:hAnsi="Calibri"/>
+                <w:b w:val="0"/>
+                <w:color w:val="111827"/>
+                <w:sz w:val="17"/>
+              </w:rPr>
+              <w:t>Reject changed periods or offsets for a known task.</w:t>
+            </w:r>
+          </w:p>
+        </w:tc>
+        <w:tc>
+          <w:tcPr>
+            <w:tcW w:type="dxa" w:w="3260"/>
+            <w:tcMar>
+              <w:top w:w="80" w:type="dxa"/>
+              <w:start w:w="120" w:type="dxa"/>
+              <w:bottom w:w="80" w:type="dxa"/>
+              <w:end w:w="120" w:type="dxa"/>
+            </w:tcMar>
+            <w:vAlign w:val="center"/>
+            <w:shd w:fill="FFFFFF"/>
+          </w:tcPr>
+          <w:p>
+            <w:pPr>
+              <w:spacing w:before="0" w:after="40" w:line="252" w:lineRule="auto"/>
+              <w:jc w:val="left"/>
+            </w:pPr>
+            <w:r>
+              <w:rPr>
+                <w:rFonts w:ascii="Calibri" w:hAnsi="Calibri"/>
+                <w:b w:val="0"/>
+                <w:color w:val="111827"/>
+                <w:sz w:val="17"/>
+              </w:rPr>
+              <w:t>Service/API</w:t>
+            </w:r>
+          </w:p>
+        </w:tc>
+      </w:tr>
+      <w:tr>
+        <w:trPr>
+          <w:cantSplit/>
+        </w:trPr>
+        <w:tc>
+          <w:tcPr>
+            <w:tcW w:type="dxa" w:w="1650"/>
+            <w:tcMar>
+              <w:top w:w="80" w:type="dxa"/>
+              <w:start w:w="120" w:type="dxa"/>
+              <w:bottom w:w="80" w:type="dxa"/>
+              <w:end w:w="120" w:type="dxa"/>
+            </w:tcMar>
+            <w:vAlign w:val="center"/>
+            <w:shd w:fill="FFFFFF"/>
+          </w:tcPr>
+          <w:p>
+            <w:pPr>
+              <w:spacing w:before="0" w:after="40" w:line="252" w:lineRule="auto"/>
+              <w:jc w:val="center"/>
+            </w:pPr>
+            <w:r>
+              <w:rPr>
+                <w:rFonts w:ascii="Calibri" w:hAnsi="Calibri"/>
+                <w:b w:val="0"/>
+                <w:color w:val="111827"/>
+                <w:sz w:val="17"/>
+              </w:rPr>
+              <w:t>State-key rejection</w:t>
+            </w:r>
+          </w:p>
+        </w:tc>
+        <w:tc>
+          <w:tcPr>
+            <w:tcW w:type="dxa" w:w="4450"/>
+            <w:tcMar>
+              <w:top w:w="80" w:type="dxa"/>
+              <w:start w:w="120" w:type="dxa"/>
+              <w:bottom w:w="80" w:type="dxa"/>
+              <w:end w:w="120" w:type="dxa"/>
+            </w:tcMar>
+            <w:vAlign w:val="center"/>
+            <w:shd w:fill="FFFFFF"/>
+          </w:tcPr>
+          <w:p>
+            <w:pPr>
+              <w:spacing w:before="0" w:after="40" w:line="252" w:lineRule="auto"/>
+              <w:jc w:val="left"/>
+            </w:pPr>
+            <w:r>
+              <w:rPr>
+                <w:rFonts w:ascii="Calibri" w:hAnsi="Calibri"/>
+                <w:b w:val="0"/>
+                <w:color w:val="111827"/>
+                <w:sz w:val="17"/>
+              </w:rPr>
+              <w:t>Prevent unbounded or unknown behavior-state fields.</w:t>
+            </w:r>
+          </w:p>
+        </w:tc>
+        <w:tc>
+          <w:tcPr>
+            <w:tcW w:type="dxa" w:w="3260"/>
+            <w:tcMar>
+              <w:top w:w="80" w:type="dxa"/>
+              <w:start w:w="120" w:type="dxa"/>
+              <w:bottom w:w="80" w:type="dxa"/>
+              <w:end w:w="120" w:type="dxa"/>
+            </w:tcMar>
+            <w:vAlign w:val="center"/>
+            <w:shd w:fill="FFFFFF"/>
+          </w:tcPr>
+          <w:p>
+            <w:pPr>
+              <w:spacing w:before="0" w:after="40" w:line="252" w:lineRule="auto"/>
+              <w:jc w:val="left"/>
+            </w:pPr>
+            <w:r>
+              <w:rPr>
+                <w:rFonts w:ascii="Calibri" w:hAnsi="Calibri"/>
+                <w:b w:val="0"/>
+                <w:color w:val="111827"/>
+                <w:sz w:val="17"/>
+              </w:rPr>
+              <w:t>Service/API</w:t>
+            </w:r>
+          </w:p>
+        </w:tc>
+      </w:tr>
+      <w:tr>
+        <w:trPr>
+          <w:cantSplit/>
+        </w:trPr>
+        <w:tc>
+          <w:tcPr>
+            <w:tcW w:type="dxa" w:w="1650"/>
+            <w:tcMar>
+              <w:top w:w="80" w:type="dxa"/>
+              <w:start w:w="120" w:type="dxa"/>
+              <w:bottom w:w="80" w:type="dxa"/>
+              <w:end w:w="120" w:type="dxa"/>
+            </w:tcMar>
+            <w:vAlign w:val="center"/>
+            <w:shd w:fill="FFFFFF"/>
+          </w:tcPr>
+          <w:p>
+            <w:pPr>
+              <w:spacing w:before="0" w:after="40" w:line="252" w:lineRule="auto"/>
+              <w:jc w:val="center"/>
+            </w:pPr>
+            <w:r>
+              <w:rPr>
+                <w:rFonts w:ascii="Calibri" w:hAnsi="Calibri"/>
+                <w:b w:val="0"/>
+                <w:color w:val="111827"/>
+                <w:sz w:val="17"/>
+              </w:rPr>
+              <w:t>Deterministic transition</w:t>
+            </w:r>
+          </w:p>
+        </w:tc>
+        <w:tc>
+          <w:tcPr>
+            <w:tcW w:type="dxa" w:w="4450"/>
+            <w:tcMar>
+              <w:top w:w="80" w:type="dxa"/>
+              <w:start w:w="120" w:type="dxa"/>
+              <w:bottom w:w="80" w:type="dxa"/>
+              <w:end w:w="120" w:type="dxa"/>
+            </w:tcMar>
+            <w:vAlign w:val="center"/>
+            <w:shd w:fill="FFFFFF"/>
+          </w:tcPr>
+          <w:p>
+            <w:pPr>
+              <w:spacing w:before="0" w:after="40" w:line="252" w:lineRule="auto"/>
+              <w:jc w:val="left"/>
+            </w:pPr>
+            <w:r>
+              <w:rPr>
+                <w:rFonts w:ascii="Calibri" w:hAnsi="Calibri"/>
+                <w:b w:val="0"/>
+                <w:color w:val="111827"/>
+                <w:sz w:val="17"/>
+              </w:rPr>
+              <w:t>Derive counter changes from aggregated task-run counts.</w:t>
+            </w:r>
+          </w:p>
+        </w:tc>
+        <w:tc>
+          <w:tcPr>
+            <w:tcW w:type="dxa" w:w="3260"/>
+            <w:tcMar>
+              <w:top w:w="80" w:type="dxa"/>
+              <w:start w:w="120" w:type="dxa"/>
+              <w:bottom w:w="80" w:type="dxa"/>
+              <w:end w:w="120" w:type="dxa"/>
+            </w:tcMar>
+            <w:vAlign w:val="center"/>
+            <w:shd w:fill="FFFFFF"/>
+          </w:tcPr>
+          <w:p>
+            <w:pPr>
+              <w:spacing w:before="0" w:after="40" w:line="252" w:lineRule="auto"/>
+              <w:jc w:val="left"/>
+            </w:pPr>
+            <w:r>
+              <w:rPr>
+                <w:rFonts w:ascii="Calibri" w:hAnsi="Calibri"/>
+                <w:b w:val="0"/>
+                <w:color w:val="111827"/>
+                <w:sz w:val="17"/>
+              </w:rPr>
+              <w:t>Service</w:t>
+            </w:r>
+          </w:p>
+        </w:tc>
+      </w:tr>
+      <w:tr>
+        <w:trPr>
+          <w:cantSplit/>
+        </w:trPr>
+        <w:tc>
+          <w:tcPr>
+            <w:tcW w:type="dxa" w:w="1650"/>
+            <w:tcMar>
+              <w:top w:w="80" w:type="dxa"/>
+              <w:start w:w="120" w:type="dxa"/>
+              <w:bottom w:w="80" w:type="dxa"/>
+              <w:end w:w="120" w:type="dxa"/>
+            </w:tcMar>
+            <w:vAlign w:val="center"/>
+            <w:shd w:fill="FFFFFF"/>
+          </w:tcPr>
+          <w:p>
+            <w:pPr>
+              <w:spacing w:before="0" w:after="40" w:line="252" w:lineRule="auto"/>
+              <w:jc w:val="center"/>
+            </w:pPr>
+            <w:r>
+              <w:rPr>
+                <w:rFonts w:ascii="Calibri" w:hAnsi="Calibri"/>
+                <w:b w:val="0"/>
+                <w:color w:val="111827"/>
+                <w:sz w:val="17"/>
+              </w:rPr>
+              <w:t>Profile RBAC</w:t>
+            </w:r>
+          </w:p>
+        </w:tc>
+        <w:tc>
+          <w:tcPr>
+            <w:tcW w:type="dxa" w:w="4450"/>
+            <w:tcMar>
+              <w:top w:w="80" w:type="dxa"/>
+              <w:start w:w="120" w:type="dxa"/>
+              <w:bottom w:w="80" w:type="dxa"/>
+              <w:end w:w="120" w:type="dxa"/>
+            </w:tcMar>
+            <w:vAlign w:val="center"/>
+            <w:shd w:fill="FFFFFF"/>
+          </w:tcPr>
+          <w:p>
+            <w:pPr>
+              <w:spacing w:before="0" w:after="40" w:line="252" w:lineRule="auto"/>
+              <w:jc w:val="left"/>
+            </w:pPr>
+            <w:r>
+              <w:rPr>
+                <w:rFonts w:ascii="Calibri" w:hAnsi="Calibri"/>
+                <w:b w:val="0"/>
+                <w:color w:val="111827"/>
+                <w:sz w:val="17"/>
+              </w:rPr>
+              <w:t xml:space="preserve">Require </w:t>
+            </w:r>
+            <w:r>
+              <w:rPr>
+                <w:rFonts w:ascii="Calibri" w:hAnsi="Calibri"/>
+                <w:b w:val="0"/>
+                <w:color w:val="111827"/>
+                <w:sz w:val="17"/>
+              </w:rPr>
+              <w:t>ecus:read</w:t>
+            </w:r>
+            <w:r>
+              <w:rPr>
+                <w:rFonts w:ascii="Calibri" w:hAnsi="Calibri"/>
+                <w:b w:val="0"/>
+                <w:color w:val="111827"/>
+                <w:sz w:val="17"/>
+              </w:rPr>
+              <w:t xml:space="preserve"> for catalogue and detail endpoints.</w:t>
+            </w:r>
+          </w:p>
+        </w:tc>
+        <w:tc>
+          <w:tcPr>
+            <w:tcW w:type="dxa" w:w="3260"/>
+            <w:tcMar>
+              <w:top w:w="80" w:type="dxa"/>
+              <w:start w:w="120" w:type="dxa"/>
+              <w:bottom w:w="80" w:type="dxa"/>
+              <w:end w:w="120" w:type="dxa"/>
+            </w:tcMar>
+            <w:vAlign w:val="center"/>
+            <w:shd w:fill="FFFFFF"/>
+          </w:tcPr>
+          <w:p>
+            <w:pPr>
+              <w:spacing w:before="0" w:after="40" w:line="252" w:lineRule="auto"/>
+              <w:jc w:val="left"/>
+            </w:pPr>
+            <w:r>
+              <w:rPr>
+                <w:rFonts w:ascii="Calibri" w:hAnsi="Calibri"/>
+                <w:b w:val="0"/>
+                <w:color w:val="111827"/>
+                <w:sz w:val="17"/>
+              </w:rPr>
+              <w:t>API/integration</w:t>
+            </w:r>
+          </w:p>
+        </w:tc>
+      </w:tr>
+      <w:tr>
+        <w:trPr>
+          <w:cantSplit/>
+        </w:trPr>
+        <w:tc>
+          <w:tcPr>
+            <w:tcW w:type="dxa" w:w="1650"/>
+            <w:tcMar>
+              <w:top w:w="80" w:type="dxa"/>
+              <w:start w:w="120" w:type="dxa"/>
+              <w:bottom w:w="80" w:type="dxa"/>
+              <w:end w:w="120" w:type="dxa"/>
+            </w:tcMar>
+            <w:vAlign w:val="center"/>
+            <w:shd w:fill="FFFFFF"/>
+          </w:tcPr>
+          <w:p>
+            <w:pPr>
+              <w:spacing w:before="0" w:after="40" w:line="252" w:lineRule="auto"/>
+              <w:jc w:val="center"/>
+            </w:pPr>
+            <w:r>
+              <w:rPr>
+                <w:rFonts w:ascii="Calibri" w:hAnsi="Calibri"/>
+                <w:b w:val="0"/>
+                <w:color w:val="111827"/>
+                <w:sz w:val="17"/>
+              </w:rPr>
+              <w:t>OpenAPI publication</w:t>
+            </w:r>
+          </w:p>
+        </w:tc>
+        <w:tc>
+          <w:tcPr>
+            <w:tcW w:type="dxa" w:w="4450"/>
+            <w:tcMar>
+              <w:top w:w="80" w:type="dxa"/>
+              <w:start w:w="120" w:type="dxa"/>
+              <w:bottom w:w="80" w:type="dxa"/>
+              <w:end w:w="120" w:type="dxa"/>
+            </w:tcMar>
+            <w:vAlign w:val="center"/>
+            <w:shd w:fill="FFFFFF"/>
+          </w:tcPr>
+          <w:p>
+            <w:pPr>
+              <w:spacing w:before="0" w:after="40" w:line="252" w:lineRule="auto"/>
+              <w:jc w:val="left"/>
+            </w:pPr>
+            <w:r>
+              <w:rPr>
+                <w:rFonts w:ascii="Calibri" w:hAnsi="Calibri"/>
+                <w:b w:val="0"/>
+                <w:color w:val="111827"/>
+                <w:sz w:val="17"/>
+              </w:rPr>
+              <w:t>Publish profile paths and typed schemas.</w:t>
+            </w:r>
+          </w:p>
+        </w:tc>
+        <w:tc>
+          <w:tcPr>
+            <w:tcW w:type="dxa" w:w="3260"/>
+            <w:tcMar>
+              <w:top w:w="80" w:type="dxa"/>
+              <w:start w:w="120" w:type="dxa"/>
+              <w:bottom w:w="80" w:type="dxa"/>
+              <w:end w:w="120" w:type="dxa"/>
+            </w:tcMar>
+            <w:vAlign w:val="center"/>
+            <w:shd w:fill="FFFFFF"/>
+          </w:tcPr>
+          <w:p>
+            <w:pPr>
+              <w:spacing w:before="0" w:after="40" w:line="252" w:lineRule="auto"/>
+              <w:jc w:val="left"/>
+            </w:pPr>
+            <w:r>
+              <w:rPr>
+                <w:rFonts w:ascii="Calibri" w:hAnsi="Calibri"/>
+                <w:b w:val="0"/>
+                <w:color w:val="111827"/>
+                <w:sz w:val="17"/>
+              </w:rPr>
+              <w:t>Contract</w:t>
+            </w:r>
+          </w:p>
+        </w:tc>
+      </w:tr>
+    </w:tbl>
+    <w:p>
+      <w:pPr>
+        <w:spacing w:after="60"/>
+      </w:pPr>
+    </w:p>
+    <w:p>
+      <w:pPr>
+        <w:pStyle w:val="Heading1"/>
+        <w:keepNext/>
+        <w:keepLines/>
       </w:pPr>
       <w:r>
         <w:t>12. Implemented Evidence</w:t>
@@ -5923,7 +7266,7 @@
           <w:color w:val="111827"/>
           <w:sz w:val="22"/>
         </w:rPr>
-        <w:t xml:space="preserve"> and </w:t>
+        <w:t xml:space="preserve">, </w:t>
       </w:r>
       <w:r>
         <w:rPr>
@@ -5939,6 +7282,24 @@
           <w:color w:val="111827"/>
           <w:sz w:val="22"/>
         </w:rPr>
+        <w:t>, and</w:t>
+      </w:r>
+    </w:p>
+    <w:p>
+      <w:r>
+        <w:rPr>
+          <w:rFonts w:ascii="Consolas" w:hAnsi="Consolas"/>
+          <w:color w:val="1F4D78"/>
+          <w:sz w:val="19"/>
+        </w:rPr>
+        <w:t>0020_ecu_behavior_profiles</w:t>
+      </w:r>
+      <w:r>
+        <w:rPr>
+          <w:rFonts w:ascii="Calibri" w:hAnsi="Calibri"/>
+          <w:color w:val="111827"/>
+          <w:sz w:val="22"/>
+        </w:rPr>
         <w:t xml:space="preserve"> own the database schema.</w:t>
       </w:r>
     </w:p>
@@ -5947,7 +7308,7 @@
         <w:pStyle w:val="ListBullet"/>
         <w:numPr>
           <w:ilvl w:val="0"/>
-          <w:numId w:val="13"/>
+          <w:numId w:val="14"/>
         </w:numPr>
       </w:pPr>
       <w:r>
@@ -5996,7 +7357,7 @@
         <w:pStyle w:val="ListBullet"/>
         <w:numPr>
           <w:ilvl w:val="0"/>
-          <w:numId w:val="13"/>
+          <w:numId w:val="14"/>
         </w:numPr>
       </w:pPr>
       <w:r>
@@ -6045,7 +7406,7 @@
         <w:pStyle w:val="ListBullet"/>
         <w:numPr>
           <w:ilvl w:val="0"/>
-          <w:numId w:val="13"/>
+          <w:numId w:val="14"/>
         </w:numPr>
       </w:pPr>
       <w:r>
@@ -6094,7 +7455,7 @@
         <w:pStyle w:val="ListBullet"/>
         <w:numPr>
           <w:ilvl w:val="0"/>
-          <w:numId w:val="13"/>
+          <w:numId w:val="14"/>
         </w:numPr>
       </w:pPr>
       <w:r>
@@ -6121,7 +7482,7 @@
         <w:pStyle w:val="ListBullet"/>
         <w:numPr>
           <w:ilvl w:val="0"/>
-          <w:numId w:val="14"/>
+          <w:numId w:val="15"/>
         </w:numPr>
       </w:pPr>
       <w:r>
@@ -6138,7 +7499,7 @@
         <w:pStyle w:val="ListBullet"/>
         <w:numPr>
           <w:ilvl w:val="0"/>
-          <w:numId w:val="14"/>
+          <w:numId w:val="15"/>
         </w:numPr>
       </w:pPr>
       <w:r>
@@ -6155,7 +7516,7 @@
         <w:pStyle w:val="ListBullet"/>
         <w:numPr>
           <w:ilvl w:val="0"/>
-          <w:numId w:val="14"/>
+          <w:numId w:val="15"/>
         </w:numPr>
       </w:pPr>
       <w:r>
@@ -6164,7 +7525,17 @@
           <w:color w:val="111827"/>
           <w:sz w:val="22"/>
         </w:rPr>
-        <w:t>ECU type profiles are not yet behaviorally distinct.</w:t>
+        <w:t>Coordination profiles for door, ADAS, climate, and lighting intentionally share a baseline and</w:t>
+      </w:r>
+    </w:p>
+    <w:p>
+      <w:r>
+        <w:rPr>
+          <w:rFonts w:ascii="Calibri" w:hAnsi="Calibri"/>
+          <w:color w:val="111827"/>
+          <w:sz w:val="22"/>
+        </w:rPr>
+        <w:t>need specialization in later scenario-driven work.</w:t>
       </w:r>
     </w:p>
     <w:p>
@@ -6172,7 +7543,7 @@
         <w:pStyle w:val="ListBullet"/>
         <w:numPr>
           <w:ilvl w:val="0"/>
-          <w:numId w:val="14"/>
+          <w:numId w:val="16"/>
         </w:numPr>
       </w:pPr>
       <w:r>
@@ -6189,7 +7560,7 @@
         <w:pStyle w:val="ListBullet"/>
         <w:numPr>
           <w:ilvl w:val="0"/>
-          <w:numId w:val="14"/>
+          <w:numId w:val="16"/>
         </w:numPr>
       </w:pPr>
       <w:r>
@@ -6218,7 +7589,7 @@
           <w:color w:val="111827"/>
           <w:sz w:val="22"/>
         </w:rPr>
-        <w:t xml:space="preserve">The next increment adds ECU-specific behavior profiles on top of the deterministic task clock. Later increments add memory regions, fault lifecycle, CAN contracts, and multi-ECU scenarios. See </w:t>
+        <w:t xml:space="preserve">The next increment adds volatile and non-volatile memory regions, snapshots, reset persistence, and corruption injection. Later increments add fault lifecycle, CAN contracts, and multi-ECU scenarios. See </w:t>
       </w:r>
       <w:r>
         <w:rPr>
@@ -6252,7 +7623,7 @@
         <w:pStyle w:val="ListNumber"/>
         <w:numPr>
           <w:ilvl w:val="0"/>
-          <w:numId w:val="15"/>
+          <w:numId w:val="17"/>
         </w:numPr>
       </w:pPr>
       <w:r>
@@ -6269,7 +7640,7 @@
         <w:pStyle w:val="ListNumber"/>
         <w:numPr>
           <w:ilvl w:val="0"/>
-          <w:numId w:val="15"/>
+          <w:numId w:val="17"/>
         </w:numPr>
       </w:pPr>
       <w:r>
@@ -6286,7 +7657,7 @@
         <w:pStyle w:val="ListNumber"/>
         <w:numPr>
           <w:ilvl w:val="0"/>
-          <w:numId w:val="15"/>
+          <w:numId w:val="17"/>
         </w:numPr>
       </w:pPr>
       <w:r>
@@ -6303,7 +7674,7 @@
         <w:pStyle w:val="ListNumber"/>
         <w:numPr>
           <w:ilvl w:val="0"/>
-          <w:numId w:val="15"/>
+          <w:numId w:val="17"/>
         </w:numPr>
       </w:pPr>
       <w:r>
@@ -6320,7 +7691,7 @@
         <w:pStyle w:val="ListNumber"/>
         <w:numPr>
           <w:ilvl w:val="0"/>
-          <w:numId w:val="15"/>
+          <w:numId w:val="17"/>
         </w:numPr>
       </w:pPr>
       <w:r>
@@ -6337,7 +7708,7 @@
         <w:pStyle w:val="ListNumber"/>
         <w:numPr>
           <w:ilvl w:val="0"/>
-          <w:numId w:val="15"/>
+          <w:numId w:val="17"/>
         </w:numPr>
       </w:pPr>
       <w:r>
@@ -6354,7 +7725,7 @@
         <w:pStyle w:val="ListNumber"/>
         <w:numPr>
           <w:ilvl w:val="0"/>
-          <w:numId w:val="15"/>
+          <w:numId w:val="17"/>
         </w:numPr>
       </w:pPr>
       <w:r>
@@ -6364,6 +7735,57 @@
           <w:sz w:val="22"/>
         </w:rPr>
         <w:t>Explain why III-2 reset preserves memory and how III-4 can refine that contract safely.</w:t>
+      </w:r>
+    </w:p>
+    <w:p>
+      <w:pPr>
+        <w:pStyle w:val="ListNumber"/>
+        <w:numPr>
+          <w:ilvl w:val="0"/>
+          <w:numId w:val="17"/>
+        </w:numPr>
+      </w:pPr>
+      <w:r>
+        <w:rPr>
+          <w:rFonts w:ascii="Calibri" w:hAnsi="Calibri"/>
+          <w:color w:val="111827"/>
+          <w:sz w:val="22"/>
+        </w:rPr>
+        <w:t>Compare the battery and gateway schedules and explain why both remain protocol-independent.</w:t>
+      </w:r>
+    </w:p>
+    <w:p>
+      <w:pPr>
+        <w:pStyle w:val="ListNumber"/>
+        <w:numPr>
+          <w:ilvl w:val="0"/>
+          <w:numId w:val="17"/>
+        </w:numPr>
+      </w:pPr>
+      <w:r>
+        <w:rPr>
+          <w:rFonts w:ascii="Calibri" w:hAnsi="Calibri"/>
+          <w:color w:val="111827"/>
+          <w:sz w:val="22"/>
+        </w:rPr>
+        <w:t>Calculate the behavior-state counters after advancing a new battery ECU by 2,100 ms.</w:t>
+      </w:r>
+    </w:p>
+    <w:p>
+      <w:pPr>
+        <w:pStyle w:val="ListNumber"/>
+        <w:numPr>
+          <w:ilvl w:val="0"/>
+          <w:numId w:val="17"/>
+        </w:numPr>
+      </w:pPr>
+      <w:r>
+        <w:rPr>
+          <w:rFonts w:ascii="Calibri" w:hAnsi="Calibri"/>
+          <w:color w:val="111827"/>
+          <w:sz w:val="22"/>
+        </w:rPr>
+        <w:t>Design a dedicated ADAS profile without adding camera or CAN dependencies to the registry.</w:t>
       </w:r>
     </w:p>
     <w:sectPr>
@@ -6395,7 +7817,7 @@
         <w:color w:val="667085"/>
         <w:sz w:val="17"/>
       </w:rPr>
-      <w:t>ATEP Volume III Workbook  |  Version 0.2.0</w:t>
+      <w:t>ATEP Volume III Workbook  |  Version 0.3.0</w:t>
     </w:r>
     <w:r>
       <w:rPr>
@@ -6707,6 +8129,18 @@
     </w:lvlOverride>
   </w:num>
   <w:num w:numId="15">
+    <w:abstractNumId w:val="10"/>
+    <w:lvlOverride w:ilvl="0">
+      <w:startOverride w:val="1"/>
+    </w:lvlOverride>
+  </w:num>
+  <w:num w:numId="16">
+    <w:abstractNumId w:val="10"/>
+    <w:lvlOverride w:ilvl="0">
+      <w:startOverride w:val="1"/>
+    </w:lvlOverride>
+  </w:num>
+  <w:num w:numId="17">
     <w:abstractNumId w:val="9"/>
     <w:lvlOverride w:ilvl="0">
       <w:startOverride w:val="1"/>

</xml_diff>

<commit_message>
feat(ecus): add memory regions and snapshots
</commit_message>
<xml_diff>
--- a/docs/ATEP_Volume_III_ECU_Simulator_Engineering_Workbook.docx
+++ b/docs/ATEP_Volume_III_ECU_Simulator_Engineering_Workbook.docx
@@ -143,7 +143,7 @@
                 <w:color w:val="0B2545"/>
                 <w:sz w:val="19"/>
               </w:rPr>
-              <w:t>0.3.0</w:t>
+              <w:t>0.4.0</w:t>
             </w:r>
           </w:p>
         </w:tc>
@@ -265,7 +265,7 @@
                 <w:color w:val="111827"/>
                 <w:sz w:val="19"/>
               </w:rPr>
-              <w:t>Living document - Increments III-1 through III-3 implemented</w:t>
+              <w:t>Living document - Increments III-1 through III-4 implemented</w:t>
             </w:r>
           </w:p>
         </w:tc>
@@ -637,6 +637,25 @@
           <w:color w:val="0B2545"/>
           <w:sz w:val="21"/>
         </w:rPr>
+        <w:t>11.3 III-4 Verification</w:t>
+      </w:r>
+    </w:p>
+    <w:p>
+      <w:pPr>
+        <w:pStyle w:val="ListNumber"/>
+        <w:numPr>
+          <w:ilvl w:val="0"/>
+          <w:numId w:val="10"/>
+        </w:numPr>
+        <w:ind w:left="216" w:firstLine="0"/>
+      </w:pPr>
+      <w:r>
+        <w:rPr>
+          <w:rFonts w:ascii="Calibri" w:hAnsi="Calibri"/>
+          <w:b/>
+          <w:color w:val="0B2545"/>
+          <w:sz w:val="21"/>
+        </w:rPr>
         <w:t>12. Implemented Evidence</w:t>
       </w:r>
     </w:p>
@@ -931,7 +950,7 @@
                 <w:color w:val="111827"/>
                 <w:sz w:val="17"/>
               </w:rPr>
-              <w:t>Increments III-1 through III-3</w:t>
+              <w:t>Increments III-1 through III-4</w:t>
             </w:r>
           </w:p>
         </w:tc>
@@ -1513,6 +1532,95 @@
           </w:p>
         </w:tc>
       </w:tr>
+      <w:tr>
+        <w:trPr>
+          <w:cantSplit/>
+        </w:trPr>
+        <w:tc>
+          <w:tcPr>
+            <w:tcW w:type="dxa" w:w="1650"/>
+            <w:tcMar>
+              <w:top w:w="80" w:type="dxa"/>
+              <w:start w:w="120" w:type="dxa"/>
+              <w:bottom w:w="80" w:type="dxa"/>
+              <w:end w:w="120" w:type="dxa"/>
+            </w:tcMar>
+            <w:vAlign w:val="center"/>
+            <w:shd w:fill="FFFFFF"/>
+          </w:tcPr>
+          <w:p>
+            <w:pPr>
+              <w:spacing w:before="0" w:after="40" w:line="252" w:lineRule="auto"/>
+              <w:jc w:val="center"/>
+            </w:pPr>
+            <w:r>
+              <w:rPr>
+                <w:rFonts w:ascii="Calibri" w:hAnsi="Calibri"/>
+                <w:b w:val="0"/>
+                <w:color w:val="111827"/>
+                <w:sz w:val="17"/>
+              </w:rPr>
+              <w:t>0.4.0</w:t>
+            </w:r>
+          </w:p>
+        </w:tc>
+        <w:tc>
+          <w:tcPr>
+            <w:tcW w:type="dxa" w:w="4450"/>
+            <w:tcMar>
+              <w:top w:w="80" w:type="dxa"/>
+              <w:start w:w="120" w:type="dxa"/>
+              <w:bottom w:w="80" w:type="dxa"/>
+              <w:end w:w="120" w:type="dxa"/>
+            </w:tcMar>
+            <w:vAlign w:val="center"/>
+            <w:shd w:fill="FFFFFF"/>
+          </w:tcPr>
+          <w:p>
+            <w:pPr>
+              <w:spacing w:before="0" w:after="40" w:line="252" w:lineRule="auto"/>
+              <w:jc w:val="left"/>
+            </w:pPr>
+            <w:r>
+              <w:rPr>
+                <w:rFonts w:ascii="Calibri" w:hAnsi="Calibri"/>
+                <w:b w:val="0"/>
+                <w:color w:val="111827"/>
+                <w:sz w:val="17"/>
+              </w:rPr>
+              <w:t>2026-08-24</w:t>
+            </w:r>
+          </w:p>
+        </w:tc>
+        <w:tc>
+          <w:tcPr>
+            <w:tcW w:type="dxa" w:w="3260"/>
+            <w:tcMar>
+              <w:top w:w="80" w:type="dxa"/>
+              <w:start w:w="120" w:type="dxa"/>
+              <w:bottom w:w="80" w:type="dxa"/>
+              <w:end w:w="120" w:type="dxa"/>
+            </w:tcMar>
+            <w:vAlign w:val="center"/>
+            <w:shd w:fill="FFFFFF"/>
+          </w:tcPr>
+          <w:p>
+            <w:pPr>
+              <w:spacing w:before="0" w:after="40" w:line="252" w:lineRule="auto"/>
+              <w:jc w:val="left"/>
+            </w:pPr>
+            <w:r>
+              <w:rPr>
+                <w:rFonts w:ascii="Calibri" w:hAnsi="Calibri"/>
+                <w:b w:val="0"/>
+                <w:color w:val="111827"/>
+                <w:sz w:val="17"/>
+              </w:rPr>
+              <w:t>Added memory regions, reset persistence, snapshots, seeded corruption, APIs, migration, and tests.</w:t>
+            </w:r>
+          </w:p>
+        </w:tc>
+      </w:tr>
     </w:tbl>
     <w:p>
       <w:pPr>
@@ -1728,6 +1836,23 @@
     </w:p>
     <w:p>
       <w:pPr>
+        <w:pStyle w:val="ListBullet"/>
+        <w:numPr>
+          <w:ilvl w:val="0"/>
+          <w:numId w:val="11"/>
+        </w:numPr>
+      </w:pPr>
+      <w:r>
+        <w:rPr>
+          <w:rFonts w:ascii="Calibri" w:hAnsi="Calibri"/>
+          <w:color w:val="111827"/>
+          <w:sz w:val="22"/>
+        </w:rPr>
+        <w:t>Volatile/non-volatile regions, checksummed snapshots, and seeded corruption evidence.</w:t>
+      </w:r>
+    </w:p>
+    <w:p>
+      <w:pPr>
         <w:pStyle w:val="Heading2"/>
         <w:keepNext/>
         <w:keepLines/>
@@ -1801,7 +1926,7 @@
           <w:color w:val="111827"/>
           <w:sz w:val="22"/>
         </w:rPr>
-        <w:t>Persistent memory regions and reset persistence semantics.</w:t>
+        <w:t>Full binary firmware images and unrestricted memory dumps.</w:t>
       </w:r>
     </w:p>
     <w:p>
@@ -1996,7 +2121,7 @@
           <w:color w:val="111827"/>
           <w:sz w:val="22"/>
         </w:rPr>
-        <w:t xml:space="preserve">, cyclic tasks, profile version, behavior state, logical time, boot count, </w:t>
+        <w:t xml:space="preserve">, memory regions, cyclic tasks, profile version, behavior state, logical time, boot count, </w:t>
       </w:r>
       <w:r>
         <w:rPr>
@@ -3121,6 +3246,375 @@
           </w:p>
         </w:tc>
       </w:tr>
+      <w:tr>
+        <w:trPr>
+          <w:cantSplit/>
+        </w:trPr>
+        <w:tc>
+          <w:tcPr>
+            <w:tcW w:type="dxa" w:w="1150"/>
+            <w:tcMar>
+              <w:top w:w="80" w:type="dxa"/>
+              <w:start w:w="120" w:type="dxa"/>
+              <w:bottom w:w="80" w:type="dxa"/>
+              <w:end w:w="120" w:type="dxa"/>
+            </w:tcMar>
+            <w:vAlign w:val="center"/>
+            <w:shd w:fill="FFFFFF"/>
+          </w:tcPr>
+          <w:p>
+            <w:pPr>
+              <w:spacing w:before="0" w:after="40" w:line="252" w:lineRule="auto"/>
+              <w:jc w:val="center"/>
+            </w:pPr>
+            <w:r>
+              <w:rPr>
+                <w:rFonts w:ascii="Calibri" w:hAnsi="Calibri"/>
+                <w:b w:val="0"/>
+                <w:color w:val="111827"/>
+                <w:sz w:val="16"/>
+              </w:rPr>
+              <w:t>POST/GET</w:t>
+            </w:r>
+          </w:p>
+        </w:tc>
+        <w:tc>
+          <w:tcPr>
+            <w:tcW w:type="dxa" w:w="3700"/>
+            <w:tcMar>
+              <w:top w:w="80" w:type="dxa"/>
+              <w:start w:w="120" w:type="dxa"/>
+              <w:bottom w:w="80" w:type="dxa"/>
+              <w:end w:w="120" w:type="dxa"/>
+            </w:tcMar>
+            <w:vAlign w:val="center"/>
+            <w:shd w:fill="FFFFFF"/>
+          </w:tcPr>
+          <w:p>
+            <w:pPr>
+              <w:spacing w:before="0" w:after="40" w:line="252" w:lineRule="auto"/>
+              <w:jc w:val="left"/>
+            </w:pPr>
+            <w:r>
+              <w:rPr>
+                <w:rFonts w:ascii="Calibri" w:hAnsi="Calibri"/>
+                <w:b w:val="0"/>
+                <w:color w:val="111827"/>
+                <w:sz w:val="16"/>
+              </w:rPr>
+              <w:t>/api/v1/vehicles/{vehicle_id}/ecus/{ecu_id}/memory/snapshots</w:t>
+            </w:r>
+          </w:p>
+        </w:tc>
+        <w:tc>
+          <w:tcPr>
+            <w:tcW w:type="dxa" w:w="3100"/>
+            <w:tcMar>
+              <w:top w:w="80" w:type="dxa"/>
+              <w:start w:w="120" w:type="dxa"/>
+              <w:bottom w:w="80" w:type="dxa"/>
+              <w:end w:w="120" w:type="dxa"/>
+            </w:tcMar>
+            <w:vAlign w:val="center"/>
+            <w:shd w:fill="FFFFFF"/>
+          </w:tcPr>
+          <w:p>
+            <w:pPr>
+              <w:spacing w:before="0" w:after="40" w:line="252" w:lineRule="auto"/>
+              <w:jc w:val="left"/>
+            </w:pPr>
+            <w:r>
+              <w:rPr>
+                <w:rFonts w:ascii="Calibri" w:hAnsi="Calibri"/>
+                <w:b w:val="0"/>
+                <w:color w:val="111827"/>
+                <w:sz w:val="16"/>
+              </w:rPr>
+              <w:t>ecus:manage</w:t>
+            </w:r>
+            <w:r>
+              <w:rPr>
+                <w:rFonts w:ascii="Calibri" w:hAnsi="Calibri"/>
+                <w:b w:val="0"/>
+                <w:color w:val="111827"/>
+                <w:sz w:val="16"/>
+              </w:rPr>
+              <w:t xml:space="preserve"> / </w:t>
+            </w:r>
+            <w:r>
+              <w:rPr>
+                <w:rFonts w:ascii="Calibri" w:hAnsi="Calibri"/>
+                <w:b w:val="0"/>
+                <w:color w:val="111827"/>
+                <w:sz w:val="16"/>
+              </w:rPr>
+              <w:t>ecus:read</w:t>
+            </w:r>
+          </w:p>
+        </w:tc>
+        <w:tc>
+          <w:tcPr>
+            <w:tcW w:type="dxa" w:w="1410"/>
+            <w:tcMar>
+              <w:top w:w="80" w:type="dxa"/>
+              <w:start w:w="120" w:type="dxa"/>
+              <w:bottom w:w="80" w:type="dxa"/>
+              <w:end w:w="120" w:type="dxa"/>
+            </w:tcMar>
+            <w:vAlign w:val="center"/>
+            <w:shd w:fill="FFFFFF"/>
+          </w:tcPr>
+          <w:p>
+            <w:pPr>
+              <w:spacing w:before="0" w:after="40" w:line="252" w:lineRule="auto"/>
+              <w:jc w:val="left"/>
+            </w:pPr>
+            <w:r>
+              <w:rPr>
+                <w:rFonts w:ascii="Calibri" w:hAnsi="Calibri"/>
+                <w:b w:val="0"/>
+                <w:color w:val="111827"/>
+                <w:sz w:val="16"/>
+              </w:rPr>
+              <w:t>Create or list memory snapshots.</w:t>
+            </w:r>
+          </w:p>
+        </w:tc>
+      </w:tr>
+      <w:tr>
+        <w:trPr>
+          <w:cantSplit/>
+        </w:trPr>
+        <w:tc>
+          <w:tcPr>
+            <w:tcW w:type="dxa" w:w="1150"/>
+            <w:tcMar>
+              <w:top w:w="80" w:type="dxa"/>
+              <w:start w:w="120" w:type="dxa"/>
+              <w:bottom w:w="80" w:type="dxa"/>
+              <w:end w:w="120" w:type="dxa"/>
+            </w:tcMar>
+            <w:vAlign w:val="center"/>
+            <w:shd w:fill="FFFFFF"/>
+          </w:tcPr>
+          <w:p>
+            <w:pPr>
+              <w:spacing w:before="0" w:after="40" w:line="252" w:lineRule="auto"/>
+              <w:jc w:val="center"/>
+            </w:pPr>
+            <w:r>
+              <w:rPr>
+                <w:rFonts w:ascii="Calibri" w:hAnsi="Calibri"/>
+                <w:b w:val="0"/>
+                <w:color w:val="111827"/>
+                <w:sz w:val="16"/>
+              </w:rPr>
+              <w:t>POST</w:t>
+            </w:r>
+          </w:p>
+        </w:tc>
+        <w:tc>
+          <w:tcPr>
+            <w:tcW w:type="dxa" w:w="3700"/>
+            <w:tcMar>
+              <w:top w:w="80" w:type="dxa"/>
+              <w:start w:w="120" w:type="dxa"/>
+              <w:bottom w:w="80" w:type="dxa"/>
+              <w:end w:w="120" w:type="dxa"/>
+            </w:tcMar>
+            <w:vAlign w:val="center"/>
+            <w:shd w:fill="FFFFFF"/>
+          </w:tcPr>
+          <w:p>
+            <w:pPr>
+              <w:spacing w:before="0" w:after="40" w:line="252" w:lineRule="auto"/>
+              <w:jc w:val="left"/>
+            </w:pPr>
+            <w:r>
+              <w:rPr>
+                <w:rFonts w:ascii="Calibri" w:hAnsi="Calibri"/>
+                <w:b w:val="0"/>
+                <w:color w:val="111827"/>
+                <w:sz w:val="16"/>
+              </w:rPr>
+              <w:t>/api/v1/vehicles/{vehicle_id}/ecus/{ecu_id}/memory/snapshots/{snapshot_id}/restore</w:t>
+            </w:r>
+          </w:p>
+        </w:tc>
+        <w:tc>
+          <w:tcPr>
+            <w:tcW w:type="dxa" w:w="3100"/>
+            <w:tcMar>
+              <w:top w:w="80" w:type="dxa"/>
+              <w:start w:w="120" w:type="dxa"/>
+              <w:bottom w:w="80" w:type="dxa"/>
+              <w:end w:w="120" w:type="dxa"/>
+            </w:tcMar>
+            <w:vAlign w:val="center"/>
+            <w:shd w:fill="FFFFFF"/>
+          </w:tcPr>
+          <w:p>
+            <w:pPr>
+              <w:spacing w:before="0" w:after="40" w:line="252" w:lineRule="auto"/>
+              <w:jc w:val="left"/>
+            </w:pPr>
+            <w:r>
+              <w:rPr>
+                <w:rFonts w:ascii="Calibri" w:hAnsi="Calibri"/>
+                <w:b w:val="0"/>
+                <w:color w:val="111827"/>
+                <w:sz w:val="16"/>
+              </w:rPr>
+              <w:t>ecus:manage</w:t>
+            </w:r>
+          </w:p>
+        </w:tc>
+        <w:tc>
+          <w:tcPr>
+            <w:tcW w:type="dxa" w:w="1410"/>
+            <w:tcMar>
+              <w:top w:w="80" w:type="dxa"/>
+              <w:start w:w="120" w:type="dxa"/>
+              <w:bottom w:w="80" w:type="dxa"/>
+              <w:end w:w="120" w:type="dxa"/>
+            </w:tcMar>
+            <w:vAlign w:val="center"/>
+            <w:shd w:fill="FFFFFF"/>
+          </w:tcPr>
+          <w:p>
+            <w:pPr>
+              <w:spacing w:before="0" w:after="40" w:line="252" w:lineRule="auto"/>
+              <w:jc w:val="left"/>
+            </w:pPr>
+            <w:r>
+              <w:rPr>
+                <w:rFonts w:ascii="Calibri" w:hAnsi="Calibri"/>
+                <w:b w:val="0"/>
+                <w:color w:val="111827"/>
+                <w:sz w:val="16"/>
+              </w:rPr>
+              <w:t>Restore a versioned snapshot.</w:t>
+            </w:r>
+          </w:p>
+        </w:tc>
+      </w:tr>
+      <w:tr>
+        <w:trPr>
+          <w:cantSplit/>
+        </w:trPr>
+        <w:tc>
+          <w:tcPr>
+            <w:tcW w:type="dxa" w:w="1150"/>
+            <w:tcMar>
+              <w:top w:w="80" w:type="dxa"/>
+              <w:start w:w="120" w:type="dxa"/>
+              <w:bottom w:w="80" w:type="dxa"/>
+              <w:end w:w="120" w:type="dxa"/>
+            </w:tcMar>
+            <w:vAlign w:val="center"/>
+            <w:shd w:fill="FFFFFF"/>
+          </w:tcPr>
+          <w:p>
+            <w:pPr>
+              <w:spacing w:before="0" w:after="40" w:line="252" w:lineRule="auto"/>
+              <w:jc w:val="center"/>
+            </w:pPr>
+            <w:r>
+              <w:rPr>
+                <w:rFonts w:ascii="Calibri" w:hAnsi="Calibri"/>
+                <w:b w:val="0"/>
+                <w:color w:val="111827"/>
+                <w:sz w:val="16"/>
+              </w:rPr>
+              <w:t>POST</w:t>
+            </w:r>
+          </w:p>
+        </w:tc>
+        <w:tc>
+          <w:tcPr>
+            <w:tcW w:type="dxa" w:w="3700"/>
+            <w:tcMar>
+              <w:top w:w="80" w:type="dxa"/>
+              <w:start w:w="120" w:type="dxa"/>
+              <w:bottom w:w="80" w:type="dxa"/>
+              <w:end w:w="120" w:type="dxa"/>
+            </w:tcMar>
+            <w:vAlign w:val="center"/>
+            <w:shd w:fill="FFFFFF"/>
+          </w:tcPr>
+          <w:p>
+            <w:pPr>
+              <w:spacing w:before="0" w:after="40" w:line="252" w:lineRule="auto"/>
+              <w:jc w:val="left"/>
+            </w:pPr>
+            <w:r>
+              <w:rPr>
+                <w:rFonts w:ascii="Calibri" w:hAnsi="Calibri"/>
+                <w:b w:val="0"/>
+                <w:color w:val="111827"/>
+                <w:sz w:val="16"/>
+              </w:rPr>
+              <w:t>/api/v1/vehicles/{vehicle_id}/ecus/{ecu_id}/memory/corrupt</w:t>
+            </w:r>
+          </w:p>
+        </w:tc>
+        <w:tc>
+          <w:tcPr>
+            <w:tcW w:type="dxa" w:w="3100"/>
+            <w:tcMar>
+              <w:top w:w="80" w:type="dxa"/>
+              <w:start w:w="120" w:type="dxa"/>
+              <w:bottom w:w="80" w:type="dxa"/>
+              <w:end w:w="120" w:type="dxa"/>
+            </w:tcMar>
+            <w:vAlign w:val="center"/>
+            <w:shd w:fill="FFFFFF"/>
+          </w:tcPr>
+          <w:p>
+            <w:pPr>
+              <w:spacing w:before="0" w:after="40" w:line="252" w:lineRule="auto"/>
+              <w:jc w:val="left"/>
+            </w:pPr>
+            <w:r>
+              <w:rPr>
+                <w:rFonts w:ascii="Calibri" w:hAnsi="Calibri"/>
+                <w:b w:val="0"/>
+                <w:color w:val="111827"/>
+                <w:sz w:val="16"/>
+              </w:rPr>
+              <w:t>ecus:manage</w:t>
+            </w:r>
+          </w:p>
+        </w:tc>
+        <w:tc>
+          <w:tcPr>
+            <w:tcW w:type="dxa" w:w="1410"/>
+            <w:tcMar>
+              <w:top w:w="80" w:type="dxa"/>
+              <w:start w:w="120" w:type="dxa"/>
+              <w:bottom w:w="80" w:type="dxa"/>
+              <w:end w:w="120" w:type="dxa"/>
+            </w:tcMar>
+            <w:vAlign w:val="center"/>
+            <w:shd w:fill="FFFFFF"/>
+          </w:tcPr>
+          <w:p>
+            <w:pPr>
+              <w:spacing w:before="0" w:after="40" w:line="252" w:lineRule="auto"/>
+              <w:jc w:val="left"/>
+            </w:pPr>
+            <w:r>
+              <w:rPr>
+                <w:rFonts w:ascii="Calibri" w:hAnsi="Calibri"/>
+                <w:b w:val="0"/>
+                <w:color w:val="111827"/>
+                <w:sz w:val="16"/>
+              </w:rPr>
+              <w:t>Apply deterministic seeded bit flips.</w:t>
+            </w:r>
+          </w:p>
+        </w:tc>
+      </w:tr>
     </w:tbl>
     <w:p>
       <w:pPr>
@@ -3264,7 +3758,7 @@
           <w:color w:val="111827"/>
           <w:sz w:val="22"/>
         </w:rPr>
-        <w:t>Reset durations are fixed: soft 10 ms, hard 100 ms, and power cycle 500 ms. Reset increments the boot counter, advances logical time, and becomes offline unless a confirmed critical fault requires fault state. Memory and faults remain unchanged pending the III-4 memory-region model.</w:t>
+        <w:t>Reset durations are fixed: soft 10 ms, hard 100 ms, and power cycle 500 ms. Reset increments the boot counter, advances logical time, and becomes offline unless a confirmed critical fault requires fault state. Soft reset preserves memory; hard and power-cycle reset restore volatile cells to their region reset value while preserving non-volatile cells. Fault records remain unchanged.</w:t>
       </w:r>
     </w:p>
     <w:p>
@@ -3285,6 +3779,26 @@
           <w:sz w:val="22"/>
         </w:rPr>
         <w:t>The immutable registry defines a version, allowed task schedules, initial behavior state, and a state effect for every task. Creation applies defaults when callers omit them. State replacement rejects unknown task IDs, modified schedules, and unknown state keys. During logical-time advance, aggregated execution counts update integer counters once; no wall-clock or protocol adapter is used.</w:t>
+      </w:r>
+    </w:p>
+    <w:p>
+      <w:pPr>
+        <w:pStyle w:val="Heading2"/>
+        <w:keepNext/>
+        <w:keepLines/>
+      </w:pPr>
+      <w:r>
+        <w:t>8.3 Memory Persistence and Evidence</w:t>
+      </w:r>
+    </w:p>
+    <w:p>
+      <w:r>
+        <w:rPr>
+          <w:rFonts w:ascii="Calibri" w:hAnsi="Calibri"/>
+          <w:color w:val="111827"/>
+          <w:sz w:val="22"/>
+        </w:rPr>
+        <w:t>Regions are non-overlapping and every initialized sparse cell belongs to exactly one region. Soft reset preserves all cells; hard and power-cycle reset restore volatile cells to their region reset value while retaining non-volatile cells. Snapshots contain no more than 256 cells and use a canonical SHA-256 checksum. Audit records store checksum and counts rather than full memory images. Seeded corruption flips a bounded number of bits and persists command identity for exact replay.</w:t>
       </w:r>
     </w:p>
     <w:p>
@@ -3320,7 +3834,7 @@
           <w:color w:val="111827"/>
           <w:sz w:val="22"/>
         </w:rPr>
-        <w:t>. III-1 covers the aggregate, III-2 covers deterministic execution and reset, and III-3 covers versioned profiles and state transitions.</w:t>
+        <w:t>. III-1 covers the aggregate, III-2 covers deterministic execution and reset, III-3 covers versioned profiles, and III-4 covers memory regions, snapshots, persistence, and corruption.</w:t>
       </w:r>
     </w:p>
     <w:p>
@@ -3450,7 +3964,7 @@
           <w:color w:val="111827"/>
           <w:sz w:val="22"/>
         </w:rPr>
-        <w:t>Clearing state before defining volatile and non-volatile regions would invent behavior. III-2 records reset mode, duration, boot count, and preservation; III-4 will own persistence semantics.</w:t>
+        <w:t>Clearing state before defining volatile and non-volatile regions would invent behavior. III-2 therefore preserved all memory; III-4 supersedes that transitional rule with explicit, region-driven persistence semantics.</w:t>
       </w:r>
     </w:p>
     <w:p>
@@ -3471,6 +3985,62 @@
           <w:sz w:val="22"/>
         </w:rPr>
         <w:t>Profiles are source-controlled contracts rather than mutable database configuration. This makes tests reproducible and reviewable. CAN production, UDS diagnostics, and continuous physical models remain outside the profile registry and will integrate through later explicit boundaries.</w:t>
+      </w:r>
+    </w:p>
+    <w:p>
+      <w:pPr>
+        <w:pStyle w:val="Heading2"/>
+        <w:keepNext/>
+        <w:keepLines/>
+      </w:pPr>
+      <w:r>
+        <w:t>ADR-ECU-008 — Make Memory Persistence Region-Driven</w:t>
+      </w:r>
+    </w:p>
+    <w:p>
+      <w:r>
+        <w:rPr>
+          <w:rFonts w:ascii="Calibri" w:hAnsi="Calibri"/>
+          <w:color w:val="111827"/>
+          <w:sz w:val="22"/>
+        </w:rPr>
+        <w:t xml:space="preserve">Reset behavior follows explicit region kind rather than address conventions. This avoids hidden assumptions, preserves backward compatibility through </w:t>
+      </w:r>
+      <w:r>
+        <w:rPr>
+          <w:rFonts w:ascii="Consolas" w:hAnsi="Consolas"/>
+          <w:color w:val="1F4D78"/>
+          <w:sz w:val="19"/>
+        </w:rPr>
+        <w:t>legacy_nvm</w:t>
+      </w:r>
+      <w:r>
+        <w:rPr>
+          <w:rFonts w:ascii="Calibri" w:hAnsi="Calibri"/>
+          <w:color w:val="111827"/>
+          <w:sz w:val="22"/>
+        </w:rPr>
+        <w:t>, and makes volatile-state tests portable across ECU types.</w:t>
+      </w:r>
+    </w:p>
+    <w:p>
+      <w:pPr>
+        <w:pStyle w:val="Heading2"/>
+        <w:keepNext/>
+        <w:keepLines/>
+      </w:pPr>
+      <w:r>
+        <w:t>ADR-ECU-009 — Use Checksums and Seeds for Reproducible Memory Evidence</w:t>
+      </w:r>
+    </w:p>
+    <w:p>
+      <w:r>
+        <w:rPr>
+          <w:rFonts w:ascii="Calibri" w:hAnsi="Calibri"/>
+          <w:color w:val="111827"/>
+          <w:sz w:val="22"/>
+        </w:rPr>
+        <w:t>Canonical checksums identify snapshot content without copying complete memory into audit logs. An explicit corruption seed, bounded flip count, optimistic version, and persisted command ID make fault injection repeatable and retry-safe.</w:t>
       </w:r>
     </w:p>
     <w:p>
@@ -7208,6 +7778,1023 @@
         <w:keepLines/>
       </w:pPr>
       <w:r>
+        <w:t>11.3 III-4 Verification</w:t>
+      </w:r>
+    </w:p>
+    <w:tbl>
+      <w:tblPr>
+        <w:tblW w:type="dxa" w:w="9360"/>
+        <w:jc w:val="left"/>
+        <w:tblLayout w:type="fixed"/>
+        <w:tblLook w:firstColumn="1" w:firstRow="1" w:lastColumn="0" w:lastRow="0" w:noHBand="0" w:noVBand="1" w:val="04A0"/>
+        <w:tblInd w:w="120" w:type="dxa"/>
+        <w:tblBorders>
+          <w:top w:val="single" w:sz="6" w:color="B8C4D1"/>
+          <w:left w:val="single" w:sz="6" w:color="B8C4D1"/>
+          <w:bottom w:val="single" w:sz="6" w:color="B8C4D1"/>
+          <w:right w:val="single" w:sz="6" w:color="B8C4D1"/>
+          <w:insideH w:val="single" w:sz="6" w:color="B8C4D1"/>
+          <w:insideV w:val="single" w:sz="6" w:color="B8C4D1"/>
+        </w:tblBorders>
+      </w:tblPr>
+      <w:tblGrid>
+        <w:gridCol w:w="1650"/>
+        <w:gridCol w:w="4450"/>
+        <w:gridCol w:w="3260"/>
+      </w:tblGrid>
+      <w:tr>
+        <w:trPr>
+          <w:tblHeader w:val="true"/>
+          <w:cantSplit/>
+        </w:trPr>
+        <w:tc>
+          <w:tcPr>
+            <w:tcW w:type="dxa" w:w="1650"/>
+            <w:tcMar>
+              <w:top w:w="80" w:type="dxa"/>
+              <w:start w:w="120" w:type="dxa"/>
+              <w:bottom w:w="80" w:type="dxa"/>
+              <w:end w:w="120" w:type="dxa"/>
+            </w:tcMar>
+            <w:vAlign w:val="center"/>
+            <w:shd w:fill="E8EEF5"/>
+          </w:tcPr>
+          <w:p>
+            <w:pPr>
+              <w:spacing w:before="0" w:after="40" w:line="252" w:lineRule="auto"/>
+              <w:jc w:val="center"/>
+            </w:pPr>
+            <w:r>
+              <w:rPr>
+                <w:rFonts w:ascii="Calibri" w:hAnsi="Calibri"/>
+                <w:b/>
+                <w:color w:val="0B2545"/>
+                <w:sz w:val="17"/>
+              </w:rPr>
+              <w:t>Test</w:t>
+            </w:r>
+          </w:p>
+        </w:tc>
+        <w:tc>
+          <w:tcPr>
+            <w:tcW w:type="dxa" w:w="4450"/>
+            <w:tcMar>
+              <w:top w:w="80" w:type="dxa"/>
+              <w:start w:w="120" w:type="dxa"/>
+              <w:bottom w:w="80" w:type="dxa"/>
+              <w:end w:w="120" w:type="dxa"/>
+            </w:tcMar>
+            <w:vAlign w:val="center"/>
+            <w:shd w:fill="E8EEF5"/>
+          </w:tcPr>
+          <w:p>
+            <w:pPr>
+              <w:spacing w:before="0" w:after="40" w:line="252" w:lineRule="auto"/>
+              <w:jc w:val="left"/>
+            </w:pPr>
+            <w:r>
+              <w:rPr>
+                <w:rFonts w:ascii="Calibri" w:hAnsi="Calibri"/>
+                <w:b/>
+                <w:color w:val="0B2545"/>
+                <w:sz w:val="17"/>
+              </w:rPr>
+              <w:t>Objective</w:t>
+            </w:r>
+          </w:p>
+        </w:tc>
+        <w:tc>
+          <w:tcPr>
+            <w:tcW w:type="dxa" w:w="3260"/>
+            <w:tcMar>
+              <w:top w:w="80" w:type="dxa"/>
+              <w:start w:w="120" w:type="dxa"/>
+              <w:bottom w:w="80" w:type="dxa"/>
+              <w:end w:w="120" w:type="dxa"/>
+            </w:tcMar>
+            <w:vAlign w:val="center"/>
+            <w:shd w:fill="E8EEF5"/>
+          </w:tcPr>
+          <w:p>
+            <w:pPr>
+              <w:spacing w:before="0" w:after="40" w:line="252" w:lineRule="auto"/>
+              <w:jc w:val="left"/>
+            </w:pPr>
+            <w:r>
+              <w:rPr>
+                <w:rFonts w:ascii="Calibri" w:hAnsi="Calibri"/>
+                <w:b/>
+                <w:color w:val="0B2545"/>
+                <w:sz w:val="17"/>
+              </w:rPr>
+              <w:t>Level</w:t>
+            </w:r>
+          </w:p>
+        </w:tc>
+      </w:tr>
+      <w:tr>
+        <w:trPr>
+          <w:cantSplit/>
+        </w:trPr>
+        <w:tc>
+          <w:tcPr>
+            <w:tcW w:type="dxa" w:w="1650"/>
+            <w:tcMar>
+              <w:top w:w="80" w:type="dxa"/>
+              <w:start w:w="120" w:type="dxa"/>
+              <w:bottom w:w="80" w:type="dxa"/>
+              <w:end w:w="120" w:type="dxa"/>
+            </w:tcMar>
+            <w:vAlign w:val="center"/>
+            <w:shd w:fill="FFFFFF"/>
+          </w:tcPr>
+          <w:p>
+            <w:pPr>
+              <w:spacing w:before="0" w:after="40" w:line="252" w:lineRule="auto"/>
+              <w:jc w:val="center"/>
+            </w:pPr>
+            <w:r>
+              <w:rPr>
+                <w:rFonts w:ascii="Calibri" w:hAnsi="Calibri"/>
+                <w:b w:val="0"/>
+                <w:color w:val="111827"/>
+                <w:sz w:val="17"/>
+              </w:rPr>
+              <w:t>Region overlap</w:t>
+            </w:r>
+          </w:p>
+        </w:tc>
+        <w:tc>
+          <w:tcPr>
+            <w:tcW w:type="dxa" w:w="4450"/>
+            <w:tcMar>
+              <w:top w:w="80" w:type="dxa"/>
+              <w:start w:w="120" w:type="dxa"/>
+              <w:bottom w:w="80" w:type="dxa"/>
+              <w:end w:w="120" w:type="dxa"/>
+            </w:tcMar>
+            <w:vAlign w:val="center"/>
+            <w:shd w:fill="FFFFFF"/>
+          </w:tcPr>
+          <w:p>
+            <w:pPr>
+              <w:spacing w:before="0" w:after="40" w:line="252" w:lineRule="auto"/>
+              <w:jc w:val="left"/>
+            </w:pPr>
+            <w:r>
+              <w:rPr>
+                <w:rFonts w:ascii="Calibri" w:hAnsi="Calibri"/>
+                <w:b w:val="0"/>
+                <w:color w:val="111827"/>
+                <w:sz w:val="17"/>
+              </w:rPr>
+              <w:t>Reject ambiguous memory ownership.</w:t>
+            </w:r>
+          </w:p>
+        </w:tc>
+        <w:tc>
+          <w:tcPr>
+            <w:tcW w:type="dxa" w:w="3260"/>
+            <w:tcMar>
+              <w:top w:w="80" w:type="dxa"/>
+              <w:start w:w="120" w:type="dxa"/>
+              <w:bottom w:w="80" w:type="dxa"/>
+              <w:end w:w="120" w:type="dxa"/>
+            </w:tcMar>
+            <w:vAlign w:val="center"/>
+            <w:shd w:fill="FFFFFF"/>
+          </w:tcPr>
+          <w:p>
+            <w:pPr>
+              <w:spacing w:before="0" w:after="40" w:line="252" w:lineRule="auto"/>
+              <w:jc w:val="left"/>
+            </w:pPr>
+            <w:r>
+              <w:rPr>
+                <w:rFonts w:ascii="Calibri" w:hAnsi="Calibri"/>
+                <w:b w:val="0"/>
+                <w:color w:val="111827"/>
+                <w:sz w:val="17"/>
+              </w:rPr>
+              <w:t>Schema</w:t>
+            </w:r>
+          </w:p>
+        </w:tc>
+      </w:tr>
+      <w:tr>
+        <w:trPr>
+          <w:cantSplit/>
+        </w:trPr>
+        <w:tc>
+          <w:tcPr>
+            <w:tcW w:type="dxa" w:w="1650"/>
+            <w:tcMar>
+              <w:top w:w="80" w:type="dxa"/>
+              <w:start w:w="120" w:type="dxa"/>
+              <w:bottom w:w="80" w:type="dxa"/>
+              <w:end w:w="120" w:type="dxa"/>
+            </w:tcMar>
+            <w:vAlign w:val="center"/>
+            <w:shd w:fill="FFFFFF"/>
+          </w:tcPr>
+          <w:p>
+            <w:pPr>
+              <w:spacing w:before="0" w:after="40" w:line="252" w:lineRule="auto"/>
+              <w:jc w:val="center"/>
+            </w:pPr>
+            <w:r>
+              <w:rPr>
+                <w:rFonts w:ascii="Calibri" w:hAnsi="Calibri"/>
+                <w:b w:val="0"/>
+                <w:color w:val="111827"/>
+                <w:sz w:val="17"/>
+              </w:rPr>
+              <w:t>Unassigned cell</w:t>
+            </w:r>
+          </w:p>
+        </w:tc>
+        <w:tc>
+          <w:tcPr>
+            <w:tcW w:type="dxa" w:w="4450"/>
+            <w:tcMar>
+              <w:top w:w="80" w:type="dxa"/>
+              <w:start w:w="120" w:type="dxa"/>
+              <w:bottom w:w="80" w:type="dxa"/>
+              <w:end w:w="120" w:type="dxa"/>
+            </w:tcMar>
+            <w:vAlign w:val="center"/>
+            <w:shd w:fill="FFFFFF"/>
+          </w:tcPr>
+          <w:p>
+            <w:pPr>
+              <w:spacing w:before="0" w:after="40" w:line="252" w:lineRule="auto"/>
+              <w:jc w:val="left"/>
+            </w:pPr>
+            <w:r>
+              <w:rPr>
+                <w:rFonts w:ascii="Calibri" w:hAnsi="Calibri"/>
+                <w:b w:val="0"/>
+                <w:color w:val="111827"/>
+                <w:sz w:val="17"/>
+              </w:rPr>
+              <w:t>Require every initialized cell to belong to one region.</w:t>
+            </w:r>
+          </w:p>
+        </w:tc>
+        <w:tc>
+          <w:tcPr>
+            <w:tcW w:type="dxa" w:w="3260"/>
+            <w:tcMar>
+              <w:top w:w="80" w:type="dxa"/>
+              <w:start w:w="120" w:type="dxa"/>
+              <w:bottom w:w="80" w:type="dxa"/>
+              <w:end w:w="120" w:type="dxa"/>
+            </w:tcMar>
+            <w:vAlign w:val="center"/>
+            <w:shd w:fill="FFFFFF"/>
+          </w:tcPr>
+          <w:p>
+            <w:pPr>
+              <w:spacing w:before="0" w:after="40" w:line="252" w:lineRule="auto"/>
+              <w:jc w:val="left"/>
+            </w:pPr>
+            <w:r>
+              <w:rPr>
+                <w:rFonts w:ascii="Calibri" w:hAnsi="Calibri"/>
+                <w:b w:val="0"/>
+                <w:color w:val="111827"/>
+                <w:sz w:val="17"/>
+              </w:rPr>
+              <w:t>Schema</w:t>
+            </w:r>
+          </w:p>
+        </w:tc>
+      </w:tr>
+      <w:tr>
+        <w:trPr>
+          <w:cantSplit/>
+        </w:trPr>
+        <w:tc>
+          <w:tcPr>
+            <w:tcW w:type="dxa" w:w="1650"/>
+            <w:tcMar>
+              <w:top w:w="80" w:type="dxa"/>
+              <w:start w:w="120" w:type="dxa"/>
+              <w:bottom w:w="80" w:type="dxa"/>
+              <w:end w:w="120" w:type="dxa"/>
+            </w:tcMar>
+            <w:vAlign w:val="center"/>
+            <w:shd w:fill="FFFFFF"/>
+          </w:tcPr>
+          <w:p>
+            <w:pPr>
+              <w:spacing w:before="0" w:after="40" w:line="252" w:lineRule="auto"/>
+              <w:jc w:val="center"/>
+            </w:pPr>
+            <w:r>
+              <w:rPr>
+                <w:rFonts w:ascii="Calibri" w:hAnsi="Calibri"/>
+                <w:b w:val="0"/>
+                <w:color w:val="111827"/>
+                <w:sz w:val="17"/>
+              </w:rPr>
+              <w:t>Soft reset persistence</w:t>
+            </w:r>
+          </w:p>
+        </w:tc>
+        <w:tc>
+          <w:tcPr>
+            <w:tcW w:type="dxa" w:w="4450"/>
+            <w:tcMar>
+              <w:top w:w="80" w:type="dxa"/>
+              <w:start w:w="120" w:type="dxa"/>
+              <w:bottom w:w="80" w:type="dxa"/>
+              <w:end w:w="120" w:type="dxa"/>
+            </w:tcMar>
+            <w:vAlign w:val="center"/>
+            <w:shd w:fill="FFFFFF"/>
+          </w:tcPr>
+          <w:p>
+            <w:pPr>
+              <w:spacing w:before="0" w:after="40" w:line="252" w:lineRule="auto"/>
+              <w:jc w:val="left"/>
+            </w:pPr>
+            <w:r>
+              <w:rPr>
+                <w:rFonts w:ascii="Calibri" w:hAnsi="Calibri"/>
+                <w:b w:val="0"/>
+                <w:color w:val="111827"/>
+                <w:sz w:val="17"/>
+              </w:rPr>
+              <w:t>Preserve volatile and non-volatile cells.</w:t>
+            </w:r>
+          </w:p>
+        </w:tc>
+        <w:tc>
+          <w:tcPr>
+            <w:tcW w:type="dxa" w:w="3260"/>
+            <w:tcMar>
+              <w:top w:w="80" w:type="dxa"/>
+              <w:start w:w="120" w:type="dxa"/>
+              <w:bottom w:w="80" w:type="dxa"/>
+              <w:end w:w="120" w:type="dxa"/>
+            </w:tcMar>
+            <w:vAlign w:val="center"/>
+            <w:shd w:fill="FFFFFF"/>
+          </w:tcPr>
+          <w:p>
+            <w:pPr>
+              <w:spacing w:before="0" w:after="40" w:line="252" w:lineRule="auto"/>
+              <w:jc w:val="left"/>
+            </w:pPr>
+            <w:r>
+              <w:rPr>
+                <w:rFonts w:ascii="Calibri" w:hAnsi="Calibri"/>
+                <w:b w:val="0"/>
+                <w:color w:val="111827"/>
+                <w:sz w:val="17"/>
+              </w:rPr>
+              <w:t>Service</w:t>
+            </w:r>
+          </w:p>
+        </w:tc>
+      </w:tr>
+      <w:tr>
+        <w:trPr>
+          <w:cantSplit/>
+        </w:trPr>
+        <w:tc>
+          <w:tcPr>
+            <w:tcW w:type="dxa" w:w="1650"/>
+            <w:tcMar>
+              <w:top w:w="80" w:type="dxa"/>
+              <w:start w:w="120" w:type="dxa"/>
+              <w:bottom w:w="80" w:type="dxa"/>
+              <w:end w:w="120" w:type="dxa"/>
+            </w:tcMar>
+            <w:vAlign w:val="center"/>
+            <w:shd w:fill="FFFFFF"/>
+          </w:tcPr>
+          <w:p>
+            <w:pPr>
+              <w:spacing w:before="0" w:after="40" w:line="252" w:lineRule="auto"/>
+              <w:jc w:val="center"/>
+            </w:pPr>
+            <w:r>
+              <w:rPr>
+                <w:rFonts w:ascii="Calibri" w:hAnsi="Calibri"/>
+                <w:b w:val="0"/>
+                <w:color w:val="111827"/>
+                <w:sz w:val="17"/>
+              </w:rPr>
+              <w:t>Hard reset persistence</w:t>
+            </w:r>
+          </w:p>
+        </w:tc>
+        <w:tc>
+          <w:tcPr>
+            <w:tcW w:type="dxa" w:w="4450"/>
+            <w:tcMar>
+              <w:top w:w="80" w:type="dxa"/>
+              <w:start w:w="120" w:type="dxa"/>
+              <w:bottom w:w="80" w:type="dxa"/>
+              <w:end w:w="120" w:type="dxa"/>
+            </w:tcMar>
+            <w:vAlign w:val="center"/>
+            <w:shd w:fill="FFFFFF"/>
+          </w:tcPr>
+          <w:p>
+            <w:pPr>
+              <w:spacing w:before="0" w:after="40" w:line="252" w:lineRule="auto"/>
+              <w:jc w:val="left"/>
+            </w:pPr>
+            <w:r>
+              <w:rPr>
+                <w:rFonts w:ascii="Calibri" w:hAnsi="Calibri"/>
+                <w:b w:val="0"/>
+                <w:color w:val="111827"/>
+                <w:sz w:val="17"/>
+              </w:rPr>
+              <w:t>Reset volatile cells and preserve non-volatile cells.</w:t>
+            </w:r>
+          </w:p>
+        </w:tc>
+        <w:tc>
+          <w:tcPr>
+            <w:tcW w:type="dxa" w:w="3260"/>
+            <w:tcMar>
+              <w:top w:w="80" w:type="dxa"/>
+              <w:start w:w="120" w:type="dxa"/>
+              <w:bottom w:w="80" w:type="dxa"/>
+              <w:end w:w="120" w:type="dxa"/>
+            </w:tcMar>
+            <w:vAlign w:val="center"/>
+            <w:shd w:fill="FFFFFF"/>
+          </w:tcPr>
+          <w:p>
+            <w:pPr>
+              <w:spacing w:before="0" w:after="40" w:line="252" w:lineRule="auto"/>
+              <w:jc w:val="left"/>
+            </w:pPr>
+            <w:r>
+              <w:rPr>
+                <w:rFonts w:ascii="Calibri" w:hAnsi="Calibri"/>
+                <w:b w:val="0"/>
+                <w:color w:val="111827"/>
+                <w:sz w:val="17"/>
+              </w:rPr>
+              <w:t>Service</w:t>
+            </w:r>
+          </w:p>
+        </w:tc>
+      </w:tr>
+      <w:tr>
+        <w:trPr>
+          <w:cantSplit/>
+        </w:trPr>
+        <w:tc>
+          <w:tcPr>
+            <w:tcW w:type="dxa" w:w="1650"/>
+            <w:tcMar>
+              <w:top w:w="80" w:type="dxa"/>
+              <w:start w:w="120" w:type="dxa"/>
+              <w:bottom w:w="80" w:type="dxa"/>
+              <w:end w:w="120" w:type="dxa"/>
+            </w:tcMar>
+            <w:vAlign w:val="center"/>
+            <w:shd w:fill="FFFFFF"/>
+          </w:tcPr>
+          <w:p>
+            <w:pPr>
+              <w:spacing w:before="0" w:after="40" w:line="252" w:lineRule="auto"/>
+              <w:jc w:val="center"/>
+            </w:pPr>
+            <w:r>
+              <w:rPr>
+                <w:rFonts w:ascii="Calibri" w:hAnsi="Calibri"/>
+                <w:b w:val="0"/>
+                <w:color w:val="111827"/>
+                <w:sz w:val="17"/>
+              </w:rPr>
+              <w:t>Power-cycle persistence</w:t>
+            </w:r>
+          </w:p>
+        </w:tc>
+        <w:tc>
+          <w:tcPr>
+            <w:tcW w:type="dxa" w:w="4450"/>
+            <w:tcMar>
+              <w:top w:w="80" w:type="dxa"/>
+              <w:start w:w="120" w:type="dxa"/>
+              <w:bottom w:w="80" w:type="dxa"/>
+              <w:end w:w="120" w:type="dxa"/>
+            </w:tcMar>
+            <w:vAlign w:val="center"/>
+            <w:shd w:fill="FFFFFF"/>
+          </w:tcPr>
+          <w:p>
+            <w:pPr>
+              <w:spacing w:before="0" w:after="40" w:line="252" w:lineRule="auto"/>
+              <w:jc w:val="left"/>
+            </w:pPr>
+            <w:r>
+              <w:rPr>
+                <w:rFonts w:ascii="Calibri" w:hAnsi="Calibri"/>
+                <w:b w:val="0"/>
+                <w:color w:val="111827"/>
+                <w:sz w:val="17"/>
+              </w:rPr>
+              <w:t>Apply the same defined volatile-memory rule.</w:t>
+            </w:r>
+          </w:p>
+        </w:tc>
+        <w:tc>
+          <w:tcPr>
+            <w:tcW w:type="dxa" w:w="3260"/>
+            <w:tcMar>
+              <w:top w:w="80" w:type="dxa"/>
+              <w:start w:w="120" w:type="dxa"/>
+              <w:bottom w:w="80" w:type="dxa"/>
+              <w:end w:w="120" w:type="dxa"/>
+            </w:tcMar>
+            <w:vAlign w:val="center"/>
+            <w:shd w:fill="FFFFFF"/>
+          </w:tcPr>
+          <w:p>
+            <w:pPr>
+              <w:spacing w:before="0" w:after="40" w:line="252" w:lineRule="auto"/>
+              <w:jc w:val="left"/>
+            </w:pPr>
+            <w:r>
+              <w:rPr>
+                <w:rFonts w:ascii="Calibri" w:hAnsi="Calibri"/>
+                <w:b w:val="0"/>
+                <w:color w:val="111827"/>
+                <w:sz w:val="17"/>
+              </w:rPr>
+              <w:t>Service</w:t>
+            </w:r>
+          </w:p>
+        </w:tc>
+      </w:tr>
+      <w:tr>
+        <w:trPr>
+          <w:cantSplit/>
+        </w:trPr>
+        <w:tc>
+          <w:tcPr>
+            <w:tcW w:type="dxa" w:w="1650"/>
+            <w:tcMar>
+              <w:top w:w="80" w:type="dxa"/>
+              <w:start w:w="120" w:type="dxa"/>
+              <w:bottom w:w="80" w:type="dxa"/>
+              <w:end w:w="120" w:type="dxa"/>
+            </w:tcMar>
+            <w:vAlign w:val="center"/>
+            <w:shd w:fill="FFFFFF"/>
+          </w:tcPr>
+          <w:p>
+            <w:pPr>
+              <w:spacing w:before="0" w:after="40" w:line="252" w:lineRule="auto"/>
+              <w:jc w:val="center"/>
+            </w:pPr>
+            <w:r>
+              <w:rPr>
+                <w:rFonts w:ascii="Calibri" w:hAnsi="Calibri"/>
+                <w:b w:val="0"/>
+                <w:color w:val="111827"/>
+                <w:sz w:val="17"/>
+              </w:rPr>
+              <w:t>Snapshot checksum</w:t>
+            </w:r>
+          </w:p>
+        </w:tc>
+        <w:tc>
+          <w:tcPr>
+            <w:tcW w:type="dxa" w:w="4450"/>
+            <w:tcMar>
+              <w:top w:w="80" w:type="dxa"/>
+              <w:start w:w="120" w:type="dxa"/>
+              <w:bottom w:w="80" w:type="dxa"/>
+              <w:end w:w="120" w:type="dxa"/>
+            </w:tcMar>
+            <w:vAlign w:val="center"/>
+            <w:shd w:fill="FFFFFF"/>
+          </w:tcPr>
+          <w:p>
+            <w:pPr>
+              <w:spacing w:before="0" w:after="40" w:line="252" w:lineRule="auto"/>
+              <w:jc w:val="left"/>
+            </w:pPr>
+            <w:r>
+              <w:rPr>
+                <w:rFonts w:ascii="Calibri" w:hAnsi="Calibri"/>
+                <w:b w:val="0"/>
+                <w:color w:val="111827"/>
+                <w:sz w:val="17"/>
+              </w:rPr>
+              <w:t>Produce the same checksum for canonical memory content.</w:t>
+            </w:r>
+          </w:p>
+        </w:tc>
+        <w:tc>
+          <w:tcPr>
+            <w:tcW w:type="dxa" w:w="3260"/>
+            <w:tcMar>
+              <w:top w:w="80" w:type="dxa"/>
+              <w:start w:w="120" w:type="dxa"/>
+              <w:bottom w:w="80" w:type="dxa"/>
+              <w:end w:w="120" w:type="dxa"/>
+            </w:tcMar>
+            <w:vAlign w:val="center"/>
+            <w:shd w:fill="FFFFFF"/>
+          </w:tcPr>
+          <w:p>
+            <w:pPr>
+              <w:spacing w:before="0" w:after="40" w:line="252" w:lineRule="auto"/>
+              <w:jc w:val="left"/>
+            </w:pPr>
+            <w:r>
+              <w:rPr>
+                <w:rFonts w:ascii="Calibri" w:hAnsi="Calibri"/>
+                <w:b w:val="0"/>
+                <w:color w:val="111827"/>
+                <w:sz w:val="17"/>
+              </w:rPr>
+              <w:t>Service</w:t>
+            </w:r>
+          </w:p>
+        </w:tc>
+      </w:tr>
+      <w:tr>
+        <w:trPr>
+          <w:cantSplit/>
+        </w:trPr>
+        <w:tc>
+          <w:tcPr>
+            <w:tcW w:type="dxa" w:w="1650"/>
+            <w:tcMar>
+              <w:top w:w="80" w:type="dxa"/>
+              <w:start w:w="120" w:type="dxa"/>
+              <w:bottom w:w="80" w:type="dxa"/>
+              <w:end w:w="120" w:type="dxa"/>
+            </w:tcMar>
+            <w:vAlign w:val="center"/>
+            <w:shd w:fill="FFFFFF"/>
+          </w:tcPr>
+          <w:p>
+            <w:pPr>
+              <w:spacing w:before="0" w:after="40" w:line="252" w:lineRule="auto"/>
+              <w:jc w:val="center"/>
+            </w:pPr>
+            <w:r>
+              <w:rPr>
+                <w:rFonts w:ascii="Calibri" w:hAnsi="Calibri"/>
+                <w:b w:val="0"/>
+                <w:color w:val="111827"/>
+                <w:sz w:val="17"/>
+              </w:rPr>
+              <w:t>Snapshot restore conflict</w:t>
+            </w:r>
+          </w:p>
+        </w:tc>
+        <w:tc>
+          <w:tcPr>
+            <w:tcW w:type="dxa" w:w="4450"/>
+            <w:tcMar>
+              <w:top w:w="80" w:type="dxa"/>
+              <w:start w:w="120" w:type="dxa"/>
+              <w:bottom w:w="80" w:type="dxa"/>
+              <w:end w:w="120" w:type="dxa"/>
+            </w:tcMar>
+            <w:vAlign w:val="center"/>
+            <w:shd w:fill="FFFFFF"/>
+          </w:tcPr>
+          <w:p>
+            <w:pPr>
+              <w:spacing w:before="0" w:after="40" w:line="252" w:lineRule="auto"/>
+              <w:jc w:val="left"/>
+            </w:pPr>
+            <w:r>
+              <w:rPr>
+                <w:rFonts w:ascii="Calibri" w:hAnsi="Calibri"/>
+                <w:b w:val="0"/>
+                <w:color w:val="111827"/>
+                <w:sz w:val="17"/>
+              </w:rPr>
+              <w:t>Reject stale expected versions.</w:t>
+            </w:r>
+          </w:p>
+        </w:tc>
+        <w:tc>
+          <w:tcPr>
+            <w:tcW w:type="dxa" w:w="3260"/>
+            <w:tcMar>
+              <w:top w:w="80" w:type="dxa"/>
+              <w:start w:w="120" w:type="dxa"/>
+              <w:bottom w:w="80" w:type="dxa"/>
+              <w:end w:w="120" w:type="dxa"/>
+            </w:tcMar>
+            <w:vAlign w:val="center"/>
+            <w:shd w:fill="FFFFFF"/>
+          </w:tcPr>
+          <w:p>
+            <w:pPr>
+              <w:spacing w:before="0" w:after="40" w:line="252" w:lineRule="auto"/>
+              <w:jc w:val="left"/>
+            </w:pPr>
+            <w:r>
+              <w:rPr>
+                <w:rFonts w:ascii="Calibri" w:hAnsi="Calibri"/>
+                <w:b w:val="0"/>
+                <w:color w:val="111827"/>
+                <w:sz w:val="17"/>
+              </w:rPr>
+              <w:t>Service/API</w:t>
+            </w:r>
+          </w:p>
+        </w:tc>
+      </w:tr>
+      <w:tr>
+        <w:trPr>
+          <w:cantSplit/>
+        </w:trPr>
+        <w:tc>
+          <w:tcPr>
+            <w:tcW w:type="dxa" w:w="1650"/>
+            <w:tcMar>
+              <w:top w:w="80" w:type="dxa"/>
+              <w:start w:w="120" w:type="dxa"/>
+              <w:bottom w:w="80" w:type="dxa"/>
+              <w:end w:w="120" w:type="dxa"/>
+            </w:tcMar>
+            <w:vAlign w:val="center"/>
+            <w:shd w:fill="FFFFFF"/>
+          </w:tcPr>
+          <w:p>
+            <w:pPr>
+              <w:spacing w:before="0" w:after="40" w:line="252" w:lineRule="auto"/>
+              <w:jc w:val="center"/>
+            </w:pPr>
+            <w:r>
+              <w:rPr>
+                <w:rFonts w:ascii="Calibri" w:hAnsi="Calibri"/>
+                <w:b w:val="0"/>
+                <w:color w:val="111827"/>
+                <w:sz w:val="17"/>
+              </w:rPr>
+              <w:t>Seeded corruption</w:t>
+            </w:r>
+          </w:p>
+        </w:tc>
+        <w:tc>
+          <w:tcPr>
+            <w:tcW w:type="dxa" w:w="4450"/>
+            <w:tcMar>
+              <w:top w:w="80" w:type="dxa"/>
+              <w:start w:w="120" w:type="dxa"/>
+              <w:bottom w:w="80" w:type="dxa"/>
+              <w:end w:w="120" w:type="dxa"/>
+            </w:tcMar>
+            <w:vAlign w:val="center"/>
+            <w:shd w:fill="FFFFFF"/>
+          </w:tcPr>
+          <w:p>
+            <w:pPr>
+              <w:spacing w:before="0" w:after="40" w:line="252" w:lineRule="auto"/>
+              <w:jc w:val="left"/>
+            </w:pPr>
+            <w:r>
+              <w:rPr>
+                <w:rFonts w:ascii="Calibri" w:hAnsi="Calibri"/>
+                <w:b w:val="0"/>
+                <w:color w:val="111827"/>
+                <w:sz w:val="17"/>
+              </w:rPr>
+              <w:t>Reproduce the same bit changes from the same state and seed.</w:t>
+            </w:r>
+          </w:p>
+        </w:tc>
+        <w:tc>
+          <w:tcPr>
+            <w:tcW w:type="dxa" w:w="3260"/>
+            <w:tcMar>
+              <w:top w:w="80" w:type="dxa"/>
+              <w:start w:w="120" w:type="dxa"/>
+              <w:bottom w:w="80" w:type="dxa"/>
+              <w:end w:w="120" w:type="dxa"/>
+            </w:tcMar>
+            <w:vAlign w:val="center"/>
+            <w:shd w:fill="FFFFFF"/>
+          </w:tcPr>
+          <w:p>
+            <w:pPr>
+              <w:spacing w:before="0" w:after="40" w:line="252" w:lineRule="auto"/>
+              <w:jc w:val="left"/>
+            </w:pPr>
+            <w:r>
+              <w:rPr>
+                <w:rFonts w:ascii="Calibri" w:hAnsi="Calibri"/>
+                <w:b w:val="0"/>
+                <w:color w:val="111827"/>
+                <w:sz w:val="17"/>
+              </w:rPr>
+              <w:t>Service</w:t>
+            </w:r>
+          </w:p>
+        </w:tc>
+      </w:tr>
+      <w:tr>
+        <w:trPr>
+          <w:cantSplit/>
+        </w:trPr>
+        <w:tc>
+          <w:tcPr>
+            <w:tcW w:type="dxa" w:w="1650"/>
+            <w:tcMar>
+              <w:top w:w="80" w:type="dxa"/>
+              <w:start w:w="120" w:type="dxa"/>
+              <w:bottom w:w="80" w:type="dxa"/>
+              <w:end w:w="120" w:type="dxa"/>
+            </w:tcMar>
+            <w:vAlign w:val="center"/>
+            <w:shd w:fill="FFFFFF"/>
+          </w:tcPr>
+          <w:p>
+            <w:pPr>
+              <w:spacing w:before="0" w:after="40" w:line="252" w:lineRule="auto"/>
+              <w:jc w:val="center"/>
+            </w:pPr>
+            <w:r>
+              <w:rPr>
+                <w:rFonts w:ascii="Calibri" w:hAnsi="Calibri"/>
+                <w:b w:val="0"/>
+                <w:color w:val="111827"/>
+                <w:sz w:val="17"/>
+              </w:rPr>
+              <w:t>Corruption replay</w:t>
+            </w:r>
+          </w:p>
+        </w:tc>
+        <w:tc>
+          <w:tcPr>
+            <w:tcW w:type="dxa" w:w="4450"/>
+            <w:tcMar>
+              <w:top w:w="80" w:type="dxa"/>
+              <w:start w:w="120" w:type="dxa"/>
+              <w:bottom w:w="80" w:type="dxa"/>
+              <w:end w:w="120" w:type="dxa"/>
+            </w:tcMar>
+            <w:vAlign w:val="center"/>
+            <w:shd w:fill="FFFFFF"/>
+          </w:tcPr>
+          <w:p>
+            <w:pPr>
+              <w:spacing w:before="0" w:after="40" w:line="252" w:lineRule="auto"/>
+              <w:jc w:val="left"/>
+            </w:pPr>
+            <w:r>
+              <w:rPr>
+                <w:rFonts w:ascii="Calibri" w:hAnsi="Calibri"/>
+                <w:b w:val="0"/>
+                <w:color w:val="111827"/>
+                <w:sz w:val="17"/>
+              </w:rPr>
+              <w:t>Avoid applying an exact command twice.</w:t>
+            </w:r>
+          </w:p>
+        </w:tc>
+        <w:tc>
+          <w:tcPr>
+            <w:tcW w:type="dxa" w:w="3260"/>
+            <w:tcMar>
+              <w:top w:w="80" w:type="dxa"/>
+              <w:start w:w="120" w:type="dxa"/>
+              <w:bottom w:w="80" w:type="dxa"/>
+              <w:end w:w="120" w:type="dxa"/>
+            </w:tcMar>
+            <w:vAlign w:val="center"/>
+            <w:shd w:fill="FFFFFF"/>
+          </w:tcPr>
+          <w:p>
+            <w:pPr>
+              <w:spacing w:before="0" w:after="40" w:line="252" w:lineRule="auto"/>
+              <w:jc w:val="left"/>
+            </w:pPr>
+            <w:r>
+              <w:rPr>
+                <w:rFonts w:ascii="Calibri" w:hAnsi="Calibri"/>
+                <w:b w:val="0"/>
+                <w:color w:val="111827"/>
+                <w:sz w:val="17"/>
+              </w:rPr>
+              <w:t>Service</w:t>
+            </w:r>
+          </w:p>
+        </w:tc>
+      </w:tr>
+      <w:tr>
+        <w:trPr>
+          <w:cantSplit/>
+        </w:trPr>
+        <w:tc>
+          <w:tcPr>
+            <w:tcW w:type="dxa" w:w="1650"/>
+            <w:tcMar>
+              <w:top w:w="80" w:type="dxa"/>
+              <w:start w:w="120" w:type="dxa"/>
+              <w:bottom w:w="80" w:type="dxa"/>
+              <w:end w:w="120" w:type="dxa"/>
+            </w:tcMar>
+            <w:vAlign w:val="center"/>
+            <w:shd w:fill="FFFFFF"/>
+          </w:tcPr>
+          <w:p>
+            <w:pPr>
+              <w:spacing w:before="0" w:after="40" w:line="252" w:lineRule="auto"/>
+              <w:jc w:val="center"/>
+            </w:pPr>
+            <w:r>
+              <w:rPr>
+                <w:rFonts w:ascii="Calibri" w:hAnsi="Calibri"/>
+                <w:b w:val="0"/>
+                <w:color w:val="111827"/>
+                <w:sz w:val="17"/>
+              </w:rPr>
+              <w:t>Memory RBAC and OpenAPI</w:t>
+            </w:r>
+          </w:p>
+        </w:tc>
+        <w:tc>
+          <w:tcPr>
+            <w:tcW w:type="dxa" w:w="4450"/>
+            <w:tcMar>
+              <w:top w:w="80" w:type="dxa"/>
+              <w:start w:w="120" w:type="dxa"/>
+              <w:bottom w:w="80" w:type="dxa"/>
+              <w:end w:w="120" w:type="dxa"/>
+            </w:tcMar>
+            <w:vAlign w:val="center"/>
+            <w:shd w:fill="FFFFFF"/>
+          </w:tcPr>
+          <w:p>
+            <w:pPr>
+              <w:spacing w:before="0" w:after="40" w:line="252" w:lineRule="auto"/>
+              <w:jc w:val="left"/>
+            </w:pPr>
+            <w:r>
+              <w:rPr>
+                <w:rFonts w:ascii="Calibri" w:hAnsi="Calibri"/>
+                <w:b w:val="0"/>
+                <w:color w:val="111827"/>
+                <w:sz w:val="17"/>
+              </w:rPr>
+              <w:t>Publish protected, typed memory endpoints.</w:t>
+            </w:r>
+          </w:p>
+        </w:tc>
+        <w:tc>
+          <w:tcPr>
+            <w:tcW w:type="dxa" w:w="3260"/>
+            <w:tcMar>
+              <w:top w:w="80" w:type="dxa"/>
+              <w:start w:w="120" w:type="dxa"/>
+              <w:bottom w:w="80" w:type="dxa"/>
+              <w:end w:w="120" w:type="dxa"/>
+            </w:tcMar>
+            <w:vAlign w:val="center"/>
+            <w:shd w:fill="FFFFFF"/>
+          </w:tcPr>
+          <w:p>
+            <w:pPr>
+              <w:spacing w:before="0" w:after="40" w:line="252" w:lineRule="auto"/>
+              <w:jc w:val="left"/>
+            </w:pPr>
+            <w:r>
+              <w:rPr>
+                <w:rFonts w:ascii="Calibri" w:hAnsi="Calibri"/>
+                <w:b w:val="0"/>
+                <w:color w:val="111827"/>
+                <w:sz w:val="17"/>
+              </w:rPr>
+              <w:t>Contract/integration</w:t>
+            </w:r>
+          </w:p>
+        </w:tc>
+      </w:tr>
+    </w:tbl>
+    <w:p>
+      <w:pPr>
+        <w:spacing w:after="60"/>
+      </w:pPr>
+    </w:p>
+    <w:p>
+      <w:pPr>
+        <w:pStyle w:val="Heading1"/>
+        <w:keepNext/>
+        <w:keepLines/>
+      </w:pPr>
+      <w:r>
         <w:t>12. Implemented Evidence</w:t>
       </w:r>
     </w:p>
@@ -7293,6 +8880,22 @@
           <w:sz w:val="19"/>
         </w:rPr>
         <w:t>0020_ecu_behavior_profiles</w:t>
+      </w:r>
+      <w:r>
+        <w:rPr>
+          <w:rFonts w:ascii="Calibri" w:hAnsi="Calibri"/>
+          <w:color w:val="111827"/>
+          <w:sz w:val="22"/>
+        </w:rPr>
+        <w:t xml:space="preserve">, and </w:t>
+      </w:r>
+      <w:r>
+        <w:rPr>
+          <w:rFonts w:ascii="Consolas" w:hAnsi="Consolas"/>
+          <w:color w:val="1F4D78"/>
+          <w:sz w:val="19"/>
+        </w:rPr>
+        <w:t>0021_ecu_memory_regions</w:t>
       </w:r>
       <w:r>
         <w:rPr>
@@ -7464,6 +9067,23 @@
           <w:color w:val="111827"/>
           <w:sz w:val="22"/>
         </w:rPr>
+        <w:t>Memory events cover snapshot creation/restoration and deterministic corruption.</w:t>
+      </w:r>
+    </w:p>
+    <w:p>
+      <w:pPr>
+        <w:pStyle w:val="ListBullet"/>
+        <w:numPr>
+          <w:ilvl w:val="0"/>
+          <w:numId w:val="14"/>
+        </w:numPr>
+      </w:pPr>
+      <w:r>
+        <w:rPr>
+          <w:rFonts w:ascii="Calibri" w:hAnsi="Calibri"/>
+          <w:color w:val="111827"/>
+          <w:sz w:val="22"/>
+        </w:rPr>
         <w:t>Automated tests cover validation, atomic evidence, concurrency, idempotency, permissions, and API contracts.</w:t>
       </w:r>
     </w:p>
@@ -7552,7 +9172,7 @@
           <w:color w:val="111827"/>
           <w:sz w:val="22"/>
         </w:rPr>
-        <w:t>Memory persistence across reset is undefined until III-4.</w:t>
+        <w:t>Snapshot retention limits and deletion policy require an enterprise storage decision.</w:t>
       </w:r>
     </w:p>
     <w:p>
@@ -7589,7 +9209,7 @@
           <w:color w:val="111827"/>
           <w:sz w:val="22"/>
         </w:rPr>
-        <w:t xml:space="preserve">The next increment adds volatile and non-volatile memory regions, snapshots, reset persistence, and corruption injection. Later increments add fault lifecycle, CAN contracts, and multi-ECU scenarios. See </w:t>
+        <w:t xml:space="preserve">The next increment adds fault activation lifecycle, debouncing, latching, healing, and a future DTC bridge. Later increments add CAN contracts and multi-ECU scenarios. See </w:t>
       </w:r>
       <w:r>
         <w:rPr>
@@ -7683,7 +9303,7 @@
           <w:color w:val="111827"/>
           <w:sz w:val="22"/>
         </w:rPr>
-        <w:t>Design reset behavior for volatile and non-volatile memory without implementing it.</w:t>
+        <w:t>Compare the implemented reset behavior for volatile and non-volatile memory across all modes.</w:t>
       </w:r>
     </w:p>
     <w:p>
@@ -7734,7 +9354,7 @@
           <w:color w:val="111827"/>
           <w:sz w:val="22"/>
         </w:rPr>
-        <w:t>Explain why III-2 reset preserves memory and how III-4 can refine that contract safely.</w:t>
+        <w:t>Explain how III-4 safely supersedes the transitional III-2 memory-preservation rule.</w:t>
       </w:r>
     </w:p>
     <w:p>
@@ -7788,6 +9408,57 @@
         <w:t>Design a dedicated ADAS profile without adding camera or CAN dependencies to the registry.</w:t>
       </w:r>
     </w:p>
+    <w:p>
+      <w:pPr>
+        <w:pStyle w:val="ListNumber"/>
+        <w:numPr>
+          <w:ilvl w:val="0"/>
+          <w:numId w:val="17"/>
+        </w:numPr>
+      </w:pPr>
+      <w:r>
+        <w:rPr>
+          <w:rFonts w:ascii="Calibri" w:hAnsi="Calibri"/>
+          <w:color w:val="111827"/>
+          <w:sz w:val="22"/>
+        </w:rPr>
+        <w:t>Model RAM and EEPROM regions for a BMS ECU and predict each reset mode's result.</w:t>
+      </w:r>
+    </w:p>
+    <w:p>
+      <w:pPr>
+        <w:pStyle w:val="ListNumber"/>
+        <w:numPr>
+          <w:ilvl w:val="0"/>
+          <w:numId w:val="17"/>
+        </w:numPr>
+      </w:pPr>
+      <w:r>
+        <w:rPr>
+          <w:rFonts w:ascii="Calibri" w:hAnsi="Calibri"/>
+          <w:color w:val="111827"/>
+          <w:sz w:val="22"/>
+        </w:rPr>
+        <w:t>Explain why snapshot audits contain checksums and counts instead of the complete memory image.</w:t>
+      </w:r>
+    </w:p>
+    <w:p>
+      <w:pPr>
+        <w:pStyle w:val="ListNumber"/>
+        <w:numPr>
+          <w:ilvl w:val="0"/>
+          <w:numId w:val="17"/>
+        </w:numPr>
+      </w:pPr>
+      <w:r>
+        <w:rPr>
+          <w:rFonts w:ascii="Calibri" w:hAnsi="Calibri"/>
+          <w:color w:val="111827"/>
+          <w:sz w:val="22"/>
+        </w:rPr>
+        <w:t>Design a corruption campaign that remains reproducible across CI machines.</w:t>
+      </w:r>
+    </w:p>
     <w:sectPr>
       <w:headerReference w:type="default" r:id="rId9"/>
       <w:footerReference w:type="default" r:id="rId10"/>
@@ -7817,7 +9488,7 @@
         <w:color w:val="667085"/>
         <w:sz w:val="17"/>
       </w:rPr>
-      <w:t>ATEP Volume III Workbook  |  Version 0.3.0</w:t>
+      <w:t>ATEP Volume III Workbook  |  Version 0.4.0</w:t>
     </w:r>
     <w:r>
       <w:rPr>

</xml_diff>

<commit_message>
feat(ecus): add memory regions and snapshots (#53)
</commit_message>
<xml_diff>
--- a/docs/ATEP_Volume_III_ECU_Simulator_Engineering_Workbook.docx
+++ b/docs/ATEP_Volume_III_ECU_Simulator_Engineering_Workbook.docx
@@ -143,7 +143,7 @@
                 <w:color w:val="0B2545"/>
                 <w:sz w:val="19"/>
               </w:rPr>
-              <w:t>0.3.0</w:t>
+              <w:t>0.4.0</w:t>
             </w:r>
           </w:p>
         </w:tc>
@@ -265,7 +265,7 @@
                 <w:color w:val="111827"/>
                 <w:sz w:val="19"/>
               </w:rPr>
-              <w:t>Living document - Increments III-1 through III-3 implemented</w:t>
+              <w:t>Living document - Increments III-1 through III-4 implemented</w:t>
             </w:r>
           </w:p>
         </w:tc>
@@ -637,6 +637,25 @@
           <w:color w:val="0B2545"/>
           <w:sz w:val="21"/>
         </w:rPr>
+        <w:t>11.3 III-4 Verification</w:t>
+      </w:r>
+    </w:p>
+    <w:p>
+      <w:pPr>
+        <w:pStyle w:val="ListNumber"/>
+        <w:numPr>
+          <w:ilvl w:val="0"/>
+          <w:numId w:val="10"/>
+        </w:numPr>
+        <w:ind w:left="216" w:firstLine="0"/>
+      </w:pPr>
+      <w:r>
+        <w:rPr>
+          <w:rFonts w:ascii="Calibri" w:hAnsi="Calibri"/>
+          <w:b/>
+          <w:color w:val="0B2545"/>
+          <w:sz w:val="21"/>
+        </w:rPr>
         <w:t>12. Implemented Evidence</w:t>
       </w:r>
     </w:p>
@@ -931,7 +950,7 @@
                 <w:color w:val="111827"/>
                 <w:sz w:val="17"/>
               </w:rPr>
-              <w:t>Increments III-1 through III-3</w:t>
+              <w:t>Increments III-1 through III-4</w:t>
             </w:r>
           </w:p>
         </w:tc>
@@ -1513,6 +1532,95 @@
           </w:p>
         </w:tc>
       </w:tr>
+      <w:tr>
+        <w:trPr>
+          <w:cantSplit/>
+        </w:trPr>
+        <w:tc>
+          <w:tcPr>
+            <w:tcW w:type="dxa" w:w="1650"/>
+            <w:tcMar>
+              <w:top w:w="80" w:type="dxa"/>
+              <w:start w:w="120" w:type="dxa"/>
+              <w:bottom w:w="80" w:type="dxa"/>
+              <w:end w:w="120" w:type="dxa"/>
+            </w:tcMar>
+            <w:vAlign w:val="center"/>
+            <w:shd w:fill="FFFFFF"/>
+          </w:tcPr>
+          <w:p>
+            <w:pPr>
+              <w:spacing w:before="0" w:after="40" w:line="252" w:lineRule="auto"/>
+              <w:jc w:val="center"/>
+            </w:pPr>
+            <w:r>
+              <w:rPr>
+                <w:rFonts w:ascii="Calibri" w:hAnsi="Calibri"/>
+                <w:b w:val="0"/>
+                <w:color w:val="111827"/>
+                <w:sz w:val="17"/>
+              </w:rPr>
+              <w:t>0.4.0</w:t>
+            </w:r>
+          </w:p>
+        </w:tc>
+        <w:tc>
+          <w:tcPr>
+            <w:tcW w:type="dxa" w:w="4450"/>
+            <w:tcMar>
+              <w:top w:w="80" w:type="dxa"/>
+              <w:start w:w="120" w:type="dxa"/>
+              <w:bottom w:w="80" w:type="dxa"/>
+              <w:end w:w="120" w:type="dxa"/>
+            </w:tcMar>
+            <w:vAlign w:val="center"/>
+            <w:shd w:fill="FFFFFF"/>
+          </w:tcPr>
+          <w:p>
+            <w:pPr>
+              <w:spacing w:before="0" w:after="40" w:line="252" w:lineRule="auto"/>
+              <w:jc w:val="left"/>
+            </w:pPr>
+            <w:r>
+              <w:rPr>
+                <w:rFonts w:ascii="Calibri" w:hAnsi="Calibri"/>
+                <w:b w:val="0"/>
+                <w:color w:val="111827"/>
+                <w:sz w:val="17"/>
+              </w:rPr>
+              <w:t>2026-08-24</w:t>
+            </w:r>
+          </w:p>
+        </w:tc>
+        <w:tc>
+          <w:tcPr>
+            <w:tcW w:type="dxa" w:w="3260"/>
+            <w:tcMar>
+              <w:top w:w="80" w:type="dxa"/>
+              <w:start w:w="120" w:type="dxa"/>
+              <w:bottom w:w="80" w:type="dxa"/>
+              <w:end w:w="120" w:type="dxa"/>
+            </w:tcMar>
+            <w:vAlign w:val="center"/>
+            <w:shd w:fill="FFFFFF"/>
+          </w:tcPr>
+          <w:p>
+            <w:pPr>
+              <w:spacing w:before="0" w:after="40" w:line="252" w:lineRule="auto"/>
+              <w:jc w:val="left"/>
+            </w:pPr>
+            <w:r>
+              <w:rPr>
+                <w:rFonts w:ascii="Calibri" w:hAnsi="Calibri"/>
+                <w:b w:val="0"/>
+                <w:color w:val="111827"/>
+                <w:sz w:val="17"/>
+              </w:rPr>
+              <w:t>Added memory regions, reset persistence, snapshots, seeded corruption, APIs, migration, and tests.</w:t>
+            </w:r>
+          </w:p>
+        </w:tc>
+      </w:tr>
     </w:tbl>
     <w:p>
       <w:pPr>
@@ -1728,6 +1836,23 @@
     </w:p>
     <w:p>
       <w:pPr>
+        <w:pStyle w:val="ListBullet"/>
+        <w:numPr>
+          <w:ilvl w:val="0"/>
+          <w:numId w:val="11"/>
+        </w:numPr>
+      </w:pPr>
+      <w:r>
+        <w:rPr>
+          <w:rFonts w:ascii="Calibri" w:hAnsi="Calibri"/>
+          <w:color w:val="111827"/>
+          <w:sz w:val="22"/>
+        </w:rPr>
+        <w:t>Volatile/non-volatile regions, checksummed snapshots, and seeded corruption evidence.</w:t>
+      </w:r>
+    </w:p>
+    <w:p>
+      <w:pPr>
         <w:pStyle w:val="Heading2"/>
         <w:keepNext/>
         <w:keepLines/>
@@ -1801,7 +1926,7 @@
           <w:color w:val="111827"/>
           <w:sz w:val="22"/>
         </w:rPr>
-        <w:t>Persistent memory regions and reset persistence semantics.</w:t>
+        <w:t>Full binary firmware images and unrestricted memory dumps.</w:t>
       </w:r>
     </w:p>
     <w:p>
@@ -1996,7 +2121,7 @@
           <w:color w:val="111827"/>
           <w:sz w:val="22"/>
         </w:rPr>
-        <w:t xml:space="preserve">, cyclic tasks, profile version, behavior state, logical time, boot count, </w:t>
+        <w:t xml:space="preserve">, memory regions, cyclic tasks, profile version, behavior state, logical time, boot count, </w:t>
       </w:r>
       <w:r>
         <w:rPr>
@@ -3121,6 +3246,375 @@
           </w:p>
         </w:tc>
       </w:tr>
+      <w:tr>
+        <w:trPr>
+          <w:cantSplit/>
+        </w:trPr>
+        <w:tc>
+          <w:tcPr>
+            <w:tcW w:type="dxa" w:w="1150"/>
+            <w:tcMar>
+              <w:top w:w="80" w:type="dxa"/>
+              <w:start w:w="120" w:type="dxa"/>
+              <w:bottom w:w="80" w:type="dxa"/>
+              <w:end w:w="120" w:type="dxa"/>
+            </w:tcMar>
+            <w:vAlign w:val="center"/>
+            <w:shd w:fill="FFFFFF"/>
+          </w:tcPr>
+          <w:p>
+            <w:pPr>
+              <w:spacing w:before="0" w:after="40" w:line="252" w:lineRule="auto"/>
+              <w:jc w:val="center"/>
+            </w:pPr>
+            <w:r>
+              <w:rPr>
+                <w:rFonts w:ascii="Calibri" w:hAnsi="Calibri"/>
+                <w:b w:val="0"/>
+                <w:color w:val="111827"/>
+                <w:sz w:val="16"/>
+              </w:rPr>
+              <w:t>POST/GET</w:t>
+            </w:r>
+          </w:p>
+        </w:tc>
+        <w:tc>
+          <w:tcPr>
+            <w:tcW w:type="dxa" w:w="3700"/>
+            <w:tcMar>
+              <w:top w:w="80" w:type="dxa"/>
+              <w:start w:w="120" w:type="dxa"/>
+              <w:bottom w:w="80" w:type="dxa"/>
+              <w:end w:w="120" w:type="dxa"/>
+            </w:tcMar>
+            <w:vAlign w:val="center"/>
+            <w:shd w:fill="FFFFFF"/>
+          </w:tcPr>
+          <w:p>
+            <w:pPr>
+              <w:spacing w:before="0" w:after="40" w:line="252" w:lineRule="auto"/>
+              <w:jc w:val="left"/>
+            </w:pPr>
+            <w:r>
+              <w:rPr>
+                <w:rFonts w:ascii="Calibri" w:hAnsi="Calibri"/>
+                <w:b w:val="0"/>
+                <w:color w:val="111827"/>
+                <w:sz w:val="16"/>
+              </w:rPr>
+              <w:t>/api/v1/vehicles/{vehicle_id}/ecus/{ecu_id}/memory/snapshots</w:t>
+            </w:r>
+          </w:p>
+        </w:tc>
+        <w:tc>
+          <w:tcPr>
+            <w:tcW w:type="dxa" w:w="3100"/>
+            <w:tcMar>
+              <w:top w:w="80" w:type="dxa"/>
+              <w:start w:w="120" w:type="dxa"/>
+              <w:bottom w:w="80" w:type="dxa"/>
+              <w:end w:w="120" w:type="dxa"/>
+            </w:tcMar>
+            <w:vAlign w:val="center"/>
+            <w:shd w:fill="FFFFFF"/>
+          </w:tcPr>
+          <w:p>
+            <w:pPr>
+              <w:spacing w:before="0" w:after="40" w:line="252" w:lineRule="auto"/>
+              <w:jc w:val="left"/>
+            </w:pPr>
+            <w:r>
+              <w:rPr>
+                <w:rFonts w:ascii="Calibri" w:hAnsi="Calibri"/>
+                <w:b w:val="0"/>
+                <w:color w:val="111827"/>
+                <w:sz w:val="16"/>
+              </w:rPr>
+              <w:t>ecus:manage</w:t>
+            </w:r>
+            <w:r>
+              <w:rPr>
+                <w:rFonts w:ascii="Calibri" w:hAnsi="Calibri"/>
+                <w:b w:val="0"/>
+                <w:color w:val="111827"/>
+                <w:sz w:val="16"/>
+              </w:rPr>
+              <w:t xml:space="preserve"> / </w:t>
+            </w:r>
+            <w:r>
+              <w:rPr>
+                <w:rFonts w:ascii="Calibri" w:hAnsi="Calibri"/>
+                <w:b w:val="0"/>
+                <w:color w:val="111827"/>
+                <w:sz w:val="16"/>
+              </w:rPr>
+              <w:t>ecus:read</w:t>
+            </w:r>
+          </w:p>
+        </w:tc>
+        <w:tc>
+          <w:tcPr>
+            <w:tcW w:type="dxa" w:w="1410"/>
+            <w:tcMar>
+              <w:top w:w="80" w:type="dxa"/>
+              <w:start w:w="120" w:type="dxa"/>
+              <w:bottom w:w="80" w:type="dxa"/>
+              <w:end w:w="120" w:type="dxa"/>
+            </w:tcMar>
+            <w:vAlign w:val="center"/>
+            <w:shd w:fill="FFFFFF"/>
+          </w:tcPr>
+          <w:p>
+            <w:pPr>
+              <w:spacing w:before="0" w:after="40" w:line="252" w:lineRule="auto"/>
+              <w:jc w:val="left"/>
+            </w:pPr>
+            <w:r>
+              <w:rPr>
+                <w:rFonts w:ascii="Calibri" w:hAnsi="Calibri"/>
+                <w:b w:val="0"/>
+                <w:color w:val="111827"/>
+                <w:sz w:val="16"/>
+              </w:rPr>
+              <w:t>Create or list memory snapshots.</w:t>
+            </w:r>
+          </w:p>
+        </w:tc>
+      </w:tr>
+      <w:tr>
+        <w:trPr>
+          <w:cantSplit/>
+        </w:trPr>
+        <w:tc>
+          <w:tcPr>
+            <w:tcW w:type="dxa" w:w="1150"/>
+            <w:tcMar>
+              <w:top w:w="80" w:type="dxa"/>
+              <w:start w:w="120" w:type="dxa"/>
+              <w:bottom w:w="80" w:type="dxa"/>
+              <w:end w:w="120" w:type="dxa"/>
+            </w:tcMar>
+            <w:vAlign w:val="center"/>
+            <w:shd w:fill="FFFFFF"/>
+          </w:tcPr>
+          <w:p>
+            <w:pPr>
+              <w:spacing w:before="0" w:after="40" w:line="252" w:lineRule="auto"/>
+              <w:jc w:val="center"/>
+            </w:pPr>
+            <w:r>
+              <w:rPr>
+                <w:rFonts w:ascii="Calibri" w:hAnsi="Calibri"/>
+                <w:b w:val="0"/>
+                <w:color w:val="111827"/>
+                <w:sz w:val="16"/>
+              </w:rPr>
+              <w:t>POST</w:t>
+            </w:r>
+          </w:p>
+        </w:tc>
+        <w:tc>
+          <w:tcPr>
+            <w:tcW w:type="dxa" w:w="3700"/>
+            <w:tcMar>
+              <w:top w:w="80" w:type="dxa"/>
+              <w:start w:w="120" w:type="dxa"/>
+              <w:bottom w:w="80" w:type="dxa"/>
+              <w:end w:w="120" w:type="dxa"/>
+            </w:tcMar>
+            <w:vAlign w:val="center"/>
+            <w:shd w:fill="FFFFFF"/>
+          </w:tcPr>
+          <w:p>
+            <w:pPr>
+              <w:spacing w:before="0" w:after="40" w:line="252" w:lineRule="auto"/>
+              <w:jc w:val="left"/>
+            </w:pPr>
+            <w:r>
+              <w:rPr>
+                <w:rFonts w:ascii="Calibri" w:hAnsi="Calibri"/>
+                <w:b w:val="0"/>
+                <w:color w:val="111827"/>
+                <w:sz w:val="16"/>
+              </w:rPr>
+              <w:t>/api/v1/vehicles/{vehicle_id}/ecus/{ecu_id}/memory/snapshots/{snapshot_id}/restore</w:t>
+            </w:r>
+          </w:p>
+        </w:tc>
+        <w:tc>
+          <w:tcPr>
+            <w:tcW w:type="dxa" w:w="3100"/>
+            <w:tcMar>
+              <w:top w:w="80" w:type="dxa"/>
+              <w:start w:w="120" w:type="dxa"/>
+              <w:bottom w:w="80" w:type="dxa"/>
+              <w:end w:w="120" w:type="dxa"/>
+            </w:tcMar>
+            <w:vAlign w:val="center"/>
+            <w:shd w:fill="FFFFFF"/>
+          </w:tcPr>
+          <w:p>
+            <w:pPr>
+              <w:spacing w:before="0" w:after="40" w:line="252" w:lineRule="auto"/>
+              <w:jc w:val="left"/>
+            </w:pPr>
+            <w:r>
+              <w:rPr>
+                <w:rFonts w:ascii="Calibri" w:hAnsi="Calibri"/>
+                <w:b w:val="0"/>
+                <w:color w:val="111827"/>
+                <w:sz w:val="16"/>
+              </w:rPr>
+              <w:t>ecus:manage</w:t>
+            </w:r>
+          </w:p>
+        </w:tc>
+        <w:tc>
+          <w:tcPr>
+            <w:tcW w:type="dxa" w:w="1410"/>
+            <w:tcMar>
+              <w:top w:w="80" w:type="dxa"/>
+              <w:start w:w="120" w:type="dxa"/>
+              <w:bottom w:w="80" w:type="dxa"/>
+              <w:end w:w="120" w:type="dxa"/>
+            </w:tcMar>
+            <w:vAlign w:val="center"/>
+            <w:shd w:fill="FFFFFF"/>
+          </w:tcPr>
+          <w:p>
+            <w:pPr>
+              <w:spacing w:before="0" w:after="40" w:line="252" w:lineRule="auto"/>
+              <w:jc w:val="left"/>
+            </w:pPr>
+            <w:r>
+              <w:rPr>
+                <w:rFonts w:ascii="Calibri" w:hAnsi="Calibri"/>
+                <w:b w:val="0"/>
+                <w:color w:val="111827"/>
+                <w:sz w:val="16"/>
+              </w:rPr>
+              <w:t>Restore a versioned snapshot.</w:t>
+            </w:r>
+          </w:p>
+        </w:tc>
+      </w:tr>
+      <w:tr>
+        <w:trPr>
+          <w:cantSplit/>
+        </w:trPr>
+        <w:tc>
+          <w:tcPr>
+            <w:tcW w:type="dxa" w:w="1150"/>
+            <w:tcMar>
+              <w:top w:w="80" w:type="dxa"/>
+              <w:start w:w="120" w:type="dxa"/>
+              <w:bottom w:w="80" w:type="dxa"/>
+              <w:end w:w="120" w:type="dxa"/>
+            </w:tcMar>
+            <w:vAlign w:val="center"/>
+            <w:shd w:fill="FFFFFF"/>
+          </w:tcPr>
+          <w:p>
+            <w:pPr>
+              <w:spacing w:before="0" w:after="40" w:line="252" w:lineRule="auto"/>
+              <w:jc w:val="center"/>
+            </w:pPr>
+            <w:r>
+              <w:rPr>
+                <w:rFonts w:ascii="Calibri" w:hAnsi="Calibri"/>
+                <w:b w:val="0"/>
+                <w:color w:val="111827"/>
+                <w:sz w:val="16"/>
+              </w:rPr>
+              <w:t>POST</w:t>
+            </w:r>
+          </w:p>
+        </w:tc>
+        <w:tc>
+          <w:tcPr>
+            <w:tcW w:type="dxa" w:w="3700"/>
+            <w:tcMar>
+              <w:top w:w="80" w:type="dxa"/>
+              <w:start w:w="120" w:type="dxa"/>
+              <w:bottom w:w="80" w:type="dxa"/>
+              <w:end w:w="120" w:type="dxa"/>
+            </w:tcMar>
+            <w:vAlign w:val="center"/>
+            <w:shd w:fill="FFFFFF"/>
+          </w:tcPr>
+          <w:p>
+            <w:pPr>
+              <w:spacing w:before="0" w:after="40" w:line="252" w:lineRule="auto"/>
+              <w:jc w:val="left"/>
+            </w:pPr>
+            <w:r>
+              <w:rPr>
+                <w:rFonts w:ascii="Calibri" w:hAnsi="Calibri"/>
+                <w:b w:val="0"/>
+                <w:color w:val="111827"/>
+                <w:sz w:val="16"/>
+              </w:rPr>
+              <w:t>/api/v1/vehicles/{vehicle_id}/ecus/{ecu_id}/memory/corrupt</w:t>
+            </w:r>
+          </w:p>
+        </w:tc>
+        <w:tc>
+          <w:tcPr>
+            <w:tcW w:type="dxa" w:w="3100"/>
+            <w:tcMar>
+              <w:top w:w="80" w:type="dxa"/>
+              <w:start w:w="120" w:type="dxa"/>
+              <w:bottom w:w="80" w:type="dxa"/>
+              <w:end w:w="120" w:type="dxa"/>
+            </w:tcMar>
+            <w:vAlign w:val="center"/>
+            <w:shd w:fill="FFFFFF"/>
+          </w:tcPr>
+          <w:p>
+            <w:pPr>
+              <w:spacing w:before="0" w:after="40" w:line="252" w:lineRule="auto"/>
+              <w:jc w:val="left"/>
+            </w:pPr>
+            <w:r>
+              <w:rPr>
+                <w:rFonts w:ascii="Calibri" w:hAnsi="Calibri"/>
+                <w:b w:val="0"/>
+                <w:color w:val="111827"/>
+                <w:sz w:val="16"/>
+              </w:rPr>
+              <w:t>ecus:manage</w:t>
+            </w:r>
+          </w:p>
+        </w:tc>
+        <w:tc>
+          <w:tcPr>
+            <w:tcW w:type="dxa" w:w="1410"/>
+            <w:tcMar>
+              <w:top w:w="80" w:type="dxa"/>
+              <w:start w:w="120" w:type="dxa"/>
+              <w:bottom w:w="80" w:type="dxa"/>
+              <w:end w:w="120" w:type="dxa"/>
+            </w:tcMar>
+            <w:vAlign w:val="center"/>
+            <w:shd w:fill="FFFFFF"/>
+          </w:tcPr>
+          <w:p>
+            <w:pPr>
+              <w:spacing w:before="0" w:after="40" w:line="252" w:lineRule="auto"/>
+              <w:jc w:val="left"/>
+            </w:pPr>
+            <w:r>
+              <w:rPr>
+                <w:rFonts w:ascii="Calibri" w:hAnsi="Calibri"/>
+                <w:b w:val="0"/>
+                <w:color w:val="111827"/>
+                <w:sz w:val="16"/>
+              </w:rPr>
+              <w:t>Apply deterministic seeded bit flips.</w:t>
+            </w:r>
+          </w:p>
+        </w:tc>
+      </w:tr>
     </w:tbl>
     <w:p>
       <w:pPr>
@@ -3264,7 +3758,7 @@
           <w:color w:val="111827"/>
           <w:sz w:val="22"/>
         </w:rPr>
-        <w:t>Reset durations are fixed: soft 10 ms, hard 100 ms, and power cycle 500 ms. Reset increments the boot counter, advances logical time, and becomes offline unless a confirmed critical fault requires fault state. Memory and faults remain unchanged pending the III-4 memory-region model.</w:t>
+        <w:t>Reset durations are fixed: soft 10 ms, hard 100 ms, and power cycle 500 ms. Reset increments the boot counter, advances logical time, and becomes offline unless a confirmed critical fault requires fault state. Soft reset preserves memory; hard and power-cycle reset restore volatile cells to their region reset value while preserving non-volatile cells. Fault records remain unchanged.</w:t>
       </w:r>
     </w:p>
     <w:p>
@@ -3285,6 +3779,26 @@
           <w:sz w:val="22"/>
         </w:rPr>
         <w:t>The immutable registry defines a version, allowed task schedules, initial behavior state, and a state effect for every task. Creation applies defaults when callers omit them. State replacement rejects unknown task IDs, modified schedules, and unknown state keys. During logical-time advance, aggregated execution counts update integer counters once; no wall-clock or protocol adapter is used.</w:t>
+      </w:r>
+    </w:p>
+    <w:p>
+      <w:pPr>
+        <w:pStyle w:val="Heading2"/>
+        <w:keepNext/>
+        <w:keepLines/>
+      </w:pPr>
+      <w:r>
+        <w:t>8.3 Memory Persistence and Evidence</w:t>
+      </w:r>
+    </w:p>
+    <w:p>
+      <w:r>
+        <w:rPr>
+          <w:rFonts w:ascii="Calibri" w:hAnsi="Calibri"/>
+          <w:color w:val="111827"/>
+          <w:sz w:val="22"/>
+        </w:rPr>
+        <w:t>Regions are non-overlapping and every initialized sparse cell belongs to exactly one region. Soft reset preserves all cells; hard and power-cycle reset restore volatile cells to their region reset value while retaining non-volatile cells. Snapshots contain no more than 256 cells and use a canonical SHA-256 checksum. Audit records store checksum and counts rather than full memory images. Seeded corruption flips a bounded number of bits and persists command identity for exact replay.</w:t>
       </w:r>
     </w:p>
     <w:p>
@@ -3320,7 +3834,7 @@
           <w:color w:val="111827"/>
           <w:sz w:val="22"/>
         </w:rPr>
-        <w:t>. III-1 covers the aggregate, III-2 covers deterministic execution and reset, and III-3 covers versioned profiles and state transitions.</w:t>
+        <w:t>. III-1 covers the aggregate, III-2 covers deterministic execution and reset, III-3 covers versioned profiles, and III-4 covers memory regions, snapshots, persistence, and corruption.</w:t>
       </w:r>
     </w:p>
     <w:p>
@@ -3450,7 +3964,7 @@
           <w:color w:val="111827"/>
           <w:sz w:val="22"/>
         </w:rPr>
-        <w:t>Clearing state before defining volatile and non-volatile regions would invent behavior. III-2 records reset mode, duration, boot count, and preservation; III-4 will own persistence semantics.</w:t>
+        <w:t>Clearing state before defining volatile and non-volatile regions would invent behavior. III-2 therefore preserved all memory; III-4 supersedes that transitional rule with explicit, region-driven persistence semantics.</w:t>
       </w:r>
     </w:p>
     <w:p>
@@ -3471,6 +3985,62 @@
           <w:sz w:val="22"/>
         </w:rPr>
         <w:t>Profiles are source-controlled contracts rather than mutable database configuration. This makes tests reproducible and reviewable. CAN production, UDS diagnostics, and continuous physical models remain outside the profile registry and will integrate through later explicit boundaries.</w:t>
+      </w:r>
+    </w:p>
+    <w:p>
+      <w:pPr>
+        <w:pStyle w:val="Heading2"/>
+        <w:keepNext/>
+        <w:keepLines/>
+      </w:pPr>
+      <w:r>
+        <w:t>ADR-ECU-008 — Make Memory Persistence Region-Driven</w:t>
+      </w:r>
+    </w:p>
+    <w:p>
+      <w:r>
+        <w:rPr>
+          <w:rFonts w:ascii="Calibri" w:hAnsi="Calibri"/>
+          <w:color w:val="111827"/>
+          <w:sz w:val="22"/>
+        </w:rPr>
+        <w:t xml:space="preserve">Reset behavior follows explicit region kind rather than address conventions. This avoids hidden assumptions, preserves backward compatibility through </w:t>
+      </w:r>
+      <w:r>
+        <w:rPr>
+          <w:rFonts w:ascii="Consolas" w:hAnsi="Consolas"/>
+          <w:color w:val="1F4D78"/>
+          <w:sz w:val="19"/>
+        </w:rPr>
+        <w:t>legacy_nvm</w:t>
+      </w:r>
+      <w:r>
+        <w:rPr>
+          <w:rFonts w:ascii="Calibri" w:hAnsi="Calibri"/>
+          <w:color w:val="111827"/>
+          <w:sz w:val="22"/>
+        </w:rPr>
+        <w:t>, and makes volatile-state tests portable across ECU types.</w:t>
+      </w:r>
+    </w:p>
+    <w:p>
+      <w:pPr>
+        <w:pStyle w:val="Heading2"/>
+        <w:keepNext/>
+        <w:keepLines/>
+      </w:pPr>
+      <w:r>
+        <w:t>ADR-ECU-009 — Use Checksums and Seeds for Reproducible Memory Evidence</w:t>
+      </w:r>
+    </w:p>
+    <w:p>
+      <w:r>
+        <w:rPr>
+          <w:rFonts w:ascii="Calibri" w:hAnsi="Calibri"/>
+          <w:color w:val="111827"/>
+          <w:sz w:val="22"/>
+        </w:rPr>
+        <w:t>Canonical checksums identify snapshot content without copying complete memory into audit logs. An explicit corruption seed, bounded flip count, optimistic version, and persisted command ID make fault injection repeatable and retry-safe.</w:t>
       </w:r>
     </w:p>
     <w:p>
@@ -7208,6 +7778,1023 @@
         <w:keepLines/>
       </w:pPr>
       <w:r>
+        <w:t>11.3 III-4 Verification</w:t>
+      </w:r>
+    </w:p>
+    <w:tbl>
+      <w:tblPr>
+        <w:tblW w:type="dxa" w:w="9360"/>
+        <w:jc w:val="left"/>
+        <w:tblLayout w:type="fixed"/>
+        <w:tblLook w:firstColumn="1" w:firstRow="1" w:lastColumn="0" w:lastRow="0" w:noHBand="0" w:noVBand="1" w:val="04A0"/>
+        <w:tblInd w:w="120" w:type="dxa"/>
+        <w:tblBorders>
+          <w:top w:val="single" w:sz="6" w:color="B8C4D1"/>
+          <w:left w:val="single" w:sz="6" w:color="B8C4D1"/>
+          <w:bottom w:val="single" w:sz="6" w:color="B8C4D1"/>
+          <w:right w:val="single" w:sz="6" w:color="B8C4D1"/>
+          <w:insideH w:val="single" w:sz="6" w:color="B8C4D1"/>
+          <w:insideV w:val="single" w:sz="6" w:color="B8C4D1"/>
+        </w:tblBorders>
+      </w:tblPr>
+      <w:tblGrid>
+        <w:gridCol w:w="1650"/>
+        <w:gridCol w:w="4450"/>
+        <w:gridCol w:w="3260"/>
+      </w:tblGrid>
+      <w:tr>
+        <w:trPr>
+          <w:tblHeader w:val="true"/>
+          <w:cantSplit/>
+        </w:trPr>
+        <w:tc>
+          <w:tcPr>
+            <w:tcW w:type="dxa" w:w="1650"/>
+            <w:tcMar>
+              <w:top w:w="80" w:type="dxa"/>
+              <w:start w:w="120" w:type="dxa"/>
+              <w:bottom w:w="80" w:type="dxa"/>
+              <w:end w:w="120" w:type="dxa"/>
+            </w:tcMar>
+            <w:vAlign w:val="center"/>
+            <w:shd w:fill="E8EEF5"/>
+          </w:tcPr>
+          <w:p>
+            <w:pPr>
+              <w:spacing w:before="0" w:after="40" w:line="252" w:lineRule="auto"/>
+              <w:jc w:val="center"/>
+            </w:pPr>
+            <w:r>
+              <w:rPr>
+                <w:rFonts w:ascii="Calibri" w:hAnsi="Calibri"/>
+                <w:b/>
+                <w:color w:val="0B2545"/>
+                <w:sz w:val="17"/>
+              </w:rPr>
+              <w:t>Test</w:t>
+            </w:r>
+          </w:p>
+        </w:tc>
+        <w:tc>
+          <w:tcPr>
+            <w:tcW w:type="dxa" w:w="4450"/>
+            <w:tcMar>
+              <w:top w:w="80" w:type="dxa"/>
+              <w:start w:w="120" w:type="dxa"/>
+              <w:bottom w:w="80" w:type="dxa"/>
+              <w:end w:w="120" w:type="dxa"/>
+            </w:tcMar>
+            <w:vAlign w:val="center"/>
+            <w:shd w:fill="E8EEF5"/>
+          </w:tcPr>
+          <w:p>
+            <w:pPr>
+              <w:spacing w:before="0" w:after="40" w:line="252" w:lineRule="auto"/>
+              <w:jc w:val="left"/>
+            </w:pPr>
+            <w:r>
+              <w:rPr>
+                <w:rFonts w:ascii="Calibri" w:hAnsi="Calibri"/>
+                <w:b/>
+                <w:color w:val="0B2545"/>
+                <w:sz w:val="17"/>
+              </w:rPr>
+              <w:t>Objective</w:t>
+            </w:r>
+          </w:p>
+        </w:tc>
+        <w:tc>
+          <w:tcPr>
+            <w:tcW w:type="dxa" w:w="3260"/>
+            <w:tcMar>
+              <w:top w:w="80" w:type="dxa"/>
+              <w:start w:w="120" w:type="dxa"/>
+              <w:bottom w:w="80" w:type="dxa"/>
+              <w:end w:w="120" w:type="dxa"/>
+            </w:tcMar>
+            <w:vAlign w:val="center"/>
+            <w:shd w:fill="E8EEF5"/>
+          </w:tcPr>
+          <w:p>
+            <w:pPr>
+              <w:spacing w:before="0" w:after="40" w:line="252" w:lineRule="auto"/>
+              <w:jc w:val="left"/>
+            </w:pPr>
+            <w:r>
+              <w:rPr>
+                <w:rFonts w:ascii="Calibri" w:hAnsi="Calibri"/>
+                <w:b/>
+                <w:color w:val="0B2545"/>
+                <w:sz w:val="17"/>
+              </w:rPr>
+              <w:t>Level</w:t>
+            </w:r>
+          </w:p>
+        </w:tc>
+      </w:tr>
+      <w:tr>
+        <w:trPr>
+          <w:cantSplit/>
+        </w:trPr>
+        <w:tc>
+          <w:tcPr>
+            <w:tcW w:type="dxa" w:w="1650"/>
+            <w:tcMar>
+              <w:top w:w="80" w:type="dxa"/>
+              <w:start w:w="120" w:type="dxa"/>
+              <w:bottom w:w="80" w:type="dxa"/>
+              <w:end w:w="120" w:type="dxa"/>
+            </w:tcMar>
+            <w:vAlign w:val="center"/>
+            <w:shd w:fill="FFFFFF"/>
+          </w:tcPr>
+          <w:p>
+            <w:pPr>
+              <w:spacing w:before="0" w:after="40" w:line="252" w:lineRule="auto"/>
+              <w:jc w:val="center"/>
+            </w:pPr>
+            <w:r>
+              <w:rPr>
+                <w:rFonts w:ascii="Calibri" w:hAnsi="Calibri"/>
+                <w:b w:val="0"/>
+                <w:color w:val="111827"/>
+                <w:sz w:val="17"/>
+              </w:rPr>
+              <w:t>Region overlap</w:t>
+            </w:r>
+          </w:p>
+        </w:tc>
+        <w:tc>
+          <w:tcPr>
+            <w:tcW w:type="dxa" w:w="4450"/>
+            <w:tcMar>
+              <w:top w:w="80" w:type="dxa"/>
+              <w:start w:w="120" w:type="dxa"/>
+              <w:bottom w:w="80" w:type="dxa"/>
+              <w:end w:w="120" w:type="dxa"/>
+            </w:tcMar>
+            <w:vAlign w:val="center"/>
+            <w:shd w:fill="FFFFFF"/>
+          </w:tcPr>
+          <w:p>
+            <w:pPr>
+              <w:spacing w:before="0" w:after="40" w:line="252" w:lineRule="auto"/>
+              <w:jc w:val="left"/>
+            </w:pPr>
+            <w:r>
+              <w:rPr>
+                <w:rFonts w:ascii="Calibri" w:hAnsi="Calibri"/>
+                <w:b w:val="0"/>
+                <w:color w:val="111827"/>
+                <w:sz w:val="17"/>
+              </w:rPr>
+              <w:t>Reject ambiguous memory ownership.</w:t>
+            </w:r>
+          </w:p>
+        </w:tc>
+        <w:tc>
+          <w:tcPr>
+            <w:tcW w:type="dxa" w:w="3260"/>
+            <w:tcMar>
+              <w:top w:w="80" w:type="dxa"/>
+              <w:start w:w="120" w:type="dxa"/>
+              <w:bottom w:w="80" w:type="dxa"/>
+              <w:end w:w="120" w:type="dxa"/>
+            </w:tcMar>
+            <w:vAlign w:val="center"/>
+            <w:shd w:fill="FFFFFF"/>
+          </w:tcPr>
+          <w:p>
+            <w:pPr>
+              <w:spacing w:before="0" w:after="40" w:line="252" w:lineRule="auto"/>
+              <w:jc w:val="left"/>
+            </w:pPr>
+            <w:r>
+              <w:rPr>
+                <w:rFonts w:ascii="Calibri" w:hAnsi="Calibri"/>
+                <w:b w:val="0"/>
+                <w:color w:val="111827"/>
+                <w:sz w:val="17"/>
+              </w:rPr>
+              <w:t>Schema</w:t>
+            </w:r>
+          </w:p>
+        </w:tc>
+      </w:tr>
+      <w:tr>
+        <w:trPr>
+          <w:cantSplit/>
+        </w:trPr>
+        <w:tc>
+          <w:tcPr>
+            <w:tcW w:type="dxa" w:w="1650"/>
+            <w:tcMar>
+              <w:top w:w="80" w:type="dxa"/>
+              <w:start w:w="120" w:type="dxa"/>
+              <w:bottom w:w="80" w:type="dxa"/>
+              <w:end w:w="120" w:type="dxa"/>
+            </w:tcMar>
+            <w:vAlign w:val="center"/>
+            <w:shd w:fill="FFFFFF"/>
+          </w:tcPr>
+          <w:p>
+            <w:pPr>
+              <w:spacing w:before="0" w:after="40" w:line="252" w:lineRule="auto"/>
+              <w:jc w:val="center"/>
+            </w:pPr>
+            <w:r>
+              <w:rPr>
+                <w:rFonts w:ascii="Calibri" w:hAnsi="Calibri"/>
+                <w:b w:val="0"/>
+                <w:color w:val="111827"/>
+                <w:sz w:val="17"/>
+              </w:rPr>
+              <w:t>Unassigned cell</w:t>
+            </w:r>
+          </w:p>
+        </w:tc>
+        <w:tc>
+          <w:tcPr>
+            <w:tcW w:type="dxa" w:w="4450"/>
+            <w:tcMar>
+              <w:top w:w="80" w:type="dxa"/>
+              <w:start w:w="120" w:type="dxa"/>
+              <w:bottom w:w="80" w:type="dxa"/>
+              <w:end w:w="120" w:type="dxa"/>
+            </w:tcMar>
+            <w:vAlign w:val="center"/>
+            <w:shd w:fill="FFFFFF"/>
+          </w:tcPr>
+          <w:p>
+            <w:pPr>
+              <w:spacing w:before="0" w:after="40" w:line="252" w:lineRule="auto"/>
+              <w:jc w:val="left"/>
+            </w:pPr>
+            <w:r>
+              <w:rPr>
+                <w:rFonts w:ascii="Calibri" w:hAnsi="Calibri"/>
+                <w:b w:val="0"/>
+                <w:color w:val="111827"/>
+                <w:sz w:val="17"/>
+              </w:rPr>
+              <w:t>Require every initialized cell to belong to one region.</w:t>
+            </w:r>
+          </w:p>
+        </w:tc>
+        <w:tc>
+          <w:tcPr>
+            <w:tcW w:type="dxa" w:w="3260"/>
+            <w:tcMar>
+              <w:top w:w="80" w:type="dxa"/>
+              <w:start w:w="120" w:type="dxa"/>
+              <w:bottom w:w="80" w:type="dxa"/>
+              <w:end w:w="120" w:type="dxa"/>
+            </w:tcMar>
+            <w:vAlign w:val="center"/>
+            <w:shd w:fill="FFFFFF"/>
+          </w:tcPr>
+          <w:p>
+            <w:pPr>
+              <w:spacing w:before="0" w:after="40" w:line="252" w:lineRule="auto"/>
+              <w:jc w:val="left"/>
+            </w:pPr>
+            <w:r>
+              <w:rPr>
+                <w:rFonts w:ascii="Calibri" w:hAnsi="Calibri"/>
+                <w:b w:val="0"/>
+                <w:color w:val="111827"/>
+                <w:sz w:val="17"/>
+              </w:rPr>
+              <w:t>Schema</w:t>
+            </w:r>
+          </w:p>
+        </w:tc>
+      </w:tr>
+      <w:tr>
+        <w:trPr>
+          <w:cantSplit/>
+        </w:trPr>
+        <w:tc>
+          <w:tcPr>
+            <w:tcW w:type="dxa" w:w="1650"/>
+            <w:tcMar>
+              <w:top w:w="80" w:type="dxa"/>
+              <w:start w:w="120" w:type="dxa"/>
+              <w:bottom w:w="80" w:type="dxa"/>
+              <w:end w:w="120" w:type="dxa"/>
+            </w:tcMar>
+            <w:vAlign w:val="center"/>
+            <w:shd w:fill="FFFFFF"/>
+          </w:tcPr>
+          <w:p>
+            <w:pPr>
+              <w:spacing w:before="0" w:after="40" w:line="252" w:lineRule="auto"/>
+              <w:jc w:val="center"/>
+            </w:pPr>
+            <w:r>
+              <w:rPr>
+                <w:rFonts w:ascii="Calibri" w:hAnsi="Calibri"/>
+                <w:b w:val="0"/>
+                <w:color w:val="111827"/>
+                <w:sz w:val="17"/>
+              </w:rPr>
+              <w:t>Soft reset persistence</w:t>
+            </w:r>
+          </w:p>
+        </w:tc>
+        <w:tc>
+          <w:tcPr>
+            <w:tcW w:type="dxa" w:w="4450"/>
+            <w:tcMar>
+              <w:top w:w="80" w:type="dxa"/>
+              <w:start w:w="120" w:type="dxa"/>
+              <w:bottom w:w="80" w:type="dxa"/>
+              <w:end w:w="120" w:type="dxa"/>
+            </w:tcMar>
+            <w:vAlign w:val="center"/>
+            <w:shd w:fill="FFFFFF"/>
+          </w:tcPr>
+          <w:p>
+            <w:pPr>
+              <w:spacing w:before="0" w:after="40" w:line="252" w:lineRule="auto"/>
+              <w:jc w:val="left"/>
+            </w:pPr>
+            <w:r>
+              <w:rPr>
+                <w:rFonts w:ascii="Calibri" w:hAnsi="Calibri"/>
+                <w:b w:val="0"/>
+                <w:color w:val="111827"/>
+                <w:sz w:val="17"/>
+              </w:rPr>
+              <w:t>Preserve volatile and non-volatile cells.</w:t>
+            </w:r>
+          </w:p>
+        </w:tc>
+        <w:tc>
+          <w:tcPr>
+            <w:tcW w:type="dxa" w:w="3260"/>
+            <w:tcMar>
+              <w:top w:w="80" w:type="dxa"/>
+              <w:start w:w="120" w:type="dxa"/>
+              <w:bottom w:w="80" w:type="dxa"/>
+              <w:end w:w="120" w:type="dxa"/>
+            </w:tcMar>
+            <w:vAlign w:val="center"/>
+            <w:shd w:fill="FFFFFF"/>
+          </w:tcPr>
+          <w:p>
+            <w:pPr>
+              <w:spacing w:before="0" w:after="40" w:line="252" w:lineRule="auto"/>
+              <w:jc w:val="left"/>
+            </w:pPr>
+            <w:r>
+              <w:rPr>
+                <w:rFonts w:ascii="Calibri" w:hAnsi="Calibri"/>
+                <w:b w:val="0"/>
+                <w:color w:val="111827"/>
+                <w:sz w:val="17"/>
+              </w:rPr>
+              <w:t>Service</w:t>
+            </w:r>
+          </w:p>
+        </w:tc>
+      </w:tr>
+      <w:tr>
+        <w:trPr>
+          <w:cantSplit/>
+        </w:trPr>
+        <w:tc>
+          <w:tcPr>
+            <w:tcW w:type="dxa" w:w="1650"/>
+            <w:tcMar>
+              <w:top w:w="80" w:type="dxa"/>
+              <w:start w:w="120" w:type="dxa"/>
+              <w:bottom w:w="80" w:type="dxa"/>
+              <w:end w:w="120" w:type="dxa"/>
+            </w:tcMar>
+            <w:vAlign w:val="center"/>
+            <w:shd w:fill="FFFFFF"/>
+          </w:tcPr>
+          <w:p>
+            <w:pPr>
+              <w:spacing w:before="0" w:after="40" w:line="252" w:lineRule="auto"/>
+              <w:jc w:val="center"/>
+            </w:pPr>
+            <w:r>
+              <w:rPr>
+                <w:rFonts w:ascii="Calibri" w:hAnsi="Calibri"/>
+                <w:b w:val="0"/>
+                <w:color w:val="111827"/>
+                <w:sz w:val="17"/>
+              </w:rPr>
+              <w:t>Hard reset persistence</w:t>
+            </w:r>
+          </w:p>
+        </w:tc>
+        <w:tc>
+          <w:tcPr>
+            <w:tcW w:type="dxa" w:w="4450"/>
+            <w:tcMar>
+              <w:top w:w="80" w:type="dxa"/>
+              <w:start w:w="120" w:type="dxa"/>
+              <w:bottom w:w="80" w:type="dxa"/>
+              <w:end w:w="120" w:type="dxa"/>
+            </w:tcMar>
+            <w:vAlign w:val="center"/>
+            <w:shd w:fill="FFFFFF"/>
+          </w:tcPr>
+          <w:p>
+            <w:pPr>
+              <w:spacing w:before="0" w:after="40" w:line="252" w:lineRule="auto"/>
+              <w:jc w:val="left"/>
+            </w:pPr>
+            <w:r>
+              <w:rPr>
+                <w:rFonts w:ascii="Calibri" w:hAnsi="Calibri"/>
+                <w:b w:val="0"/>
+                <w:color w:val="111827"/>
+                <w:sz w:val="17"/>
+              </w:rPr>
+              <w:t>Reset volatile cells and preserve non-volatile cells.</w:t>
+            </w:r>
+          </w:p>
+        </w:tc>
+        <w:tc>
+          <w:tcPr>
+            <w:tcW w:type="dxa" w:w="3260"/>
+            <w:tcMar>
+              <w:top w:w="80" w:type="dxa"/>
+              <w:start w:w="120" w:type="dxa"/>
+              <w:bottom w:w="80" w:type="dxa"/>
+              <w:end w:w="120" w:type="dxa"/>
+            </w:tcMar>
+            <w:vAlign w:val="center"/>
+            <w:shd w:fill="FFFFFF"/>
+          </w:tcPr>
+          <w:p>
+            <w:pPr>
+              <w:spacing w:before="0" w:after="40" w:line="252" w:lineRule="auto"/>
+              <w:jc w:val="left"/>
+            </w:pPr>
+            <w:r>
+              <w:rPr>
+                <w:rFonts w:ascii="Calibri" w:hAnsi="Calibri"/>
+                <w:b w:val="0"/>
+                <w:color w:val="111827"/>
+                <w:sz w:val="17"/>
+              </w:rPr>
+              <w:t>Service</w:t>
+            </w:r>
+          </w:p>
+        </w:tc>
+      </w:tr>
+      <w:tr>
+        <w:trPr>
+          <w:cantSplit/>
+        </w:trPr>
+        <w:tc>
+          <w:tcPr>
+            <w:tcW w:type="dxa" w:w="1650"/>
+            <w:tcMar>
+              <w:top w:w="80" w:type="dxa"/>
+              <w:start w:w="120" w:type="dxa"/>
+              <w:bottom w:w="80" w:type="dxa"/>
+              <w:end w:w="120" w:type="dxa"/>
+            </w:tcMar>
+            <w:vAlign w:val="center"/>
+            <w:shd w:fill="FFFFFF"/>
+          </w:tcPr>
+          <w:p>
+            <w:pPr>
+              <w:spacing w:before="0" w:after="40" w:line="252" w:lineRule="auto"/>
+              <w:jc w:val="center"/>
+            </w:pPr>
+            <w:r>
+              <w:rPr>
+                <w:rFonts w:ascii="Calibri" w:hAnsi="Calibri"/>
+                <w:b w:val="0"/>
+                <w:color w:val="111827"/>
+                <w:sz w:val="17"/>
+              </w:rPr>
+              <w:t>Power-cycle persistence</w:t>
+            </w:r>
+          </w:p>
+        </w:tc>
+        <w:tc>
+          <w:tcPr>
+            <w:tcW w:type="dxa" w:w="4450"/>
+            <w:tcMar>
+              <w:top w:w="80" w:type="dxa"/>
+              <w:start w:w="120" w:type="dxa"/>
+              <w:bottom w:w="80" w:type="dxa"/>
+              <w:end w:w="120" w:type="dxa"/>
+            </w:tcMar>
+            <w:vAlign w:val="center"/>
+            <w:shd w:fill="FFFFFF"/>
+          </w:tcPr>
+          <w:p>
+            <w:pPr>
+              <w:spacing w:before="0" w:after="40" w:line="252" w:lineRule="auto"/>
+              <w:jc w:val="left"/>
+            </w:pPr>
+            <w:r>
+              <w:rPr>
+                <w:rFonts w:ascii="Calibri" w:hAnsi="Calibri"/>
+                <w:b w:val="0"/>
+                <w:color w:val="111827"/>
+                <w:sz w:val="17"/>
+              </w:rPr>
+              <w:t>Apply the same defined volatile-memory rule.</w:t>
+            </w:r>
+          </w:p>
+        </w:tc>
+        <w:tc>
+          <w:tcPr>
+            <w:tcW w:type="dxa" w:w="3260"/>
+            <w:tcMar>
+              <w:top w:w="80" w:type="dxa"/>
+              <w:start w:w="120" w:type="dxa"/>
+              <w:bottom w:w="80" w:type="dxa"/>
+              <w:end w:w="120" w:type="dxa"/>
+            </w:tcMar>
+            <w:vAlign w:val="center"/>
+            <w:shd w:fill="FFFFFF"/>
+          </w:tcPr>
+          <w:p>
+            <w:pPr>
+              <w:spacing w:before="0" w:after="40" w:line="252" w:lineRule="auto"/>
+              <w:jc w:val="left"/>
+            </w:pPr>
+            <w:r>
+              <w:rPr>
+                <w:rFonts w:ascii="Calibri" w:hAnsi="Calibri"/>
+                <w:b w:val="0"/>
+                <w:color w:val="111827"/>
+                <w:sz w:val="17"/>
+              </w:rPr>
+              <w:t>Service</w:t>
+            </w:r>
+          </w:p>
+        </w:tc>
+      </w:tr>
+      <w:tr>
+        <w:trPr>
+          <w:cantSplit/>
+        </w:trPr>
+        <w:tc>
+          <w:tcPr>
+            <w:tcW w:type="dxa" w:w="1650"/>
+            <w:tcMar>
+              <w:top w:w="80" w:type="dxa"/>
+              <w:start w:w="120" w:type="dxa"/>
+              <w:bottom w:w="80" w:type="dxa"/>
+              <w:end w:w="120" w:type="dxa"/>
+            </w:tcMar>
+            <w:vAlign w:val="center"/>
+            <w:shd w:fill="FFFFFF"/>
+          </w:tcPr>
+          <w:p>
+            <w:pPr>
+              <w:spacing w:before="0" w:after="40" w:line="252" w:lineRule="auto"/>
+              <w:jc w:val="center"/>
+            </w:pPr>
+            <w:r>
+              <w:rPr>
+                <w:rFonts w:ascii="Calibri" w:hAnsi="Calibri"/>
+                <w:b w:val="0"/>
+                <w:color w:val="111827"/>
+                <w:sz w:val="17"/>
+              </w:rPr>
+              <w:t>Snapshot checksum</w:t>
+            </w:r>
+          </w:p>
+        </w:tc>
+        <w:tc>
+          <w:tcPr>
+            <w:tcW w:type="dxa" w:w="4450"/>
+            <w:tcMar>
+              <w:top w:w="80" w:type="dxa"/>
+              <w:start w:w="120" w:type="dxa"/>
+              <w:bottom w:w="80" w:type="dxa"/>
+              <w:end w:w="120" w:type="dxa"/>
+            </w:tcMar>
+            <w:vAlign w:val="center"/>
+            <w:shd w:fill="FFFFFF"/>
+          </w:tcPr>
+          <w:p>
+            <w:pPr>
+              <w:spacing w:before="0" w:after="40" w:line="252" w:lineRule="auto"/>
+              <w:jc w:val="left"/>
+            </w:pPr>
+            <w:r>
+              <w:rPr>
+                <w:rFonts w:ascii="Calibri" w:hAnsi="Calibri"/>
+                <w:b w:val="0"/>
+                <w:color w:val="111827"/>
+                <w:sz w:val="17"/>
+              </w:rPr>
+              <w:t>Produce the same checksum for canonical memory content.</w:t>
+            </w:r>
+          </w:p>
+        </w:tc>
+        <w:tc>
+          <w:tcPr>
+            <w:tcW w:type="dxa" w:w="3260"/>
+            <w:tcMar>
+              <w:top w:w="80" w:type="dxa"/>
+              <w:start w:w="120" w:type="dxa"/>
+              <w:bottom w:w="80" w:type="dxa"/>
+              <w:end w:w="120" w:type="dxa"/>
+            </w:tcMar>
+            <w:vAlign w:val="center"/>
+            <w:shd w:fill="FFFFFF"/>
+          </w:tcPr>
+          <w:p>
+            <w:pPr>
+              <w:spacing w:before="0" w:after="40" w:line="252" w:lineRule="auto"/>
+              <w:jc w:val="left"/>
+            </w:pPr>
+            <w:r>
+              <w:rPr>
+                <w:rFonts w:ascii="Calibri" w:hAnsi="Calibri"/>
+                <w:b w:val="0"/>
+                <w:color w:val="111827"/>
+                <w:sz w:val="17"/>
+              </w:rPr>
+              <w:t>Service</w:t>
+            </w:r>
+          </w:p>
+        </w:tc>
+      </w:tr>
+      <w:tr>
+        <w:trPr>
+          <w:cantSplit/>
+        </w:trPr>
+        <w:tc>
+          <w:tcPr>
+            <w:tcW w:type="dxa" w:w="1650"/>
+            <w:tcMar>
+              <w:top w:w="80" w:type="dxa"/>
+              <w:start w:w="120" w:type="dxa"/>
+              <w:bottom w:w="80" w:type="dxa"/>
+              <w:end w:w="120" w:type="dxa"/>
+            </w:tcMar>
+            <w:vAlign w:val="center"/>
+            <w:shd w:fill="FFFFFF"/>
+          </w:tcPr>
+          <w:p>
+            <w:pPr>
+              <w:spacing w:before="0" w:after="40" w:line="252" w:lineRule="auto"/>
+              <w:jc w:val="center"/>
+            </w:pPr>
+            <w:r>
+              <w:rPr>
+                <w:rFonts w:ascii="Calibri" w:hAnsi="Calibri"/>
+                <w:b w:val="0"/>
+                <w:color w:val="111827"/>
+                <w:sz w:val="17"/>
+              </w:rPr>
+              <w:t>Snapshot restore conflict</w:t>
+            </w:r>
+          </w:p>
+        </w:tc>
+        <w:tc>
+          <w:tcPr>
+            <w:tcW w:type="dxa" w:w="4450"/>
+            <w:tcMar>
+              <w:top w:w="80" w:type="dxa"/>
+              <w:start w:w="120" w:type="dxa"/>
+              <w:bottom w:w="80" w:type="dxa"/>
+              <w:end w:w="120" w:type="dxa"/>
+            </w:tcMar>
+            <w:vAlign w:val="center"/>
+            <w:shd w:fill="FFFFFF"/>
+          </w:tcPr>
+          <w:p>
+            <w:pPr>
+              <w:spacing w:before="0" w:after="40" w:line="252" w:lineRule="auto"/>
+              <w:jc w:val="left"/>
+            </w:pPr>
+            <w:r>
+              <w:rPr>
+                <w:rFonts w:ascii="Calibri" w:hAnsi="Calibri"/>
+                <w:b w:val="0"/>
+                <w:color w:val="111827"/>
+                <w:sz w:val="17"/>
+              </w:rPr>
+              <w:t>Reject stale expected versions.</w:t>
+            </w:r>
+          </w:p>
+        </w:tc>
+        <w:tc>
+          <w:tcPr>
+            <w:tcW w:type="dxa" w:w="3260"/>
+            <w:tcMar>
+              <w:top w:w="80" w:type="dxa"/>
+              <w:start w:w="120" w:type="dxa"/>
+              <w:bottom w:w="80" w:type="dxa"/>
+              <w:end w:w="120" w:type="dxa"/>
+            </w:tcMar>
+            <w:vAlign w:val="center"/>
+            <w:shd w:fill="FFFFFF"/>
+          </w:tcPr>
+          <w:p>
+            <w:pPr>
+              <w:spacing w:before="0" w:after="40" w:line="252" w:lineRule="auto"/>
+              <w:jc w:val="left"/>
+            </w:pPr>
+            <w:r>
+              <w:rPr>
+                <w:rFonts w:ascii="Calibri" w:hAnsi="Calibri"/>
+                <w:b w:val="0"/>
+                <w:color w:val="111827"/>
+                <w:sz w:val="17"/>
+              </w:rPr>
+              <w:t>Service/API</w:t>
+            </w:r>
+          </w:p>
+        </w:tc>
+      </w:tr>
+      <w:tr>
+        <w:trPr>
+          <w:cantSplit/>
+        </w:trPr>
+        <w:tc>
+          <w:tcPr>
+            <w:tcW w:type="dxa" w:w="1650"/>
+            <w:tcMar>
+              <w:top w:w="80" w:type="dxa"/>
+              <w:start w:w="120" w:type="dxa"/>
+              <w:bottom w:w="80" w:type="dxa"/>
+              <w:end w:w="120" w:type="dxa"/>
+            </w:tcMar>
+            <w:vAlign w:val="center"/>
+            <w:shd w:fill="FFFFFF"/>
+          </w:tcPr>
+          <w:p>
+            <w:pPr>
+              <w:spacing w:before="0" w:after="40" w:line="252" w:lineRule="auto"/>
+              <w:jc w:val="center"/>
+            </w:pPr>
+            <w:r>
+              <w:rPr>
+                <w:rFonts w:ascii="Calibri" w:hAnsi="Calibri"/>
+                <w:b w:val="0"/>
+                <w:color w:val="111827"/>
+                <w:sz w:val="17"/>
+              </w:rPr>
+              <w:t>Seeded corruption</w:t>
+            </w:r>
+          </w:p>
+        </w:tc>
+        <w:tc>
+          <w:tcPr>
+            <w:tcW w:type="dxa" w:w="4450"/>
+            <w:tcMar>
+              <w:top w:w="80" w:type="dxa"/>
+              <w:start w:w="120" w:type="dxa"/>
+              <w:bottom w:w="80" w:type="dxa"/>
+              <w:end w:w="120" w:type="dxa"/>
+            </w:tcMar>
+            <w:vAlign w:val="center"/>
+            <w:shd w:fill="FFFFFF"/>
+          </w:tcPr>
+          <w:p>
+            <w:pPr>
+              <w:spacing w:before="0" w:after="40" w:line="252" w:lineRule="auto"/>
+              <w:jc w:val="left"/>
+            </w:pPr>
+            <w:r>
+              <w:rPr>
+                <w:rFonts w:ascii="Calibri" w:hAnsi="Calibri"/>
+                <w:b w:val="0"/>
+                <w:color w:val="111827"/>
+                <w:sz w:val="17"/>
+              </w:rPr>
+              <w:t>Reproduce the same bit changes from the same state and seed.</w:t>
+            </w:r>
+          </w:p>
+        </w:tc>
+        <w:tc>
+          <w:tcPr>
+            <w:tcW w:type="dxa" w:w="3260"/>
+            <w:tcMar>
+              <w:top w:w="80" w:type="dxa"/>
+              <w:start w:w="120" w:type="dxa"/>
+              <w:bottom w:w="80" w:type="dxa"/>
+              <w:end w:w="120" w:type="dxa"/>
+            </w:tcMar>
+            <w:vAlign w:val="center"/>
+            <w:shd w:fill="FFFFFF"/>
+          </w:tcPr>
+          <w:p>
+            <w:pPr>
+              <w:spacing w:before="0" w:after="40" w:line="252" w:lineRule="auto"/>
+              <w:jc w:val="left"/>
+            </w:pPr>
+            <w:r>
+              <w:rPr>
+                <w:rFonts w:ascii="Calibri" w:hAnsi="Calibri"/>
+                <w:b w:val="0"/>
+                <w:color w:val="111827"/>
+                <w:sz w:val="17"/>
+              </w:rPr>
+              <w:t>Service</w:t>
+            </w:r>
+          </w:p>
+        </w:tc>
+      </w:tr>
+      <w:tr>
+        <w:trPr>
+          <w:cantSplit/>
+        </w:trPr>
+        <w:tc>
+          <w:tcPr>
+            <w:tcW w:type="dxa" w:w="1650"/>
+            <w:tcMar>
+              <w:top w:w="80" w:type="dxa"/>
+              <w:start w:w="120" w:type="dxa"/>
+              <w:bottom w:w="80" w:type="dxa"/>
+              <w:end w:w="120" w:type="dxa"/>
+            </w:tcMar>
+            <w:vAlign w:val="center"/>
+            <w:shd w:fill="FFFFFF"/>
+          </w:tcPr>
+          <w:p>
+            <w:pPr>
+              <w:spacing w:before="0" w:after="40" w:line="252" w:lineRule="auto"/>
+              <w:jc w:val="center"/>
+            </w:pPr>
+            <w:r>
+              <w:rPr>
+                <w:rFonts w:ascii="Calibri" w:hAnsi="Calibri"/>
+                <w:b w:val="0"/>
+                <w:color w:val="111827"/>
+                <w:sz w:val="17"/>
+              </w:rPr>
+              <w:t>Corruption replay</w:t>
+            </w:r>
+          </w:p>
+        </w:tc>
+        <w:tc>
+          <w:tcPr>
+            <w:tcW w:type="dxa" w:w="4450"/>
+            <w:tcMar>
+              <w:top w:w="80" w:type="dxa"/>
+              <w:start w:w="120" w:type="dxa"/>
+              <w:bottom w:w="80" w:type="dxa"/>
+              <w:end w:w="120" w:type="dxa"/>
+            </w:tcMar>
+            <w:vAlign w:val="center"/>
+            <w:shd w:fill="FFFFFF"/>
+          </w:tcPr>
+          <w:p>
+            <w:pPr>
+              <w:spacing w:before="0" w:after="40" w:line="252" w:lineRule="auto"/>
+              <w:jc w:val="left"/>
+            </w:pPr>
+            <w:r>
+              <w:rPr>
+                <w:rFonts w:ascii="Calibri" w:hAnsi="Calibri"/>
+                <w:b w:val="0"/>
+                <w:color w:val="111827"/>
+                <w:sz w:val="17"/>
+              </w:rPr>
+              <w:t>Avoid applying an exact command twice.</w:t>
+            </w:r>
+          </w:p>
+        </w:tc>
+        <w:tc>
+          <w:tcPr>
+            <w:tcW w:type="dxa" w:w="3260"/>
+            <w:tcMar>
+              <w:top w:w="80" w:type="dxa"/>
+              <w:start w:w="120" w:type="dxa"/>
+              <w:bottom w:w="80" w:type="dxa"/>
+              <w:end w:w="120" w:type="dxa"/>
+            </w:tcMar>
+            <w:vAlign w:val="center"/>
+            <w:shd w:fill="FFFFFF"/>
+          </w:tcPr>
+          <w:p>
+            <w:pPr>
+              <w:spacing w:before="0" w:after="40" w:line="252" w:lineRule="auto"/>
+              <w:jc w:val="left"/>
+            </w:pPr>
+            <w:r>
+              <w:rPr>
+                <w:rFonts w:ascii="Calibri" w:hAnsi="Calibri"/>
+                <w:b w:val="0"/>
+                <w:color w:val="111827"/>
+                <w:sz w:val="17"/>
+              </w:rPr>
+              <w:t>Service</w:t>
+            </w:r>
+          </w:p>
+        </w:tc>
+      </w:tr>
+      <w:tr>
+        <w:trPr>
+          <w:cantSplit/>
+        </w:trPr>
+        <w:tc>
+          <w:tcPr>
+            <w:tcW w:type="dxa" w:w="1650"/>
+            <w:tcMar>
+              <w:top w:w="80" w:type="dxa"/>
+              <w:start w:w="120" w:type="dxa"/>
+              <w:bottom w:w="80" w:type="dxa"/>
+              <w:end w:w="120" w:type="dxa"/>
+            </w:tcMar>
+            <w:vAlign w:val="center"/>
+            <w:shd w:fill="FFFFFF"/>
+          </w:tcPr>
+          <w:p>
+            <w:pPr>
+              <w:spacing w:before="0" w:after="40" w:line="252" w:lineRule="auto"/>
+              <w:jc w:val="center"/>
+            </w:pPr>
+            <w:r>
+              <w:rPr>
+                <w:rFonts w:ascii="Calibri" w:hAnsi="Calibri"/>
+                <w:b w:val="0"/>
+                <w:color w:val="111827"/>
+                <w:sz w:val="17"/>
+              </w:rPr>
+              <w:t>Memory RBAC and OpenAPI</w:t>
+            </w:r>
+          </w:p>
+        </w:tc>
+        <w:tc>
+          <w:tcPr>
+            <w:tcW w:type="dxa" w:w="4450"/>
+            <w:tcMar>
+              <w:top w:w="80" w:type="dxa"/>
+              <w:start w:w="120" w:type="dxa"/>
+              <w:bottom w:w="80" w:type="dxa"/>
+              <w:end w:w="120" w:type="dxa"/>
+            </w:tcMar>
+            <w:vAlign w:val="center"/>
+            <w:shd w:fill="FFFFFF"/>
+          </w:tcPr>
+          <w:p>
+            <w:pPr>
+              <w:spacing w:before="0" w:after="40" w:line="252" w:lineRule="auto"/>
+              <w:jc w:val="left"/>
+            </w:pPr>
+            <w:r>
+              <w:rPr>
+                <w:rFonts w:ascii="Calibri" w:hAnsi="Calibri"/>
+                <w:b w:val="0"/>
+                <w:color w:val="111827"/>
+                <w:sz w:val="17"/>
+              </w:rPr>
+              <w:t>Publish protected, typed memory endpoints.</w:t>
+            </w:r>
+          </w:p>
+        </w:tc>
+        <w:tc>
+          <w:tcPr>
+            <w:tcW w:type="dxa" w:w="3260"/>
+            <w:tcMar>
+              <w:top w:w="80" w:type="dxa"/>
+              <w:start w:w="120" w:type="dxa"/>
+              <w:bottom w:w="80" w:type="dxa"/>
+              <w:end w:w="120" w:type="dxa"/>
+            </w:tcMar>
+            <w:vAlign w:val="center"/>
+            <w:shd w:fill="FFFFFF"/>
+          </w:tcPr>
+          <w:p>
+            <w:pPr>
+              <w:spacing w:before="0" w:after="40" w:line="252" w:lineRule="auto"/>
+              <w:jc w:val="left"/>
+            </w:pPr>
+            <w:r>
+              <w:rPr>
+                <w:rFonts w:ascii="Calibri" w:hAnsi="Calibri"/>
+                <w:b w:val="0"/>
+                <w:color w:val="111827"/>
+                <w:sz w:val="17"/>
+              </w:rPr>
+              <w:t>Contract/integration</w:t>
+            </w:r>
+          </w:p>
+        </w:tc>
+      </w:tr>
+    </w:tbl>
+    <w:p>
+      <w:pPr>
+        <w:spacing w:after="60"/>
+      </w:pPr>
+    </w:p>
+    <w:p>
+      <w:pPr>
+        <w:pStyle w:val="Heading1"/>
+        <w:keepNext/>
+        <w:keepLines/>
+      </w:pPr>
+      <w:r>
         <w:t>12. Implemented Evidence</w:t>
       </w:r>
     </w:p>
@@ -7293,6 +8880,22 @@
           <w:sz w:val="19"/>
         </w:rPr>
         <w:t>0020_ecu_behavior_profiles</w:t>
+      </w:r>
+      <w:r>
+        <w:rPr>
+          <w:rFonts w:ascii="Calibri" w:hAnsi="Calibri"/>
+          <w:color w:val="111827"/>
+          <w:sz w:val="22"/>
+        </w:rPr>
+        <w:t xml:space="preserve">, and </w:t>
+      </w:r>
+      <w:r>
+        <w:rPr>
+          <w:rFonts w:ascii="Consolas" w:hAnsi="Consolas"/>
+          <w:color w:val="1F4D78"/>
+          <w:sz w:val="19"/>
+        </w:rPr>
+        <w:t>0021_ecu_memory_regions</w:t>
       </w:r>
       <w:r>
         <w:rPr>
@@ -7464,6 +9067,23 @@
           <w:color w:val="111827"/>
           <w:sz w:val="22"/>
         </w:rPr>
+        <w:t>Memory events cover snapshot creation/restoration and deterministic corruption.</w:t>
+      </w:r>
+    </w:p>
+    <w:p>
+      <w:pPr>
+        <w:pStyle w:val="ListBullet"/>
+        <w:numPr>
+          <w:ilvl w:val="0"/>
+          <w:numId w:val="14"/>
+        </w:numPr>
+      </w:pPr>
+      <w:r>
+        <w:rPr>
+          <w:rFonts w:ascii="Calibri" w:hAnsi="Calibri"/>
+          <w:color w:val="111827"/>
+          <w:sz w:val="22"/>
+        </w:rPr>
         <w:t>Automated tests cover validation, atomic evidence, concurrency, idempotency, permissions, and API contracts.</w:t>
       </w:r>
     </w:p>
@@ -7552,7 +9172,7 @@
           <w:color w:val="111827"/>
           <w:sz w:val="22"/>
         </w:rPr>
-        <w:t>Memory persistence across reset is undefined until III-4.</w:t>
+        <w:t>Snapshot retention limits and deletion policy require an enterprise storage decision.</w:t>
       </w:r>
     </w:p>
     <w:p>
@@ -7589,7 +9209,7 @@
           <w:color w:val="111827"/>
           <w:sz w:val="22"/>
         </w:rPr>
-        <w:t xml:space="preserve">The next increment adds volatile and non-volatile memory regions, snapshots, reset persistence, and corruption injection. Later increments add fault lifecycle, CAN contracts, and multi-ECU scenarios. See </w:t>
+        <w:t xml:space="preserve">The next increment adds fault activation lifecycle, debouncing, latching, healing, and a future DTC bridge. Later increments add CAN contracts and multi-ECU scenarios. See </w:t>
       </w:r>
       <w:r>
         <w:rPr>
@@ -7683,7 +9303,7 @@
           <w:color w:val="111827"/>
           <w:sz w:val="22"/>
         </w:rPr>
-        <w:t>Design reset behavior for volatile and non-volatile memory without implementing it.</w:t>
+        <w:t>Compare the implemented reset behavior for volatile and non-volatile memory across all modes.</w:t>
       </w:r>
     </w:p>
     <w:p>
@@ -7734,7 +9354,7 @@
           <w:color w:val="111827"/>
           <w:sz w:val="22"/>
         </w:rPr>
-        <w:t>Explain why III-2 reset preserves memory and how III-4 can refine that contract safely.</w:t>
+        <w:t>Explain how III-4 safely supersedes the transitional III-2 memory-preservation rule.</w:t>
       </w:r>
     </w:p>
     <w:p>
@@ -7788,6 +9408,57 @@
         <w:t>Design a dedicated ADAS profile without adding camera or CAN dependencies to the registry.</w:t>
       </w:r>
     </w:p>
+    <w:p>
+      <w:pPr>
+        <w:pStyle w:val="ListNumber"/>
+        <w:numPr>
+          <w:ilvl w:val="0"/>
+          <w:numId w:val="17"/>
+        </w:numPr>
+      </w:pPr>
+      <w:r>
+        <w:rPr>
+          <w:rFonts w:ascii="Calibri" w:hAnsi="Calibri"/>
+          <w:color w:val="111827"/>
+          <w:sz w:val="22"/>
+        </w:rPr>
+        <w:t>Model RAM and EEPROM regions for a BMS ECU and predict each reset mode's result.</w:t>
+      </w:r>
+    </w:p>
+    <w:p>
+      <w:pPr>
+        <w:pStyle w:val="ListNumber"/>
+        <w:numPr>
+          <w:ilvl w:val="0"/>
+          <w:numId w:val="17"/>
+        </w:numPr>
+      </w:pPr>
+      <w:r>
+        <w:rPr>
+          <w:rFonts w:ascii="Calibri" w:hAnsi="Calibri"/>
+          <w:color w:val="111827"/>
+          <w:sz w:val="22"/>
+        </w:rPr>
+        <w:t>Explain why snapshot audits contain checksums and counts instead of the complete memory image.</w:t>
+      </w:r>
+    </w:p>
+    <w:p>
+      <w:pPr>
+        <w:pStyle w:val="ListNumber"/>
+        <w:numPr>
+          <w:ilvl w:val="0"/>
+          <w:numId w:val="17"/>
+        </w:numPr>
+      </w:pPr>
+      <w:r>
+        <w:rPr>
+          <w:rFonts w:ascii="Calibri" w:hAnsi="Calibri"/>
+          <w:color w:val="111827"/>
+          <w:sz w:val="22"/>
+        </w:rPr>
+        <w:t>Design a corruption campaign that remains reproducible across CI machines.</w:t>
+      </w:r>
+    </w:p>
     <w:sectPr>
       <w:headerReference w:type="default" r:id="rId9"/>
       <w:footerReference w:type="default" r:id="rId10"/>
@@ -7817,7 +9488,7 @@
         <w:color w:val="667085"/>
         <w:sz w:val="17"/>
       </w:rPr>
-      <w:t>ATEP Volume III Workbook  |  Version 0.3.0</w:t>
+      <w:t>ATEP Volume III Workbook  |  Version 0.4.0</w:t>
     </w:r>
     <w:r>
       <w:rPr>

</xml_diff>

<commit_message>
feat(ecus): add fault lifecycle management
</commit_message>
<xml_diff>
--- a/docs/ATEP_Volume_III_ECU_Simulator_Engineering_Workbook.docx
+++ b/docs/ATEP_Volume_III_ECU_Simulator_Engineering_Workbook.docx
@@ -143,7 +143,7 @@
                 <w:color w:val="0B2545"/>
                 <w:sz w:val="19"/>
               </w:rPr>
-              <w:t>0.4.0</w:t>
+              <w:t>0.5.0</w:t>
             </w:r>
           </w:p>
         </w:tc>
@@ -265,7 +265,7 @@
                 <w:color w:val="111827"/>
                 <w:sz w:val="19"/>
               </w:rPr>
-              <w:t>Living document - Increments III-1 through III-4 implemented</w:t>
+              <w:t>Living document - Increments III-1 through III-5 implemented</w:t>
             </w:r>
           </w:p>
         </w:tc>
@@ -656,6 +656,25 @@
           <w:color w:val="0B2545"/>
           <w:sz w:val="21"/>
         </w:rPr>
+        <w:t>11.4 III-5 Verification</w:t>
+      </w:r>
+    </w:p>
+    <w:p>
+      <w:pPr>
+        <w:pStyle w:val="ListNumber"/>
+        <w:numPr>
+          <w:ilvl w:val="0"/>
+          <w:numId w:val="10"/>
+        </w:numPr>
+        <w:ind w:left="216" w:firstLine="0"/>
+      </w:pPr>
+      <w:r>
+        <w:rPr>
+          <w:rFonts w:ascii="Calibri" w:hAnsi="Calibri"/>
+          <w:b/>
+          <w:color w:val="0B2545"/>
+          <w:sz w:val="21"/>
+        </w:rPr>
         <w:t>12. Implemented Evidence</w:t>
       </w:r>
     </w:p>
@@ -950,7 +969,7 @@
                 <w:color w:val="111827"/>
                 <w:sz w:val="17"/>
               </w:rPr>
-              <w:t>Increments III-1 through III-4</w:t>
+              <w:t>Increments III-1 through III-5</w:t>
             </w:r>
           </w:p>
         </w:tc>
@@ -1621,6 +1640,95 @@
           </w:p>
         </w:tc>
       </w:tr>
+      <w:tr>
+        <w:trPr>
+          <w:cantSplit/>
+        </w:trPr>
+        <w:tc>
+          <w:tcPr>
+            <w:tcW w:type="dxa" w:w="1650"/>
+            <w:tcMar>
+              <w:top w:w="80" w:type="dxa"/>
+              <w:start w:w="120" w:type="dxa"/>
+              <w:bottom w:w="80" w:type="dxa"/>
+              <w:end w:w="120" w:type="dxa"/>
+            </w:tcMar>
+            <w:vAlign w:val="center"/>
+            <w:shd w:fill="FFFFFF"/>
+          </w:tcPr>
+          <w:p>
+            <w:pPr>
+              <w:spacing w:before="0" w:after="40" w:line="252" w:lineRule="auto"/>
+              <w:jc w:val="center"/>
+            </w:pPr>
+            <w:r>
+              <w:rPr>
+                <w:rFonts w:ascii="Calibri" w:hAnsi="Calibri"/>
+                <w:b w:val="0"/>
+                <w:color w:val="111827"/>
+                <w:sz w:val="17"/>
+              </w:rPr>
+              <w:t>0.5.0</w:t>
+            </w:r>
+          </w:p>
+        </w:tc>
+        <w:tc>
+          <w:tcPr>
+            <w:tcW w:type="dxa" w:w="4450"/>
+            <w:tcMar>
+              <w:top w:w="80" w:type="dxa"/>
+              <w:start w:w="120" w:type="dxa"/>
+              <w:bottom w:w="80" w:type="dxa"/>
+              <w:end w:w="120" w:type="dxa"/>
+            </w:tcMar>
+            <w:vAlign w:val="center"/>
+            <w:shd w:fill="FFFFFF"/>
+          </w:tcPr>
+          <w:p>
+            <w:pPr>
+              <w:spacing w:before="0" w:after="40" w:line="252" w:lineRule="auto"/>
+              <w:jc w:val="left"/>
+            </w:pPr>
+            <w:r>
+              <w:rPr>
+                <w:rFonts w:ascii="Calibri" w:hAnsi="Calibri"/>
+                <w:b w:val="0"/>
+                <w:color w:val="111827"/>
+                <w:sz w:val="17"/>
+              </w:rPr>
+              <w:t>2026-08-24</w:t>
+            </w:r>
+          </w:p>
+        </w:tc>
+        <w:tc>
+          <w:tcPr>
+            <w:tcW w:type="dxa" w:w="3260"/>
+            <w:tcMar>
+              <w:top w:w="80" w:type="dxa"/>
+              <w:start w:w="120" w:type="dxa"/>
+              <w:bottom w:w="80" w:type="dxa"/>
+              <w:end w:w="120" w:type="dxa"/>
+            </w:tcMar>
+            <w:vAlign w:val="center"/>
+            <w:shd w:fill="FFFFFF"/>
+          </w:tcPr>
+          <w:p>
+            <w:pPr>
+              <w:spacing w:before="0" w:after="40" w:line="252" w:lineRule="auto"/>
+              <w:jc w:val="left"/>
+            </w:pPr>
+            <w:r>
+              <w:rPr>
+                <w:rFonts w:ascii="Calibri" w:hAnsi="Calibri"/>
+                <w:b w:val="0"/>
+                <w:color w:val="111827"/>
+                <w:sz w:val="17"/>
+              </w:rPr>
+              <w:t>Added logical-time fault lifecycle, debounce, healing, latching, clear, DTC projection, APIs, and tests.</w:t>
+            </w:r>
+          </w:p>
+        </w:tc>
+      </w:tr>
     </w:tbl>
     <w:p>
       <w:pPr>
@@ -1695,7 +1803,7 @@
           <w:color w:val="111827"/>
           <w:sz w:val="22"/>
         </w:rPr>
-        <w:t>Bounded byte-addressable memory cells.</w:t>
+        <w:t>Bounded memory with volatile/non-volatile regions, snapshots, and seeded corruption.</w:t>
       </w:r>
     </w:p>
     <w:p>
@@ -1712,7 +1820,7 @@
           <w:color w:val="111827"/>
           <w:sz w:val="22"/>
         </w:rPr>
-        <w:t>Explicit, typed, and bounded fault records.</w:t>
+        <w:t>Bounded fault records with logical-time confirmation, healing, latching, clear, and DTC intent.</w:t>
       </w:r>
     </w:p>
     <w:p>
@@ -1836,23 +1944,6 @@
     </w:p>
     <w:p>
       <w:pPr>
-        <w:pStyle w:val="ListBullet"/>
-        <w:numPr>
-          <w:ilvl w:val="0"/>
-          <w:numId w:val="11"/>
-        </w:numPr>
-      </w:pPr>
-      <w:r>
-        <w:rPr>
-          <w:rFonts w:ascii="Calibri" w:hAnsi="Calibri"/>
-          <w:color w:val="111827"/>
-          <w:sz w:val="22"/>
-        </w:rPr>
-        <w:t>Volatile/non-volatile regions, checksummed snapshots, and seeded corruption evidence.</w:t>
-      </w:r>
-    </w:p>
-    <w:p>
-      <w:pPr>
         <w:pStyle w:val="Heading2"/>
         <w:keepNext/>
         <w:keepLines/>
@@ -1909,7 +2000,7 @@
           <w:color w:val="111827"/>
           <w:sz w:val="22"/>
         </w:rPr>
-        <w:t>UDS/OBD-II services, DTC aging, security access, and flashing.</w:t>
+        <w:t>UDS/OBD-II services, assigned DTC numbers, status-byte aging, security access, and flashing.</w:t>
       </w:r>
     </w:p>
     <w:p>
@@ -1943,7 +2034,7 @@
           <w:color w:val="111827"/>
           <w:sz w:val="22"/>
         </w:rPr>
-        <w:t>Time-based fault injection and healing.</w:t>
+        <w:t>Autonomous sensor-condition evaluation and fault injection campaigns.</w:t>
       </w:r>
     </w:p>
     <w:p>
@@ -2137,7 +2228,7 @@
           <w:color w:val="111827"/>
           <w:sz w:val="22"/>
         </w:rPr>
-        <w:t>, and timestamps. Memory has at most 256 cells, each with a 16-bit address and an 8-bit value. Faults have a canonical code, severity, pending/confirmed status, and description.</w:t>
+        <w:t>, and timestamps. Memory has at most 256 cells, each with a 16-bit address and an 8-bit value. Faults have a canonical code, severity, pending/confirmed/healed status, description, bounded debounce counters, logical timestamps, thresholds, active state, and latch policy.</w:t>
       </w:r>
     </w:p>
     <w:p>
@@ -3615,6 +3706,357 @@
           </w:p>
         </w:tc>
       </w:tr>
+      <w:tr>
+        <w:trPr>
+          <w:cantSplit/>
+        </w:trPr>
+        <w:tc>
+          <w:tcPr>
+            <w:tcW w:type="dxa" w:w="1150"/>
+            <w:tcMar>
+              <w:top w:w="80" w:type="dxa"/>
+              <w:start w:w="120" w:type="dxa"/>
+              <w:bottom w:w="80" w:type="dxa"/>
+              <w:end w:w="120" w:type="dxa"/>
+            </w:tcMar>
+            <w:vAlign w:val="center"/>
+            <w:shd w:fill="FFFFFF"/>
+          </w:tcPr>
+          <w:p>
+            <w:pPr>
+              <w:spacing w:before="0" w:after="40" w:line="252" w:lineRule="auto"/>
+              <w:jc w:val="center"/>
+            </w:pPr>
+            <w:r>
+              <w:rPr>
+                <w:rFonts w:ascii="Calibri" w:hAnsi="Calibri"/>
+                <w:b w:val="0"/>
+                <w:color w:val="111827"/>
+                <w:sz w:val="16"/>
+              </w:rPr>
+              <w:t>POST</w:t>
+            </w:r>
+          </w:p>
+        </w:tc>
+        <w:tc>
+          <w:tcPr>
+            <w:tcW w:type="dxa" w:w="3700"/>
+            <w:tcMar>
+              <w:top w:w="80" w:type="dxa"/>
+              <w:start w:w="120" w:type="dxa"/>
+              <w:bottom w:w="80" w:type="dxa"/>
+              <w:end w:w="120" w:type="dxa"/>
+            </w:tcMar>
+            <w:vAlign w:val="center"/>
+            <w:shd w:fill="FFFFFF"/>
+          </w:tcPr>
+          <w:p>
+            <w:pPr>
+              <w:spacing w:before="0" w:after="40" w:line="252" w:lineRule="auto"/>
+              <w:jc w:val="left"/>
+            </w:pPr>
+            <w:r>
+              <w:rPr>
+                <w:rFonts w:ascii="Calibri" w:hAnsi="Calibri"/>
+                <w:b w:val="0"/>
+                <w:color w:val="111827"/>
+                <w:sz w:val="16"/>
+              </w:rPr>
+              <w:t>/api/v1/vehicles/{vehicle_id}/ecus/{ecu_id}/faults/observe</w:t>
+            </w:r>
+          </w:p>
+        </w:tc>
+        <w:tc>
+          <w:tcPr>
+            <w:tcW w:type="dxa" w:w="3100"/>
+            <w:tcMar>
+              <w:top w:w="80" w:type="dxa"/>
+              <w:start w:w="120" w:type="dxa"/>
+              <w:bottom w:w="80" w:type="dxa"/>
+              <w:end w:w="120" w:type="dxa"/>
+            </w:tcMar>
+            <w:vAlign w:val="center"/>
+            <w:shd w:fill="FFFFFF"/>
+          </w:tcPr>
+          <w:p>
+            <w:pPr>
+              <w:spacing w:before="0" w:after="40" w:line="252" w:lineRule="auto"/>
+              <w:jc w:val="left"/>
+            </w:pPr>
+            <w:r>
+              <w:rPr>
+                <w:rFonts w:ascii="Calibri" w:hAnsi="Calibri"/>
+                <w:b w:val="0"/>
+                <w:color w:val="111827"/>
+                <w:sz w:val="16"/>
+              </w:rPr>
+              <w:t>ecus:manage</w:t>
+            </w:r>
+          </w:p>
+        </w:tc>
+        <w:tc>
+          <w:tcPr>
+            <w:tcW w:type="dxa" w:w="1410"/>
+            <w:tcMar>
+              <w:top w:w="80" w:type="dxa"/>
+              <w:start w:w="120" w:type="dxa"/>
+              <w:bottom w:w="80" w:type="dxa"/>
+              <w:end w:w="120" w:type="dxa"/>
+            </w:tcMar>
+            <w:vAlign w:val="center"/>
+            <w:shd w:fill="FFFFFF"/>
+          </w:tcPr>
+          <w:p>
+            <w:pPr>
+              <w:spacing w:before="0" w:after="40" w:line="252" w:lineRule="auto"/>
+              <w:jc w:val="left"/>
+            </w:pPr>
+            <w:r>
+              <w:rPr>
+                <w:rFonts w:ascii="Calibri" w:hAnsi="Calibri"/>
+                <w:b w:val="0"/>
+                <w:color w:val="111827"/>
+                <w:sz w:val="16"/>
+              </w:rPr>
+              <w:t>Record one detected or absent observation.</w:t>
+            </w:r>
+          </w:p>
+        </w:tc>
+      </w:tr>
+      <w:tr>
+        <w:trPr>
+          <w:cantSplit/>
+        </w:trPr>
+        <w:tc>
+          <w:tcPr>
+            <w:tcW w:type="dxa" w:w="1150"/>
+            <w:tcMar>
+              <w:top w:w="80" w:type="dxa"/>
+              <w:start w:w="120" w:type="dxa"/>
+              <w:bottom w:w="80" w:type="dxa"/>
+              <w:end w:w="120" w:type="dxa"/>
+            </w:tcMar>
+            <w:vAlign w:val="center"/>
+            <w:shd w:fill="FFFFFF"/>
+          </w:tcPr>
+          <w:p>
+            <w:pPr>
+              <w:spacing w:before="0" w:after="40" w:line="252" w:lineRule="auto"/>
+              <w:jc w:val="center"/>
+            </w:pPr>
+            <w:r>
+              <w:rPr>
+                <w:rFonts w:ascii="Calibri" w:hAnsi="Calibri"/>
+                <w:b w:val="0"/>
+                <w:color w:val="111827"/>
+                <w:sz w:val="16"/>
+              </w:rPr>
+              <w:t>POST</w:t>
+            </w:r>
+          </w:p>
+        </w:tc>
+        <w:tc>
+          <w:tcPr>
+            <w:tcW w:type="dxa" w:w="3700"/>
+            <w:tcMar>
+              <w:top w:w="80" w:type="dxa"/>
+              <w:start w:w="120" w:type="dxa"/>
+              <w:bottom w:w="80" w:type="dxa"/>
+              <w:end w:w="120" w:type="dxa"/>
+            </w:tcMar>
+            <w:vAlign w:val="center"/>
+            <w:shd w:fill="FFFFFF"/>
+          </w:tcPr>
+          <w:p>
+            <w:pPr>
+              <w:spacing w:before="0" w:after="40" w:line="252" w:lineRule="auto"/>
+              <w:jc w:val="left"/>
+            </w:pPr>
+            <w:r>
+              <w:rPr>
+                <w:rFonts w:ascii="Calibri" w:hAnsi="Calibri"/>
+                <w:b w:val="0"/>
+                <w:color w:val="111827"/>
+                <w:sz w:val="16"/>
+              </w:rPr>
+              <w:t>/api/v1/vehicles/{vehicle_id}/ecus/{ecu_id}/faults/{fault_code}/clear</w:t>
+            </w:r>
+          </w:p>
+        </w:tc>
+        <w:tc>
+          <w:tcPr>
+            <w:tcW w:type="dxa" w:w="3100"/>
+            <w:tcMar>
+              <w:top w:w="80" w:type="dxa"/>
+              <w:start w:w="120" w:type="dxa"/>
+              <w:bottom w:w="80" w:type="dxa"/>
+              <w:end w:w="120" w:type="dxa"/>
+            </w:tcMar>
+            <w:vAlign w:val="center"/>
+            <w:shd w:fill="FFFFFF"/>
+          </w:tcPr>
+          <w:p>
+            <w:pPr>
+              <w:spacing w:before="0" w:after="40" w:line="252" w:lineRule="auto"/>
+              <w:jc w:val="left"/>
+            </w:pPr>
+            <w:r>
+              <w:rPr>
+                <w:rFonts w:ascii="Calibri" w:hAnsi="Calibri"/>
+                <w:b w:val="0"/>
+                <w:color w:val="111827"/>
+                <w:sz w:val="16"/>
+              </w:rPr>
+              <w:t>ecus:manage</w:t>
+            </w:r>
+          </w:p>
+        </w:tc>
+        <w:tc>
+          <w:tcPr>
+            <w:tcW w:type="dxa" w:w="1410"/>
+            <w:tcMar>
+              <w:top w:w="80" w:type="dxa"/>
+              <w:start w:w="120" w:type="dxa"/>
+              <w:bottom w:w="80" w:type="dxa"/>
+              <w:end w:w="120" w:type="dxa"/>
+            </w:tcMar>
+            <w:vAlign w:val="center"/>
+            <w:shd w:fill="FFFFFF"/>
+          </w:tcPr>
+          <w:p>
+            <w:pPr>
+              <w:spacing w:before="0" w:after="40" w:line="252" w:lineRule="auto"/>
+              <w:jc w:val="left"/>
+            </w:pPr>
+            <w:r>
+              <w:rPr>
+                <w:rFonts w:ascii="Calibri" w:hAnsi="Calibri"/>
+                <w:b w:val="0"/>
+                <w:color w:val="111827"/>
+                <w:sz w:val="16"/>
+              </w:rPr>
+              <w:t>Explicitly clear an active fault.</w:t>
+            </w:r>
+          </w:p>
+        </w:tc>
+      </w:tr>
+      <w:tr>
+        <w:trPr>
+          <w:cantSplit/>
+        </w:trPr>
+        <w:tc>
+          <w:tcPr>
+            <w:tcW w:type="dxa" w:w="1150"/>
+            <w:tcMar>
+              <w:top w:w="80" w:type="dxa"/>
+              <w:start w:w="120" w:type="dxa"/>
+              <w:bottom w:w="80" w:type="dxa"/>
+              <w:end w:w="120" w:type="dxa"/>
+            </w:tcMar>
+            <w:vAlign w:val="center"/>
+            <w:shd w:fill="FFFFFF"/>
+          </w:tcPr>
+          <w:p>
+            <w:pPr>
+              <w:spacing w:before="0" w:after="40" w:line="252" w:lineRule="auto"/>
+              <w:jc w:val="center"/>
+            </w:pPr>
+            <w:r>
+              <w:rPr>
+                <w:rFonts w:ascii="Calibri" w:hAnsi="Calibri"/>
+                <w:b w:val="0"/>
+                <w:color w:val="111827"/>
+                <w:sz w:val="16"/>
+              </w:rPr>
+              <w:t>GET</w:t>
+            </w:r>
+          </w:p>
+        </w:tc>
+        <w:tc>
+          <w:tcPr>
+            <w:tcW w:type="dxa" w:w="3700"/>
+            <w:tcMar>
+              <w:top w:w="80" w:type="dxa"/>
+              <w:start w:w="120" w:type="dxa"/>
+              <w:bottom w:w="80" w:type="dxa"/>
+              <w:end w:w="120" w:type="dxa"/>
+            </w:tcMar>
+            <w:vAlign w:val="center"/>
+            <w:shd w:fill="FFFFFF"/>
+          </w:tcPr>
+          <w:p>
+            <w:pPr>
+              <w:spacing w:before="0" w:after="40" w:line="252" w:lineRule="auto"/>
+              <w:jc w:val="left"/>
+            </w:pPr>
+            <w:r>
+              <w:rPr>
+                <w:rFonts w:ascii="Calibri" w:hAnsi="Calibri"/>
+                <w:b w:val="0"/>
+                <w:color w:val="111827"/>
+                <w:sz w:val="16"/>
+              </w:rPr>
+              <w:t>/api/v1/vehicles/{vehicle_id}/ecus/{ecu_id}/faults/dtc-candidates</w:t>
+            </w:r>
+          </w:p>
+        </w:tc>
+        <w:tc>
+          <w:tcPr>
+            <w:tcW w:type="dxa" w:w="3100"/>
+            <w:tcMar>
+              <w:top w:w="80" w:type="dxa"/>
+              <w:start w:w="120" w:type="dxa"/>
+              <w:bottom w:w="80" w:type="dxa"/>
+              <w:end w:w="120" w:type="dxa"/>
+            </w:tcMar>
+            <w:vAlign w:val="center"/>
+            <w:shd w:fill="FFFFFF"/>
+          </w:tcPr>
+          <w:p>
+            <w:pPr>
+              <w:spacing w:before="0" w:after="40" w:line="252" w:lineRule="auto"/>
+              <w:jc w:val="left"/>
+            </w:pPr>
+            <w:r>
+              <w:rPr>
+                <w:rFonts w:ascii="Calibri" w:hAnsi="Calibri"/>
+                <w:b w:val="0"/>
+                <w:color w:val="111827"/>
+                <w:sz w:val="16"/>
+              </w:rPr>
+              <w:t>ecus:read</w:t>
+            </w:r>
+          </w:p>
+        </w:tc>
+        <w:tc>
+          <w:tcPr>
+            <w:tcW w:type="dxa" w:w="1410"/>
+            <w:tcMar>
+              <w:top w:w="80" w:type="dxa"/>
+              <w:start w:w="120" w:type="dxa"/>
+              <w:bottom w:w="80" w:type="dxa"/>
+              <w:end w:w="120" w:type="dxa"/>
+            </w:tcMar>
+            <w:vAlign w:val="center"/>
+            <w:shd w:fill="FFFFFF"/>
+          </w:tcPr>
+          <w:p>
+            <w:pPr>
+              <w:spacing w:before="0" w:after="40" w:line="252" w:lineRule="auto"/>
+              <w:jc w:val="left"/>
+            </w:pPr>
+            <w:r>
+              <w:rPr>
+                <w:rFonts w:ascii="Calibri" w:hAnsi="Calibri"/>
+                <w:b w:val="0"/>
+                <w:color w:val="111827"/>
+                <w:sz w:val="16"/>
+              </w:rPr>
+              <w:t>Read diagnostic-intent projections.</w:t>
+            </w:r>
+          </w:p>
+        </w:tc>
+      </w:tr>
     </w:tbl>
     <w:p>
       <w:pPr>
@@ -3803,6 +4245,36 @@
     </w:p>
     <w:p>
       <w:pPr>
+        <w:pStyle w:val="Heading2"/>
+        <w:keepNext/>
+        <w:keepLines/>
+      </w:pPr>
+      <w:r>
+        <w:t>8.4 Fault Lifecycle and Diagnostic Intent</w:t>
+      </w:r>
+    </w:p>
+    <w:p>
+      <w:r>
+        <w:rPr>
+          <w:rFonts w:ascii="Calibri" w:hAnsi="Calibri"/>
+          <w:color w:val="111827"/>
+          <w:sz w:val="22"/>
+        </w:rPr>
+        <w:t>Each observation is evaluated at the ECU's current logical time. Consecutive detections increment the occurrence counter and confirm the fault at its configured threshold. Consecutive absences increment the healing counter and heal non-latched faults at their configured threshold. Confirmed critical faults force the ECU into fault state; after the final critical fault heals or is cleared, the ECU moves to degraded state for explicit recovery handling.</w:t>
+      </w:r>
+    </w:p>
+    <w:p>
+      <w:r>
+        <w:rPr>
+          <w:rFonts w:ascii="Calibri" w:hAnsi="Calibri"/>
+          <w:color w:val="111827"/>
+          <w:sz w:val="22"/>
+        </w:rPr>
+        <w:t>Latched confirmed faults ignore automatic healing and require an explicit clear command. Observation and clear commands persist command identity, so exact retries do not mutate counters or versions twice. Audit and outbox evidence includes the transition, code, status, and bounded counts, not the complete fault collection. DTC candidates express diagnostic intent but deliberately contain no UDS types or assigned DTC numbers.</w:t>
+      </w:r>
+    </w:p>
+    <w:p>
+      <w:pPr>
         <w:pStyle w:val="Heading1"/>
         <w:keepNext/>
         <w:keepLines/>
@@ -3834,7 +4306,7 @@
           <w:color w:val="111827"/>
           <w:sz w:val="22"/>
         </w:rPr>
-        <w:t>. III-1 covers the aggregate, III-2 covers deterministic execution and reset, III-3 covers versioned profiles, and III-4 covers memory regions, snapshots, persistence, and corruption.</w:t>
+        <w:t>. III-1 covers the aggregate, III-2 covers deterministic execution and reset, III-3 covers versioned profiles, III-4 covers memory regions, snapshots, persistence, and corruption, and III-5 covers fault lifecycle and DTC intent.</w:t>
       </w:r>
     </w:p>
     <w:p>
@@ -4041,6 +4513,46 @@
           <w:sz w:val="22"/>
         </w:rPr>
         <w:t>Canonical checksums identify snapshot content without copying complete memory into audit logs. An explicit corruption seed, bounded flip count, optimistic version, and persisted command ID make fault injection repeatable and retry-safe.</w:t>
+      </w:r>
+    </w:p>
+    <w:p>
+      <w:pPr>
+        <w:pStyle w:val="Heading2"/>
+        <w:keepNext/>
+        <w:keepLines/>
+      </w:pPr>
+      <w:r>
+        <w:t>ADR-ECU-010 — Use Logical-Time Observations for Fault Debounce</w:t>
+      </w:r>
+    </w:p>
+    <w:p>
+      <w:r>
+        <w:rPr>
+          <w:rFonts w:ascii="Calibri" w:hAnsi="Calibri"/>
+          <w:color w:val="111827"/>
+          <w:sz w:val="22"/>
+        </w:rPr>
+        <w:t>Wall-clock timers make simulations host-dependent. Explicit detected/absent observations evaluated against bounded thresholds at the ECU logical time make confirmation and healing reproducible.</w:t>
+      </w:r>
+    </w:p>
+    <w:p>
+      <w:pPr>
+        <w:pStyle w:val="Heading2"/>
+        <w:keepNext/>
+        <w:keepLines/>
+      </w:pPr>
+      <w:r>
+        <w:t>ADR-ECU-011 — Keep the DTC Bridge Protocol-Independent</w:t>
+      </w:r>
+    </w:p>
+    <w:p>
+      <w:r>
+        <w:rPr>
+          <w:rFonts w:ascii="Calibri" w:hAnsi="Calibri"/>
+          <w:color w:val="111827"/>
+          <w:sz w:val="22"/>
+        </w:rPr>
+        <w:t>The ECU owns fault truth, while Diagnostics will own UDS identifiers, status bytes, and services. Publishing diagnostic intent prevents both domains from creating competing fault representations.</w:t>
       </w:r>
     </w:p>
     <w:p>
@@ -8795,6 +9307,1023 @@
         <w:keepLines/>
       </w:pPr>
       <w:r>
+        <w:t>11.4 III-5 Verification</w:t>
+      </w:r>
+    </w:p>
+    <w:tbl>
+      <w:tblPr>
+        <w:tblW w:type="dxa" w:w="9360"/>
+        <w:jc w:val="left"/>
+        <w:tblLayout w:type="fixed"/>
+        <w:tblLook w:firstColumn="1" w:firstRow="1" w:lastColumn="0" w:lastRow="0" w:noHBand="0" w:noVBand="1" w:val="04A0"/>
+        <w:tblInd w:w="120" w:type="dxa"/>
+        <w:tblBorders>
+          <w:top w:val="single" w:sz="6" w:color="B8C4D1"/>
+          <w:left w:val="single" w:sz="6" w:color="B8C4D1"/>
+          <w:bottom w:val="single" w:sz="6" w:color="B8C4D1"/>
+          <w:right w:val="single" w:sz="6" w:color="B8C4D1"/>
+          <w:insideH w:val="single" w:sz="6" w:color="B8C4D1"/>
+          <w:insideV w:val="single" w:sz="6" w:color="B8C4D1"/>
+        </w:tblBorders>
+      </w:tblPr>
+      <w:tblGrid>
+        <w:gridCol w:w="1650"/>
+        <w:gridCol w:w="4450"/>
+        <w:gridCol w:w="3260"/>
+      </w:tblGrid>
+      <w:tr>
+        <w:trPr>
+          <w:tblHeader w:val="true"/>
+          <w:cantSplit/>
+        </w:trPr>
+        <w:tc>
+          <w:tcPr>
+            <w:tcW w:type="dxa" w:w="1650"/>
+            <w:tcMar>
+              <w:top w:w="80" w:type="dxa"/>
+              <w:start w:w="120" w:type="dxa"/>
+              <w:bottom w:w="80" w:type="dxa"/>
+              <w:end w:w="120" w:type="dxa"/>
+            </w:tcMar>
+            <w:vAlign w:val="center"/>
+            <w:shd w:fill="E8EEF5"/>
+          </w:tcPr>
+          <w:p>
+            <w:pPr>
+              <w:spacing w:before="0" w:after="40" w:line="252" w:lineRule="auto"/>
+              <w:jc w:val="center"/>
+            </w:pPr>
+            <w:r>
+              <w:rPr>
+                <w:rFonts w:ascii="Calibri" w:hAnsi="Calibri"/>
+                <w:b/>
+                <w:color w:val="0B2545"/>
+                <w:sz w:val="17"/>
+              </w:rPr>
+              <w:t>Test</w:t>
+            </w:r>
+          </w:p>
+        </w:tc>
+        <w:tc>
+          <w:tcPr>
+            <w:tcW w:type="dxa" w:w="4450"/>
+            <w:tcMar>
+              <w:top w:w="80" w:type="dxa"/>
+              <w:start w:w="120" w:type="dxa"/>
+              <w:bottom w:w="80" w:type="dxa"/>
+              <w:end w:w="120" w:type="dxa"/>
+            </w:tcMar>
+            <w:vAlign w:val="center"/>
+            <w:shd w:fill="E8EEF5"/>
+          </w:tcPr>
+          <w:p>
+            <w:pPr>
+              <w:spacing w:before="0" w:after="40" w:line="252" w:lineRule="auto"/>
+              <w:jc w:val="left"/>
+            </w:pPr>
+            <w:r>
+              <w:rPr>
+                <w:rFonts w:ascii="Calibri" w:hAnsi="Calibri"/>
+                <w:b/>
+                <w:color w:val="0B2545"/>
+                <w:sz w:val="17"/>
+              </w:rPr>
+              <w:t>Objective</w:t>
+            </w:r>
+          </w:p>
+        </w:tc>
+        <w:tc>
+          <w:tcPr>
+            <w:tcW w:type="dxa" w:w="3260"/>
+            <w:tcMar>
+              <w:top w:w="80" w:type="dxa"/>
+              <w:start w:w="120" w:type="dxa"/>
+              <w:bottom w:w="80" w:type="dxa"/>
+              <w:end w:w="120" w:type="dxa"/>
+            </w:tcMar>
+            <w:vAlign w:val="center"/>
+            <w:shd w:fill="E8EEF5"/>
+          </w:tcPr>
+          <w:p>
+            <w:pPr>
+              <w:spacing w:before="0" w:after="40" w:line="252" w:lineRule="auto"/>
+              <w:jc w:val="left"/>
+            </w:pPr>
+            <w:r>
+              <w:rPr>
+                <w:rFonts w:ascii="Calibri" w:hAnsi="Calibri"/>
+                <w:b/>
+                <w:color w:val="0B2545"/>
+                <w:sz w:val="17"/>
+              </w:rPr>
+              <w:t>Level</w:t>
+            </w:r>
+          </w:p>
+        </w:tc>
+      </w:tr>
+      <w:tr>
+        <w:trPr>
+          <w:cantSplit/>
+        </w:trPr>
+        <w:tc>
+          <w:tcPr>
+            <w:tcW w:type="dxa" w:w="1650"/>
+            <w:tcMar>
+              <w:top w:w="80" w:type="dxa"/>
+              <w:start w:w="120" w:type="dxa"/>
+              <w:bottom w:w="80" w:type="dxa"/>
+              <w:end w:w="120" w:type="dxa"/>
+            </w:tcMar>
+            <w:vAlign w:val="center"/>
+            <w:shd w:fill="FFFFFF"/>
+          </w:tcPr>
+          <w:p>
+            <w:pPr>
+              <w:spacing w:before="0" w:after="40" w:line="252" w:lineRule="auto"/>
+              <w:jc w:val="center"/>
+            </w:pPr>
+            <w:r>
+              <w:rPr>
+                <w:rFonts w:ascii="Calibri" w:hAnsi="Calibri"/>
+                <w:b w:val="0"/>
+                <w:color w:val="111827"/>
+                <w:sz w:val="17"/>
+              </w:rPr>
+              <w:t>Confirmation debounce</w:t>
+            </w:r>
+          </w:p>
+        </w:tc>
+        <w:tc>
+          <w:tcPr>
+            <w:tcW w:type="dxa" w:w="4450"/>
+            <w:tcMar>
+              <w:top w:w="80" w:type="dxa"/>
+              <w:start w:w="120" w:type="dxa"/>
+              <w:bottom w:w="80" w:type="dxa"/>
+              <w:end w:w="120" w:type="dxa"/>
+            </w:tcMar>
+            <w:vAlign w:val="center"/>
+            <w:shd w:fill="FFFFFF"/>
+          </w:tcPr>
+          <w:p>
+            <w:pPr>
+              <w:spacing w:before="0" w:after="40" w:line="252" w:lineRule="auto"/>
+              <w:jc w:val="left"/>
+            </w:pPr>
+            <w:r>
+              <w:rPr>
+                <w:rFonts w:ascii="Calibri" w:hAnsi="Calibri"/>
+                <w:b w:val="0"/>
+                <w:color w:val="111827"/>
+                <w:sz w:val="17"/>
+              </w:rPr>
+              <w:t>Confirm only when the configured detection threshold is reached.</w:t>
+            </w:r>
+          </w:p>
+        </w:tc>
+        <w:tc>
+          <w:tcPr>
+            <w:tcW w:type="dxa" w:w="3260"/>
+            <w:tcMar>
+              <w:top w:w="80" w:type="dxa"/>
+              <w:start w:w="120" w:type="dxa"/>
+              <w:bottom w:w="80" w:type="dxa"/>
+              <w:end w:w="120" w:type="dxa"/>
+            </w:tcMar>
+            <w:vAlign w:val="center"/>
+            <w:shd w:fill="FFFFFF"/>
+          </w:tcPr>
+          <w:p>
+            <w:pPr>
+              <w:spacing w:before="0" w:after="40" w:line="252" w:lineRule="auto"/>
+              <w:jc w:val="left"/>
+            </w:pPr>
+            <w:r>
+              <w:rPr>
+                <w:rFonts w:ascii="Calibri" w:hAnsi="Calibri"/>
+                <w:b w:val="0"/>
+                <w:color w:val="111827"/>
+                <w:sz w:val="17"/>
+              </w:rPr>
+              <w:t>Service</w:t>
+            </w:r>
+          </w:p>
+        </w:tc>
+      </w:tr>
+      <w:tr>
+        <w:trPr>
+          <w:cantSplit/>
+        </w:trPr>
+        <w:tc>
+          <w:tcPr>
+            <w:tcW w:type="dxa" w:w="1650"/>
+            <w:tcMar>
+              <w:top w:w="80" w:type="dxa"/>
+              <w:start w:w="120" w:type="dxa"/>
+              <w:bottom w:w="80" w:type="dxa"/>
+              <w:end w:w="120" w:type="dxa"/>
+            </w:tcMar>
+            <w:vAlign w:val="center"/>
+            <w:shd w:fill="FFFFFF"/>
+          </w:tcPr>
+          <w:p>
+            <w:pPr>
+              <w:spacing w:before="0" w:after="40" w:line="252" w:lineRule="auto"/>
+              <w:jc w:val="center"/>
+            </w:pPr>
+            <w:r>
+              <w:rPr>
+                <w:rFonts w:ascii="Calibri" w:hAnsi="Calibri"/>
+                <w:b w:val="0"/>
+                <w:color w:val="111827"/>
+                <w:sz w:val="17"/>
+              </w:rPr>
+              <w:t>Healing debounce</w:t>
+            </w:r>
+          </w:p>
+        </w:tc>
+        <w:tc>
+          <w:tcPr>
+            <w:tcW w:type="dxa" w:w="4450"/>
+            <w:tcMar>
+              <w:top w:w="80" w:type="dxa"/>
+              <w:start w:w="120" w:type="dxa"/>
+              <w:bottom w:w="80" w:type="dxa"/>
+              <w:end w:w="120" w:type="dxa"/>
+            </w:tcMar>
+            <w:vAlign w:val="center"/>
+            <w:shd w:fill="FFFFFF"/>
+          </w:tcPr>
+          <w:p>
+            <w:pPr>
+              <w:spacing w:before="0" w:after="40" w:line="252" w:lineRule="auto"/>
+              <w:jc w:val="left"/>
+            </w:pPr>
+            <w:r>
+              <w:rPr>
+                <w:rFonts w:ascii="Calibri" w:hAnsi="Calibri"/>
+                <w:b w:val="0"/>
+                <w:color w:val="111827"/>
+                <w:sz w:val="17"/>
+              </w:rPr>
+              <w:t>Heal only after the configured consecutive-absence threshold.</w:t>
+            </w:r>
+          </w:p>
+        </w:tc>
+        <w:tc>
+          <w:tcPr>
+            <w:tcW w:type="dxa" w:w="3260"/>
+            <w:tcMar>
+              <w:top w:w="80" w:type="dxa"/>
+              <w:start w:w="120" w:type="dxa"/>
+              <w:bottom w:w="80" w:type="dxa"/>
+              <w:end w:w="120" w:type="dxa"/>
+            </w:tcMar>
+            <w:vAlign w:val="center"/>
+            <w:shd w:fill="FFFFFF"/>
+          </w:tcPr>
+          <w:p>
+            <w:pPr>
+              <w:spacing w:before="0" w:after="40" w:line="252" w:lineRule="auto"/>
+              <w:jc w:val="left"/>
+            </w:pPr>
+            <w:r>
+              <w:rPr>
+                <w:rFonts w:ascii="Calibri" w:hAnsi="Calibri"/>
+                <w:b w:val="0"/>
+                <w:color w:val="111827"/>
+                <w:sz w:val="17"/>
+              </w:rPr>
+              <w:t>Service</w:t>
+            </w:r>
+          </w:p>
+        </w:tc>
+      </w:tr>
+      <w:tr>
+        <w:trPr>
+          <w:cantSplit/>
+        </w:trPr>
+        <w:tc>
+          <w:tcPr>
+            <w:tcW w:type="dxa" w:w="1650"/>
+            <w:tcMar>
+              <w:top w:w="80" w:type="dxa"/>
+              <w:start w:w="120" w:type="dxa"/>
+              <w:bottom w:w="80" w:type="dxa"/>
+              <w:end w:w="120" w:type="dxa"/>
+            </w:tcMar>
+            <w:vAlign w:val="center"/>
+            <w:shd w:fill="FFFFFF"/>
+          </w:tcPr>
+          <w:p>
+            <w:pPr>
+              <w:spacing w:before="0" w:after="40" w:line="252" w:lineRule="auto"/>
+              <w:jc w:val="center"/>
+            </w:pPr>
+            <w:r>
+              <w:rPr>
+                <w:rFonts w:ascii="Calibri" w:hAnsi="Calibri"/>
+                <w:b w:val="0"/>
+                <w:color w:val="111827"/>
+                <w:sz w:val="17"/>
+              </w:rPr>
+              <w:t>Logical timestamps</w:t>
+            </w:r>
+          </w:p>
+        </w:tc>
+        <w:tc>
+          <w:tcPr>
+            <w:tcW w:type="dxa" w:w="4450"/>
+            <w:tcMar>
+              <w:top w:w="80" w:type="dxa"/>
+              <w:start w:w="120" w:type="dxa"/>
+              <w:bottom w:w="80" w:type="dxa"/>
+              <w:end w:w="120" w:type="dxa"/>
+            </w:tcMar>
+            <w:vAlign w:val="center"/>
+            <w:shd w:fill="FFFFFF"/>
+          </w:tcPr>
+          <w:p>
+            <w:pPr>
+              <w:spacing w:before="0" w:after="40" w:line="252" w:lineRule="auto"/>
+              <w:jc w:val="left"/>
+            </w:pPr>
+            <w:r>
+              <w:rPr>
+                <w:rFonts w:ascii="Calibri" w:hAnsi="Calibri"/>
+                <w:b w:val="0"/>
+                <w:color w:val="111827"/>
+                <w:sz w:val="17"/>
+              </w:rPr>
+              <w:t>Derive first-seen, last-seen, confirmed, and healed evidence from ECU time.</w:t>
+            </w:r>
+          </w:p>
+        </w:tc>
+        <w:tc>
+          <w:tcPr>
+            <w:tcW w:type="dxa" w:w="3260"/>
+            <w:tcMar>
+              <w:top w:w="80" w:type="dxa"/>
+              <w:start w:w="120" w:type="dxa"/>
+              <w:bottom w:w="80" w:type="dxa"/>
+              <w:end w:w="120" w:type="dxa"/>
+            </w:tcMar>
+            <w:vAlign w:val="center"/>
+            <w:shd w:fill="FFFFFF"/>
+          </w:tcPr>
+          <w:p>
+            <w:pPr>
+              <w:spacing w:before="0" w:after="40" w:line="252" w:lineRule="auto"/>
+              <w:jc w:val="left"/>
+            </w:pPr>
+            <w:r>
+              <w:rPr>
+                <w:rFonts w:ascii="Calibri" w:hAnsi="Calibri"/>
+                <w:b w:val="0"/>
+                <w:color w:val="111827"/>
+                <w:sz w:val="17"/>
+              </w:rPr>
+              <w:t>Service</w:t>
+            </w:r>
+          </w:p>
+        </w:tc>
+      </w:tr>
+      <w:tr>
+        <w:trPr>
+          <w:cantSplit/>
+        </w:trPr>
+        <w:tc>
+          <w:tcPr>
+            <w:tcW w:type="dxa" w:w="1650"/>
+            <w:tcMar>
+              <w:top w:w="80" w:type="dxa"/>
+              <w:start w:w="120" w:type="dxa"/>
+              <w:bottom w:w="80" w:type="dxa"/>
+              <w:end w:w="120" w:type="dxa"/>
+            </w:tcMar>
+            <w:vAlign w:val="center"/>
+            <w:shd w:fill="FFFFFF"/>
+          </w:tcPr>
+          <w:p>
+            <w:pPr>
+              <w:spacing w:before="0" w:after="40" w:line="252" w:lineRule="auto"/>
+              <w:jc w:val="center"/>
+            </w:pPr>
+            <w:r>
+              <w:rPr>
+                <w:rFonts w:ascii="Calibri" w:hAnsi="Calibri"/>
+                <w:b w:val="0"/>
+                <w:color w:val="111827"/>
+                <w:sz w:val="17"/>
+              </w:rPr>
+              <w:t>Critical transition</w:t>
+            </w:r>
+          </w:p>
+        </w:tc>
+        <w:tc>
+          <w:tcPr>
+            <w:tcW w:type="dxa" w:w="4450"/>
+            <w:tcMar>
+              <w:top w:w="80" w:type="dxa"/>
+              <w:start w:w="120" w:type="dxa"/>
+              <w:bottom w:w="80" w:type="dxa"/>
+              <w:end w:w="120" w:type="dxa"/>
+            </w:tcMar>
+            <w:vAlign w:val="center"/>
+            <w:shd w:fill="FFFFFF"/>
+          </w:tcPr>
+          <w:p>
+            <w:pPr>
+              <w:spacing w:before="0" w:after="40" w:line="252" w:lineRule="auto"/>
+              <w:jc w:val="left"/>
+            </w:pPr>
+            <w:r>
+              <w:rPr>
+                <w:rFonts w:ascii="Calibri" w:hAnsi="Calibri"/>
+                <w:b w:val="0"/>
+                <w:color w:val="111827"/>
+                <w:sz w:val="17"/>
+              </w:rPr>
+              <w:t>Move an ECU to fault state when a critical fault confirms.</w:t>
+            </w:r>
+          </w:p>
+        </w:tc>
+        <w:tc>
+          <w:tcPr>
+            <w:tcW w:type="dxa" w:w="3260"/>
+            <w:tcMar>
+              <w:top w:w="80" w:type="dxa"/>
+              <w:start w:w="120" w:type="dxa"/>
+              <w:bottom w:w="80" w:type="dxa"/>
+              <w:end w:w="120" w:type="dxa"/>
+            </w:tcMar>
+            <w:vAlign w:val="center"/>
+            <w:shd w:fill="FFFFFF"/>
+          </w:tcPr>
+          <w:p>
+            <w:pPr>
+              <w:spacing w:before="0" w:after="40" w:line="252" w:lineRule="auto"/>
+              <w:jc w:val="left"/>
+            </w:pPr>
+            <w:r>
+              <w:rPr>
+                <w:rFonts w:ascii="Calibri" w:hAnsi="Calibri"/>
+                <w:b w:val="0"/>
+                <w:color w:val="111827"/>
+                <w:sz w:val="17"/>
+              </w:rPr>
+              <w:t>Service</w:t>
+            </w:r>
+          </w:p>
+        </w:tc>
+      </w:tr>
+      <w:tr>
+        <w:trPr>
+          <w:cantSplit/>
+        </w:trPr>
+        <w:tc>
+          <w:tcPr>
+            <w:tcW w:type="dxa" w:w="1650"/>
+            <w:tcMar>
+              <w:top w:w="80" w:type="dxa"/>
+              <w:start w:w="120" w:type="dxa"/>
+              <w:bottom w:w="80" w:type="dxa"/>
+              <w:end w:w="120" w:type="dxa"/>
+            </w:tcMar>
+            <w:vAlign w:val="center"/>
+            <w:shd w:fill="FFFFFF"/>
+          </w:tcPr>
+          <w:p>
+            <w:pPr>
+              <w:spacing w:before="0" w:after="40" w:line="252" w:lineRule="auto"/>
+              <w:jc w:val="center"/>
+            </w:pPr>
+            <w:r>
+              <w:rPr>
+                <w:rFonts w:ascii="Calibri" w:hAnsi="Calibri"/>
+                <w:b w:val="0"/>
+                <w:color w:val="111827"/>
+                <w:sz w:val="17"/>
+              </w:rPr>
+              <w:t>Latched absence</w:t>
+            </w:r>
+          </w:p>
+        </w:tc>
+        <w:tc>
+          <w:tcPr>
+            <w:tcW w:type="dxa" w:w="4450"/>
+            <w:tcMar>
+              <w:top w:w="80" w:type="dxa"/>
+              <w:start w:w="120" w:type="dxa"/>
+              <w:bottom w:w="80" w:type="dxa"/>
+              <w:end w:w="120" w:type="dxa"/>
+            </w:tcMar>
+            <w:vAlign w:val="center"/>
+            <w:shd w:fill="FFFFFF"/>
+          </w:tcPr>
+          <w:p>
+            <w:pPr>
+              <w:spacing w:before="0" w:after="40" w:line="252" w:lineRule="auto"/>
+              <w:jc w:val="left"/>
+            </w:pPr>
+            <w:r>
+              <w:rPr>
+                <w:rFonts w:ascii="Calibri" w:hAnsi="Calibri"/>
+                <w:b w:val="0"/>
+                <w:color w:val="111827"/>
+                <w:sz w:val="17"/>
+              </w:rPr>
+              <w:t>Preserve an active confirmed latch despite absent observations.</w:t>
+            </w:r>
+          </w:p>
+        </w:tc>
+        <w:tc>
+          <w:tcPr>
+            <w:tcW w:type="dxa" w:w="3260"/>
+            <w:tcMar>
+              <w:top w:w="80" w:type="dxa"/>
+              <w:start w:w="120" w:type="dxa"/>
+              <w:bottom w:w="80" w:type="dxa"/>
+              <w:end w:w="120" w:type="dxa"/>
+            </w:tcMar>
+            <w:vAlign w:val="center"/>
+            <w:shd w:fill="FFFFFF"/>
+          </w:tcPr>
+          <w:p>
+            <w:pPr>
+              <w:spacing w:before="0" w:after="40" w:line="252" w:lineRule="auto"/>
+              <w:jc w:val="left"/>
+            </w:pPr>
+            <w:r>
+              <w:rPr>
+                <w:rFonts w:ascii="Calibri" w:hAnsi="Calibri"/>
+                <w:b w:val="0"/>
+                <w:color w:val="111827"/>
+                <w:sz w:val="17"/>
+              </w:rPr>
+              <w:t>Service</w:t>
+            </w:r>
+          </w:p>
+        </w:tc>
+      </w:tr>
+      <w:tr>
+        <w:trPr>
+          <w:cantSplit/>
+        </w:trPr>
+        <w:tc>
+          <w:tcPr>
+            <w:tcW w:type="dxa" w:w="1650"/>
+            <w:tcMar>
+              <w:top w:w="80" w:type="dxa"/>
+              <w:start w:w="120" w:type="dxa"/>
+              <w:bottom w:w="80" w:type="dxa"/>
+              <w:end w:w="120" w:type="dxa"/>
+            </w:tcMar>
+            <w:vAlign w:val="center"/>
+            <w:shd w:fill="FFFFFF"/>
+          </w:tcPr>
+          <w:p>
+            <w:pPr>
+              <w:spacing w:before="0" w:after="40" w:line="252" w:lineRule="auto"/>
+              <w:jc w:val="center"/>
+            </w:pPr>
+            <w:r>
+              <w:rPr>
+                <w:rFonts w:ascii="Calibri" w:hAnsi="Calibri"/>
+                <w:b w:val="0"/>
+                <w:color w:val="111827"/>
+                <w:sz w:val="17"/>
+              </w:rPr>
+              <w:t>Explicit clear</w:t>
+            </w:r>
+          </w:p>
+        </w:tc>
+        <w:tc>
+          <w:tcPr>
+            <w:tcW w:type="dxa" w:w="4450"/>
+            <w:tcMar>
+              <w:top w:w="80" w:type="dxa"/>
+              <w:start w:w="120" w:type="dxa"/>
+              <w:bottom w:w="80" w:type="dxa"/>
+              <w:end w:w="120" w:type="dxa"/>
+            </w:tcMar>
+            <w:vAlign w:val="center"/>
+            <w:shd w:fill="FFFFFF"/>
+          </w:tcPr>
+          <w:p>
+            <w:pPr>
+              <w:spacing w:before="0" w:after="40" w:line="252" w:lineRule="auto"/>
+              <w:jc w:val="left"/>
+            </w:pPr>
+            <w:r>
+              <w:rPr>
+                <w:rFonts w:ascii="Calibri" w:hAnsi="Calibri"/>
+                <w:b w:val="0"/>
+                <w:color w:val="111827"/>
+                <w:sz w:val="17"/>
+              </w:rPr>
+              <w:t>Heal and unlatch a fault only through an authorized clear command.</w:t>
+            </w:r>
+          </w:p>
+        </w:tc>
+        <w:tc>
+          <w:tcPr>
+            <w:tcW w:type="dxa" w:w="3260"/>
+            <w:tcMar>
+              <w:top w:w="80" w:type="dxa"/>
+              <w:start w:w="120" w:type="dxa"/>
+              <w:bottom w:w="80" w:type="dxa"/>
+              <w:end w:w="120" w:type="dxa"/>
+            </w:tcMar>
+            <w:vAlign w:val="center"/>
+            <w:shd w:fill="FFFFFF"/>
+          </w:tcPr>
+          <w:p>
+            <w:pPr>
+              <w:spacing w:before="0" w:after="40" w:line="252" w:lineRule="auto"/>
+              <w:jc w:val="left"/>
+            </w:pPr>
+            <w:r>
+              <w:rPr>
+                <w:rFonts w:ascii="Calibri" w:hAnsi="Calibri"/>
+                <w:b w:val="0"/>
+                <w:color w:val="111827"/>
+                <w:sz w:val="17"/>
+              </w:rPr>
+              <w:t>Service/API</w:t>
+            </w:r>
+          </w:p>
+        </w:tc>
+      </w:tr>
+      <w:tr>
+        <w:trPr>
+          <w:cantSplit/>
+        </w:trPr>
+        <w:tc>
+          <w:tcPr>
+            <w:tcW w:type="dxa" w:w="1650"/>
+            <w:tcMar>
+              <w:top w:w="80" w:type="dxa"/>
+              <w:start w:w="120" w:type="dxa"/>
+              <w:bottom w:w="80" w:type="dxa"/>
+              <w:end w:w="120" w:type="dxa"/>
+            </w:tcMar>
+            <w:vAlign w:val="center"/>
+            <w:shd w:fill="FFFFFF"/>
+          </w:tcPr>
+          <w:p>
+            <w:pPr>
+              <w:spacing w:before="0" w:after="40" w:line="252" w:lineRule="auto"/>
+              <w:jc w:val="center"/>
+            </w:pPr>
+            <w:r>
+              <w:rPr>
+                <w:rFonts w:ascii="Calibri" w:hAnsi="Calibri"/>
+                <w:b w:val="0"/>
+                <w:color w:val="111827"/>
+                <w:sz w:val="17"/>
+              </w:rPr>
+              <w:t>Exact replay</w:t>
+            </w:r>
+          </w:p>
+        </w:tc>
+        <w:tc>
+          <w:tcPr>
+            <w:tcW w:type="dxa" w:w="4450"/>
+            <w:tcMar>
+              <w:top w:w="80" w:type="dxa"/>
+              <w:start w:w="120" w:type="dxa"/>
+              <w:bottom w:w="80" w:type="dxa"/>
+              <w:end w:w="120" w:type="dxa"/>
+            </w:tcMar>
+            <w:vAlign w:val="center"/>
+            <w:shd w:fill="FFFFFF"/>
+          </w:tcPr>
+          <w:p>
+            <w:pPr>
+              <w:spacing w:before="0" w:after="40" w:line="252" w:lineRule="auto"/>
+              <w:jc w:val="left"/>
+            </w:pPr>
+            <w:r>
+              <w:rPr>
+                <w:rFonts w:ascii="Calibri" w:hAnsi="Calibri"/>
+                <w:b w:val="0"/>
+                <w:color w:val="111827"/>
+                <w:sz w:val="17"/>
+              </w:rPr>
+              <w:t>Avoid incrementing lifecycle counters or versions twice.</w:t>
+            </w:r>
+          </w:p>
+        </w:tc>
+        <w:tc>
+          <w:tcPr>
+            <w:tcW w:type="dxa" w:w="3260"/>
+            <w:tcMar>
+              <w:top w:w="80" w:type="dxa"/>
+              <w:start w:w="120" w:type="dxa"/>
+              <w:bottom w:w="80" w:type="dxa"/>
+              <w:end w:w="120" w:type="dxa"/>
+            </w:tcMar>
+            <w:vAlign w:val="center"/>
+            <w:shd w:fill="FFFFFF"/>
+          </w:tcPr>
+          <w:p>
+            <w:pPr>
+              <w:spacing w:before="0" w:after="40" w:line="252" w:lineRule="auto"/>
+              <w:jc w:val="left"/>
+            </w:pPr>
+            <w:r>
+              <w:rPr>
+                <w:rFonts w:ascii="Calibri" w:hAnsi="Calibri"/>
+                <w:b w:val="0"/>
+                <w:color w:val="111827"/>
+                <w:sz w:val="17"/>
+              </w:rPr>
+              <w:t>Service</w:t>
+            </w:r>
+          </w:p>
+        </w:tc>
+      </w:tr>
+      <w:tr>
+        <w:trPr>
+          <w:cantSplit/>
+        </w:trPr>
+        <w:tc>
+          <w:tcPr>
+            <w:tcW w:type="dxa" w:w="1650"/>
+            <w:tcMar>
+              <w:top w:w="80" w:type="dxa"/>
+              <w:start w:w="120" w:type="dxa"/>
+              <w:bottom w:w="80" w:type="dxa"/>
+              <w:end w:w="120" w:type="dxa"/>
+            </w:tcMar>
+            <w:vAlign w:val="center"/>
+            <w:shd w:fill="FFFFFF"/>
+          </w:tcPr>
+          <w:p>
+            <w:pPr>
+              <w:spacing w:before="0" w:after="40" w:line="252" w:lineRule="auto"/>
+              <w:jc w:val="center"/>
+            </w:pPr>
+            <w:r>
+              <w:rPr>
+                <w:rFonts w:ascii="Calibri" w:hAnsi="Calibri"/>
+                <w:b w:val="0"/>
+                <w:color w:val="111827"/>
+                <w:sz w:val="17"/>
+              </w:rPr>
+              <w:t>Policy conflict</w:t>
+            </w:r>
+          </w:p>
+        </w:tc>
+        <w:tc>
+          <w:tcPr>
+            <w:tcW w:type="dxa" w:w="4450"/>
+            <w:tcMar>
+              <w:top w:w="80" w:type="dxa"/>
+              <w:start w:w="120" w:type="dxa"/>
+              <w:bottom w:w="80" w:type="dxa"/>
+              <w:end w:w="120" w:type="dxa"/>
+            </w:tcMar>
+            <w:vAlign w:val="center"/>
+            <w:shd w:fill="FFFFFF"/>
+          </w:tcPr>
+          <w:p>
+            <w:pPr>
+              <w:spacing w:before="0" w:after="40" w:line="252" w:lineRule="auto"/>
+              <w:jc w:val="left"/>
+            </w:pPr>
+            <w:r>
+              <w:rPr>
+                <w:rFonts w:ascii="Calibri" w:hAnsi="Calibri"/>
+                <w:b w:val="0"/>
+                <w:color w:val="111827"/>
+                <w:sz w:val="17"/>
+              </w:rPr>
+              <w:t>Reject policy changes while one fault activation is active.</w:t>
+            </w:r>
+          </w:p>
+        </w:tc>
+        <w:tc>
+          <w:tcPr>
+            <w:tcW w:type="dxa" w:w="3260"/>
+            <w:tcMar>
+              <w:top w:w="80" w:type="dxa"/>
+              <w:start w:w="120" w:type="dxa"/>
+              <w:bottom w:w="80" w:type="dxa"/>
+              <w:end w:w="120" w:type="dxa"/>
+            </w:tcMar>
+            <w:vAlign w:val="center"/>
+            <w:shd w:fill="FFFFFF"/>
+          </w:tcPr>
+          <w:p>
+            <w:pPr>
+              <w:spacing w:before="0" w:after="40" w:line="252" w:lineRule="auto"/>
+              <w:jc w:val="left"/>
+            </w:pPr>
+            <w:r>
+              <w:rPr>
+                <w:rFonts w:ascii="Calibri" w:hAnsi="Calibri"/>
+                <w:b w:val="0"/>
+                <w:color w:val="111827"/>
+                <w:sz w:val="17"/>
+              </w:rPr>
+              <w:t>Service/API</w:t>
+            </w:r>
+          </w:p>
+        </w:tc>
+      </w:tr>
+      <w:tr>
+        <w:trPr>
+          <w:cantSplit/>
+        </w:trPr>
+        <w:tc>
+          <w:tcPr>
+            <w:tcW w:type="dxa" w:w="1650"/>
+            <w:tcMar>
+              <w:top w:w="80" w:type="dxa"/>
+              <w:start w:w="120" w:type="dxa"/>
+              <w:bottom w:w="80" w:type="dxa"/>
+              <w:end w:w="120" w:type="dxa"/>
+            </w:tcMar>
+            <w:vAlign w:val="center"/>
+            <w:shd w:fill="FFFFFF"/>
+          </w:tcPr>
+          <w:p>
+            <w:pPr>
+              <w:spacing w:before="0" w:after="40" w:line="252" w:lineRule="auto"/>
+              <w:jc w:val="center"/>
+            </w:pPr>
+            <w:r>
+              <w:rPr>
+                <w:rFonts w:ascii="Calibri" w:hAnsi="Calibri"/>
+                <w:b w:val="0"/>
+                <w:color w:val="111827"/>
+                <w:sz w:val="17"/>
+              </w:rPr>
+              <w:t>DTC projection</w:t>
+            </w:r>
+          </w:p>
+        </w:tc>
+        <w:tc>
+          <w:tcPr>
+            <w:tcW w:type="dxa" w:w="4450"/>
+            <w:tcMar>
+              <w:top w:w="80" w:type="dxa"/>
+              <w:start w:w="120" w:type="dxa"/>
+              <w:bottom w:w="80" w:type="dxa"/>
+              <w:end w:w="120" w:type="dxa"/>
+            </w:tcMar>
+            <w:vAlign w:val="center"/>
+            <w:shd w:fill="FFFFFF"/>
+          </w:tcPr>
+          <w:p>
+            <w:pPr>
+              <w:spacing w:before="0" w:after="40" w:line="252" w:lineRule="auto"/>
+              <w:jc w:val="left"/>
+            </w:pPr>
+            <w:r>
+              <w:rPr>
+                <w:rFonts w:ascii="Calibri" w:hAnsi="Calibri"/>
+                <w:b w:val="0"/>
+                <w:color w:val="111827"/>
+                <w:sz w:val="17"/>
+              </w:rPr>
+              <w:t>Publish protocol-independent diagnostic intent without UDS coupling.</w:t>
+            </w:r>
+          </w:p>
+        </w:tc>
+        <w:tc>
+          <w:tcPr>
+            <w:tcW w:type="dxa" w:w="3260"/>
+            <w:tcMar>
+              <w:top w:w="80" w:type="dxa"/>
+              <w:start w:w="120" w:type="dxa"/>
+              <w:bottom w:w="80" w:type="dxa"/>
+              <w:end w:w="120" w:type="dxa"/>
+            </w:tcMar>
+            <w:vAlign w:val="center"/>
+            <w:shd w:fill="FFFFFF"/>
+          </w:tcPr>
+          <w:p>
+            <w:pPr>
+              <w:spacing w:before="0" w:after="40" w:line="252" w:lineRule="auto"/>
+              <w:jc w:val="left"/>
+            </w:pPr>
+            <w:r>
+              <w:rPr>
+                <w:rFonts w:ascii="Calibri" w:hAnsi="Calibri"/>
+                <w:b w:val="0"/>
+                <w:color w:val="111827"/>
+                <w:sz w:val="17"/>
+              </w:rPr>
+              <w:t>Unit/contract</w:t>
+            </w:r>
+          </w:p>
+        </w:tc>
+      </w:tr>
+      <w:tr>
+        <w:trPr>
+          <w:cantSplit/>
+        </w:trPr>
+        <w:tc>
+          <w:tcPr>
+            <w:tcW w:type="dxa" w:w="1650"/>
+            <w:tcMar>
+              <w:top w:w="80" w:type="dxa"/>
+              <w:start w:w="120" w:type="dxa"/>
+              <w:bottom w:w="80" w:type="dxa"/>
+              <w:end w:w="120" w:type="dxa"/>
+            </w:tcMar>
+            <w:vAlign w:val="center"/>
+            <w:shd w:fill="FFFFFF"/>
+          </w:tcPr>
+          <w:p>
+            <w:pPr>
+              <w:spacing w:before="0" w:after="40" w:line="252" w:lineRule="auto"/>
+              <w:jc w:val="center"/>
+            </w:pPr>
+            <w:r>
+              <w:rPr>
+                <w:rFonts w:ascii="Calibri" w:hAnsi="Calibri"/>
+                <w:b w:val="0"/>
+                <w:color w:val="111827"/>
+                <w:sz w:val="17"/>
+              </w:rPr>
+              <w:t>Fault RBAC and OpenAPI</w:t>
+            </w:r>
+          </w:p>
+        </w:tc>
+        <w:tc>
+          <w:tcPr>
+            <w:tcW w:type="dxa" w:w="4450"/>
+            <w:tcMar>
+              <w:top w:w="80" w:type="dxa"/>
+              <w:start w:w="120" w:type="dxa"/>
+              <w:bottom w:w="80" w:type="dxa"/>
+              <w:end w:w="120" w:type="dxa"/>
+            </w:tcMar>
+            <w:vAlign w:val="center"/>
+            <w:shd w:fill="FFFFFF"/>
+          </w:tcPr>
+          <w:p>
+            <w:pPr>
+              <w:spacing w:before="0" w:after="40" w:line="252" w:lineRule="auto"/>
+              <w:jc w:val="left"/>
+            </w:pPr>
+            <w:r>
+              <w:rPr>
+                <w:rFonts w:ascii="Calibri" w:hAnsi="Calibri"/>
+                <w:b w:val="0"/>
+                <w:color w:val="111827"/>
+                <w:sz w:val="17"/>
+              </w:rPr>
+              <w:t>Publish protected, typed lifecycle endpoints.</w:t>
+            </w:r>
+          </w:p>
+        </w:tc>
+        <w:tc>
+          <w:tcPr>
+            <w:tcW w:type="dxa" w:w="3260"/>
+            <w:tcMar>
+              <w:top w:w="80" w:type="dxa"/>
+              <w:start w:w="120" w:type="dxa"/>
+              <w:bottom w:w="80" w:type="dxa"/>
+              <w:end w:w="120" w:type="dxa"/>
+            </w:tcMar>
+            <w:vAlign w:val="center"/>
+            <w:shd w:fill="FFFFFF"/>
+          </w:tcPr>
+          <w:p>
+            <w:pPr>
+              <w:spacing w:before="0" w:after="40" w:line="252" w:lineRule="auto"/>
+              <w:jc w:val="left"/>
+            </w:pPr>
+            <w:r>
+              <w:rPr>
+                <w:rFonts w:ascii="Calibri" w:hAnsi="Calibri"/>
+                <w:b w:val="0"/>
+                <w:color w:val="111827"/>
+                <w:sz w:val="17"/>
+              </w:rPr>
+              <w:t>Contract/integration</w:t>
+            </w:r>
+          </w:p>
+        </w:tc>
+      </w:tr>
+    </w:tbl>
+    <w:p>
+      <w:pPr>
+        <w:spacing w:after="60"/>
+      </w:pPr>
+    </w:p>
+    <w:p>
+      <w:pPr>
+        <w:pStyle w:val="Heading1"/>
+        <w:keepNext/>
+        <w:keepLines/>
+      </w:pPr>
+      <w:r>
         <w:t>12. Implemented Evidence</w:t>
       </w:r>
     </w:p>
@@ -9084,6 +10613,39 @@
           <w:color w:val="111827"/>
           <w:sz w:val="22"/>
         </w:rPr>
+        <w:t xml:space="preserve">Fault events use </w:t>
+      </w:r>
+      <w:r>
+        <w:rPr>
+          <w:rFonts w:ascii="Consolas" w:hAnsi="Consolas"/>
+          <w:color w:val="1F4D78"/>
+          <w:sz w:val="19"/>
+        </w:rPr>
+        <w:t>atep.ecu.fault.lifecycle.changed.v1</w:t>
+      </w:r>
+      <w:r>
+        <w:rPr>
+          <w:rFonts w:ascii="Calibri" w:hAnsi="Calibri"/>
+          <w:color w:val="111827"/>
+          <w:sz w:val="22"/>
+        </w:rPr>
+        <w:t xml:space="preserve"> for observation and explicit-clear evidence.</w:t>
+      </w:r>
+    </w:p>
+    <w:p>
+      <w:pPr>
+        <w:pStyle w:val="ListBullet"/>
+        <w:numPr>
+          <w:ilvl w:val="0"/>
+          <w:numId w:val="14"/>
+        </w:numPr>
+      </w:pPr>
+      <w:r>
+        <w:rPr>
+          <w:rFonts w:ascii="Calibri" w:hAnsi="Calibri"/>
+          <w:color w:val="111827"/>
+          <w:sz w:val="22"/>
+        </w:rPr>
         <w:t>Automated tests cover validation, atomic evidence, concurrency, idempotency, permissions, and API contracts.</w:t>
       </w:r>
     </w:p>
@@ -9189,7 +10751,7 @@
           <w:color w:val="111827"/>
           <w:sz w:val="22"/>
         </w:rPr>
-        <w:t>Fault-to-DTC mapping belongs to the Diagnostics boundary and is not implemented here.</w:t>
+        <w:t>Actual DTC identifiers, status-byte semantics, and aging belong to the Diagnostics boundary.</w:t>
       </w:r>
     </w:p>
     <w:p>
@@ -9209,7 +10771,7 @@
           <w:color w:val="111827"/>
           <w:sz w:val="22"/>
         </w:rPr>
-        <w:t xml:space="preserve">The next increment adds fault activation lifecycle, debouncing, latching, healing, and a future DTC bridge. Later increments add CAN contracts and multi-ECU scenarios. See </w:t>
+        <w:t xml:space="preserve">The next increment adds CAN production/consumption contracts and gateway routing hooks without embedding a bus implementation. Later increments add multi-ECU scenarios. See </w:t>
       </w:r>
       <w:r>
         <w:rPr>
@@ -9459,6 +11021,57 @@
         <w:t>Design a corruption campaign that remains reproducible across CI machines.</w:t>
       </w:r>
     </w:p>
+    <w:p>
+      <w:pPr>
+        <w:pStyle w:val="ListNumber"/>
+        <w:numPr>
+          <w:ilvl w:val="0"/>
+          <w:numId w:val="17"/>
+        </w:numPr>
+      </w:pPr>
+      <w:r>
+        <w:rPr>
+          <w:rFonts w:ascii="Calibri" w:hAnsi="Calibri"/>
+          <w:color w:val="111827"/>
+          <w:sz w:val="22"/>
+        </w:rPr>
+        <w:t>Trace three detected observations and two absent observations through configurable thresholds.</w:t>
+      </w:r>
+    </w:p>
+    <w:p>
+      <w:pPr>
+        <w:pStyle w:val="ListNumber"/>
+        <w:numPr>
+          <w:ilvl w:val="0"/>
+          <w:numId w:val="17"/>
+        </w:numPr>
+      </w:pPr>
+      <w:r>
+        <w:rPr>
+          <w:rFonts w:ascii="Calibri" w:hAnsi="Calibri"/>
+          <w:color w:val="111827"/>
+          <w:sz w:val="22"/>
+        </w:rPr>
+        <w:t>Explain why a latched confirmed fault cannot heal from an absent observation alone.</w:t>
+      </w:r>
+    </w:p>
+    <w:p>
+      <w:pPr>
+        <w:pStyle w:val="ListNumber"/>
+        <w:numPr>
+          <w:ilvl w:val="0"/>
+          <w:numId w:val="17"/>
+        </w:numPr>
+      </w:pPr>
+      <w:r>
+        <w:rPr>
+          <w:rFonts w:ascii="Calibri" w:hAnsi="Calibri"/>
+          <w:color w:val="111827"/>
+          <w:sz w:val="22"/>
+        </w:rPr>
+        <w:t>Map a DTC candidate to future UDS responsibilities without assigning a DTC number in the ECU.</w:t>
+      </w:r>
+    </w:p>
     <w:sectPr>
       <w:headerReference w:type="default" r:id="rId9"/>
       <w:footerReference w:type="default" r:id="rId10"/>
@@ -9488,7 +11101,7 @@
         <w:color w:val="667085"/>
         <w:sz w:val="17"/>
       </w:rPr>
-      <w:t>ATEP Volume III Workbook  |  Version 0.4.0</w:t>
+      <w:t>ATEP Volume III Workbook  |  Version 0.5.0</w:t>
     </w:r>
     <w:r>
       <w:rPr>

</xml_diff>

<commit_message>
feat(ecus): add fault lifecycle management (#54)
</commit_message>
<xml_diff>
--- a/docs/ATEP_Volume_III_ECU_Simulator_Engineering_Workbook.docx
+++ b/docs/ATEP_Volume_III_ECU_Simulator_Engineering_Workbook.docx
@@ -143,7 +143,7 @@
                 <w:color w:val="0B2545"/>
                 <w:sz w:val="19"/>
               </w:rPr>
-              <w:t>0.4.0</w:t>
+              <w:t>0.5.0</w:t>
             </w:r>
           </w:p>
         </w:tc>
@@ -265,7 +265,7 @@
                 <w:color w:val="111827"/>
                 <w:sz w:val="19"/>
               </w:rPr>
-              <w:t>Living document - Increments III-1 through III-4 implemented</w:t>
+              <w:t>Living document - Increments III-1 through III-5 implemented</w:t>
             </w:r>
           </w:p>
         </w:tc>
@@ -656,6 +656,25 @@
           <w:color w:val="0B2545"/>
           <w:sz w:val="21"/>
         </w:rPr>
+        <w:t>11.4 III-5 Verification</w:t>
+      </w:r>
+    </w:p>
+    <w:p>
+      <w:pPr>
+        <w:pStyle w:val="ListNumber"/>
+        <w:numPr>
+          <w:ilvl w:val="0"/>
+          <w:numId w:val="10"/>
+        </w:numPr>
+        <w:ind w:left="216" w:firstLine="0"/>
+      </w:pPr>
+      <w:r>
+        <w:rPr>
+          <w:rFonts w:ascii="Calibri" w:hAnsi="Calibri"/>
+          <w:b/>
+          <w:color w:val="0B2545"/>
+          <w:sz w:val="21"/>
+        </w:rPr>
         <w:t>12. Implemented Evidence</w:t>
       </w:r>
     </w:p>
@@ -950,7 +969,7 @@
                 <w:color w:val="111827"/>
                 <w:sz w:val="17"/>
               </w:rPr>
-              <w:t>Increments III-1 through III-4</w:t>
+              <w:t>Increments III-1 through III-5</w:t>
             </w:r>
           </w:p>
         </w:tc>
@@ -1621,6 +1640,95 @@
           </w:p>
         </w:tc>
       </w:tr>
+      <w:tr>
+        <w:trPr>
+          <w:cantSplit/>
+        </w:trPr>
+        <w:tc>
+          <w:tcPr>
+            <w:tcW w:type="dxa" w:w="1650"/>
+            <w:tcMar>
+              <w:top w:w="80" w:type="dxa"/>
+              <w:start w:w="120" w:type="dxa"/>
+              <w:bottom w:w="80" w:type="dxa"/>
+              <w:end w:w="120" w:type="dxa"/>
+            </w:tcMar>
+            <w:vAlign w:val="center"/>
+            <w:shd w:fill="FFFFFF"/>
+          </w:tcPr>
+          <w:p>
+            <w:pPr>
+              <w:spacing w:before="0" w:after="40" w:line="252" w:lineRule="auto"/>
+              <w:jc w:val="center"/>
+            </w:pPr>
+            <w:r>
+              <w:rPr>
+                <w:rFonts w:ascii="Calibri" w:hAnsi="Calibri"/>
+                <w:b w:val="0"/>
+                <w:color w:val="111827"/>
+                <w:sz w:val="17"/>
+              </w:rPr>
+              <w:t>0.5.0</w:t>
+            </w:r>
+          </w:p>
+        </w:tc>
+        <w:tc>
+          <w:tcPr>
+            <w:tcW w:type="dxa" w:w="4450"/>
+            <w:tcMar>
+              <w:top w:w="80" w:type="dxa"/>
+              <w:start w:w="120" w:type="dxa"/>
+              <w:bottom w:w="80" w:type="dxa"/>
+              <w:end w:w="120" w:type="dxa"/>
+            </w:tcMar>
+            <w:vAlign w:val="center"/>
+            <w:shd w:fill="FFFFFF"/>
+          </w:tcPr>
+          <w:p>
+            <w:pPr>
+              <w:spacing w:before="0" w:after="40" w:line="252" w:lineRule="auto"/>
+              <w:jc w:val="left"/>
+            </w:pPr>
+            <w:r>
+              <w:rPr>
+                <w:rFonts w:ascii="Calibri" w:hAnsi="Calibri"/>
+                <w:b w:val="0"/>
+                <w:color w:val="111827"/>
+                <w:sz w:val="17"/>
+              </w:rPr>
+              <w:t>2026-08-24</w:t>
+            </w:r>
+          </w:p>
+        </w:tc>
+        <w:tc>
+          <w:tcPr>
+            <w:tcW w:type="dxa" w:w="3260"/>
+            <w:tcMar>
+              <w:top w:w="80" w:type="dxa"/>
+              <w:start w:w="120" w:type="dxa"/>
+              <w:bottom w:w="80" w:type="dxa"/>
+              <w:end w:w="120" w:type="dxa"/>
+            </w:tcMar>
+            <w:vAlign w:val="center"/>
+            <w:shd w:fill="FFFFFF"/>
+          </w:tcPr>
+          <w:p>
+            <w:pPr>
+              <w:spacing w:before="0" w:after="40" w:line="252" w:lineRule="auto"/>
+              <w:jc w:val="left"/>
+            </w:pPr>
+            <w:r>
+              <w:rPr>
+                <w:rFonts w:ascii="Calibri" w:hAnsi="Calibri"/>
+                <w:b w:val="0"/>
+                <w:color w:val="111827"/>
+                <w:sz w:val="17"/>
+              </w:rPr>
+              <w:t>Added logical-time fault lifecycle, debounce, healing, latching, clear, DTC projection, APIs, and tests.</w:t>
+            </w:r>
+          </w:p>
+        </w:tc>
+      </w:tr>
     </w:tbl>
     <w:p>
       <w:pPr>
@@ -1695,7 +1803,7 @@
           <w:color w:val="111827"/>
           <w:sz w:val="22"/>
         </w:rPr>
-        <w:t>Bounded byte-addressable memory cells.</w:t>
+        <w:t>Bounded memory with volatile/non-volatile regions, snapshots, and seeded corruption.</w:t>
       </w:r>
     </w:p>
     <w:p>
@@ -1712,7 +1820,7 @@
           <w:color w:val="111827"/>
           <w:sz w:val="22"/>
         </w:rPr>
-        <w:t>Explicit, typed, and bounded fault records.</w:t>
+        <w:t>Bounded fault records with logical-time confirmation, healing, latching, clear, and DTC intent.</w:t>
       </w:r>
     </w:p>
     <w:p>
@@ -1836,23 +1944,6 @@
     </w:p>
     <w:p>
       <w:pPr>
-        <w:pStyle w:val="ListBullet"/>
-        <w:numPr>
-          <w:ilvl w:val="0"/>
-          <w:numId w:val="11"/>
-        </w:numPr>
-      </w:pPr>
-      <w:r>
-        <w:rPr>
-          <w:rFonts w:ascii="Calibri" w:hAnsi="Calibri"/>
-          <w:color w:val="111827"/>
-          <w:sz w:val="22"/>
-        </w:rPr>
-        <w:t>Volatile/non-volatile regions, checksummed snapshots, and seeded corruption evidence.</w:t>
-      </w:r>
-    </w:p>
-    <w:p>
-      <w:pPr>
         <w:pStyle w:val="Heading2"/>
         <w:keepNext/>
         <w:keepLines/>
@@ -1909,7 +2000,7 @@
           <w:color w:val="111827"/>
           <w:sz w:val="22"/>
         </w:rPr>
-        <w:t>UDS/OBD-II services, DTC aging, security access, and flashing.</w:t>
+        <w:t>UDS/OBD-II services, assigned DTC numbers, status-byte aging, security access, and flashing.</w:t>
       </w:r>
     </w:p>
     <w:p>
@@ -1943,7 +2034,7 @@
           <w:color w:val="111827"/>
           <w:sz w:val="22"/>
         </w:rPr>
-        <w:t>Time-based fault injection and healing.</w:t>
+        <w:t>Autonomous sensor-condition evaluation and fault injection campaigns.</w:t>
       </w:r>
     </w:p>
     <w:p>
@@ -2137,7 +2228,7 @@
           <w:color w:val="111827"/>
           <w:sz w:val="22"/>
         </w:rPr>
-        <w:t>, and timestamps. Memory has at most 256 cells, each with a 16-bit address and an 8-bit value. Faults have a canonical code, severity, pending/confirmed status, and description.</w:t>
+        <w:t>, and timestamps. Memory has at most 256 cells, each with a 16-bit address and an 8-bit value. Faults have a canonical code, severity, pending/confirmed/healed status, description, bounded debounce counters, logical timestamps, thresholds, active state, and latch policy.</w:t>
       </w:r>
     </w:p>
     <w:p>
@@ -3615,6 +3706,357 @@
           </w:p>
         </w:tc>
       </w:tr>
+      <w:tr>
+        <w:trPr>
+          <w:cantSplit/>
+        </w:trPr>
+        <w:tc>
+          <w:tcPr>
+            <w:tcW w:type="dxa" w:w="1150"/>
+            <w:tcMar>
+              <w:top w:w="80" w:type="dxa"/>
+              <w:start w:w="120" w:type="dxa"/>
+              <w:bottom w:w="80" w:type="dxa"/>
+              <w:end w:w="120" w:type="dxa"/>
+            </w:tcMar>
+            <w:vAlign w:val="center"/>
+            <w:shd w:fill="FFFFFF"/>
+          </w:tcPr>
+          <w:p>
+            <w:pPr>
+              <w:spacing w:before="0" w:after="40" w:line="252" w:lineRule="auto"/>
+              <w:jc w:val="center"/>
+            </w:pPr>
+            <w:r>
+              <w:rPr>
+                <w:rFonts w:ascii="Calibri" w:hAnsi="Calibri"/>
+                <w:b w:val="0"/>
+                <w:color w:val="111827"/>
+                <w:sz w:val="16"/>
+              </w:rPr>
+              <w:t>POST</w:t>
+            </w:r>
+          </w:p>
+        </w:tc>
+        <w:tc>
+          <w:tcPr>
+            <w:tcW w:type="dxa" w:w="3700"/>
+            <w:tcMar>
+              <w:top w:w="80" w:type="dxa"/>
+              <w:start w:w="120" w:type="dxa"/>
+              <w:bottom w:w="80" w:type="dxa"/>
+              <w:end w:w="120" w:type="dxa"/>
+            </w:tcMar>
+            <w:vAlign w:val="center"/>
+            <w:shd w:fill="FFFFFF"/>
+          </w:tcPr>
+          <w:p>
+            <w:pPr>
+              <w:spacing w:before="0" w:after="40" w:line="252" w:lineRule="auto"/>
+              <w:jc w:val="left"/>
+            </w:pPr>
+            <w:r>
+              <w:rPr>
+                <w:rFonts w:ascii="Calibri" w:hAnsi="Calibri"/>
+                <w:b w:val="0"/>
+                <w:color w:val="111827"/>
+                <w:sz w:val="16"/>
+              </w:rPr>
+              <w:t>/api/v1/vehicles/{vehicle_id}/ecus/{ecu_id}/faults/observe</w:t>
+            </w:r>
+          </w:p>
+        </w:tc>
+        <w:tc>
+          <w:tcPr>
+            <w:tcW w:type="dxa" w:w="3100"/>
+            <w:tcMar>
+              <w:top w:w="80" w:type="dxa"/>
+              <w:start w:w="120" w:type="dxa"/>
+              <w:bottom w:w="80" w:type="dxa"/>
+              <w:end w:w="120" w:type="dxa"/>
+            </w:tcMar>
+            <w:vAlign w:val="center"/>
+            <w:shd w:fill="FFFFFF"/>
+          </w:tcPr>
+          <w:p>
+            <w:pPr>
+              <w:spacing w:before="0" w:after="40" w:line="252" w:lineRule="auto"/>
+              <w:jc w:val="left"/>
+            </w:pPr>
+            <w:r>
+              <w:rPr>
+                <w:rFonts w:ascii="Calibri" w:hAnsi="Calibri"/>
+                <w:b w:val="0"/>
+                <w:color w:val="111827"/>
+                <w:sz w:val="16"/>
+              </w:rPr>
+              <w:t>ecus:manage</w:t>
+            </w:r>
+          </w:p>
+        </w:tc>
+        <w:tc>
+          <w:tcPr>
+            <w:tcW w:type="dxa" w:w="1410"/>
+            <w:tcMar>
+              <w:top w:w="80" w:type="dxa"/>
+              <w:start w:w="120" w:type="dxa"/>
+              <w:bottom w:w="80" w:type="dxa"/>
+              <w:end w:w="120" w:type="dxa"/>
+            </w:tcMar>
+            <w:vAlign w:val="center"/>
+            <w:shd w:fill="FFFFFF"/>
+          </w:tcPr>
+          <w:p>
+            <w:pPr>
+              <w:spacing w:before="0" w:after="40" w:line="252" w:lineRule="auto"/>
+              <w:jc w:val="left"/>
+            </w:pPr>
+            <w:r>
+              <w:rPr>
+                <w:rFonts w:ascii="Calibri" w:hAnsi="Calibri"/>
+                <w:b w:val="0"/>
+                <w:color w:val="111827"/>
+                <w:sz w:val="16"/>
+              </w:rPr>
+              <w:t>Record one detected or absent observation.</w:t>
+            </w:r>
+          </w:p>
+        </w:tc>
+      </w:tr>
+      <w:tr>
+        <w:trPr>
+          <w:cantSplit/>
+        </w:trPr>
+        <w:tc>
+          <w:tcPr>
+            <w:tcW w:type="dxa" w:w="1150"/>
+            <w:tcMar>
+              <w:top w:w="80" w:type="dxa"/>
+              <w:start w:w="120" w:type="dxa"/>
+              <w:bottom w:w="80" w:type="dxa"/>
+              <w:end w:w="120" w:type="dxa"/>
+            </w:tcMar>
+            <w:vAlign w:val="center"/>
+            <w:shd w:fill="FFFFFF"/>
+          </w:tcPr>
+          <w:p>
+            <w:pPr>
+              <w:spacing w:before="0" w:after="40" w:line="252" w:lineRule="auto"/>
+              <w:jc w:val="center"/>
+            </w:pPr>
+            <w:r>
+              <w:rPr>
+                <w:rFonts w:ascii="Calibri" w:hAnsi="Calibri"/>
+                <w:b w:val="0"/>
+                <w:color w:val="111827"/>
+                <w:sz w:val="16"/>
+              </w:rPr>
+              <w:t>POST</w:t>
+            </w:r>
+          </w:p>
+        </w:tc>
+        <w:tc>
+          <w:tcPr>
+            <w:tcW w:type="dxa" w:w="3700"/>
+            <w:tcMar>
+              <w:top w:w="80" w:type="dxa"/>
+              <w:start w:w="120" w:type="dxa"/>
+              <w:bottom w:w="80" w:type="dxa"/>
+              <w:end w:w="120" w:type="dxa"/>
+            </w:tcMar>
+            <w:vAlign w:val="center"/>
+            <w:shd w:fill="FFFFFF"/>
+          </w:tcPr>
+          <w:p>
+            <w:pPr>
+              <w:spacing w:before="0" w:after="40" w:line="252" w:lineRule="auto"/>
+              <w:jc w:val="left"/>
+            </w:pPr>
+            <w:r>
+              <w:rPr>
+                <w:rFonts w:ascii="Calibri" w:hAnsi="Calibri"/>
+                <w:b w:val="0"/>
+                <w:color w:val="111827"/>
+                <w:sz w:val="16"/>
+              </w:rPr>
+              <w:t>/api/v1/vehicles/{vehicle_id}/ecus/{ecu_id}/faults/{fault_code}/clear</w:t>
+            </w:r>
+          </w:p>
+        </w:tc>
+        <w:tc>
+          <w:tcPr>
+            <w:tcW w:type="dxa" w:w="3100"/>
+            <w:tcMar>
+              <w:top w:w="80" w:type="dxa"/>
+              <w:start w:w="120" w:type="dxa"/>
+              <w:bottom w:w="80" w:type="dxa"/>
+              <w:end w:w="120" w:type="dxa"/>
+            </w:tcMar>
+            <w:vAlign w:val="center"/>
+            <w:shd w:fill="FFFFFF"/>
+          </w:tcPr>
+          <w:p>
+            <w:pPr>
+              <w:spacing w:before="0" w:after="40" w:line="252" w:lineRule="auto"/>
+              <w:jc w:val="left"/>
+            </w:pPr>
+            <w:r>
+              <w:rPr>
+                <w:rFonts w:ascii="Calibri" w:hAnsi="Calibri"/>
+                <w:b w:val="0"/>
+                <w:color w:val="111827"/>
+                <w:sz w:val="16"/>
+              </w:rPr>
+              <w:t>ecus:manage</w:t>
+            </w:r>
+          </w:p>
+        </w:tc>
+        <w:tc>
+          <w:tcPr>
+            <w:tcW w:type="dxa" w:w="1410"/>
+            <w:tcMar>
+              <w:top w:w="80" w:type="dxa"/>
+              <w:start w:w="120" w:type="dxa"/>
+              <w:bottom w:w="80" w:type="dxa"/>
+              <w:end w:w="120" w:type="dxa"/>
+            </w:tcMar>
+            <w:vAlign w:val="center"/>
+            <w:shd w:fill="FFFFFF"/>
+          </w:tcPr>
+          <w:p>
+            <w:pPr>
+              <w:spacing w:before="0" w:after="40" w:line="252" w:lineRule="auto"/>
+              <w:jc w:val="left"/>
+            </w:pPr>
+            <w:r>
+              <w:rPr>
+                <w:rFonts w:ascii="Calibri" w:hAnsi="Calibri"/>
+                <w:b w:val="0"/>
+                <w:color w:val="111827"/>
+                <w:sz w:val="16"/>
+              </w:rPr>
+              <w:t>Explicitly clear an active fault.</w:t>
+            </w:r>
+          </w:p>
+        </w:tc>
+      </w:tr>
+      <w:tr>
+        <w:trPr>
+          <w:cantSplit/>
+        </w:trPr>
+        <w:tc>
+          <w:tcPr>
+            <w:tcW w:type="dxa" w:w="1150"/>
+            <w:tcMar>
+              <w:top w:w="80" w:type="dxa"/>
+              <w:start w:w="120" w:type="dxa"/>
+              <w:bottom w:w="80" w:type="dxa"/>
+              <w:end w:w="120" w:type="dxa"/>
+            </w:tcMar>
+            <w:vAlign w:val="center"/>
+            <w:shd w:fill="FFFFFF"/>
+          </w:tcPr>
+          <w:p>
+            <w:pPr>
+              <w:spacing w:before="0" w:after="40" w:line="252" w:lineRule="auto"/>
+              <w:jc w:val="center"/>
+            </w:pPr>
+            <w:r>
+              <w:rPr>
+                <w:rFonts w:ascii="Calibri" w:hAnsi="Calibri"/>
+                <w:b w:val="0"/>
+                <w:color w:val="111827"/>
+                <w:sz w:val="16"/>
+              </w:rPr>
+              <w:t>GET</w:t>
+            </w:r>
+          </w:p>
+        </w:tc>
+        <w:tc>
+          <w:tcPr>
+            <w:tcW w:type="dxa" w:w="3700"/>
+            <w:tcMar>
+              <w:top w:w="80" w:type="dxa"/>
+              <w:start w:w="120" w:type="dxa"/>
+              <w:bottom w:w="80" w:type="dxa"/>
+              <w:end w:w="120" w:type="dxa"/>
+            </w:tcMar>
+            <w:vAlign w:val="center"/>
+            <w:shd w:fill="FFFFFF"/>
+          </w:tcPr>
+          <w:p>
+            <w:pPr>
+              <w:spacing w:before="0" w:after="40" w:line="252" w:lineRule="auto"/>
+              <w:jc w:val="left"/>
+            </w:pPr>
+            <w:r>
+              <w:rPr>
+                <w:rFonts w:ascii="Calibri" w:hAnsi="Calibri"/>
+                <w:b w:val="0"/>
+                <w:color w:val="111827"/>
+                <w:sz w:val="16"/>
+              </w:rPr>
+              <w:t>/api/v1/vehicles/{vehicle_id}/ecus/{ecu_id}/faults/dtc-candidates</w:t>
+            </w:r>
+          </w:p>
+        </w:tc>
+        <w:tc>
+          <w:tcPr>
+            <w:tcW w:type="dxa" w:w="3100"/>
+            <w:tcMar>
+              <w:top w:w="80" w:type="dxa"/>
+              <w:start w:w="120" w:type="dxa"/>
+              <w:bottom w:w="80" w:type="dxa"/>
+              <w:end w:w="120" w:type="dxa"/>
+            </w:tcMar>
+            <w:vAlign w:val="center"/>
+            <w:shd w:fill="FFFFFF"/>
+          </w:tcPr>
+          <w:p>
+            <w:pPr>
+              <w:spacing w:before="0" w:after="40" w:line="252" w:lineRule="auto"/>
+              <w:jc w:val="left"/>
+            </w:pPr>
+            <w:r>
+              <w:rPr>
+                <w:rFonts w:ascii="Calibri" w:hAnsi="Calibri"/>
+                <w:b w:val="0"/>
+                <w:color w:val="111827"/>
+                <w:sz w:val="16"/>
+              </w:rPr>
+              <w:t>ecus:read</w:t>
+            </w:r>
+          </w:p>
+        </w:tc>
+        <w:tc>
+          <w:tcPr>
+            <w:tcW w:type="dxa" w:w="1410"/>
+            <w:tcMar>
+              <w:top w:w="80" w:type="dxa"/>
+              <w:start w:w="120" w:type="dxa"/>
+              <w:bottom w:w="80" w:type="dxa"/>
+              <w:end w:w="120" w:type="dxa"/>
+            </w:tcMar>
+            <w:vAlign w:val="center"/>
+            <w:shd w:fill="FFFFFF"/>
+          </w:tcPr>
+          <w:p>
+            <w:pPr>
+              <w:spacing w:before="0" w:after="40" w:line="252" w:lineRule="auto"/>
+              <w:jc w:val="left"/>
+            </w:pPr>
+            <w:r>
+              <w:rPr>
+                <w:rFonts w:ascii="Calibri" w:hAnsi="Calibri"/>
+                <w:b w:val="0"/>
+                <w:color w:val="111827"/>
+                <w:sz w:val="16"/>
+              </w:rPr>
+              <w:t>Read diagnostic-intent projections.</w:t>
+            </w:r>
+          </w:p>
+        </w:tc>
+      </w:tr>
     </w:tbl>
     <w:p>
       <w:pPr>
@@ -3803,6 +4245,36 @@
     </w:p>
     <w:p>
       <w:pPr>
+        <w:pStyle w:val="Heading2"/>
+        <w:keepNext/>
+        <w:keepLines/>
+      </w:pPr>
+      <w:r>
+        <w:t>8.4 Fault Lifecycle and Diagnostic Intent</w:t>
+      </w:r>
+    </w:p>
+    <w:p>
+      <w:r>
+        <w:rPr>
+          <w:rFonts w:ascii="Calibri" w:hAnsi="Calibri"/>
+          <w:color w:val="111827"/>
+          <w:sz w:val="22"/>
+        </w:rPr>
+        <w:t>Each observation is evaluated at the ECU's current logical time. Consecutive detections increment the occurrence counter and confirm the fault at its configured threshold. Consecutive absences increment the healing counter and heal non-latched faults at their configured threshold. Confirmed critical faults force the ECU into fault state; after the final critical fault heals or is cleared, the ECU moves to degraded state for explicit recovery handling.</w:t>
+      </w:r>
+    </w:p>
+    <w:p>
+      <w:r>
+        <w:rPr>
+          <w:rFonts w:ascii="Calibri" w:hAnsi="Calibri"/>
+          <w:color w:val="111827"/>
+          <w:sz w:val="22"/>
+        </w:rPr>
+        <w:t>Latched confirmed faults ignore automatic healing and require an explicit clear command. Observation and clear commands persist command identity, so exact retries do not mutate counters or versions twice. Audit and outbox evidence includes the transition, code, status, and bounded counts, not the complete fault collection. DTC candidates express diagnostic intent but deliberately contain no UDS types or assigned DTC numbers.</w:t>
+      </w:r>
+    </w:p>
+    <w:p>
+      <w:pPr>
         <w:pStyle w:val="Heading1"/>
         <w:keepNext/>
         <w:keepLines/>
@@ -3834,7 +4306,7 @@
           <w:color w:val="111827"/>
           <w:sz w:val="22"/>
         </w:rPr>
-        <w:t>. III-1 covers the aggregate, III-2 covers deterministic execution and reset, III-3 covers versioned profiles, and III-4 covers memory regions, snapshots, persistence, and corruption.</w:t>
+        <w:t>. III-1 covers the aggregate, III-2 covers deterministic execution and reset, III-3 covers versioned profiles, III-4 covers memory regions, snapshots, persistence, and corruption, and III-5 covers fault lifecycle and DTC intent.</w:t>
       </w:r>
     </w:p>
     <w:p>
@@ -4041,6 +4513,46 @@
           <w:sz w:val="22"/>
         </w:rPr>
         <w:t>Canonical checksums identify snapshot content without copying complete memory into audit logs. An explicit corruption seed, bounded flip count, optimistic version, and persisted command ID make fault injection repeatable and retry-safe.</w:t>
+      </w:r>
+    </w:p>
+    <w:p>
+      <w:pPr>
+        <w:pStyle w:val="Heading2"/>
+        <w:keepNext/>
+        <w:keepLines/>
+      </w:pPr>
+      <w:r>
+        <w:t>ADR-ECU-010 — Use Logical-Time Observations for Fault Debounce</w:t>
+      </w:r>
+    </w:p>
+    <w:p>
+      <w:r>
+        <w:rPr>
+          <w:rFonts w:ascii="Calibri" w:hAnsi="Calibri"/>
+          <w:color w:val="111827"/>
+          <w:sz w:val="22"/>
+        </w:rPr>
+        <w:t>Wall-clock timers make simulations host-dependent. Explicit detected/absent observations evaluated against bounded thresholds at the ECU logical time make confirmation and healing reproducible.</w:t>
+      </w:r>
+    </w:p>
+    <w:p>
+      <w:pPr>
+        <w:pStyle w:val="Heading2"/>
+        <w:keepNext/>
+        <w:keepLines/>
+      </w:pPr>
+      <w:r>
+        <w:t>ADR-ECU-011 — Keep the DTC Bridge Protocol-Independent</w:t>
+      </w:r>
+    </w:p>
+    <w:p>
+      <w:r>
+        <w:rPr>
+          <w:rFonts w:ascii="Calibri" w:hAnsi="Calibri"/>
+          <w:color w:val="111827"/>
+          <w:sz w:val="22"/>
+        </w:rPr>
+        <w:t>The ECU owns fault truth, while Diagnostics will own UDS identifiers, status bytes, and services. Publishing diagnostic intent prevents both domains from creating competing fault representations.</w:t>
       </w:r>
     </w:p>
     <w:p>
@@ -8795,6 +9307,1023 @@
         <w:keepLines/>
       </w:pPr>
       <w:r>
+        <w:t>11.4 III-5 Verification</w:t>
+      </w:r>
+    </w:p>
+    <w:tbl>
+      <w:tblPr>
+        <w:tblW w:type="dxa" w:w="9360"/>
+        <w:jc w:val="left"/>
+        <w:tblLayout w:type="fixed"/>
+        <w:tblLook w:firstColumn="1" w:firstRow="1" w:lastColumn="0" w:lastRow="0" w:noHBand="0" w:noVBand="1" w:val="04A0"/>
+        <w:tblInd w:w="120" w:type="dxa"/>
+        <w:tblBorders>
+          <w:top w:val="single" w:sz="6" w:color="B8C4D1"/>
+          <w:left w:val="single" w:sz="6" w:color="B8C4D1"/>
+          <w:bottom w:val="single" w:sz="6" w:color="B8C4D1"/>
+          <w:right w:val="single" w:sz="6" w:color="B8C4D1"/>
+          <w:insideH w:val="single" w:sz="6" w:color="B8C4D1"/>
+          <w:insideV w:val="single" w:sz="6" w:color="B8C4D1"/>
+        </w:tblBorders>
+      </w:tblPr>
+      <w:tblGrid>
+        <w:gridCol w:w="1650"/>
+        <w:gridCol w:w="4450"/>
+        <w:gridCol w:w="3260"/>
+      </w:tblGrid>
+      <w:tr>
+        <w:trPr>
+          <w:tblHeader w:val="true"/>
+          <w:cantSplit/>
+        </w:trPr>
+        <w:tc>
+          <w:tcPr>
+            <w:tcW w:type="dxa" w:w="1650"/>
+            <w:tcMar>
+              <w:top w:w="80" w:type="dxa"/>
+              <w:start w:w="120" w:type="dxa"/>
+              <w:bottom w:w="80" w:type="dxa"/>
+              <w:end w:w="120" w:type="dxa"/>
+            </w:tcMar>
+            <w:vAlign w:val="center"/>
+            <w:shd w:fill="E8EEF5"/>
+          </w:tcPr>
+          <w:p>
+            <w:pPr>
+              <w:spacing w:before="0" w:after="40" w:line="252" w:lineRule="auto"/>
+              <w:jc w:val="center"/>
+            </w:pPr>
+            <w:r>
+              <w:rPr>
+                <w:rFonts w:ascii="Calibri" w:hAnsi="Calibri"/>
+                <w:b/>
+                <w:color w:val="0B2545"/>
+                <w:sz w:val="17"/>
+              </w:rPr>
+              <w:t>Test</w:t>
+            </w:r>
+          </w:p>
+        </w:tc>
+        <w:tc>
+          <w:tcPr>
+            <w:tcW w:type="dxa" w:w="4450"/>
+            <w:tcMar>
+              <w:top w:w="80" w:type="dxa"/>
+              <w:start w:w="120" w:type="dxa"/>
+              <w:bottom w:w="80" w:type="dxa"/>
+              <w:end w:w="120" w:type="dxa"/>
+            </w:tcMar>
+            <w:vAlign w:val="center"/>
+            <w:shd w:fill="E8EEF5"/>
+          </w:tcPr>
+          <w:p>
+            <w:pPr>
+              <w:spacing w:before="0" w:after="40" w:line="252" w:lineRule="auto"/>
+              <w:jc w:val="left"/>
+            </w:pPr>
+            <w:r>
+              <w:rPr>
+                <w:rFonts w:ascii="Calibri" w:hAnsi="Calibri"/>
+                <w:b/>
+                <w:color w:val="0B2545"/>
+                <w:sz w:val="17"/>
+              </w:rPr>
+              <w:t>Objective</w:t>
+            </w:r>
+          </w:p>
+        </w:tc>
+        <w:tc>
+          <w:tcPr>
+            <w:tcW w:type="dxa" w:w="3260"/>
+            <w:tcMar>
+              <w:top w:w="80" w:type="dxa"/>
+              <w:start w:w="120" w:type="dxa"/>
+              <w:bottom w:w="80" w:type="dxa"/>
+              <w:end w:w="120" w:type="dxa"/>
+            </w:tcMar>
+            <w:vAlign w:val="center"/>
+            <w:shd w:fill="E8EEF5"/>
+          </w:tcPr>
+          <w:p>
+            <w:pPr>
+              <w:spacing w:before="0" w:after="40" w:line="252" w:lineRule="auto"/>
+              <w:jc w:val="left"/>
+            </w:pPr>
+            <w:r>
+              <w:rPr>
+                <w:rFonts w:ascii="Calibri" w:hAnsi="Calibri"/>
+                <w:b/>
+                <w:color w:val="0B2545"/>
+                <w:sz w:val="17"/>
+              </w:rPr>
+              <w:t>Level</w:t>
+            </w:r>
+          </w:p>
+        </w:tc>
+      </w:tr>
+      <w:tr>
+        <w:trPr>
+          <w:cantSplit/>
+        </w:trPr>
+        <w:tc>
+          <w:tcPr>
+            <w:tcW w:type="dxa" w:w="1650"/>
+            <w:tcMar>
+              <w:top w:w="80" w:type="dxa"/>
+              <w:start w:w="120" w:type="dxa"/>
+              <w:bottom w:w="80" w:type="dxa"/>
+              <w:end w:w="120" w:type="dxa"/>
+            </w:tcMar>
+            <w:vAlign w:val="center"/>
+            <w:shd w:fill="FFFFFF"/>
+          </w:tcPr>
+          <w:p>
+            <w:pPr>
+              <w:spacing w:before="0" w:after="40" w:line="252" w:lineRule="auto"/>
+              <w:jc w:val="center"/>
+            </w:pPr>
+            <w:r>
+              <w:rPr>
+                <w:rFonts w:ascii="Calibri" w:hAnsi="Calibri"/>
+                <w:b w:val="0"/>
+                <w:color w:val="111827"/>
+                <w:sz w:val="17"/>
+              </w:rPr>
+              <w:t>Confirmation debounce</w:t>
+            </w:r>
+          </w:p>
+        </w:tc>
+        <w:tc>
+          <w:tcPr>
+            <w:tcW w:type="dxa" w:w="4450"/>
+            <w:tcMar>
+              <w:top w:w="80" w:type="dxa"/>
+              <w:start w:w="120" w:type="dxa"/>
+              <w:bottom w:w="80" w:type="dxa"/>
+              <w:end w:w="120" w:type="dxa"/>
+            </w:tcMar>
+            <w:vAlign w:val="center"/>
+            <w:shd w:fill="FFFFFF"/>
+          </w:tcPr>
+          <w:p>
+            <w:pPr>
+              <w:spacing w:before="0" w:after="40" w:line="252" w:lineRule="auto"/>
+              <w:jc w:val="left"/>
+            </w:pPr>
+            <w:r>
+              <w:rPr>
+                <w:rFonts w:ascii="Calibri" w:hAnsi="Calibri"/>
+                <w:b w:val="0"/>
+                <w:color w:val="111827"/>
+                <w:sz w:val="17"/>
+              </w:rPr>
+              <w:t>Confirm only when the configured detection threshold is reached.</w:t>
+            </w:r>
+          </w:p>
+        </w:tc>
+        <w:tc>
+          <w:tcPr>
+            <w:tcW w:type="dxa" w:w="3260"/>
+            <w:tcMar>
+              <w:top w:w="80" w:type="dxa"/>
+              <w:start w:w="120" w:type="dxa"/>
+              <w:bottom w:w="80" w:type="dxa"/>
+              <w:end w:w="120" w:type="dxa"/>
+            </w:tcMar>
+            <w:vAlign w:val="center"/>
+            <w:shd w:fill="FFFFFF"/>
+          </w:tcPr>
+          <w:p>
+            <w:pPr>
+              <w:spacing w:before="0" w:after="40" w:line="252" w:lineRule="auto"/>
+              <w:jc w:val="left"/>
+            </w:pPr>
+            <w:r>
+              <w:rPr>
+                <w:rFonts w:ascii="Calibri" w:hAnsi="Calibri"/>
+                <w:b w:val="0"/>
+                <w:color w:val="111827"/>
+                <w:sz w:val="17"/>
+              </w:rPr>
+              <w:t>Service</w:t>
+            </w:r>
+          </w:p>
+        </w:tc>
+      </w:tr>
+      <w:tr>
+        <w:trPr>
+          <w:cantSplit/>
+        </w:trPr>
+        <w:tc>
+          <w:tcPr>
+            <w:tcW w:type="dxa" w:w="1650"/>
+            <w:tcMar>
+              <w:top w:w="80" w:type="dxa"/>
+              <w:start w:w="120" w:type="dxa"/>
+              <w:bottom w:w="80" w:type="dxa"/>
+              <w:end w:w="120" w:type="dxa"/>
+            </w:tcMar>
+            <w:vAlign w:val="center"/>
+            <w:shd w:fill="FFFFFF"/>
+          </w:tcPr>
+          <w:p>
+            <w:pPr>
+              <w:spacing w:before="0" w:after="40" w:line="252" w:lineRule="auto"/>
+              <w:jc w:val="center"/>
+            </w:pPr>
+            <w:r>
+              <w:rPr>
+                <w:rFonts w:ascii="Calibri" w:hAnsi="Calibri"/>
+                <w:b w:val="0"/>
+                <w:color w:val="111827"/>
+                <w:sz w:val="17"/>
+              </w:rPr>
+              <w:t>Healing debounce</w:t>
+            </w:r>
+          </w:p>
+        </w:tc>
+        <w:tc>
+          <w:tcPr>
+            <w:tcW w:type="dxa" w:w="4450"/>
+            <w:tcMar>
+              <w:top w:w="80" w:type="dxa"/>
+              <w:start w:w="120" w:type="dxa"/>
+              <w:bottom w:w="80" w:type="dxa"/>
+              <w:end w:w="120" w:type="dxa"/>
+            </w:tcMar>
+            <w:vAlign w:val="center"/>
+            <w:shd w:fill="FFFFFF"/>
+          </w:tcPr>
+          <w:p>
+            <w:pPr>
+              <w:spacing w:before="0" w:after="40" w:line="252" w:lineRule="auto"/>
+              <w:jc w:val="left"/>
+            </w:pPr>
+            <w:r>
+              <w:rPr>
+                <w:rFonts w:ascii="Calibri" w:hAnsi="Calibri"/>
+                <w:b w:val="0"/>
+                <w:color w:val="111827"/>
+                <w:sz w:val="17"/>
+              </w:rPr>
+              <w:t>Heal only after the configured consecutive-absence threshold.</w:t>
+            </w:r>
+          </w:p>
+        </w:tc>
+        <w:tc>
+          <w:tcPr>
+            <w:tcW w:type="dxa" w:w="3260"/>
+            <w:tcMar>
+              <w:top w:w="80" w:type="dxa"/>
+              <w:start w:w="120" w:type="dxa"/>
+              <w:bottom w:w="80" w:type="dxa"/>
+              <w:end w:w="120" w:type="dxa"/>
+            </w:tcMar>
+            <w:vAlign w:val="center"/>
+            <w:shd w:fill="FFFFFF"/>
+          </w:tcPr>
+          <w:p>
+            <w:pPr>
+              <w:spacing w:before="0" w:after="40" w:line="252" w:lineRule="auto"/>
+              <w:jc w:val="left"/>
+            </w:pPr>
+            <w:r>
+              <w:rPr>
+                <w:rFonts w:ascii="Calibri" w:hAnsi="Calibri"/>
+                <w:b w:val="0"/>
+                <w:color w:val="111827"/>
+                <w:sz w:val="17"/>
+              </w:rPr>
+              <w:t>Service</w:t>
+            </w:r>
+          </w:p>
+        </w:tc>
+      </w:tr>
+      <w:tr>
+        <w:trPr>
+          <w:cantSplit/>
+        </w:trPr>
+        <w:tc>
+          <w:tcPr>
+            <w:tcW w:type="dxa" w:w="1650"/>
+            <w:tcMar>
+              <w:top w:w="80" w:type="dxa"/>
+              <w:start w:w="120" w:type="dxa"/>
+              <w:bottom w:w="80" w:type="dxa"/>
+              <w:end w:w="120" w:type="dxa"/>
+            </w:tcMar>
+            <w:vAlign w:val="center"/>
+            <w:shd w:fill="FFFFFF"/>
+          </w:tcPr>
+          <w:p>
+            <w:pPr>
+              <w:spacing w:before="0" w:after="40" w:line="252" w:lineRule="auto"/>
+              <w:jc w:val="center"/>
+            </w:pPr>
+            <w:r>
+              <w:rPr>
+                <w:rFonts w:ascii="Calibri" w:hAnsi="Calibri"/>
+                <w:b w:val="0"/>
+                <w:color w:val="111827"/>
+                <w:sz w:val="17"/>
+              </w:rPr>
+              <w:t>Logical timestamps</w:t>
+            </w:r>
+          </w:p>
+        </w:tc>
+        <w:tc>
+          <w:tcPr>
+            <w:tcW w:type="dxa" w:w="4450"/>
+            <w:tcMar>
+              <w:top w:w="80" w:type="dxa"/>
+              <w:start w:w="120" w:type="dxa"/>
+              <w:bottom w:w="80" w:type="dxa"/>
+              <w:end w:w="120" w:type="dxa"/>
+            </w:tcMar>
+            <w:vAlign w:val="center"/>
+            <w:shd w:fill="FFFFFF"/>
+          </w:tcPr>
+          <w:p>
+            <w:pPr>
+              <w:spacing w:before="0" w:after="40" w:line="252" w:lineRule="auto"/>
+              <w:jc w:val="left"/>
+            </w:pPr>
+            <w:r>
+              <w:rPr>
+                <w:rFonts w:ascii="Calibri" w:hAnsi="Calibri"/>
+                <w:b w:val="0"/>
+                <w:color w:val="111827"/>
+                <w:sz w:val="17"/>
+              </w:rPr>
+              <w:t>Derive first-seen, last-seen, confirmed, and healed evidence from ECU time.</w:t>
+            </w:r>
+          </w:p>
+        </w:tc>
+        <w:tc>
+          <w:tcPr>
+            <w:tcW w:type="dxa" w:w="3260"/>
+            <w:tcMar>
+              <w:top w:w="80" w:type="dxa"/>
+              <w:start w:w="120" w:type="dxa"/>
+              <w:bottom w:w="80" w:type="dxa"/>
+              <w:end w:w="120" w:type="dxa"/>
+            </w:tcMar>
+            <w:vAlign w:val="center"/>
+            <w:shd w:fill="FFFFFF"/>
+          </w:tcPr>
+          <w:p>
+            <w:pPr>
+              <w:spacing w:before="0" w:after="40" w:line="252" w:lineRule="auto"/>
+              <w:jc w:val="left"/>
+            </w:pPr>
+            <w:r>
+              <w:rPr>
+                <w:rFonts w:ascii="Calibri" w:hAnsi="Calibri"/>
+                <w:b w:val="0"/>
+                <w:color w:val="111827"/>
+                <w:sz w:val="17"/>
+              </w:rPr>
+              <w:t>Service</w:t>
+            </w:r>
+          </w:p>
+        </w:tc>
+      </w:tr>
+      <w:tr>
+        <w:trPr>
+          <w:cantSplit/>
+        </w:trPr>
+        <w:tc>
+          <w:tcPr>
+            <w:tcW w:type="dxa" w:w="1650"/>
+            <w:tcMar>
+              <w:top w:w="80" w:type="dxa"/>
+              <w:start w:w="120" w:type="dxa"/>
+              <w:bottom w:w="80" w:type="dxa"/>
+              <w:end w:w="120" w:type="dxa"/>
+            </w:tcMar>
+            <w:vAlign w:val="center"/>
+            <w:shd w:fill="FFFFFF"/>
+          </w:tcPr>
+          <w:p>
+            <w:pPr>
+              <w:spacing w:before="0" w:after="40" w:line="252" w:lineRule="auto"/>
+              <w:jc w:val="center"/>
+            </w:pPr>
+            <w:r>
+              <w:rPr>
+                <w:rFonts w:ascii="Calibri" w:hAnsi="Calibri"/>
+                <w:b w:val="0"/>
+                <w:color w:val="111827"/>
+                <w:sz w:val="17"/>
+              </w:rPr>
+              <w:t>Critical transition</w:t>
+            </w:r>
+          </w:p>
+        </w:tc>
+        <w:tc>
+          <w:tcPr>
+            <w:tcW w:type="dxa" w:w="4450"/>
+            <w:tcMar>
+              <w:top w:w="80" w:type="dxa"/>
+              <w:start w:w="120" w:type="dxa"/>
+              <w:bottom w:w="80" w:type="dxa"/>
+              <w:end w:w="120" w:type="dxa"/>
+            </w:tcMar>
+            <w:vAlign w:val="center"/>
+            <w:shd w:fill="FFFFFF"/>
+          </w:tcPr>
+          <w:p>
+            <w:pPr>
+              <w:spacing w:before="0" w:after="40" w:line="252" w:lineRule="auto"/>
+              <w:jc w:val="left"/>
+            </w:pPr>
+            <w:r>
+              <w:rPr>
+                <w:rFonts w:ascii="Calibri" w:hAnsi="Calibri"/>
+                <w:b w:val="0"/>
+                <w:color w:val="111827"/>
+                <w:sz w:val="17"/>
+              </w:rPr>
+              <w:t>Move an ECU to fault state when a critical fault confirms.</w:t>
+            </w:r>
+          </w:p>
+        </w:tc>
+        <w:tc>
+          <w:tcPr>
+            <w:tcW w:type="dxa" w:w="3260"/>
+            <w:tcMar>
+              <w:top w:w="80" w:type="dxa"/>
+              <w:start w:w="120" w:type="dxa"/>
+              <w:bottom w:w="80" w:type="dxa"/>
+              <w:end w:w="120" w:type="dxa"/>
+            </w:tcMar>
+            <w:vAlign w:val="center"/>
+            <w:shd w:fill="FFFFFF"/>
+          </w:tcPr>
+          <w:p>
+            <w:pPr>
+              <w:spacing w:before="0" w:after="40" w:line="252" w:lineRule="auto"/>
+              <w:jc w:val="left"/>
+            </w:pPr>
+            <w:r>
+              <w:rPr>
+                <w:rFonts w:ascii="Calibri" w:hAnsi="Calibri"/>
+                <w:b w:val="0"/>
+                <w:color w:val="111827"/>
+                <w:sz w:val="17"/>
+              </w:rPr>
+              <w:t>Service</w:t>
+            </w:r>
+          </w:p>
+        </w:tc>
+      </w:tr>
+      <w:tr>
+        <w:trPr>
+          <w:cantSplit/>
+        </w:trPr>
+        <w:tc>
+          <w:tcPr>
+            <w:tcW w:type="dxa" w:w="1650"/>
+            <w:tcMar>
+              <w:top w:w="80" w:type="dxa"/>
+              <w:start w:w="120" w:type="dxa"/>
+              <w:bottom w:w="80" w:type="dxa"/>
+              <w:end w:w="120" w:type="dxa"/>
+            </w:tcMar>
+            <w:vAlign w:val="center"/>
+            <w:shd w:fill="FFFFFF"/>
+          </w:tcPr>
+          <w:p>
+            <w:pPr>
+              <w:spacing w:before="0" w:after="40" w:line="252" w:lineRule="auto"/>
+              <w:jc w:val="center"/>
+            </w:pPr>
+            <w:r>
+              <w:rPr>
+                <w:rFonts w:ascii="Calibri" w:hAnsi="Calibri"/>
+                <w:b w:val="0"/>
+                <w:color w:val="111827"/>
+                <w:sz w:val="17"/>
+              </w:rPr>
+              <w:t>Latched absence</w:t>
+            </w:r>
+          </w:p>
+        </w:tc>
+        <w:tc>
+          <w:tcPr>
+            <w:tcW w:type="dxa" w:w="4450"/>
+            <w:tcMar>
+              <w:top w:w="80" w:type="dxa"/>
+              <w:start w:w="120" w:type="dxa"/>
+              <w:bottom w:w="80" w:type="dxa"/>
+              <w:end w:w="120" w:type="dxa"/>
+            </w:tcMar>
+            <w:vAlign w:val="center"/>
+            <w:shd w:fill="FFFFFF"/>
+          </w:tcPr>
+          <w:p>
+            <w:pPr>
+              <w:spacing w:before="0" w:after="40" w:line="252" w:lineRule="auto"/>
+              <w:jc w:val="left"/>
+            </w:pPr>
+            <w:r>
+              <w:rPr>
+                <w:rFonts w:ascii="Calibri" w:hAnsi="Calibri"/>
+                <w:b w:val="0"/>
+                <w:color w:val="111827"/>
+                <w:sz w:val="17"/>
+              </w:rPr>
+              <w:t>Preserve an active confirmed latch despite absent observations.</w:t>
+            </w:r>
+          </w:p>
+        </w:tc>
+        <w:tc>
+          <w:tcPr>
+            <w:tcW w:type="dxa" w:w="3260"/>
+            <w:tcMar>
+              <w:top w:w="80" w:type="dxa"/>
+              <w:start w:w="120" w:type="dxa"/>
+              <w:bottom w:w="80" w:type="dxa"/>
+              <w:end w:w="120" w:type="dxa"/>
+            </w:tcMar>
+            <w:vAlign w:val="center"/>
+            <w:shd w:fill="FFFFFF"/>
+          </w:tcPr>
+          <w:p>
+            <w:pPr>
+              <w:spacing w:before="0" w:after="40" w:line="252" w:lineRule="auto"/>
+              <w:jc w:val="left"/>
+            </w:pPr>
+            <w:r>
+              <w:rPr>
+                <w:rFonts w:ascii="Calibri" w:hAnsi="Calibri"/>
+                <w:b w:val="0"/>
+                <w:color w:val="111827"/>
+                <w:sz w:val="17"/>
+              </w:rPr>
+              <w:t>Service</w:t>
+            </w:r>
+          </w:p>
+        </w:tc>
+      </w:tr>
+      <w:tr>
+        <w:trPr>
+          <w:cantSplit/>
+        </w:trPr>
+        <w:tc>
+          <w:tcPr>
+            <w:tcW w:type="dxa" w:w="1650"/>
+            <w:tcMar>
+              <w:top w:w="80" w:type="dxa"/>
+              <w:start w:w="120" w:type="dxa"/>
+              <w:bottom w:w="80" w:type="dxa"/>
+              <w:end w:w="120" w:type="dxa"/>
+            </w:tcMar>
+            <w:vAlign w:val="center"/>
+            <w:shd w:fill="FFFFFF"/>
+          </w:tcPr>
+          <w:p>
+            <w:pPr>
+              <w:spacing w:before="0" w:after="40" w:line="252" w:lineRule="auto"/>
+              <w:jc w:val="center"/>
+            </w:pPr>
+            <w:r>
+              <w:rPr>
+                <w:rFonts w:ascii="Calibri" w:hAnsi="Calibri"/>
+                <w:b w:val="0"/>
+                <w:color w:val="111827"/>
+                <w:sz w:val="17"/>
+              </w:rPr>
+              <w:t>Explicit clear</w:t>
+            </w:r>
+          </w:p>
+        </w:tc>
+        <w:tc>
+          <w:tcPr>
+            <w:tcW w:type="dxa" w:w="4450"/>
+            <w:tcMar>
+              <w:top w:w="80" w:type="dxa"/>
+              <w:start w:w="120" w:type="dxa"/>
+              <w:bottom w:w="80" w:type="dxa"/>
+              <w:end w:w="120" w:type="dxa"/>
+            </w:tcMar>
+            <w:vAlign w:val="center"/>
+            <w:shd w:fill="FFFFFF"/>
+          </w:tcPr>
+          <w:p>
+            <w:pPr>
+              <w:spacing w:before="0" w:after="40" w:line="252" w:lineRule="auto"/>
+              <w:jc w:val="left"/>
+            </w:pPr>
+            <w:r>
+              <w:rPr>
+                <w:rFonts w:ascii="Calibri" w:hAnsi="Calibri"/>
+                <w:b w:val="0"/>
+                <w:color w:val="111827"/>
+                <w:sz w:val="17"/>
+              </w:rPr>
+              <w:t>Heal and unlatch a fault only through an authorized clear command.</w:t>
+            </w:r>
+          </w:p>
+        </w:tc>
+        <w:tc>
+          <w:tcPr>
+            <w:tcW w:type="dxa" w:w="3260"/>
+            <w:tcMar>
+              <w:top w:w="80" w:type="dxa"/>
+              <w:start w:w="120" w:type="dxa"/>
+              <w:bottom w:w="80" w:type="dxa"/>
+              <w:end w:w="120" w:type="dxa"/>
+            </w:tcMar>
+            <w:vAlign w:val="center"/>
+            <w:shd w:fill="FFFFFF"/>
+          </w:tcPr>
+          <w:p>
+            <w:pPr>
+              <w:spacing w:before="0" w:after="40" w:line="252" w:lineRule="auto"/>
+              <w:jc w:val="left"/>
+            </w:pPr>
+            <w:r>
+              <w:rPr>
+                <w:rFonts w:ascii="Calibri" w:hAnsi="Calibri"/>
+                <w:b w:val="0"/>
+                <w:color w:val="111827"/>
+                <w:sz w:val="17"/>
+              </w:rPr>
+              <w:t>Service/API</w:t>
+            </w:r>
+          </w:p>
+        </w:tc>
+      </w:tr>
+      <w:tr>
+        <w:trPr>
+          <w:cantSplit/>
+        </w:trPr>
+        <w:tc>
+          <w:tcPr>
+            <w:tcW w:type="dxa" w:w="1650"/>
+            <w:tcMar>
+              <w:top w:w="80" w:type="dxa"/>
+              <w:start w:w="120" w:type="dxa"/>
+              <w:bottom w:w="80" w:type="dxa"/>
+              <w:end w:w="120" w:type="dxa"/>
+            </w:tcMar>
+            <w:vAlign w:val="center"/>
+            <w:shd w:fill="FFFFFF"/>
+          </w:tcPr>
+          <w:p>
+            <w:pPr>
+              <w:spacing w:before="0" w:after="40" w:line="252" w:lineRule="auto"/>
+              <w:jc w:val="center"/>
+            </w:pPr>
+            <w:r>
+              <w:rPr>
+                <w:rFonts w:ascii="Calibri" w:hAnsi="Calibri"/>
+                <w:b w:val="0"/>
+                <w:color w:val="111827"/>
+                <w:sz w:val="17"/>
+              </w:rPr>
+              <w:t>Exact replay</w:t>
+            </w:r>
+          </w:p>
+        </w:tc>
+        <w:tc>
+          <w:tcPr>
+            <w:tcW w:type="dxa" w:w="4450"/>
+            <w:tcMar>
+              <w:top w:w="80" w:type="dxa"/>
+              <w:start w:w="120" w:type="dxa"/>
+              <w:bottom w:w="80" w:type="dxa"/>
+              <w:end w:w="120" w:type="dxa"/>
+            </w:tcMar>
+            <w:vAlign w:val="center"/>
+            <w:shd w:fill="FFFFFF"/>
+          </w:tcPr>
+          <w:p>
+            <w:pPr>
+              <w:spacing w:before="0" w:after="40" w:line="252" w:lineRule="auto"/>
+              <w:jc w:val="left"/>
+            </w:pPr>
+            <w:r>
+              <w:rPr>
+                <w:rFonts w:ascii="Calibri" w:hAnsi="Calibri"/>
+                <w:b w:val="0"/>
+                <w:color w:val="111827"/>
+                <w:sz w:val="17"/>
+              </w:rPr>
+              <w:t>Avoid incrementing lifecycle counters or versions twice.</w:t>
+            </w:r>
+          </w:p>
+        </w:tc>
+        <w:tc>
+          <w:tcPr>
+            <w:tcW w:type="dxa" w:w="3260"/>
+            <w:tcMar>
+              <w:top w:w="80" w:type="dxa"/>
+              <w:start w:w="120" w:type="dxa"/>
+              <w:bottom w:w="80" w:type="dxa"/>
+              <w:end w:w="120" w:type="dxa"/>
+            </w:tcMar>
+            <w:vAlign w:val="center"/>
+            <w:shd w:fill="FFFFFF"/>
+          </w:tcPr>
+          <w:p>
+            <w:pPr>
+              <w:spacing w:before="0" w:after="40" w:line="252" w:lineRule="auto"/>
+              <w:jc w:val="left"/>
+            </w:pPr>
+            <w:r>
+              <w:rPr>
+                <w:rFonts w:ascii="Calibri" w:hAnsi="Calibri"/>
+                <w:b w:val="0"/>
+                <w:color w:val="111827"/>
+                <w:sz w:val="17"/>
+              </w:rPr>
+              <w:t>Service</w:t>
+            </w:r>
+          </w:p>
+        </w:tc>
+      </w:tr>
+      <w:tr>
+        <w:trPr>
+          <w:cantSplit/>
+        </w:trPr>
+        <w:tc>
+          <w:tcPr>
+            <w:tcW w:type="dxa" w:w="1650"/>
+            <w:tcMar>
+              <w:top w:w="80" w:type="dxa"/>
+              <w:start w:w="120" w:type="dxa"/>
+              <w:bottom w:w="80" w:type="dxa"/>
+              <w:end w:w="120" w:type="dxa"/>
+            </w:tcMar>
+            <w:vAlign w:val="center"/>
+            <w:shd w:fill="FFFFFF"/>
+          </w:tcPr>
+          <w:p>
+            <w:pPr>
+              <w:spacing w:before="0" w:after="40" w:line="252" w:lineRule="auto"/>
+              <w:jc w:val="center"/>
+            </w:pPr>
+            <w:r>
+              <w:rPr>
+                <w:rFonts w:ascii="Calibri" w:hAnsi="Calibri"/>
+                <w:b w:val="0"/>
+                <w:color w:val="111827"/>
+                <w:sz w:val="17"/>
+              </w:rPr>
+              <w:t>Policy conflict</w:t>
+            </w:r>
+          </w:p>
+        </w:tc>
+        <w:tc>
+          <w:tcPr>
+            <w:tcW w:type="dxa" w:w="4450"/>
+            <w:tcMar>
+              <w:top w:w="80" w:type="dxa"/>
+              <w:start w:w="120" w:type="dxa"/>
+              <w:bottom w:w="80" w:type="dxa"/>
+              <w:end w:w="120" w:type="dxa"/>
+            </w:tcMar>
+            <w:vAlign w:val="center"/>
+            <w:shd w:fill="FFFFFF"/>
+          </w:tcPr>
+          <w:p>
+            <w:pPr>
+              <w:spacing w:before="0" w:after="40" w:line="252" w:lineRule="auto"/>
+              <w:jc w:val="left"/>
+            </w:pPr>
+            <w:r>
+              <w:rPr>
+                <w:rFonts w:ascii="Calibri" w:hAnsi="Calibri"/>
+                <w:b w:val="0"/>
+                <w:color w:val="111827"/>
+                <w:sz w:val="17"/>
+              </w:rPr>
+              <w:t>Reject policy changes while one fault activation is active.</w:t>
+            </w:r>
+          </w:p>
+        </w:tc>
+        <w:tc>
+          <w:tcPr>
+            <w:tcW w:type="dxa" w:w="3260"/>
+            <w:tcMar>
+              <w:top w:w="80" w:type="dxa"/>
+              <w:start w:w="120" w:type="dxa"/>
+              <w:bottom w:w="80" w:type="dxa"/>
+              <w:end w:w="120" w:type="dxa"/>
+            </w:tcMar>
+            <w:vAlign w:val="center"/>
+            <w:shd w:fill="FFFFFF"/>
+          </w:tcPr>
+          <w:p>
+            <w:pPr>
+              <w:spacing w:before="0" w:after="40" w:line="252" w:lineRule="auto"/>
+              <w:jc w:val="left"/>
+            </w:pPr>
+            <w:r>
+              <w:rPr>
+                <w:rFonts w:ascii="Calibri" w:hAnsi="Calibri"/>
+                <w:b w:val="0"/>
+                <w:color w:val="111827"/>
+                <w:sz w:val="17"/>
+              </w:rPr>
+              <w:t>Service/API</w:t>
+            </w:r>
+          </w:p>
+        </w:tc>
+      </w:tr>
+      <w:tr>
+        <w:trPr>
+          <w:cantSplit/>
+        </w:trPr>
+        <w:tc>
+          <w:tcPr>
+            <w:tcW w:type="dxa" w:w="1650"/>
+            <w:tcMar>
+              <w:top w:w="80" w:type="dxa"/>
+              <w:start w:w="120" w:type="dxa"/>
+              <w:bottom w:w="80" w:type="dxa"/>
+              <w:end w:w="120" w:type="dxa"/>
+            </w:tcMar>
+            <w:vAlign w:val="center"/>
+            <w:shd w:fill="FFFFFF"/>
+          </w:tcPr>
+          <w:p>
+            <w:pPr>
+              <w:spacing w:before="0" w:after="40" w:line="252" w:lineRule="auto"/>
+              <w:jc w:val="center"/>
+            </w:pPr>
+            <w:r>
+              <w:rPr>
+                <w:rFonts w:ascii="Calibri" w:hAnsi="Calibri"/>
+                <w:b w:val="0"/>
+                <w:color w:val="111827"/>
+                <w:sz w:val="17"/>
+              </w:rPr>
+              <w:t>DTC projection</w:t>
+            </w:r>
+          </w:p>
+        </w:tc>
+        <w:tc>
+          <w:tcPr>
+            <w:tcW w:type="dxa" w:w="4450"/>
+            <w:tcMar>
+              <w:top w:w="80" w:type="dxa"/>
+              <w:start w:w="120" w:type="dxa"/>
+              <w:bottom w:w="80" w:type="dxa"/>
+              <w:end w:w="120" w:type="dxa"/>
+            </w:tcMar>
+            <w:vAlign w:val="center"/>
+            <w:shd w:fill="FFFFFF"/>
+          </w:tcPr>
+          <w:p>
+            <w:pPr>
+              <w:spacing w:before="0" w:after="40" w:line="252" w:lineRule="auto"/>
+              <w:jc w:val="left"/>
+            </w:pPr>
+            <w:r>
+              <w:rPr>
+                <w:rFonts w:ascii="Calibri" w:hAnsi="Calibri"/>
+                <w:b w:val="0"/>
+                <w:color w:val="111827"/>
+                <w:sz w:val="17"/>
+              </w:rPr>
+              <w:t>Publish protocol-independent diagnostic intent without UDS coupling.</w:t>
+            </w:r>
+          </w:p>
+        </w:tc>
+        <w:tc>
+          <w:tcPr>
+            <w:tcW w:type="dxa" w:w="3260"/>
+            <w:tcMar>
+              <w:top w:w="80" w:type="dxa"/>
+              <w:start w:w="120" w:type="dxa"/>
+              <w:bottom w:w="80" w:type="dxa"/>
+              <w:end w:w="120" w:type="dxa"/>
+            </w:tcMar>
+            <w:vAlign w:val="center"/>
+            <w:shd w:fill="FFFFFF"/>
+          </w:tcPr>
+          <w:p>
+            <w:pPr>
+              <w:spacing w:before="0" w:after="40" w:line="252" w:lineRule="auto"/>
+              <w:jc w:val="left"/>
+            </w:pPr>
+            <w:r>
+              <w:rPr>
+                <w:rFonts w:ascii="Calibri" w:hAnsi="Calibri"/>
+                <w:b w:val="0"/>
+                <w:color w:val="111827"/>
+                <w:sz w:val="17"/>
+              </w:rPr>
+              <w:t>Unit/contract</w:t>
+            </w:r>
+          </w:p>
+        </w:tc>
+      </w:tr>
+      <w:tr>
+        <w:trPr>
+          <w:cantSplit/>
+        </w:trPr>
+        <w:tc>
+          <w:tcPr>
+            <w:tcW w:type="dxa" w:w="1650"/>
+            <w:tcMar>
+              <w:top w:w="80" w:type="dxa"/>
+              <w:start w:w="120" w:type="dxa"/>
+              <w:bottom w:w="80" w:type="dxa"/>
+              <w:end w:w="120" w:type="dxa"/>
+            </w:tcMar>
+            <w:vAlign w:val="center"/>
+            <w:shd w:fill="FFFFFF"/>
+          </w:tcPr>
+          <w:p>
+            <w:pPr>
+              <w:spacing w:before="0" w:after="40" w:line="252" w:lineRule="auto"/>
+              <w:jc w:val="center"/>
+            </w:pPr>
+            <w:r>
+              <w:rPr>
+                <w:rFonts w:ascii="Calibri" w:hAnsi="Calibri"/>
+                <w:b w:val="0"/>
+                <w:color w:val="111827"/>
+                <w:sz w:val="17"/>
+              </w:rPr>
+              <w:t>Fault RBAC and OpenAPI</w:t>
+            </w:r>
+          </w:p>
+        </w:tc>
+        <w:tc>
+          <w:tcPr>
+            <w:tcW w:type="dxa" w:w="4450"/>
+            <w:tcMar>
+              <w:top w:w="80" w:type="dxa"/>
+              <w:start w:w="120" w:type="dxa"/>
+              <w:bottom w:w="80" w:type="dxa"/>
+              <w:end w:w="120" w:type="dxa"/>
+            </w:tcMar>
+            <w:vAlign w:val="center"/>
+            <w:shd w:fill="FFFFFF"/>
+          </w:tcPr>
+          <w:p>
+            <w:pPr>
+              <w:spacing w:before="0" w:after="40" w:line="252" w:lineRule="auto"/>
+              <w:jc w:val="left"/>
+            </w:pPr>
+            <w:r>
+              <w:rPr>
+                <w:rFonts w:ascii="Calibri" w:hAnsi="Calibri"/>
+                <w:b w:val="0"/>
+                <w:color w:val="111827"/>
+                <w:sz w:val="17"/>
+              </w:rPr>
+              <w:t>Publish protected, typed lifecycle endpoints.</w:t>
+            </w:r>
+          </w:p>
+        </w:tc>
+        <w:tc>
+          <w:tcPr>
+            <w:tcW w:type="dxa" w:w="3260"/>
+            <w:tcMar>
+              <w:top w:w="80" w:type="dxa"/>
+              <w:start w:w="120" w:type="dxa"/>
+              <w:bottom w:w="80" w:type="dxa"/>
+              <w:end w:w="120" w:type="dxa"/>
+            </w:tcMar>
+            <w:vAlign w:val="center"/>
+            <w:shd w:fill="FFFFFF"/>
+          </w:tcPr>
+          <w:p>
+            <w:pPr>
+              <w:spacing w:before="0" w:after="40" w:line="252" w:lineRule="auto"/>
+              <w:jc w:val="left"/>
+            </w:pPr>
+            <w:r>
+              <w:rPr>
+                <w:rFonts w:ascii="Calibri" w:hAnsi="Calibri"/>
+                <w:b w:val="0"/>
+                <w:color w:val="111827"/>
+                <w:sz w:val="17"/>
+              </w:rPr>
+              <w:t>Contract/integration</w:t>
+            </w:r>
+          </w:p>
+        </w:tc>
+      </w:tr>
+    </w:tbl>
+    <w:p>
+      <w:pPr>
+        <w:spacing w:after="60"/>
+      </w:pPr>
+    </w:p>
+    <w:p>
+      <w:pPr>
+        <w:pStyle w:val="Heading1"/>
+        <w:keepNext/>
+        <w:keepLines/>
+      </w:pPr>
+      <w:r>
         <w:t>12. Implemented Evidence</w:t>
       </w:r>
     </w:p>
@@ -9084,6 +10613,39 @@
           <w:color w:val="111827"/>
           <w:sz w:val="22"/>
         </w:rPr>
+        <w:t xml:space="preserve">Fault events use </w:t>
+      </w:r>
+      <w:r>
+        <w:rPr>
+          <w:rFonts w:ascii="Consolas" w:hAnsi="Consolas"/>
+          <w:color w:val="1F4D78"/>
+          <w:sz w:val="19"/>
+        </w:rPr>
+        <w:t>atep.ecu.fault.lifecycle.changed.v1</w:t>
+      </w:r>
+      <w:r>
+        <w:rPr>
+          <w:rFonts w:ascii="Calibri" w:hAnsi="Calibri"/>
+          <w:color w:val="111827"/>
+          <w:sz w:val="22"/>
+        </w:rPr>
+        <w:t xml:space="preserve"> for observation and explicit-clear evidence.</w:t>
+      </w:r>
+    </w:p>
+    <w:p>
+      <w:pPr>
+        <w:pStyle w:val="ListBullet"/>
+        <w:numPr>
+          <w:ilvl w:val="0"/>
+          <w:numId w:val="14"/>
+        </w:numPr>
+      </w:pPr>
+      <w:r>
+        <w:rPr>
+          <w:rFonts w:ascii="Calibri" w:hAnsi="Calibri"/>
+          <w:color w:val="111827"/>
+          <w:sz w:val="22"/>
+        </w:rPr>
         <w:t>Automated tests cover validation, atomic evidence, concurrency, idempotency, permissions, and API contracts.</w:t>
       </w:r>
     </w:p>
@@ -9189,7 +10751,7 @@
           <w:color w:val="111827"/>
           <w:sz w:val="22"/>
         </w:rPr>
-        <w:t>Fault-to-DTC mapping belongs to the Diagnostics boundary and is not implemented here.</w:t>
+        <w:t>Actual DTC identifiers, status-byte semantics, and aging belong to the Diagnostics boundary.</w:t>
       </w:r>
     </w:p>
     <w:p>
@@ -9209,7 +10771,7 @@
           <w:color w:val="111827"/>
           <w:sz w:val="22"/>
         </w:rPr>
-        <w:t xml:space="preserve">The next increment adds fault activation lifecycle, debouncing, latching, healing, and a future DTC bridge. Later increments add CAN contracts and multi-ECU scenarios. See </w:t>
+        <w:t xml:space="preserve">The next increment adds CAN production/consumption contracts and gateway routing hooks without embedding a bus implementation. Later increments add multi-ECU scenarios. See </w:t>
       </w:r>
       <w:r>
         <w:rPr>
@@ -9459,6 +11021,57 @@
         <w:t>Design a corruption campaign that remains reproducible across CI machines.</w:t>
       </w:r>
     </w:p>
+    <w:p>
+      <w:pPr>
+        <w:pStyle w:val="ListNumber"/>
+        <w:numPr>
+          <w:ilvl w:val="0"/>
+          <w:numId w:val="17"/>
+        </w:numPr>
+      </w:pPr>
+      <w:r>
+        <w:rPr>
+          <w:rFonts w:ascii="Calibri" w:hAnsi="Calibri"/>
+          <w:color w:val="111827"/>
+          <w:sz w:val="22"/>
+        </w:rPr>
+        <w:t>Trace three detected observations and two absent observations through configurable thresholds.</w:t>
+      </w:r>
+    </w:p>
+    <w:p>
+      <w:pPr>
+        <w:pStyle w:val="ListNumber"/>
+        <w:numPr>
+          <w:ilvl w:val="0"/>
+          <w:numId w:val="17"/>
+        </w:numPr>
+      </w:pPr>
+      <w:r>
+        <w:rPr>
+          <w:rFonts w:ascii="Calibri" w:hAnsi="Calibri"/>
+          <w:color w:val="111827"/>
+          <w:sz w:val="22"/>
+        </w:rPr>
+        <w:t>Explain why a latched confirmed fault cannot heal from an absent observation alone.</w:t>
+      </w:r>
+    </w:p>
+    <w:p>
+      <w:pPr>
+        <w:pStyle w:val="ListNumber"/>
+        <w:numPr>
+          <w:ilvl w:val="0"/>
+          <w:numId w:val="17"/>
+        </w:numPr>
+      </w:pPr>
+      <w:r>
+        <w:rPr>
+          <w:rFonts w:ascii="Calibri" w:hAnsi="Calibri"/>
+          <w:color w:val="111827"/>
+          <w:sz w:val="22"/>
+        </w:rPr>
+        <w:t>Map a DTC candidate to future UDS responsibilities without assigning a DTC number in the ECU.</w:t>
+      </w:r>
+    </w:p>
     <w:sectPr>
       <w:headerReference w:type="default" r:id="rId9"/>
       <w:footerReference w:type="default" r:id="rId10"/>
@@ -9488,7 +11101,7 @@
         <w:color w:val="667085"/>
         <w:sz w:val="17"/>
       </w:rPr>
-      <w:t>ATEP Volume III Workbook  |  Version 0.4.0</w:t>
+      <w:t>ATEP Volume III Workbook  |  Version 0.5.0</w:t>
     </w:r>
     <w:r>
       <w:rPr>

</xml_diff>

<commit_message>
feat(ecus): add semantic signal routing
</commit_message>
<xml_diff>
--- a/docs/ATEP_Volume_III_ECU_Simulator_Engineering_Workbook.docx
+++ b/docs/ATEP_Volume_III_ECU_Simulator_Engineering_Workbook.docx
@@ -143,7 +143,7 @@
                 <w:color w:val="0B2545"/>
                 <w:sz w:val="19"/>
               </w:rPr>
-              <w:t>0.5.0</w:t>
+              <w:t>0.6.0</w:t>
             </w:r>
           </w:p>
         </w:tc>
@@ -265,7 +265,7 @@
                 <w:color w:val="111827"/>
                 <w:sz w:val="19"/>
               </w:rPr>
-              <w:t>Living document - Increments III-1 through III-5 implemented</w:t>
+              <w:t>Living document - Increments III-1 through III-6 implemented</w:t>
             </w:r>
           </w:p>
         </w:tc>
@@ -675,6 +675,25 @@
           <w:color w:val="0B2545"/>
           <w:sz w:val="21"/>
         </w:rPr>
+        <w:t>11.5 III-6 Verification</w:t>
+      </w:r>
+    </w:p>
+    <w:p>
+      <w:pPr>
+        <w:pStyle w:val="ListNumber"/>
+        <w:numPr>
+          <w:ilvl w:val="0"/>
+          <w:numId w:val="10"/>
+        </w:numPr>
+        <w:ind w:left="216" w:firstLine="0"/>
+      </w:pPr>
+      <w:r>
+        <w:rPr>
+          <w:rFonts w:ascii="Calibri" w:hAnsi="Calibri"/>
+          <w:b/>
+          <w:color w:val="0B2545"/>
+          <w:sz w:val="21"/>
+        </w:rPr>
         <w:t>12. Implemented Evidence</w:t>
       </w:r>
     </w:p>
@@ -969,7 +988,7 @@
                 <w:color w:val="111827"/>
                 <w:sz w:val="17"/>
               </w:rPr>
-              <w:t>Increments III-1 through III-5</w:t>
+              <w:t>Increments III-1 through III-6</w:t>
             </w:r>
           </w:p>
         </w:tc>
@@ -1729,6 +1748,95 @@
           </w:p>
         </w:tc>
       </w:tr>
+      <w:tr>
+        <w:trPr>
+          <w:cantSplit/>
+        </w:trPr>
+        <w:tc>
+          <w:tcPr>
+            <w:tcW w:type="dxa" w:w="1650"/>
+            <w:tcMar>
+              <w:top w:w="80" w:type="dxa"/>
+              <w:start w:w="120" w:type="dxa"/>
+              <w:bottom w:w="80" w:type="dxa"/>
+              <w:end w:w="120" w:type="dxa"/>
+            </w:tcMar>
+            <w:vAlign w:val="center"/>
+            <w:shd w:fill="FFFFFF"/>
+          </w:tcPr>
+          <w:p>
+            <w:pPr>
+              <w:spacing w:before="0" w:after="40" w:line="252" w:lineRule="auto"/>
+              <w:jc w:val="center"/>
+            </w:pPr>
+            <w:r>
+              <w:rPr>
+                <w:rFonts w:ascii="Calibri" w:hAnsi="Calibri"/>
+                <w:b w:val="0"/>
+                <w:color w:val="111827"/>
+                <w:sz w:val="17"/>
+              </w:rPr>
+              <w:t>0.6.0</w:t>
+            </w:r>
+          </w:p>
+        </w:tc>
+        <w:tc>
+          <w:tcPr>
+            <w:tcW w:type="dxa" w:w="4450"/>
+            <w:tcMar>
+              <w:top w:w="80" w:type="dxa"/>
+              <w:start w:w="120" w:type="dxa"/>
+              <w:bottom w:w="80" w:type="dxa"/>
+              <w:end w:w="120" w:type="dxa"/>
+            </w:tcMar>
+            <w:vAlign w:val="center"/>
+            <w:shd w:fill="FFFFFF"/>
+          </w:tcPr>
+          <w:p>
+            <w:pPr>
+              <w:spacing w:before="0" w:after="40" w:line="252" w:lineRule="auto"/>
+              <w:jc w:val="left"/>
+            </w:pPr>
+            <w:r>
+              <w:rPr>
+                <w:rFonts w:ascii="Calibri" w:hAnsi="Calibri"/>
+                <w:b w:val="0"/>
+                <w:color w:val="111827"/>
+                <w:sz w:val="17"/>
+              </w:rPr>
+              <w:t>2026-08-24</w:t>
+            </w:r>
+          </w:p>
+        </w:tc>
+        <w:tc>
+          <w:tcPr>
+            <w:tcW w:type="dxa" w:w="3260"/>
+            <w:tcMar>
+              <w:top w:w="80" w:type="dxa"/>
+              <w:start w:w="120" w:type="dxa"/>
+              <w:bottom w:w="80" w:type="dxa"/>
+              <w:end w:w="120" w:type="dxa"/>
+            </w:tcMar>
+            <w:vAlign w:val="center"/>
+            <w:shd w:fill="FFFFFF"/>
+          </w:tcPr>
+          <w:p>
+            <w:pPr>
+              <w:spacing w:before="0" w:after="40" w:line="252" w:lineRule="auto"/>
+              <w:jc w:val="left"/>
+            </w:pPr>
+            <w:r>
+              <w:rPr>
+                <w:rFonts w:ascii="Calibri" w:hAnsi="Calibri"/>
+                <w:b w:val="0"/>
+                <w:color w:val="111827"/>
+                <w:sz w:val="17"/>
+              </w:rPr>
+              <w:t>Added typed signal contracts, publication, gateway routes, atomic transfer, migration, APIs, and tests.</w:t>
+            </w:r>
+          </w:p>
+        </w:tc>
+      </w:tr>
     </w:tbl>
     <w:p>
       <w:pPr>
@@ -1821,6 +1929,23 @@
           <w:sz w:val="22"/>
         </w:rPr>
         <w:t>Bounded fault records with logical-time confirmation, healing, latching, clear, and DTC intent.</w:t>
+      </w:r>
+    </w:p>
+    <w:p>
+      <w:pPr>
+        <w:pStyle w:val="ListBullet"/>
+        <w:numPr>
+          <w:ilvl w:val="0"/>
+          <w:numId w:val="11"/>
+        </w:numPr>
+      </w:pPr>
+      <w:r>
+        <w:rPr>
+          <w:rFonts w:ascii="Calibri" w:hAnsi="Calibri"/>
+          <w:color w:val="111827"/>
+          <w:sz w:val="22"/>
+        </w:rPr>
+        <w:t>Typed produced/consumed signals, logical-time publication, and gateway-owned routing hooks.</w:t>
       </w:r>
     </w:p>
     <w:p>
@@ -1983,7 +2108,7 @@
           <w:color w:val="111827"/>
           <w:sz w:val="22"/>
         </w:rPr>
-        <w:t>CAN, CAN FD, LIN, Ethernet, and gateway routing.</w:t>
+        <w:t>CAN, CAN FD, LIN, Ethernet frames, DBC encoding, arbitration, and bus simulation.</w:t>
       </w:r>
     </w:p>
     <w:p>
@@ -2212,7 +2337,7 @@
           <w:color w:val="111827"/>
           <w:sz w:val="22"/>
         </w:rPr>
-        <w:t xml:space="preserve">, memory regions, cyclic tasks, profile version, behavior state, logical time, boot count, </w:t>
+        <w:t xml:space="preserve">, semantic signals, memory regions, cyclic tasks, profile version, behavior state, logical time, boot count, </w:t>
       </w:r>
       <w:r>
         <w:rPr>
@@ -2229,6 +2354,16 @@
           <w:sz w:val="22"/>
         </w:rPr>
         <w:t>, and timestamps. Memory has at most 256 cells, each with a 16-bit address and an 8-bit value. Faults have a canonical code, severity, pending/confirmed/healed status, description, bounded debounce counters, logical timestamps, thresholds, active state, and latch policy.</w:t>
+      </w:r>
+    </w:p>
+    <w:p>
+      <w:r>
+        <w:rPr>
+          <w:rFonts w:ascii="Calibri" w:hAnsi="Calibri"/>
+          <w:color w:val="111827"/>
+          <w:sz w:val="22"/>
+        </w:rPr>
+        <w:t>Signals are bounded to 64 contracts. Each contract declares a canonical name, produced/consumed direction, strict data type, optional unit/bounds/cycle time, current value, and ECU logical update time. Names are unique per direction, allowing an ECU to consume and produce the same semantic name without ambiguity.</w:t>
       </w:r>
     </w:p>
     <w:p>
@@ -4057,6 +4192,375 @@
           </w:p>
         </w:tc>
       </w:tr>
+      <w:tr>
+        <w:trPr>
+          <w:cantSplit/>
+        </w:trPr>
+        <w:tc>
+          <w:tcPr>
+            <w:tcW w:type="dxa" w:w="1150"/>
+            <w:tcMar>
+              <w:top w:w="80" w:type="dxa"/>
+              <w:start w:w="120" w:type="dxa"/>
+              <w:bottom w:w="80" w:type="dxa"/>
+              <w:end w:w="120" w:type="dxa"/>
+            </w:tcMar>
+            <w:vAlign w:val="center"/>
+            <w:shd w:fill="FFFFFF"/>
+          </w:tcPr>
+          <w:p>
+            <w:pPr>
+              <w:spacing w:before="0" w:after="40" w:line="252" w:lineRule="auto"/>
+              <w:jc w:val="center"/>
+            </w:pPr>
+            <w:r>
+              <w:rPr>
+                <w:rFonts w:ascii="Calibri" w:hAnsi="Calibri"/>
+                <w:b w:val="0"/>
+                <w:color w:val="111827"/>
+                <w:sz w:val="16"/>
+              </w:rPr>
+              <w:t>POST</w:t>
+            </w:r>
+          </w:p>
+        </w:tc>
+        <w:tc>
+          <w:tcPr>
+            <w:tcW w:type="dxa" w:w="3700"/>
+            <w:tcMar>
+              <w:top w:w="80" w:type="dxa"/>
+              <w:start w:w="120" w:type="dxa"/>
+              <w:bottom w:w="80" w:type="dxa"/>
+              <w:end w:w="120" w:type="dxa"/>
+            </w:tcMar>
+            <w:vAlign w:val="center"/>
+            <w:shd w:fill="FFFFFF"/>
+          </w:tcPr>
+          <w:p>
+            <w:pPr>
+              <w:spacing w:before="0" w:after="40" w:line="252" w:lineRule="auto"/>
+              <w:jc w:val="left"/>
+            </w:pPr>
+            <w:r>
+              <w:rPr>
+                <w:rFonts w:ascii="Calibri" w:hAnsi="Calibri"/>
+                <w:b w:val="0"/>
+                <w:color w:val="111827"/>
+                <w:sz w:val="16"/>
+              </w:rPr>
+              <w:t>/api/v1/vehicles/{vehicle_id}/ecus/{ecu_id}/signals/{signal_name}/publish</w:t>
+            </w:r>
+          </w:p>
+        </w:tc>
+        <w:tc>
+          <w:tcPr>
+            <w:tcW w:type="dxa" w:w="3100"/>
+            <w:tcMar>
+              <w:top w:w="80" w:type="dxa"/>
+              <w:start w:w="120" w:type="dxa"/>
+              <w:bottom w:w="80" w:type="dxa"/>
+              <w:end w:w="120" w:type="dxa"/>
+            </w:tcMar>
+            <w:vAlign w:val="center"/>
+            <w:shd w:fill="FFFFFF"/>
+          </w:tcPr>
+          <w:p>
+            <w:pPr>
+              <w:spacing w:before="0" w:after="40" w:line="252" w:lineRule="auto"/>
+              <w:jc w:val="left"/>
+            </w:pPr>
+            <w:r>
+              <w:rPr>
+                <w:rFonts w:ascii="Calibri" w:hAnsi="Calibri"/>
+                <w:b w:val="0"/>
+                <w:color w:val="111827"/>
+                <w:sz w:val="16"/>
+              </w:rPr>
+              <w:t>ecus:manage</w:t>
+            </w:r>
+          </w:p>
+        </w:tc>
+        <w:tc>
+          <w:tcPr>
+            <w:tcW w:type="dxa" w:w="1410"/>
+            <w:tcMar>
+              <w:top w:w="80" w:type="dxa"/>
+              <w:start w:w="120" w:type="dxa"/>
+              <w:bottom w:w="80" w:type="dxa"/>
+              <w:end w:w="120" w:type="dxa"/>
+            </w:tcMar>
+            <w:vAlign w:val="center"/>
+            <w:shd w:fill="FFFFFF"/>
+          </w:tcPr>
+          <w:p>
+            <w:pPr>
+              <w:spacing w:before="0" w:after="40" w:line="252" w:lineRule="auto"/>
+              <w:jc w:val="left"/>
+            </w:pPr>
+            <w:r>
+              <w:rPr>
+                <w:rFonts w:ascii="Calibri" w:hAnsi="Calibri"/>
+                <w:b w:val="0"/>
+                <w:color w:val="111827"/>
+                <w:sz w:val="16"/>
+              </w:rPr>
+              <w:t>Publish one produced signal value.</w:t>
+            </w:r>
+          </w:p>
+        </w:tc>
+      </w:tr>
+      <w:tr>
+        <w:trPr>
+          <w:cantSplit/>
+        </w:trPr>
+        <w:tc>
+          <w:tcPr>
+            <w:tcW w:type="dxa" w:w="1150"/>
+            <w:tcMar>
+              <w:top w:w="80" w:type="dxa"/>
+              <w:start w:w="120" w:type="dxa"/>
+              <w:bottom w:w="80" w:type="dxa"/>
+              <w:end w:w="120" w:type="dxa"/>
+            </w:tcMar>
+            <w:vAlign w:val="center"/>
+            <w:shd w:fill="FFFFFF"/>
+          </w:tcPr>
+          <w:p>
+            <w:pPr>
+              <w:spacing w:before="0" w:after="40" w:line="252" w:lineRule="auto"/>
+              <w:jc w:val="center"/>
+            </w:pPr>
+            <w:r>
+              <w:rPr>
+                <w:rFonts w:ascii="Calibri" w:hAnsi="Calibri"/>
+                <w:b w:val="0"/>
+                <w:color w:val="111827"/>
+                <w:sz w:val="16"/>
+              </w:rPr>
+              <w:t>POST/GET</w:t>
+            </w:r>
+          </w:p>
+        </w:tc>
+        <w:tc>
+          <w:tcPr>
+            <w:tcW w:type="dxa" w:w="3700"/>
+            <w:tcMar>
+              <w:top w:w="80" w:type="dxa"/>
+              <w:start w:w="120" w:type="dxa"/>
+              <w:bottom w:w="80" w:type="dxa"/>
+              <w:end w:w="120" w:type="dxa"/>
+            </w:tcMar>
+            <w:vAlign w:val="center"/>
+            <w:shd w:fill="FFFFFF"/>
+          </w:tcPr>
+          <w:p>
+            <w:pPr>
+              <w:spacing w:before="0" w:after="40" w:line="252" w:lineRule="auto"/>
+              <w:jc w:val="left"/>
+            </w:pPr>
+            <w:r>
+              <w:rPr>
+                <w:rFonts w:ascii="Calibri" w:hAnsi="Calibri"/>
+                <w:b w:val="0"/>
+                <w:color w:val="111827"/>
+                <w:sz w:val="16"/>
+              </w:rPr>
+              <w:t>/api/v1/vehicles/{vehicle_id}/ecus/{ecu_id}/signal-routes</w:t>
+            </w:r>
+          </w:p>
+        </w:tc>
+        <w:tc>
+          <w:tcPr>
+            <w:tcW w:type="dxa" w:w="3100"/>
+            <w:tcMar>
+              <w:top w:w="80" w:type="dxa"/>
+              <w:start w:w="120" w:type="dxa"/>
+              <w:bottom w:w="80" w:type="dxa"/>
+              <w:end w:w="120" w:type="dxa"/>
+            </w:tcMar>
+            <w:vAlign w:val="center"/>
+            <w:shd w:fill="FFFFFF"/>
+          </w:tcPr>
+          <w:p>
+            <w:pPr>
+              <w:spacing w:before="0" w:after="40" w:line="252" w:lineRule="auto"/>
+              <w:jc w:val="left"/>
+            </w:pPr>
+            <w:r>
+              <w:rPr>
+                <w:rFonts w:ascii="Calibri" w:hAnsi="Calibri"/>
+                <w:b w:val="0"/>
+                <w:color w:val="111827"/>
+                <w:sz w:val="16"/>
+              </w:rPr>
+              <w:t>ecus:manage</w:t>
+            </w:r>
+            <w:r>
+              <w:rPr>
+                <w:rFonts w:ascii="Calibri" w:hAnsi="Calibri"/>
+                <w:b w:val="0"/>
+                <w:color w:val="111827"/>
+                <w:sz w:val="16"/>
+              </w:rPr>
+              <w:t xml:space="preserve"> / </w:t>
+            </w:r>
+            <w:r>
+              <w:rPr>
+                <w:rFonts w:ascii="Calibri" w:hAnsi="Calibri"/>
+                <w:b w:val="0"/>
+                <w:color w:val="111827"/>
+                <w:sz w:val="16"/>
+              </w:rPr>
+              <w:t>ecus:read</w:t>
+            </w:r>
+          </w:p>
+        </w:tc>
+        <w:tc>
+          <w:tcPr>
+            <w:tcW w:type="dxa" w:w="1410"/>
+            <w:tcMar>
+              <w:top w:w="80" w:type="dxa"/>
+              <w:start w:w="120" w:type="dxa"/>
+              <w:bottom w:w="80" w:type="dxa"/>
+              <w:end w:w="120" w:type="dxa"/>
+            </w:tcMar>
+            <w:vAlign w:val="center"/>
+            <w:shd w:fill="FFFFFF"/>
+          </w:tcPr>
+          <w:p>
+            <w:pPr>
+              <w:spacing w:before="0" w:after="40" w:line="252" w:lineRule="auto"/>
+              <w:jc w:val="left"/>
+            </w:pPr>
+            <w:r>
+              <w:rPr>
+                <w:rFonts w:ascii="Calibri" w:hAnsi="Calibri"/>
+                <w:b w:val="0"/>
+                <w:color w:val="111827"/>
+                <w:sz w:val="16"/>
+              </w:rPr>
+              <w:t>Create or list gateway routes.</w:t>
+            </w:r>
+          </w:p>
+        </w:tc>
+      </w:tr>
+      <w:tr>
+        <w:trPr>
+          <w:cantSplit/>
+        </w:trPr>
+        <w:tc>
+          <w:tcPr>
+            <w:tcW w:type="dxa" w:w="1150"/>
+            <w:tcMar>
+              <w:top w:w="80" w:type="dxa"/>
+              <w:start w:w="120" w:type="dxa"/>
+              <w:bottom w:w="80" w:type="dxa"/>
+              <w:end w:w="120" w:type="dxa"/>
+            </w:tcMar>
+            <w:vAlign w:val="center"/>
+            <w:shd w:fill="FFFFFF"/>
+          </w:tcPr>
+          <w:p>
+            <w:pPr>
+              <w:spacing w:before="0" w:after="40" w:line="252" w:lineRule="auto"/>
+              <w:jc w:val="center"/>
+            </w:pPr>
+            <w:r>
+              <w:rPr>
+                <w:rFonts w:ascii="Calibri" w:hAnsi="Calibri"/>
+                <w:b w:val="0"/>
+                <w:color w:val="111827"/>
+                <w:sz w:val="16"/>
+              </w:rPr>
+              <w:t>POST</w:t>
+            </w:r>
+          </w:p>
+        </w:tc>
+        <w:tc>
+          <w:tcPr>
+            <w:tcW w:type="dxa" w:w="3700"/>
+            <w:tcMar>
+              <w:top w:w="80" w:type="dxa"/>
+              <w:start w:w="120" w:type="dxa"/>
+              <w:bottom w:w="80" w:type="dxa"/>
+              <w:end w:w="120" w:type="dxa"/>
+            </w:tcMar>
+            <w:vAlign w:val="center"/>
+            <w:shd w:fill="FFFFFF"/>
+          </w:tcPr>
+          <w:p>
+            <w:pPr>
+              <w:spacing w:before="0" w:after="40" w:line="252" w:lineRule="auto"/>
+              <w:jc w:val="left"/>
+            </w:pPr>
+            <w:r>
+              <w:rPr>
+                <w:rFonts w:ascii="Calibri" w:hAnsi="Calibri"/>
+                <w:b w:val="0"/>
+                <w:color w:val="111827"/>
+                <w:sz w:val="16"/>
+              </w:rPr>
+              <w:t>/api/v1/vehicles/{vehicle_id}/ecus/{ecu_id}/signal-routes/{route_id}/transfer</w:t>
+            </w:r>
+          </w:p>
+        </w:tc>
+        <w:tc>
+          <w:tcPr>
+            <w:tcW w:type="dxa" w:w="3100"/>
+            <w:tcMar>
+              <w:top w:w="80" w:type="dxa"/>
+              <w:start w:w="120" w:type="dxa"/>
+              <w:bottom w:w="80" w:type="dxa"/>
+              <w:end w:w="120" w:type="dxa"/>
+            </w:tcMar>
+            <w:vAlign w:val="center"/>
+            <w:shd w:fill="FFFFFF"/>
+          </w:tcPr>
+          <w:p>
+            <w:pPr>
+              <w:spacing w:before="0" w:after="40" w:line="252" w:lineRule="auto"/>
+              <w:jc w:val="left"/>
+            </w:pPr>
+            <w:r>
+              <w:rPr>
+                <w:rFonts w:ascii="Calibri" w:hAnsi="Calibri"/>
+                <w:b w:val="0"/>
+                <w:color w:val="111827"/>
+                <w:sz w:val="16"/>
+              </w:rPr>
+              <w:t>ecus:manage</w:t>
+            </w:r>
+          </w:p>
+        </w:tc>
+        <w:tc>
+          <w:tcPr>
+            <w:tcW w:type="dxa" w:w="1410"/>
+            <w:tcMar>
+              <w:top w:w="80" w:type="dxa"/>
+              <w:start w:w="120" w:type="dxa"/>
+              <w:bottom w:w="80" w:type="dxa"/>
+              <w:end w:w="120" w:type="dxa"/>
+            </w:tcMar>
+            <w:vAlign w:val="center"/>
+            <w:shd w:fill="FFFFFF"/>
+          </w:tcPr>
+          <w:p>
+            <w:pPr>
+              <w:spacing w:before="0" w:after="40" w:line="252" w:lineRule="auto"/>
+              <w:jc w:val="left"/>
+            </w:pPr>
+            <w:r>
+              <w:rPr>
+                <w:rFonts w:ascii="Calibri" w:hAnsi="Calibri"/>
+                <w:b w:val="0"/>
+                <w:color w:val="111827"/>
+                <w:sz w:val="16"/>
+              </w:rPr>
+              <w:t>Transfer a routed value atomically.</w:t>
+            </w:r>
+          </w:p>
+        </w:tc>
+      </w:tr>
     </w:tbl>
     <w:p>
       <w:pPr>
@@ -4275,6 +4779,36 @@
     </w:p>
     <w:p>
       <w:pPr>
+        <w:pStyle w:val="Heading2"/>
+        <w:keepNext/>
+        <w:keepLines/>
+      </w:pPr>
+      <w:r>
+        <w:t>8.5 Signal Publication and Gateway Routes</w:t>
+      </w:r>
+    </w:p>
+    <w:p>
+      <w:r>
+        <w:rPr>
+          <w:rFonts w:ascii="Calibri" w:hAnsi="Calibri"/>
+          <w:color w:val="111827"/>
+          <w:sz w:val="22"/>
+        </w:rPr>
+        <w:t>Signal publication changes a produced contract under a row lock and expected ECU version. The published timestamp is the ECU logical clock, not host time. Persisted command identity makes exact retries safe. Evidence includes contract identity, type, direction, and logical time but excludes the physical value.</w:t>
+      </w:r>
+    </w:p>
+    <w:p>
+      <w:r>
+        <w:rPr>
+          <w:rFonts w:ascii="Calibri" w:hAnsi="Calibri"/>
+          <w:color w:val="111827"/>
+          <w:sz w:val="22"/>
+        </w:rPr>
+        <w:t>Only a gateway ECU can own a route. Its source and target are distinct ECUs in the same vehicle; the source contract must be produced, the target consumed, and type/unit must match. Transfer locks both ECUs, compares source and target versions, copies the source value to the target at target logical time, and increments only the target version. This is an adapter hook: no CAN ID, frame, DBC, arbitration, bitrate, or bus timing exists in the ECU domain.</w:t>
+      </w:r>
+    </w:p>
+    <w:p>
+      <w:pPr>
         <w:pStyle w:val="Heading1"/>
         <w:keepNext/>
         <w:keepLines/>
@@ -4306,7 +4840,7 @@
           <w:color w:val="111827"/>
           <w:sz w:val="22"/>
         </w:rPr>
-        <w:t>. III-1 covers the aggregate, III-2 covers deterministic execution and reset, III-3 covers versioned profiles, III-4 covers memory regions, snapshots, persistence, and corruption, and III-5 covers fault lifecycle and DTC intent.</w:t>
+        <w:t>. III-1 covers the aggregate, III-2 covers deterministic execution and reset, III-3 covers versioned profiles, III-4 covers memory regions, snapshots, persistence, and corruption, III-5 covers fault lifecycle and DTC intent, and III-6 covers semantic signal contracts and gateway routing hooks.</w:t>
       </w:r>
     </w:p>
     <w:p>
@@ -4553,6 +5087,46 @@
           <w:sz w:val="22"/>
         </w:rPr>
         <w:t>The ECU owns fault truth, while Diagnostics will own UDS identifiers, status bytes, and services. Publishing diagnostic intent prevents both domains from creating competing fault representations.</w:t>
+      </w:r>
+    </w:p>
+    <w:p>
+      <w:pPr>
+        <w:pStyle w:val="Heading2"/>
+        <w:keepNext/>
+        <w:keepLines/>
+      </w:pPr>
+      <w:r>
+        <w:t>ADR-ECU-012 — Separate Semantic Signals from CAN Transport</w:t>
+      </w:r>
+    </w:p>
+    <w:p>
+      <w:r>
+        <w:rPr>
+          <w:rFonts w:ascii="Calibri" w:hAnsi="Calibri"/>
+          <w:color w:val="111827"/>
+          <w:sz w:val="22"/>
+        </w:rPr>
+        <w:t>ECUs own physical meaning, direction, value constraints, and logical timestamps. Volume IV owns CAN identifiers, encoding, frames, arbitration, bus timing, and network faults. This allows alternate Ethernet or simulation adapters to reuse the same ECU contract.</w:t>
+      </w:r>
+    </w:p>
+    <w:p>
+      <w:pPr>
+        <w:pStyle w:val="Heading2"/>
+        <w:keepNext/>
+        <w:keepLines/>
+      </w:pPr>
+      <w:r>
+        <w:t>ADR-ECU-013 — Make Gateway Routing Explicit and Version-Guarded</w:t>
+      </w:r>
+    </w:p>
+    <w:p>
+      <w:r>
+        <w:rPr>
+          <w:rFonts w:ascii="Calibri" w:hAnsi="Calibri"/>
+          <w:color w:val="111827"/>
+          <w:sz w:val="22"/>
+        </w:rPr>
+        <w:t>Persistent routes provide reviewable source/target ownership. Matching type/unit rules prevent implicit conversion, while source and target versions expose stale transfers rather than silently copying a different value.</w:t>
       </w:r>
     </w:p>
     <w:p>
@@ -10324,6 +10898,1201 @@
         <w:keepLines/>
       </w:pPr>
       <w:r>
+        <w:t>11.5 III-6 Verification</w:t>
+      </w:r>
+    </w:p>
+    <w:tbl>
+      <w:tblPr>
+        <w:tblW w:type="dxa" w:w="9360"/>
+        <w:jc w:val="left"/>
+        <w:tblLayout w:type="fixed"/>
+        <w:tblLook w:firstColumn="1" w:firstRow="1" w:lastColumn="0" w:lastRow="0" w:noHBand="0" w:noVBand="1" w:val="04A0"/>
+        <w:tblInd w:w="120" w:type="dxa"/>
+        <w:tblBorders>
+          <w:top w:val="single" w:sz="6" w:color="B8C4D1"/>
+          <w:left w:val="single" w:sz="6" w:color="B8C4D1"/>
+          <w:bottom w:val="single" w:sz="6" w:color="B8C4D1"/>
+          <w:right w:val="single" w:sz="6" w:color="B8C4D1"/>
+          <w:insideH w:val="single" w:sz="6" w:color="B8C4D1"/>
+          <w:insideV w:val="single" w:sz="6" w:color="B8C4D1"/>
+        </w:tblBorders>
+      </w:tblPr>
+      <w:tblGrid>
+        <w:gridCol w:w="1650"/>
+        <w:gridCol w:w="4450"/>
+        <w:gridCol w:w="3260"/>
+      </w:tblGrid>
+      <w:tr>
+        <w:trPr>
+          <w:tblHeader w:val="true"/>
+          <w:cantSplit/>
+        </w:trPr>
+        <w:tc>
+          <w:tcPr>
+            <w:tcW w:type="dxa" w:w="1650"/>
+            <w:tcMar>
+              <w:top w:w="80" w:type="dxa"/>
+              <w:start w:w="120" w:type="dxa"/>
+              <w:bottom w:w="80" w:type="dxa"/>
+              <w:end w:w="120" w:type="dxa"/>
+            </w:tcMar>
+            <w:vAlign w:val="center"/>
+            <w:shd w:fill="E8EEF5"/>
+          </w:tcPr>
+          <w:p>
+            <w:pPr>
+              <w:spacing w:before="0" w:after="40" w:line="252" w:lineRule="auto"/>
+              <w:jc w:val="center"/>
+            </w:pPr>
+            <w:r>
+              <w:rPr>
+                <w:rFonts w:ascii="Calibri" w:hAnsi="Calibri"/>
+                <w:b/>
+                <w:color w:val="0B2545"/>
+                <w:sz w:val="17"/>
+              </w:rPr>
+              <w:t>Test</w:t>
+            </w:r>
+          </w:p>
+        </w:tc>
+        <w:tc>
+          <w:tcPr>
+            <w:tcW w:type="dxa" w:w="4450"/>
+            <w:tcMar>
+              <w:top w:w="80" w:type="dxa"/>
+              <w:start w:w="120" w:type="dxa"/>
+              <w:bottom w:w="80" w:type="dxa"/>
+              <w:end w:w="120" w:type="dxa"/>
+            </w:tcMar>
+            <w:vAlign w:val="center"/>
+            <w:shd w:fill="E8EEF5"/>
+          </w:tcPr>
+          <w:p>
+            <w:pPr>
+              <w:spacing w:before="0" w:after="40" w:line="252" w:lineRule="auto"/>
+              <w:jc w:val="left"/>
+            </w:pPr>
+            <w:r>
+              <w:rPr>
+                <w:rFonts w:ascii="Calibri" w:hAnsi="Calibri"/>
+                <w:b/>
+                <w:color w:val="0B2545"/>
+                <w:sz w:val="17"/>
+              </w:rPr>
+              <w:t>Objective</w:t>
+            </w:r>
+          </w:p>
+        </w:tc>
+        <w:tc>
+          <w:tcPr>
+            <w:tcW w:type="dxa" w:w="3260"/>
+            <w:tcMar>
+              <w:top w:w="80" w:type="dxa"/>
+              <w:start w:w="120" w:type="dxa"/>
+              <w:bottom w:w="80" w:type="dxa"/>
+              <w:end w:w="120" w:type="dxa"/>
+            </w:tcMar>
+            <w:vAlign w:val="center"/>
+            <w:shd w:fill="E8EEF5"/>
+          </w:tcPr>
+          <w:p>
+            <w:pPr>
+              <w:spacing w:before="0" w:after="40" w:line="252" w:lineRule="auto"/>
+              <w:jc w:val="left"/>
+            </w:pPr>
+            <w:r>
+              <w:rPr>
+                <w:rFonts w:ascii="Calibri" w:hAnsi="Calibri"/>
+                <w:b/>
+                <w:color w:val="0B2545"/>
+                <w:sz w:val="17"/>
+              </w:rPr>
+              <w:t>Level</w:t>
+            </w:r>
+          </w:p>
+        </w:tc>
+      </w:tr>
+      <w:tr>
+        <w:trPr>
+          <w:cantSplit/>
+        </w:trPr>
+        <w:tc>
+          <w:tcPr>
+            <w:tcW w:type="dxa" w:w="1650"/>
+            <w:tcMar>
+              <w:top w:w="80" w:type="dxa"/>
+              <w:start w:w="120" w:type="dxa"/>
+              <w:bottom w:w="80" w:type="dxa"/>
+              <w:end w:w="120" w:type="dxa"/>
+            </w:tcMar>
+            <w:vAlign w:val="center"/>
+            <w:shd w:fill="FFFFFF"/>
+          </w:tcPr>
+          <w:p>
+            <w:pPr>
+              <w:spacing w:before="0" w:after="40" w:line="252" w:lineRule="auto"/>
+              <w:jc w:val="center"/>
+            </w:pPr>
+            <w:r>
+              <w:rPr>
+                <w:rFonts w:ascii="Calibri" w:hAnsi="Calibri"/>
+                <w:b w:val="0"/>
+                <w:color w:val="111827"/>
+                <w:sz w:val="17"/>
+              </w:rPr>
+              <w:t>Signal bound</w:t>
+            </w:r>
+          </w:p>
+        </w:tc>
+        <w:tc>
+          <w:tcPr>
+            <w:tcW w:type="dxa" w:w="4450"/>
+            <w:tcMar>
+              <w:top w:w="80" w:type="dxa"/>
+              <w:start w:w="120" w:type="dxa"/>
+              <w:bottom w:w="80" w:type="dxa"/>
+              <w:end w:w="120" w:type="dxa"/>
+            </w:tcMar>
+            <w:vAlign w:val="center"/>
+            <w:shd w:fill="FFFFFF"/>
+          </w:tcPr>
+          <w:p>
+            <w:pPr>
+              <w:spacing w:before="0" w:after="40" w:line="252" w:lineRule="auto"/>
+              <w:jc w:val="left"/>
+            </w:pPr>
+            <w:r>
+              <w:rPr>
+                <w:rFonts w:ascii="Calibri" w:hAnsi="Calibri"/>
+                <w:b w:val="0"/>
+                <w:color w:val="111827"/>
+                <w:sz w:val="17"/>
+              </w:rPr>
+              <w:t>Reject the 65th contract.</w:t>
+            </w:r>
+          </w:p>
+        </w:tc>
+        <w:tc>
+          <w:tcPr>
+            <w:tcW w:type="dxa" w:w="3260"/>
+            <w:tcMar>
+              <w:top w:w="80" w:type="dxa"/>
+              <w:start w:w="120" w:type="dxa"/>
+              <w:bottom w:w="80" w:type="dxa"/>
+              <w:end w:w="120" w:type="dxa"/>
+            </w:tcMar>
+            <w:vAlign w:val="center"/>
+            <w:shd w:fill="FFFFFF"/>
+          </w:tcPr>
+          <w:p>
+            <w:pPr>
+              <w:spacing w:before="0" w:after="40" w:line="252" w:lineRule="auto"/>
+              <w:jc w:val="left"/>
+            </w:pPr>
+            <w:r>
+              <w:rPr>
+                <w:rFonts w:ascii="Calibri" w:hAnsi="Calibri"/>
+                <w:b w:val="0"/>
+                <w:color w:val="111827"/>
+                <w:sz w:val="17"/>
+              </w:rPr>
+              <w:t>Schema</w:t>
+            </w:r>
+          </w:p>
+        </w:tc>
+      </w:tr>
+      <w:tr>
+        <w:trPr>
+          <w:cantSplit/>
+        </w:trPr>
+        <w:tc>
+          <w:tcPr>
+            <w:tcW w:type="dxa" w:w="1650"/>
+            <w:tcMar>
+              <w:top w:w="80" w:type="dxa"/>
+              <w:start w:w="120" w:type="dxa"/>
+              <w:bottom w:w="80" w:type="dxa"/>
+              <w:end w:w="120" w:type="dxa"/>
+            </w:tcMar>
+            <w:vAlign w:val="center"/>
+            <w:shd w:fill="FFFFFF"/>
+          </w:tcPr>
+          <w:p>
+            <w:pPr>
+              <w:spacing w:before="0" w:after="40" w:line="252" w:lineRule="auto"/>
+              <w:jc w:val="center"/>
+            </w:pPr>
+            <w:r>
+              <w:rPr>
+                <w:rFonts w:ascii="Calibri" w:hAnsi="Calibri"/>
+                <w:b w:val="0"/>
+                <w:color w:val="111827"/>
+                <w:sz w:val="17"/>
+              </w:rPr>
+              <w:t>Strict data type</w:t>
+            </w:r>
+          </w:p>
+        </w:tc>
+        <w:tc>
+          <w:tcPr>
+            <w:tcW w:type="dxa" w:w="4450"/>
+            <w:tcMar>
+              <w:top w:w="80" w:type="dxa"/>
+              <w:start w:w="120" w:type="dxa"/>
+              <w:bottom w:w="80" w:type="dxa"/>
+              <w:end w:w="120" w:type="dxa"/>
+            </w:tcMar>
+            <w:vAlign w:val="center"/>
+            <w:shd w:fill="FFFFFF"/>
+          </w:tcPr>
+          <w:p>
+            <w:pPr>
+              <w:spacing w:before="0" w:after="40" w:line="252" w:lineRule="auto"/>
+              <w:jc w:val="left"/>
+            </w:pPr>
+            <w:r>
+              <w:rPr>
+                <w:rFonts w:ascii="Calibri" w:hAnsi="Calibri"/>
+                <w:b w:val="0"/>
+                <w:color w:val="111827"/>
+                <w:sz w:val="17"/>
+              </w:rPr>
+              <w:t>Reject coercion and values that disagree with the declaration.</w:t>
+            </w:r>
+          </w:p>
+        </w:tc>
+        <w:tc>
+          <w:tcPr>
+            <w:tcW w:type="dxa" w:w="3260"/>
+            <w:tcMar>
+              <w:top w:w="80" w:type="dxa"/>
+              <w:start w:w="120" w:type="dxa"/>
+              <w:bottom w:w="80" w:type="dxa"/>
+              <w:end w:w="120" w:type="dxa"/>
+            </w:tcMar>
+            <w:vAlign w:val="center"/>
+            <w:shd w:fill="FFFFFF"/>
+          </w:tcPr>
+          <w:p>
+            <w:pPr>
+              <w:spacing w:before="0" w:after="40" w:line="252" w:lineRule="auto"/>
+              <w:jc w:val="left"/>
+            </w:pPr>
+            <w:r>
+              <w:rPr>
+                <w:rFonts w:ascii="Calibri" w:hAnsi="Calibri"/>
+                <w:b w:val="0"/>
+                <w:color w:val="111827"/>
+                <w:sz w:val="17"/>
+              </w:rPr>
+              <w:t>Schema</w:t>
+            </w:r>
+          </w:p>
+        </w:tc>
+      </w:tr>
+      <w:tr>
+        <w:trPr>
+          <w:cantSplit/>
+        </w:trPr>
+        <w:tc>
+          <w:tcPr>
+            <w:tcW w:type="dxa" w:w="1650"/>
+            <w:tcMar>
+              <w:top w:w="80" w:type="dxa"/>
+              <w:start w:w="120" w:type="dxa"/>
+              <w:bottom w:w="80" w:type="dxa"/>
+              <w:end w:w="120" w:type="dxa"/>
+            </w:tcMar>
+            <w:vAlign w:val="center"/>
+            <w:shd w:fill="FFFFFF"/>
+          </w:tcPr>
+          <w:p>
+            <w:pPr>
+              <w:spacing w:before="0" w:after="40" w:line="252" w:lineRule="auto"/>
+              <w:jc w:val="center"/>
+            </w:pPr>
+            <w:r>
+              <w:rPr>
+                <w:rFonts w:ascii="Calibri" w:hAnsi="Calibri"/>
+                <w:b w:val="0"/>
+                <w:color w:val="111827"/>
+                <w:sz w:val="17"/>
+              </w:rPr>
+              <w:t>Physical bounds</w:t>
+            </w:r>
+          </w:p>
+        </w:tc>
+        <w:tc>
+          <w:tcPr>
+            <w:tcW w:type="dxa" w:w="4450"/>
+            <w:tcMar>
+              <w:top w:w="80" w:type="dxa"/>
+              <w:start w:w="120" w:type="dxa"/>
+              <w:bottom w:w="80" w:type="dxa"/>
+              <w:end w:w="120" w:type="dxa"/>
+            </w:tcMar>
+            <w:vAlign w:val="center"/>
+            <w:shd w:fill="FFFFFF"/>
+          </w:tcPr>
+          <w:p>
+            <w:pPr>
+              <w:spacing w:before="0" w:after="40" w:line="252" w:lineRule="auto"/>
+              <w:jc w:val="left"/>
+            </w:pPr>
+            <w:r>
+              <w:rPr>
+                <w:rFonts w:ascii="Calibri" w:hAnsi="Calibri"/>
+                <w:b w:val="0"/>
+                <w:color w:val="111827"/>
+                <w:sz w:val="17"/>
+              </w:rPr>
+              <w:t>Reject values below minimum or above maximum.</w:t>
+            </w:r>
+          </w:p>
+        </w:tc>
+        <w:tc>
+          <w:tcPr>
+            <w:tcW w:type="dxa" w:w="3260"/>
+            <w:tcMar>
+              <w:top w:w="80" w:type="dxa"/>
+              <w:start w:w="120" w:type="dxa"/>
+              <w:bottom w:w="80" w:type="dxa"/>
+              <w:end w:w="120" w:type="dxa"/>
+            </w:tcMar>
+            <w:vAlign w:val="center"/>
+            <w:shd w:fill="FFFFFF"/>
+          </w:tcPr>
+          <w:p>
+            <w:pPr>
+              <w:spacing w:before="0" w:after="40" w:line="252" w:lineRule="auto"/>
+              <w:jc w:val="left"/>
+            </w:pPr>
+            <w:r>
+              <w:rPr>
+                <w:rFonts w:ascii="Calibri" w:hAnsi="Calibri"/>
+                <w:b w:val="0"/>
+                <w:color w:val="111827"/>
+                <w:sz w:val="17"/>
+              </w:rPr>
+              <w:t>Schema/service</w:t>
+            </w:r>
+          </w:p>
+        </w:tc>
+      </w:tr>
+      <w:tr>
+        <w:trPr>
+          <w:cantSplit/>
+        </w:trPr>
+        <w:tc>
+          <w:tcPr>
+            <w:tcW w:type="dxa" w:w="1650"/>
+            <w:tcMar>
+              <w:top w:w="80" w:type="dxa"/>
+              <w:start w:w="120" w:type="dxa"/>
+              <w:bottom w:w="80" w:type="dxa"/>
+              <w:end w:w="120" w:type="dxa"/>
+            </w:tcMar>
+            <w:vAlign w:val="center"/>
+            <w:shd w:fill="FFFFFF"/>
+          </w:tcPr>
+          <w:p>
+            <w:pPr>
+              <w:spacing w:before="0" w:after="40" w:line="252" w:lineRule="auto"/>
+              <w:jc w:val="center"/>
+            </w:pPr>
+            <w:r>
+              <w:rPr>
+                <w:rFonts w:ascii="Calibri" w:hAnsi="Calibri"/>
+                <w:b w:val="0"/>
+                <w:color w:val="111827"/>
+                <w:sz w:val="17"/>
+              </w:rPr>
+              <w:t>Direction uniqueness</w:t>
+            </w:r>
+          </w:p>
+        </w:tc>
+        <w:tc>
+          <w:tcPr>
+            <w:tcW w:type="dxa" w:w="4450"/>
+            <w:tcMar>
+              <w:top w:w="80" w:type="dxa"/>
+              <w:start w:w="120" w:type="dxa"/>
+              <w:bottom w:w="80" w:type="dxa"/>
+              <w:end w:w="120" w:type="dxa"/>
+            </w:tcMar>
+            <w:vAlign w:val="center"/>
+            <w:shd w:fill="FFFFFF"/>
+          </w:tcPr>
+          <w:p>
+            <w:pPr>
+              <w:spacing w:before="0" w:after="40" w:line="252" w:lineRule="auto"/>
+              <w:jc w:val="left"/>
+            </w:pPr>
+            <w:r>
+              <w:rPr>
+                <w:rFonts w:ascii="Calibri" w:hAnsi="Calibri"/>
+                <w:b w:val="0"/>
+                <w:color w:val="111827"/>
+                <w:sz w:val="17"/>
+              </w:rPr>
+              <w:t>Reject duplicate names within one direction.</w:t>
+            </w:r>
+          </w:p>
+        </w:tc>
+        <w:tc>
+          <w:tcPr>
+            <w:tcW w:type="dxa" w:w="3260"/>
+            <w:tcMar>
+              <w:top w:w="80" w:type="dxa"/>
+              <w:start w:w="120" w:type="dxa"/>
+              <w:bottom w:w="80" w:type="dxa"/>
+              <w:end w:w="120" w:type="dxa"/>
+            </w:tcMar>
+            <w:vAlign w:val="center"/>
+            <w:shd w:fill="FFFFFF"/>
+          </w:tcPr>
+          <w:p>
+            <w:pPr>
+              <w:spacing w:before="0" w:after="40" w:line="252" w:lineRule="auto"/>
+              <w:jc w:val="left"/>
+            </w:pPr>
+            <w:r>
+              <w:rPr>
+                <w:rFonts w:ascii="Calibri" w:hAnsi="Calibri"/>
+                <w:b w:val="0"/>
+                <w:color w:val="111827"/>
+                <w:sz w:val="17"/>
+              </w:rPr>
+              <w:t>Schema</w:t>
+            </w:r>
+          </w:p>
+        </w:tc>
+      </w:tr>
+      <w:tr>
+        <w:trPr>
+          <w:cantSplit/>
+        </w:trPr>
+        <w:tc>
+          <w:tcPr>
+            <w:tcW w:type="dxa" w:w="1650"/>
+            <w:tcMar>
+              <w:top w:w="80" w:type="dxa"/>
+              <w:start w:w="120" w:type="dxa"/>
+              <w:bottom w:w="80" w:type="dxa"/>
+              <w:end w:w="120" w:type="dxa"/>
+            </w:tcMar>
+            <w:vAlign w:val="center"/>
+            <w:shd w:fill="FFFFFF"/>
+          </w:tcPr>
+          <w:p>
+            <w:pPr>
+              <w:spacing w:before="0" w:after="40" w:line="252" w:lineRule="auto"/>
+              <w:jc w:val="center"/>
+            </w:pPr>
+            <w:r>
+              <w:rPr>
+                <w:rFonts w:ascii="Calibri" w:hAnsi="Calibri"/>
+                <w:b w:val="0"/>
+                <w:color w:val="111827"/>
+                <w:sz w:val="17"/>
+              </w:rPr>
+              <w:t>Publication clock</w:t>
+            </w:r>
+          </w:p>
+        </w:tc>
+        <w:tc>
+          <w:tcPr>
+            <w:tcW w:type="dxa" w:w="4450"/>
+            <w:tcMar>
+              <w:top w:w="80" w:type="dxa"/>
+              <w:start w:w="120" w:type="dxa"/>
+              <w:bottom w:w="80" w:type="dxa"/>
+              <w:end w:w="120" w:type="dxa"/>
+            </w:tcMar>
+            <w:vAlign w:val="center"/>
+            <w:shd w:fill="FFFFFF"/>
+          </w:tcPr>
+          <w:p>
+            <w:pPr>
+              <w:spacing w:before="0" w:after="40" w:line="252" w:lineRule="auto"/>
+              <w:jc w:val="left"/>
+            </w:pPr>
+            <w:r>
+              <w:rPr>
+                <w:rFonts w:ascii="Calibri" w:hAnsi="Calibri"/>
+                <w:b w:val="0"/>
+                <w:color w:val="111827"/>
+                <w:sz w:val="17"/>
+              </w:rPr>
+              <w:t>Record the ECU logical time without wall-clock access.</w:t>
+            </w:r>
+          </w:p>
+        </w:tc>
+        <w:tc>
+          <w:tcPr>
+            <w:tcW w:type="dxa" w:w="3260"/>
+            <w:tcMar>
+              <w:top w:w="80" w:type="dxa"/>
+              <w:start w:w="120" w:type="dxa"/>
+              <w:bottom w:w="80" w:type="dxa"/>
+              <w:end w:w="120" w:type="dxa"/>
+            </w:tcMar>
+            <w:vAlign w:val="center"/>
+            <w:shd w:fill="FFFFFF"/>
+          </w:tcPr>
+          <w:p>
+            <w:pPr>
+              <w:spacing w:before="0" w:after="40" w:line="252" w:lineRule="auto"/>
+              <w:jc w:val="left"/>
+            </w:pPr>
+            <w:r>
+              <w:rPr>
+                <w:rFonts w:ascii="Calibri" w:hAnsi="Calibri"/>
+                <w:b w:val="0"/>
+                <w:color w:val="111827"/>
+                <w:sz w:val="17"/>
+              </w:rPr>
+              <w:t>Service</w:t>
+            </w:r>
+          </w:p>
+        </w:tc>
+      </w:tr>
+      <w:tr>
+        <w:trPr>
+          <w:cantSplit/>
+        </w:trPr>
+        <w:tc>
+          <w:tcPr>
+            <w:tcW w:type="dxa" w:w="1650"/>
+            <w:tcMar>
+              <w:top w:w="80" w:type="dxa"/>
+              <w:start w:w="120" w:type="dxa"/>
+              <w:bottom w:w="80" w:type="dxa"/>
+              <w:end w:w="120" w:type="dxa"/>
+            </w:tcMar>
+            <w:vAlign w:val="center"/>
+            <w:shd w:fill="FFFFFF"/>
+          </w:tcPr>
+          <w:p>
+            <w:pPr>
+              <w:spacing w:before="0" w:after="40" w:line="252" w:lineRule="auto"/>
+              <w:jc w:val="center"/>
+            </w:pPr>
+            <w:r>
+              <w:rPr>
+                <w:rFonts w:ascii="Calibri" w:hAnsi="Calibri"/>
+                <w:b w:val="0"/>
+                <w:color w:val="111827"/>
+                <w:sz w:val="17"/>
+              </w:rPr>
+              <w:t>Publication replay</w:t>
+            </w:r>
+          </w:p>
+        </w:tc>
+        <w:tc>
+          <w:tcPr>
+            <w:tcW w:type="dxa" w:w="4450"/>
+            <w:tcMar>
+              <w:top w:w="80" w:type="dxa"/>
+              <w:start w:w="120" w:type="dxa"/>
+              <w:bottom w:w="80" w:type="dxa"/>
+              <w:end w:w="120" w:type="dxa"/>
+            </w:tcMar>
+            <w:vAlign w:val="center"/>
+            <w:shd w:fill="FFFFFF"/>
+          </w:tcPr>
+          <w:p>
+            <w:pPr>
+              <w:spacing w:before="0" w:after="40" w:line="252" w:lineRule="auto"/>
+              <w:jc w:val="left"/>
+            </w:pPr>
+            <w:r>
+              <w:rPr>
+                <w:rFonts w:ascii="Calibri" w:hAnsi="Calibri"/>
+                <w:b w:val="0"/>
+                <w:color w:val="111827"/>
+                <w:sz w:val="17"/>
+              </w:rPr>
+              <w:t>Avoid changing value or version twice.</w:t>
+            </w:r>
+          </w:p>
+        </w:tc>
+        <w:tc>
+          <w:tcPr>
+            <w:tcW w:type="dxa" w:w="3260"/>
+            <w:tcMar>
+              <w:top w:w="80" w:type="dxa"/>
+              <w:start w:w="120" w:type="dxa"/>
+              <w:bottom w:w="80" w:type="dxa"/>
+              <w:end w:w="120" w:type="dxa"/>
+            </w:tcMar>
+            <w:vAlign w:val="center"/>
+            <w:shd w:fill="FFFFFF"/>
+          </w:tcPr>
+          <w:p>
+            <w:pPr>
+              <w:spacing w:before="0" w:after="40" w:line="252" w:lineRule="auto"/>
+              <w:jc w:val="left"/>
+            </w:pPr>
+            <w:r>
+              <w:rPr>
+                <w:rFonts w:ascii="Calibri" w:hAnsi="Calibri"/>
+                <w:b w:val="0"/>
+                <w:color w:val="111827"/>
+                <w:sz w:val="17"/>
+              </w:rPr>
+              <w:t>Service</w:t>
+            </w:r>
+          </w:p>
+        </w:tc>
+      </w:tr>
+      <w:tr>
+        <w:trPr>
+          <w:cantSplit/>
+        </w:trPr>
+        <w:tc>
+          <w:tcPr>
+            <w:tcW w:type="dxa" w:w="1650"/>
+            <w:tcMar>
+              <w:top w:w="80" w:type="dxa"/>
+              <w:start w:w="120" w:type="dxa"/>
+              <w:bottom w:w="80" w:type="dxa"/>
+              <w:end w:w="120" w:type="dxa"/>
+            </w:tcMar>
+            <w:vAlign w:val="center"/>
+            <w:shd w:fill="FFFFFF"/>
+          </w:tcPr>
+          <w:p>
+            <w:pPr>
+              <w:spacing w:before="0" w:after="40" w:line="252" w:lineRule="auto"/>
+              <w:jc w:val="center"/>
+            </w:pPr>
+            <w:r>
+              <w:rPr>
+                <w:rFonts w:ascii="Calibri" w:hAnsi="Calibri"/>
+                <w:b w:val="0"/>
+                <w:color w:val="111827"/>
+                <w:sz w:val="17"/>
+              </w:rPr>
+              <w:t>Gateway ownership</w:t>
+            </w:r>
+          </w:p>
+        </w:tc>
+        <w:tc>
+          <w:tcPr>
+            <w:tcW w:type="dxa" w:w="4450"/>
+            <w:tcMar>
+              <w:top w:w="80" w:type="dxa"/>
+              <w:start w:w="120" w:type="dxa"/>
+              <w:bottom w:w="80" w:type="dxa"/>
+              <w:end w:w="120" w:type="dxa"/>
+            </w:tcMar>
+            <w:vAlign w:val="center"/>
+            <w:shd w:fill="FFFFFF"/>
+          </w:tcPr>
+          <w:p>
+            <w:pPr>
+              <w:spacing w:before="0" w:after="40" w:line="252" w:lineRule="auto"/>
+              <w:jc w:val="left"/>
+            </w:pPr>
+            <w:r>
+              <w:rPr>
+                <w:rFonts w:ascii="Calibri" w:hAnsi="Calibri"/>
+                <w:b w:val="0"/>
+                <w:color w:val="111827"/>
+                <w:sz w:val="17"/>
+              </w:rPr>
+              <w:t>Reject route creation by a non-gateway ECU.</w:t>
+            </w:r>
+          </w:p>
+        </w:tc>
+        <w:tc>
+          <w:tcPr>
+            <w:tcW w:type="dxa" w:w="3260"/>
+            <w:tcMar>
+              <w:top w:w="80" w:type="dxa"/>
+              <w:start w:w="120" w:type="dxa"/>
+              <w:bottom w:w="80" w:type="dxa"/>
+              <w:end w:w="120" w:type="dxa"/>
+            </w:tcMar>
+            <w:vAlign w:val="center"/>
+            <w:shd w:fill="FFFFFF"/>
+          </w:tcPr>
+          <w:p>
+            <w:pPr>
+              <w:spacing w:before="0" w:after="40" w:line="252" w:lineRule="auto"/>
+              <w:jc w:val="left"/>
+            </w:pPr>
+            <w:r>
+              <w:rPr>
+                <w:rFonts w:ascii="Calibri" w:hAnsi="Calibri"/>
+                <w:b w:val="0"/>
+                <w:color w:val="111827"/>
+                <w:sz w:val="17"/>
+              </w:rPr>
+              <w:t>Service/API</w:t>
+            </w:r>
+          </w:p>
+        </w:tc>
+      </w:tr>
+      <w:tr>
+        <w:trPr>
+          <w:cantSplit/>
+        </w:trPr>
+        <w:tc>
+          <w:tcPr>
+            <w:tcW w:type="dxa" w:w="1650"/>
+            <w:tcMar>
+              <w:top w:w="80" w:type="dxa"/>
+              <w:start w:w="120" w:type="dxa"/>
+              <w:bottom w:w="80" w:type="dxa"/>
+              <w:end w:w="120" w:type="dxa"/>
+            </w:tcMar>
+            <w:vAlign w:val="center"/>
+            <w:shd w:fill="FFFFFF"/>
+          </w:tcPr>
+          <w:p>
+            <w:pPr>
+              <w:spacing w:before="0" w:after="40" w:line="252" w:lineRule="auto"/>
+              <w:jc w:val="center"/>
+            </w:pPr>
+            <w:r>
+              <w:rPr>
+                <w:rFonts w:ascii="Calibri" w:hAnsi="Calibri"/>
+                <w:b w:val="0"/>
+                <w:color w:val="111827"/>
+                <w:sz w:val="17"/>
+              </w:rPr>
+              <w:t>Route compatibility</w:t>
+            </w:r>
+          </w:p>
+        </w:tc>
+        <w:tc>
+          <w:tcPr>
+            <w:tcW w:type="dxa" w:w="4450"/>
+            <w:tcMar>
+              <w:top w:w="80" w:type="dxa"/>
+              <w:start w:w="120" w:type="dxa"/>
+              <w:bottom w:w="80" w:type="dxa"/>
+              <w:end w:w="120" w:type="dxa"/>
+            </w:tcMar>
+            <w:vAlign w:val="center"/>
+            <w:shd w:fill="FFFFFF"/>
+          </w:tcPr>
+          <w:p>
+            <w:pPr>
+              <w:spacing w:before="0" w:after="40" w:line="252" w:lineRule="auto"/>
+              <w:jc w:val="left"/>
+            </w:pPr>
+            <w:r>
+              <w:rPr>
+                <w:rFonts w:ascii="Calibri" w:hAnsi="Calibri"/>
+                <w:b w:val="0"/>
+                <w:color w:val="111827"/>
+                <w:sz w:val="17"/>
+              </w:rPr>
+              <w:t>Require produced-to-consumed direction plus matching type and unit.</w:t>
+            </w:r>
+          </w:p>
+        </w:tc>
+        <w:tc>
+          <w:tcPr>
+            <w:tcW w:type="dxa" w:w="3260"/>
+            <w:tcMar>
+              <w:top w:w="80" w:type="dxa"/>
+              <w:start w:w="120" w:type="dxa"/>
+              <w:bottom w:w="80" w:type="dxa"/>
+              <w:end w:w="120" w:type="dxa"/>
+            </w:tcMar>
+            <w:vAlign w:val="center"/>
+            <w:shd w:fill="FFFFFF"/>
+          </w:tcPr>
+          <w:p>
+            <w:pPr>
+              <w:spacing w:before="0" w:after="40" w:line="252" w:lineRule="auto"/>
+              <w:jc w:val="left"/>
+            </w:pPr>
+            <w:r>
+              <w:rPr>
+                <w:rFonts w:ascii="Calibri" w:hAnsi="Calibri"/>
+                <w:b w:val="0"/>
+                <w:color w:val="111827"/>
+                <w:sz w:val="17"/>
+              </w:rPr>
+              <w:t>Service</w:t>
+            </w:r>
+          </w:p>
+        </w:tc>
+      </w:tr>
+      <w:tr>
+        <w:trPr>
+          <w:cantSplit/>
+        </w:trPr>
+        <w:tc>
+          <w:tcPr>
+            <w:tcW w:type="dxa" w:w="1650"/>
+            <w:tcMar>
+              <w:top w:w="80" w:type="dxa"/>
+              <w:start w:w="120" w:type="dxa"/>
+              <w:bottom w:w="80" w:type="dxa"/>
+              <w:end w:w="120" w:type="dxa"/>
+            </w:tcMar>
+            <w:vAlign w:val="center"/>
+            <w:shd w:fill="FFFFFF"/>
+          </w:tcPr>
+          <w:p>
+            <w:pPr>
+              <w:spacing w:before="0" w:after="40" w:line="252" w:lineRule="auto"/>
+              <w:jc w:val="center"/>
+            </w:pPr>
+            <w:r>
+              <w:rPr>
+                <w:rFonts w:ascii="Calibri" w:hAnsi="Calibri"/>
+                <w:b w:val="0"/>
+                <w:color w:val="111827"/>
+                <w:sz w:val="17"/>
+              </w:rPr>
+              <w:t>Transfer concurrency</w:t>
+            </w:r>
+          </w:p>
+        </w:tc>
+        <w:tc>
+          <w:tcPr>
+            <w:tcW w:type="dxa" w:w="4450"/>
+            <w:tcMar>
+              <w:top w:w="80" w:type="dxa"/>
+              <w:start w:w="120" w:type="dxa"/>
+              <w:bottom w:w="80" w:type="dxa"/>
+              <w:end w:w="120" w:type="dxa"/>
+            </w:tcMar>
+            <w:vAlign w:val="center"/>
+            <w:shd w:fill="FFFFFF"/>
+          </w:tcPr>
+          <w:p>
+            <w:pPr>
+              <w:spacing w:before="0" w:after="40" w:line="252" w:lineRule="auto"/>
+              <w:jc w:val="left"/>
+            </w:pPr>
+            <w:r>
+              <w:rPr>
+                <w:rFonts w:ascii="Calibri" w:hAnsi="Calibri"/>
+                <w:b w:val="0"/>
+                <w:color w:val="111827"/>
+                <w:sz w:val="17"/>
+              </w:rPr>
+              <w:t>Reject stale source or target versions.</w:t>
+            </w:r>
+          </w:p>
+        </w:tc>
+        <w:tc>
+          <w:tcPr>
+            <w:tcW w:type="dxa" w:w="3260"/>
+            <w:tcMar>
+              <w:top w:w="80" w:type="dxa"/>
+              <w:start w:w="120" w:type="dxa"/>
+              <w:bottom w:w="80" w:type="dxa"/>
+              <w:end w:w="120" w:type="dxa"/>
+            </w:tcMar>
+            <w:vAlign w:val="center"/>
+            <w:shd w:fill="FFFFFF"/>
+          </w:tcPr>
+          <w:p>
+            <w:pPr>
+              <w:spacing w:before="0" w:after="40" w:line="252" w:lineRule="auto"/>
+              <w:jc w:val="left"/>
+            </w:pPr>
+            <w:r>
+              <w:rPr>
+                <w:rFonts w:ascii="Calibri" w:hAnsi="Calibri"/>
+                <w:b w:val="0"/>
+                <w:color w:val="111827"/>
+                <w:sz w:val="17"/>
+              </w:rPr>
+              <w:t>Service/API</w:t>
+            </w:r>
+          </w:p>
+        </w:tc>
+      </w:tr>
+      <w:tr>
+        <w:trPr>
+          <w:cantSplit/>
+        </w:trPr>
+        <w:tc>
+          <w:tcPr>
+            <w:tcW w:type="dxa" w:w="1650"/>
+            <w:tcMar>
+              <w:top w:w="80" w:type="dxa"/>
+              <w:start w:w="120" w:type="dxa"/>
+              <w:bottom w:w="80" w:type="dxa"/>
+              <w:end w:w="120" w:type="dxa"/>
+            </w:tcMar>
+            <w:vAlign w:val="center"/>
+            <w:shd w:fill="FFFFFF"/>
+          </w:tcPr>
+          <w:p>
+            <w:pPr>
+              <w:spacing w:before="0" w:after="40" w:line="252" w:lineRule="auto"/>
+              <w:jc w:val="center"/>
+            </w:pPr>
+            <w:r>
+              <w:rPr>
+                <w:rFonts w:ascii="Calibri" w:hAnsi="Calibri"/>
+                <w:b w:val="0"/>
+                <w:color w:val="111827"/>
+                <w:sz w:val="17"/>
+              </w:rPr>
+              <w:t>Atomic transfer</w:t>
+            </w:r>
+          </w:p>
+        </w:tc>
+        <w:tc>
+          <w:tcPr>
+            <w:tcW w:type="dxa" w:w="4450"/>
+            <w:tcMar>
+              <w:top w:w="80" w:type="dxa"/>
+              <w:start w:w="120" w:type="dxa"/>
+              <w:bottom w:w="80" w:type="dxa"/>
+              <w:end w:w="120" w:type="dxa"/>
+            </w:tcMar>
+            <w:vAlign w:val="center"/>
+            <w:shd w:fill="FFFFFF"/>
+          </w:tcPr>
+          <w:p>
+            <w:pPr>
+              <w:spacing w:before="0" w:after="40" w:line="252" w:lineRule="auto"/>
+              <w:jc w:val="left"/>
+            </w:pPr>
+            <w:r>
+              <w:rPr>
+                <w:rFonts w:ascii="Calibri" w:hAnsi="Calibri"/>
+                <w:b w:val="0"/>
+                <w:color w:val="111827"/>
+                <w:sz w:val="17"/>
+              </w:rPr>
+              <w:t>Copy the value and commit target, audit, command, and event together.</w:t>
+            </w:r>
+          </w:p>
+        </w:tc>
+        <w:tc>
+          <w:tcPr>
+            <w:tcW w:type="dxa" w:w="3260"/>
+            <w:tcMar>
+              <w:top w:w="80" w:type="dxa"/>
+              <w:start w:w="120" w:type="dxa"/>
+              <w:bottom w:w="80" w:type="dxa"/>
+              <w:end w:w="120" w:type="dxa"/>
+            </w:tcMar>
+            <w:vAlign w:val="center"/>
+            <w:shd w:fill="FFFFFF"/>
+          </w:tcPr>
+          <w:p>
+            <w:pPr>
+              <w:spacing w:before="0" w:after="40" w:line="252" w:lineRule="auto"/>
+              <w:jc w:val="left"/>
+            </w:pPr>
+            <w:r>
+              <w:rPr>
+                <w:rFonts w:ascii="Calibri" w:hAnsi="Calibri"/>
+                <w:b w:val="0"/>
+                <w:color w:val="111827"/>
+                <w:sz w:val="17"/>
+              </w:rPr>
+              <w:t>Integration</w:t>
+            </w:r>
+          </w:p>
+        </w:tc>
+      </w:tr>
+      <w:tr>
+        <w:trPr>
+          <w:cantSplit/>
+        </w:trPr>
+        <w:tc>
+          <w:tcPr>
+            <w:tcW w:type="dxa" w:w="1650"/>
+            <w:tcMar>
+              <w:top w:w="80" w:type="dxa"/>
+              <w:start w:w="120" w:type="dxa"/>
+              <w:bottom w:w="80" w:type="dxa"/>
+              <w:end w:w="120" w:type="dxa"/>
+            </w:tcMar>
+            <w:vAlign w:val="center"/>
+            <w:shd w:fill="FFFFFF"/>
+          </w:tcPr>
+          <w:p>
+            <w:pPr>
+              <w:spacing w:before="0" w:after="40" w:line="252" w:lineRule="auto"/>
+              <w:jc w:val="center"/>
+            </w:pPr>
+            <w:r>
+              <w:rPr>
+                <w:rFonts w:ascii="Calibri" w:hAnsi="Calibri"/>
+                <w:b w:val="0"/>
+                <w:color w:val="111827"/>
+                <w:sz w:val="17"/>
+              </w:rPr>
+              <w:t>Signal RBAC/OpenAPI</w:t>
+            </w:r>
+          </w:p>
+        </w:tc>
+        <w:tc>
+          <w:tcPr>
+            <w:tcW w:type="dxa" w:w="4450"/>
+            <w:tcMar>
+              <w:top w:w="80" w:type="dxa"/>
+              <w:start w:w="120" w:type="dxa"/>
+              <w:bottom w:w="80" w:type="dxa"/>
+              <w:end w:w="120" w:type="dxa"/>
+            </w:tcMar>
+            <w:vAlign w:val="center"/>
+            <w:shd w:fill="FFFFFF"/>
+          </w:tcPr>
+          <w:p>
+            <w:pPr>
+              <w:spacing w:before="0" w:after="40" w:line="252" w:lineRule="auto"/>
+              <w:jc w:val="left"/>
+            </w:pPr>
+            <w:r>
+              <w:rPr>
+                <w:rFonts w:ascii="Calibri" w:hAnsi="Calibri"/>
+                <w:b w:val="0"/>
+                <w:color w:val="111827"/>
+                <w:sz w:val="17"/>
+              </w:rPr>
+              <w:t>Publish protected, typed, safely paginated endpoints.</w:t>
+            </w:r>
+          </w:p>
+        </w:tc>
+        <w:tc>
+          <w:tcPr>
+            <w:tcW w:type="dxa" w:w="3260"/>
+            <w:tcMar>
+              <w:top w:w="80" w:type="dxa"/>
+              <w:start w:w="120" w:type="dxa"/>
+              <w:bottom w:w="80" w:type="dxa"/>
+              <w:end w:w="120" w:type="dxa"/>
+            </w:tcMar>
+            <w:vAlign w:val="center"/>
+            <w:shd w:fill="FFFFFF"/>
+          </w:tcPr>
+          <w:p>
+            <w:pPr>
+              <w:spacing w:before="0" w:after="40" w:line="252" w:lineRule="auto"/>
+              <w:jc w:val="left"/>
+            </w:pPr>
+            <w:r>
+              <w:rPr>
+                <w:rFonts w:ascii="Calibri" w:hAnsi="Calibri"/>
+                <w:b w:val="0"/>
+                <w:color w:val="111827"/>
+                <w:sz w:val="17"/>
+              </w:rPr>
+              <w:t>Contract/integration</w:t>
+            </w:r>
+          </w:p>
+        </w:tc>
+      </w:tr>
+      <w:tr>
+        <w:trPr>
+          <w:cantSplit/>
+        </w:trPr>
+        <w:tc>
+          <w:tcPr>
+            <w:tcW w:type="dxa" w:w="1650"/>
+            <w:tcMar>
+              <w:top w:w="80" w:type="dxa"/>
+              <w:start w:w="120" w:type="dxa"/>
+              <w:bottom w:w="80" w:type="dxa"/>
+              <w:end w:w="120" w:type="dxa"/>
+            </w:tcMar>
+            <w:vAlign w:val="center"/>
+            <w:shd w:fill="FFFFFF"/>
+          </w:tcPr>
+          <w:p>
+            <w:pPr>
+              <w:spacing w:before="0" w:after="40" w:line="252" w:lineRule="auto"/>
+              <w:jc w:val="center"/>
+            </w:pPr>
+            <w:r>
+              <w:rPr>
+                <w:rFonts w:ascii="Calibri" w:hAnsi="Calibri"/>
+                <w:b w:val="0"/>
+                <w:color w:val="111827"/>
+                <w:sz w:val="17"/>
+              </w:rPr>
+              <w:t>Transport boundary</w:t>
+            </w:r>
+          </w:p>
+        </w:tc>
+        <w:tc>
+          <w:tcPr>
+            <w:tcW w:type="dxa" w:w="4450"/>
+            <w:tcMar>
+              <w:top w:w="80" w:type="dxa"/>
+              <w:start w:w="120" w:type="dxa"/>
+              <w:bottom w:w="80" w:type="dxa"/>
+              <w:end w:w="120" w:type="dxa"/>
+            </w:tcMar>
+            <w:vAlign w:val="center"/>
+            <w:shd w:fill="FFFFFF"/>
+          </w:tcPr>
+          <w:p>
+            <w:pPr>
+              <w:spacing w:before="0" w:after="40" w:line="252" w:lineRule="auto"/>
+              <w:jc w:val="left"/>
+            </w:pPr>
+            <w:r>
+              <w:rPr>
+                <w:rFonts w:ascii="Calibri" w:hAnsi="Calibri"/>
+                <w:b w:val="0"/>
+                <w:color w:val="111827"/>
+                <w:sz w:val="17"/>
+              </w:rPr>
+              <w:t>Verify no CAN ID, frame, DBC, arbitration, or bitrate type is imported.</w:t>
+            </w:r>
+          </w:p>
+        </w:tc>
+        <w:tc>
+          <w:tcPr>
+            <w:tcW w:type="dxa" w:w="3260"/>
+            <w:tcMar>
+              <w:top w:w="80" w:type="dxa"/>
+              <w:start w:w="120" w:type="dxa"/>
+              <w:bottom w:w="80" w:type="dxa"/>
+              <w:end w:w="120" w:type="dxa"/>
+            </w:tcMar>
+            <w:vAlign w:val="center"/>
+            <w:shd w:fill="FFFFFF"/>
+          </w:tcPr>
+          <w:p>
+            <w:pPr>
+              <w:spacing w:before="0" w:after="40" w:line="252" w:lineRule="auto"/>
+              <w:jc w:val="left"/>
+            </w:pPr>
+            <w:r>
+              <w:rPr>
+                <w:rFonts w:ascii="Calibri" w:hAnsi="Calibri"/>
+                <w:b w:val="0"/>
+                <w:color w:val="111827"/>
+                <w:sz w:val="17"/>
+              </w:rPr>
+              <w:t>Review</w:t>
+            </w:r>
+          </w:p>
+        </w:tc>
+      </w:tr>
+    </w:tbl>
+    <w:p>
+      <w:pPr>
+        <w:spacing w:after="60"/>
+      </w:pPr>
+    </w:p>
+    <w:p>
+      <w:pPr>
+        <w:pStyle w:val="Heading1"/>
+        <w:keepNext/>
+        <w:keepLines/>
+      </w:pPr>
+      <w:r>
         <w:t>12. Implemented Evidence</w:t>
       </w:r>
     </w:p>
@@ -10416,6 +12185,22 @@
           <w:color w:val="111827"/>
           <w:sz w:val="22"/>
         </w:rPr>
+        <w:t xml:space="preserve">, </w:t>
+      </w:r>
+      <w:r>
+        <w:rPr>
+          <w:rFonts w:ascii="Consolas" w:hAnsi="Consolas"/>
+          <w:color w:val="1F4D78"/>
+          <w:sz w:val="19"/>
+        </w:rPr>
+        <w:t>0021_ecu_memory_regions</w:t>
+      </w:r>
+      <w:r>
+        <w:rPr>
+          <w:rFonts w:ascii="Calibri" w:hAnsi="Calibri"/>
+          <w:color w:val="111827"/>
+          <w:sz w:val="22"/>
+        </w:rPr>
         <w:t xml:space="preserve">, and </w:t>
       </w:r>
       <w:r>
@@ -10424,7 +12209,7 @@
           <w:color w:val="1F4D78"/>
           <w:sz w:val="19"/>
         </w:rPr>
-        <w:t>0021_ecu_memory_regions</w:t>
+        <w:t>0022_ecu_signal_contracts</w:t>
       </w:r>
       <w:r>
         <w:rPr>
@@ -10629,7 +12414,7 @@
           <w:color w:val="111827"/>
           <w:sz w:val="22"/>
         </w:rPr>
-        <w:t xml:space="preserve"> for observation and explicit-clear evidence.</w:t>
+        <w:t xml:space="preserve"> for observation and explicit-clear evidence; signal events cover publication, route creation, and routed transfer without physical values in audit evidence.</w:t>
       </w:r>
     </w:p>
     <w:p>
@@ -10756,6 +12541,40 @@
     </w:p>
     <w:p>
       <w:pPr>
+        <w:pStyle w:val="ListBullet"/>
+        <w:numPr>
+          <w:ilvl w:val="0"/>
+          <w:numId w:val="16"/>
+        </w:numPr>
+      </w:pPr>
+      <w:r>
+        <w:rPr>
+          <w:rFonts w:ascii="Calibri" w:hAnsi="Calibri"/>
+          <w:color w:val="111827"/>
+          <w:sz w:val="22"/>
+        </w:rPr>
+        <w:t>Cross-route lock ordering must be hardened before high-concurrency multi-gateway execution.</w:t>
+      </w:r>
+    </w:p>
+    <w:p>
+      <w:pPr>
+        <w:pStyle w:val="ListBullet"/>
+        <w:numPr>
+          <w:ilvl w:val="0"/>
+          <w:numId w:val="16"/>
+        </w:numPr>
+      </w:pPr>
+      <w:r>
+        <w:rPr>
+          <w:rFonts w:ascii="Calibri" w:hAnsi="Calibri"/>
+          <w:color w:val="111827"/>
+          <w:sz w:val="22"/>
+        </w:rPr>
+        <w:t>Unit conversion is intentionally absent; routes currently require exact unit equality.</w:t>
+      </w:r>
+    </w:p>
+    <w:p>
+      <w:pPr>
         <w:pStyle w:val="Heading1"/>
         <w:keepNext/>
         <w:keepLines/>
@@ -10771,7 +12590,7 @@
           <w:color w:val="111827"/>
           <w:sz w:val="22"/>
         </w:rPr>
-        <w:t xml:space="preserve">The next increment adds CAN production/consumption contracts and gateway routing hooks without embedding a bus implementation. Later increments add multi-ECU scenarios. See </w:t>
+        <w:t xml:space="preserve">The next increment adds multi-ECU scenarios, logical-time diagnostics, bounded resource metrics, and repeatable failure campaigns. CAN bus implementation remains in Volume IV. See </w:t>
       </w:r>
       <w:r>
         <w:rPr>
@@ -11072,11 +12891,79 @@
         <w:t>Map a DTC candidate to future UDS responsibilities without assigning a DTC number in the ECU.</w:t>
       </w:r>
     </w:p>
+    <w:p>
+      <w:pPr>
+        <w:pStyle w:val="ListNumber"/>
+        <w:numPr>
+          <w:ilvl w:val="0"/>
+          <w:numId w:val="17"/>
+        </w:numPr>
+      </w:pPr>
+      <w:r>
+        <w:rPr>
+          <w:rFonts w:ascii="Calibri" w:hAnsi="Calibri"/>
+          <w:color w:val="111827"/>
+          <w:sz w:val="22"/>
+        </w:rPr>
+        <w:t>Model battery temperature as a produced BMS signal and consumed thermal-controller signal.</w:t>
+      </w:r>
+    </w:p>
+    <w:p>
+      <w:pPr>
+        <w:pStyle w:val="ListNumber"/>
+        <w:numPr>
+          <w:ilvl w:val="0"/>
+          <w:numId w:val="17"/>
+        </w:numPr>
+      </w:pPr>
+      <w:r>
+        <w:rPr>
+          <w:rFonts w:ascii="Calibri" w:hAnsi="Calibri"/>
+          <w:color w:val="111827"/>
+          <w:sz w:val="22"/>
+        </w:rPr>
+        <w:t>Explain why a gateway route rejects Celsius-to-Kelvin transfer instead of converting silently.</w:t>
+      </w:r>
+    </w:p>
+    <w:p>
+      <w:pPr>
+        <w:pStyle w:val="ListNumber"/>
+        <w:numPr>
+          <w:ilvl w:val="0"/>
+          <w:numId w:val="17"/>
+        </w:numPr>
+      </w:pPr>
+      <w:r>
+        <w:rPr>
+          <w:rFonts w:ascii="Calibri" w:hAnsi="Calibri"/>
+          <w:color w:val="111827"/>
+          <w:sz w:val="22"/>
+        </w:rPr>
+        <w:t>Trace publication and transfer versions through an exact retry and one stale-source conflict.</w:t>
+      </w:r>
+    </w:p>
+    <w:p>
+      <w:pPr>
+        <w:pStyle w:val="ListNumber"/>
+        <w:numPr>
+          <w:ilvl w:val="0"/>
+          <w:numId w:val="17"/>
+        </w:numPr>
+      </w:pPr>
+      <w:r>
+        <w:rPr>
+          <w:rFonts w:ascii="Calibri" w:hAnsi="Calibri"/>
+          <w:color w:val="111827"/>
+          <w:sz w:val="22"/>
+        </w:rPr>
+        <w:t>Design the future Volume IV adapter that maps a semantic signal to a DBC without changing ECU state.</w:t>
+      </w:r>
+    </w:p>
     <w:sectPr>
       <w:headerReference w:type="default" r:id="rId9"/>
       <w:footerReference w:type="default" r:id="rId10"/>
       <w:pgSz w:w="12240" w:h="15840"/>
-      <w:pgMar w:top="1440" w:right="1440" w:bottom="1440" w:left="1440" w:header="708" w:footer="708" w:gutter="0"/>
+      <w:pgMar w:top="1440" w:right="1440" w:bottom="1728" w:left="1440" w:header="708" w:footer="360" w:gutter="0"/>
       <w:cols w:space="720"/>
       <w:titlePg/>
       <w:docGrid w:linePitch="360"/>
@@ -11101,7 +12988,7 @@
         <w:color w:val="667085"/>
         <w:sz w:val="17"/>
       </w:rPr>
-      <w:t>ATEP Volume III Workbook  |  Version 0.5.0</w:t>
+      <w:t>ATEP Volume III Workbook  |  Version 0.6.0</w:t>
     </w:r>
     <w:r>
       <w:rPr>

</xml_diff>

<commit_message>
feat(ecus): add semantic signal routing (#55)
</commit_message>
<xml_diff>
--- a/docs/ATEP_Volume_III_ECU_Simulator_Engineering_Workbook.docx
+++ b/docs/ATEP_Volume_III_ECU_Simulator_Engineering_Workbook.docx
@@ -143,7 +143,7 @@
                 <w:color w:val="0B2545"/>
                 <w:sz w:val="19"/>
               </w:rPr>
-              <w:t>0.5.0</w:t>
+              <w:t>0.6.0</w:t>
             </w:r>
           </w:p>
         </w:tc>
@@ -265,7 +265,7 @@
                 <w:color w:val="111827"/>
                 <w:sz w:val="19"/>
               </w:rPr>
-              <w:t>Living document - Increments III-1 through III-5 implemented</w:t>
+              <w:t>Living document - Increments III-1 through III-6 implemented</w:t>
             </w:r>
           </w:p>
         </w:tc>
@@ -675,6 +675,25 @@
           <w:color w:val="0B2545"/>
           <w:sz w:val="21"/>
         </w:rPr>
+        <w:t>11.5 III-6 Verification</w:t>
+      </w:r>
+    </w:p>
+    <w:p>
+      <w:pPr>
+        <w:pStyle w:val="ListNumber"/>
+        <w:numPr>
+          <w:ilvl w:val="0"/>
+          <w:numId w:val="10"/>
+        </w:numPr>
+        <w:ind w:left="216" w:firstLine="0"/>
+      </w:pPr>
+      <w:r>
+        <w:rPr>
+          <w:rFonts w:ascii="Calibri" w:hAnsi="Calibri"/>
+          <w:b/>
+          <w:color w:val="0B2545"/>
+          <w:sz w:val="21"/>
+        </w:rPr>
         <w:t>12. Implemented Evidence</w:t>
       </w:r>
     </w:p>
@@ -969,7 +988,7 @@
                 <w:color w:val="111827"/>
                 <w:sz w:val="17"/>
               </w:rPr>
-              <w:t>Increments III-1 through III-5</w:t>
+              <w:t>Increments III-1 through III-6</w:t>
             </w:r>
           </w:p>
         </w:tc>
@@ -1729,6 +1748,95 @@
           </w:p>
         </w:tc>
       </w:tr>
+      <w:tr>
+        <w:trPr>
+          <w:cantSplit/>
+        </w:trPr>
+        <w:tc>
+          <w:tcPr>
+            <w:tcW w:type="dxa" w:w="1650"/>
+            <w:tcMar>
+              <w:top w:w="80" w:type="dxa"/>
+              <w:start w:w="120" w:type="dxa"/>
+              <w:bottom w:w="80" w:type="dxa"/>
+              <w:end w:w="120" w:type="dxa"/>
+            </w:tcMar>
+            <w:vAlign w:val="center"/>
+            <w:shd w:fill="FFFFFF"/>
+          </w:tcPr>
+          <w:p>
+            <w:pPr>
+              <w:spacing w:before="0" w:after="40" w:line="252" w:lineRule="auto"/>
+              <w:jc w:val="center"/>
+            </w:pPr>
+            <w:r>
+              <w:rPr>
+                <w:rFonts w:ascii="Calibri" w:hAnsi="Calibri"/>
+                <w:b w:val="0"/>
+                <w:color w:val="111827"/>
+                <w:sz w:val="17"/>
+              </w:rPr>
+              <w:t>0.6.0</w:t>
+            </w:r>
+          </w:p>
+        </w:tc>
+        <w:tc>
+          <w:tcPr>
+            <w:tcW w:type="dxa" w:w="4450"/>
+            <w:tcMar>
+              <w:top w:w="80" w:type="dxa"/>
+              <w:start w:w="120" w:type="dxa"/>
+              <w:bottom w:w="80" w:type="dxa"/>
+              <w:end w:w="120" w:type="dxa"/>
+            </w:tcMar>
+            <w:vAlign w:val="center"/>
+            <w:shd w:fill="FFFFFF"/>
+          </w:tcPr>
+          <w:p>
+            <w:pPr>
+              <w:spacing w:before="0" w:after="40" w:line="252" w:lineRule="auto"/>
+              <w:jc w:val="left"/>
+            </w:pPr>
+            <w:r>
+              <w:rPr>
+                <w:rFonts w:ascii="Calibri" w:hAnsi="Calibri"/>
+                <w:b w:val="0"/>
+                <w:color w:val="111827"/>
+                <w:sz w:val="17"/>
+              </w:rPr>
+              <w:t>2026-08-24</w:t>
+            </w:r>
+          </w:p>
+        </w:tc>
+        <w:tc>
+          <w:tcPr>
+            <w:tcW w:type="dxa" w:w="3260"/>
+            <w:tcMar>
+              <w:top w:w="80" w:type="dxa"/>
+              <w:start w:w="120" w:type="dxa"/>
+              <w:bottom w:w="80" w:type="dxa"/>
+              <w:end w:w="120" w:type="dxa"/>
+            </w:tcMar>
+            <w:vAlign w:val="center"/>
+            <w:shd w:fill="FFFFFF"/>
+          </w:tcPr>
+          <w:p>
+            <w:pPr>
+              <w:spacing w:before="0" w:after="40" w:line="252" w:lineRule="auto"/>
+              <w:jc w:val="left"/>
+            </w:pPr>
+            <w:r>
+              <w:rPr>
+                <w:rFonts w:ascii="Calibri" w:hAnsi="Calibri"/>
+                <w:b w:val="0"/>
+                <w:color w:val="111827"/>
+                <w:sz w:val="17"/>
+              </w:rPr>
+              <w:t>Added typed signal contracts, publication, gateway routes, atomic transfer, migration, APIs, and tests.</w:t>
+            </w:r>
+          </w:p>
+        </w:tc>
+      </w:tr>
     </w:tbl>
     <w:p>
       <w:pPr>
@@ -1821,6 +1929,23 @@
           <w:sz w:val="22"/>
         </w:rPr>
         <w:t>Bounded fault records with logical-time confirmation, healing, latching, clear, and DTC intent.</w:t>
+      </w:r>
+    </w:p>
+    <w:p>
+      <w:pPr>
+        <w:pStyle w:val="ListBullet"/>
+        <w:numPr>
+          <w:ilvl w:val="0"/>
+          <w:numId w:val="11"/>
+        </w:numPr>
+      </w:pPr>
+      <w:r>
+        <w:rPr>
+          <w:rFonts w:ascii="Calibri" w:hAnsi="Calibri"/>
+          <w:color w:val="111827"/>
+          <w:sz w:val="22"/>
+        </w:rPr>
+        <w:t>Typed produced/consumed signals, logical-time publication, and gateway-owned routing hooks.</w:t>
       </w:r>
     </w:p>
     <w:p>
@@ -1983,7 +2108,7 @@
           <w:color w:val="111827"/>
           <w:sz w:val="22"/>
         </w:rPr>
-        <w:t>CAN, CAN FD, LIN, Ethernet, and gateway routing.</w:t>
+        <w:t>CAN, CAN FD, LIN, Ethernet frames, DBC encoding, arbitration, and bus simulation.</w:t>
       </w:r>
     </w:p>
     <w:p>
@@ -2212,7 +2337,7 @@
           <w:color w:val="111827"/>
           <w:sz w:val="22"/>
         </w:rPr>
-        <w:t xml:space="preserve">, memory regions, cyclic tasks, profile version, behavior state, logical time, boot count, </w:t>
+        <w:t xml:space="preserve">, semantic signals, memory regions, cyclic tasks, profile version, behavior state, logical time, boot count, </w:t>
       </w:r>
       <w:r>
         <w:rPr>
@@ -2229,6 +2354,16 @@
           <w:sz w:val="22"/>
         </w:rPr>
         <w:t>, and timestamps. Memory has at most 256 cells, each with a 16-bit address and an 8-bit value. Faults have a canonical code, severity, pending/confirmed/healed status, description, bounded debounce counters, logical timestamps, thresholds, active state, and latch policy.</w:t>
+      </w:r>
+    </w:p>
+    <w:p>
+      <w:r>
+        <w:rPr>
+          <w:rFonts w:ascii="Calibri" w:hAnsi="Calibri"/>
+          <w:color w:val="111827"/>
+          <w:sz w:val="22"/>
+        </w:rPr>
+        <w:t>Signals are bounded to 64 contracts. Each contract declares a canonical name, produced/consumed direction, strict data type, optional unit/bounds/cycle time, current value, and ECU logical update time. Names are unique per direction, allowing an ECU to consume and produce the same semantic name without ambiguity.</w:t>
       </w:r>
     </w:p>
     <w:p>
@@ -4057,6 +4192,375 @@
           </w:p>
         </w:tc>
       </w:tr>
+      <w:tr>
+        <w:trPr>
+          <w:cantSplit/>
+        </w:trPr>
+        <w:tc>
+          <w:tcPr>
+            <w:tcW w:type="dxa" w:w="1150"/>
+            <w:tcMar>
+              <w:top w:w="80" w:type="dxa"/>
+              <w:start w:w="120" w:type="dxa"/>
+              <w:bottom w:w="80" w:type="dxa"/>
+              <w:end w:w="120" w:type="dxa"/>
+            </w:tcMar>
+            <w:vAlign w:val="center"/>
+            <w:shd w:fill="FFFFFF"/>
+          </w:tcPr>
+          <w:p>
+            <w:pPr>
+              <w:spacing w:before="0" w:after="40" w:line="252" w:lineRule="auto"/>
+              <w:jc w:val="center"/>
+            </w:pPr>
+            <w:r>
+              <w:rPr>
+                <w:rFonts w:ascii="Calibri" w:hAnsi="Calibri"/>
+                <w:b w:val="0"/>
+                <w:color w:val="111827"/>
+                <w:sz w:val="16"/>
+              </w:rPr>
+              <w:t>POST</w:t>
+            </w:r>
+          </w:p>
+        </w:tc>
+        <w:tc>
+          <w:tcPr>
+            <w:tcW w:type="dxa" w:w="3700"/>
+            <w:tcMar>
+              <w:top w:w="80" w:type="dxa"/>
+              <w:start w:w="120" w:type="dxa"/>
+              <w:bottom w:w="80" w:type="dxa"/>
+              <w:end w:w="120" w:type="dxa"/>
+            </w:tcMar>
+            <w:vAlign w:val="center"/>
+            <w:shd w:fill="FFFFFF"/>
+          </w:tcPr>
+          <w:p>
+            <w:pPr>
+              <w:spacing w:before="0" w:after="40" w:line="252" w:lineRule="auto"/>
+              <w:jc w:val="left"/>
+            </w:pPr>
+            <w:r>
+              <w:rPr>
+                <w:rFonts w:ascii="Calibri" w:hAnsi="Calibri"/>
+                <w:b w:val="0"/>
+                <w:color w:val="111827"/>
+                <w:sz w:val="16"/>
+              </w:rPr>
+              <w:t>/api/v1/vehicles/{vehicle_id}/ecus/{ecu_id}/signals/{signal_name}/publish</w:t>
+            </w:r>
+          </w:p>
+        </w:tc>
+        <w:tc>
+          <w:tcPr>
+            <w:tcW w:type="dxa" w:w="3100"/>
+            <w:tcMar>
+              <w:top w:w="80" w:type="dxa"/>
+              <w:start w:w="120" w:type="dxa"/>
+              <w:bottom w:w="80" w:type="dxa"/>
+              <w:end w:w="120" w:type="dxa"/>
+            </w:tcMar>
+            <w:vAlign w:val="center"/>
+            <w:shd w:fill="FFFFFF"/>
+          </w:tcPr>
+          <w:p>
+            <w:pPr>
+              <w:spacing w:before="0" w:after="40" w:line="252" w:lineRule="auto"/>
+              <w:jc w:val="left"/>
+            </w:pPr>
+            <w:r>
+              <w:rPr>
+                <w:rFonts w:ascii="Calibri" w:hAnsi="Calibri"/>
+                <w:b w:val="0"/>
+                <w:color w:val="111827"/>
+                <w:sz w:val="16"/>
+              </w:rPr>
+              <w:t>ecus:manage</w:t>
+            </w:r>
+          </w:p>
+        </w:tc>
+        <w:tc>
+          <w:tcPr>
+            <w:tcW w:type="dxa" w:w="1410"/>
+            <w:tcMar>
+              <w:top w:w="80" w:type="dxa"/>
+              <w:start w:w="120" w:type="dxa"/>
+              <w:bottom w:w="80" w:type="dxa"/>
+              <w:end w:w="120" w:type="dxa"/>
+            </w:tcMar>
+            <w:vAlign w:val="center"/>
+            <w:shd w:fill="FFFFFF"/>
+          </w:tcPr>
+          <w:p>
+            <w:pPr>
+              <w:spacing w:before="0" w:after="40" w:line="252" w:lineRule="auto"/>
+              <w:jc w:val="left"/>
+            </w:pPr>
+            <w:r>
+              <w:rPr>
+                <w:rFonts w:ascii="Calibri" w:hAnsi="Calibri"/>
+                <w:b w:val="0"/>
+                <w:color w:val="111827"/>
+                <w:sz w:val="16"/>
+              </w:rPr>
+              <w:t>Publish one produced signal value.</w:t>
+            </w:r>
+          </w:p>
+        </w:tc>
+      </w:tr>
+      <w:tr>
+        <w:trPr>
+          <w:cantSplit/>
+        </w:trPr>
+        <w:tc>
+          <w:tcPr>
+            <w:tcW w:type="dxa" w:w="1150"/>
+            <w:tcMar>
+              <w:top w:w="80" w:type="dxa"/>
+              <w:start w:w="120" w:type="dxa"/>
+              <w:bottom w:w="80" w:type="dxa"/>
+              <w:end w:w="120" w:type="dxa"/>
+            </w:tcMar>
+            <w:vAlign w:val="center"/>
+            <w:shd w:fill="FFFFFF"/>
+          </w:tcPr>
+          <w:p>
+            <w:pPr>
+              <w:spacing w:before="0" w:after="40" w:line="252" w:lineRule="auto"/>
+              <w:jc w:val="center"/>
+            </w:pPr>
+            <w:r>
+              <w:rPr>
+                <w:rFonts w:ascii="Calibri" w:hAnsi="Calibri"/>
+                <w:b w:val="0"/>
+                <w:color w:val="111827"/>
+                <w:sz w:val="16"/>
+              </w:rPr>
+              <w:t>POST/GET</w:t>
+            </w:r>
+          </w:p>
+        </w:tc>
+        <w:tc>
+          <w:tcPr>
+            <w:tcW w:type="dxa" w:w="3700"/>
+            <w:tcMar>
+              <w:top w:w="80" w:type="dxa"/>
+              <w:start w:w="120" w:type="dxa"/>
+              <w:bottom w:w="80" w:type="dxa"/>
+              <w:end w:w="120" w:type="dxa"/>
+            </w:tcMar>
+            <w:vAlign w:val="center"/>
+            <w:shd w:fill="FFFFFF"/>
+          </w:tcPr>
+          <w:p>
+            <w:pPr>
+              <w:spacing w:before="0" w:after="40" w:line="252" w:lineRule="auto"/>
+              <w:jc w:val="left"/>
+            </w:pPr>
+            <w:r>
+              <w:rPr>
+                <w:rFonts w:ascii="Calibri" w:hAnsi="Calibri"/>
+                <w:b w:val="0"/>
+                <w:color w:val="111827"/>
+                <w:sz w:val="16"/>
+              </w:rPr>
+              <w:t>/api/v1/vehicles/{vehicle_id}/ecus/{ecu_id}/signal-routes</w:t>
+            </w:r>
+          </w:p>
+        </w:tc>
+        <w:tc>
+          <w:tcPr>
+            <w:tcW w:type="dxa" w:w="3100"/>
+            <w:tcMar>
+              <w:top w:w="80" w:type="dxa"/>
+              <w:start w:w="120" w:type="dxa"/>
+              <w:bottom w:w="80" w:type="dxa"/>
+              <w:end w:w="120" w:type="dxa"/>
+            </w:tcMar>
+            <w:vAlign w:val="center"/>
+            <w:shd w:fill="FFFFFF"/>
+          </w:tcPr>
+          <w:p>
+            <w:pPr>
+              <w:spacing w:before="0" w:after="40" w:line="252" w:lineRule="auto"/>
+              <w:jc w:val="left"/>
+            </w:pPr>
+            <w:r>
+              <w:rPr>
+                <w:rFonts w:ascii="Calibri" w:hAnsi="Calibri"/>
+                <w:b w:val="0"/>
+                <w:color w:val="111827"/>
+                <w:sz w:val="16"/>
+              </w:rPr>
+              <w:t>ecus:manage</w:t>
+            </w:r>
+            <w:r>
+              <w:rPr>
+                <w:rFonts w:ascii="Calibri" w:hAnsi="Calibri"/>
+                <w:b w:val="0"/>
+                <w:color w:val="111827"/>
+                <w:sz w:val="16"/>
+              </w:rPr>
+              <w:t xml:space="preserve"> / </w:t>
+            </w:r>
+            <w:r>
+              <w:rPr>
+                <w:rFonts w:ascii="Calibri" w:hAnsi="Calibri"/>
+                <w:b w:val="0"/>
+                <w:color w:val="111827"/>
+                <w:sz w:val="16"/>
+              </w:rPr>
+              <w:t>ecus:read</w:t>
+            </w:r>
+          </w:p>
+        </w:tc>
+        <w:tc>
+          <w:tcPr>
+            <w:tcW w:type="dxa" w:w="1410"/>
+            <w:tcMar>
+              <w:top w:w="80" w:type="dxa"/>
+              <w:start w:w="120" w:type="dxa"/>
+              <w:bottom w:w="80" w:type="dxa"/>
+              <w:end w:w="120" w:type="dxa"/>
+            </w:tcMar>
+            <w:vAlign w:val="center"/>
+            <w:shd w:fill="FFFFFF"/>
+          </w:tcPr>
+          <w:p>
+            <w:pPr>
+              <w:spacing w:before="0" w:after="40" w:line="252" w:lineRule="auto"/>
+              <w:jc w:val="left"/>
+            </w:pPr>
+            <w:r>
+              <w:rPr>
+                <w:rFonts w:ascii="Calibri" w:hAnsi="Calibri"/>
+                <w:b w:val="0"/>
+                <w:color w:val="111827"/>
+                <w:sz w:val="16"/>
+              </w:rPr>
+              <w:t>Create or list gateway routes.</w:t>
+            </w:r>
+          </w:p>
+        </w:tc>
+      </w:tr>
+      <w:tr>
+        <w:trPr>
+          <w:cantSplit/>
+        </w:trPr>
+        <w:tc>
+          <w:tcPr>
+            <w:tcW w:type="dxa" w:w="1150"/>
+            <w:tcMar>
+              <w:top w:w="80" w:type="dxa"/>
+              <w:start w:w="120" w:type="dxa"/>
+              <w:bottom w:w="80" w:type="dxa"/>
+              <w:end w:w="120" w:type="dxa"/>
+            </w:tcMar>
+            <w:vAlign w:val="center"/>
+            <w:shd w:fill="FFFFFF"/>
+          </w:tcPr>
+          <w:p>
+            <w:pPr>
+              <w:spacing w:before="0" w:after="40" w:line="252" w:lineRule="auto"/>
+              <w:jc w:val="center"/>
+            </w:pPr>
+            <w:r>
+              <w:rPr>
+                <w:rFonts w:ascii="Calibri" w:hAnsi="Calibri"/>
+                <w:b w:val="0"/>
+                <w:color w:val="111827"/>
+                <w:sz w:val="16"/>
+              </w:rPr>
+              <w:t>POST</w:t>
+            </w:r>
+          </w:p>
+        </w:tc>
+        <w:tc>
+          <w:tcPr>
+            <w:tcW w:type="dxa" w:w="3700"/>
+            <w:tcMar>
+              <w:top w:w="80" w:type="dxa"/>
+              <w:start w:w="120" w:type="dxa"/>
+              <w:bottom w:w="80" w:type="dxa"/>
+              <w:end w:w="120" w:type="dxa"/>
+            </w:tcMar>
+            <w:vAlign w:val="center"/>
+            <w:shd w:fill="FFFFFF"/>
+          </w:tcPr>
+          <w:p>
+            <w:pPr>
+              <w:spacing w:before="0" w:after="40" w:line="252" w:lineRule="auto"/>
+              <w:jc w:val="left"/>
+            </w:pPr>
+            <w:r>
+              <w:rPr>
+                <w:rFonts w:ascii="Calibri" w:hAnsi="Calibri"/>
+                <w:b w:val="0"/>
+                <w:color w:val="111827"/>
+                <w:sz w:val="16"/>
+              </w:rPr>
+              <w:t>/api/v1/vehicles/{vehicle_id}/ecus/{ecu_id}/signal-routes/{route_id}/transfer</w:t>
+            </w:r>
+          </w:p>
+        </w:tc>
+        <w:tc>
+          <w:tcPr>
+            <w:tcW w:type="dxa" w:w="3100"/>
+            <w:tcMar>
+              <w:top w:w="80" w:type="dxa"/>
+              <w:start w:w="120" w:type="dxa"/>
+              <w:bottom w:w="80" w:type="dxa"/>
+              <w:end w:w="120" w:type="dxa"/>
+            </w:tcMar>
+            <w:vAlign w:val="center"/>
+            <w:shd w:fill="FFFFFF"/>
+          </w:tcPr>
+          <w:p>
+            <w:pPr>
+              <w:spacing w:before="0" w:after="40" w:line="252" w:lineRule="auto"/>
+              <w:jc w:val="left"/>
+            </w:pPr>
+            <w:r>
+              <w:rPr>
+                <w:rFonts w:ascii="Calibri" w:hAnsi="Calibri"/>
+                <w:b w:val="0"/>
+                <w:color w:val="111827"/>
+                <w:sz w:val="16"/>
+              </w:rPr>
+              <w:t>ecus:manage</w:t>
+            </w:r>
+          </w:p>
+        </w:tc>
+        <w:tc>
+          <w:tcPr>
+            <w:tcW w:type="dxa" w:w="1410"/>
+            <w:tcMar>
+              <w:top w:w="80" w:type="dxa"/>
+              <w:start w:w="120" w:type="dxa"/>
+              <w:bottom w:w="80" w:type="dxa"/>
+              <w:end w:w="120" w:type="dxa"/>
+            </w:tcMar>
+            <w:vAlign w:val="center"/>
+            <w:shd w:fill="FFFFFF"/>
+          </w:tcPr>
+          <w:p>
+            <w:pPr>
+              <w:spacing w:before="0" w:after="40" w:line="252" w:lineRule="auto"/>
+              <w:jc w:val="left"/>
+            </w:pPr>
+            <w:r>
+              <w:rPr>
+                <w:rFonts w:ascii="Calibri" w:hAnsi="Calibri"/>
+                <w:b w:val="0"/>
+                <w:color w:val="111827"/>
+                <w:sz w:val="16"/>
+              </w:rPr>
+              <w:t>Transfer a routed value atomically.</w:t>
+            </w:r>
+          </w:p>
+        </w:tc>
+      </w:tr>
     </w:tbl>
     <w:p>
       <w:pPr>
@@ -4275,6 +4779,36 @@
     </w:p>
     <w:p>
       <w:pPr>
+        <w:pStyle w:val="Heading2"/>
+        <w:keepNext/>
+        <w:keepLines/>
+      </w:pPr>
+      <w:r>
+        <w:t>8.5 Signal Publication and Gateway Routes</w:t>
+      </w:r>
+    </w:p>
+    <w:p>
+      <w:r>
+        <w:rPr>
+          <w:rFonts w:ascii="Calibri" w:hAnsi="Calibri"/>
+          <w:color w:val="111827"/>
+          <w:sz w:val="22"/>
+        </w:rPr>
+        <w:t>Signal publication changes a produced contract under a row lock and expected ECU version. The published timestamp is the ECU logical clock, not host time. Persisted command identity makes exact retries safe. Evidence includes contract identity, type, direction, and logical time but excludes the physical value.</w:t>
+      </w:r>
+    </w:p>
+    <w:p>
+      <w:r>
+        <w:rPr>
+          <w:rFonts w:ascii="Calibri" w:hAnsi="Calibri"/>
+          <w:color w:val="111827"/>
+          <w:sz w:val="22"/>
+        </w:rPr>
+        <w:t>Only a gateway ECU can own a route. Its source and target are distinct ECUs in the same vehicle; the source contract must be produced, the target consumed, and type/unit must match. Transfer locks both ECUs, compares source and target versions, copies the source value to the target at target logical time, and increments only the target version. This is an adapter hook: no CAN ID, frame, DBC, arbitration, bitrate, or bus timing exists in the ECU domain.</w:t>
+      </w:r>
+    </w:p>
+    <w:p>
+      <w:pPr>
         <w:pStyle w:val="Heading1"/>
         <w:keepNext/>
         <w:keepLines/>
@@ -4306,7 +4840,7 @@
           <w:color w:val="111827"/>
           <w:sz w:val="22"/>
         </w:rPr>
-        <w:t>. III-1 covers the aggregate, III-2 covers deterministic execution and reset, III-3 covers versioned profiles, III-4 covers memory regions, snapshots, persistence, and corruption, and III-5 covers fault lifecycle and DTC intent.</w:t>
+        <w:t>. III-1 covers the aggregate, III-2 covers deterministic execution and reset, III-3 covers versioned profiles, III-4 covers memory regions, snapshots, persistence, and corruption, III-5 covers fault lifecycle and DTC intent, and III-6 covers semantic signal contracts and gateway routing hooks.</w:t>
       </w:r>
     </w:p>
     <w:p>
@@ -4553,6 +5087,46 @@
           <w:sz w:val="22"/>
         </w:rPr>
         <w:t>The ECU owns fault truth, while Diagnostics will own UDS identifiers, status bytes, and services. Publishing diagnostic intent prevents both domains from creating competing fault representations.</w:t>
+      </w:r>
+    </w:p>
+    <w:p>
+      <w:pPr>
+        <w:pStyle w:val="Heading2"/>
+        <w:keepNext/>
+        <w:keepLines/>
+      </w:pPr>
+      <w:r>
+        <w:t>ADR-ECU-012 — Separate Semantic Signals from CAN Transport</w:t>
+      </w:r>
+    </w:p>
+    <w:p>
+      <w:r>
+        <w:rPr>
+          <w:rFonts w:ascii="Calibri" w:hAnsi="Calibri"/>
+          <w:color w:val="111827"/>
+          <w:sz w:val="22"/>
+        </w:rPr>
+        <w:t>ECUs own physical meaning, direction, value constraints, and logical timestamps. Volume IV owns CAN identifiers, encoding, frames, arbitration, bus timing, and network faults. This allows alternate Ethernet or simulation adapters to reuse the same ECU contract.</w:t>
+      </w:r>
+    </w:p>
+    <w:p>
+      <w:pPr>
+        <w:pStyle w:val="Heading2"/>
+        <w:keepNext/>
+        <w:keepLines/>
+      </w:pPr>
+      <w:r>
+        <w:t>ADR-ECU-013 — Make Gateway Routing Explicit and Version-Guarded</w:t>
+      </w:r>
+    </w:p>
+    <w:p>
+      <w:r>
+        <w:rPr>
+          <w:rFonts w:ascii="Calibri" w:hAnsi="Calibri"/>
+          <w:color w:val="111827"/>
+          <w:sz w:val="22"/>
+        </w:rPr>
+        <w:t>Persistent routes provide reviewable source/target ownership. Matching type/unit rules prevent implicit conversion, while source and target versions expose stale transfers rather than silently copying a different value.</w:t>
       </w:r>
     </w:p>
     <w:p>
@@ -10324,6 +10898,1201 @@
         <w:keepLines/>
       </w:pPr>
       <w:r>
+        <w:t>11.5 III-6 Verification</w:t>
+      </w:r>
+    </w:p>
+    <w:tbl>
+      <w:tblPr>
+        <w:tblW w:type="dxa" w:w="9360"/>
+        <w:jc w:val="left"/>
+        <w:tblLayout w:type="fixed"/>
+        <w:tblLook w:firstColumn="1" w:firstRow="1" w:lastColumn="0" w:lastRow="0" w:noHBand="0" w:noVBand="1" w:val="04A0"/>
+        <w:tblInd w:w="120" w:type="dxa"/>
+        <w:tblBorders>
+          <w:top w:val="single" w:sz="6" w:color="B8C4D1"/>
+          <w:left w:val="single" w:sz="6" w:color="B8C4D1"/>
+          <w:bottom w:val="single" w:sz="6" w:color="B8C4D1"/>
+          <w:right w:val="single" w:sz="6" w:color="B8C4D1"/>
+          <w:insideH w:val="single" w:sz="6" w:color="B8C4D1"/>
+          <w:insideV w:val="single" w:sz="6" w:color="B8C4D1"/>
+        </w:tblBorders>
+      </w:tblPr>
+      <w:tblGrid>
+        <w:gridCol w:w="1650"/>
+        <w:gridCol w:w="4450"/>
+        <w:gridCol w:w="3260"/>
+      </w:tblGrid>
+      <w:tr>
+        <w:trPr>
+          <w:tblHeader w:val="true"/>
+          <w:cantSplit/>
+        </w:trPr>
+        <w:tc>
+          <w:tcPr>
+            <w:tcW w:type="dxa" w:w="1650"/>
+            <w:tcMar>
+              <w:top w:w="80" w:type="dxa"/>
+              <w:start w:w="120" w:type="dxa"/>
+              <w:bottom w:w="80" w:type="dxa"/>
+              <w:end w:w="120" w:type="dxa"/>
+            </w:tcMar>
+            <w:vAlign w:val="center"/>
+            <w:shd w:fill="E8EEF5"/>
+          </w:tcPr>
+          <w:p>
+            <w:pPr>
+              <w:spacing w:before="0" w:after="40" w:line="252" w:lineRule="auto"/>
+              <w:jc w:val="center"/>
+            </w:pPr>
+            <w:r>
+              <w:rPr>
+                <w:rFonts w:ascii="Calibri" w:hAnsi="Calibri"/>
+                <w:b/>
+                <w:color w:val="0B2545"/>
+                <w:sz w:val="17"/>
+              </w:rPr>
+              <w:t>Test</w:t>
+            </w:r>
+          </w:p>
+        </w:tc>
+        <w:tc>
+          <w:tcPr>
+            <w:tcW w:type="dxa" w:w="4450"/>
+            <w:tcMar>
+              <w:top w:w="80" w:type="dxa"/>
+              <w:start w:w="120" w:type="dxa"/>
+              <w:bottom w:w="80" w:type="dxa"/>
+              <w:end w:w="120" w:type="dxa"/>
+            </w:tcMar>
+            <w:vAlign w:val="center"/>
+            <w:shd w:fill="E8EEF5"/>
+          </w:tcPr>
+          <w:p>
+            <w:pPr>
+              <w:spacing w:before="0" w:after="40" w:line="252" w:lineRule="auto"/>
+              <w:jc w:val="left"/>
+            </w:pPr>
+            <w:r>
+              <w:rPr>
+                <w:rFonts w:ascii="Calibri" w:hAnsi="Calibri"/>
+                <w:b/>
+                <w:color w:val="0B2545"/>
+                <w:sz w:val="17"/>
+              </w:rPr>
+              <w:t>Objective</w:t>
+            </w:r>
+          </w:p>
+        </w:tc>
+        <w:tc>
+          <w:tcPr>
+            <w:tcW w:type="dxa" w:w="3260"/>
+            <w:tcMar>
+              <w:top w:w="80" w:type="dxa"/>
+              <w:start w:w="120" w:type="dxa"/>
+              <w:bottom w:w="80" w:type="dxa"/>
+              <w:end w:w="120" w:type="dxa"/>
+            </w:tcMar>
+            <w:vAlign w:val="center"/>
+            <w:shd w:fill="E8EEF5"/>
+          </w:tcPr>
+          <w:p>
+            <w:pPr>
+              <w:spacing w:before="0" w:after="40" w:line="252" w:lineRule="auto"/>
+              <w:jc w:val="left"/>
+            </w:pPr>
+            <w:r>
+              <w:rPr>
+                <w:rFonts w:ascii="Calibri" w:hAnsi="Calibri"/>
+                <w:b/>
+                <w:color w:val="0B2545"/>
+                <w:sz w:val="17"/>
+              </w:rPr>
+              <w:t>Level</w:t>
+            </w:r>
+          </w:p>
+        </w:tc>
+      </w:tr>
+      <w:tr>
+        <w:trPr>
+          <w:cantSplit/>
+        </w:trPr>
+        <w:tc>
+          <w:tcPr>
+            <w:tcW w:type="dxa" w:w="1650"/>
+            <w:tcMar>
+              <w:top w:w="80" w:type="dxa"/>
+              <w:start w:w="120" w:type="dxa"/>
+              <w:bottom w:w="80" w:type="dxa"/>
+              <w:end w:w="120" w:type="dxa"/>
+            </w:tcMar>
+            <w:vAlign w:val="center"/>
+            <w:shd w:fill="FFFFFF"/>
+          </w:tcPr>
+          <w:p>
+            <w:pPr>
+              <w:spacing w:before="0" w:after="40" w:line="252" w:lineRule="auto"/>
+              <w:jc w:val="center"/>
+            </w:pPr>
+            <w:r>
+              <w:rPr>
+                <w:rFonts w:ascii="Calibri" w:hAnsi="Calibri"/>
+                <w:b w:val="0"/>
+                <w:color w:val="111827"/>
+                <w:sz w:val="17"/>
+              </w:rPr>
+              <w:t>Signal bound</w:t>
+            </w:r>
+          </w:p>
+        </w:tc>
+        <w:tc>
+          <w:tcPr>
+            <w:tcW w:type="dxa" w:w="4450"/>
+            <w:tcMar>
+              <w:top w:w="80" w:type="dxa"/>
+              <w:start w:w="120" w:type="dxa"/>
+              <w:bottom w:w="80" w:type="dxa"/>
+              <w:end w:w="120" w:type="dxa"/>
+            </w:tcMar>
+            <w:vAlign w:val="center"/>
+            <w:shd w:fill="FFFFFF"/>
+          </w:tcPr>
+          <w:p>
+            <w:pPr>
+              <w:spacing w:before="0" w:after="40" w:line="252" w:lineRule="auto"/>
+              <w:jc w:val="left"/>
+            </w:pPr>
+            <w:r>
+              <w:rPr>
+                <w:rFonts w:ascii="Calibri" w:hAnsi="Calibri"/>
+                <w:b w:val="0"/>
+                <w:color w:val="111827"/>
+                <w:sz w:val="17"/>
+              </w:rPr>
+              <w:t>Reject the 65th contract.</w:t>
+            </w:r>
+          </w:p>
+        </w:tc>
+        <w:tc>
+          <w:tcPr>
+            <w:tcW w:type="dxa" w:w="3260"/>
+            <w:tcMar>
+              <w:top w:w="80" w:type="dxa"/>
+              <w:start w:w="120" w:type="dxa"/>
+              <w:bottom w:w="80" w:type="dxa"/>
+              <w:end w:w="120" w:type="dxa"/>
+            </w:tcMar>
+            <w:vAlign w:val="center"/>
+            <w:shd w:fill="FFFFFF"/>
+          </w:tcPr>
+          <w:p>
+            <w:pPr>
+              <w:spacing w:before="0" w:after="40" w:line="252" w:lineRule="auto"/>
+              <w:jc w:val="left"/>
+            </w:pPr>
+            <w:r>
+              <w:rPr>
+                <w:rFonts w:ascii="Calibri" w:hAnsi="Calibri"/>
+                <w:b w:val="0"/>
+                <w:color w:val="111827"/>
+                <w:sz w:val="17"/>
+              </w:rPr>
+              <w:t>Schema</w:t>
+            </w:r>
+          </w:p>
+        </w:tc>
+      </w:tr>
+      <w:tr>
+        <w:trPr>
+          <w:cantSplit/>
+        </w:trPr>
+        <w:tc>
+          <w:tcPr>
+            <w:tcW w:type="dxa" w:w="1650"/>
+            <w:tcMar>
+              <w:top w:w="80" w:type="dxa"/>
+              <w:start w:w="120" w:type="dxa"/>
+              <w:bottom w:w="80" w:type="dxa"/>
+              <w:end w:w="120" w:type="dxa"/>
+            </w:tcMar>
+            <w:vAlign w:val="center"/>
+            <w:shd w:fill="FFFFFF"/>
+          </w:tcPr>
+          <w:p>
+            <w:pPr>
+              <w:spacing w:before="0" w:after="40" w:line="252" w:lineRule="auto"/>
+              <w:jc w:val="center"/>
+            </w:pPr>
+            <w:r>
+              <w:rPr>
+                <w:rFonts w:ascii="Calibri" w:hAnsi="Calibri"/>
+                <w:b w:val="0"/>
+                <w:color w:val="111827"/>
+                <w:sz w:val="17"/>
+              </w:rPr>
+              <w:t>Strict data type</w:t>
+            </w:r>
+          </w:p>
+        </w:tc>
+        <w:tc>
+          <w:tcPr>
+            <w:tcW w:type="dxa" w:w="4450"/>
+            <w:tcMar>
+              <w:top w:w="80" w:type="dxa"/>
+              <w:start w:w="120" w:type="dxa"/>
+              <w:bottom w:w="80" w:type="dxa"/>
+              <w:end w:w="120" w:type="dxa"/>
+            </w:tcMar>
+            <w:vAlign w:val="center"/>
+            <w:shd w:fill="FFFFFF"/>
+          </w:tcPr>
+          <w:p>
+            <w:pPr>
+              <w:spacing w:before="0" w:after="40" w:line="252" w:lineRule="auto"/>
+              <w:jc w:val="left"/>
+            </w:pPr>
+            <w:r>
+              <w:rPr>
+                <w:rFonts w:ascii="Calibri" w:hAnsi="Calibri"/>
+                <w:b w:val="0"/>
+                <w:color w:val="111827"/>
+                <w:sz w:val="17"/>
+              </w:rPr>
+              <w:t>Reject coercion and values that disagree with the declaration.</w:t>
+            </w:r>
+          </w:p>
+        </w:tc>
+        <w:tc>
+          <w:tcPr>
+            <w:tcW w:type="dxa" w:w="3260"/>
+            <w:tcMar>
+              <w:top w:w="80" w:type="dxa"/>
+              <w:start w:w="120" w:type="dxa"/>
+              <w:bottom w:w="80" w:type="dxa"/>
+              <w:end w:w="120" w:type="dxa"/>
+            </w:tcMar>
+            <w:vAlign w:val="center"/>
+            <w:shd w:fill="FFFFFF"/>
+          </w:tcPr>
+          <w:p>
+            <w:pPr>
+              <w:spacing w:before="0" w:after="40" w:line="252" w:lineRule="auto"/>
+              <w:jc w:val="left"/>
+            </w:pPr>
+            <w:r>
+              <w:rPr>
+                <w:rFonts w:ascii="Calibri" w:hAnsi="Calibri"/>
+                <w:b w:val="0"/>
+                <w:color w:val="111827"/>
+                <w:sz w:val="17"/>
+              </w:rPr>
+              <w:t>Schema</w:t>
+            </w:r>
+          </w:p>
+        </w:tc>
+      </w:tr>
+      <w:tr>
+        <w:trPr>
+          <w:cantSplit/>
+        </w:trPr>
+        <w:tc>
+          <w:tcPr>
+            <w:tcW w:type="dxa" w:w="1650"/>
+            <w:tcMar>
+              <w:top w:w="80" w:type="dxa"/>
+              <w:start w:w="120" w:type="dxa"/>
+              <w:bottom w:w="80" w:type="dxa"/>
+              <w:end w:w="120" w:type="dxa"/>
+            </w:tcMar>
+            <w:vAlign w:val="center"/>
+            <w:shd w:fill="FFFFFF"/>
+          </w:tcPr>
+          <w:p>
+            <w:pPr>
+              <w:spacing w:before="0" w:after="40" w:line="252" w:lineRule="auto"/>
+              <w:jc w:val="center"/>
+            </w:pPr>
+            <w:r>
+              <w:rPr>
+                <w:rFonts w:ascii="Calibri" w:hAnsi="Calibri"/>
+                <w:b w:val="0"/>
+                <w:color w:val="111827"/>
+                <w:sz w:val="17"/>
+              </w:rPr>
+              <w:t>Physical bounds</w:t>
+            </w:r>
+          </w:p>
+        </w:tc>
+        <w:tc>
+          <w:tcPr>
+            <w:tcW w:type="dxa" w:w="4450"/>
+            <w:tcMar>
+              <w:top w:w="80" w:type="dxa"/>
+              <w:start w:w="120" w:type="dxa"/>
+              <w:bottom w:w="80" w:type="dxa"/>
+              <w:end w:w="120" w:type="dxa"/>
+            </w:tcMar>
+            <w:vAlign w:val="center"/>
+            <w:shd w:fill="FFFFFF"/>
+          </w:tcPr>
+          <w:p>
+            <w:pPr>
+              <w:spacing w:before="0" w:after="40" w:line="252" w:lineRule="auto"/>
+              <w:jc w:val="left"/>
+            </w:pPr>
+            <w:r>
+              <w:rPr>
+                <w:rFonts w:ascii="Calibri" w:hAnsi="Calibri"/>
+                <w:b w:val="0"/>
+                <w:color w:val="111827"/>
+                <w:sz w:val="17"/>
+              </w:rPr>
+              <w:t>Reject values below minimum or above maximum.</w:t>
+            </w:r>
+          </w:p>
+        </w:tc>
+        <w:tc>
+          <w:tcPr>
+            <w:tcW w:type="dxa" w:w="3260"/>
+            <w:tcMar>
+              <w:top w:w="80" w:type="dxa"/>
+              <w:start w:w="120" w:type="dxa"/>
+              <w:bottom w:w="80" w:type="dxa"/>
+              <w:end w:w="120" w:type="dxa"/>
+            </w:tcMar>
+            <w:vAlign w:val="center"/>
+            <w:shd w:fill="FFFFFF"/>
+          </w:tcPr>
+          <w:p>
+            <w:pPr>
+              <w:spacing w:before="0" w:after="40" w:line="252" w:lineRule="auto"/>
+              <w:jc w:val="left"/>
+            </w:pPr>
+            <w:r>
+              <w:rPr>
+                <w:rFonts w:ascii="Calibri" w:hAnsi="Calibri"/>
+                <w:b w:val="0"/>
+                <w:color w:val="111827"/>
+                <w:sz w:val="17"/>
+              </w:rPr>
+              <w:t>Schema/service</w:t>
+            </w:r>
+          </w:p>
+        </w:tc>
+      </w:tr>
+      <w:tr>
+        <w:trPr>
+          <w:cantSplit/>
+        </w:trPr>
+        <w:tc>
+          <w:tcPr>
+            <w:tcW w:type="dxa" w:w="1650"/>
+            <w:tcMar>
+              <w:top w:w="80" w:type="dxa"/>
+              <w:start w:w="120" w:type="dxa"/>
+              <w:bottom w:w="80" w:type="dxa"/>
+              <w:end w:w="120" w:type="dxa"/>
+            </w:tcMar>
+            <w:vAlign w:val="center"/>
+            <w:shd w:fill="FFFFFF"/>
+          </w:tcPr>
+          <w:p>
+            <w:pPr>
+              <w:spacing w:before="0" w:after="40" w:line="252" w:lineRule="auto"/>
+              <w:jc w:val="center"/>
+            </w:pPr>
+            <w:r>
+              <w:rPr>
+                <w:rFonts w:ascii="Calibri" w:hAnsi="Calibri"/>
+                <w:b w:val="0"/>
+                <w:color w:val="111827"/>
+                <w:sz w:val="17"/>
+              </w:rPr>
+              <w:t>Direction uniqueness</w:t>
+            </w:r>
+          </w:p>
+        </w:tc>
+        <w:tc>
+          <w:tcPr>
+            <w:tcW w:type="dxa" w:w="4450"/>
+            <w:tcMar>
+              <w:top w:w="80" w:type="dxa"/>
+              <w:start w:w="120" w:type="dxa"/>
+              <w:bottom w:w="80" w:type="dxa"/>
+              <w:end w:w="120" w:type="dxa"/>
+            </w:tcMar>
+            <w:vAlign w:val="center"/>
+            <w:shd w:fill="FFFFFF"/>
+          </w:tcPr>
+          <w:p>
+            <w:pPr>
+              <w:spacing w:before="0" w:after="40" w:line="252" w:lineRule="auto"/>
+              <w:jc w:val="left"/>
+            </w:pPr>
+            <w:r>
+              <w:rPr>
+                <w:rFonts w:ascii="Calibri" w:hAnsi="Calibri"/>
+                <w:b w:val="0"/>
+                <w:color w:val="111827"/>
+                <w:sz w:val="17"/>
+              </w:rPr>
+              <w:t>Reject duplicate names within one direction.</w:t>
+            </w:r>
+          </w:p>
+        </w:tc>
+        <w:tc>
+          <w:tcPr>
+            <w:tcW w:type="dxa" w:w="3260"/>
+            <w:tcMar>
+              <w:top w:w="80" w:type="dxa"/>
+              <w:start w:w="120" w:type="dxa"/>
+              <w:bottom w:w="80" w:type="dxa"/>
+              <w:end w:w="120" w:type="dxa"/>
+            </w:tcMar>
+            <w:vAlign w:val="center"/>
+            <w:shd w:fill="FFFFFF"/>
+          </w:tcPr>
+          <w:p>
+            <w:pPr>
+              <w:spacing w:before="0" w:after="40" w:line="252" w:lineRule="auto"/>
+              <w:jc w:val="left"/>
+            </w:pPr>
+            <w:r>
+              <w:rPr>
+                <w:rFonts w:ascii="Calibri" w:hAnsi="Calibri"/>
+                <w:b w:val="0"/>
+                <w:color w:val="111827"/>
+                <w:sz w:val="17"/>
+              </w:rPr>
+              <w:t>Schema</w:t>
+            </w:r>
+          </w:p>
+        </w:tc>
+      </w:tr>
+      <w:tr>
+        <w:trPr>
+          <w:cantSplit/>
+        </w:trPr>
+        <w:tc>
+          <w:tcPr>
+            <w:tcW w:type="dxa" w:w="1650"/>
+            <w:tcMar>
+              <w:top w:w="80" w:type="dxa"/>
+              <w:start w:w="120" w:type="dxa"/>
+              <w:bottom w:w="80" w:type="dxa"/>
+              <w:end w:w="120" w:type="dxa"/>
+            </w:tcMar>
+            <w:vAlign w:val="center"/>
+            <w:shd w:fill="FFFFFF"/>
+          </w:tcPr>
+          <w:p>
+            <w:pPr>
+              <w:spacing w:before="0" w:after="40" w:line="252" w:lineRule="auto"/>
+              <w:jc w:val="center"/>
+            </w:pPr>
+            <w:r>
+              <w:rPr>
+                <w:rFonts w:ascii="Calibri" w:hAnsi="Calibri"/>
+                <w:b w:val="0"/>
+                <w:color w:val="111827"/>
+                <w:sz w:val="17"/>
+              </w:rPr>
+              <w:t>Publication clock</w:t>
+            </w:r>
+          </w:p>
+        </w:tc>
+        <w:tc>
+          <w:tcPr>
+            <w:tcW w:type="dxa" w:w="4450"/>
+            <w:tcMar>
+              <w:top w:w="80" w:type="dxa"/>
+              <w:start w:w="120" w:type="dxa"/>
+              <w:bottom w:w="80" w:type="dxa"/>
+              <w:end w:w="120" w:type="dxa"/>
+            </w:tcMar>
+            <w:vAlign w:val="center"/>
+            <w:shd w:fill="FFFFFF"/>
+          </w:tcPr>
+          <w:p>
+            <w:pPr>
+              <w:spacing w:before="0" w:after="40" w:line="252" w:lineRule="auto"/>
+              <w:jc w:val="left"/>
+            </w:pPr>
+            <w:r>
+              <w:rPr>
+                <w:rFonts w:ascii="Calibri" w:hAnsi="Calibri"/>
+                <w:b w:val="0"/>
+                <w:color w:val="111827"/>
+                <w:sz w:val="17"/>
+              </w:rPr>
+              <w:t>Record the ECU logical time without wall-clock access.</w:t>
+            </w:r>
+          </w:p>
+        </w:tc>
+        <w:tc>
+          <w:tcPr>
+            <w:tcW w:type="dxa" w:w="3260"/>
+            <w:tcMar>
+              <w:top w:w="80" w:type="dxa"/>
+              <w:start w:w="120" w:type="dxa"/>
+              <w:bottom w:w="80" w:type="dxa"/>
+              <w:end w:w="120" w:type="dxa"/>
+            </w:tcMar>
+            <w:vAlign w:val="center"/>
+            <w:shd w:fill="FFFFFF"/>
+          </w:tcPr>
+          <w:p>
+            <w:pPr>
+              <w:spacing w:before="0" w:after="40" w:line="252" w:lineRule="auto"/>
+              <w:jc w:val="left"/>
+            </w:pPr>
+            <w:r>
+              <w:rPr>
+                <w:rFonts w:ascii="Calibri" w:hAnsi="Calibri"/>
+                <w:b w:val="0"/>
+                <w:color w:val="111827"/>
+                <w:sz w:val="17"/>
+              </w:rPr>
+              <w:t>Service</w:t>
+            </w:r>
+          </w:p>
+        </w:tc>
+      </w:tr>
+      <w:tr>
+        <w:trPr>
+          <w:cantSplit/>
+        </w:trPr>
+        <w:tc>
+          <w:tcPr>
+            <w:tcW w:type="dxa" w:w="1650"/>
+            <w:tcMar>
+              <w:top w:w="80" w:type="dxa"/>
+              <w:start w:w="120" w:type="dxa"/>
+              <w:bottom w:w="80" w:type="dxa"/>
+              <w:end w:w="120" w:type="dxa"/>
+            </w:tcMar>
+            <w:vAlign w:val="center"/>
+            <w:shd w:fill="FFFFFF"/>
+          </w:tcPr>
+          <w:p>
+            <w:pPr>
+              <w:spacing w:before="0" w:after="40" w:line="252" w:lineRule="auto"/>
+              <w:jc w:val="center"/>
+            </w:pPr>
+            <w:r>
+              <w:rPr>
+                <w:rFonts w:ascii="Calibri" w:hAnsi="Calibri"/>
+                <w:b w:val="0"/>
+                <w:color w:val="111827"/>
+                <w:sz w:val="17"/>
+              </w:rPr>
+              <w:t>Publication replay</w:t>
+            </w:r>
+          </w:p>
+        </w:tc>
+        <w:tc>
+          <w:tcPr>
+            <w:tcW w:type="dxa" w:w="4450"/>
+            <w:tcMar>
+              <w:top w:w="80" w:type="dxa"/>
+              <w:start w:w="120" w:type="dxa"/>
+              <w:bottom w:w="80" w:type="dxa"/>
+              <w:end w:w="120" w:type="dxa"/>
+            </w:tcMar>
+            <w:vAlign w:val="center"/>
+            <w:shd w:fill="FFFFFF"/>
+          </w:tcPr>
+          <w:p>
+            <w:pPr>
+              <w:spacing w:before="0" w:after="40" w:line="252" w:lineRule="auto"/>
+              <w:jc w:val="left"/>
+            </w:pPr>
+            <w:r>
+              <w:rPr>
+                <w:rFonts w:ascii="Calibri" w:hAnsi="Calibri"/>
+                <w:b w:val="0"/>
+                <w:color w:val="111827"/>
+                <w:sz w:val="17"/>
+              </w:rPr>
+              <w:t>Avoid changing value or version twice.</w:t>
+            </w:r>
+          </w:p>
+        </w:tc>
+        <w:tc>
+          <w:tcPr>
+            <w:tcW w:type="dxa" w:w="3260"/>
+            <w:tcMar>
+              <w:top w:w="80" w:type="dxa"/>
+              <w:start w:w="120" w:type="dxa"/>
+              <w:bottom w:w="80" w:type="dxa"/>
+              <w:end w:w="120" w:type="dxa"/>
+            </w:tcMar>
+            <w:vAlign w:val="center"/>
+            <w:shd w:fill="FFFFFF"/>
+          </w:tcPr>
+          <w:p>
+            <w:pPr>
+              <w:spacing w:before="0" w:after="40" w:line="252" w:lineRule="auto"/>
+              <w:jc w:val="left"/>
+            </w:pPr>
+            <w:r>
+              <w:rPr>
+                <w:rFonts w:ascii="Calibri" w:hAnsi="Calibri"/>
+                <w:b w:val="0"/>
+                <w:color w:val="111827"/>
+                <w:sz w:val="17"/>
+              </w:rPr>
+              <w:t>Service</w:t>
+            </w:r>
+          </w:p>
+        </w:tc>
+      </w:tr>
+      <w:tr>
+        <w:trPr>
+          <w:cantSplit/>
+        </w:trPr>
+        <w:tc>
+          <w:tcPr>
+            <w:tcW w:type="dxa" w:w="1650"/>
+            <w:tcMar>
+              <w:top w:w="80" w:type="dxa"/>
+              <w:start w:w="120" w:type="dxa"/>
+              <w:bottom w:w="80" w:type="dxa"/>
+              <w:end w:w="120" w:type="dxa"/>
+            </w:tcMar>
+            <w:vAlign w:val="center"/>
+            <w:shd w:fill="FFFFFF"/>
+          </w:tcPr>
+          <w:p>
+            <w:pPr>
+              <w:spacing w:before="0" w:after="40" w:line="252" w:lineRule="auto"/>
+              <w:jc w:val="center"/>
+            </w:pPr>
+            <w:r>
+              <w:rPr>
+                <w:rFonts w:ascii="Calibri" w:hAnsi="Calibri"/>
+                <w:b w:val="0"/>
+                <w:color w:val="111827"/>
+                <w:sz w:val="17"/>
+              </w:rPr>
+              <w:t>Gateway ownership</w:t>
+            </w:r>
+          </w:p>
+        </w:tc>
+        <w:tc>
+          <w:tcPr>
+            <w:tcW w:type="dxa" w:w="4450"/>
+            <w:tcMar>
+              <w:top w:w="80" w:type="dxa"/>
+              <w:start w:w="120" w:type="dxa"/>
+              <w:bottom w:w="80" w:type="dxa"/>
+              <w:end w:w="120" w:type="dxa"/>
+            </w:tcMar>
+            <w:vAlign w:val="center"/>
+            <w:shd w:fill="FFFFFF"/>
+          </w:tcPr>
+          <w:p>
+            <w:pPr>
+              <w:spacing w:before="0" w:after="40" w:line="252" w:lineRule="auto"/>
+              <w:jc w:val="left"/>
+            </w:pPr>
+            <w:r>
+              <w:rPr>
+                <w:rFonts w:ascii="Calibri" w:hAnsi="Calibri"/>
+                <w:b w:val="0"/>
+                <w:color w:val="111827"/>
+                <w:sz w:val="17"/>
+              </w:rPr>
+              <w:t>Reject route creation by a non-gateway ECU.</w:t>
+            </w:r>
+          </w:p>
+        </w:tc>
+        <w:tc>
+          <w:tcPr>
+            <w:tcW w:type="dxa" w:w="3260"/>
+            <w:tcMar>
+              <w:top w:w="80" w:type="dxa"/>
+              <w:start w:w="120" w:type="dxa"/>
+              <w:bottom w:w="80" w:type="dxa"/>
+              <w:end w:w="120" w:type="dxa"/>
+            </w:tcMar>
+            <w:vAlign w:val="center"/>
+            <w:shd w:fill="FFFFFF"/>
+          </w:tcPr>
+          <w:p>
+            <w:pPr>
+              <w:spacing w:before="0" w:after="40" w:line="252" w:lineRule="auto"/>
+              <w:jc w:val="left"/>
+            </w:pPr>
+            <w:r>
+              <w:rPr>
+                <w:rFonts w:ascii="Calibri" w:hAnsi="Calibri"/>
+                <w:b w:val="0"/>
+                <w:color w:val="111827"/>
+                <w:sz w:val="17"/>
+              </w:rPr>
+              <w:t>Service/API</w:t>
+            </w:r>
+          </w:p>
+        </w:tc>
+      </w:tr>
+      <w:tr>
+        <w:trPr>
+          <w:cantSplit/>
+        </w:trPr>
+        <w:tc>
+          <w:tcPr>
+            <w:tcW w:type="dxa" w:w="1650"/>
+            <w:tcMar>
+              <w:top w:w="80" w:type="dxa"/>
+              <w:start w:w="120" w:type="dxa"/>
+              <w:bottom w:w="80" w:type="dxa"/>
+              <w:end w:w="120" w:type="dxa"/>
+            </w:tcMar>
+            <w:vAlign w:val="center"/>
+            <w:shd w:fill="FFFFFF"/>
+          </w:tcPr>
+          <w:p>
+            <w:pPr>
+              <w:spacing w:before="0" w:after="40" w:line="252" w:lineRule="auto"/>
+              <w:jc w:val="center"/>
+            </w:pPr>
+            <w:r>
+              <w:rPr>
+                <w:rFonts w:ascii="Calibri" w:hAnsi="Calibri"/>
+                <w:b w:val="0"/>
+                <w:color w:val="111827"/>
+                <w:sz w:val="17"/>
+              </w:rPr>
+              <w:t>Route compatibility</w:t>
+            </w:r>
+          </w:p>
+        </w:tc>
+        <w:tc>
+          <w:tcPr>
+            <w:tcW w:type="dxa" w:w="4450"/>
+            <w:tcMar>
+              <w:top w:w="80" w:type="dxa"/>
+              <w:start w:w="120" w:type="dxa"/>
+              <w:bottom w:w="80" w:type="dxa"/>
+              <w:end w:w="120" w:type="dxa"/>
+            </w:tcMar>
+            <w:vAlign w:val="center"/>
+            <w:shd w:fill="FFFFFF"/>
+          </w:tcPr>
+          <w:p>
+            <w:pPr>
+              <w:spacing w:before="0" w:after="40" w:line="252" w:lineRule="auto"/>
+              <w:jc w:val="left"/>
+            </w:pPr>
+            <w:r>
+              <w:rPr>
+                <w:rFonts w:ascii="Calibri" w:hAnsi="Calibri"/>
+                <w:b w:val="0"/>
+                <w:color w:val="111827"/>
+                <w:sz w:val="17"/>
+              </w:rPr>
+              <w:t>Require produced-to-consumed direction plus matching type and unit.</w:t>
+            </w:r>
+          </w:p>
+        </w:tc>
+        <w:tc>
+          <w:tcPr>
+            <w:tcW w:type="dxa" w:w="3260"/>
+            <w:tcMar>
+              <w:top w:w="80" w:type="dxa"/>
+              <w:start w:w="120" w:type="dxa"/>
+              <w:bottom w:w="80" w:type="dxa"/>
+              <w:end w:w="120" w:type="dxa"/>
+            </w:tcMar>
+            <w:vAlign w:val="center"/>
+            <w:shd w:fill="FFFFFF"/>
+          </w:tcPr>
+          <w:p>
+            <w:pPr>
+              <w:spacing w:before="0" w:after="40" w:line="252" w:lineRule="auto"/>
+              <w:jc w:val="left"/>
+            </w:pPr>
+            <w:r>
+              <w:rPr>
+                <w:rFonts w:ascii="Calibri" w:hAnsi="Calibri"/>
+                <w:b w:val="0"/>
+                <w:color w:val="111827"/>
+                <w:sz w:val="17"/>
+              </w:rPr>
+              <w:t>Service</w:t>
+            </w:r>
+          </w:p>
+        </w:tc>
+      </w:tr>
+      <w:tr>
+        <w:trPr>
+          <w:cantSplit/>
+        </w:trPr>
+        <w:tc>
+          <w:tcPr>
+            <w:tcW w:type="dxa" w:w="1650"/>
+            <w:tcMar>
+              <w:top w:w="80" w:type="dxa"/>
+              <w:start w:w="120" w:type="dxa"/>
+              <w:bottom w:w="80" w:type="dxa"/>
+              <w:end w:w="120" w:type="dxa"/>
+            </w:tcMar>
+            <w:vAlign w:val="center"/>
+            <w:shd w:fill="FFFFFF"/>
+          </w:tcPr>
+          <w:p>
+            <w:pPr>
+              <w:spacing w:before="0" w:after="40" w:line="252" w:lineRule="auto"/>
+              <w:jc w:val="center"/>
+            </w:pPr>
+            <w:r>
+              <w:rPr>
+                <w:rFonts w:ascii="Calibri" w:hAnsi="Calibri"/>
+                <w:b w:val="0"/>
+                <w:color w:val="111827"/>
+                <w:sz w:val="17"/>
+              </w:rPr>
+              <w:t>Transfer concurrency</w:t>
+            </w:r>
+          </w:p>
+        </w:tc>
+        <w:tc>
+          <w:tcPr>
+            <w:tcW w:type="dxa" w:w="4450"/>
+            <w:tcMar>
+              <w:top w:w="80" w:type="dxa"/>
+              <w:start w:w="120" w:type="dxa"/>
+              <w:bottom w:w="80" w:type="dxa"/>
+              <w:end w:w="120" w:type="dxa"/>
+            </w:tcMar>
+            <w:vAlign w:val="center"/>
+            <w:shd w:fill="FFFFFF"/>
+          </w:tcPr>
+          <w:p>
+            <w:pPr>
+              <w:spacing w:before="0" w:after="40" w:line="252" w:lineRule="auto"/>
+              <w:jc w:val="left"/>
+            </w:pPr>
+            <w:r>
+              <w:rPr>
+                <w:rFonts w:ascii="Calibri" w:hAnsi="Calibri"/>
+                <w:b w:val="0"/>
+                <w:color w:val="111827"/>
+                <w:sz w:val="17"/>
+              </w:rPr>
+              <w:t>Reject stale source or target versions.</w:t>
+            </w:r>
+          </w:p>
+        </w:tc>
+        <w:tc>
+          <w:tcPr>
+            <w:tcW w:type="dxa" w:w="3260"/>
+            <w:tcMar>
+              <w:top w:w="80" w:type="dxa"/>
+              <w:start w:w="120" w:type="dxa"/>
+              <w:bottom w:w="80" w:type="dxa"/>
+              <w:end w:w="120" w:type="dxa"/>
+            </w:tcMar>
+            <w:vAlign w:val="center"/>
+            <w:shd w:fill="FFFFFF"/>
+          </w:tcPr>
+          <w:p>
+            <w:pPr>
+              <w:spacing w:before="0" w:after="40" w:line="252" w:lineRule="auto"/>
+              <w:jc w:val="left"/>
+            </w:pPr>
+            <w:r>
+              <w:rPr>
+                <w:rFonts w:ascii="Calibri" w:hAnsi="Calibri"/>
+                <w:b w:val="0"/>
+                <w:color w:val="111827"/>
+                <w:sz w:val="17"/>
+              </w:rPr>
+              <w:t>Service/API</w:t>
+            </w:r>
+          </w:p>
+        </w:tc>
+      </w:tr>
+      <w:tr>
+        <w:trPr>
+          <w:cantSplit/>
+        </w:trPr>
+        <w:tc>
+          <w:tcPr>
+            <w:tcW w:type="dxa" w:w="1650"/>
+            <w:tcMar>
+              <w:top w:w="80" w:type="dxa"/>
+              <w:start w:w="120" w:type="dxa"/>
+              <w:bottom w:w="80" w:type="dxa"/>
+              <w:end w:w="120" w:type="dxa"/>
+            </w:tcMar>
+            <w:vAlign w:val="center"/>
+            <w:shd w:fill="FFFFFF"/>
+          </w:tcPr>
+          <w:p>
+            <w:pPr>
+              <w:spacing w:before="0" w:after="40" w:line="252" w:lineRule="auto"/>
+              <w:jc w:val="center"/>
+            </w:pPr>
+            <w:r>
+              <w:rPr>
+                <w:rFonts w:ascii="Calibri" w:hAnsi="Calibri"/>
+                <w:b w:val="0"/>
+                <w:color w:val="111827"/>
+                <w:sz w:val="17"/>
+              </w:rPr>
+              <w:t>Atomic transfer</w:t>
+            </w:r>
+          </w:p>
+        </w:tc>
+        <w:tc>
+          <w:tcPr>
+            <w:tcW w:type="dxa" w:w="4450"/>
+            <w:tcMar>
+              <w:top w:w="80" w:type="dxa"/>
+              <w:start w:w="120" w:type="dxa"/>
+              <w:bottom w:w="80" w:type="dxa"/>
+              <w:end w:w="120" w:type="dxa"/>
+            </w:tcMar>
+            <w:vAlign w:val="center"/>
+            <w:shd w:fill="FFFFFF"/>
+          </w:tcPr>
+          <w:p>
+            <w:pPr>
+              <w:spacing w:before="0" w:after="40" w:line="252" w:lineRule="auto"/>
+              <w:jc w:val="left"/>
+            </w:pPr>
+            <w:r>
+              <w:rPr>
+                <w:rFonts w:ascii="Calibri" w:hAnsi="Calibri"/>
+                <w:b w:val="0"/>
+                <w:color w:val="111827"/>
+                <w:sz w:val="17"/>
+              </w:rPr>
+              <w:t>Copy the value and commit target, audit, command, and event together.</w:t>
+            </w:r>
+          </w:p>
+        </w:tc>
+        <w:tc>
+          <w:tcPr>
+            <w:tcW w:type="dxa" w:w="3260"/>
+            <w:tcMar>
+              <w:top w:w="80" w:type="dxa"/>
+              <w:start w:w="120" w:type="dxa"/>
+              <w:bottom w:w="80" w:type="dxa"/>
+              <w:end w:w="120" w:type="dxa"/>
+            </w:tcMar>
+            <w:vAlign w:val="center"/>
+            <w:shd w:fill="FFFFFF"/>
+          </w:tcPr>
+          <w:p>
+            <w:pPr>
+              <w:spacing w:before="0" w:after="40" w:line="252" w:lineRule="auto"/>
+              <w:jc w:val="left"/>
+            </w:pPr>
+            <w:r>
+              <w:rPr>
+                <w:rFonts w:ascii="Calibri" w:hAnsi="Calibri"/>
+                <w:b w:val="0"/>
+                <w:color w:val="111827"/>
+                <w:sz w:val="17"/>
+              </w:rPr>
+              <w:t>Integration</w:t>
+            </w:r>
+          </w:p>
+        </w:tc>
+      </w:tr>
+      <w:tr>
+        <w:trPr>
+          <w:cantSplit/>
+        </w:trPr>
+        <w:tc>
+          <w:tcPr>
+            <w:tcW w:type="dxa" w:w="1650"/>
+            <w:tcMar>
+              <w:top w:w="80" w:type="dxa"/>
+              <w:start w:w="120" w:type="dxa"/>
+              <w:bottom w:w="80" w:type="dxa"/>
+              <w:end w:w="120" w:type="dxa"/>
+            </w:tcMar>
+            <w:vAlign w:val="center"/>
+            <w:shd w:fill="FFFFFF"/>
+          </w:tcPr>
+          <w:p>
+            <w:pPr>
+              <w:spacing w:before="0" w:after="40" w:line="252" w:lineRule="auto"/>
+              <w:jc w:val="center"/>
+            </w:pPr>
+            <w:r>
+              <w:rPr>
+                <w:rFonts w:ascii="Calibri" w:hAnsi="Calibri"/>
+                <w:b w:val="0"/>
+                <w:color w:val="111827"/>
+                <w:sz w:val="17"/>
+              </w:rPr>
+              <w:t>Signal RBAC/OpenAPI</w:t>
+            </w:r>
+          </w:p>
+        </w:tc>
+        <w:tc>
+          <w:tcPr>
+            <w:tcW w:type="dxa" w:w="4450"/>
+            <w:tcMar>
+              <w:top w:w="80" w:type="dxa"/>
+              <w:start w:w="120" w:type="dxa"/>
+              <w:bottom w:w="80" w:type="dxa"/>
+              <w:end w:w="120" w:type="dxa"/>
+            </w:tcMar>
+            <w:vAlign w:val="center"/>
+            <w:shd w:fill="FFFFFF"/>
+          </w:tcPr>
+          <w:p>
+            <w:pPr>
+              <w:spacing w:before="0" w:after="40" w:line="252" w:lineRule="auto"/>
+              <w:jc w:val="left"/>
+            </w:pPr>
+            <w:r>
+              <w:rPr>
+                <w:rFonts w:ascii="Calibri" w:hAnsi="Calibri"/>
+                <w:b w:val="0"/>
+                <w:color w:val="111827"/>
+                <w:sz w:val="17"/>
+              </w:rPr>
+              <w:t>Publish protected, typed, safely paginated endpoints.</w:t>
+            </w:r>
+          </w:p>
+        </w:tc>
+        <w:tc>
+          <w:tcPr>
+            <w:tcW w:type="dxa" w:w="3260"/>
+            <w:tcMar>
+              <w:top w:w="80" w:type="dxa"/>
+              <w:start w:w="120" w:type="dxa"/>
+              <w:bottom w:w="80" w:type="dxa"/>
+              <w:end w:w="120" w:type="dxa"/>
+            </w:tcMar>
+            <w:vAlign w:val="center"/>
+            <w:shd w:fill="FFFFFF"/>
+          </w:tcPr>
+          <w:p>
+            <w:pPr>
+              <w:spacing w:before="0" w:after="40" w:line="252" w:lineRule="auto"/>
+              <w:jc w:val="left"/>
+            </w:pPr>
+            <w:r>
+              <w:rPr>
+                <w:rFonts w:ascii="Calibri" w:hAnsi="Calibri"/>
+                <w:b w:val="0"/>
+                <w:color w:val="111827"/>
+                <w:sz w:val="17"/>
+              </w:rPr>
+              <w:t>Contract/integration</w:t>
+            </w:r>
+          </w:p>
+        </w:tc>
+      </w:tr>
+      <w:tr>
+        <w:trPr>
+          <w:cantSplit/>
+        </w:trPr>
+        <w:tc>
+          <w:tcPr>
+            <w:tcW w:type="dxa" w:w="1650"/>
+            <w:tcMar>
+              <w:top w:w="80" w:type="dxa"/>
+              <w:start w:w="120" w:type="dxa"/>
+              <w:bottom w:w="80" w:type="dxa"/>
+              <w:end w:w="120" w:type="dxa"/>
+            </w:tcMar>
+            <w:vAlign w:val="center"/>
+            <w:shd w:fill="FFFFFF"/>
+          </w:tcPr>
+          <w:p>
+            <w:pPr>
+              <w:spacing w:before="0" w:after="40" w:line="252" w:lineRule="auto"/>
+              <w:jc w:val="center"/>
+            </w:pPr>
+            <w:r>
+              <w:rPr>
+                <w:rFonts w:ascii="Calibri" w:hAnsi="Calibri"/>
+                <w:b w:val="0"/>
+                <w:color w:val="111827"/>
+                <w:sz w:val="17"/>
+              </w:rPr>
+              <w:t>Transport boundary</w:t>
+            </w:r>
+          </w:p>
+        </w:tc>
+        <w:tc>
+          <w:tcPr>
+            <w:tcW w:type="dxa" w:w="4450"/>
+            <w:tcMar>
+              <w:top w:w="80" w:type="dxa"/>
+              <w:start w:w="120" w:type="dxa"/>
+              <w:bottom w:w="80" w:type="dxa"/>
+              <w:end w:w="120" w:type="dxa"/>
+            </w:tcMar>
+            <w:vAlign w:val="center"/>
+            <w:shd w:fill="FFFFFF"/>
+          </w:tcPr>
+          <w:p>
+            <w:pPr>
+              <w:spacing w:before="0" w:after="40" w:line="252" w:lineRule="auto"/>
+              <w:jc w:val="left"/>
+            </w:pPr>
+            <w:r>
+              <w:rPr>
+                <w:rFonts w:ascii="Calibri" w:hAnsi="Calibri"/>
+                <w:b w:val="0"/>
+                <w:color w:val="111827"/>
+                <w:sz w:val="17"/>
+              </w:rPr>
+              <w:t>Verify no CAN ID, frame, DBC, arbitration, or bitrate type is imported.</w:t>
+            </w:r>
+          </w:p>
+        </w:tc>
+        <w:tc>
+          <w:tcPr>
+            <w:tcW w:type="dxa" w:w="3260"/>
+            <w:tcMar>
+              <w:top w:w="80" w:type="dxa"/>
+              <w:start w:w="120" w:type="dxa"/>
+              <w:bottom w:w="80" w:type="dxa"/>
+              <w:end w:w="120" w:type="dxa"/>
+            </w:tcMar>
+            <w:vAlign w:val="center"/>
+            <w:shd w:fill="FFFFFF"/>
+          </w:tcPr>
+          <w:p>
+            <w:pPr>
+              <w:spacing w:before="0" w:after="40" w:line="252" w:lineRule="auto"/>
+              <w:jc w:val="left"/>
+            </w:pPr>
+            <w:r>
+              <w:rPr>
+                <w:rFonts w:ascii="Calibri" w:hAnsi="Calibri"/>
+                <w:b w:val="0"/>
+                <w:color w:val="111827"/>
+                <w:sz w:val="17"/>
+              </w:rPr>
+              <w:t>Review</w:t>
+            </w:r>
+          </w:p>
+        </w:tc>
+      </w:tr>
+    </w:tbl>
+    <w:p>
+      <w:pPr>
+        <w:spacing w:after="60"/>
+      </w:pPr>
+    </w:p>
+    <w:p>
+      <w:pPr>
+        <w:pStyle w:val="Heading1"/>
+        <w:keepNext/>
+        <w:keepLines/>
+      </w:pPr>
+      <w:r>
         <w:t>12. Implemented Evidence</w:t>
       </w:r>
     </w:p>
@@ -10416,6 +12185,22 @@
           <w:color w:val="111827"/>
           <w:sz w:val="22"/>
         </w:rPr>
+        <w:t xml:space="preserve">, </w:t>
+      </w:r>
+      <w:r>
+        <w:rPr>
+          <w:rFonts w:ascii="Consolas" w:hAnsi="Consolas"/>
+          <w:color w:val="1F4D78"/>
+          <w:sz w:val="19"/>
+        </w:rPr>
+        <w:t>0021_ecu_memory_regions</w:t>
+      </w:r>
+      <w:r>
+        <w:rPr>
+          <w:rFonts w:ascii="Calibri" w:hAnsi="Calibri"/>
+          <w:color w:val="111827"/>
+          <w:sz w:val="22"/>
+        </w:rPr>
         <w:t xml:space="preserve">, and </w:t>
       </w:r>
       <w:r>
@@ -10424,7 +12209,7 @@
           <w:color w:val="1F4D78"/>
           <w:sz w:val="19"/>
         </w:rPr>
-        <w:t>0021_ecu_memory_regions</w:t>
+        <w:t>0022_ecu_signal_contracts</w:t>
       </w:r>
       <w:r>
         <w:rPr>
@@ -10629,7 +12414,7 @@
           <w:color w:val="111827"/>
           <w:sz w:val="22"/>
         </w:rPr>
-        <w:t xml:space="preserve"> for observation and explicit-clear evidence.</w:t>
+        <w:t xml:space="preserve"> for observation and explicit-clear evidence; signal events cover publication, route creation, and routed transfer without physical values in audit evidence.</w:t>
       </w:r>
     </w:p>
     <w:p>
@@ -10756,6 +12541,40 @@
     </w:p>
     <w:p>
       <w:pPr>
+        <w:pStyle w:val="ListBullet"/>
+        <w:numPr>
+          <w:ilvl w:val="0"/>
+          <w:numId w:val="16"/>
+        </w:numPr>
+      </w:pPr>
+      <w:r>
+        <w:rPr>
+          <w:rFonts w:ascii="Calibri" w:hAnsi="Calibri"/>
+          <w:color w:val="111827"/>
+          <w:sz w:val="22"/>
+        </w:rPr>
+        <w:t>Cross-route lock ordering must be hardened before high-concurrency multi-gateway execution.</w:t>
+      </w:r>
+    </w:p>
+    <w:p>
+      <w:pPr>
+        <w:pStyle w:val="ListBullet"/>
+        <w:numPr>
+          <w:ilvl w:val="0"/>
+          <w:numId w:val="16"/>
+        </w:numPr>
+      </w:pPr>
+      <w:r>
+        <w:rPr>
+          <w:rFonts w:ascii="Calibri" w:hAnsi="Calibri"/>
+          <w:color w:val="111827"/>
+          <w:sz w:val="22"/>
+        </w:rPr>
+        <w:t>Unit conversion is intentionally absent; routes currently require exact unit equality.</w:t>
+      </w:r>
+    </w:p>
+    <w:p>
+      <w:pPr>
         <w:pStyle w:val="Heading1"/>
         <w:keepNext/>
         <w:keepLines/>
@@ -10771,7 +12590,7 @@
           <w:color w:val="111827"/>
           <w:sz w:val="22"/>
         </w:rPr>
-        <w:t xml:space="preserve">The next increment adds CAN production/consumption contracts and gateway routing hooks without embedding a bus implementation. Later increments add multi-ECU scenarios. See </w:t>
+        <w:t xml:space="preserve">The next increment adds multi-ECU scenarios, logical-time diagnostics, bounded resource metrics, and repeatable failure campaigns. CAN bus implementation remains in Volume IV. See </w:t>
       </w:r>
       <w:r>
         <w:rPr>
@@ -11072,11 +12891,79 @@
         <w:t>Map a DTC candidate to future UDS responsibilities without assigning a DTC number in the ECU.</w:t>
       </w:r>
     </w:p>
+    <w:p>
+      <w:pPr>
+        <w:pStyle w:val="ListNumber"/>
+        <w:numPr>
+          <w:ilvl w:val="0"/>
+          <w:numId w:val="17"/>
+        </w:numPr>
+      </w:pPr>
+      <w:r>
+        <w:rPr>
+          <w:rFonts w:ascii="Calibri" w:hAnsi="Calibri"/>
+          <w:color w:val="111827"/>
+          <w:sz w:val="22"/>
+        </w:rPr>
+        <w:t>Model battery temperature as a produced BMS signal and consumed thermal-controller signal.</w:t>
+      </w:r>
+    </w:p>
+    <w:p>
+      <w:pPr>
+        <w:pStyle w:val="ListNumber"/>
+        <w:numPr>
+          <w:ilvl w:val="0"/>
+          <w:numId w:val="17"/>
+        </w:numPr>
+      </w:pPr>
+      <w:r>
+        <w:rPr>
+          <w:rFonts w:ascii="Calibri" w:hAnsi="Calibri"/>
+          <w:color w:val="111827"/>
+          <w:sz w:val="22"/>
+        </w:rPr>
+        <w:t>Explain why a gateway route rejects Celsius-to-Kelvin transfer instead of converting silently.</w:t>
+      </w:r>
+    </w:p>
+    <w:p>
+      <w:pPr>
+        <w:pStyle w:val="ListNumber"/>
+        <w:numPr>
+          <w:ilvl w:val="0"/>
+          <w:numId w:val="17"/>
+        </w:numPr>
+      </w:pPr>
+      <w:r>
+        <w:rPr>
+          <w:rFonts w:ascii="Calibri" w:hAnsi="Calibri"/>
+          <w:color w:val="111827"/>
+          <w:sz w:val="22"/>
+        </w:rPr>
+        <w:t>Trace publication and transfer versions through an exact retry and one stale-source conflict.</w:t>
+      </w:r>
+    </w:p>
+    <w:p>
+      <w:pPr>
+        <w:pStyle w:val="ListNumber"/>
+        <w:numPr>
+          <w:ilvl w:val="0"/>
+          <w:numId w:val="17"/>
+        </w:numPr>
+      </w:pPr>
+      <w:r>
+        <w:rPr>
+          <w:rFonts w:ascii="Calibri" w:hAnsi="Calibri"/>
+          <w:color w:val="111827"/>
+          <w:sz w:val="22"/>
+        </w:rPr>
+        <w:t>Design the future Volume IV adapter that maps a semantic signal to a DBC without changing ECU state.</w:t>
+      </w:r>
+    </w:p>
     <w:sectPr>
       <w:headerReference w:type="default" r:id="rId9"/>
       <w:footerReference w:type="default" r:id="rId10"/>
       <w:pgSz w:w="12240" w:h="15840"/>
-      <w:pgMar w:top="1440" w:right="1440" w:bottom="1440" w:left="1440" w:header="708" w:footer="708" w:gutter="0"/>
+      <w:pgMar w:top="1440" w:right="1440" w:bottom="1728" w:left="1440" w:header="708" w:footer="360" w:gutter="0"/>
       <w:cols w:space="720"/>
       <w:titlePg/>
       <w:docGrid w:linePitch="360"/>
@@ -11101,7 +12988,7 @@
         <w:color w:val="667085"/>
         <w:sz w:val="17"/>
       </w:rPr>
-      <w:t>ATEP Volume III Workbook  |  Version 0.5.0</w:t>
+      <w:t>ATEP Volume III Workbook  |  Version 0.6.0</w:t>
     </w:r>
     <w:r>
       <w:rPr>

</xml_diff>

<commit_message>
feat(ecus): add deterministic multi-ecu scenarios
</commit_message>
<xml_diff>
--- a/docs/ATEP_Volume_III_ECU_Simulator_Engineering_Workbook.docx
+++ b/docs/ATEP_Volume_III_ECU_Simulator_Engineering_Workbook.docx
@@ -143,7 +143,7 @@
                 <w:color w:val="0B2545"/>
                 <w:sz w:val="19"/>
               </w:rPr>
-              <w:t>0.6.0</w:t>
+              <w:t>0.7.0</w:t>
             </w:r>
           </w:p>
         </w:tc>
@@ -265,7 +265,7 @@
                 <w:color w:val="111827"/>
                 <w:sz w:val="19"/>
               </w:rPr>
-              <w:t>Living document - Increments III-1 through III-6 implemented</w:t>
+              <w:t>Volume III baseline - Increments III-1 through III-7 implemented</w:t>
             </w:r>
           </w:p>
         </w:tc>
@@ -694,6 +694,25 @@
           <w:color w:val="0B2545"/>
           <w:sz w:val="21"/>
         </w:rPr>
+        <w:t>11.6 III-7 Verification</w:t>
+      </w:r>
+    </w:p>
+    <w:p>
+      <w:pPr>
+        <w:pStyle w:val="ListNumber"/>
+        <w:numPr>
+          <w:ilvl w:val="0"/>
+          <w:numId w:val="10"/>
+        </w:numPr>
+        <w:ind w:left="216" w:firstLine="0"/>
+      </w:pPr>
+      <w:r>
+        <w:rPr>
+          <w:rFonts w:ascii="Calibri" w:hAnsi="Calibri"/>
+          <w:b/>
+          <w:color w:val="0B2545"/>
+          <w:sz w:val="21"/>
+        </w:rPr>
         <w:t>12. Implemented Evidence</w:t>
       </w:r>
     </w:p>
@@ -988,7 +1007,7 @@
                 <w:color w:val="111827"/>
                 <w:sz w:val="17"/>
               </w:rPr>
-              <w:t>Increments III-1 through III-6</w:t>
+              <w:t>Increments III-1 through III-7</w:t>
             </w:r>
           </w:p>
         </w:tc>
@@ -1833,6 +1852,95 @@
                 <w:sz w:val="17"/>
               </w:rPr>
               <w:t>Added typed signal contracts, publication, gateway routes, atomic transfer, migration, APIs, and tests.</w:t>
+            </w:r>
+          </w:p>
+        </w:tc>
+      </w:tr>
+      <w:tr>
+        <w:trPr>
+          <w:cantSplit/>
+        </w:trPr>
+        <w:tc>
+          <w:tcPr>
+            <w:tcW w:type="dxa" w:w="1650"/>
+            <w:tcMar>
+              <w:top w:w="80" w:type="dxa"/>
+              <w:start w:w="120" w:type="dxa"/>
+              <w:bottom w:w="80" w:type="dxa"/>
+              <w:end w:w="120" w:type="dxa"/>
+            </w:tcMar>
+            <w:vAlign w:val="center"/>
+            <w:shd w:fill="FFFFFF"/>
+          </w:tcPr>
+          <w:p>
+            <w:pPr>
+              <w:spacing w:before="0" w:after="40" w:line="252" w:lineRule="auto"/>
+              <w:jc w:val="center"/>
+            </w:pPr>
+            <w:r>
+              <w:rPr>
+                <w:rFonts w:ascii="Calibri" w:hAnsi="Calibri"/>
+                <w:b w:val="0"/>
+                <w:color w:val="111827"/>
+                <w:sz w:val="17"/>
+              </w:rPr>
+              <w:t>0.7.0</w:t>
+            </w:r>
+          </w:p>
+        </w:tc>
+        <w:tc>
+          <w:tcPr>
+            <w:tcW w:type="dxa" w:w="4450"/>
+            <w:tcMar>
+              <w:top w:w="80" w:type="dxa"/>
+              <w:start w:w="120" w:type="dxa"/>
+              <w:bottom w:w="80" w:type="dxa"/>
+              <w:end w:w="120" w:type="dxa"/>
+            </w:tcMar>
+            <w:vAlign w:val="center"/>
+            <w:shd w:fill="FFFFFF"/>
+          </w:tcPr>
+          <w:p>
+            <w:pPr>
+              <w:spacing w:before="0" w:after="40" w:line="252" w:lineRule="auto"/>
+              <w:jc w:val="left"/>
+            </w:pPr>
+            <w:r>
+              <w:rPr>
+                <w:rFonts w:ascii="Calibri" w:hAnsi="Calibri"/>
+                <w:b w:val="0"/>
+                <w:color w:val="111827"/>
+                <w:sz w:val="17"/>
+              </w:rPr>
+              <w:t>2026-08-24</w:t>
+            </w:r>
+          </w:p>
+        </w:tc>
+        <w:tc>
+          <w:tcPr>
+            <w:tcW w:type="dxa" w:w="3260"/>
+            <w:tcMar>
+              <w:top w:w="80" w:type="dxa"/>
+              <w:start w:w="120" w:type="dxa"/>
+              <w:bottom w:w="80" w:type="dxa"/>
+              <w:end w:w="120" w:type="dxa"/>
+            </w:tcMar>
+            <w:vAlign w:val="center"/>
+            <w:shd w:fill="FFFFFF"/>
+          </w:tcPr>
+          <w:p>
+            <w:pPr>
+              <w:spacing w:before="0" w:after="40" w:line="252" w:lineRule="auto"/>
+              <w:jc w:val="left"/>
+            </w:pPr>
+            <w:r>
+              <w:rPr>
+                <w:rFonts w:ascii="Calibri" w:hAnsi="Calibri"/>
+                <w:b w:val="0"/>
+                <w:color w:val="111827"/>
+                <w:sz w:val="17"/>
+              </w:rPr>
+              <w:t>Added persisted multi-ECU scenarios, logical-clock diagnostics, bounded metrics, deterministic failure campaigns, APIs, migration, and tests.</w:t>
             </w:r>
           </w:p>
         </w:tc>
@@ -1946,6 +2054,23 @@
           <w:sz w:val="22"/>
         </w:rPr>
         <w:t>Typed produced/consumed signals, logical-time publication, and gateway-owned routing hooks.</w:t>
+      </w:r>
+    </w:p>
+    <w:p>
+      <w:pPr>
+        <w:pStyle w:val="ListBullet"/>
+        <w:numPr>
+          <w:ilvl w:val="0"/>
+          <w:numId w:val="11"/>
+        </w:numPr>
+      </w:pPr>
+      <w:r>
+        <w:rPr>
+          <w:rFonts w:ascii="Calibri" w:hAnsi="Calibri"/>
+          <w:color w:val="111827"/>
+          <w:sz w:val="22"/>
+        </w:rPr>
+        <w:t>Bounded multi-ECU scenarios, logical-clock diagnostics, aggregate metrics, and repeatable campaigns.</w:t>
       </w:r>
     </w:p>
     <w:p>
@@ -2159,7 +2284,7 @@
           <w:color w:val="111827"/>
           <w:sz w:val="22"/>
         </w:rPr>
-        <w:t>Autonomous sensor-condition evaluation and fault injection campaigns.</w:t>
+        <w:t>Autonomous sensor-condition evaluation and continuous fault-trigger rules.</w:t>
       </w:r>
     </w:p>
     <w:p>
@@ -2206,6 +2331,16 @@
           <w:sz w:val="22"/>
         </w:rPr>
         <w:t>Request flow: authenticated client -&gt; FastAPI router -&gt; RBAC dependency -&gt; ECU domain service -&gt; PostgreSQL aggregate + audit record + transactional outbox event -&gt; HTTP response.</w:t>
+      </w:r>
+    </w:p>
+    <w:p>
+      <w:r>
+        <w:rPr>
+          <w:rFonts w:ascii="Calibri" w:hAnsi="Calibri"/>
+          <w:color w:val="111827"/>
+          <w:sz w:val="22"/>
+        </w:rPr>
+        <w:t>The scenario orchestrator is a vehicle-scoped application service above the ECU primitives. It serializes execution-ID claims with a vehicle row lock and performs all ordered actions in the API transaction. Its diagnostics use ECU logical clocks; host resource sampling and wall-clock timing are not part of simulated truth.</w:t>
       </w:r>
     </w:p>
     <w:p>
@@ -2387,6 +2522,16 @@
       </w:r>
     </w:p>
     <w:p>
+      <w:r>
+        <w:rPr>
+          <w:rFonts w:ascii="Calibri" w:hAnsi="Calibri"/>
+          <w:color w:val="111827"/>
+          <w:sz w:val="22"/>
+        </w:rPr>
+        <w:t>An ECU scenario execution stores a request hash, bounded request, bounded aggregate result, iteration count, actor, and timestamps. One request has 1 to 32 actions, references at most 16 ECUs, repeats at most eight times, and returns at most 256 action summaries. Results include before/after counts and per-ECU clock lag rather than complete memory, signal-value, or fault payloads.</w:t>
+      </w:r>
+    </w:p>
+    <w:p>
       <w:pPr>
         <w:pStyle w:val="Heading1"/>
         <w:keepNext/>
@@ -4557,6 +4702,357 @@
                 <w:sz w:val="16"/>
               </w:rPr>
               <w:t>Transfer a routed value atomically.</w:t>
+            </w:r>
+          </w:p>
+        </w:tc>
+      </w:tr>
+      <w:tr>
+        <w:trPr>
+          <w:cantSplit/>
+        </w:trPr>
+        <w:tc>
+          <w:tcPr>
+            <w:tcW w:type="dxa" w:w="1150"/>
+            <w:tcMar>
+              <w:top w:w="80" w:type="dxa"/>
+              <w:start w:w="120" w:type="dxa"/>
+              <w:bottom w:w="80" w:type="dxa"/>
+              <w:end w:w="120" w:type="dxa"/>
+            </w:tcMar>
+            <w:vAlign w:val="center"/>
+            <w:shd w:fill="FFFFFF"/>
+          </w:tcPr>
+          <w:p>
+            <w:pPr>
+              <w:spacing w:before="0" w:after="40" w:line="252" w:lineRule="auto"/>
+              <w:jc w:val="center"/>
+            </w:pPr>
+            <w:r>
+              <w:rPr>
+                <w:rFonts w:ascii="Calibri" w:hAnsi="Calibri"/>
+                <w:b w:val="0"/>
+                <w:color w:val="111827"/>
+                <w:sz w:val="16"/>
+              </w:rPr>
+              <w:t>POST</w:t>
+            </w:r>
+          </w:p>
+        </w:tc>
+        <w:tc>
+          <w:tcPr>
+            <w:tcW w:type="dxa" w:w="3700"/>
+            <w:tcMar>
+              <w:top w:w="80" w:type="dxa"/>
+              <w:start w:w="120" w:type="dxa"/>
+              <w:bottom w:w="80" w:type="dxa"/>
+              <w:end w:w="120" w:type="dxa"/>
+            </w:tcMar>
+            <w:vAlign w:val="center"/>
+            <w:shd w:fill="FFFFFF"/>
+          </w:tcPr>
+          <w:p>
+            <w:pPr>
+              <w:spacing w:before="0" w:after="40" w:line="252" w:lineRule="auto"/>
+              <w:jc w:val="left"/>
+            </w:pPr>
+            <w:r>
+              <w:rPr>
+                <w:rFonts w:ascii="Calibri" w:hAnsi="Calibri"/>
+                <w:b w:val="0"/>
+                <w:color w:val="111827"/>
+                <w:sz w:val="16"/>
+              </w:rPr>
+              <w:t>/api/v1/vehicles/{vehicle_id}/ecu-scenarios/execute</w:t>
+            </w:r>
+          </w:p>
+        </w:tc>
+        <w:tc>
+          <w:tcPr>
+            <w:tcW w:type="dxa" w:w="3100"/>
+            <w:tcMar>
+              <w:top w:w="80" w:type="dxa"/>
+              <w:start w:w="120" w:type="dxa"/>
+              <w:bottom w:w="80" w:type="dxa"/>
+              <w:end w:w="120" w:type="dxa"/>
+            </w:tcMar>
+            <w:vAlign w:val="center"/>
+            <w:shd w:fill="FFFFFF"/>
+          </w:tcPr>
+          <w:p>
+            <w:pPr>
+              <w:spacing w:before="0" w:after="40" w:line="252" w:lineRule="auto"/>
+              <w:jc w:val="left"/>
+            </w:pPr>
+            <w:r>
+              <w:rPr>
+                <w:rFonts w:ascii="Calibri" w:hAnsi="Calibri"/>
+                <w:b w:val="0"/>
+                <w:color w:val="111827"/>
+                <w:sz w:val="16"/>
+              </w:rPr>
+              <w:t>ecus:manage</w:t>
+            </w:r>
+          </w:p>
+        </w:tc>
+        <w:tc>
+          <w:tcPr>
+            <w:tcW w:type="dxa" w:w="1410"/>
+            <w:tcMar>
+              <w:top w:w="80" w:type="dxa"/>
+              <w:start w:w="120" w:type="dxa"/>
+              <w:bottom w:w="80" w:type="dxa"/>
+              <w:end w:w="120" w:type="dxa"/>
+            </w:tcMar>
+            <w:vAlign w:val="center"/>
+            <w:shd w:fill="FFFFFF"/>
+          </w:tcPr>
+          <w:p>
+            <w:pPr>
+              <w:spacing w:before="0" w:after="40" w:line="252" w:lineRule="auto"/>
+              <w:jc w:val="left"/>
+            </w:pPr>
+            <w:r>
+              <w:rPr>
+                <w:rFonts w:ascii="Calibri" w:hAnsi="Calibri"/>
+                <w:b w:val="0"/>
+                <w:color w:val="111827"/>
+                <w:sz w:val="16"/>
+              </w:rPr>
+              <w:t>Execute a bounded deterministic scenario or campaign.</w:t>
+            </w:r>
+          </w:p>
+        </w:tc>
+      </w:tr>
+      <w:tr>
+        <w:trPr>
+          <w:cantSplit/>
+        </w:trPr>
+        <w:tc>
+          <w:tcPr>
+            <w:tcW w:type="dxa" w:w="1150"/>
+            <w:tcMar>
+              <w:top w:w="80" w:type="dxa"/>
+              <w:start w:w="120" w:type="dxa"/>
+              <w:bottom w:w="80" w:type="dxa"/>
+              <w:end w:w="120" w:type="dxa"/>
+            </w:tcMar>
+            <w:vAlign w:val="center"/>
+            <w:shd w:fill="FFFFFF"/>
+          </w:tcPr>
+          <w:p>
+            <w:pPr>
+              <w:spacing w:before="0" w:after="40" w:line="252" w:lineRule="auto"/>
+              <w:jc w:val="center"/>
+            </w:pPr>
+            <w:r>
+              <w:rPr>
+                <w:rFonts w:ascii="Calibri" w:hAnsi="Calibri"/>
+                <w:b w:val="0"/>
+                <w:color w:val="111827"/>
+                <w:sz w:val="16"/>
+              </w:rPr>
+              <w:t>GET</w:t>
+            </w:r>
+          </w:p>
+        </w:tc>
+        <w:tc>
+          <w:tcPr>
+            <w:tcW w:type="dxa" w:w="3700"/>
+            <w:tcMar>
+              <w:top w:w="80" w:type="dxa"/>
+              <w:start w:w="120" w:type="dxa"/>
+              <w:bottom w:w="80" w:type="dxa"/>
+              <w:end w:w="120" w:type="dxa"/>
+            </w:tcMar>
+            <w:vAlign w:val="center"/>
+            <w:shd w:fill="FFFFFF"/>
+          </w:tcPr>
+          <w:p>
+            <w:pPr>
+              <w:spacing w:before="0" w:after="40" w:line="252" w:lineRule="auto"/>
+              <w:jc w:val="left"/>
+            </w:pPr>
+            <w:r>
+              <w:rPr>
+                <w:rFonts w:ascii="Calibri" w:hAnsi="Calibri"/>
+                <w:b w:val="0"/>
+                <w:color w:val="111827"/>
+                <w:sz w:val="16"/>
+              </w:rPr>
+              <w:t>/api/v1/vehicles/{vehicle_id}/ecu-scenarios</w:t>
+            </w:r>
+          </w:p>
+        </w:tc>
+        <w:tc>
+          <w:tcPr>
+            <w:tcW w:type="dxa" w:w="3100"/>
+            <w:tcMar>
+              <w:top w:w="80" w:type="dxa"/>
+              <w:start w:w="120" w:type="dxa"/>
+              <w:bottom w:w="80" w:type="dxa"/>
+              <w:end w:w="120" w:type="dxa"/>
+            </w:tcMar>
+            <w:vAlign w:val="center"/>
+            <w:shd w:fill="FFFFFF"/>
+          </w:tcPr>
+          <w:p>
+            <w:pPr>
+              <w:spacing w:before="0" w:after="40" w:line="252" w:lineRule="auto"/>
+              <w:jc w:val="left"/>
+            </w:pPr>
+            <w:r>
+              <w:rPr>
+                <w:rFonts w:ascii="Calibri" w:hAnsi="Calibri"/>
+                <w:b w:val="0"/>
+                <w:color w:val="111827"/>
+                <w:sz w:val="16"/>
+              </w:rPr>
+              <w:t>ecus:read</w:t>
+            </w:r>
+          </w:p>
+        </w:tc>
+        <w:tc>
+          <w:tcPr>
+            <w:tcW w:type="dxa" w:w="1410"/>
+            <w:tcMar>
+              <w:top w:w="80" w:type="dxa"/>
+              <w:start w:w="120" w:type="dxa"/>
+              <w:bottom w:w="80" w:type="dxa"/>
+              <w:end w:w="120" w:type="dxa"/>
+            </w:tcMar>
+            <w:vAlign w:val="center"/>
+            <w:shd w:fill="FFFFFF"/>
+          </w:tcPr>
+          <w:p>
+            <w:pPr>
+              <w:spacing w:before="0" w:after="40" w:line="252" w:lineRule="auto"/>
+              <w:jc w:val="left"/>
+            </w:pPr>
+            <w:r>
+              <w:rPr>
+                <w:rFonts w:ascii="Calibri" w:hAnsi="Calibri"/>
+                <w:b w:val="0"/>
+                <w:color w:val="111827"/>
+                <w:sz w:val="16"/>
+              </w:rPr>
+              <w:t>List persisted scenario evidence safely.</w:t>
+            </w:r>
+          </w:p>
+        </w:tc>
+      </w:tr>
+      <w:tr>
+        <w:trPr>
+          <w:cantSplit/>
+        </w:trPr>
+        <w:tc>
+          <w:tcPr>
+            <w:tcW w:type="dxa" w:w="1150"/>
+            <w:tcMar>
+              <w:top w:w="80" w:type="dxa"/>
+              <w:start w:w="120" w:type="dxa"/>
+              <w:bottom w:w="80" w:type="dxa"/>
+              <w:end w:w="120" w:type="dxa"/>
+            </w:tcMar>
+            <w:vAlign w:val="center"/>
+            <w:shd w:fill="FFFFFF"/>
+          </w:tcPr>
+          <w:p>
+            <w:pPr>
+              <w:spacing w:before="0" w:after="40" w:line="252" w:lineRule="auto"/>
+              <w:jc w:val="center"/>
+            </w:pPr>
+            <w:r>
+              <w:rPr>
+                <w:rFonts w:ascii="Calibri" w:hAnsi="Calibri"/>
+                <w:b w:val="0"/>
+                <w:color w:val="111827"/>
+                <w:sz w:val="16"/>
+              </w:rPr>
+              <w:t>GET</w:t>
+            </w:r>
+          </w:p>
+        </w:tc>
+        <w:tc>
+          <w:tcPr>
+            <w:tcW w:type="dxa" w:w="3700"/>
+            <w:tcMar>
+              <w:top w:w="80" w:type="dxa"/>
+              <w:start w:w="120" w:type="dxa"/>
+              <w:bottom w:w="80" w:type="dxa"/>
+              <w:end w:w="120" w:type="dxa"/>
+            </w:tcMar>
+            <w:vAlign w:val="center"/>
+            <w:shd w:fill="FFFFFF"/>
+          </w:tcPr>
+          <w:p>
+            <w:pPr>
+              <w:spacing w:before="0" w:after="40" w:line="252" w:lineRule="auto"/>
+              <w:jc w:val="left"/>
+            </w:pPr>
+            <w:r>
+              <w:rPr>
+                <w:rFonts w:ascii="Calibri" w:hAnsi="Calibri"/>
+                <w:b w:val="0"/>
+                <w:color w:val="111827"/>
+                <w:sz w:val="16"/>
+              </w:rPr>
+              <w:t>/api/v1/vehicles/{vehicle_id}/ecu-scenarios/{execution_id}</w:t>
+            </w:r>
+          </w:p>
+        </w:tc>
+        <w:tc>
+          <w:tcPr>
+            <w:tcW w:type="dxa" w:w="3100"/>
+            <w:tcMar>
+              <w:top w:w="80" w:type="dxa"/>
+              <w:start w:w="120" w:type="dxa"/>
+              <w:bottom w:w="80" w:type="dxa"/>
+              <w:end w:w="120" w:type="dxa"/>
+            </w:tcMar>
+            <w:vAlign w:val="center"/>
+            <w:shd w:fill="FFFFFF"/>
+          </w:tcPr>
+          <w:p>
+            <w:pPr>
+              <w:spacing w:before="0" w:after="40" w:line="252" w:lineRule="auto"/>
+              <w:jc w:val="left"/>
+            </w:pPr>
+            <w:r>
+              <w:rPr>
+                <w:rFonts w:ascii="Calibri" w:hAnsi="Calibri"/>
+                <w:b w:val="0"/>
+                <w:color w:val="111827"/>
+                <w:sz w:val="16"/>
+              </w:rPr>
+              <w:t>ecus:read</w:t>
+            </w:r>
+          </w:p>
+        </w:tc>
+        <w:tc>
+          <w:tcPr>
+            <w:tcW w:type="dxa" w:w="1410"/>
+            <w:tcMar>
+              <w:top w:w="80" w:type="dxa"/>
+              <w:start w:w="120" w:type="dxa"/>
+              <w:bottom w:w="80" w:type="dxa"/>
+              <w:end w:w="120" w:type="dxa"/>
+            </w:tcMar>
+            <w:vAlign w:val="center"/>
+            <w:shd w:fill="FFFFFF"/>
+          </w:tcPr>
+          <w:p>
+            <w:pPr>
+              <w:spacing w:before="0" w:after="40" w:line="252" w:lineRule="auto"/>
+              <w:jc w:val="left"/>
+            </w:pPr>
+            <w:r>
+              <w:rPr>
+                <w:rFonts w:ascii="Calibri" w:hAnsi="Calibri"/>
+                <w:b w:val="0"/>
+                <w:color w:val="111827"/>
+                <w:sz w:val="16"/>
+              </w:rPr>
+              <w:t>Inspect one scenario execution.</w:t>
             </w:r>
           </w:p>
         </w:tc>
@@ -4809,6 +5305,52 @@
     </w:p>
     <w:p>
       <w:pPr>
+        <w:pStyle w:val="Heading2"/>
+        <w:keepNext/>
+        <w:keepLines/>
+      </w:pPr>
+      <w:r>
+        <w:t>8.6 Scenario Orchestration and Timing Diagnostics</w:t>
+      </w:r>
+    </w:p>
+    <w:p>
+      <w:r>
+        <w:rPr>
+          <w:rFonts w:ascii="Calibri" w:hAnsi="Calibri"/>
+          <w:color w:val="111827"/>
+          <w:sz w:val="22"/>
+        </w:rPr>
+        <w:t>Scenario actions call the existing advance, fault, corruption, publication, and transfer services. The orchestrator supplies each primitive's current version and derives a stable command ID from the execution ID, iteration, and action index. Corruption seeds derive from the declared base seed and the same logical coordinates, making a campaign repeatable from an identical initial state.</w:t>
+      </w:r>
+    </w:p>
+    <w:p>
+      <w:r>
+        <w:rPr>
+          <w:rFonts w:ascii="Calibri" w:hAnsi="Calibri"/>
+          <w:color w:val="111827"/>
+          <w:sz w:val="22"/>
+        </w:rPr>
+        <w:t xml:space="preserve">Exact request replay returns persisted evidence without executing actions again; changed reuse of an execution ID fails with </w:t>
+      </w:r>
+      <w:r>
+        <w:rPr>
+          <w:rFonts w:ascii="Consolas" w:hAnsi="Consolas"/>
+          <w:color w:val="1F4D78"/>
+          <w:sz w:val="19"/>
+        </w:rPr>
+        <w:t>ecu_scenario_execution_conflict</w:t>
+      </w:r>
+      <w:r>
+        <w:rPr>
+          <w:rFonts w:ascii="Calibri" w:hAnsi="Calibri"/>
+          <w:color w:val="111827"/>
+          <w:sz w:val="22"/>
+        </w:rPr>
+        <w:t>. Before/after evidence counts ECUs, memory cells, semantic signals, active faults, routes, and aggregate versions. Timing evidence reports the minimum and maximum ECU clocks, skew, synchronization state, and lag for at most 16 ECUs. Aggregate audit and outbox evidence excludes action requests, memory contents, physical values, and fault sets.</w:t>
+      </w:r>
+    </w:p>
+    <w:p>
+      <w:pPr>
         <w:pStyle w:val="Heading1"/>
         <w:keepNext/>
         <w:keepLines/>
@@ -4840,7 +5382,7 @@
           <w:color w:val="111827"/>
           <w:sz w:val="22"/>
         </w:rPr>
-        <w:t>. III-1 covers the aggregate, III-2 covers deterministic execution and reset, III-3 covers versioned profiles, III-4 covers memory regions, snapshots, persistence, and corruption, III-5 covers fault lifecycle and DTC intent, and III-6 covers semantic signal contracts and gateway routing hooks.</w:t>
+        <w:t>. III-1 covers the aggregate, III-2 covers deterministic execution and reset, III-3 covers versioned profiles, III-4 covers memory regions, snapshots, persistence, and corruption, III-5 covers fault lifecycle and DTC intent, and III-6 covers semantic signal contracts and gateway routing hooks. III-7 covers multi-ECU scenarios, logical-clock diagnostics, bounded resource evidence, and deterministic campaigns.</w:t>
       </w:r>
     </w:p>
     <w:p>
@@ -5131,6 +5673,66 @@
     </w:p>
     <w:p>
       <w:pPr>
+        <w:pStyle w:val="Heading2"/>
+        <w:keepNext/>
+        <w:keepLines/>
+      </w:pPr>
+      <w:r>
+        <w:t>ADR-ECU-014 — Orchestrate Existing Commands Instead of Duplicating ECU Behavior</w:t>
+      </w:r>
+    </w:p>
+    <w:p>
+      <w:r>
+        <w:rPr>
+          <w:rFonts w:ascii="Calibri" w:hAnsi="Calibri"/>
+          <w:color w:val="111827"/>
+          <w:sz w:val="22"/>
+        </w:rPr>
+        <w:t>Scenario actions call the already validated ECU primitives and calculate optimistic versions at the point of execution. This keeps fault, memory, timing, and signal invariants in one implementation.</w:t>
+      </w:r>
+    </w:p>
+    <w:p>
+      <w:pPr>
+        <w:pStyle w:val="Heading2"/>
+        <w:keepNext/>
+        <w:keepLines/>
+      </w:pPr>
+      <w:r>
+        <w:t>ADR-ECU-015 — Treat Logical Clocks as Timing Diagnostics</w:t>
+      </w:r>
+    </w:p>
+    <w:p>
+      <w:r>
+        <w:rPr>
+          <w:rFonts w:ascii="Calibri" w:hAnsi="Calibri"/>
+          <w:color w:val="111827"/>
+          <w:sz w:val="22"/>
+        </w:rPr>
+        <w:t>Clock skew and lag come only from ECU simulation clocks. Host CPU/GPU load and wall-clock duration describe the test environment, not vehicle behavior, and therefore never affect scenario results.</w:t>
+      </w:r>
+    </w:p>
+    <w:p>
+      <w:pPr>
+        <w:pStyle w:val="Heading2"/>
+        <w:keepNext/>
+        <w:keepLines/>
+      </w:pPr>
+      <w:r>
+        <w:t>ADR-ECU-016 — Bound and Minimize Campaign Evidence</w:t>
+      </w:r>
+    </w:p>
+    <w:p>
+      <w:r>
+        <w:rPr>
+          <w:rFonts w:ascii="Calibri" w:hAnsi="Calibri"/>
+          <w:color w:val="111827"/>
+          <w:sz w:val="22"/>
+        </w:rPr>
+        <w:t>Iteration, action, and ECU limits cap response and transaction size. Aggregate evidence retains identities, counts, versions, and skew while excluding memory images, physical values, and full faults.</w:t>
+      </w:r>
+    </w:p>
+    <w:p>
+      <w:pPr>
         <w:pStyle w:val="Heading1"/>
         <w:keepNext/>
         <w:keepLines/>
@@ -12048,6 +12650,1379 @@
                 <w:sz w:val="17"/>
               </w:rPr>
               <w:t>Verify no CAN ID, frame, DBC, arbitration, or bitrate type is imported.</w:t>
+            </w:r>
+          </w:p>
+        </w:tc>
+        <w:tc>
+          <w:tcPr>
+            <w:tcW w:type="dxa" w:w="3260"/>
+            <w:tcMar>
+              <w:top w:w="80" w:type="dxa"/>
+              <w:start w:w="120" w:type="dxa"/>
+              <w:bottom w:w="80" w:type="dxa"/>
+              <w:end w:w="120" w:type="dxa"/>
+            </w:tcMar>
+            <w:vAlign w:val="center"/>
+            <w:shd w:fill="FFFFFF"/>
+          </w:tcPr>
+          <w:p>
+            <w:pPr>
+              <w:spacing w:before="0" w:after="40" w:line="252" w:lineRule="auto"/>
+              <w:jc w:val="left"/>
+            </w:pPr>
+            <w:r>
+              <w:rPr>
+                <w:rFonts w:ascii="Calibri" w:hAnsi="Calibri"/>
+                <w:b w:val="0"/>
+                <w:color w:val="111827"/>
+                <w:sz w:val="17"/>
+              </w:rPr>
+              <w:t>Review</w:t>
+            </w:r>
+          </w:p>
+        </w:tc>
+      </w:tr>
+    </w:tbl>
+    <w:p>
+      <w:pPr>
+        <w:spacing w:after="60"/>
+      </w:pPr>
+    </w:p>
+    <w:p>
+      <w:pPr>
+        <w:pStyle w:val="Heading1"/>
+        <w:keepNext/>
+        <w:keepLines/>
+      </w:pPr>
+      <w:r>
+        <w:t>11.6 III-7 Verification</w:t>
+      </w:r>
+    </w:p>
+    <w:tbl>
+      <w:tblPr>
+        <w:tblW w:type="dxa" w:w="9360"/>
+        <w:jc w:val="left"/>
+        <w:tblLayout w:type="fixed"/>
+        <w:tblLook w:firstColumn="1" w:firstRow="1" w:lastColumn="0" w:lastRow="0" w:noHBand="0" w:noVBand="1" w:val="04A0"/>
+        <w:tblInd w:w="120" w:type="dxa"/>
+        <w:tblBorders>
+          <w:top w:val="single" w:sz="6" w:color="B8C4D1"/>
+          <w:left w:val="single" w:sz="6" w:color="B8C4D1"/>
+          <w:bottom w:val="single" w:sz="6" w:color="B8C4D1"/>
+          <w:right w:val="single" w:sz="6" w:color="B8C4D1"/>
+          <w:insideH w:val="single" w:sz="6" w:color="B8C4D1"/>
+          <w:insideV w:val="single" w:sz="6" w:color="B8C4D1"/>
+        </w:tblBorders>
+      </w:tblPr>
+      <w:tblGrid>
+        <w:gridCol w:w="1650"/>
+        <w:gridCol w:w="4450"/>
+        <w:gridCol w:w="3260"/>
+      </w:tblGrid>
+      <w:tr>
+        <w:trPr>
+          <w:tblHeader w:val="true"/>
+          <w:cantSplit/>
+        </w:trPr>
+        <w:tc>
+          <w:tcPr>
+            <w:tcW w:type="dxa" w:w="1650"/>
+            <w:tcMar>
+              <w:top w:w="80" w:type="dxa"/>
+              <w:start w:w="120" w:type="dxa"/>
+              <w:bottom w:w="80" w:type="dxa"/>
+              <w:end w:w="120" w:type="dxa"/>
+            </w:tcMar>
+            <w:vAlign w:val="center"/>
+            <w:shd w:fill="E8EEF5"/>
+          </w:tcPr>
+          <w:p>
+            <w:pPr>
+              <w:spacing w:before="0" w:after="40" w:line="252" w:lineRule="auto"/>
+              <w:jc w:val="center"/>
+            </w:pPr>
+            <w:r>
+              <w:rPr>
+                <w:rFonts w:ascii="Calibri" w:hAnsi="Calibri"/>
+                <w:b/>
+                <w:color w:val="0B2545"/>
+                <w:sz w:val="17"/>
+              </w:rPr>
+              <w:t>Test</w:t>
+            </w:r>
+          </w:p>
+        </w:tc>
+        <w:tc>
+          <w:tcPr>
+            <w:tcW w:type="dxa" w:w="4450"/>
+            <w:tcMar>
+              <w:top w:w="80" w:type="dxa"/>
+              <w:start w:w="120" w:type="dxa"/>
+              <w:bottom w:w="80" w:type="dxa"/>
+              <w:end w:w="120" w:type="dxa"/>
+            </w:tcMar>
+            <w:vAlign w:val="center"/>
+            <w:shd w:fill="E8EEF5"/>
+          </w:tcPr>
+          <w:p>
+            <w:pPr>
+              <w:spacing w:before="0" w:after="40" w:line="252" w:lineRule="auto"/>
+              <w:jc w:val="left"/>
+            </w:pPr>
+            <w:r>
+              <w:rPr>
+                <w:rFonts w:ascii="Calibri" w:hAnsi="Calibri"/>
+                <w:b/>
+                <w:color w:val="0B2545"/>
+                <w:sz w:val="17"/>
+              </w:rPr>
+              <w:t>Objective</w:t>
+            </w:r>
+          </w:p>
+        </w:tc>
+        <w:tc>
+          <w:tcPr>
+            <w:tcW w:type="dxa" w:w="3260"/>
+            <w:tcMar>
+              <w:top w:w="80" w:type="dxa"/>
+              <w:start w:w="120" w:type="dxa"/>
+              <w:bottom w:w="80" w:type="dxa"/>
+              <w:end w:w="120" w:type="dxa"/>
+            </w:tcMar>
+            <w:vAlign w:val="center"/>
+            <w:shd w:fill="E8EEF5"/>
+          </w:tcPr>
+          <w:p>
+            <w:pPr>
+              <w:spacing w:before="0" w:after="40" w:line="252" w:lineRule="auto"/>
+              <w:jc w:val="left"/>
+            </w:pPr>
+            <w:r>
+              <w:rPr>
+                <w:rFonts w:ascii="Calibri" w:hAnsi="Calibri"/>
+                <w:b/>
+                <w:color w:val="0B2545"/>
+                <w:sz w:val="17"/>
+              </w:rPr>
+              <w:t>Level</w:t>
+            </w:r>
+          </w:p>
+        </w:tc>
+      </w:tr>
+      <w:tr>
+        <w:trPr>
+          <w:cantSplit/>
+        </w:trPr>
+        <w:tc>
+          <w:tcPr>
+            <w:tcW w:type="dxa" w:w="1650"/>
+            <w:tcMar>
+              <w:top w:w="80" w:type="dxa"/>
+              <w:start w:w="120" w:type="dxa"/>
+              <w:bottom w:w="80" w:type="dxa"/>
+              <w:end w:w="120" w:type="dxa"/>
+            </w:tcMar>
+            <w:vAlign w:val="center"/>
+            <w:shd w:fill="FFFFFF"/>
+          </w:tcPr>
+          <w:p>
+            <w:pPr>
+              <w:spacing w:before="0" w:after="40" w:line="252" w:lineRule="auto"/>
+              <w:jc w:val="center"/>
+            </w:pPr>
+            <w:r>
+              <w:rPr>
+                <w:rFonts w:ascii="Calibri" w:hAnsi="Calibri"/>
+                <w:b w:val="0"/>
+                <w:color w:val="111827"/>
+                <w:sz w:val="17"/>
+              </w:rPr>
+              <w:t>Action contract</w:t>
+            </w:r>
+          </w:p>
+        </w:tc>
+        <w:tc>
+          <w:tcPr>
+            <w:tcW w:type="dxa" w:w="4450"/>
+            <w:tcMar>
+              <w:top w:w="80" w:type="dxa"/>
+              <w:start w:w="120" w:type="dxa"/>
+              <w:bottom w:w="80" w:type="dxa"/>
+              <w:end w:w="120" w:type="dxa"/>
+            </w:tcMar>
+            <w:vAlign w:val="center"/>
+            <w:shd w:fill="FFFFFF"/>
+          </w:tcPr>
+          <w:p>
+            <w:pPr>
+              <w:spacing w:before="0" w:after="40" w:line="252" w:lineRule="auto"/>
+              <w:jc w:val="left"/>
+            </w:pPr>
+            <w:r>
+              <w:rPr>
+                <w:rFonts w:ascii="Calibri" w:hAnsi="Calibri"/>
+                <w:b w:val="0"/>
+                <w:color w:val="111827"/>
+                <w:sz w:val="17"/>
+              </w:rPr>
+              <w:t>Require kind-specific fields and reject the 33rd action.</w:t>
+            </w:r>
+          </w:p>
+        </w:tc>
+        <w:tc>
+          <w:tcPr>
+            <w:tcW w:type="dxa" w:w="3260"/>
+            <w:tcMar>
+              <w:top w:w="80" w:type="dxa"/>
+              <w:start w:w="120" w:type="dxa"/>
+              <w:bottom w:w="80" w:type="dxa"/>
+              <w:end w:w="120" w:type="dxa"/>
+            </w:tcMar>
+            <w:vAlign w:val="center"/>
+            <w:shd w:fill="FFFFFF"/>
+          </w:tcPr>
+          <w:p>
+            <w:pPr>
+              <w:spacing w:before="0" w:after="40" w:line="252" w:lineRule="auto"/>
+              <w:jc w:val="left"/>
+            </w:pPr>
+            <w:r>
+              <w:rPr>
+                <w:rFonts w:ascii="Calibri" w:hAnsi="Calibri"/>
+                <w:b w:val="0"/>
+                <w:color w:val="111827"/>
+                <w:sz w:val="17"/>
+              </w:rPr>
+              <w:t>Schema</w:t>
+            </w:r>
+          </w:p>
+        </w:tc>
+      </w:tr>
+      <w:tr>
+        <w:trPr>
+          <w:cantSplit/>
+        </w:trPr>
+        <w:tc>
+          <w:tcPr>
+            <w:tcW w:type="dxa" w:w="1650"/>
+            <w:tcMar>
+              <w:top w:w="80" w:type="dxa"/>
+              <w:start w:w="120" w:type="dxa"/>
+              <w:bottom w:w="80" w:type="dxa"/>
+              <w:end w:w="120" w:type="dxa"/>
+            </w:tcMar>
+            <w:vAlign w:val="center"/>
+            <w:shd w:fill="FFFFFF"/>
+          </w:tcPr>
+          <w:p>
+            <w:pPr>
+              <w:spacing w:before="0" w:after="40" w:line="252" w:lineRule="auto"/>
+              <w:jc w:val="center"/>
+            </w:pPr>
+            <w:r>
+              <w:rPr>
+                <w:rFonts w:ascii="Calibri" w:hAnsi="Calibri"/>
+                <w:b w:val="0"/>
+                <w:color w:val="111827"/>
+                <w:sz w:val="17"/>
+              </w:rPr>
+              <w:t>ECU scope</w:t>
+            </w:r>
+          </w:p>
+        </w:tc>
+        <w:tc>
+          <w:tcPr>
+            <w:tcW w:type="dxa" w:w="4450"/>
+            <w:tcMar>
+              <w:top w:w="80" w:type="dxa"/>
+              <w:start w:w="120" w:type="dxa"/>
+              <w:bottom w:w="80" w:type="dxa"/>
+              <w:end w:w="120" w:type="dxa"/>
+            </w:tcMar>
+            <w:vAlign w:val="center"/>
+            <w:shd w:fill="FFFFFF"/>
+          </w:tcPr>
+          <w:p>
+            <w:pPr>
+              <w:spacing w:before="0" w:after="40" w:line="252" w:lineRule="auto"/>
+              <w:jc w:val="left"/>
+            </w:pPr>
+            <w:r>
+              <w:rPr>
+                <w:rFonts w:ascii="Calibri" w:hAnsi="Calibri"/>
+                <w:b w:val="0"/>
+                <w:color w:val="111827"/>
+                <w:sz w:val="17"/>
+              </w:rPr>
+              <w:t>Reject a scenario referencing more than 16 ECUs.</w:t>
+            </w:r>
+          </w:p>
+        </w:tc>
+        <w:tc>
+          <w:tcPr>
+            <w:tcW w:type="dxa" w:w="3260"/>
+            <w:tcMar>
+              <w:top w:w="80" w:type="dxa"/>
+              <w:start w:w="120" w:type="dxa"/>
+              <w:bottom w:w="80" w:type="dxa"/>
+              <w:end w:w="120" w:type="dxa"/>
+            </w:tcMar>
+            <w:vAlign w:val="center"/>
+            <w:shd w:fill="FFFFFF"/>
+          </w:tcPr>
+          <w:p>
+            <w:pPr>
+              <w:spacing w:before="0" w:after="40" w:line="252" w:lineRule="auto"/>
+              <w:jc w:val="left"/>
+            </w:pPr>
+            <w:r>
+              <w:rPr>
+                <w:rFonts w:ascii="Calibri" w:hAnsi="Calibri"/>
+                <w:b w:val="0"/>
+                <w:color w:val="111827"/>
+                <w:sz w:val="17"/>
+              </w:rPr>
+              <w:t>Schema</w:t>
+            </w:r>
+          </w:p>
+        </w:tc>
+      </w:tr>
+      <w:tr>
+        <w:trPr>
+          <w:cantSplit/>
+        </w:trPr>
+        <w:tc>
+          <w:tcPr>
+            <w:tcW w:type="dxa" w:w="1650"/>
+            <w:tcMar>
+              <w:top w:w="80" w:type="dxa"/>
+              <w:start w:w="120" w:type="dxa"/>
+              <w:bottom w:w="80" w:type="dxa"/>
+              <w:end w:w="120" w:type="dxa"/>
+            </w:tcMar>
+            <w:vAlign w:val="center"/>
+            <w:shd w:fill="FFFFFF"/>
+          </w:tcPr>
+          <w:p>
+            <w:pPr>
+              <w:spacing w:before="0" w:after="40" w:line="252" w:lineRule="auto"/>
+              <w:jc w:val="center"/>
+            </w:pPr>
+            <w:r>
+              <w:rPr>
+                <w:rFonts w:ascii="Calibri" w:hAnsi="Calibri"/>
+                <w:b w:val="0"/>
+                <w:color w:val="111827"/>
+                <w:sz w:val="17"/>
+              </w:rPr>
+              <w:t>Campaign bound</w:t>
+            </w:r>
+          </w:p>
+        </w:tc>
+        <w:tc>
+          <w:tcPr>
+            <w:tcW w:type="dxa" w:w="4450"/>
+            <w:tcMar>
+              <w:top w:w="80" w:type="dxa"/>
+              <w:start w:w="120" w:type="dxa"/>
+              <w:bottom w:w="80" w:type="dxa"/>
+              <w:end w:w="120" w:type="dxa"/>
+            </w:tcMar>
+            <w:vAlign w:val="center"/>
+            <w:shd w:fill="FFFFFF"/>
+          </w:tcPr>
+          <w:p>
+            <w:pPr>
+              <w:spacing w:before="0" w:after="40" w:line="252" w:lineRule="auto"/>
+              <w:jc w:val="left"/>
+            </w:pPr>
+            <w:r>
+              <w:rPr>
+                <w:rFonts w:ascii="Calibri" w:hAnsi="Calibri"/>
+                <w:b w:val="0"/>
+                <w:color w:val="111827"/>
+                <w:sz w:val="17"/>
+              </w:rPr>
+              <w:t>Reject the ninth iteration and cap results at 256 summaries.</w:t>
+            </w:r>
+          </w:p>
+        </w:tc>
+        <w:tc>
+          <w:tcPr>
+            <w:tcW w:type="dxa" w:w="3260"/>
+            <w:tcMar>
+              <w:top w:w="80" w:type="dxa"/>
+              <w:start w:w="120" w:type="dxa"/>
+              <w:bottom w:w="80" w:type="dxa"/>
+              <w:end w:w="120" w:type="dxa"/>
+            </w:tcMar>
+            <w:vAlign w:val="center"/>
+            <w:shd w:fill="FFFFFF"/>
+          </w:tcPr>
+          <w:p>
+            <w:pPr>
+              <w:spacing w:before="0" w:after="40" w:line="252" w:lineRule="auto"/>
+              <w:jc w:val="left"/>
+            </w:pPr>
+            <w:r>
+              <w:rPr>
+                <w:rFonts w:ascii="Calibri" w:hAnsi="Calibri"/>
+                <w:b w:val="0"/>
+                <w:color w:val="111827"/>
+                <w:sz w:val="17"/>
+              </w:rPr>
+              <w:t>Schema</w:t>
+            </w:r>
+          </w:p>
+        </w:tc>
+      </w:tr>
+      <w:tr>
+        <w:trPr>
+          <w:cantSplit/>
+        </w:trPr>
+        <w:tc>
+          <w:tcPr>
+            <w:tcW w:type="dxa" w:w="1650"/>
+            <w:tcMar>
+              <w:top w:w="80" w:type="dxa"/>
+              <w:start w:w="120" w:type="dxa"/>
+              <w:bottom w:w="80" w:type="dxa"/>
+              <w:end w:w="120" w:type="dxa"/>
+            </w:tcMar>
+            <w:vAlign w:val="center"/>
+            <w:shd w:fill="FFFFFF"/>
+          </w:tcPr>
+          <w:p>
+            <w:pPr>
+              <w:spacing w:before="0" w:after="40" w:line="252" w:lineRule="auto"/>
+              <w:jc w:val="center"/>
+            </w:pPr>
+            <w:r>
+              <w:rPr>
+                <w:rFonts w:ascii="Calibri" w:hAnsi="Calibri"/>
+                <w:b w:val="0"/>
+                <w:color w:val="111827"/>
+                <w:sz w:val="17"/>
+              </w:rPr>
+              <w:t>Ordered orchestration</w:t>
+            </w:r>
+          </w:p>
+        </w:tc>
+        <w:tc>
+          <w:tcPr>
+            <w:tcW w:type="dxa" w:w="4450"/>
+            <w:tcMar>
+              <w:top w:w="80" w:type="dxa"/>
+              <w:start w:w="120" w:type="dxa"/>
+              <w:bottom w:w="80" w:type="dxa"/>
+              <w:end w:w="120" w:type="dxa"/>
+            </w:tcMar>
+            <w:vAlign w:val="center"/>
+            <w:shd w:fill="FFFFFF"/>
+          </w:tcPr>
+          <w:p>
+            <w:pPr>
+              <w:spacing w:before="0" w:after="40" w:line="252" w:lineRule="auto"/>
+              <w:jc w:val="left"/>
+            </w:pPr>
+            <w:r>
+              <w:rPr>
+                <w:rFonts w:ascii="Calibri" w:hAnsi="Calibri"/>
+                <w:b w:val="0"/>
+                <w:color w:val="111827"/>
+                <w:sz w:val="17"/>
+              </w:rPr>
+              <w:t>Execute existing ECU commands in declared iteration/action order.</w:t>
+            </w:r>
+          </w:p>
+        </w:tc>
+        <w:tc>
+          <w:tcPr>
+            <w:tcW w:type="dxa" w:w="3260"/>
+            <w:tcMar>
+              <w:top w:w="80" w:type="dxa"/>
+              <w:start w:w="120" w:type="dxa"/>
+              <w:bottom w:w="80" w:type="dxa"/>
+              <w:end w:w="120" w:type="dxa"/>
+            </w:tcMar>
+            <w:vAlign w:val="center"/>
+            <w:shd w:fill="FFFFFF"/>
+          </w:tcPr>
+          <w:p>
+            <w:pPr>
+              <w:spacing w:before="0" w:after="40" w:line="252" w:lineRule="auto"/>
+              <w:jc w:val="left"/>
+            </w:pPr>
+            <w:r>
+              <w:rPr>
+                <w:rFonts w:ascii="Calibri" w:hAnsi="Calibri"/>
+                <w:b w:val="0"/>
+                <w:color w:val="111827"/>
+                <w:sz w:val="17"/>
+              </w:rPr>
+              <w:t>Service</w:t>
+            </w:r>
+          </w:p>
+        </w:tc>
+      </w:tr>
+      <w:tr>
+        <w:trPr>
+          <w:cantSplit/>
+        </w:trPr>
+        <w:tc>
+          <w:tcPr>
+            <w:tcW w:type="dxa" w:w="1650"/>
+            <w:tcMar>
+              <w:top w:w="80" w:type="dxa"/>
+              <w:start w:w="120" w:type="dxa"/>
+              <w:bottom w:w="80" w:type="dxa"/>
+              <w:end w:w="120" w:type="dxa"/>
+            </w:tcMar>
+            <w:vAlign w:val="center"/>
+            <w:shd w:fill="FFFFFF"/>
+          </w:tcPr>
+          <w:p>
+            <w:pPr>
+              <w:spacing w:before="0" w:after="40" w:line="252" w:lineRule="auto"/>
+              <w:jc w:val="center"/>
+            </w:pPr>
+            <w:r>
+              <w:rPr>
+                <w:rFonts w:ascii="Calibri" w:hAnsi="Calibri"/>
+                <w:b w:val="0"/>
+                <w:color w:val="111827"/>
+                <w:sz w:val="17"/>
+              </w:rPr>
+              <w:t>Deterministic seed</w:t>
+            </w:r>
+          </w:p>
+        </w:tc>
+        <w:tc>
+          <w:tcPr>
+            <w:tcW w:type="dxa" w:w="4450"/>
+            <w:tcMar>
+              <w:top w:w="80" w:type="dxa"/>
+              <w:start w:w="120" w:type="dxa"/>
+              <w:bottom w:w="80" w:type="dxa"/>
+              <w:end w:w="120" w:type="dxa"/>
+            </w:tcMar>
+            <w:vAlign w:val="center"/>
+            <w:shd w:fill="FFFFFF"/>
+          </w:tcPr>
+          <w:p>
+            <w:pPr>
+              <w:spacing w:before="0" w:after="40" w:line="252" w:lineRule="auto"/>
+              <w:jc w:val="left"/>
+            </w:pPr>
+            <w:r>
+              <w:rPr>
+                <w:rFonts w:ascii="Calibri" w:hAnsi="Calibri"/>
+                <w:b w:val="0"/>
+                <w:color w:val="111827"/>
+                <w:sz w:val="17"/>
+              </w:rPr>
+              <w:t>Derive the same corruption seed and command identity from the same coordinates.</w:t>
+            </w:r>
+          </w:p>
+        </w:tc>
+        <w:tc>
+          <w:tcPr>
+            <w:tcW w:type="dxa" w:w="3260"/>
+            <w:tcMar>
+              <w:top w:w="80" w:type="dxa"/>
+              <w:start w:w="120" w:type="dxa"/>
+              <w:bottom w:w="80" w:type="dxa"/>
+              <w:end w:w="120" w:type="dxa"/>
+            </w:tcMar>
+            <w:vAlign w:val="center"/>
+            <w:shd w:fill="FFFFFF"/>
+          </w:tcPr>
+          <w:p>
+            <w:pPr>
+              <w:spacing w:before="0" w:after="40" w:line="252" w:lineRule="auto"/>
+              <w:jc w:val="left"/>
+            </w:pPr>
+            <w:r>
+              <w:rPr>
+                <w:rFonts w:ascii="Calibri" w:hAnsi="Calibri"/>
+                <w:b w:val="0"/>
+                <w:color w:val="111827"/>
+                <w:sz w:val="17"/>
+              </w:rPr>
+              <w:t>Unit/service</w:t>
+            </w:r>
+          </w:p>
+        </w:tc>
+      </w:tr>
+      <w:tr>
+        <w:trPr>
+          <w:cantSplit/>
+        </w:trPr>
+        <w:tc>
+          <w:tcPr>
+            <w:tcW w:type="dxa" w:w="1650"/>
+            <w:tcMar>
+              <w:top w:w="80" w:type="dxa"/>
+              <w:start w:w="120" w:type="dxa"/>
+              <w:bottom w:w="80" w:type="dxa"/>
+              <w:end w:w="120" w:type="dxa"/>
+            </w:tcMar>
+            <w:vAlign w:val="center"/>
+            <w:shd w:fill="FFFFFF"/>
+          </w:tcPr>
+          <w:p>
+            <w:pPr>
+              <w:spacing w:before="0" w:after="40" w:line="252" w:lineRule="auto"/>
+              <w:jc w:val="center"/>
+            </w:pPr>
+            <w:r>
+              <w:rPr>
+                <w:rFonts w:ascii="Calibri" w:hAnsi="Calibri"/>
+                <w:b w:val="0"/>
+                <w:color w:val="111827"/>
+                <w:sz w:val="17"/>
+              </w:rPr>
+              <w:t>Timing diagnostic</w:t>
+            </w:r>
+          </w:p>
+        </w:tc>
+        <w:tc>
+          <w:tcPr>
+            <w:tcW w:type="dxa" w:w="4450"/>
+            <w:tcMar>
+              <w:top w:w="80" w:type="dxa"/>
+              <w:start w:w="120" w:type="dxa"/>
+              <w:bottom w:w="80" w:type="dxa"/>
+              <w:end w:w="120" w:type="dxa"/>
+            </w:tcMar>
+            <w:vAlign w:val="center"/>
+            <w:shd w:fill="FFFFFF"/>
+          </w:tcPr>
+          <w:p>
+            <w:pPr>
+              <w:spacing w:before="0" w:after="40" w:line="252" w:lineRule="auto"/>
+              <w:jc w:val="left"/>
+            </w:pPr>
+            <w:r>
+              <w:rPr>
+                <w:rFonts w:ascii="Calibri" w:hAnsi="Calibri"/>
+                <w:b w:val="0"/>
+                <w:color w:val="111827"/>
+                <w:sz w:val="17"/>
+              </w:rPr>
+              <w:t>Report logical minimum, maximum, skew, synchronization, and lag.</w:t>
+            </w:r>
+          </w:p>
+        </w:tc>
+        <w:tc>
+          <w:tcPr>
+            <w:tcW w:type="dxa" w:w="3260"/>
+            <w:tcMar>
+              <w:top w:w="80" w:type="dxa"/>
+              <w:start w:w="120" w:type="dxa"/>
+              <w:bottom w:w="80" w:type="dxa"/>
+              <w:end w:w="120" w:type="dxa"/>
+            </w:tcMar>
+            <w:vAlign w:val="center"/>
+            <w:shd w:fill="FFFFFF"/>
+          </w:tcPr>
+          <w:p>
+            <w:pPr>
+              <w:spacing w:before="0" w:after="40" w:line="252" w:lineRule="auto"/>
+              <w:jc w:val="left"/>
+            </w:pPr>
+            <w:r>
+              <w:rPr>
+                <w:rFonts w:ascii="Calibri" w:hAnsi="Calibri"/>
+                <w:b w:val="0"/>
+                <w:color w:val="111827"/>
+                <w:sz w:val="17"/>
+              </w:rPr>
+              <w:t>Service</w:t>
+            </w:r>
+          </w:p>
+        </w:tc>
+      </w:tr>
+      <w:tr>
+        <w:trPr>
+          <w:cantSplit/>
+        </w:trPr>
+        <w:tc>
+          <w:tcPr>
+            <w:tcW w:type="dxa" w:w="1650"/>
+            <w:tcMar>
+              <w:top w:w="80" w:type="dxa"/>
+              <w:start w:w="120" w:type="dxa"/>
+              <w:bottom w:w="80" w:type="dxa"/>
+              <w:end w:w="120" w:type="dxa"/>
+            </w:tcMar>
+            <w:vAlign w:val="center"/>
+            <w:shd w:fill="FFFFFF"/>
+          </w:tcPr>
+          <w:p>
+            <w:pPr>
+              <w:spacing w:before="0" w:after="40" w:line="252" w:lineRule="auto"/>
+              <w:jc w:val="center"/>
+            </w:pPr>
+            <w:r>
+              <w:rPr>
+                <w:rFonts w:ascii="Calibri" w:hAnsi="Calibri"/>
+                <w:b w:val="0"/>
+                <w:color w:val="111827"/>
+                <w:sz w:val="17"/>
+              </w:rPr>
+              <w:t>Resource evidence</w:t>
+            </w:r>
+          </w:p>
+        </w:tc>
+        <w:tc>
+          <w:tcPr>
+            <w:tcW w:type="dxa" w:w="4450"/>
+            <w:tcMar>
+              <w:top w:w="80" w:type="dxa"/>
+              <w:start w:w="120" w:type="dxa"/>
+              <w:bottom w:w="80" w:type="dxa"/>
+              <w:end w:w="120" w:type="dxa"/>
+            </w:tcMar>
+            <w:vAlign w:val="center"/>
+            <w:shd w:fill="FFFFFF"/>
+          </w:tcPr>
+          <w:p>
+            <w:pPr>
+              <w:spacing w:before="0" w:after="40" w:line="252" w:lineRule="auto"/>
+              <w:jc w:val="left"/>
+            </w:pPr>
+            <w:r>
+              <w:rPr>
+                <w:rFonts w:ascii="Calibri" w:hAnsi="Calibri"/>
+                <w:b w:val="0"/>
+                <w:color w:val="111827"/>
+                <w:sz w:val="17"/>
+              </w:rPr>
+              <w:t>Compare bounded before/after aggregate counts without host sampling.</w:t>
+            </w:r>
+          </w:p>
+        </w:tc>
+        <w:tc>
+          <w:tcPr>
+            <w:tcW w:type="dxa" w:w="3260"/>
+            <w:tcMar>
+              <w:top w:w="80" w:type="dxa"/>
+              <w:start w:w="120" w:type="dxa"/>
+              <w:bottom w:w="80" w:type="dxa"/>
+              <w:end w:w="120" w:type="dxa"/>
+            </w:tcMar>
+            <w:vAlign w:val="center"/>
+            <w:shd w:fill="FFFFFF"/>
+          </w:tcPr>
+          <w:p>
+            <w:pPr>
+              <w:spacing w:before="0" w:after="40" w:line="252" w:lineRule="auto"/>
+              <w:jc w:val="left"/>
+            </w:pPr>
+            <w:r>
+              <w:rPr>
+                <w:rFonts w:ascii="Calibri" w:hAnsi="Calibri"/>
+                <w:b w:val="0"/>
+                <w:color w:val="111827"/>
+                <w:sz w:val="17"/>
+              </w:rPr>
+              <w:t>Service</w:t>
+            </w:r>
+          </w:p>
+        </w:tc>
+      </w:tr>
+      <w:tr>
+        <w:trPr>
+          <w:cantSplit/>
+        </w:trPr>
+        <w:tc>
+          <w:tcPr>
+            <w:tcW w:type="dxa" w:w="1650"/>
+            <w:tcMar>
+              <w:top w:w="80" w:type="dxa"/>
+              <w:start w:w="120" w:type="dxa"/>
+              <w:bottom w:w="80" w:type="dxa"/>
+              <w:end w:w="120" w:type="dxa"/>
+            </w:tcMar>
+            <w:vAlign w:val="center"/>
+            <w:shd w:fill="FFFFFF"/>
+          </w:tcPr>
+          <w:p>
+            <w:pPr>
+              <w:spacing w:before="0" w:after="40" w:line="252" w:lineRule="auto"/>
+              <w:jc w:val="center"/>
+            </w:pPr>
+            <w:r>
+              <w:rPr>
+                <w:rFonts w:ascii="Calibri" w:hAnsi="Calibri"/>
+                <w:b w:val="0"/>
+                <w:color w:val="111827"/>
+                <w:sz w:val="17"/>
+              </w:rPr>
+              <w:t>Exact replay</w:t>
+            </w:r>
+          </w:p>
+        </w:tc>
+        <w:tc>
+          <w:tcPr>
+            <w:tcW w:type="dxa" w:w="4450"/>
+            <w:tcMar>
+              <w:top w:w="80" w:type="dxa"/>
+              <w:start w:w="120" w:type="dxa"/>
+              <w:bottom w:w="80" w:type="dxa"/>
+              <w:end w:w="120" w:type="dxa"/>
+            </w:tcMar>
+            <w:vAlign w:val="center"/>
+            <w:shd w:fill="FFFFFF"/>
+          </w:tcPr>
+          <w:p>
+            <w:pPr>
+              <w:spacing w:before="0" w:after="40" w:line="252" w:lineRule="auto"/>
+              <w:jc w:val="left"/>
+            </w:pPr>
+            <w:r>
+              <w:rPr>
+                <w:rFonts w:ascii="Calibri" w:hAnsi="Calibri"/>
+                <w:b w:val="0"/>
+                <w:color w:val="111827"/>
+                <w:sz w:val="17"/>
+              </w:rPr>
+              <w:t>Return persisted evidence without applying actions twice.</w:t>
+            </w:r>
+          </w:p>
+        </w:tc>
+        <w:tc>
+          <w:tcPr>
+            <w:tcW w:type="dxa" w:w="3260"/>
+            <w:tcMar>
+              <w:top w:w="80" w:type="dxa"/>
+              <w:start w:w="120" w:type="dxa"/>
+              <w:bottom w:w="80" w:type="dxa"/>
+              <w:end w:w="120" w:type="dxa"/>
+            </w:tcMar>
+            <w:vAlign w:val="center"/>
+            <w:shd w:fill="FFFFFF"/>
+          </w:tcPr>
+          <w:p>
+            <w:pPr>
+              <w:spacing w:before="0" w:after="40" w:line="252" w:lineRule="auto"/>
+              <w:jc w:val="left"/>
+            </w:pPr>
+            <w:r>
+              <w:rPr>
+                <w:rFonts w:ascii="Calibri" w:hAnsi="Calibri"/>
+                <w:b w:val="0"/>
+                <w:color w:val="111827"/>
+                <w:sz w:val="17"/>
+              </w:rPr>
+              <w:t>Service/API</w:t>
+            </w:r>
+          </w:p>
+        </w:tc>
+      </w:tr>
+      <w:tr>
+        <w:trPr>
+          <w:cantSplit/>
+        </w:trPr>
+        <w:tc>
+          <w:tcPr>
+            <w:tcW w:type="dxa" w:w="1650"/>
+            <w:tcMar>
+              <w:top w:w="80" w:type="dxa"/>
+              <w:start w:w="120" w:type="dxa"/>
+              <w:bottom w:w="80" w:type="dxa"/>
+              <w:end w:w="120" w:type="dxa"/>
+            </w:tcMar>
+            <w:vAlign w:val="center"/>
+            <w:shd w:fill="FFFFFF"/>
+          </w:tcPr>
+          <w:p>
+            <w:pPr>
+              <w:spacing w:before="0" w:after="40" w:line="252" w:lineRule="auto"/>
+              <w:jc w:val="center"/>
+            </w:pPr>
+            <w:r>
+              <w:rPr>
+                <w:rFonts w:ascii="Calibri" w:hAnsi="Calibri"/>
+                <w:b w:val="0"/>
+                <w:color w:val="111827"/>
+                <w:sz w:val="17"/>
+              </w:rPr>
+              <w:t>Execution-ID conflict</w:t>
+            </w:r>
+          </w:p>
+        </w:tc>
+        <w:tc>
+          <w:tcPr>
+            <w:tcW w:type="dxa" w:w="4450"/>
+            <w:tcMar>
+              <w:top w:w="80" w:type="dxa"/>
+              <w:start w:w="120" w:type="dxa"/>
+              <w:bottom w:w="80" w:type="dxa"/>
+              <w:end w:w="120" w:type="dxa"/>
+            </w:tcMar>
+            <w:vAlign w:val="center"/>
+            <w:shd w:fill="FFFFFF"/>
+          </w:tcPr>
+          <w:p>
+            <w:pPr>
+              <w:spacing w:before="0" w:after="40" w:line="252" w:lineRule="auto"/>
+              <w:jc w:val="left"/>
+            </w:pPr>
+            <w:r>
+              <w:rPr>
+                <w:rFonts w:ascii="Calibri" w:hAnsi="Calibri"/>
+                <w:b w:val="0"/>
+                <w:color w:val="111827"/>
+                <w:sz w:val="17"/>
+              </w:rPr>
+              <w:t>Return one stable conflict for a changed request.</w:t>
+            </w:r>
+          </w:p>
+        </w:tc>
+        <w:tc>
+          <w:tcPr>
+            <w:tcW w:type="dxa" w:w="3260"/>
+            <w:tcMar>
+              <w:top w:w="80" w:type="dxa"/>
+              <w:start w:w="120" w:type="dxa"/>
+              <w:bottom w:w="80" w:type="dxa"/>
+              <w:end w:w="120" w:type="dxa"/>
+            </w:tcMar>
+            <w:vAlign w:val="center"/>
+            <w:shd w:fill="FFFFFF"/>
+          </w:tcPr>
+          <w:p>
+            <w:pPr>
+              <w:spacing w:before="0" w:after="40" w:line="252" w:lineRule="auto"/>
+              <w:jc w:val="left"/>
+            </w:pPr>
+            <w:r>
+              <w:rPr>
+                <w:rFonts w:ascii="Calibri" w:hAnsi="Calibri"/>
+                <w:b w:val="0"/>
+                <w:color w:val="111827"/>
+                <w:sz w:val="17"/>
+              </w:rPr>
+              <w:t>Service/API</w:t>
+            </w:r>
+          </w:p>
+        </w:tc>
+      </w:tr>
+      <w:tr>
+        <w:trPr>
+          <w:cantSplit/>
+        </w:trPr>
+        <w:tc>
+          <w:tcPr>
+            <w:tcW w:type="dxa" w:w="1650"/>
+            <w:tcMar>
+              <w:top w:w="80" w:type="dxa"/>
+              <w:start w:w="120" w:type="dxa"/>
+              <w:bottom w:w="80" w:type="dxa"/>
+              <w:end w:w="120" w:type="dxa"/>
+            </w:tcMar>
+            <w:vAlign w:val="center"/>
+            <w:shd w:fill="FFFFFF"/>
+          </w:tcPr>
+          <w:p>
+            <w:pPr>
+              <w:spacing w:before="0" w:after="40" w:line="252" w:lineRule="auto"/>
+              <w:jc w:val="center"/>
+            </w:pPr>
+            <w:r>
+              <w:rPr>
+                <w:rFonts w:ascii="Calibri" w:hAnsi="Calibri"/>
+                <w:b w:val="0"/>
+                <w:color w:val="111827"/>
+                <w:sz w:val="17"/>
+              </w:rPr>
+              <w:t>Concurrent claim</w:t>
+            </w:r>
+          </w:p>
+        </w:tc>
+        <w:tc>
+          <w:tcPr>
+            <w:tcW w:type="dxa" w:w="4450"/>
+            <w:tcMar>
+              <w:top w:w="80" w:type="dxa"/>
+              <w:start w:w="120" w:type="dxa"/>
+              <w:bottom w:w="80" w:type="dxa"/>
+              <w:end w:w="120" w:type="dxa"/>
+            </w:tcMar>
+            <w:vAlign w:val="center"/>
+            <w:shd w:fill="FFFFFF"/>
+          </w:tcPr>
+          <w:p>
+            <w:pPr>
+              <w:spacing w:before="0" w:after="40" w:line="252" w:lineRule="auto"/>
+              <w:jc w:val="left"/>
+            </w:pPr>
+            <w:r>
+              <w:rPr>
+                <w:rFonts w:ascii="Calibri" w:hAnsi="Calibri"/>
+                <w:b w:val="0"/>
+                <w:color w:val="111827"/>
+                <w:sz w:val="17"/>
+              </w:rPr>
+              <w:t>Serialize one vehicle's scenario identifiers with a row lock.</w:t>
+            </w:r>
+          </w:p>
+        </w:tc>
+        <w:tc>
+          <w:tcPr>
+            <w:tcW w:type="dxa" w:w="3260"/>
+            <w:tcMar>
+              <w:top w:w="80" w:type="dxa"/>
+              <w:start w:w="120" w:type="dxa"/>
+              <w:bottom w:w="80" w:type="dxa"/>
+              <w:end w:w="120" w:type="dxa"/>
+            </w:tcMar>
+            <w:vAlign w:val="center"/>
+            <w:shd w:fill="FFFFFF"/>
+          </w:tcPr>
+          <w:p>
+            <w:pPr>
+              <w:spacing w:before="0" w:after="40" w:line="252" w:lineRule="auto"/>
+              <w:jc w:val="left"/>
+            </w:pPr>
+            <w:r>
+              <w:rPr>
+                <w:rFonts w:ascii="Calibri" w:hAnsi="Calibri"/>
+                <w:b w:val="0"/>
+                <w:color w:val="111827"/>
+                <w:sz w:val="17"/>
+              </w:rPr>
+              <w:t>Design/integration</w:t>
+            </w:r>
+          </w:p>
+        </w:tc>
+      </w:tr>
+      <w:tr>
+        <w:trPr>
+          <w:cantSplit/>
+        </w:trPr>
+        <w:tc>
+          <w:tcPr>
+            <w:tcW w:type="dxa" w:w="1650"/>
+            <w:tcMar>
+              <w:top w:w="80" w:type="dxa"/>
+              <w:start w:w="120" w:type="dxa"/>
+              <w:bottom w:w="80" w:type="dxa"/>
+              <w:end w:w="120" w:type="dxa"/>
+            </w:tcMar>
+            <w:vAlign w:val="center"/>
+            <w:shd w:fill="FFFFFF"/>
+          </w:tcPr>
+          <w:p>
+            <w:pPr>
+              <w:spacing w:before="0" w:after="40" w:line="252" w:lineRule="auto"/>
+              <w:jc w:val="center"/>
+            </w:pPr>
+            <w:r>
+              <w:rPr>
+                <w:rFonts w:ascii="Calibri" w:hAnsi="Calibri"/>
+                <w:b w:val="0"/>
+                <w:color w:val="111827"/>
+                <w:sz w:val="17"/>
+              </w:rPr>
+              <w:t>Atomic campaign</w:t>
+            </w:r>
+          </w:p>
+        </w:tc>
+        <w:tc>
+          <w:tcPr>
+            <w:tcW w:type="dxa" w:w="4450"/>
+            <w:tcMar>
+              <w:top w:w="80" w:type="dxa"/>
+              <w:start w:w="120" w:type="dxa"/>
+              <w:bottom w:w="80" w:type="dxa"/>
+              <w:end w:w="120" w:type="dxa"/>
+            </w:tcMar>
+            <w:vAlign w:val="center"/>
+            <w:shd w:fill="FFFFFF"/>
+          </w:tcPr>
+          <w:p>
+            <w:pPr>
+              <w:spacing w:before="0" w:after="40" w:line="252" w:lineRule="auto"/>
+              <w:jc w:val="left"/>
+            </w:pPr>
+            <w:r>
+              <w:rPr>
+                <w:rFonts w:ascii="Calibri" w:hAnsi="Calibri"/>
+                <w:b w:val="0"/>
+                <w:color w:val="111827"/>
+                <w:sz w:val="17"/>
+              </w:rPr>
+              <w:t>Commit primitive mutations, scenario, audit, and outbox together.</w:t>
+            </w:r>
+          </w:p>
+        </w:tc>
+        <w:tc>
+          <w:tcPr>
+            <w:tcW w:type="dxa" w:w="3260"/>
+            <w:tcMar>
+              <w:top w:w="80" w:type="dxa"/>
+              <w:start w:w="120" w:type="dxa"/>
+              <w:bottom w:w="80" w:type="dxa"/>
+              <w:end w:w="120" w:type="dxa"/>
+            </w:tcMar>
+            <w:vAlign w:val="center"/>
+            <w:shd w:fill="FFFFFF"/>
+          </w:tcPr>
+          <w:p>
+            <w:pPr>
+              <w:spacing w:before="0" w:after="40" w:line="252" w:lineRule="auto"/>
+              <w:jc w:val="left"/>
+            </w:pPr>
+            <w:r>
+              <w:rPr>
+                <w:rFonts w:ascii="Calibri" w:hAnsi="Calibri"/>
+                <w:b w:val="0"/>
+                <w:color w:val="111827"/>
+                <w:sz w:val="17"/>
+              </w:rPr>
+              <w:t>Integration</w:t>
+            </w:r>
+          </w:p>
+        </w:tc>
+      </w:tr>
+      <w:tr>
+        <w:trPr>
+          <w:cantSplit/>
+        </w:trPr>
+        <w:tc>
+          <w:tcPr>
+            <w:tcW w:type="dxa" w:w="1650"/>
+            <w:tcMar>
+              <w:top w:w="80" w:type="dxa"/>
+              <w:start w:w="120" w:type="dxa"/>
+              <w:bottom w:w="80" w:type="dxa"/>
+              <w:end w:w="120" w:type="dxa"/>
+            </w:tcMar>
+            <w:vAlign w:val="center"/>
+            <w:shd w:fill="FFFFFF"/>
+          </w:tcPr>
+          <w:p>
+            <w:pPr>
+              <w:spacing w:before="0" w:after="40" w:line="252" w:lineRule="auto"/>
+              <w:jc w:val="center"/>
+            </w:pPr>
+            <w:r>
+              <w:rPr>
+                <w:rFonts w:ascii="Calibri" w:hAnsi="Calibri"/>
+                <w:b w:val="0"/>
+                <w:color w:val="111827"/>
+                <w:sz w:val="17"/>
+              </w:rPr>
+              <w:t>Evidence minimization</w:t>
+            </w:r>
+          </w:p>
+        </w:tc>
+        <w:tc>
+          <w:tcPr>
+            <w:tcW w:type="dxa" w:w="4450"/>
+            <w:tcMar>
+              <w:top w:w="80" w:type="dxa"/>
+              <w:start w:w="120" w:type="dxa"/>
+              <w:bottom w:w="80" w:type="dxa"/>
+              <w:end w:w="120" w:type="dxa"/>
+            </w:tcMar>
+            <w:vAlign w:val="center"/>
+            <w:shd w:fill="FFFFFF"/>
+          </w:tcPr>
+          <w:p>
+            <w:pPr>
+              <w:spacing w:before="0" w:after="40" w:line="252" w:lineRule="auto"/>
+              <w:jc w:val="left"/>
+            </w:pPr>
+            <w:r>
+              <w:rPr>
+                <w:rFonts w:ascii="Calibri" w:hAnsi="Calibri"/>
+                <w:b w:val="0"/>
+                <w:color w:val="111827"/>
+                <w:sz w:val="17"/>
+              </w:rPr>
+              <w:t>Exclude action payloads, physical values, memory, and full faults.</w:t>
+            </w:r>
+          </w:p>
+        </w:tc>
+        <w:tc>
+          <w:tcPr>
+            <w:tcW w:type="dxa" w:w="3260"/>
+            <w:tcMar>
+              <w:top w:w="80" w:type="dxa"/>
+              <w:start w:w="120" w:type="dxa"/>
+              <w:bottom w:w="80" w:type="dxa"/>
+              <w:end w:w="120" w:type="dxa"/>
+            </w:tcMar>
+            <w:vAlign w:val="center"/>
+            <w:shd w:fill="FFFFFF"/>
+          </w:tcPr>
+          <w:p>
+            <w:pPr>
+              <w:spacing w:before="0" w:after="40" w:line="252" w:lineRule="auto"/>
+              <w:jc w:val="left"/>
+            </w:pPr>
+            <w:r>
+              <w:rPr>
+                <w:rFonts w:ascii="Calibri" w:hAnsi="Calibri"/>
+                <w:b w:val="0"/>
+                <w:color w:val="111827"/>
+                <w:sz w:val="17"/>
+              </w:rPr>
+              <w:t>Service</w:t>
+            </w:r>
+          </w:p>
+        </w:tc>
+      </w:tr>
+      <w:tr>
+        <w:trPr>
+          <w:cantSplit/>
+        </w:trPr>
+        <w:tc>
+          <w:tcPr>
+            <w:tcW w:type="dxa" w:w="1650"/>
+            <w:tcMar>
+              <w:top w:w="80" w:type="dxa"/>
+              <w:start w:w="120" w:type="dxa"/>
+              <w:bottom w:w="80" w:type="dxa"/>
+              <w:end w:w="120" w:type="dxa"/>
+            </w:tcMar>
+            <w:vAlign w:val="center"/>
+            <w:shd w:fill="FFFFFF"/>
+          </w:tcPr>
+          <w:p>
+            <w:pPr>
+              <w:spacing w:before="0" w:after="40" w:line="252" w:lineRule="auto"/>
+              <w:jc w:val="center"/>
+            </w:pPr>
+            <w:r>
+              <w:rPr>
+                <w:rFonts w:ascii="Calibri" w:hAnsi="Calibri"/>
+                <w:b w:val="0"/>
+                <w:color w:val="111827"/>
+                <w:sz w:val="17"/>
+              </w:rPr>
+              <w:t>Scenario RBAC/OpenAPI</w:t>
+            </w:r>
+          </w:p>
+        </w:tc>
+        <w:tc>
+          <w:tcPr>
+            <w:tcW w:type="dxa" w:w="4450"/>
+            <w:tcMar>
+              <w:top w:w="80" w:type="dxa"/>
+              <w:start w:w="120" w:type="dxa"/>
+              <w:bottom w:w="80" w:type="dxa"/>
+              <w:end w:w="120" w:type="dxa"/>
+            </w:tcMar>
+            <w:vAlign w:val="center"/>
+            <w:shd w:fill="FFFFFF"/>
+          </w:tcPr>
+          <w:p>
+            <w:pPr>
+              <w:spacing w:before="0" w:after="40" w:line="252" w:lineRule="auto"/>
+              <w:jc w:val="left"/>
+            </w:pPr>
+            <w:r>
+              <w:rPr>
+                <w:rFonts w:ascii="Calibri" w:hAnsi="Calibri"/>
+                <w:b w:val="0"/>
+                <w:color w:val="111827"/>
+                <w:sz w:val="17"/>
+              </w:rPr>
+              <w:t>Publish protected execute, list, and detail endpoints with safe limits.</w:t>
+            </w:r>
+          </w:p>
+        </w:tc>
+        <w:tc>
+          <w:tcPr>
+            <w:tcW w:type="dxa" w:w="3260"/>
+            <w:tcMar>
+              <w:top w:w="80" w:type="dxa"/>
+              <w:start w:w="120" w:type="dxa"/>
+              <w:bottom w:w="80" w:type="dxa"/>
+              <w:end w:w="120" w:type="dxa"/>
+            </w:tcMar>
+            <w:vAlign w:val="center"/>
+            <w:shd w:fill="FFFFFF"/>
+          </w:tcPr>
+          <w:p>
+            <w:pPr>
+              <w:spacing w:before="0" w:after="40" w:line="252" w:lineRule="auto"/>
+              <w:jc w:val="left"/>
+            </w:pPr>
+            <w:r>
+              <w:rPr>
+                <w:rFonts w:ascii="Calibri" w:hAnsi="Calibri"/>
+                <w:b w:val="0"/>
+                <w:color w:val="111827"/>
+                <w:sz w:val="17"/>
+              </w:rPr>
+              <w:t>Contract/integration</w:t>
+            </w:r>
+          </w:p>
+        </w:tc>
+      </w:tr>
+      <w:tr>
+        <w:trPr>
+          <w:cantSplit/>
+        </w:trPr>
+        <w:tc>
+          <w:tcPr>
+            <w:tcW w:type="dxa" w:w="1650"/>
+            <w:tcMar>
+              <w:top w:w="80" w:type="dxa"/>
+              <w:start w:w="120" w:type="dxa"/>
+              <w:bottom w:w="80" w:type="dxa"/>
+              <w:end w:w="120" w:type="dxa"/>
+            </w:tcMar>
+            <w:vAlign w:val="center"/>
+            <w:shd w:fill="FFFFFF"/>
+          </w:tcPr>
+          <w:p>
+            <w:pPr>
+              <w:spacing w:before="0" w:after="40" w:line="252" w:lineRule="auto"/>
+              <w:jc w:val="center"/>
+            </w:pPr>
+            <w:r>
+              <w:rPr>
+                <w:rFonts w:ascii="Calibri" w:hAnsi="Calibri"/>
+                <w:b w:val="0"/>
+                <w:color w:val="111827"/>
+                <w:sz w:val="17"/>
+              </w:rPr>
+              <w:t>Protocol boundary</w:t>
+            </w:r>
+          </w:p>
+        </w:tc>
+        <w:tc>
+          <w:tcPr>
+            <w:tcW w:type="dxa" w:w="4450"/>
+            <w:tcMar>
+              <w:top w:w="80" w:type="dxa"/>
+              <w:start w:w="120" w:type="dxa"/>
+              <w:bottom w:w="80" w:type="dxa"/>
+              <w:end w:w="120" w:type="dxa"/>
+            </w:tcMar>
+            <w:vAlign w:val="center"/>
+            <w:shd w:fill="FFFFFF"/>
+          </w:tcPr>
+          <w:p>
+            <w:pPr>
+              <w:spacing w:before="0" w:after="40" w:line="252" w:lineRule="auto"/>
+              <w:jc w:val="left"/>
+            </w:pPr>
+            <w:r>
+              <w:rPr>
+                <w:rFonts w:ascii="Calibri" w:hAnsi="Calibri"/>
+                <w:b w:val="0"/>
+                <w:color w:val="111827"/>
+                <w:sz w:val="17"/>
+              </w:rPr>
+              <w:t>Keep CAN frames, DBC, UDS, and wall-clock schedulers outside the orchestrator.</w:t>
             </w:r>
           </w:p>
         </w:tc>
@@ -12201,6 +14176,22 @@
           <w:color w:val="111827"/>
           <w:sz w:val="22"/>
         </w:rPr>
+        <w:t xml:space="preserve">, </w:t>
+      </w:r>
+      <w:r>
+        <w:rPr>
+          <w:rFonts w:ascii="Consolas" w:hAnsi="Consolas"/>
+          <w:color w:val="1F4D78"/>
+          <w:sz w:val="19"/>
+        </w:rPr>
+        <w:t>0022_ecu_signal_contracts</w:t>
+      </w:r>
+      <w:r>
+        <w:rPr>
+          <w:rFonts w:ascii="Calibri" w:hAnsi="Calibri"/>
+          <w:color w:val="111827"/>
+          <w:sz w:val="22"/>
+        </w:rPr>
         <w:t xml:space="preserve">, and </w:t>
       </w:r>
       <w:r>
@@ -12209,7 +14200,7 @@
           <w:color w:val="1F4D78"/>
           <w:sz w:val="19"/>
         </w:rPr>
-        <w:t>0022_ecu_signal_contracts</w:t>
+        <w:t>0023_ecu_scenarios</w:t>
       </w:r>
       <w:r>
         <w:rPr>
@@ -12431,6 +14422,39 @@
           <w:color w:val="111827"/>
           <w:sz w:val="22"/>
         </w:rPr>
+        <w:t xml:space="preserve">Scenario completion uses </w:t>
+      </w:r>
+      <w:r>
+        <w:rPr>
+          <w:rFonts w:ascii="Consolas" w:hAnsi="Consolas"/>
+          <w:color w:val="1F4D78"/>
+          <w:sz w:val="19"/>
+        </w:rPr>
+        <w:t>atep.ecu.scenario.completed.v1</w:t>
+      </w:r>
+      <w:r>
+        <w:rPr>
+          <w:rFonts w:ascii="Calibri" w:hAnsi="Calibri"/>
+          <w:color w:val="111827"/>
+          <w:sz w:val="22"/>
+        </w:rPr>
+        <w:t xml:space="preserve"> with bounded counts and clock skew.</w:t>
+      </w:r>
+    </w:p>
+    <w:p>
+      <w:pPr>
+        <w:pStyle w:val="ListBullet"/>
+        <w:numPr>
+          <w:ilvl w:val="0"/>
+          <w:numId w:val="14"/>
+        </w:numPr>
+      </w:pPr>
+      <w:r>
+        <w:rPr>
+          <w:rFonts w:ascii="Calibri" w:hAnsi="Calibri"/>
+          <w:color w:val="111827"/>
+          <w:sz w:val="22"/>
+        </w:rPr>
         <w:t>Automated tests cover validation, atomic evidence, concurrency, idempotency, permissions, and API contracts.</w:t>
       </w:r>
     </w:p>
@@ -12575,6 +14599,60 @@
     </w:p>
     <w:p>
       <w:pPr>
+        <w:pStyle w:val="ListBullet"/>
+        <w:numPr>
+          <w:ilvl w:val="0"/>
+          <w:numId w:val="16"/>
+        </w:numPr>
+      </w:pPr>
+      <w:r>
+        <w:rPr>
+          <w:rFonts w:ascii="Calibri" w:hAnsi="Calibri"/>
+          <w:color w:val="111827"/>
+          <w:sz w:val="22"/>
+        </w:rPr>
+        <w:t>Vehicle-level serialization is intentionally conservative; later scale work may introduce ordered</w:t>
+      </w:r>
+    </w:p>
+    <w:p>
+      <w:r>
+        <w:rPr>
+          <w:rFonts w:ascii="Calibri" w:hAnsi="Calibri"/>
+          <w:color w:val="111827"/>
+          <w:sz w:val="22"/>
+        </w:rPr>
+        <w:t>multi-aggregate locks after measuring real campaign contention.</w:t>
+      </w:r>
+    </w:p>
+    <w:p>
+      <w:pPr>
+        <w:pStyle w:val="ListBullet"/>
+        <w:numPr>
+          <w:ilvl w:val="0"/>
+          <w:numId w:val="17"/>
+        </w:numPr>
+      </w:pPr>
+      <w:r>
+        <w:rPr>
+          <w:rFonts w:ascii="Calibri" w:hAnsi="Calibri"/>
+          <w:color w:val="111827"/>
+          <w:sz w:val="22"/>
+        </w:rPr>
+        <w:t>Scenario definitions are request-persisted execution evidence, not yet a reusable catalogue with</w:t>
+      </w:r>
+    </w:p>
+    <w:p>
+      <w:r>
+        <w:rPr>
+          <w:rFonts w:ascii="Calibri" w:hAnsi="Calibri"/>
+          <w:color w:val="111827"/>
+          <w:sz w:val="22"/>
+        </w:rPr>
+        <w:t>approval workflow or scheduled execution.</w:t>
+      </w:r>
+    </w:p>
+    <w:p>
+      <w:pPr>
         <w:pStyle w:val="Heading1"/>
         <w:keepNext/>
         <w:keepLines/>
@@ -12590,7 +14668,7 @@
           <w:color w:val="111827"/>
           <w:sz w:val="22"/>
         </w:rPr>
-        <w:t xml:space="preserve">The next increment adds multi-ECU scenarios, logical-time diagnostics, bounded resource metrics, and repeatable failure campaigns. CAN bus implementation remains in Volume IV. See </w:t>
+        <w:t xml:space="preserve">The initial Volume III baseline is complete. The recommended next development starts Volume IV with a protocol-independent CAN network aggregate, bounded frame contracts, topology, and deterministic bus submission semantics. DBC encoding, arbitration, CAN FD, fault injection, and timing follow in later Volume IV increments. See </w:t>
       </w:r>
       <w:r>
         <w:rPr>
@@ -12624,7 +14702,7 @@
         <w:pStyle w:val="ListNumber"/>
         <w:numPr>
           <w:ilvl w:val="0"/>
-          <w:numId w:val="17"/>
+          <w:numId w:val="18"/>
         </w:numPr>
       </w:pPr>
       <w:r>
@@ -12641,7 +14719,7 @@
         <w:pStyle w:val="ListNumber"/>
         <w:numPr>
           <w:ilvl w:val="0"/>
-          <w:numId w:val="17"/>
+          <w:numId w:val="18"/>
         </w:numPr>
       </w:pPr>
       <w:r>
@@ -12658,7 +14736,7 @@
         <w:pStyle w:val="ListNumber"/>
         <w:numPr>
           <w:ilvl w:val="0"/>
-          <w:numId w:val="17"/>
+          <w:numId w:val="18"/>
         </w:numPr>
       </w:pPr>
       <w:r>
@@ -12675,7 +14753,7 @@
         <w:pStyle w:val="ListNumber"/>
         <w:numPr>
           <w:ilvl w:val="0"/>
-          <w:numId w:val="17"/>
+          <w:numId w:val="18"/>
         </w:numPr>
       </w:pPr>
       <w:r>
@@ -12692,7 +14770,7 @@
         <w:pStyle w:val="ListNumber"/>
         <w:numPr>
           <w:ilvl w:val="0"/>
-          <w:numId w:val="17"/>
+          <w:numId w:val="18"/>
         </w:numPr>
       </w:pPr>
       <w:r>
@@ -12709,7 +14787,7 @@
         <w:pStyle w:val="ListNumber"/>
         <w:numPr>
           <w:ilvl w:val="0"/>
-          <w:numId w:val="17"/>
+          <w:numId w:val="18"/>
         </w:numPr>
       </w:pPr>
       <w:r>
@@ -12726,7 +14804,7 @@
         <w:pStyle w:val="ListNumber"/>
         <w:numPr>
           <w:ilvl w:val="0"/>
-          <w:numId w:val="17"/>
+          <w:numId w:val="18"/>
         </w:numPr>
       </w:pPr>
       <w:r>
@@ -12743,7 +14821,7 @@
         <w:pStyle w:val="ListNumber"/>
         <w:numPr>
           <w:ilvl w:val="0"/>
-          <w:numId w:val="17"/>
+          <w:numId w:val="18"/>
         </w:numPr>
       </w:pPr>
       <w:r>
@@ -12760,7 +14838,7 @@
         <w:pStyle w:val="ListNumber"/>
         <w:numPr>
           <w:ilvl w:val="0"/>
-          <w:numId w:val="17"/>
+          <w:numId w:val="18"/>
         </w:numPr>
       </w:pPr>
       <w:r>
@@ -12777,7 +14855,7 @@
         <w:pStyle w:val="ListNumber"/>
         <w:numPr>
           <w:ilvl w:val="0"/>
-          <w:numId w:val="17"/>
+          <w:numId w:val="18"/>
         </w:numPr>
       </w:pPr>
       <w:r>
@@ -12794,7 +14872,7 @@
         <w:pStyle w:val="ListNumber"/>
         <w:numPr>
           <w:ilvl w:val="0"/>
-          <w:numId w:val="17"/>
+          <w:numId w:val="18"/>
         </w:numPr>
       </w:pPr>
       <w:r>
@@ -12811,7 +14889,7 @@
         <w:pStyle w:val="ListNumber"/>
         <w:numPr>
           <w:ilvl w:val="0"/>
-          <w:numId w:val="17"/>
+          <w:numId w:val="18"/>
         </w:numPr>
       </w:pPr>
       <w:r>
@@ -12828,7 +14906,7 @@
         <w:pStyle w:val="ListNumber"/>
         <w:numPr>
           <w:ilvl w:val="0"/>
-          <w:numId w:val="17"/>
+          <w:numId w:val="18"/>
         </w:numPr>
       </w:pPr>
       <w:r>
@@ -12845,7 +14923,7 @@
         <w:pStyle w:val="ListNumber"/>
         <w:numPr>
           <w:ilvl w:val="0"/>
-          <w:numId w:val="17"/>
+          <w:numId w:val="18"/>
         </w:numPr>
       </w:pPr>
       <w:r>
@@ -12862,7 +14940,7 @@
         <w:pStyle w:val="ListNumber"/>
         <w:numPr>
           <w:ilvl w:val="0"/>
-          <w:numId w:val="17"/>
+          <w:numId w:val="18"/>
         </w:numPr>
       </w:pPr>
       <w:r>
@@ -12879,7 +14957,7 @@
         <w:pStyle w:val="ListNumber"/>
         <w:numPr>
           <w:ilvl w:val="0"/>
-          <w:numId w:val="17"/>
+          <w:numId w:val="18"/>
         </w:numPr>
       </w:pPr>
       <w:r>
@@ -12896,7 +14974,7 @@
         <w:pStyle w:val="ListNumber"/>
         <w:numPr>
           <w:ilvl w:val="0"/>
-          <w:numId w:val="17"/>
+          <w:numId w:val="18"/>
         </w:numPr>
       </w:pPr>
       <w:r>
@@ -12913,7 +14991,7 @@
         <w:pStyle w:val="ListNumber"/>
         <w:numPr>
           <w:ilvl w:val="0"/>
-          <w:numId w:val="17"/>
+          <w:numId w:val="18"/>
         </w:numPr>
       </w:pPr>
       <w:r>
@@ -12930,7 +15008,7 @@
         <w:pStyle w:val="ListNumber"/>
         <w:numPr>
           <w:ilvl w:val="0"/>
-          <w:numId w:val="17"/>
+          <w:numId w:val="18"/>
         </w:numPr>
       </w:pPr>
       <w:r>
@@ -12947,7 +15025,7 @@
         <w:pStyle w:val="ListNumber"/>
         <w:numPr>
           <w:ilvl w:val="0"/>
-          <w:numId w:val="17"/>
+          <w:numId w:val="18"/>
         </w:numPr>
       </w:pPr>
       <w:r>
@@ -12957,6 +15035,74 @@
           <w:sz w:val="22"/>
         </w:rPr>
         <w:t>Design the future Volume IV adapter that maps a semantic signal to a DBC without changing ECU state.</w:t>
+      </w:r>
+    </w:p>
+    <w:p>
+      <w:pPr>
+        <w:pStyle w:val="ListNumber"/>
+        <w:numPr>
+          <w:ilvl w:val="0"/>
+          <w:numId w:val="18"/>
+        </w:numPr>
+      </w:pPr>
+      <w:r>
+        <w:rPr>
+          <w:rFonts w:ascii="Calibri" w:hAnsi="Calibri"/>
+          <w:color w:val="111827"/>
+          <w:sz w:val="22"/>
+        </w:rPr>
+        <w:t>Build a two-ECU scenario and calculate every derived command ID and campaign seed.</w:t>
+      </w:r>
+    </w:p>
+    <w:p>
+      <w:pPr>
+        <w:pStyle w:val="ListNumber"/>
+        <w:numPr>
+          <w:ilvl w:val="0"/>
+          <w:numId w:val="18"/>
+        </w:numPr>
+      </w:pPr>
+      <w:r>
+        <w:rPr>
+          <w:rFonts w:ascii="Calibri" w:hAnsi="Calibri"/>
+          <w:color w:val="111827"/>
+          <w:sz w:val="22"/>
+        </w:rPr>
+        <w:t>Compare synchronized ECU clocks with a 250 ms skew and explain the diagnostic result.</w:t>
+      </w:r>
+    </w:p>
+    <w:p>
+      <w:pPr>
+        <w:pStyle w:val="ListNumber"/>
+        <w:numPr>
+          <w:ilvl w:val="0"/>
+          <w:numId w:val="18"/>
+        </w:numPr>
+      </w:pPr>
+      <w:r>
+        <w:rPr>
+          <w:rFonts w:ascii="Calibri" w:hAnsi="Calibri"/>
+          <w:color w:val="111827"/>
+          <w:sz w:val="22"/>
+        </w:rPr>
+        <w:t>Prove why aggregate scenario evidence is safer than copying action requests and physical values.</w:t>
+      </w:r>
+    </w:p>
+    <w:p>
+      <w:pPr>
+        <w:pStyle w:val="ListNumber"/>
+        <w:numPr>
+          <w:ilvl w:val="0"/>
+          <w:numId w:val="18"/>
+        </w:numPr>
+      </w:pPr>
+      <w:r>
+        <w:rPr>
+          <w:rFonts w:ascii="Calibri" w:hAnsi="Calibri"/>
+          <w:color w:val="111827"/>
+          <w:sz w:val="22"/>
+        </w:rPr>
+        <w:t>Propose a reusable scenario catalogue without weakening immutable execution evidence.</w:t>
       </w:r>
     </w:p>
     <w:sectPr>
@@ -12988,7 +15134,7 @@
         <w:color w:val="667085"/>
         <w:sz w:val="17"/>
       </w:rPr>
-      <w:t>ATEP Volume III Workbook  |  Version 0.6.0</w:t>
+      <w:t>ATEP Volume III Workbook  |  Version 0.7.0</w:t>
     </w:r>
     <w:r>
       <w:rPr>
@@ -13312,6 +15458,12 @@
     </w:lvlOverride>
   </w:num>
   <w:num w:numId="17">
+    <w:abstractNumId w:val="10"/>
+    <w:lvlOverride w:ilvl="0">
+      <w:startOverride w:val="1"/>
+    </w:lvlOverride>
+  </w:num>
+  <w:num w:numId="18">
     <w:abstractNumId w:val="9"/>
     <w:lvlOverride w:ilvl="0">
       <w:startOverride w:val="1"/>

</xml_diff>

<commit_message>
feat(ecus): add deterministic multi-ecu scenarios (#56)
</commit_message>
<xml_diff>
--- a/docs/ATEP_Volume_III_ECU_Simulator_Engineering_Workbook.docx
+++ b/docs/ATEP_Volume_III_ECU_Simulator_Engineering_Workbook.docx
@@ -143,7 +143,7 @@
                 <w:color w:val="0B2545"/>
                 <w:sz w:val="19"/>
               </w:rPr>
-              <w:t>0.6.0</w:t>
+              <w:t>0.7.0</w:t>
             </w:r>
           </w:p>
         </w:tc>
@@ -265,7 +265,7 @@
                 <w:color w:val="111827"/>
                 <w:sz w:val="19"/>
               </w:rPr>
-              <w:t>Living document - Increments III-1 through III-6 implemented</w:t>
+              <w:t>Volume III baseline - Increments III-1 through III-7 implemented</w:t>
             </w:r>
           </w:p>
         </w:tc>
@@ -694,6 +694,25 @@
           <w:color w:val="0B2545"/>
           <w:sz w:val="21"/>
         </w:rPr>
+        <w:t>11.6 III-7 Verification</w:t>
+      </w:r>
+    </w:p>
+    <w:p>
+      <w:pPr>
+        <w:pStyle w:val="ListNumber"/>
+        <w:numPr>
+          <w:ilvl w:val="0"/>
+          <w:numId w:val="10"/>
+        </w:numPr>
+        <w:ind w:left="216" w:firstLine="0"/>
+      </w:pPr>
+      <w:r>
+        <w:rPr>
+          <w:rFonts w:ascii="Calibri" w:hAnsi="Calibri"/>
+          <w:b/>
+          <w:color w:val="0B2545"/>
+          <w:sz w:val="21"/>
+        </w:rPr>
         <w:t>12. Implemented Evidence</w:t>
       </w:r>
     </w:p>
@@ -988,7 +1007,7 @@
                 <w:color w:val="111827"/>
                 <w:sz w:val="17"/>
               </w:rPr>
-              <w:t>Increments III-1 through III-6</w:t>
+              <w:t>Increments III-1 through III-7</w:t>
             </w:r>
           </w:p>
         </w:tc>
@@ -1833,6 +1852,95 @@
                 <w:sz w:val="17"/>
               </w:rPr>
               <w:t>Added typed signal contracts, publication, gateway routes, atomic transfer, migration, APIs, and tests.</w:t>
+            </w:r>
+          </w:p>
+        </w:tc>
+      </w:tr>
+      <w:tr>
+        <w:trPr>
+          <w:cantSplit/>
+        </w:trPr>
+        <w:tc>
+          <w:tcPr>
+            <w:tcW w:type="dxa" w:w="1650"/>
+            <w:tcMar>
+              <w:top w:w="80" w:type="dxa"/>
+              <w:start w:w="120" w:type="dxa"/>
+              <w:bottom w:w="80" w:type="dxa"/>
+              <w:end w:w="120" w:type="dxa"/>
+            </w:tcMar>
+            <w:vAlign w:val="center"/>
+            <w:shd w:fill="FFFFFF"/>
+          </w:tcPr>
+          <w:p>
+            <w:pPr>
+              <w:spacing w:before="0" w:after="40" w:line="252" w:lineRule="auto"/>
+              <w:jc w:val="center"/>
+            </w:pPr>
+            <w:r>
+              <w:rPr>
+                <w:rFonts w:ascii="Calibri" w:hAnsi="Calibri"/>
+                <w:b w:val="0"/>
+                <w:color w:val="111827"/>
+                <w:sz w:val="17"/>
+              </w:rPr>
+              <w:t>0.7.0</w:t>
+            </w:r>
+          </w:p>
+        </w:tc>
+        <w:tc>
+          <w:tcPr>
+            <w:tcW w:type="dxa" w:w="4450"/>
+            <w:tcMar>
+              <w:top w:w="80" w:type="dxa"/>
+              <w:start w:w="120" w:type="dxa"/>
+              <w:bottom w:w="80" w:type="dxa"/>
+              <w:end w:w="120" w:type="dxa"/>
+            </w:tcMar>
+            <w:vAlign w:val="center"/>
+            <w:shd w:fill="FFFFFF"/>
+          </w:tcPr>
+          <w:p>
+            <w:pPr>
+              <w:spacing w:before="0" w:after="40" w:line="252" w:lineRule="auto"/>
+              <w:jc w:val="left"/>
+            </w:pPr>
+            <w:r>
+              <w:rPr>
+                <w:rFonts w:ascii="Calibri" w:hAnsi="Calibri"/>
+                <w:b w:val="0"/>
+                <w:color w:val="111827"/>
+                <w:sz w:val="17"/>
+              </w:rPr>
+              <w:t>2026-08-24</w:t>
+            </w:r>
+          </w:p>
+        </w:tc>
+        <w:tc>
+          <w:tcPr>
+            <w:tcW w:type="dxa" w:w="3260"/>
+            <w:tcMar>
+              <w:top w:w="80" w:type="dxa"/>
+              <w:start w:w="120" w:type="dxa"/>
+              <w:bottom w:w="80" w:type="dxa"/>
+              <w:end w:w="120" w:type="dxa"/>
+            </w:tcMar>
+            <w:vAlign w:val="center"/>
+            <w:shd w:fill="FFFFFF"/>
+          </w:tcPr>
+          <w:p>
+            <w:pPr>
+              <w:spacing w:before="0" w:after="40" w:line="252" w:lineRule="auto"/>
+              <w:jc w:val="left"/>
+            </w:pPr>
+            <w:r>
+              <w:rPr>
+                <w:rFonts w:ascii="Calibri" w:hAnsi="Calibri"/>
+                <w:b w:val="0"/>
+                <w:color w:val="111827"/>
+                <w:sz w:val="17"/>
+              </w:rPr>
+              <w:t>Added persisted multi-ECU scenarios, logical-clock diagnostics, bounded metrics, deterministic failure campaigns, APIs, migration, and tests.</w:t>
             </w:r>
           </w:p>
         </w:tc>
@@ -1946,6 +2054,23 @@
           <w:sz w:val="22"/>
         </w:rPr>
         <w:t>Typed produced/consumed signals, logical-time publication, and gateway-owned routing hooks.</w:t>
+      </w:r>
+    </w:p>
+    <w:p>
+      <w:pPr>
+        <w:pStyle w:val="ListBullet"/>
+        <w:numPr>
+          <w:ilvl w:val="0"/>
+          <w:numId w:val="11"/>
+        </w:numPr>
+      </w:pPr>
+      <w:r>
+        <w:rPr>
+          <w:rFonts w:ascii="Calibri" w:hAnsi="Calibri"/>
+          <w:color w:val="111827"/>
+          <w:sz w:val="22"/>
+        </w:rPr>
+        <w:t>Bounded multi-ECU scenarios, logical-clock diagnostics, aggregate metrics, and repeatable campaigns.</w:t>
       </w:r>
     </w:p>
     <w:p>
@@ -2159,7 +2284,7 @@
           <w:color w:val="111827"/>
           <w:sz w:val="22"/>
         </w:rPr>
-        <w:t>Autonomous sensor-condition evaluation and fault injection campaigns.</w:t>
+        <w:t>Autonomous sensor-condition evaluation and continuous fault-trigger rules.</w:t>
       </w:r>
     </w:p>
     <w:p>
@@ -2206,6 +2331,16 @@
           <w:sz w:val="22"/>
         </w:rPr>
         <w:t>Request flow: authenticated client -&gt; FastAPI router -&gt; RBAC dependency -&gt; ECU domain service -&gt; PostgreSQL aggregate + audit record + transactional outbox event -&gt; HTTP response.</w:t>
+      </w:r>
+    </w:p>
+    <w:p>
+      <w:r>
+        <w:rPr>
+          <w:rFonts w:ascii="Calibri" w:hAnsi="Calibri"/>
+          <w:color w:val="111827"/>
+          <w:sz w:val="22"/>
+        </w:rPr>
+        <w:t>The scenario orchestrator is a vehicle-scoped application service above the ECU primitives. It serializes execution-ID claims with a vehicle row lock and performs all ordered actions in the API transaction. Its diagnostics use ECU logical clocks; host resource sampling and wall-clock timing are not part of simulated truth.</w:t>
       </w:r>
     </w:p>
     <w:p>
@@ -2387,6 +2522,16 @@
       </w:r>
     </w:p>
     <w:p>
+      <w:r>
+        <w:rPr>
+          <w:rFonts w:ascii="Calibri" w:hAnsi="Calibri"/>
+          <w:color w:val="111827"/>
+          <w:sz w:val="22"/>
+        </w:rPr>
+        <w:t>An ECU scenario execution stores a request hash, bounded request, bounded aggregate result, iteration count, actor, and timestamps. One request has 1 to 32 actions, references at most 16 ECUs, repeats at most eight times, and returns at most 256 action summaries. Results include before/after counts and per-ECU clock lag rather than complete memory, signal-value, or fault payloads.</w:t>
+      </w:r>
+    </w:p>
+    <w:p>
       <w:pPr>
         <w:pStyle w:val="Heading1"/>
         <w:keepNext/>
@@ -4557,6 +4702,357 @@
                 <w:sz w:val="16"/>
               </w:rPr>
               <w:t>Transfer a routed value atomically.</w:t>
+            </w:r>
+          </w:p>
+        </w:tc>
+      </w:tr>
+      <w:tr>
+        <w:trPr>
+          <w:cantSplit/>
+        </w:trPr>
+        <w:tc>
+          <w:tcPr>
+            <w:tcW w:type="dxa" w:w="1150"/>
+            <w:tcMar>
+              <w:top w:w="80" w:type="dxa"/>
+              <w:start w:w="120" w:type="dxa"/>
+              <w:bottom w:w="80" w:type="dxa"/>
+              <w:end w:w="120" w:type="dxa"/>
+            </w:tcMar>
+            <w:vAlign w:val="center"/>
+            <w:shd w:fill="FFFFFF"/>
+          </w:tcPr>
+          <w:p>
+            <w:pPr>
+              <w:spacing w:before="0" w:after="40" w:line="252" w:lineRule="auto"/>
+              <w:jc w:val="center"/>
+            </w:pPr>
+            <w:r>
+              <w:rPr>
+                <w:rFonts w:ascii="Calibri" w:hAnsi="Calibri"/>
+                <w:b w:val="0"/>
+                <w:color w:val="111827"/>
+                <w:sz w:val="16"/>
+              </w:rPr>
+              <w:t>POST</w:t>
+            </w:r>
+          </w:p>
+        </w:tc>
+        <w:tc>
+          <w:tcPr>
+            <w:tcW w:type="dxa" w:w="3700"/>
+            <w:tcMar>
+              <w:top w:w="80" w:type="dxa"/>
+              <w:start w:w="120" w:type="dxa"/>
+              <w:bottom w:w="80" w:type="dxa"/>
+              <w:end w:w="120" w:type="dxa"/>
+            </w:tcMar>
+            <w:vAlign w:val="center"/>
+            <w:shd w:fill="FFFFFF"/>
+          </w:tcPr>
+          <w:p>
+            <w:pPr>
+              <w:spacing w:before="0" w:after="40" w:line="252" w:lineRule="auto"/>
+              <w:jc w:val="left"/>
+            </w:pPr>
+            <w:r>
+              <w:rPr>
+                <w:rFonts w:ascii="Calibri" w:hAnsi="Calibri"/>
+                <w:b w:val="0"/>
+                <w:color w:val="111827"/>
+                <w:sz w:val="16"/>
+              </w:rPr>
+              <w:t>/api/v1/vehicles/{vehicle_id}/ecu-scenarios/execute</w:t>
+            </w:r>
+          </w:p>
+        </w:tc>
+        <w:tc>
+          <w:tcPr>
+            <w:tcW w:type="dxa" w:w="3100"/>
+            <w:tcMar>
+              <w:top w:w="80" w:type="dxa"/>
+              <w:start w:w="120" w:type="dxa"/>
+              <w:bottom w:w="80" w:type="dxa"/>
+              <w:end w:w="120" w:type="dxa"/>
+            </w:tcMar>
+            <w:vAlign w:val="center"/>
+            <w:shd w:fill="FFFFFF"/>
+          </w:tcPr>
+          <w:p>
+            <w:pPr>
+              <w:spacing w:before="0" w:after="40" w:line="252" w:lineRule="auto"/>
+              <w:jc w:val="left"/>
+            </w:pPr>
+            <w:r>
+              <w:rPr>
+                <w:rFonts w:ascii="Calibri" w:hAnsi="Calibri"/>
+                <w:b w:val="0"/>
+                <w:color w:val="111827"/>
+                <w:sz w:val="16"/>
+              </w:rPr>
+              <w:t>ecus:manage</w:t>
+            </w:r>
+          </w:p>
+        </w:tc>
+        <w:tc>
+          <w:tcPr>
+            <w:tcW w:type="dxa" w:w="1410"/>
+            <w:tcMar>
+              <w:top w:w="80" w:type="dxa"/>
+              <w:start w:w="120" w:type="dxa"/>
+              <w:bottom w:w="80" w:type="dxa"/>
+              <w:end w:w="120" w:type="dxa"/>
+            </w:tcMar>
+            <w:vAlign w:val="center"/>
+            <w:shd w:fill="FFFFFF"/>
+          </w:tcPr>
+          <w:p>
+            <w:pPr>
+              <w:spacing w:before="0" w:after="40" w:line="252" w:lineRule="auto"/>
+              <w:jc w:val="left"/>
+            </w:pPr>
+            <w:r>
+              <w:rPr>
+                <w:rFonts w:ascii="Calibri" w:hAnsi="Calibri"/>
+                <w:b w:val="0"/>
+                <w:color w:val="111827"/>
+                <w:sz w:val="16"/>
+              </w:rPr>
+              <w:t>Execute a bounded deterministic scenario or campaign.</w:t>
+            </w:r>
+          </w:p>
+        </w:tc>
+      </w:tr>
+      <w:tr>
+        <w:trPr>
+          <w:cantSplit/>
+        </w:trPr>
+        <w:tc>
+          <w:tcPr>
+            <w:tcW w:type="dxa" w:w="1150"/>
+            <w:tcMar>
+              <w:top w:w="80" w:type="dxa"/>
+              <w:start w:w="120" w:type="dxa"/>
+              <w:bottom w:w="80" w:type="dxa"/>
+              <w:end w:w="120" w:type="dxa"/>
+            </w:tcMar>
+            <w:vAlign w:val="center"/>
+            <w:shd w:fill="FFFFFF"/>
+          </w:tcPr>
+          <w:p>
+            <w:pPr>
+              <w:spacing w:before="0" w:after="40" w:line="252" w:lineRule="auto"/>
+              <w:jc w:val="center"/>
+            </w:pPr>
+            <w:r>
+              <w:rPr>
+                <w:rFonts w:ascii="Calibri" w:hAnsi="Calibri"/>
+                <w:b w:val="0"/>
+                <w:color w:val="111827"/>
+                <w:sz w:val="16"/>
+              </w:rPr>
+              <w:t>GET</w:t>
+            </w:r>
+          </w:p>
+        </w:tc>
+        <w:tc>
+          <w:tcPr>
+            <w:tcW w:type="dxa" w:w="3700"/>
+            <w:tcMar>
+              <w:top w:w="80" w:type="dxa"/>
+              <w:start w:w="120" w:type="dxa"/>
+              <w:bottom w:w="80" w:type="dxa"/>
+              <w:end w:w="120" w:type="dxa"/>
+            </w:tcMar>
+            <w:vAlign w:val="center"/>
+            <w:shd w:fill="FFFFFF"/>
+          </w:tcPr>
+          <w:p>
+            <w:pPr>
+              <w:spacing w:before="0" w:after="40" w:line="252" w:lineRule="auto"/>
+              <w:jc w:val="left"/>
+            </w:pPr>
+            <w:r>
+              <w:rPr>
+                <w:rFonts w:ascii="Calibri" w:hAnsi="Calibri"/>
+                <w:b w:val="0"/>
+                <w:color w:val="111827"/>
+                <w:sz w:val="16"/>
+              </w:rPr>
+              <w:t>/api/v1/vehicles/{vehicle_id}/ecu-scenarios</w:t>
+            </w:r>
+          </w:p>
+        </w:tc>
+        <w:tc>
+          <w:tcPr>
+            <w:tcW w:type="dxa" w:w="3100"/>
+            <w:tcMar>
+              <w:top w:w="80" w:type="dxa"/>
+              <w:start w:w="120" w:type="dxa"/>
+              <w:bottom w:w="80" w:type="dxa"/>
+              <w:end w:w="120" w:type="dxa"/>
+            </w:tcMar>
+            <w:vAlign w:val="center"/>
+            <w:shd w:fill="FFFFFF"/>
+          </w:tcPr>
+          <w:p>
+            <w:pPr>
+              <w:spacing w:before="0" w:after="40" w:line="252" w:lineRule="auto"/>
+              <w:jc w:val="left"/>
+            </w:pPr>
+            <w:r>
+              <w:rPr>
+                <w:rFonts w:ascii="Calibri" w:hAnsi="Calibri"/>
+                <w:b w:val="0"/>
+                <w:color w:val="111827"/>
+                <w:sz w:val="16"/>
+              </w:rPr>
+              <w:t>ecus:read</w:t>
+            </w:r>
+          </w:p>
+        </w:tc>
+        <w:tc>
+          <w:tcPr>
+            <w:tcW w:type="dxa" w:w="1410"/>
+            <w:tcMar>
+              <w:top w:w="80" w:type="dxa"/>
+              <w:start w:w="120" w:type="dxa"/>
+              <w:bottom w:w="80" w:type="dxa"/>
+              <w:end w:w="120" w:type="dxa"/>
+            </w:tcMar>
+            <w:vAlign w:val="center"/>
+            <w:shd w:fill="FFFFFF"/>
+          </w:tcPr>
+          <w:p>
+            <w:pPr>
+              <w:spacing w:before="0" w:after="40" w:line="252" w:lineRule="auto"/>
+              <w:jc w:val="left"/>
+            </w:pPr>
+            <w:r>
+              <w:rPr>
+                <w:rFonts w:ascii="Calibri" w:hAnsi="Calibri"/>
+                <w:b w:val="0"/>
+                <w:color w:val="111827"/>
+                <w:sz w:val="16"/>
+              </w:rPr>
+              <w:t>List persisted scenario evidence safely.</w:t>
+            </w:r>
+          </w:p>
+        </w:tc>
+      </w:tr>
+      <w:tr>
+        <w:trPr>
+          <w:cantSplit/>
+        </w:trPr>
+        <w:tc>
+          <w:tcPr>
+            <w:tcW w:type="dxa" w:w="1150"/>
+            <w:tcMar>
+              <w:top w:w="80" w:type="dxa"/>
+              <w:start w:w="120" w:type="dxa"/>
+              <w:bottom w:w="80" w:type="dxa"/>
+              <w:end w:w="120" w:type="dxa"/>
+            </w:tcMar>
+            <w:vAlign w:val="center"/>
+            <w:shd w:fill="FFFFFF"/>
+          </w:tcPr>
+          <w:p>
+            <w:pPr>
+              <w:spacing w:before="0" w:after="40" w:line="252" w:lineRule="auto"/>
+              <w:jc w:val="center"/>
+            </w:pPr>
+            <w:r>
+              <w:rPr>
+                <w:rFonts w:ascii="Calibri" w:hAnsi="Calibri"/>
+                <w:b w:val="0"/>
+                <w:color w:val="111827"/>
+                <w:sz w:val="16"/>
+              </w:rPr>
+              <w:t>GET</w:t>
+            </w:r>
+          </w:p>
+        </w:tc>
+        <w:tc>
+          <w:tcPr>
+            <w:tcW w:type="dxa" w:w="3700"/>
+            <w:tcMar>
+              <w:top w:w="80" w:type="dxa"/>
+              <w:start w:w="120" w:type="dxa"/>
+              <w:bottom w:w="80" w:type="dxa"/>
+              <w:end w:w="120" w:type="dxa"/>
+            </w:tcMar>
+            <w:vAlign w:val="center"/>
+            <w:shd w:fill="FFFFFF"/>
+          </w:tcPr>
+          <w:p>
+            <w:pPr>
+              <w:spacing w:before="0" w:after="40" w:line="252" w:lineRule="auto"/>
+              <w:jc w:val="left"/>
+            </w:pPr>
+            <w:r>
+              <w:rPr>
+                <w:rFonts w:ascii="Calibri" w:hAnsi="Calibri"/>
+                <w:b w:val="0"/>
+                <w:color w:val="111827"/>
+                <w:sz w:val="16"/>
+              </w:rPr>
+              <w:t>/api/v1/vehicles/{vehicle_id}/ecu-scenarios/{execution_id}</w:t>
+            </w:r>
+          </w:p>
+        </w:tc>
+        <w:tc>
+          <w:tcPr>
+            <w:tcW w:type="dxa" w:w="3100"/>
+            <w:tcMar>
+              <w:top w:w="80" w:type="dxa"/>
+              <w:start w:w="120" w:type="dxa"/>
+              <w:bottom w:w="80" w:type="dxa"/>
+              <w:end w:w="120" w:type="dxa"/>
+            </w:tcMar>
+            <w:vAlign w:val="center"/>
+            <w:shd w:fill="FFFFFF"/>
+          </w:tcPr>
+          <w:p>
+            <w:pPr>
+              <w:spacing w:before="0" w:after="40" w:line="252" w:lineRule="auto"/>
+              <w:jc w:val="left"/>
+            </w:pPr>
+            <w:r>
+              <w:rPr>
+                <w:rFonts w:ascii="Calibri" w:hAnsi="Calibri"/>
+                <w:b w:val="0"/>
+                <w:color w:val="111827"/>
+                <w:sz w:val="16"/>
+              </w:rPr>
+              <w:t>ecus:read</w:t>
+            </w:r>
+          </w:p>
+        </w:tc>
+        <w:tc>
+          <w:tcPr>
+            <w:tcW w:type="dxa" w:w="1410"/>
+            <w:tcMar>
+              <w:top w:w="80" w:type="dxa"/>
+              <w:start w:w="120" w:type="dxa"/>
+              <w:bottom w:w="80" w:type="dxa"/>
+              <w:end w:w="120" w:type="dxa"/>
+            </w:tcMar>
+            <w:vAlign w:val="center"/>
+            <w:shd w:fill="FFFFFF"/>
+          </w:tcPr>
+          <w:p>
+            <w:pPr>
+              <w:spacing w:before="0" w:after="40" w:line="252" w:lineRule="auto"/>
+              <w:jc w:val="left"/>
+            </w:pPr>
+            <w:r>
+              <w:rPr>
+                <w:rFonts w:ascii="Calibri" w:hAnsi="Calibri"/>
+                <w:b w:val="0"/>
+                <w:color w:val="111827"/>
+                <w:sz w:val="16"/>
+              </w:rPr>
+              <w:t>Inspect one scenario execution.</w:t>
             </w:r>
           </w:p>
         </w:tc>
@@ -4809,6 +5305,52 @@
     </w:p>
     <w:p>
       <w:pPr>
+        <w:pStyle w:val="Heading2"/>
+        <w:keepNext/>
+        <w:keepLines/>
+      </w:pPr>
+      <w:r>
+        <w:t>8.6 Scenario Orchestration and Timing Diagnostics</w:t>
+      </w:r>
+    </w:p>
+    <w:p>
+      <w:r>
+        <w:rPr>
+          <w:rFonts w:ascii="Calibri" w:hAnsi="Calibri"/>
+          <w:color w:val="111827"/>
+          <w:sz w:val="22"/>
+        </w:rPr>
+        <w:t>Scenario actions call the existing advance, fault, corruption, publication, and transfer services. The orchestrator supplies each primitive's current version and derives a stable command ID from the execution ID, iteration, and action index. Corruption seeds derive from the declared base seed and the same logical coordinates, making a campaign repeatable from an identical initial state.</w:t>
+      </w:r>
+    </w:p>
+    <w:p>
+      <w:r>
+        <w:rPr>
+          <w:rFonts w:ascii="Calibri" w:hAnsi="Calibri"/>
+          <w:color w:val="111827"/>
+          <w:sz w:val="22"/>
+        </w:rPr>
+        <w:t xml:space="preserve">Exact request replay returns persisted evidence without executing actions again; changed reuse of an execution ID fails with </w:t>
+      </w:r>
+      <w:r>
+        <w:rPr>
+          <w:rFonts w:ascii="Consolas" w:hAnsi="Consolas"/>
+          <w:color w:val="1F4D78"/>
+          <w:sz w:val="19"/>
+        </w:rPr>
+        <w:t>ecu_scenario_execution_conflict</w:t>
+      </w:r>
+      <w:r>
+        <w:rPr>
+          <w:rFonts w:ascii="Calibri" w:hAnsi="Calibri"/>
+          <w:color w:val="111827"/>
+          <w:sz w:val="22"/>
+        </w:rPr>
+        <w:t>. Before/after evidence counts ECUs, memory cells, semantic signals, active faults, routes, and aggregate versions. Timing evidence reports the minimum and maximum ECU clocks, skew, synchronization state, and lag for at most 16 ECUs. Aggregate audit and outbox evidence excludes action requests, memory contents, physical values, and fault sets.</w:t>
+      </w:r>
+    </w:p>
+    <w:p>
+      <w:pPr>
         <w:pStyle w:val="Heading1"/>
         <w:keepNext/>
         <w:keepLines/>
@@ -4840,7 +5382,7 @@
           <w:color w:val="111827"/>
           <w:sz w:val="22"/>
         </w:rPr>
-        <w:t>. III-1 covers the aggregate, III-2 covers deterministic execution and reset, III-3 covers versioned profiles, III-4 covers memory regions, snapshots, persistence, and corruption, III-5 covers fault lifecycle and DTC intent, and III-6 covers semantic signal contracts and gateway routing hooks.</w:t>
+        <w:t>. III-1 covers the aggregate, III-2 covers deterministic execution and reset, III-3 covers versioned profiles, III-4 covers memory regions, snapshots, persistence, and corruption, III-5 covers fault lifecycle and DTC intent, and III-6 covers semantic signal contracts and gateway routing hooks. III-7 covers multi-ECU scenarios, logical-clock diagnostics, bounded resource evidence, and deterministic campaigns.</w:t>
       </w:r>
     </w:p>
     <w:p>
@@ -5131,6 +5673,66 @@
     </w:p>
     <w:p>
       <w:pPr>
+        <w:pStyle w:val="Heading2"/>
+        <w:keepNext/>
+        <w:keepLines/>
+      </w:pPr>
+      <w:r>
+        <w:t>ADR-ECU-014 — Orchestrate Existing Commands Instead of Duplicating ECU Behavior</w:t>
+      </w:r>
+    </w:p>
+    <w:p>
+      <w:r>
+        <w:rPr>
+          <w:rFonts w:ascii="Calibri" w:hAnsi="Calibri"/>
+          <w:color w:val="111827"/>
+          <w:sz w:val="22"/>
+        </w:rPr>
+        <w:t>Scenario actions call the already validated ECU primitives and calculate optimistic versions at the point of execution. This keeps fault, memory, timing, and signal invariants in one implementation.</w:t>
+      </w:r>
+    </w:p>
+    <w:p>
+      <w:pPr>
+        <w:pStyle w:val="Heading2"/>
+        <w:keepNext/>
+        <w:keepLines/>
+      </w:pPr>
+      <w:r>
+        <w:t>ADR-ECU-015 — Treat Logical Clocks as Timing Diagnostics</w:t>
+      </w:r>
+    </w:p>
+    <w:p>
+      <w:r>
+        <w:rPr>
+          <w:rFonts w:ascii="Calibri" w:hAnsi="Calibri"/>
+          <w:color w:val="111827"/>
+          <w:sz w:val="22"/>
+        </w:rPr>
+        <w:t>Clock skew and lag come only from ECU simulation clocks. Host CPU/GPU load and wall-clock duration describe the test environment, not vehicle behavior, and therefore never affect scenario results.</w:t>
+      </w:r>
+    </w:p>
+    <w:p>
+      <w:pPr>
+        <w:pStyle w:val="Heading2"/>
+        <w:keepNext/>
+        <w:keepLines/>
+      </w:pPr>
+      <w:r>
+        <w:t>ADR-ECU-016 — Bound and Minimize Campaign Evidence</w:t>
+      </w:r>
+    </w:p>
+    <w:p>
+      <w:r>
+        <w:rPr>
+          <w:rFonts w:ascii="Calibri" w:hAnsi="Calibri"/>
+          <w:color w:val="111827"/>
+          <w:sz w:val="22"/>
+        </w:rPr>
+        <w:t>Iteration, action, and ECU limits cap response and transaction size. Aggregate evidence retains identities, counts, versions, and skew while excluding memory images, physical values, and full faults.</w:t>
+      </w:r>
+    </w:p>
+    <w:p>
+      <w:pPr>
         <w:pStyle w:val="Heading1"/>
         <w:keepNext/>
         <w:keepLines/>
@@ -12048,6 +12650,1379 @@
                 <w:sz w:val="17"/>
               </w:rPr>
               <w:t>Verify no CAN ID, frame, DBC, arbitration, or bitrate type is imported.</w:t>
+            </w:r>
+          </w:p>
+        </w:tc>
+        <w:tc>
+          <w:tcPr>
+            <w:tcW w:type="dxa" w:w="3260"/>
+            <w:tcMar>
+              <w:top w:w="80" w:type="dxa"/>
+              <w:start w:w="120" w:type="dxa"/>
+              <w:bottom w:w="80" w:type="dxa"/>
+              <w:end w:w="120" w:type="dxa"/>
+            </w:tcMar>
+            <w:vAlign w:val="center"/>
+            <w:shd w:fill="FFFFFF"/>
+          </w:tcPr>
+          <w:p>
+            <w:pPr>
+              <w:spacing w:before="0" w:after="40" w:line="252" w:lineRule="auto"/>
+              <w:jc w:val="left"/>
+            </w:pPr>
+            <w:r>
+              <w:rPr>
+                <w:rFonts w:ascii="Calibri" w:hAnsi="Calibri"/>
+                <w:b w:val="0"/>
+                <w:color w:val="111827"/>
+                <w:sz w:val="17"/>
+              </w:rPr>
+              <w:t>Review</w:t>
+            </w:r>
+          </w:p>
+        </w:tc>
+      </w:tr>
+    </w:tbl>
+    <w:p>
+      <w:pPr>
+        <w:spacing w:after="60"/>
+      </w:pPr>
+    </w:p>
+    <w:p>
+      <w:pPr>
+        <w:pStyle w:val="Heading1"/>
+        <w:keepNext/>
+        <w:keepLines/>
+      </w:pPr>
+      <w:r>
+        <w:t>11.6 III-7 Verification</w:t>
+      </w:r>
+    </w:p>
+    <w:tbl>
+      <w:tblPr>
+        <w:tblW w:type="dxa" w:w="9360"/>
+        <w:jc w:val="left"/>
+        <w:tblLayout w:type="fixed"/>
+        <w:tblLook w:firstColumn="1" w:firstRow="1" w:lastColumn="0" w:lastRow="0" w:noHBand="0" w:noVBand="1" w:val="04A0"/>
+        <w:tblInd w:w="120" w:type="dxa"/>
+        <w:tblBorders>
+          <w:top w:val="single" w:sz="6" w:color="B8C4D1"/>
+          <w:left w:val="single" w:sz="6" w:color="B8C4D1"/>
+          <w:bottom w:val="single" w:sz="6" w:color="B8C4D1"/>
+          <w:right w:val="single" w:sz="6" w:color="B8C4D1"/>
+          <w:insideH w:val="single" w:sz="6" w:color="B8C4D1"/>
+          <w:insideV w:val="single" w:sz="6" w:color="B8C4D1"/>
+        </w:tblBorders>
+      </w:tblPr>
+      <w:tblGrid>
+        <w:gridCol w:w="1650"/>
+        <w:gridCol w:w="4450"/>
+        <w:gridCol w:w="3260"/>
+      </w:tblGrid>
+      <w:tr>
+        <w:trPr>
+          <w:tblHeader w:val="true"/>
+          <w:cantSplit/>
+        </w:trPr>
+        <w:tc>
+          <w:tcPr>
+            <w:tcW w:type="dxa" w:w="1650"/>
+            <w:tcMar>
+              <w:top w:w="80" w:type="dxa"/>
+              <w:start w:w="120" w:type="dxa"/>
+              <w:bottom w:w="80" w:type="dxa"/>
+              <w:end w:w="120" w:type="dxa"/>
+            </w:tcMar>
+            <w:vAlign w:val="center"/>
+            <w:shd w:fill="E8EEF5"/>
+          </w:tcPr>
+          <w:p>
+            <w:pPr>
+              <w:spacing w:before="0" w:after="40" w:line="252" w:lineRule="auto"/>
+              <w:jc w:val="center"/>
+            </w:pPr>
+            <w:r>
+              <w:rPr>
+                <w:rFonts w:ascii="Calibri" w:hAnsi="Calibri"/>
+                <w:b/>
+                <w:color w:val="0B2545"/>
+                <w:sz w:val="17"/>
+              </w:rPr>
+              <w:t>Test</w:t>
+            </w:r>
+          </w:p>
+        </w:tc>
+        <w:tc>
+          <w:tcPr>
+            <w:tcW w:type="dxa" w:w="4450"/>
+            <w:tcMar>
+              <w:top w:w="80" w:type="dxa"/>
+              <w:start w:w="120" w:type="dxa"/>
+              <w:bottom w:w="80" w:type="dxa"/>
+              <w:end w:w="120" w:type="dxa"/>
+            </w:tcMar>
+            <w:vAlign w:val="center"/>
+            <w:shd w:fill="E8EEF5"/>
+          </w:tcPr>
+          <w:p>
+            <w:pPr>
+              <w:spacing w:before="0" w:after="40" w:line="252" w:lineRule="auto"/>
+              <w:jc w:val="left"/>
+            </w:pPr>
+            <w:r>
+              <w:rPr>
+                <w:rFonts w:ascii="Calibri" w:hAnsi="Calibri"/>
+                <w:b/>
+                <w:color w:val="0B2545"/>
+                <w:sz w:val="17"/>
+              </w:rPr>
+              <w:t>Objective</w:t>
+            </w:r>
+          </w:p>
+        </w:tc>
+        <w:tc>
+          <w:tcPr>
+            <w:tcW w:type="dxa" w:w="3260"/>
+            <w:tcMar>
+              <w:top w:w="80" w:type="dxa"/>
+              <w:start w:w="120" w:type="dxa"/>
+              <w:bottom w:w="80" w:type="dxa"/>
+              <w:end w:w="120" w:type="dxa"/>
+            </w:tcMar>
+            <w:vAlign w:val="center"/>
+            <w:shd w:fill="E8EEF5"/>
+          </w:tcPr>
+          <w:p>
+            <w:pPr>
+              <w:spacing w:before="0" w:after="40" w:line="252" w:lineRule="auto"/>
+              <w:jc w:val="left"/>
+            </w:pPr>
+            <w:r>
+              <w:rPr>
+                <w:rFonts w:ascii="Calibri" w:hAnsi="Calibri"/>
+                <w:b/>
+                <w:color w:val="0B2545"/>
+                <w:sz w:val="17"/>
+              </w:rPr>
+              <w:t>Level</w:t>
+            </w:r>
+          </w:p>
+        </w:tc>
+      </w:tr>
+      <w:tr>
+        <w:trPr>
+          <w:cantSplit/>
+        </w:trPr>
+        <w:tc>
+          <w:tcPr>
+            <w:tcW w:type="dxa" w:w="1650"/>
+            <w:tcMar>
+              <w:top w:w="80" w:type="dxa"/>
+              <w:start w:w="120" w:type="dxa"/>
+              <w:bottom w:w="80" w:type="dxa"/>
+              <w:end w:w="120" w:type="dxa"/>
+            </w:tcMar>
+            <w:vAlign w:val="center"/>
+            <w:shd w:fill="FFFFFF"/>
+          </w:tcPr>
+          <w:p>
+            <w:pPr>
+              <w:spacing w:before="0" w:after="40" w:line="252" w:lineRule="auto"/>
+              <w:jc w:val="center"/>
+            </w:pPr>
+            <w:r>
+              <w:rPr>
+                <w:rFonts w:ascii="Calibri" w:hAnsi="Calibri"/>
+                <w:b w:val="0"/>
+                <w:color w:val="111827"/>
+                <w:sz w:val="17"/>
+              </w:rPr>
+              <w:t>Action contract</w:t>
+            </w:r>
+          </w:p>
+        </w:tc>
+        <w:tc>
+          <w:tcPr>
+            <w:tcW w:type="dxa" w:w="4450"/>
+            <w:tcMar>
+              <w:top w:w="80" w:type="dxa"/>
+              <w:start w:w="120" w:type="dxa"/>
+              <w:bottom w:w="80" w:type="dxa"/>
+              <w:end w:w="120" w:type="dxa"/>
+            </w:tcMar>
+            <w:vAlign w:val="center"/>
+            <w:shd w:fill="FFFFFF"/>
+          </w:tcPr>
+          <w:p>
+            <w:pPr>
+              <w:spacing w:before="0" w:after="40" w:line="252" w:lineRule="auto"/>
+              <w:jc w:val="left"/>
+            </w:pPr>
+            <w:r>
+              <w:rPr>
+                <w:rFonts w:ascii="Calibri" w:hAnsi="Calibri"/>
+                <w:b w:val="0"/>
+                <w:color w:val="111827"/>
+                <w:sz w:val="17"/>
+              </w:rPr>
+              <w:t>Require kind-specific fields and reject the 33rd action.</w:t>
+            </w:r>
+          </w:p>
+        </w:tc>
+        <w:tc>
+          <w:tcPr>
+            <w:tcW w:type="dxa" w:w="3260"/>
+            <w:tcMar>
+              <w:top w:w="80" w:type="dxa"/>
+              <w:start w:w="120" w:type="dxa"/>
+              <w:bottom w:w="80" w:type="dxa"/>
+              <w:end w:w="120" w:type="dxa"/>
+            </w:tcMar>
+            <w:vAlign w:val="center"/>
+            <w:shd w:fill="FFFFFF"/>
+          </w:tcPr>
+          <w:p>
+            <w:pPr>
+              <w:spacing w:before="0" w:after="40" w:line="252" w:lineRule="auto"/>
+              <w:jc w:val="left"/>
+            </w:pPr>
+            <w:r>
+              <w:rPr>
+                <w:rFonts w:ascii="Calibri" w:hAnsi="Calibri"/>
+                <w:b w:val="0"/>
+                <w:color w:val="111827"/>
+                <w:sz w:val="17"/>
+              </w:rPr>
+              <w:t>Schema</w:t>
+            </w:r>
+          </w:p>
+        </w:tc>
+      </w:tr>
+      <w:tr>
+        <w:trPr>
+          <w:cantSplit/>
+        </w:trPr>
+        <w:tc>
+          <w:tcPr>
+            <w:tcW w:type="dxa" w:w="1650"/>
+            <w:tcMar>
+              <w:top w:w="80" w:type="dxa"/>
+              <w:start w:w="120" w:type="dxa"/>
+              <w:bottom w:w="80" w:type="dxa"/>
+              <w:end w:w="120" w:type="dxa"/>
+            </w:tcMar>
+            <w:vAlign w:val="center"/>
+            <w:shd w:fill="FFFFFF"/>
+          </w:tcPr>
+          <w:p>
+            <w:pPr>
+              <w:spacing w:before="0" w:after="40" w:line="252" w:lineRule="auto"/>
+              <w:jc w:val="center"/>
+            </w:pPr>
+            <w:r>
+              <w:rPr>
+                <w:rFonts w:ascii="Calibri" w:hAnsi="Calibri"/>
+                <w:b w:val="0"/>
+                <w:color w:val="111827"/>
+                <w:sz w:val="17"/>
+              </w:rPr>
+              <w:t>ECU scope</w:t>
+            </w:r>
+          </w:p>
+        </w:tc>
+        <w:tc>
+          <w:tcPr>
+            <w:tcW w:type="dxa" w:w="4450"/>
+            <w:tcMar>
+              <w:top w:w="80" w:type="dxa"/>
+              <w:start w:w="120" w:type="dxa"/>
+              <w:bottom w:w="80" w:type="dxa"/>
+              <w:end w:w="120" w:type="dxa"/>
+            </w:tcMar>
+            <w:vAlign w:val="center"/>
+            <w:shd w:fill="FFFFFF"/>
+          </w:tcPr>
+          <w:p>
+            <w:pPr>
+              <w:spacing w:before="0" w:after="40" w:line="252" w:lineRule="auto"/>
+              <w:jc w:val="left"/>
+            </w:pPr>
+            <w:r>
+              <w:rPr>
+                <w:rFonts w:ascii="Calibri" w:hAnsi="Calibri"/>
+                <w:b w:val="0"/>
+                <w:color w:val="111827"/>
+                <w:sz w:val="17"/>
+              </w:rPr>
+              <w:t>Reject a scenario referencing more than 16 ECUs.</w:t>
+            </w:r>
+          </w:p>
+        </w:tc>
+        <w:tc>
+          <w:tcPr>
+            <w:tcW w:type="dxa" w:w="3260"/>
+            <w:tcMar>
+              <w:top w:w="80" w:type="dxa"/>
+              <w:start w:w="120" w:type="dxa"/>
+              <w:bottom w:w="80" w:type="dxa"/>
+              <w:end w:w="120" w:type="dxa"/>
+            </w:tcMar>
+            <w:vAlign w:val="center"/>
+            <w:shd w:fill="FFFFFF"/>
+          </w:tcPr>
+          <w:p>
+            <w:pPr>
+              <w:spacing w:before="0" w:after="40" w:line="252" w:lineRule="auto"/>
+              <w:jc w:val="left"/>
+            </w:pPr>
+            <w:r>
+              <w:rPr>
+                <w:rFonts w:ascii="Calibri" w:hAnsi="Calibri"/>
+                <w:b w:val="0"/>
+                <w:color w:val="111827"/>
+                <w:sz w:val="17"/>
+              </w:rPr>
+              <w:t>Schema</w:t>
+            </w:r>
+          </w:p>
+        </w:tc>
+      </w:tr>
+      <w:tr>
+        <w:trPr>
+          <w:cantSplit/>
+        </w:trPr>
+        <w:tc>
+          <w:tcPr>
+            <w:tcW w:type="dxa" w:w="1650"/>
+            <w:tcMar>
+              <w:top w:w="80" w:type="dxa"/>
+              <w:start w:w="120" w:type="dxa"/>
+              <w:bottom w:w="80" w:type="dxa"/>
+              <w:end w:w="120" w:type="dxa"/>
+            </w:tcMar>
+            <w:vAlign w:val="center"/>
+            <w:shd w:fill="FFFFFF"/>
+          </w:tcPr>
+          <w:p>
+            <w:pPr>
+              <w:spacing w:before="0" w:after="40" w:line="252" w:lineRule="auto"/>
+              <w:jc w:val="center"/>
+            </w:pPr>
+            <w:r>
+              <w:rPr>
+                <w:rFonts w:ascii="Calibri" w:hAnsi="Calibri"/>
+                <w:b w:val="0"/>
+                <w:color w:val="111827"/>
+                <w:sz w:val="17"/>
+              </w:rPr>
+              <w:t>Campaign bound</w:t>
+            </w:r>
+          </w:p>
+        </w:tc>
+        <w:tc>
+          <w:tcPr>
+            <w:tcW w:type="dxa" w:w="4450"/>
+            <w:tcMar>
+              <w:top w:w="80" w:type="dxa"/>
+              <w:start w:w="120" w:type="dxa"/>
+              <w:bottom w:w="80" w:type="dxa"/>
+              <w:end w:w="120" w:type="dxa"/>
+            </w:tcMar>
+            <w:vAlign w:val="center"/>
+            <w:shd w:fill="FFFFFF"/>
+          </w:tcPr>
+          <w:p>
+            <w:pPr>
+              <w:spacing w:before="0" w:after="40" w:line="252" w:lineRule="auto"/>
+              <w:jc w:val="left"/>
+            </w:pPr>
+            <w:r>
+              <w:rPr>
+                <w:rFonts w:ascii="Calibri" w:hAnsi="Calibri"/>
+                <w:b w:val="0"/>
+                <w:color w:val="111827"/>
+                <w:sz w:val="17"/>
+              </w:rPr>
+              <w:t>Reject the ninth iteration and cap results at 256 summaries.</w:t>
+            </w:r>
+          </w:p>
+        </w:tc>
+        <w:tc>
+          <w:tcPr>
+            <w:tcW w:type="dxa" w:w="3260"/>
+            <w:tcMar>
+              <w:top w:w="80" w:type="dxa"/>
+              <w:start w:w="120" w:type="dxa"/>
+              <w:bottom w:w="80" w:type="dxa"/>
+              <w:end w:w="120" w:type="dxa"/>
+            </w:tcMar>
+            <w:vAlign w:val="center"/>
+            <w:shd w:fill="FFFFFF"/>
+          </w:tcPr>
+          <w:p>
+            <w:pPr>
+              <w:spacing w:before="0" w:after="40" w:line="252" w:lineRule="auto"/>
+              <w:jc w:val="left"/>
+            </w:pPr>
+            <w:r>
+              <w:rPr>
+                <w:rFonts w:ascii="Calibri" w:hAnsi="Calibri"/>
+                <w:b w:val="0"/>
+                <w:color w:val="111827"/>
+                <w:sz w:val="17"/>
+              </w:rPr>
+              <w:t>Schema</w:t>
+            </w:r>
+          </w:p>
+        </w:tc>
+      </w:tr>
+      <w:tr>
+        <w:trPr>
+          <w:cantSplit/>
+        </w:trPr>
+        <w:tc>
+          <w:tcPr>
+            <w:tcW w:type="dxa" w:w="1650"/>
+            <w:tcMar>
+              <w:top w:w="80" w:type="dxa"/>
+              <w:start w:w="120" w:type="dxa"/>
+              <w:bottom w:w="80" w:type="dxa"/>
+              <w:end w:w="120" w:type="dxa"/>
+            </w:tcMar>
+            <w:vAlign w:val="center"/>
+            <w:shd w:fill="FFFFFF"/>
+          </w:tcPr>
+          <w:p>
+            <w:pPr>
+              <w:spacing w:before="0" w:after="40" w:line="252" w:lineRule="auto"/>
+              <w:jc w:val="center"/>
+            </w:pPr>
+            <w:r>
+              <w:rPr>
+                <w:rFonts w:ascii="Calibri" w:hAnsi="Calibri"/>
+                <w:b w:val="0"/>
+                <w:color w:val="111827"/>
+                <w:sz w:val="17"/>
+              </w:rPr>
+              <w:t>Ordered orchestration</w:t>
+            </w:r>
+          </w:p>
+        </w:tc>
+        <w:tc>
+          <w:tcPr>
+            <w:tcW w:type="dxa" w:w="4450"/>
+            <w:tcMar>
+              <w:top w:w="80" w:type="dxa"/>
+              <w:start w:w="120" w:type="dxa"/>
+              <w:bottom w:w="80" w:type="dxa"/>
+              <w:end w:w="120" w:type="dxa"/>
+            </w:tcMar>
+            <w:vAlign w:val="center"/>
+            <w:shd w:fill="FFFFFF"/>
+          </w:tcPr>
+          <w:p>
+            <w:pPr>
+              <w:spacing w:before="0" w:after="40" w:line="252" w:lineRule="auto"/>
+              <w:jc w:val="left"/>
+            </w:pPr>
+            <w:r>
+              <w:rPr>
+                <w:rFonts w:ascii="Calibri" w:hAnsi="Calibri"/>
+                <w:b w:val="0"/>
+                <w:color w:val="111827"/>
+                <w:sz w:val="17"/>
+              </w:rPr>
+              <w:t>Execute existing ECU commands in declared iteration/action order.</w:t>
+            </w:r>
+          </w:p>
+        </w:tc>
+        <w:tc>
+          <w:tcPr>
+            <w:tcW w:type="dxa" w:w="3260"/>
+            <w:tcMar>
+              <w:top w:w="80" w:type="dxa"/>
+              <w:start w:w="120" w:type="dxa"/>
+              <w:bottom w:w="80" w:type="dxa"/>
+              <w:end w:w="120" w:type="dxa"/>
+            </w:tcMar>
+            <w:vAlign w:val="center"/>
+            <w:shd w:fill="FFFFFF"/>
+          </w:tcPr>
+          <w:p>
+            <w:pPr>
+              <w:spacing w:before="0" w:after="40" w:line="252" w:lineRule="auto"/>
+              <w:jc w:val="left"/>
+            </w:pPr>
+            <w:r>
+              <w:rPr>
+                <w:rFonts w:ascii="Calibri" w:hAnsi="Calibri"/>
+                <w:b w:val="0"/>
+                <w:color w:val="111827"/>
+                <w:sz w:val="17"/>
+              </w:rPr>
+              <w:t>Service</w:t>
+            </w:r>
+          </w:p>
+        </w:tc>
+      </w:tr>
+      <w:tr>
+        <w:trPr>
+          <w:cantSplit/>
+        </w:trPr>
+        <w:tc>
+          <w:tcPr>
+            <w:tcW w:type="dxa" w:w="1650"/>
+            <w:tcMar>
+              <w:top w:w="80" w:type="dxa"/>
+              <w:start w:w="120" w:type="dxa"/>
+              <w:bottom w:w="80" w:type="dxa"/>
+              <w:end w:w="120" w:type="dxa"/>
+            </w:tcMar>
+            <w:vAlign w:val="center"/>
+            <w:shd w:fill="FFFFFF"/>
+          </w:tcPr>
+          <w:p>
+            <w:pPr>
+              <w:spacing w:before="0" w:after="40" w:line="252" w:lineRule="auto"/>
+              <w:jc w:val="center"/>
+            </w:pPr>
+            <w:r>
+              <w:rPr>
+                <w:rFonts w:ascii="Calibri" w:hAnsi="Calibri"/>
+                <w:b w:val="0"/>
+                <w:color w:val="111827"/>
+                <w:sz w:val="17"/>
+              </w:rPr>
+              <w:t>Deterministic seed</w:t>
+            </w:r>
+          </w:p>
+        </w:tc>
+        <w:tc>
+          <w:tcPr>
+            <w:tcW w:type="dxa" w:w="4450"/>
+            <w:tcMar>
+              <w:top w:w="80" w:type="dxa"/>
+              <w:start w:w="120" w:type="dxa"/>
+              <w:bottom w:w="80" w:type="dxa"/>
+              <w:end w:w="120" w:type="dxa"/>
+            </w:tcMar>
+            <w:vAlign w:val="center"/>
+            <w:shd w:fill="FFFFFF"/>
+          </w:tcPr>
+          <w:p>
+            <w:pPr>
+              <w:spacing w:before="0" w:after="40" w:line="252" w:lineRule="auto"/>
+              <w:jc w:val="left"/>
+            </w:pPr>
+            <w:r>
+              <w:rPr>
+                <w:rFonts w:ascii="Calibri" w:hAnsi="Calibri"/>
+                <w:b w:val="0"/>
+                <w:color w:val="111827"/>
+                <w:sz w:val="17"/>
+              </w:rPr>
+              <w:t>Derive the same corruption seed and command identity from the same coordinates.</w:t>
+            </w:r>
+          </w:p>
+        </w:tc>
+        <w:tc>
+          <w:tcPr>
+            <w:tcW w:type="dxa" w:w="3260"/>
+            <w:tcMar>
+              <w:top w:w="80" w:type="dxa"/>
+              <w:start w:w="120" w:type="dxa"/>
+              <w:bottom w:w="80" w:type="dxa"/>
+              <w:end w:w="120" w:type="dxa"/>
+            </w:tcMar>
+            <w:vAlign w:val="center"/>
+            <w:shd w:fill="FFFFFF"/>
+          </w:tcPr>
+          <w:p>
+            <w:pPr>
+              <w:spacing w:before="0" w:after="40" w:line="252" w:lineRule="auto"/>
+              <w:jc w:val="left"/>
+            </w:pPr>
+            <w:r>
+              <w:rPr>
+                <w:rFonts w:ascii="Calibri" w:hAnsi="Calibri"/>
+                <w:b w:val="0"/>
+                <w:color w:val="111827"/>
+                <w:sz w:val="17"/>
+              </w:rPr>
+              <w:t>Unit/service</w:t>
+            </w:r>
+          </w:p>
+        </w:tc>
+      </w:tr>
+      <w:tr>
+        <w:trPr>
+          <w:cantSplit/>
+        </w:trPr>
+        <w:tc>
+          <w:tcPr>
+            <w:tcW w:type="dxa" w:w="1650"/>
+            <w:tcMar>
+              <w:top w:w="80" w:type="dxa"/>
+              <w:start w:w="120" w:type="dxa"/>
+              <w:bottom w:w="80" w:type="dxa"/>
+              <w:end w:w="120" w:type="dxa"/>
+            </w:tcMar>
+            <w:vAlign w:val="center"/>
+            <w:shd w:fill="FFFFFF"/>
+          </w:tcPr>
+          <w:p>
+            <w:pPr>
+              <w:spacing w:before="0" w:after="40" w:line="252" w:lineRule="auto"/>
+              <w:jc w:val="center"/>
+            </w:pPr>
+            <w:r>
+              <w:rPr>
+                <w:rFonts w:ascii="Calibri" w:hAnsi="Calibri"/>
+                <w:b w:val="0"/>
+                <w:color w:val="111827"/>
+                <w:sz w:val="17"/>
+              </w:rPr>
+              <w:t>Timing diagnostic</w:t>
+            </w:r>
+          </w:p>
+        </w:tc>
+        <w:tc>
+          <w:tcPr>
+            <w:tcW w:type="dxa" w:w="4450"/>
+            <w:tcMar>
+              <w:top w:w="80" w:type="dxa"/>
+              <w:start w:w="120" w:type="dxa"/>
+              <w:bottom w:w="80" w:type="dxa"/>
+              <w:end w:w="120" w:type="dxa"/>
+            </w:tcMar>
+            <w:vAlign w:val="center"/>
+            <w:shd w:fill="FFFFFF"/>
+          </w:tcPr>
+          <w:p>
+            <w:pPr>
+              <w:spacing w:before="0" w:after="40" w:line="252" w:lineRule="auto"/>
+              <w:jc w:val="left"/>
+            </w:pPr>
+            <w:r>
+              <w:rPr>
+                <w:rFonts w:ascii="Calibri" w:hAnsi="Calibri"/>
+                <w:b w:val="0"/>
+                <w:color w:val="111827"/>
+                <w:sz w:val="17"/>
+              </w:rPr>
+              <w:t>Report logical minimum, maximum, skew, synchronization, and lag.</w:t>
+            </w:r>
+          </w:p>
+        </w:tc>
+        <w:tc>
+          <w:tcPr>
+            <w:tcW w:type="dxa" w:w="3260"/>
+            <w:tcMar>
+              <w:top w:w="80" w:type="dxa"/>
+              <w:start w:w="120" w:type="dxa"/>
+              <w:bottom w:w="80" w:type="dxa"/>
+              <w:end w:w="120" w:type="dxa"/>
+            </w:tcMar>
+            <w:vAlign w:val="center"/>
+            <w:shd w:fill="FFFFFF"/>
+          </w:tcPr>
+          <w:p>
+            <w:pPr>
+              <w:spacing w:before="0" w:after="40" w:line="252" w:lineRule="auto"/>
+              <w:jc w:val="left"/>
+            </w:pPr>
+            <w:r>
+              <w:rPr>
+                <w:rFonts w:ascii="Calibri" w:hAnsi="Calibri"/>
+                <w:b w:val="0"/>
+                <w:color w:val="111827"/>
+                <w:sz w:val="17"/>
+              </w:rPr>
+              <w:t>Service</w:t>
+            </w:r>
+          </w:p>
+        </w:tc>
+      </w:tr>
+      <w:tr>
+        <w:trPr>
+          <w:cantSplit/>
+        </w:trPr>
+        <w:tc>
+          <w:tcPr>
+            <w:tcW w:type="dxa" w:w="1650"/>
+            <w:tcMar>
+              <w:top w:w="80" w:type="dxa"/>
+              <w:start w:w="120" w:type="dxa"/>
+              <w:bottom w:w="80" w:type="dxa"/>
+              <w:end w:w="120" w:type="dxa"/>
+            </w:tcMar>
+            <w:vAlign w:val="center"/>
+            <w:shd w:fill="FFFFFF"/>
+          </w:tcPr>
+          <w:p>
+            <w:pPr>
+              <w:spacing w:before="0" w:after="40" w:line="252" w:lineRule="auto"/>
+              <w:jc w:val="center"/>
+            </w:pPr>
+            <w:r>
+              <w:rPr>
+                <w:rFonts w:ascii="Calibri" w:hAnsi="Calibri"/>
+                <w:b w:val="0"/>
+                <w:color w:val="111827"/>
+                <w:sz w:val="17"/>
+              </w:rPr>
+              <w:t>Resource evidence</w:t>
+            </w:r>
+          </w:p>
+        </w:tc>
+        <w:tc>
+          <w:tcPr>
+            <w:tcW w:type="dxa" w:w="4450"/>
+            <w:tcMar>
+              <w:top w:w="80" w:type="dxa"/>
+              <w:start w:w="120" w:type="dxa"/>
+              <w:bottom w:w="80" w:type="dxa"/>
+              <w:end w:w="120" w:type="dxa"/>
+            </w:tcMar>
+            <w:vAlign w:val="center"/>
+            <w:shd w:fill="FFFFFF"/>
+          </w:tcPr>
+          <w:p>
+            <w:pPr>
+              <w:spacing w:before="0" w:after="40" w:line="252" w:lineRule="auto"/>
+              <w:jc w:val="left"/>
+            </w:pPr>
+            <w:r>
+              <w:rPr>
+                <w:rFonts w:ascii="Calibri" w:hAnsi="Calibri"/>
+                <w:b w:val="0"/>
+                <w:color w:val="111827"/>
+                <w:sz w:val="17"/>
+              </w:rPr>
+              <w:t>Compare bounded before/after aggregate counts without host sampling.</w:t>
+            </w:r>
+          </w:p>
+        </w:tc>
+        <w:tc>
+          <w:tcPr>
+            <w:tcW w:type="dxa" w:w="3260"/>
+            <w:tcMar>
+              <w:top w:w="80" w:type="dxa"/>
+              <w:start w:w="120" w:type="dxa"/>
+              <w:bottom w:w="80" w:type="dxa"/>
+              <w:end w:w="120" w:type="dxa"/>
+            </w:tcMar>
+            <w:vAlign w:val="center"/>
+            <w:shd w:fill="FFFFFF"/>
+          </w:tcPr>
+          <w:p>
+            <w:pPr>
+              <w:spacing w:before="0" w:after="40" w:line="252" w:lineRule="auto"/>
+              <w:jc w:val="left"/>
+            </w:pPr>
+            <w:r>
+              <w:rPr>
+                <w:rFonts w:ascii="Calibri" w:hAnsi="Calibri"/>
+                <w:b w:val="0"/>
+                <w:color w:val="111827"/>
+                <w:sz w:val="17"/>
+              </w:rPr>
+              <w:t>Service</w:t>
+            </w:r>
+          </w:p>
+        </w:tc>
+      </w:tr>
+      <w:tr>
+        <w:trPr>
+          <w:cantSplit/>
+        </w:trPr>
+        <w:tc>
+          <w:tcPr>
+            <w:tcW w:type="dxa" w:w="1650"/>
+            <w:tcMar>
+              <w:top w:w="80" w:type="dxa"/>
+              <w:start w:w="120" w:type="dxa"/>
+              <w:bottom w:w="80" w:type="dxa"/>
+              <w:end w:w="120" w:type="dxa"/>
+            </w:tcMar>
+            <w:vAlign w:val="center"/>
+            <w:shd w:fill="FFFFFF"/>
+          </w:tcPr>
+          <w:p>
+            <w:pPr>
+              <w:spacing w:before="0" w:after="40" w:line="252" w:lineRule="auto"/>
+              <w:jc w:val="center"/>
+            </w:pPr>
+            <w:r>
+              <w:rPr>
+                <w:rFonts w:ascii="Calibri" w:hAnsi="Calibri"/>
+                <w:b w:val="0"/>
+                <w:color w:val="111827"/>
+                <w:sz w:val="17"/>
+              </w:rPr>
+              <w:t>Exact replay</w:t>
+            </w:r>
+          </w:p>
+        </w:tc>
+        <w:tc>
+          <w:tcPr>
+            <w:tcW w:type="dxa" w:w="4450"/>
+            <w:tcMar>
+              <w:top w:w="80" w:type="dxa"/>
+              <w:start w:w="120" w:type="dxa"/>
+              <w:bottom w:w="80" w:type="dxa"/>
+              <w:end w:w="120" w:type="dxa"/>
+            </w:tcMar>
+            <w:vAlign w:val="center"/>
+            <w:shd w:fill="FFFFFF"/>
+          </w:tcPr>
+          <w:p>
+            <w:pPr>
+              <w:spacing w:before="0" w:after="40" w:line="252" w:lineRule="auto"/>
+              <w:jc w:val="left"/>
+            </w:pPr>
+            <w:r>
+              <w:rPr>
+                <w:rFonts w:ascii="Calibri" w:hAnsi="Calibri"/>
+                <w:b w:val="0"/>
+                <w:color w:val="111827"/>
+                <w:sz w:val="17"/>
+              </w:rPr>
+              <w:t>Return persisted evidence without applying actions twice.</w:t>
+            </w:r>
+          </w:p>
+        </w:tc>
+        <w:tc>
+          <w:tcPr>
+            <w:tcW w:type="dxa" w:w="3260"/>
+            <w:tcMar>
+              <w:top w:w="80" w:type="dxa"/>
+              <w:start w:w="120" w:type="dxa"/>
+              <w:bottom w:w="80" w:type="dxa"/>
+              <w:end w:w="120" w:type="dxa"/>
+            </w:tcMar>
+            <w:vAlign w:val="center"/>
+            <w:shd w:fill="FFFFFF"/>
+          </w:tcPr>
+          <w:p>
+            <w:pPr>
+              <w:spacing w:before="0" w:after="40" w:line="252" w:lineRule="auto"/>
+              <w:jc w:val="left"/>
+            </w:pPr>
+            <w:r>
+              <w:rPr>
+                <w:rFonts w:ascii="Calibri" w:hAnsi="Calibri"/>
+                <w:b w:val="0"/>
+                <w:color w:val="111827"/>
+                <w:sz w:val="17"/>
+              </w:rPr>
+              <w:t>Service/API</w:t>
+            </w:r>
+          </w:p>
+        </w:tc>
+      </w:tr>
+      <w:tr>
+        <w:trPr>
+          <w:cantSplit/>
+        </w:trPr>
+        <w:tc>
+          <w:tcPr>
+            <w:tcW w:type="dxa" w:w="1650"/>
+            <w:tcMar>
+              <w:top w:w="80" w:type="dxa"/>
+              <w:start w:w="120" w:type="dxa"/>
+              <w:bottom w:w="80" w:type="dxa"/>
+              <w:end w:w="120" w:type="dxa"/>
+            </w:tcMar>
+            <w:vAlign w:val="center"/>
+            <w:shd w:fill="FFFFFF"/>
+          </w:tcPr>
+          <w:p>
+            <w:pPr>
+              <w:spacing w:before="0" w:after="40" w:line="252" w:lineRule="auto"/>
+              <w:jc w:val="center"/>
+            </w:pPr>
+            <w:r>
+              <w:rPr>
+                <w:rFonts w:ascii="Calibri" w:hAnsi="Calibri"/>
+                <w:b w:val="0"/>
+                <w:color w:val="111827"/>
+                <w:sz w:val="17"/>
+              </w:rPr>
+              <w:t>Execution-ID conflict</w:t>
+            </w:r>
+          </w:p>
+        </w:tc>
+        <w:tc>
+          <w:tcPr>
+            <w:tcW w:type="dxa" w:w="4450"/>
+            <w:tcMar>
+              <w:top w:w="80" w:type="dxa"/>
+              <w:start w:w="120" w:type="dxa"/>
+              <w:bottom w:w="80" w:type="dxa"/>
+              <w:end w:w="120" w:type="dxa"/>
+            </w:tcMar>
+            <w:vAlign w:val="center"/>
+            <w:shd w:fill="FFFFFF"/>
+          </w:tcPr>
+          <w:p>
+            <w:pPr>
+              <w:spacing w:before="0" w:after="40" w:line="252" w:lineRule="auto"/>
+              <w:jc w:val="left"/>
+            </w:pPr>
+            <w:r>
+              <w:rPr>
+                <w:rFonts w:ascii="Calibri" w:hAnsi="Calibri"/>
+                <w:b w:val="0"/>
+                <w:color w:val="111827"/>
+                <w:sz w:val="17"/>
+              </w:rPr>
+              <w:t>Return one stable conflict for a changed request.</w:t>
+            </w:r>
+          </w:p>
+        </w:tc>
+        <w:tc>
+          <w:tcPr>
+            <w:tcW w:type="dxa" w:w="3260"/>
+            <w:tcMar>
+              <w:top w:w="80" w:type="dxa"/>
+              <w:start w:w="120" w:type="dxa"/>
+              <w:bottom w:w="80" w:type="dxa"/>
+              <w:end w:w="120" w:type="dxa"/>
+            </w:tcMar>
+            <w:vAlign w:val="center"/>
+            <w:shd w:fill="FFFFFF"/>
+          </w:tcPr>
+          <w:p>
+            <w:pPr>
+              <w:spacing w:before="0" w:after="40" w:line="252" w:lineRule="auto"/>
+              <w:jc w:val="left"/>
+            </w:pPr>
+            <w:r>
+              <w:rPr>
+                <w:rFonts w:ascii="Calibri" w:hAnsi="Calibri"/>
+                <w:b w:val="0"/>
+                <w:color w:val="111827"/>
+                <w:sz w:val="17"/>
+              </w:rPr>
+              <w:t>Service/API</w:t>
+            </w:r>
+          </w:p>
+        </w:tc>
+      </w:tr>
+      <w:tr>
+        <w:trPr>
+          <w:cantSplit/>
+        </w:trPr>
+        <w:tc>
+          <w:tcPr>
+            <w:tcW w:type="dxa" w:w="1650"/>
+            <w:tcMar>
+              <w:top w:w="80" w:type="dxa"/>
+              <w:start w:w="120" w:type="dxa"/>
+              <w:bottom w:w="80" w:type="dxa"/>
+              <w:end w:w="120" w:type="dxa"/>
+            </w:tcMar>
+            <w:vAlign w:val="center"/>
+            <w:shd w:fill="FFFFFF"/>
+          </w:tcPr>
+          <w:p>
+            <w:pPr>
+              <w:spacing w:before="0" w:after="40" w:line="252" w:lineRule="auto"/>
+              <w:jc w:val="center"/>
+            </w:pPr>
+            <w:r>
+              <w:rPr>
+                <w:rFonts w:ascii="Calibri" w:hAnsi="Calibri"/>
+                <w:b w:val="0"/>
+                <w:color w:val="111827"/>
+                <w:sz w:val="17"/>
+              </w:rPr>
+              <w:t>Concurrent claim</w:t>
+            </w:r>
+          </w:p>
+        </w:tc>
+        <w:tc>
+          <w:tcPr>
+            <w:tcW w:type="dxa" w:w="4450"/>
+            <w:tcMar>
+              <w:top w:w="80" w:type="dxa"/>
+              <w:start w:w="120" w:type="dxa"/>
+              <w:bottom w:w="80" w:type="dxa"/>
+              <w:end w:w="120" w:type="dxa"/>
+            </w:tcMar>
+            <w:vAlign w:val="center"/>
+            <w:shd w:fill="FFFFFF"/>
+          </w:tcPr>
+          <w:p>
+            <w:pPr>
+              <w:spacing w:before="0" w:after="40" w:line="252" w:lineRule="auto"/>
+              <w:jc w:val="left"/>
+            </w:pPr>
+            <w:r>
+              <w:rPr>
+                <w:rFonts w:ascii="Calibri" w:hAnsi="Calibri"/>
+                <w:b w:val="0"/>
+                <w:color w:val="111827"/>
+                <w:sz w:val="17"/>
+              </w:rPr>
+              <w:t>Serialize one vehicle's scenario identifiers with a row lock.</w:t>
+            </w:r>
+          </w:p>
+        </w:tc>
+        <w:tc>
+          <w:tcPr>
+            <w:tcW w:type="dxa" w:w="3260"/>
+            <w:tcMar>
+              <w:top w:w="80" w:type="dxa"/>
+              <w:start w:w="120" w:type="dxa"/>
+              <w:bottom w:w="80" w:type="dxa"/>
+              <w:end w:w="120" w:type="dxa"/>
+            </w:tcMar>
+            <w:vAlign w:val="center"/>
+            <w:shd w:fill="FFFFFF"/>
+          </w:tcPr>
+          <w:p>
+            <w:pPr>
+              <w:spacing w:before="0" w:after="40" w:line="252" w:lineRule="auto"/>
+              <w:jc w:val="left"/>
+            </w:pPr>
+            <w:r>
+              <w:rPr>
+                <w:rFonts w:ascii="Calibri" w:hAnsi="Calibri"/>
+                <w:b w:val="0"/>
+                <w:color w:val="111827"/>
+                <w:sz w:val="17"/>
+              </w:rPr>
+              <w:t>Design/integration</w:t>
+            </w:r>
+          </w:p>
+        </w:tc>
+      </w:tr>
+      <w:tr>
+        <w:trPr>
+          <w:cantSplit/>
+        </w:trPr>
+        <w:tc>
+          <w:tcPr>
+            <w:tcW w:type="dxa" w:w="1650"/>
+            <w:tcMar>
+              <w:top w:w="80" w:type="dxa"/>
+              <w:start w:w="120" w:type="dxa"/>
+              <w:bottom w:w="80" w:type="dxa"/>
+              <w:end w:w="120" w:type="dxa"/>
+            </w:tcMar>
+            <w:vAlign w:val="center"/>
+            <w:shd w:fill="FFFFFF"/>
+          </w:tcPr>
+          <w:p>
+            <w:pPr>
+              <w:spacing w:before="0" w:after="40" w:line="252" w:lineRule="auto"/>
+              <w:jc w:val="center"/>
+            </w:pPr>
+            <w:r>
+              <w:rPr>
+                <w:rFonts w:ascii="Calibri" w:hAnsi="Calibri"/>
+                <w:b w:val="0"/>
+                <w:color w:val="111827"/>
+                <w:sz w:val="17"/>
+              </w:rPr>
+              <w:t>Atomic campaign</w:t>
+            </w:r>
+          </w:p>
+        </w:tc>
+        <w:tc>
+          <w:tcPr>
+            <w:tcW w:type="dxa" w:w="4450"/>
+            <w:tcMar>
+              <w:top w:w="80" w:type="dxa"/>
+              <w:start w:w="120" w:type="dxa"/>
+              <w:bottom w:w="80" w:type="dxa"/>
+              <w:end w:w="120" w:type="dxa"/>
+            </w:tcMar>
+            <w:vAlign w:val="center"/>
+            <w:shd w:fill="FFFFFF"/>
+          </w:tcPr>
+          <w:p>
+            <w:pPr>
+              <w:spacing w:before="0" w:after="40" w:line="252" w:lineRule="auto"/>
+              <w:jc w:val="left"/>
+            </w:pPr>
+            <w:r>
+              <w:rPr>
+                <w:rFonts w:ascii="Calibri" w:hAnsi="Calibri"/>
+                <w:b w:val="0"/>
+                <w:color w:val="111827"/>
+                <w:sz w:val="17"/>
+              </w:rPr>
+              <w:t>Commit primitive mutations, scenario, audit, and outbox together.</w:t>
+            </w:r>
+          </w:p>
+        </w:tc>
+        <w:tc>
+          <w:tcPr>
+            <w:tcW w:type="dxa" w:w="3260"/>
+            <w:tcMar>
+              <w:top w:w="80" w:type="dxa"/>
+              <w:start w:w="120" w:type="dxa"/>
+              <w:bottom w:w="80" w:type="dxa"/>
+              <w:end w:w="120" w:type="dxa"/>
+            </w:tcMar>
+            <w:vAlign w:val="center"/>
+            <w:shd w:fill="FFFFFF"/>
+          </w:tcPr>
+          <w:p>
+            <w:pPr>
+              <w:spacing w:before="0" w:after="40" w:line="252" w:lineRule="auto"/>
+              <w:jc w:val="left"/>
+            </w:pPr>
+            <w:r>
+              <w:rPr>
+                <w:rFonts w:ascii="Calibri" w:hAnsi="Calibri"/>
+                <w:b w:val="0"/>
+                <w:color w:val="111827"/>
+                <w:sz w:val="17"/>
+              </w:rPr>
+              <w:t>Integration</w:t>
+            </w:r>
+          </w:p>
+        </w:tc>
+      </w:tr>
+      <w:tr>
+        <w:trPr>
+          <w:cantSplit/>
+        </w:trPr>
+        <w:tc>
+          <w:tcPr>
+            <w:tcW w:type="dxa" w:w="1650"/>
+            <w:tcMar>
+              <w:top w:w="80" w:type="dxa"/>
+              <w:start w:w="120" w:type="dxa"/>
+              <w:bottom w:w="80" w:type="dxa"/>
+              <w:end w:w="120" w:type="dxa"/>
+            </w:tcMar>
+            <w:vAlign w:val="center"/>
+            <w:shd w:fill="FFFFFF"/>
+          </w:tcPr>
+          <w:p>
+            <w:pPr>
+              <w:spacing w:before="0" w:after="40" w:line="252" w:lineRule="auto"/>
+              <w:jc w:val="center"/>
+            </w:pPr>
+            <w:r>
+              <w:rPr>
+                <w:rFonts w:ascii="Calibri" w:hAnsi="Calibri"/>
+                <w:b w:val="0"/>
+                <w:color w:val="111827"/>
+                <w:sz w:val="17"/>
+              </w:rPr>
+              <w:t>Evidence minimization</w:t>
+            </w:r>
+          </w:p>
+        </w:tc>
+        <w:tc>
+          <w:tcPr>
+            <w:tcW w:type="dxa" w:w="4450"/>
+            <w:tcMar>
+              <w:top w:w="80" w:type="dxa"/>
+              <w:start w:w="120" w:type="dxa"/>
+              <w:bottom w:w="80" w:type="dxa"/>
+              <w:end w:w="120" w:type="dxa"/>
+            </w:tcMar>
+            <w:vAlign w:val="center"/>
+            <w:shd w:fill="FFFFFF"/>
+          </w:tcPr>
+          <w:p>
+            <w:pPr>
+              <w:spacing w:before="0" w:after="40" w:line="252" w:lineRule="auto"/>
+              <w:jc w:val="left"/>
+            </w:pPr>
+            <w:r>
+              <w:rPr>
+                <w:rFonts w:ascii="Calibri" w:hAnsi="Calibri"/>
+                <w:b w:val="0"/>
+                <w:color w:val="111827"/>
+                <w:sz w:val="17"/>
+              </w:rPr>
+              <w:t>Exclude action payloads, physical values, memory, and full faults.</w:t>
+            </w:r>
+          </w:p>
+        </w:tc>
+        <w:tc>
+          <w:tcPr>
+            <w:tcW w:type="dxa" w:w="3260"/>
+            <w:tcMar>
+              <w:top w:w="80" w:type="dxa"/>
+              <w:start w:w="120" w:type="dxa"/>
+              <w:bottom w:w="80" w:type="dxa"/>
+              <w:end w:w="120" w:type="dxa"/>
+            </w:tcMar>
+            <w:vAlign w:val="center"/>
+            <w:shd w:fill="FFFFFF"/>
+          </w:tcPr>
+          <w:p>
+            <w:pPr>
+              <w:spacing w:before="0" w:after="40" w:line="252" w:lineRule="auto"/>
+              <w:jc w:val="left"/>
+            </w:pPr>
+            <w:r>
+              <w:rPr>
+                <w:rFonts w:ascii="Calibri" w:hAnsi="Calibri"/>
+                <w:b w:val="0"/>
+                <w:color w:val="111827"/>
+                <w:sz w:val="17"/>
+              </w:rPr>
+              <w:t>Service</w:t>
+            </w:r>
+          </w:p>
+        </w:tc>
+      </w:tr>
+      <w:tr>
+        <w:trPr>
+          <w:cantSplit/>
+        </w:trPr>
+        <w:tc>
+          <w:tcPr>
+            <w:tcW w:type="dxa" w:w="1650"/>
+            <w:tcMar>
+              <w:top w:w="80" w:type="dxa"/>
+              <w:start w:w="120" w:type="dxa"/>
+              <w:bottom w:w="80" w:type="dxa"/>
+              <w:end w:w="120" w:type="dxa"/>
+            </w:tcMar>
+            <w:vAlign w:val="center"/>
+            <w:shd w:fill="FFFFFF"/>
+          </w:tcPr>
+          <w:p>
+            <w:pPr>
+              <w:spacing w:before="0" w:after="40" w:line="252" w:lineRule="auto"/>
+              <w:jc w:val="center"/>
+            </w:pPr>
+            <w:r>
+              <w:rPr>
+                <w:rFonts w:ascii="Calibri" w:hAnsi="Calibri"/>
+                <w:b w:val="0"/>
+                <w:color w:val="111827"/>
+                <w:sz w:val="17"/>
+              </w:rPr>
+              <w:t>Scenario RBAC/OpenAPI</w:t>
+            </w:r>
+          </w:p>
+        </w:tc>
+        <w:tc>
+          <w:tcPr>
+            <w:tcW w:type="dxa" w:w="4450"/>
+            <w:tcMar>
+              <w:top w:w="80" w:type="dxa"/>
+              <w:start w:w="120" w:type="dxa"/>
+              <w:bottom w:w="80" w:type="dxa"/>
+              <w:end w:w="120" w:type="dxa"/>
+            </w:tcMar>
+            <w:vAlign w:val="center"/>
+            <w:shd w:fill="FFFFFF"/>
+          </w:tcPr>
+          <w:p>
+            <w:pPr>
+              <w:spacing w:before="0" w:after="40" w:line="252" w:lineRule="auto"/>
+              <w:jc w:val="left"/>
+            </w:pPr>
+            <w:r>
+              <w:rPr>
+                <w:rFonts w:ascii="Calibri" w:hAnsi="Calibri"/>
+                <w:b w:val="0"/>
+                <w:color w:val="111827"/>
+                <w:sz w:val="17"/>
+              </w:rPr>
+              <w:t>Publish protected execute, list, and detail endpoints with safe limits.</w:t>
+            </w:r>
+          </w:p>
+        </w:tc>
+        <w:tc>
+          <w:tcPr>
+            <w:tcW w:type="dxa" w:w="3260"/>
+            <w:tcMar>
+              <w:top w:w="80" w:type="dxa"/>
+              <w:start w:w="120" w:type="dxa"/>
+              <w:bottom w:w="80" w:type="dxa"/>
+              <w:end w:w="120" w:type="dxa"/>
+            </w:tcMar>
+            <w:vAlign w:val="center"/>
+            <w:shd w:fill="FFFFFF"/>
+          </w:tcPr>
+          <w:p>
+            <w:pPr>
+              <w:spacing w:before="0" w:after="40" w:line="252" w:lineRule="auto"/>
+              <w:jc w:val="left"/>
+            </w:pPr>
+            <w:r>
+              <w:rPr>
+                <w:rFonts w:ascii="Calibri" w:hAnsi="Calibri"/>
+                <w:b w:val="0"/>
+                <w:color w:val="111827"/>
+                <w:sz w:val="17"/>
+              </w:rPr>
+              <w:t>Contract/integration</w:t>
+            </w:r>
+          </w:p>
+        </w:tc>
+      </w:tr>
+      <w:tr>
+        <w:trPr>
+          <w:cantSplit/>
+        </w:trPr>
+        <w:tc>
+          <w:tcPr>
+            <w:tcW w:type="dxa" w:w="1650"/>
+            <w:tcMar>
+              <w:top w:w="80" w:type="dxa"/>
+              <w:start w:w="120" w:type="dxa"/>
+              <w:bottom w:w="80" w:type="dxa"/>
+              <w:end w:w="120" w:type="dxa"/>
+            </w:tcMar>
+            <w:vAlign w:val="center"/>
+            <w:shd w:fill="FFFFFF"/>
+          </w:tcPr>
+          <w:p>
+            <w:pPr>
+              <w:spacing w:before="0" w:after="40" w:line="252" w:lineRule="auto"/>
+              <w:jc w:val="center"/>
+            </w:pPr>
+            <w:r>
+              <w:rPr>
+                <w:rFonts w:ascii="Calibri" w:hAnsi="Calibri"/>
+                <w:b w:val="0"/>
+                <w:color w:val="111827"/>
+                <w:sz w:val="17"/>
+              </w:rPr>
+              <w:t>Protocol boundary</w:t>
+            </w:r>
+          </w:p>
+        </w:tc>
+        <w:tc>
+          <w:tcPr>
+            <w:tcW w:type="dxa" w:w="4450"/>
+            <w:tcMar>
+              <w:top w:w="80" w:type="dxa"/>
+              <w:start w:w="120" w:type="dxa"/>
+              <w:bottom w:w="80" w:type="dxa"/>
+              <w:end w:w="120" w:type="dxa"/>
+            </w:tcMar>
+            <w:vAlign w:val="center"/>
+            <w:shd w:fill="FFFFFF"/>
+          </w:tcPr>
+          <w:p>
+            <w:pPr>
+              <w:spacing w:before="0" w:after="40" w:line="252" w:lineRule="auto"/>
+              <w:jc w:val="left"/>
+            </w:pPr>
+            <w:r>
+              <w:rPr>
+                <w:rFonts w:ascii="Calibri" w:hAnsi="Calibri"/>
+                <w:b w:val="0"/>
+                <w:color w:val="111827"/>
+                <w:sz w:val="17"/>
+              </w:rPr>
+              <w:t>Keep CAN frames, DBC, UDS, and wall-clock schedulers outside the orchestrator.</w:t>
             </w:r>
           </w:p>
         </w:tc>
@@ -12201,6 +14176,22 @@
           <w:color w:val="111827"/>
           <w:sz w:val="22"/>
         </w:rPr>
+        <w:t xml:space="preserve">, </w:t>
+      </w:r>
+      <w:r>
+        <w:rPr>
+          <w:rFonts w:ascii="Consolas" w:hAnsi="Consolas"/>
+          <w:color w:val="1F4D78"/>
+          <w:sz w:val="19"/>
+        </w:rPr>
+        <w:t>0022_ecu_signal_contracts</w:t>
+      </w:r>
+      <w:r>
+        <w:rPr>
+          <w:rFonts w:ascii="Calibri" w:hAnsi="Calibri"/>
+          <w:color w:val="111827"/>
+          <w:sz w:val="22"/>
+        </w:rPr>
         <w:t xml:space="preserve">, and </w:t>
       </w:r>
       <w:r>
@@ -12209,7 +14200,7 @@
           <w:color w:val="1F4D78"/>
           <w:sz w:val="19"/>
         </w:rPr>
-        <w:t>0022_ecu_signal_contracts</w:t>
+        <w:t>0023_ecu_scenarios</w:t>
       </w:r>
       <w:r>
         <w:rPr>
@@ -12431,6 +14422,39 @@
           <w:color w:val="111827"/>
           <w:sz w:val="22"/>
         </w:rPr>
+        <w:t xml:space="preserve">Scenario completion uses </w:t>
+      </w:r>
+      <w:r>
+        <w:rPr>
+          <w:rFonts w:ascii="Consolas" w:hAnsi="Consolas"/>
+          <w:color w:val="1F4D78"/>
+          <w:sz w:val="19"/>
+        </w:rPr>
+        <w:t>atep.ecu.scenario.completed.v1</w:t>
+      </w:r>
+      <w:r>
+        <w:rPr>
+          <w:rFonts w:ascii="Calibri" w:hAnsi="Calibri"/>
+          <w:color w:val="111827"/>
+          <w:sz w:val="22"/>
+        </w:rPr>
+        <w:t xml:space="preserve"> with bounded counts and clock skew.</w:t>
+      </w:r>
+    </w:p>
+    <w:p>
+      <w:pPr>
+        <w:pStyle w:val="ListBullet"/>
+        <w:numPr>
+          <w:ilvl w:val="0"/>
+          <w:numId w:val="14"/>
+        </w:numPr>
+      </w:pPr>
+      <w:r>
+        <w:rPr>
+          <w:rFonts w:ascii="Calibri" w:hAnsi="Calibri"/>
+          <w:color w:val="111827"/>
+          <w:sz w:val="22"/>
+        </w:rPr>
         <w:t>Automated tests cover validation, atomic evidence, concurrency, idempotency, permissions, and API contracts.</w:t>
       </w:r>
     </w:p>
@@ -12575,6 +14599,60 @@
     </w:p>
     <w:p>
       <w:pPr>
+        <w:pStyle w:val="ListBullet"/>
+        <w:numPr>
+          <w:ilvl w:val="0"/>
+          <w:numId w:val="16"/>
+        </w:numPr>
+      </w:pPr>
+      <w:r>
+        <w:rPr>
+          <w:rFonts w:ascii="Calibri" w:hAnsi="Calibri"/>
+          <w:color w:val="111827"/>
+          <w:sz w:val="22"/>
+        </w:rPr>
+        <w:t>Vehicle-level serialization is intentionally conservative; later scale work may introduce ordered</w:t>
+      </w:r>
+    </w:p>
+    <w:p>
+      <w:r>
+        <w:rPr>
+          <w:rFonts w:ascii="Calibri" w:hAnsi="Calibri"/>
+          <w:color w:val="111827"/>
+          <w:sz w:val="22"/>
+        </w:rPr>
+        <w:t>multi-aggregate locks after measuring real campaign contention.</w:t>
+      </w:r>
+    </w:p>
+    <w:p>
+      <w:pPr>
+        <w:pStyle w:val="ListBullet"/>
+        <w:numPr>
+          <w:ilvl w:val="0"/>
+          <w:numId w:val="17"/>
+        </w:numPr>
+      </w:pPr>
+      <w:r>
+        <w:rPr>
+          <w:rFonts w:ascii="Calibri" w:hAnsi="Calibri"/>
+          <w:color w:val="111827"/>
+          <w:sz w:val="22"/>
+        </w:rPr>
+        <w:t>Scenario definitions are request-persisted execution evidence, not yet a reusable catalogue with</w:t>
+      </w:r>
+    </w:p>
+    <w:p>
+      <w:r>
+        <w:rPr>
+          <w:rFonts w:ascii="Calibri" w:hAnsi="Calibri"/>
+          <w:color w:val="111827"/>
+          <w:sz w:val="22"/>
+        </w:rPr>
+        <w:t>approval workflow or scheduled execution.</w:t>
+      </w:r>
+    </w:p>
+    <w:p>
+      <w:pPr>
         <w:pStyle w:val="Heading1"/>
         <w:keepNext/>
         <w:keepLines/>
@@ -12590,7 +14668,7 @@
           <w:color w:val="111827"/>
           <w:sz w:val="22"/>
         </w:rPr>
-        <w:t xml:space="preserve">The next increment adds multi-ECU scenarios, logical-time diagnostics, bounded resource metrics, and repeatable failure campaigns. CAN bus implementation remains in Volume IV. See </w:t>
+        <w:t xml:space="preserve">The initial Volume III baseline is complete. The recommended next development starts Volume IV with a protocol-independent CAN network aggregate, bounded frame contracts, topology, and deterministic bus submission semantics. DBC encoding, arbitration, CAN FD, fault injection, and timing follow in later Volume IV increments. See </w:t>
       </w:r>
       <w:r>
         <w:rPr>
@@ -12624,7 +14702,7 @@
         <w:pStyle w:val="ListNumber"/>
         <w:numPr>
           <w:ilvl w:val="0"/>
-          <w:numId w:val="17"/>
+          <w:numId w:val="18"/>
         </w:numPr>
       </w:pPr>
       <w:r>
@@ -12641,7 +14719,7 @@
         <w:pStyle w:val="ListNumber"/>
         <w:numPr>
           <w:ilvl w:val="0"/>
-          <w:numId w:val="17"/>
+          <w:numId w:val="18"/>
         </w:numPr>
       </w:pPr>
       <w:r>
@@ -12658,7 +14736,7 @@
         <w:pStyle w:val="ListNumber"/>
         <w:numPr>
           <w:ilvl w:val="0"/>
-          <w:numId w:val="17"/>
+          <w:numId w:val="18"/>
         </w:numPr>
       </w:pPr>
       <w:r>
@@ -12675,7 +14753,7 @@
         <w:pStyle w:val="ListNumber"/>
         <w:numPr>
           <w:ilvl w:val="0"/>
-          <w:numId w:val="17"/>
+          <w:numId w:val="18"/>
         </w:numPr>
       </w:pPr>
       <w:r>
@@ -12692,7 +14770,7 @@
         <w:pStyle w:val="ListNumber"/>
         <w:numPr>
           <w:ilvl w:val="0"/>
-          <w:numId w:val="17"/>
+          <w:numId w:val="18"/>
         </w:numPr>
       </w:pPr>
       <w:r>
@@ -12709,7 +14787,7 @@
         <w:pStyle w:val="ListNumber"/>
         <w:numPr>
           <w:ilvl w:val="0"/>
-          <w:numId w:val="17"/>
+          <w:numId w:val="18"/>
         </w:numPr>
       </w:pPr>
       <w:r>
@@ -12726,7 +14804,7 @@
         <w:pStyle w:val="ListNumber"/>
         <w:numPr>
           <w:ilvl w:val="0"/>
-          <w:numId w:val="17"/>
+          <w:numId w:val="18"/>
         </w:numPr>
       </w:pPr>
       <w:r>
@@ -12743,7 +14821,7 @@
         <w:pStyle w:val="ListNumber"/>
         <w:numPr>
           <w:ilvl w:val="0"/>
-          <w:numId w:val="17"/>
+          <w:numId w:val="18"/>
         </w:numPr>
       </w:pPr>
       <w:r>
@@ -12760,7 +14838,7 @@
         <w:pStyle w:val="ListNumber"/>
         <w:numPr>
           <w:ilvl w:val="0"/>
-          <w:numId w:val="17"/>
+          <w:numId w:val="18"/>
         </w:numPr>
       </w:pPr>
       <w:r>
@@ -12777,7 +14855,7 @@
         <w:pStyle w:val="ListNumber"/>
         <w:numPr>
           <w:ilvl w:val="0"/>
-          <w:numId w:val="17"/>
+          <w:numId w:val="18"/>
         </w:numPr>
       </w:pPr>
       <w:r>
@@ -12794,7 +14872,7 @@
         <w:pStyle w:val="ListNumber"/>
         <w:numPr>
           <w:ilvl w:val="0"/>
-          <w:numId w:val="17"/>
+          <w:numId w:val="18"/>
         </w:numPr>
       </w:pPr>
       <w:r>
@@ -12811,7 +14889,7 @@
         <w:pStyle w:val="ListNumber"/>
         <w:numPr>
           <w:ilvl w:val="0"/>
-          <w:numId w:val="17"/>
+          <w:numId w:val="18"/>
         </w:numPr>
       </w:pPr>
       <w:r>
@@ -12828,7 +14906,7 @@
         <w:pStyle w:val="ListNumber"/>
         <w:numPr>
           <w:ilvl w:val="0"/>
-          <w:numId w:val="17"/>
+          <w:numId w:val="18"/>
         </w:numPr>
       </w:pPr>
       <w:r>
@@ -12845,7 +14923,7 @@
         <w:pStyle w:val="ListNumber"/>
         <w:numPr>
           <w:ilvl w:val="0"/>
-          <w:numId w:val="17"/>
+          <w:numId w:val="18"/>
         </w:numPr>
       </w:pPr>
       <w:r>
@@ -12862,7 +14940,7 @@
         <w:pStyle w:val="ListNumber"/>
         <w:numPr>
           <w:ilvl w:val="0"/>
-          <w:numId w:val="17"/>
+          <w:numId w:val="18"/>
         </w:numPr>
       </w:pPr>
       <w:r>
@@ -12879,7 +14957,7 @@
         <w:pStyle w:val="ListNumber"/>
         <w:numPr>
           <w:ilvl w:val="0"/>
-          <w:numId w:val="17"/>
+          <w:numId w:val="18"/>
         </w:numPr>
       </w:pPr>
       <w:r>
@@ -12896,7 +14974,7 @@
         <w:pStyle w:val="ListNumber"/>
         <w:numPr>
           <w:ilvl w:val="0"/>
-          <w:numId w:val="17"/>
+          <w:numId w:val="18"/>
         </w:numPr>
       </w:pPr>
       <w:r>
@@ -12913,7 +14991,7 @@
         <w:pStyle w:val="ListNumber"/>
         <w:numPr>
           <w:ilvl w:val="0"/>
-          <w:numId w:val="17"/>
+          <w:numId w:val="18"/>
         </w:numPr>
       </w:pPr>
       <w:r>
@@ -12930,7 +15008,7 @@
         <w:pStyle w:val="ListNumber"/>
         <w:numPr>
           <w:ilvl w:val="0"/>
-          <w:numId w:val="17"/>
+          <w:numId w:val="18"/>
         </w:numPr>
       </w:pPr>
       <w:r>
@@ -12947,7 +15025,7 @@
         <w:pStyle w:val="ListNumber"/>
         <w:numPr>
           <w:ilvl w:val="0"/>
-          <w:numId w:val="17"/>
+          <w:numId w:val="18"/>
         </w:numPr>
       </w:pPr>
       <w:r>
@@ -12957,6 +15035,74 @@
           <w:sz w:val="22"/>
         </w:rPr>
         <w:t>Design the future Volume IV adapter that maps a semantic signal to a DBC without changing ECU state.</w:t>
+      </w:r>
+    </w:p>
+    <w:p>
+      <w:pPr>
+        <w:pStyle w:val="ListNumber"/>
+        <w:numPr>
+          <w:ilvl w:val="0"/>
+          <w:numId w:val="18"/>
+        </w:numPr>
+      </w:pPr>
+      <w:r>
+        <w:rPr>
+          <w:rFonts w:ascii="Calibri" w:hAnsi="Calibri"/>
+          <w:color w:val="111827"/>
+          <w:sz w:val="22"/>
+        </w:rPr>
+        <w:t>Build a two-ECU scenario and calculate every derived command ID and campaign seed.</w:t>
+      </w:r>
+    </w:p>
+    <w:p>
+      <w:pPr>
+        <w:pStyle w:val="ListNumber"/>
+        <w:numPr>
+          <w:ilvl w:val="0"/>
+          <w:numId w:val="18"/>
+        </w:numPr>
+      </w:pPr>
+      <w:r>
+        <w:rPr>
+          <w:rFonts w:ascii="Calibri" w:hAnsi="Calibri"/>
+          <w:color w:val="111827"/>
+          <w:sz w:val="22"/>
+        </w:rPr>
+        <w:t>Compare synchronized ECU clocks with a 250 ms skew and explain the diagnostic result.</w:t>
+      </w:r>
+    </w:p>
+    <w:p>
+      <w:pPr>
+        <w:pStyle w:val="ListNumber"/>
+        <w:numPr>
+          <w:ilvl w:val="0"/>
+          <w:numId w:val="18"/>
+        </w:numPr>
+      </w:pPr>
+      <w:r>
+        <w:rPr>
+          <w:rFonts w:ascii="Calibri" w:hAnsi="Calibri"/>
+          <w:color w:val="111827"/>
+          <w:sz w:val="22"/>
+        </w:rPr>
+        <w:t>Prove why aggregate scenario evidence is safer than copying action requests and physical values.</w:t>
+      </w:r>
+    </w:p>
+    <w:p>
+      <w:pPr>
+        <w:pStyle w:val="ListNumber"/>
+        <w:numPr>
+          <w:ilvl w:val="0"/>
+          <w:numId w:val="18"/>
+        </w:numPr>
+      </w:pPr>
+      <w:r>
+        <w:rPr>
+          <w:rFonts w:ascii="Calibri" w:hAnsi="Calibri"/>
+          <w:color w:val="111827"/>
+          <w:sz w:val="22"/>
+        </w:rPr>
+        <w:t>Propose a reusable scenario catalogue without weakening immutable execution evidence.</w:t>
       </w:r>
     </w:p>
     <w:sectPr>
@@ -12988,7 +15134,7 @@
         <w:color w:val="667085"/>
         <w:sz w:val="17"/>
       </w:rPr>
-      <w:t>ATEP Volume III Workbook  |  Version 0.6.0</w:t>
+      <w:t>ATEP Volume III Workbook  |  Version 0.7.0</w:t>
     </w:r>
     <w:r>
       <w:rPr>
@@ -13312,6 +15458,12 @@
     </w:lvlOverride>
   </w:num>
   <w:num w:numId="17">
+    <w:abstractNumId w:val="10"/>
+    <w:lvlOverride w:ilvl="0">
+      <w:startOverride w:val="1"/>
+    </w:lvlOverride>
+  </w:num>
+  <w:num w:numId="18">
     <w:abstractNumId w:val="9"/>
     <w:lvlOverride w:ilvl="0">
       <w:startOverride w:val="1"/>

</xml_diff>